<commit_message>
docs: revise manuscript and platform evidence
</commit_message>
<xml_diff>
--- a/论文/GriddingMachine论文初稿_导师审阅版.docx
+++ b/论文/GriddingMachine论文初稿_导师审阅版.docx
@@ -82,7 +82,7 @@
         <w:rPr>
           <w:rFonts w:ascii="Times New Roman" w:hAnsi="Times New Roman" w:eastAsia="宋体"/>
         </w:rPr>
-        <w:t>地球系统模型依赖来源广泛、格式各异的全球网格数据，但数据制作、发布、稳定获取和模型适配仍存在重复劳动。本文在2022版GriddingMachine基础上，构建从数据贡献到模型调用的可验证工作流：以共享schema约束YAML配置构建和NetCDF生产流水线，以可独立更新的多镜像目录和</w:t>
+        <w:t>地球系统模型依赖来源和格式各异的全球网格数据，数据制作、发布、稳定获取与模型适配仍存在重复劳动。本文在2022版GriddingMachine基础上构建从数据贡献到模型调用的可验证工作流：共享模式（schema）约束YAML配置与NetCDF生产，可独立更新的多镜像目录以</w:t>
       </w:r>
       <w:r>
         <w:rPr>
@@ -94,7 +94,7 @@
         <w:rPr>
           <w:rFonts w:ascii="Times New Roman" w:hAnsi="Times New Roman" w:eastAsia="宋体"/>
         </w:rPr>
-        <w:t>控制cache与正式落盘，并以</w:t>
+        <w:t>控制缓存和正式落盘，</w:t>
       </w:r>
       <w:r>
         <w:rPr>
@@ -118,7 +118,7 @@
         <w:rPr>
           <w:rFonts w:ascii="Times New Roman" w:hAnsi="Times New Roman" w:eastAsia="宋体"/>
         </w:rPr>
-        <w:t>和</w:t>
+        <w:t>与</w:t>
       </w:r>
       <w:r>
         <w:rPr>
@@ -130,7 +130,7 @@
         <w:rPr>
           <w:rFonts w:ascii="Times New Roman" w:hAnsi="Times New Roman" w:eastAsia="宋体"/>
         </w:rPr>
-        <w:t>统一读取及Emerald输入组织。在Windows与macOS、Julia 1.12.6两个环境中，数据生产包73项、数据使用包63项及Emerald最小烟雾5项测试全部通过；31编号生产矩阵中的29个非交互案例在两个平台各连续3次全部通过，人工方向正反例审核为PASS。一名未参与开发的参与者在获得1次配置说明后完成受控贡献流程，自动产物验收为PASS。当前ping版本的13个故障场景在两个平台各重复5次，共130次状态断言全部通过且无</w:t>
+        <w:t>统一数据读取及Emerald输入组织。在Windows和macOS的Julia 1.12.6环境中，GriddingMachineDatasets 73项、GriddingMachine 63项及Emerald烟雾5项测试全部通过；29个非交互生产案例在两平台各连续3轮通过，单人方向审核为PASS。一名未参与开发者经1次配置说明后完成受控贡献流程，产物验收为PASS。13个故障场景在两平台各重复5次，130次状态断言全部通过且无</w:t>
       </w:r>
       <w:r>
         <w:rPr>
@@ -142,7 +142,7 @@
         <w:rPr>
           <w:rFonts w:ascii="Times New Roman" w:hAnsi="Times New Roman" w:eastAsia="宋体"/>
         </w:rPr>
-        <w:t>残留；两个平台的校外真实访问中Zenodo下载均通过大小和哈希核验，机构FTP均因网络边界超时，其中一轮还记录到DNS污染与大文件传输截断，表明ICMP无响应和解析故障都不等于文件不可下载。两个内部压缩样本改为直接NetCDF后，两个平台的暖缓存端到端中位时间均稳定降低。14个真实陆面文件通过完整性核验，US-NR1格点成功形成参数字典，非植被格点按预期拒绝。结果表明，新版以机器可检查契约连接了生产、分发和模型接口；受控实验证据覆盖Windows与macOS两个平台，Linux作为固定依赖和Ubuntu持续集成目标受到支持，但在相应运行记录归档前不作为本文的已验证平台。校园网镜像比较、真实气象和长期模型模拟不在当前结论内。</w:t>
+        <w:t>残留。两轮校外真实访问中，Zenodo下载均通过大小和哈希核验，机构FTP均因网络边界超时；其中一轮记录到DNS异常解析和正式记录前的一次传输截断。两个内部压缩样本改为直接NetCDF后，暖缓存端到端中位时间在两平台均降低。14个真实陆面文件通过完整性核验，US-NR1参数字典成功生成，非植被格点按预期拒绝。Ubuntu持续集成另通过73项、63项包测试、29个生产案例、65次故障断言和40次小型确定性分发测量，支持核心路径的Linux兼容性。结果表明，新版以机器可检查契约连接了数据生产、分发和模型接口；Linux证据不包含Emerald、真实网络和真实陆面案例，校园网镜像比较、真实气象和长期模拟不在当前结论内。</w:t>
       </w:r>
     </w:p>
     <w:p>
@@ -230,7 +230,7 @@
         <w:rPr>
           <w:rFonts w:ascii="Times New Roman" w:hAnsi="Times New Roman" w:eastAsia="宋体"/>
         </w:rPr>
-        <w:t xml:space="preserve">Earth system models rely on heterogeneous global gridded datasets, yet producing, publishing, reliably obtaining, and adapting these data still requires repeated manual work. Building on the 2022 GriddingMachine release, this study establishes a verifiable workflow from data contribution to model use. A shared schema constrains YAML configuration construction and NetCDF production, while an independently updated multi-mirror catalog uses isolated cache files and </w:t>
+        <w:t xml:space="preserve">Earth system models rely on heterogeneous global gridded datasets, yet their production, distribution, reliable acquisition, and model adaptation still require repeated work. Building on the 2022 GriddingMachine release, this study establishes a verifiable workflow from data contribution to model use. A shared schema constrains YAML configuration and NetCDF production; an independently updated multi-mirror catalog uses isolated cache files and </w:t>
       </w:r>
       <w:r>
         <w:rPr>
@@ -242,7 +242,7 @@
         <w:rPr>
           <w:rFonts w:ascii="Times New Roman" w:hAnsi="Times New Roman" w:eastAsia="宋体"/>
         </w:rPr>
-        <w:t xml:space="preserve"> checks before promotion. The </w:t>
+        <w:t xml:space="preserve"> checks before promotion; and </w:t>
       </w:r>
       <w:r>
         <w:rPr>
@@ -278,7 +278,7 @@
         <w:rPr>
           <w:rFonts w:ascii="Times New Roman" w:hAnsi="Times New Roman" w:eastAsia="宋体"/>
         </w:rPr>
-        <w:t xml:space="preserve"> interfaces then provide unified access and organize inputs for Emerald. On both Windows and macOS under Julia 1.12.6, all 73 production-package tests, 63 data-use tests, and five Emerald smoke checks passed. All 29 non-interactive cases in a 31-case production matrix passed in three runs on each platform, and the positive/negative orientation audit passed. One participant not involved in development completed the controlled contribution workflow after one configuration clarification, with all output assertions passing. Across 13 fault scenarios repeated five times on each platform, all 130 state assertions passed with no residual </w:t>
+        <w:t xml:space="preserve"> organize data for Emerald. On Windows and macOS under Julia 1.12.6, all 73 production-package tests, 63 data-use tests, and five Emerald smoke checks passed. All 29 non-interactive production cases passed in three runs per platform, and a single-operator orientation audit passed. One participant not involved in development completed the controlled contribution workflow after one configuration clarification. Across 13 fault scenarios repeated five times per platform, all 130 state assertions passed with no residual </w:t>
       </w:r>
       <w:r>
         <w:rPr>
@@ -290,19 +290,7 @@
         <w:rPr>
           <w:rFonts w:ascii="Times New Roman" w:hAnsi="Times New Roman" w:eastAsia="宋体"/>
         </w:rPr>
-        <w:t xml:space="preserve"> files. In off-campus real-network observations on both platforms, Zenodo downloads matched the registered sizes and SHA-256 hashes while all institutional FTP attempts timed out at the network boundary; one round additionally recorded DNS poisoning and a truncated large-file transfer, showing that neither ICMP non-response nor resolution failure implies download failure. Replacing outer </w:t>
-      </w:r>
-      <w:r>
-        <w:rPr>
-          <w:rFonts w:ascii="Consolas" w:hAnsi="Consolas" w:eastAsia="等线"/>
-        </w:rPr>
-        <w:t>tar.gz</w:t>
-      </w:r>
-      <w:r>
-        <w:rPr>
-          <w:rFonts w:ascii="Times New Roman" w:hAnsi="Times New Roman" w:eastAsia="宋体"/>
-        </w:rPr>
-        <w:t xml:space="preserve"> archives with direct NetCDF consistently reduced median warm-cache end-to-end time on both platforms for two internally compressed samples. Fourteen verified land files supported parameter-dictionary generation at the US-NR1 grid cell, while a non-vegetated cell was rejected as expected. The updated framework therefore connects production, distribution, and model interfaces through machine-checkable contracts. Controlled-experiment evidence covers Windows and macOS. Linux is included as a fixed-dependency Ubuntu continuous-integration target, but is not counted as empirically verified until its runner records are archived. Campus-network mirror comparison, real-weather validation, and long-term model simulation remain outside the current conclusions.</w:t>
+        <w:t xml:space="preserve"> files. In off-campus observations, Zenodo downloads matched registered sizes and SHA-256 hashes, whereas institutional FTP attempts timed out at the network boundary; one round recorded anomalous DNS resolution and one truncated probe before formal runs. Direct NetCDF reduced median warm-cache end-to-end time on both platforms for two internally compressed samples. Fourteen verified land files supported a parameter dictionary at US-NR1, while a non-vegetated cell was rejected as expected. Ubuntu CI additionally passed the 73 and 63 package tests, 29 production cases, 65 fault assertions, and 40 distribution measurements using small deterministic fixtures. The updated framework therefore connects production, distribution, and model interfaces through machine-checkable contracts. Linux evidence is limited to the tested core paths and excludes Emerald, real-network access, and real land files; campus-network comparison, real-weather validation, and long-term simulation remain outside the conclusions.</w:t>
       </w:r>
     </w:p>
     <w:p>
@@ -364,7 +352,7 @@
         <w:rPr>
           <w:rFonts w:ascii="Times New Roman" w:hAnsi="Times New Roman" w:eastAsia="宋体"/>
         </w:rPr>
-        <w:t xml:space="preserve"> 和 Julia artifact 机制实现数据管理和自动下载，同时提供 Julia、Matlab、Octave、Python 和 R 接口。该版本降低了全球网格数据发现和调用的门槛，并明确了经纬度方向、空间分辨率、变量名称、缺失值、单位、引用信息和处理日志等数据规范。但是，旧版采用 </w:t>
+        <w:t xml:space="preserve"> 和 Julia artifact 机制实现数据管理和自动下载，同时提供 Julia、MATLAB、Octave、Python 和 R 接口。该版本降低了全球网格数据发现和调用的门槛，并明确了经纬度方向、空间分辨率、变量名称、缺失值、单位、引用信息和处理日志等数据规范。但是，旧版采用 </w:t>
       </w:r>
       <w:r>
         <w:rPr>
@@ -460,7 +448,7 @@
         <w:rPr>
           <w:rFonts w:ascii="Times New Roman" w:hAnsi="Times New Roman" w:eastAsia="宋体"/>
         </w:rPr>
-        <w:t>本文拟回答四个问题：YAML配置契约与生产流水线能否正确处理代表性的二维/三维异构NetCDF，并使未参与开发的贡献者按文档完成数据登记；直接NetCDF、独立目录、多镜像、cache和SHA校验能否在Windows与macOS受控故障条件下保持下载内容及正式目录状态正确；Collector公共操作和</w:t>
+        <w:t>本文拟回答四个问题：YAML配置契约与生产流水线能否正确处理代表性的二维/三维异构NetCDF，并使未参与开发的贡献者按文档完成数据登记；直接NetCDF、独立目录、多镜像、缓存和SHA校验能否在Windows与macOS受控故障条件下保持下载内容及正式目录状态正确；Collector公共操作和</w:t>
       </w:r>
       <w:r>
         <w:rPr>
@@ -496,7 +484,7 @@
         <w:rPr>
           <w:rFonts w:ascii="Times New Roman" w:hAnsi="Times New Roman" w:eastAsia="宋体"/>
         </w:rPr>
-        <w:t>能否在受控夹具中生成符合接口约定、可用于Emerald固定格点初始化的数据。取消二次压缩的效率对比作为分发更新的支持实验，而不是独立贡献。Windows与macOS构成本文的双平台实测范围；Linux作为受支持目标纳入固定依赖与Ubuntu持续集成，待运行记录归档后再计入实证结果。完整长期模型模拟、真实ERA5气象验证和Server/Requestor均不进入本文验证范围。</w:t>
+        <w:t>能否在受控夹具中生成符合接口约定、可用于Emerald固定格点初始化的数据。取消二次压缩的效率对比作为分发更新的支持实验，而不是独立贡献。Windows与macOS构成本文的双平台完整实测范围；Linux以相同固定依赖和Ubuntu持续集成验证核心软件路径，但不把未在Linux执行的Emerald、真实网络和真实数据案例外推为三平台结果。完整长期模型模拟、真实ERA5气象验证和Server/Requestor均不进入本文验证范围。</w:t>
       </w:r>
     </w:p>
     <w:p>
@@ -1288,7 +1276,7 @@
                 <w:rFonts w:ascii="Times New Roman" w:hAnsi="Times New Roman" w:eastAsia="宋体"/>
                 <w:sz w:val="18"/>
               </w:rPr>
-              <w:t>辅助排序；全平台多URL回退、独立cache及</w:t>
+              <w:t>辅助排序；全平台多URL回退、独立缓存及</w:t>
             </w:r>
             <w:r>
               <w:rPr>
@@ -1321,7 +1309,7 @@
                 <w:rFonts w:ascii="Times New Roman" w:hAnsi="Times New Roman" w:eastAsia="宋体"/>
                 <w:sz w:val="18"/>
               </w:rPr>
-              <w:t>Windows与macOS已测；Linux CI和校园网FTP—Zenodo比较待归档</w:t>
+              <w:t>Windows与macOS完整实测；Ubuntu CI验证受控核心路径；校园网FTP—Zenodo比较待完成</w:t>
             </w:r>
           </w:p>
         </w:tc>
@@ -3282,7 +3270,7 @@
         <w:rPr>
           <w:rFonts w:ascii="Times New Roman" w:hAnsi="Times New Roman" w:eastAsia="宋体"/>
         </w:rPr>
-        <w:t xml:space="preserve">论文实验版本的自动质量控制将在保存前检查维度、坐标、变量、数值范围和缺失值规则。当前已有的空间方向图可用于人工发现异常，但只作为补充审核；流水线的正确性应由具有已知预期输出的合成 NetCDF 自动断言。验证通过后生成 </w:t>
+        <w:t>论文实验版本的自动质量控制在保存前检查维度、坐标、变量、数值范围和缺失值规则。当前已有的空间方向图可用于人工发现异常，但只作为补充审核；流水线的正确性主要由具有已知预期输出的合成NetCDF自动断言。验证通过后生成</w:t>
       </w:r>
       <w:r>
         <w:rPr>
@@ -3294,7 +3282,7 @@
         <w:rPr>
           <w:rFonts w:ascii="Times New Roman" w:hAnsi="Times New Roman" w:eastAsia="宋体"/>
         </w:rPr>
-        <w:t xml:space="preserve">，存在不确定性时追加同形的 </w:t>
+        <w:t>，存在不确定性时追加同形的</w:t>
       </w:r>
       <w:r>
         <w:rPr>
@@ -3306,7 +3294,7 @@
         <w:rPr>
           <w:rFonts w:ascii="Times New Roman" w:hAnsi="Times New Roman" w:eastAsia="宋体"/>
         </w:rPr>
-        <w:t xml:space="preserve">，并按 </w:t>
+        <w:t>，并按</w:t>
       </w:r>
       <w:r>
         <w:rPr>
@@ -3318,7 +3306,7 @@
         <w:rPr>
           <w:rFonts w:ascii="Times New Roman" w:hAnsi="Times New Roman" w:eastAsia="宋体"/>
         </w:rPr>
-        <w:t xml:space="preserve"> 生成唯一文件名。若目标文件已存在，流水线不能仅凭文件名跳过，而应比较配置哈希、软件版本和文件校验结果，以区分可安全复用的输出与需要重建的过期或不完整文件。</w:t>
+        <w:t>生成唯一文件名。当前实现发现同名目标文件时仅依据文件存在性跳过，本研究把该行为纳入重复调用测试，但不把它解释为内容级断点续跑；需要强制重建时应先移走或删除受控输出，未来版本应增加配置哈希、软件版本和文件校验结果比较。</w:t>
       </w:r>
     </w:p>
     <w:p>
@@ -4352,7 +4340,7 @@
         <w:rPr>
           <w:rFonts w:ascii="Times New Roman" w:hAnsi="Times New Roman" w:eastAsia="宋体"/>
         </w:rPr>
-        <w:t>本地回归已覆盖首选镜像失败、错误字节数、错误SHA-256、残留缓存及全部失败等受控分支，并断言失败内容不进入正式目录。证据来自Windows上的注入式downloader/probe fixture和包级回环HTTP实验；其结论限定为受控Windows状态正确性。</w:t>
+        <w:t>本地回归已覆盖首选镜像失败、错误字节数、错误SHA-256、残留缓存及全部失败等受控分支，并断言失败内容不进入正式目录。Windows与macOS分别完成65次包级故障状态断言；Ubuntu CI使用小型确定性NetCDF夹具完成相同的65次状态断言。真实FTP与Zenodo可达性仍按网络环境单独报告，不由受控HTTP端点替代。</w:t>
       </w:r>
     </w:p>
     <w:p>
@@ -4395,31 +4383,67 @@
         <w:rPr>
           <w:rFonts w:ascii="Times New Roman" w:hAnsi="Times New Roman" w:eastAsia="宋体"/>
         </w:rPr>
-        <w:t>会递归删除本地public内容，按标签清理会删除cache和正式文件，而</w:t>
+        <w:t>清空所配置根目录下的</w:t>
       </w:r>
       <w:r>
         <w:rPr>
           <w:rFonts w:ascii="Consolas" w:hAnsi="Consolas" w:eastAsia="等线"/>
         </w:rPr>
+        <w:t>public</w:t>
+      </w:r>
+      <w:r>
+        <w:rPr>
+          <w:rFonts w:ascii="Times New Roman" w:hAnsi="Times New Roman" w:eastAsia="宋体"/>
+        </w:rPr>
+        <w:t>内容，按标签清理删除相应缓存和正式文件；</w:t>
+      </w:r>
+      <w:r>
+        <w:rPr>
+          <w:rFonts w:ascii="Consolas" w:hAnsi="Consolas" w:eastAsia="等线"/>
+        </w:rPr>
         <w:t>clean_database!("old")</w:t>
       </w:r>
       <w:r>
         <w:rPr>
           <w:rFonts w:ascii="Times New Roman" w:hAnsi="Times New Roman" w:eastAsia="宋体"/>
         </w:rPr>
-        <w:t>目前仅显示待删除路径，实际删除语句被注释；</w:t>
+        <w:t>默认加载当前有效目录，也可由</w:t>
       </w:r>
       <w:r>
         <w:rPr>
           <w:rFonts w:ascii="Consolas" w:hAnsi="Consolas" w:eastAsia="等线"/>
         </w:rPr>
+        <w:t>update=true</w:t>
+      </w:r>
+      <w:r>
+        <w:rPr>
+          <w:rFonts w:ascii="Times New Roman" w:hAnsi="Times New Roman" w:eastAsia="宋体"/>
+        </w:rPr>
+        <w:t>先刷新目录，然后删除本地</w:t>
+      </w:r>
+      <w:r>
+        <w:rPr>
+          <w:rFonts w:ascii="Consolas" w:hAnsi="Consolas" w:eastAsia="等线"/>
+        </w:rPr>
+        <w:t>public</w:t>
+      </w:r>
+      <w:r>
+        <w:rPr>
+          <w:rFonts w:ascii="Times New Roman" w:hAnsi="Times New Roman" w:eastAsia="宋体"/>
+        </w:rPr>
+        <w:t>中已不再登记的数据集。清理函数仅允许作用于经过配置和路径检查的托管数据目录。</w:t>
+      </w:r>
+      <w:r>
+        <w:rPr>
+          <w:rFonts w:ascii="Consolas" w:hAnsi="Consolas" w:eastAsia="等线"/>
+        </w:rPr>
         <w:t>sync_database!</w:t>
       </w:r>
       <w:r>
         <w:rPr>
           <w:rFonts w:ascii="Times New Roman" w:hAnsi="Times New Roman" w:eastAsia="宋体"/>
         </w:rPr>
-        <w:t>会顺序遍历整个目录，完整运行可能涉及超过100 GB数据。论文测试使用隔离的临时数据根目录和小型目录fixture，逐项断言目录与文件状态，禁止在开发者真实数据目录上执行破坏性测试。全库实际迁移只作为运维功能说明，不作为论文实验的必要条件。</w:t>
+        <w:t>会顺序遍历整个目录，完整运行可能涉及超过100 GB数据。论文测试使用隔离的临时数据根目录和小型目录夹具，逐项断言目录与文件状态，不在开发者真实数据目录上执行破坏性测试。全库实际迁移只作为运维功能说明，不作为论文实验的必要条件。</w:t>
       </w:r>
     </w:p>
     <w:p>
@@ -4746,7 +4770,7 @@
         <w:rPr>
           <w:rFonts w:ascii="Times New Roman" w:hAnsi="Times New Roman" w:eastAsia="宋体"/>
         </w:rPr>
-        <w:t>与2022版通过标签隐藏数据位置的思路一致[4]，新版仍让使用者以标签而不是远端URL调用数据，但目录更新、下载完整性和读取被拆分为可单独检查的步骤。框2展示Windows环境下的最小使用路径：显式设置本地数据根目录，更新目录，下载并强制要求完整性字段，再读取US-NR1附近格点；当</w:t>
+        <w:t>与2022版通过标签隐藏数据位置的思路一致[4]，新版仍让使用者以标签而不是远端URL调用数据，但目录更新、下载完整性和读取被拆分为可单独检查的步骤。框2展示跨平台的最小使用路径：显式设置本地数据根目录，更新目录，下载并强制要求完整性字段，再读取US-NR1附近格点；当</w:t>
       </w:r>
       <w:r>
         <w:rPr>
@@ -4788,7 +4812,7 @@
         <w:t>using GriddingMachine.Indexer</w:t>
         <w:br/>
         <w:br/>
-        <w:t>Collector.configure!(home = raw"D:\GriddingMachine")</w:t>
+        <w:t>Collector.configure!(home = joinpath(homedir(), "GriddingMachine"))</w:t>
         <w:br/>
         <w:t>Collector.update_database!()</w:t>
         <w:br/>
@@ -5954,7 +5978,7 @@
         <w:rPr>
           <w:rFonts w:ascii="Times New Roman" w:hAnsi="Times New Roman" w:eastAsia="宋体"/>
         </w:rPr>
-        <w:t>测试在同机本地HTTP服务上进行以隔离公网波动，每个组合预热1次并随机顺序重复至少10次，记录传输字节数、打包与解包时间、从请求开始到首次读取一个NetCDF值的时间以及峰值临时磁盘占用。该协议在Windows与macOS上各执行一轮，两轮使用同一脚本（仅输出文件名随平台区分）、同一随机种子与同一对输入文件；跨平台只比较方向与量级，不把两轮的绝对耗时直接合并。真实镜像不重复进行压缩对比，以免把网络波动误当成格式效应。时间指标报告中位数、四分位距和95% bootstrap置信区间。只有直接NetCDF在端到端时间或临时磁盘占用上表现出稳定定量优势时，才写“提高效率”；否则只写“删除了额外打包与解包步骤”。</w:t>
+        <w:t>测试在同机本地HTTP服务上进行以隔离公网波动，每个组合预热1次并随机顺序重复至少10次，记录传输字节数、打包与解包时间、从请求开始到首次读取一个NetCDF值的时间，以及按下载文件和解包文件同时存在关系计算的逻辑最大临时占用。该协议在Windows与macOS上各执行一轮，两轮使用同一脚本（仅输出文件名随平台区分）、同一随机种子与同一对输入文件；跨平台只比较方向与量级，不把两轮的绝对耗时直接合并。真实镜像不重复进行压缩对比，以免把网络波动误当成格式效应。时间指标报告中位数、四分位距和95% bootstrap置信区间。只有直接NetCDF在端到端时间或逻辑临时占用上表现出稳定定量优势时，才写“提高效率”；否则只写“删除了额外打包与解包步骤”。</w:t>
       </w:r>
     </w:p>
     <w:p>
@@ -6162,7 +6186,7 @@
         <w:rPr>
           <w:rFonts w:ascii="Times New Roman" w:hAnsi="Times New Roman" w:eastAsia="宋体"/>
         </w:rPr>
-        <w:t>结果、单文件下载是否成功、下载时间、字节数和SHA-256。校外观察在Windows与macOS上各执行一轮；每个文件—镜像组合重复3次，所有下载缓存只写入论文研究目录。校外观察允许FTP失败并如实保留；若执行环境的域名解析被污染，须先用公共解析器交叉核实真实地址并在结果中如实记录解析方式，不得把解析故障写成镜像故障。校园网实验要求两个镜像均实际下载。实验只读访问FTP和Zenodo，不执行上传、覆盖或删除远端对象，结果分别限定于对应网络环境。</w:t>
+        <w:t>结果、单文件下载是否成功、下载时间、字节数和SHA-256。校外观察在Windows与macOS上各执行一轮；每个文件—镜像组合重复3次，所有下载缓存只写入论文研究目录。校外观察允许FTP失败并如实保留；若执行环境出现异常域名解析，须先用公共解析器交叉核实地址并在结果中如实记录解析方式，不把解析故障直接归因于镜像服务。校园网实验要求两个镜像均实际下载。实验只读访问FTP和Zenodo，不执行上传、覆盖或删除远端对象，结果分别限定于对应网络环境。</w:t>
       </w:r>
     </w:p>
     <w:p>
@@ -6278,6 +6302,93 @@
     </w:p>
     <w:p>
       <w:pPr>
+        <w:pStyle w:val="Heading2"/>
+      </w:pPr>
+      <w:r>
+        <w:rPr>
+          <w:rFonts w:ascii="Times New Roman" w:hAnsi="Times New Roman" w:eastAsia="宋体"/>
+        </w:rPr>
+        <w:t>3.5 平台与持续集成验证边界</w:t>
+      </w:r>
+    </w:p>
+    <w:p>
+      <w:r>
+        <w:rPr>
+          <w:rFonts w:ascii="Times New Roman" w:hAnsi="Times New Roman" w:eastAsia="宋体"/>
+        </w:rPr>
+        <w:t>Windows与macOS承担本文完整实验：运行包级回归、3轮生产矩阵、真实ELEV/LAI分发实验、5轮故障矩阵、Emerald烟雾及校外真实网络观察。公开候选版本另在GitHub Actions的</w:t>
+      </w:r>
+      <w:r>
+        <w:rPr>
+          <w:rFonts w:ascii="Consolas" w:hAnsi="Consolas" w:eastAsia="等线"/>
+        </w:rPr>
+        <w:t>windows-latest</w:t>
+      </w:r>
+      <w:r>
+        <w:rPr>
+          <w:rFonts w:ascii="Times New Roman" w:hAnsi="Times New Roman" w:eastAsia="宋体"/>
+        </w:rPr>
+        <w:t>、</w:t>
+      </w:r>
+      <w:r>
+        <w:rPr>
+          <w:rFonts w:ascii="Consolas" w:hAnsi="Consolas" w:eastAsia="等线"/>
+        </w:rPr>
+        <w:t>macos-latest</w:t>
+      </w:r>
+      <w:r>
+        <w:rPr>
+          <w:rFonts w:ascii="Times New Roman" w:hAnsi="Times New Roman" w:eastAsia="宋体"/>
+        </w:rPr>
+        <w:t>和</w:t>
+      </w:r>
+      <w:r>
+        <w:rPr>
+          <w:rFonts w:ascii="Consolas" w:hAnsi="Consolas" w:eastAsia="等线"/>
+        </w:rPr>
+        <w:t>ubuntu-latest</w:t>
+      </w:r>
+      <w:r>
+        <w:rPr>
+          <w:rFonts w:ascii="Times New Roman" w:hAnsi="Times New Roman" w:eastAsia="宋体"/>
+        </w:rPr>
+        <w:t>上固定Julia 1.12.6运行。GriddingMachine执行63项回归；GriddingMachineDatasets执行38项配置测试和35项包集成测试；研究仓库执行29个非交互生产案例、M01～M13共65次故障状态断言，以及两个小型确定性NetCDF夹具、两种分发形式各10次的40次测量。通过条件为所有预期测试成功、内容SHA-256一致、预期失败不改变正式文件且无</w:t>
+      </w:r>
+      <w:r>
+        <w:rPr>
+          <w:rFonts w:ascii="Consolas" w:hAnsi="Consolas" w:eastAsia="等线"/>
+        </w:rPr>
+        <w:t>.part</w:t>
+      </w:r>
+      <w:r>
+        <w:rPr>
+          <w:rFonts w:ascii="Times New Roman" w:hAnsi="Times New Roman" w:eastAsia="宋体"/>
+        </w:rPr>
+        <w:t>残留。研究仓库保存各平台实验输出，GriddingMachineDatasets工作流另保存解析后的平台Manifest。</w:t>
+      </w:r>
+    </w:p>
+    <w:p>
+      <w:r>
+        <w:rPr>
+          <w:rFonts w:ascii="Times New Roman" w:hAnsi="Times New Roman" w:eastAsia="宋体"/>
+        </w:rPr>
+        <w:t>CI中的小型分发夹具只用于验证代码路径、文件状态和内容完整性，不替代Windows/macOS真实ELEV/LAI的性能结果。Ubuntu任务也不访问真实FTP/Zenodo，不运行Emerald或真实</w:t>
+      </w:r>
+      <w:r>
+        <w:rPr>
+          <w:rFonts w:ascii="Consolas" w:hAnsi="Consolas" w:eastAsia="等线"/>
+        </w:rPr>
+        <w:t>gm2</w:t>
+      </w:r>
+      <w:r>
+        <w:rPr>
+          <w:rFonts w:ascii="Times New Roman" w:hAnsi="Times New Roman" w:eastAsia="宋体"/>
+        </w:rPr>
+        <w:t>文件。因此，Linux结果只回答上述核心路径能否在固定依赖下执行，不能作为真实网络、模型接口或真实数据案例的三平台证据。</w:t>
+      </w:r>
+    </w:p>
+    <w:p>
+      <w:pPr>
         <w:pStyle w:val="Heading1"/>
       </w:pPr>
       <w:r>
@@ -6292,7 +6403,7 @@
         <w:rPr>
           <w:rFonts w:ascii="Times New Roman" w:hAnsi="Times New Roman" w:eastAsia="宋体"/>
         </w:rPr>
-        <w:t>本节只报告当前本地提交和归档日志能够支持的结果。校园网镜像实验尚未完成，本文不据此作出校内FTP性能结论。已归档双平台实验的核心代码提交为</w:t>
+        <w:t>本节只报告固定提交和可追溯日志支持的结果。校园网镜像实验尚未完成，本文不据此作出校内FTP性能结论。Windows与macOS原始实验固定于</w:t>
       </w:r>
       <w:r>
         <w:rPr>
@@ -6316,7 +6427,7 @@
         <w:rPr>
           <w:rFonts w:ascii="Times New Roman" w:hAnsi="Times New Roman" w:eastAsia="宋体"/>
         </w:rPr>
-        <w:t>，Julia 均为1.12.6；依赖统一后的候选论文分支提交为</w:t>
+        <w:t>；依赖统一后的公开候选提交为</w:t>
       </w:r>
       <w:r>
         <w:rPr>
@@ -6328,31 +6439,892 @@
         <w:rPr>
           <w:rFonts w:ascii="Times New Roman" w:hAnsi="Times New Roman" w:eastAsia="宋体"/>
         </w:rPr>
-        <w:t>、</w:t>
+        <w:t>（核心代码仍为</w:t>
       </w:r>
       <w:r>
         <w:rPr>
           <w:rFonts w:ascii="Consolas" w:hAnsi="Consolas" w:eastAsia="等线"/>
         </w:rPr>
+        <w:t>53bb0be</w:t>
+      </w:r>
+      <w:r>
+        <w:rPr>
+          <w:rFonts w:ascii="Times New Roman" w:hAnsi="Times New Roman" w:eastAsia="宋体"/>
+        </w:rPr>
+        <w:t>）、</w:t>
+      </w:r>
+      <w:r>
+        <w:rPr>
+          <w:rFonts w:ascii="Consolas" w:hAnsi="Consolas" w:eastAsia="等线"/>
+        </w:rPr>
         <w:t>GriddingMachineDatasets@5eac56a</w:t>
       </w:r>
       <w:r>
         <w:rPr>
           <w:rFonts w:ascii="Times New Roman" w:hAnsi="Times New Roman" w:eastAsia="宋体"/>
         </w:rPr>
-        <w:t>和</w:t>
+        <w:t>和研究仓库实验冻结提交</w:t>
       </w:r>
       <w:r>
         <w:rPr>
           <w:rFonts w:ascii="Consolas" w:hAnsi="Consolas" w:eastAsia="等线"/>
         </w:rPr>
-        <w:t>Emerald@d79324f</w:t>
-      </w:r>
-      <w:r>
-        <w:rPr>
-          <w:rFonts w:ascii="Times New Roman" w:hAnsi="Times New Roman" w:eastAsia="宋体"/>
-        </w:rPr>
-        <w:t>，最终公开提交号将在远端归档后更新。全部受控实验——生产编号矩阵、分发效率、故障注入与核心自动回归——在Windows与macOS（Apple Silicon）两个环境分别执行并通过，跨平台执行细节见4.5节；真实网络观察在两个平台的校外环境各完成一轮，校园网正式比较仍待执行。Linux是软件的支持目标，但Ubuntu CI运行记录尚未归档，因而不计入本节实证结果。</w:t>
+        <w:t>8a23b5a</w:t>
+      </w:r>
+      <w:r>
+        <w:rPr>
+          <w:rFonts w:ascii="Times New Roman" w:hAnsi="Times New Roman" w:eastAsia="宋体"/>
+        </w:rPr>
+        <w:t>，Julia均为1.12.6。全部受控实验——生产编号矩阵、分发效率、故障注入与核心自动回归——在Windows与macOS（Apple Silicon）分别执行并通过；真实网络观察在两个平台的校外环境各完成一轮。相同固定依赖的Ubuntu CI已完成核心包、生产矩阵、故障矩阵和小型确定性分发测试，但没有运行Emerald、真实网络和真实陆面案例。核心平台覆盖汇总见表4。</w:t>
+      </w:r>
+    </w:p>
+    <w:p>
+      <w:pPr>
+        <w:ind w:firstLine="0"/>
+      </w:pPr>
+      <w:r>
+        <w:rPr>
+          <w:rFonts w:ascii="Times New Roman" w:hAnsi="Times New Roman" w:eastAsia="宋体"/>
+          <w:b/>
+        </w:rPr>
+        <w:t>表4 核心验证结果与平台覆盖</w:t>
+      </w:r>
+    </w:p>
+    <w:tbl>
+      <w:tblPr>
+        <w:tblStyle w:val="TableGrid"/>
+        <w:tblW w:type="auto" w:w="0"/>
+        <w:tblLook w:firstColumn="1" w:firstRow="1" w:lastColumn="0" w:lastRow="0" w:noHBand="0" w:noVBand="1" w:val="04A0"/>
+      </w:tblPr>
+      <w:tblGrid>
+        <w:gridCol w:w="1836"/>
+        <w:gridCol w:w="1836"/>
+        <w:gridCol w:w="1836"/>
+        <w:gridCol w:w="1836"/>
+        <w:gridCol w:w="1836"/>
+      </w:tblGrid>
+      <w:tr>
+        <w:tc>
+          <w:tcPr>
+            <w:tcW w:type="dxa" w:w="1836"/>
+            <w:shd w:fill="D9EAF7"/>
+          </w:tcPr>
+          <w:p>
+            <w:r>
+              <w:rPr>
+                <w:b/>
+                <w:sz w:val="18"/>
+              </w:rPr>
+            </w:r>
+            <w:r>
+              <w:rPr>
+                <w:rFonts w:ascii="Times New Roman" w:hAnsi="Times New Roman" w:eastAsia="宋体"/>
+                <w:b/>
+                <w:sz w:val="18"/>
+              </w:rPr>
+              <w:t>验证对象</w:t>
+            </w:r>
+          </w:p>
+        </w:tc>
+        <w:tc>
+          <w:tcPr>
+            <w:tcW w:type="dxa" w:w="1836"/>
+            <w:shd w:fill="D9EAF7"/>
+          </w:tcPr>
+          <w:p>
+            <w:r>
+              <w:rPr>
+                <w:b/>
+                <w:sz w:val="18"/>
+              </w:rPr>
+            </w:r>
+            <w:r>
+              <w:rPr>
+                <w:rFonts w:ascii="Times New Roman" w:hAnsi="Times New Roman" w:eastAsia="宋体"/>
+                <w:b/>
+                <w:sz w:val="18"/>
+              </w:rPr>
+              <w:t>Windows</w:t>
+            </w:r>
+          </w:p>
+        </w:tc>
+        <w:tc>
+          <w:tcPr>
+            <w:tcW w:type="dxa" w:w="1836"/>
+            <w:shd w:fill="D9EAF7"/>
+          </w:tcPr>
+          <w:p>
+            <w:r>
+              <w:rPr>
+                <w:b/>
+                <w:sz w:val="18"/>
+              </w:rPr>
+            </w:r>
+            <w:r>
+              <w:rPr>
+                <w:rFonts w:ascii="Times New Roman" w:hAnsi="Times New Roman" w:eastAsia="宋体"/>
+                <w:b/>
+                <w:sz w:val="18"/>
+              </w:rPr>
+              <w:t>macOS</w:t>
+            </w:r>
+          </w:p>
+        </w:tc>
+        <w:tc>
+          <w:tcPr>
+            <w:tcW w:type="dxa" w:w="1836"/>
+            <w:shd w:fill="D9EAF7"/>
+          </w:tcPr>
+          <w:p>
+            <w:r>
+              <w:rPr>
+                <w:b/>
+                <w:sz w:val="18"/>
+              </w:rPr>
+            </w:r>
+            <w:r>
+              <w:rPr>
+                <w:rFonts w:ascii="Times New Roman" w:hAnsi="Times New Roman" w:eastAsia="宋体"/>
+                <w:b/>
+                <w:sz w:val="18"/>
+              </w:rPr>
+              <w:t>Linux（Ubuntu CI）</w:t>
+            </w:r>
+          </w:p>
+        </w:tc>
+        <w:tc>
+          <w:tcPr>
+            <w:tcW w:type="dxa" w:w="1836"/>
+            <w:shd w:fill="D9EAF7"/>
+          </w:tcPr>
+          <w:p>
+            <w:r>
+              <w:rPr>
+                <w:b/>
+                <w:sz w:val="18"/>
+              </w:rPr>
+            </w:r>
+            <w:r>
+              <w:rPr>
+                <w:rFonts w:ascii="Times New Roman" w:hAnsi="Times New Roman" w:eastAsia="宋体"/>
+                <w:b/>
+                <w:sz w:val="18"/>
+              </w:rPr>
+              <w:t>证据边界</w:t>
+            </w:r>
+          </w:p>
+        </w:tc>
+      </w:tr>
+      <w:tr>
+        <w:tc>
+          <w:tcPr>
+            <w:tcW w:type="dxa" w:w="1836"/>
+          </w:tcPr>
+          <w:p>
+            <w:r>
+              <w:rPr>
+                <w:sz w:val="18"/>
+              </w:rPr>
+            </w:r>
+            <w:r>
+              <w:rPr>
+                <w:rFonts w:ascii="Times New Roman" w:hAnsi="Times New Roman" w:eastAsia="宋体"/>
+                <w:sz w:val="18"/>
+              </w:rPr>
+              <w:t>GriddingMachine / GriddingMachineDatasets自动回归</w:t>
+            </w:r>
+          </w:p>
+        </w:tc>
+        <w:tc>
+          <w:tcPr>
+            <w:tcW w:type="dxa" w:w="1836"/>
+          </w:tcPr>
+          <w:p>
+            <w:r>
+              <w:rPr>
+                <w:sz w:val="18"/>
+              </w:rPr>
+            </w:r>
+            <w:r>
+              <w:rPr>
+                <w:rFonts w:ascii="Times New Roman" w:hAnsi="Times New Roman" w:eastAsia="宋体"/>
+                <w:sz w:val="18"/>
+              </w:rPr>
+              <w:t>63/63；73/73</w:t>
+            </w:r>
+          </w:p>
+        </w:tc>
+        <w:tc>
+          <w:tcPr>
+            <w:tcW w:type="dxa" w:w="1836"/>
+          </w:tcPr>
+          <w:p>
+            <w:r>
+              <w:rPr>
+                <w:sz w:val="18"/>
+              </w:rPr>
+            </w:r>
+            <w:r>
+              <w:rPr>
+                <w:rFonts w:ascii="Times New Roman" w:hAnsi="Times New Roman" w:eastAsia="宋体"/>
+                <w:sz w:val="18"/>
+              </w:rPr>
+              <w:t>63/63；73/73</w:t>
+            </w:r>
+          </w:p>
+        </w:tc>
+        <w:tc>
+          <w:tcPr>
+            <w:tcW w:type="dxa" w:w="1836"/>
+          </w:tcPr>
+          <w:p>
+            <w:r>
+              <w:rPr>
+                <w:sz w:val="18"/>
+              </w:rPr>
+            </w:r>
+            <w:r>
+              <w:rPr>
+                <w:rFonts w:ascii="Times New Roman" w:hAnsi="Times New Roman" w:eastAsia="宋体"/>
+                <w:sz w:val="18"/>
+              </w:rPr>
+              <w:t>63/63；73/73</w:t>
+            </w:r>
+          </w:p>
+        </w:tc>
+        <w:tc>
+          <w:tcPr>
+            <w:tcW w:type="dxa" w:w="1836"/>
+          </w:tcPr>
+          <w:p>
+            <w:r>
+              <w:rPr>
+                <w:sz w:val="18"/>
+              </w:rPr>
+            </w:r>
+            <w:r>
+              <w:rPr>
+                <w:rFonts w:ascii="Times New Roman" w:hAnsi="Times New Roman" w:eastAsia="宋体"/>
+                <w:sz w:val="18"/>
+              </w:rPr>
+              <w:t>包级功能与固定依赖</w:t>
+            </w:r>
+          </w:p>
+        </w:tc>
+      </w:tr>
+      <w:tr>
+        <w:tc>
+          <w:tcPr>
+            <w:tcW w:type="dxa" w:w="1836"/>
+          </w:tcPr>
+          <w:p>
+            <w:r>
+              <w:rPr>
+                <w:sz w:val="18"/>
+              </w:rPr>
+            </w:r>
+            <w:r>
+              <w:rPr>
+                <w:rFonts w:ascii="Times New Roman" w:hAnsi="Times New Roman" w:eastAsia="宋体"/>
+                <w:sz w:val="18"/>
+              </w:rPr>
+              <w:t>生产矩阵中的29个非交互案例</w:t>
+            </w:r>
+          </w:p>
+        </w:tc>
+        <w:tc>
+          <w:tcPr>
+            <w:tcW w:type="dxa" w:w="1836"/>
+          </w:tcPr>
+          <w:p>
+            <w:r>
+              <w:rPr>
+                <w:sz w:val="18"/>
+              </w:rPr>
+            </w:r>
+            <w:r>
+              <w:rPr>
+                <w:rFonts w:ascii="Times New Roman" w:hAnsi="Times New Roman" w:eastAsia="宋体"/>
+                <w:sz w:val="18"/>
+              </w:rPr>
+              <w:t>3轮×29/29</w:t>
+            </w:r>
+          </w:p>
+        </w:tc>
+        <w:tc>
+          <w:tcPr>
+            <w:tcW w:type="dxa" w:w="1836"/>
+          </w:tcPr>
+          <w:p>
+            <w:r>
+              <w:rPr>
+                <w:sz w:val="18"/>
+              </w:rPr>
+            </w:r>
+            <w:r>
+              <w:rPr>
+                <w:rFonts w:ascii="Times New Roman" w:hAnsi="Times New Roman" w:eastAsia="宋体"/>
+                <w:sz w:val="18"/>
+              </w:rPr>
+              <w:t>3轮×29/29</w:t>
+            </w:r>
+          </w:p>
+        </w:tc>
+        <w:tc>
+          <w:tcPr>
+            <w:tcW w:type="dxa" w:w="1836"/>
+          </w:tcPr>
+          <w:p>
+            <w:r>
+              <w:rPr>
+                <w:sz w:val="18"/>
+              </w:rPr>
+            </w:r>
+            <w:r>
+              <w:rPr>
+                <w:rFonts w:ascii="Times New Roman" w:hAnsi="Times New Roman" w:eastAsia="宋体"/>
+                <w:sz w:val="18"/>
+              </w:rPr>
+              <w:t>1轮×29/29</w:t>
+            </w:r>
+          </w:p>
+        </w:tc>
+        <w:tc>
+          <w:tcPr>
+            <w:tcW w:type="dxa" w:w="1836"/>
+          </w:tcPr>
+          <w:p>
+            <w:r>
+              <w:rPr>
+                <w:sz w:val="18"/>
+              </w:rPr>
+            </w:r>
+            <w:r>
+              <w:rPr>
+                <w:rFonts w:ascii="Times New Roman" w:hAnsi="Times New Roman" w:eastAsia="宋体"/>
+                <w:sz w:val="18"/>
+              </w:rPr>
+              <w:t>Ubuntu为CI兼容性运行</w:t>
+            </w:r>
+          </w:p>
+        </w:tc>
+      </w:tr>
+      <w:tr>
+        <w:tc>
+          <w:tcPr>
+            <w:tcW w:type="dxa" w:w="1836"/>
+          </w:tcPr>
+          <w:p>
+            <w:r>
+              <w:rPr>
+                <w:sz w:val="18"/>
+              </w:rPr>
+            </w:r>
+            <w:r>
+              <w:rPr>
+                <w:rFonts w:ascii="Times New Roman" w:hAnsi="Times New Roman" w:eastAsia="宋体"/>
+                <w:sz w:val="18"/>
+              </w:rPr>
+              <w:t>直接NetCDF分发测量</w:t>
+            </w:r>
+          </w:p>
+        </w:tc>
+        <w:tc>
+          <w:tcPr>
+            <w:tcW w:type="dxa" w:w="1836"/>
+          </w:tcPr>
+          <w:p>
+            <w:r>
+              <w:rPr>
+                <w:sz w:val="18"/>
+              </w:rPr>
+            </w:r>
+            <w:r>
+              <w:rPr>
+                <w:rFonts w:ascii="Times New Roman" w:hAnsi="Times New Roman" w:eastAsia="宋体"/>
+                <w:sz w:val="18"/>
+              </w:rPr>
+              <w:t>2个真实样本×2种形式×10次</w:t>
+            </w:r>
+          </w:p>
+        </w:tc>
+        <w:tc>
+          <w:tcPr>
+            <w:tcW w:type="dxa" w:w="1836"/>
+          </w:tcPr>
+          <w:p>
+            <w:r>
+              <w:rPr>
+                <w:sz w:val="18"/>
+              </w:rPr>
+            </w:r>
+            <w:r>
+              <w:rPr>
+                <w:rFonts w:ascii="Times New Roman" w:hAnsi="Times New Roman" w:eastAsia="宋体"/>
+                <w:sz w:val="18"/>
+              </w:rPr>
+              <w:t>2个真实样本×2种形式×10次</w:t>
+            </w:r>
+          </w:p>
+        </w:tc>
+        <w:tc>
+          <w:tcPr>
+            <w:tcW w:type="dxa" w:w="1836"/>
+          </w:tcPr>
+          <w:p>
+            <w:r>
+              <w:rPr>
+                <w:sz w:val="18"/>
+              </w:rPr>
+            </w:r>
+            <w:r>
+              <w:rPr>
+                <w:rFonts w:ascii="Times New Roman" w:hAnsi="Times New Roman" w:eastAsia="宋体"/>
+                <w:sz w:val="18"/>
+              </w:rPr>
+              <w:t>2个小型确定性夹具×2种形式×10次</w:t>
+            </w:r>
+          </w:p>
+        </w:tc>
+        <w:tc>
+          <w:tcPr>
+            <w:tcW w:type="dxa" w:w="1836"/>
+          </w:tcPr>
+          <w:p>
+            <w:r>
+              <w:rPr>
+                <w:sz w:val="18"/>
+              </w:rPr>
+            </w:r>
+            <w:r>
+              <w:rPr>
+                <w:rFonts w:ascii="Times New Roman" w:hAnsi="Times New Roman" w:eastAsia="宋体"/>
+                <w:sz w:val="18"/>
+              </w:rPr>
+              <w:t>Linux数值不与真实样本性能合并</w:t>
+            </w:r>
+          </w:p>
+        </w:tc>
+      </w:tr>
+      <w:tr>
+        <w:tc>
+          <w:tcPr>
+            <w:tcW w:type="dxa" w:w="1836"/>
+          </w:tcPr>
+          <w:p>
+            <w:r>
+              <w:rPr>
+                <w:sz w:val="18"/>
+              </w:rPr>
+            </w:r>
+            <w:r>
+              <w:rPr>
+                <w:rFonts w:ascii="Times New Roman" w:hAnsi="Times New Roman" w:eastAsia="宋体"/>
+                <w:sz w:val="18"/>
+              </w:rPr>
+              <w:t>M01～M13故障状态断言</w:t>
+            </w:r>
+          </w:p>
+        </w:tc>
+        <w:tc>
+          <w:tcPr>
+            <w:tcW w:type="dxa" w:w="1836"/>
+          </w:tcPr>
+          <w:p>
+            <w:r>
+              <w:rPr>
+                <w:sz w:val="18"/>
+              </w:rPr>
+            </w:r>
+            <w:r>
+              <w:rPr>
+                <w:rFonts w:ascii="Times New Roman" w:hAnsi="Times New Roman" w:eastAsia="宋体"/>
+                <w:sz w:val="18"/>
+              </w:rPr>
+              <w:t>65/65</w:t>
+            </w:r>
+          </w:p>
+        </w:tc>
+        <w:tc>
+          <w:tcPr>
+            <w:tcW w:type="dxa" w:w="1836"/>
+          </w:tcPr>
+          <w:p>
+            <w:r>
+              <w:rPr>
+                <w:sz w:val="18"/>
+              </w:rPr>
+            </w:r>
+            <w:r>
+              <w:rPr>
+                <w:rFonts w:ascii="Times New Roman" w:hAnsi="Times New Roman" w:eastAsia="宋体"/>
+                <w:sz w:val="18"/>
+              </w:rPr>
+              <w:t>65/65</w:t>
+            </w:r>
+          </w:p>
+        </w:tc>
+        <w:tc>
+          <w:tcPr>
+            <w:tcW w:type="dxa" w:w="1836"/>
+          </w:tcPr>
+          <w:p>
+            <w:r>
+              <w:rPr>
+                <w:sz w:val="18"/>
+              </w:rPr>
+            </w:r>
+            <w:r>
+              <w:rPr>
+                <w:rFonts w:ascii="Times New Roman" w:hAnsi="Times New Roman" w:eastAsia="宋体"/>
+                <w:sz w:val="18"/>
+              </w:rPr>
+              <w:t>65/65</w:t>
+            </w:r>
+          </w:p>
+        </w:tc>
+        <w:tc>
+          <w:tcPr>
+            <w:tcW w:type="dxa" w:w="1836"/>
+          </w:tcPr>
+          <w:p>
+            <w:r>
+              <w:rPr>
+                <w:sz w:val="18"/>
+              </w:rPr>
+            </w:r>
+            <w:r>
+              <w:rPr>
+                <w:rFonts w:ascii="Times New Roman" w:hAnsi="Times New Roman" w:eastAsia="宋体"/>
+                <w:sz w:val="18"/>
+              </w:rPr>
+              <w:t>注入ping分数与受控HTTP端点</w:t>
+            </w:r>
+          </w:p>
+        </w:tc>
+      </w:tr>
+      <w:tr>
+        <w:tc>
+          <w:tcPr>
+            <w:tcW w:type="dxa" w:w="1836"/>
+          </w:tcPr>
+          <w:p>
+            <w:r>
+              <w:rPr>
+                <w:sz w:val="18"/>
+              </w:rPr>
+            </w:r>
+            <w:r>
+              <w:rPr>
+                <w:rFonts w:ascii="Times New Roman" w:hAnsi="Times New Roman" w:eastAsia="宋体"/>
+                <w:sz w:val="18"/>
+              </w:rPr>
+              <w:t>Emerald最小烟雾</w:t>
+            </w:r>
+          </w:p>
+        </w:tc>
+        <w:tc>
+          <w:tcPr>
+            <w:tcW w:type="dxa" w:w="1836"/>
+          </w:tcPr>
+          <w:p>
+            <w:r>
+              <w:rPr>
+                <w:sz w:val="18"/>
+              </w:rPr>
+            </w:r>
+            <w:r>
+              <w:rPr>
+                <w:rFonts w:ascii="Times New Roman" w:hAnsi="Times New Roman" w:eastAsia="宋体"/>
+                <w:sz w:val="18"/>
+              </w:rPr>
+              <w:t>5/5</w:t>
+            </w:r>
+          </w:p>
+        </w:tc>
+        <w:tc>
+          <w:tcPr>
+            <w:tcW w:type="dxa" w:w="1836"/>
+          </w:tcPr>
+          <w:p>
+            <w:r>
+              <w:rPr>
+                <w:sz w:val="18"/>
+              </w:rPr>
+            </w:r>
+            <w:r>
+              <w:rPr>
+                <w:rFonts w:ascii="Times New Roman" w:hAnsi="Times New Roman" w:eastAsia="宋体"/>
+                <w:sz w:val="18"/>
+              </w:rPr>
+              <w:t>5/5</w:t>
+            </w:r>
+          </w:p>
+        </w:tc>
+        <w:tc>
+          <w:tcPr>
+            <w:tcW w:type="dxa" w:w="1836"/>
+          </w:tcPr>
+          <w:p>
+            <w:r>
+              <w:rPr>
+                <w:sz w:val="18"/>
+              </w:rPr>
+            </w:r>
+            <w:r>
+              <w:rPr>
+                <w:rFonts w:ascii="Times New Roman" w:hAnsi="Times New Roman" w:eastAsia="宋体"/>
+                <w:sz w:val="18"/>
+              </w:rPr>
+              <w:t>未运行</w:t>
+            </w:r>
+          </w:p>
+        </w:tc>
+        <w:tc>
+          <w:tcPr>
+            <w:tcW w:type="dxa" w:w="1836"/>
+          </w:tcPr>
+          <w:p>
+            <w:r>
+              <w:rPr>
+                <w:sz w:val="18"/>
+              </w:rPr>
+            </w:r>
+            <w:r>
+              <w:rPr>
+                <w:rFonts w:ascii="Times New Roman" w:hAnsi="Times New Roman" w:eastAsia="宋体"/>
+                <w:sz w:val="18"/>
+              </w:rPr>
+              <w:t>macOS为已归档基线提交；Linux不作模型接口结论</w:t>
+            </w:r>
+          </w:p>
+        </w:tc>
+      </w:tr>
+      <w:tr>
+        <w:tc>
+          <w:tcPr>
+            <w:tcW w:type="dxa" w:w="1836"/>
+          </w:tcPr>
+          <w:p>
+            <w:r>
+              <w:rPr>
+                <w:sz w:val="18"/>
+              </w:rPr>
+            </w:r>
+            <w:r>
+              <w:rPr>
+                <w:rFonts w:ascii="Times New Roman" w:hAnsi="Times New Roman" w:eastAsia="宋体"/>
+                <w:sz w:val="18"/>
+              </w:rPr>
+              <w:t>校外FTP—Zenodo真实访问</w:t>
+            </w:r>
+          </w:p>
+        </w:tc>
+        <w:tc>
+          <w:tcPr>
+            <w:tcW w:type="dxa" w:w="1836"/>
+          </w:tcPr>
+          <w:p>
+            <w:r>
+              <w:rPr>
+                <w:sz w:val="18"/>
+              </w:rPr>
+            </w:r>
+            <w:r>
+              <w:rPr>
+                <w:rFonts w:ascii="Times New Roman" w:hAnsi="Times New Roman" w:eastAsia="宋体"/>
+                <w:sz w:val="18"/>
+              </w:rPr>
+              <w:t>Zenodo 12/12；FTP 0/12</w:t>
+            </w:r>
+          </w:p>
+        </w:tc>
+        <w:tc>
+          <w:tcPr>
+            <w:tcW w:type="dxa" w:w="1836"/>
+          </w:tcPr>
+          <w:p>
+            <w:r>
+              <w:rPr>
+                <w:sz w:val="18"/>
+              </w:rPr>
+            </w:r>
+            <w:r>
+              <w:rPr>
+                <w:rFonts w:ascii="Times New Roman" w:hAnsi="Times New Roman" w:eastAsia="宋体"/>
+                <w:sz w:val="18"/>
+              </w:rPr>
+              <w:t>Zenodo 12/12；FTP 0/12</w:t>
+            </w:r>
+          </w:p>
+        </w:tc>
+        <w:tc>
+          <w:tcPr>
+            <w:tcW w:type="dxa" w:w="1836"/>
+          </w:tcPr>
+          <w:p>
+            <w:r>
+              <w:rPr>
+                <w:sz w:val="18"/>
+              </w:rPr>
+            </w:r>
+            <w:r>
+              <w:rPr>
+                <w:rFonts w:ascii="Times New Roman" w:hAnsi="Times New Roman" w:eastAsia="宋体"/>
+                <w:sz w:val="18"/>
+              </w:rPr>
+              <w:t>未运行</w:t>
+            </w:r>
+          </w:p>
+        </w:tc>
+        <w:tc>
+          <w:tcPr>
+            <w:tcW w:type="dxa" w:w="1836"/>
+          </w:tcPr>
+          <w:p>
+            <w:r>
+              <w:rPr>
+                <w:sz w:val="18"/>
+              </w:rPr>
+            </w:r>
+            <w:r>
+              <w:rPr>
+                <w:rFonts w:ascii="Times New Roman" w:hAnsi="Times New Roman" w:eastAsia="宋体"/>
+                <w:sz w:val="18"/>
+              </w:rPr>
+              <w:t>仅表示对应校外网络；校园网待测</w:t>
+            </w:r>
+          </w:p>
+        </w:tc>
+      </w:tr>
+      <w:tr>
+        <w:tc>
+          <w:tcPr>
+            <w:tcW w:type="dxa" w:w="1836"/>
+          </w:tcPr>
+          <w:p>
+            <w:r>
+              <w:rPr>
+                <w:sz w:val="18"/>
+              </w:rPr>
+            </w:r>
+            <w:r>
+              <w:rPr>
+                <w:rFonts w:ascii="Times New Roman" w:hAnsi="Times New Roman" w:eastAsia="宋体"/>
+                <w:sz w:val="18"/>
+              </w:rPr>
+              <w:t>真实</w:t>
+            </w:r>
+            <w:r>
+              <w:rPr>
+                <w:rFonts w:ascii="Consolas" w:hAnsi="Consolas" w:eastAsia="等线"/>
+                <w:sz w:val="18"/>
+              </w:rPr>
+              <w:t>gm2</w:t>
+            </w:r>
+            <w:r>
+              <w:rPr>
+                <w:rFonts w:ascii="Times New Roman" w:hAnsi="Times New Roman" w:eastAsia="宋体"/>
+                <w:sz w:val="18"/>
+              </w:rPr>
+              <w:t>陆面案例</w:t>
+            </w:r>
+          </w:p>
+        </w:tc>
+        <w:tc>
+          <w:tcPr>
+            <w:tcW w:type="dxa" w:w="1836"/>
+          </w:tcPr>
+          <w:p>
+            <w:r>
+              <w:rPr>
+                <w:sz w:val="18"/>
+              </w:rPr>
+            </w:r>
+            <w:r>
+              <w:rPr>
+                <w:rFonts w:ascii="Times New Roman" w:hAnsi="Times New Roman" w:eastAsia="宋体"/>
+                <w:sz w:val="18"/>
+              </w:rPr>
+              <w:t>14个文件完整性通过；US-NR1成功、非植被格点按预期拒绝</w:t>
+            </w:r>
+          </w:p>
+        </w:tc>
+        <w:tc>
+          <w:tcPr>
+            <w:tcW w:type="dxa" w:w="1836"/>
+          </w:tcPr>
+          <w:p>
+            <w:r>
+              <w:rPr>
+                <w:sz w:val="18"/>
+              </w:rPr>
+            </w:r>
+            <w:r>
+              <w:rPr>
+                <w:rFonts w:ascii="Times New Roman" w:hAnsi="Times New Roman" w:eastAsia="宋体"/>
+                <w:sz w:val="18"/>
+              </w:rPr>
+              <w:t>未独立重复</w:t>
+            </w:r>
+          </w:p>
+        </w:tc>
+        <w:tc>
+          <w:tcPr>
+            <w:tcW w:type="dxa" w:w="1836"/>
+          </w:tcPr>
+          <w:p>
+            <w:r>
+              <w:rPr>
+                <w:sz w:val="18"/>
+              </w:rPr>
+            </w:r>
+            <w:r>
+              <w:rPr>
+                <w:rFonts w:ascii="Times New Roman" w:hAnsi="Times New Roman" w:eastAsia="宋体"/>
+                <w:sz w:val="18"/>
+              </w:rPr>
+              <w:t>未运行</w:t>
+            </w:r>
+          </w:p>
+        </w:tc>
+        <w:tc>
+          <w:tcPr>
+            <w:tcW w:type="dxa" w:w="1836"/>
+          </w:tcPr>
+          <w:p>
+            <w:r>
+              <w:rPr>
+                <w:sz w:val="18"/>
+              </w:rPr>
+            </w:r>
+            <w:r>
+              <w:rPr>
+                <w:rFonts w:ascii="Times New Roman" w:hAnsi="Times New Roman" w:eastAsia="宋体"/>
+                <w:sz w:val="18"/>
+              </w:rPr>
+              <w:t>不构成逐字段科学金标准</w:t>
+            </w:r>
+          </w:p>
+        </w:tc>
+      </w:tr>
+    </w:tbl>
+    <w:p>
+      <w:pPr>
+        <w:ind w:firstLine="0"/>
+      </w:pPr>
+      <w:r>
+        <w:rPr>
+          <w:rFonts w:ascii="Times New Roman" w:hAnsi="Times New Roman" w:eastAsia="宋体"/>
+          <w:b/>
+        </w:rPr>
+        <w:t>Table 4 Core validation results and platform coverage.</w:t>
+      </w:r>
+      <w:r>
+        <w:rPr>
+          <w:rFonts w:ascii="Times New Roman" w:hAnsi="Times New Roman" w:eastAsia="宋体"/>
+        </w:rPr>
+        <w:t xml:space="preserve"> Windows and macOS provide the complete controlled-experiment evidence. Ubuntu CI verifies the listed core paths using fixed dependencies and small deterministic fixtures; it does not cover Emerald, real-network access, or real land files.</w:t>
       </w:r>
     </w:p>
     <w:p>
@@ -6717,191 +7689,101 @@
     </w:p>
     <w:p>
       <w:pPr>
-        <w:pStyle w:val="Heading2"/>
+        <w:jc w:val="center"/>
       </w:pPr>
       <w:r>
-        <w:rPr>
-          <w:rFonts w:ascii="Times New Roman" w:hAnsi="Times New Roman" w:eastAsia="宋体"/>
-        </w:rPr>
-        <w:t>4.3 Collector、完整性校验与故障分支</w:t>
+        <w:drawing>
+          <wp:inline xmlns:a="http://schemas.openxmlformats.org/drawingml/2006/main" xmlns:pic="http://schemas.openxmlformats.org/drawingml/2006/picture">
+            <wp:extent cx="5400000" cy="2756609"/>
+            <wp:docPr id="2" name="Picture 2"/>
+            <wp:cNvGraphicFramePr>
+              <a:graphicFrameLocks noChangeAspect="1"/>
+            </wp:cNvGraphicFramePr>
+            <a:graphic>
+              <a:graphicData uri="http://schemas.openxmlformats.org/drawingml/2006/picture">
+                <pic:pic>
+                  <pic:nvPicPr>
+                    <pic:cNvPr id="0" name="图2_直接NetCDF分发效率.png"/>
+                    <pic:cNvPicPr/>
+                  </pic:nvPicPr>
+                  <pic:blipFill>
+                    <a:blip r:embed="rId10"/>
+                    <a:stretch>
+                      <a:fillRect/>
+                    </a:stretch>
+                  </pic:blipFill>
+                  <pic:spPr>
+                    <a:xfrm>
+                      <a:off x="0" y="0"/>
+                      <a:ext cx="5400000" cy="2756609"/>
+                    </a:xfrm>
+                    <a:prstGeom prst="rect"/>
+                  </pic:spPr>
+                </pic:pic>
+              </a:graphicData>
+            </a:graphic>
+          </wp:inline>
+        </w:drawing>
       </w:r>
     </w:p>
     <w:p>
+      <w:pPr>
+        <w:ind w:firstLine="0"/>
+      </w:pPr>
+      <w:r>
+        <w:rPr>
+          <w:rFonts w:ascii="Times New Roman" w:hAnsi="Times New Roman" w:eastAsia="宋体"/>
+          <w:b/>
+        </w:rPr>
+        <w:t>图2 直接NetCDF与外层`tar.gz`的暖缓存端到端时间比较</w:t>
+      </w:r>
+      <w:r>
+        <w:rPr>
+          <w:rFonts w:ascii="Times New Roman" w:hAnsi="Times New Roman" w:eastAsia="宋体"/>
+        </w:rPr>
+        <w:t xml:space="preserve"> （a）二维ELEV样本；（b）三维LAI样本。柱高为10次重复的中位数，误差线为95% bootstrap置信区间，标注值为直接NetCDF相对</w:t>
+      </w:r>
       <w:r>
         <w:rPr>
           <w:rFonts w:ascii="Consolas" w:hAnsi="Consolas" w:eastAsia="等线"/>
         </w:rPr>
-        <w:t>GriddingMachine</w:t>
-      </w:r>
-      <w:r>
-        <w:rPr>
-          <w:rFonts w:ascii="Times New Roman" w:hAnsi="Times New Roman" w:eastAsia="宋体"/>
-        </w:rPr>
-        <w:t>自动回归共63项，全部通过：目录初始化和schema 5项、事务式目录更新6项、镜像回退/缓存隔离/完整性校验及Windows ping解析10项、同步/信息/目录树/安全清理8项、</w:t>
-      </w:r>
-      <w:r>
-        <w:rPr>
-          <w:rFonts w:ascii="Consolas" w:hAnsi="Consolas" w:eastAsia="等线"/>
-        </w:rPr>
-        <w:t>read_dataset</w:t>
-      </w:r>
-      <w:r>
-        <w:rPr>
-          <w:rFonts w:ascii="Times New Roman" w:hAnsi="Times New Roman" w:eastAsia="宋体"/>
-        </w:rPr>
-        <w:t xml:space="preserve"> 18项、模型输入字典15项。受控fixture已验证错误大小、错误哈希、首选镜像失败和全部镜像失败时不会把错误缓存作为正式数据，并验证目录损坏不覆盖上一有效目录。所有清理测试均限定在临时数据根目录。</w:t>
+        <w:t>tar.gz</w:t>
+      </w:r>
+      <w:r>
+        <w:rPr>
+          <w:rFonts w:ascii="Times New Roman" w:hAnsi="Times New Roman" w:eastAsia="宋体"/>
+        </w:rPr>
+        <w:t>的中位时间降幅。Windows与macOS使用SHA-256相同的输入文件，但绝对耗时不跨平台合并。</w:t>
       </w:r>
     </w:p>
     <w:p>
-      <w:r>
-        <w:rPr>
-          <w:rFonts w:ascii="Times New Roman" w:hAnsi="Times New Roman" w:eastAsia="宋体"/>
-        </w:rPr>
-        <w:t>当前包级M01～M13矩阵使用固定注入ping分数，在Windows与macOS上分别每场景重复5次，两个平台各65次状态断言全部通过。M01验证较低ping镜像优先；M03验证有限值排在</w:t>
+      <w:pPr>
+        <w:ind w:firstLine="0"/>
+      </w:pPr>
+      <w:r>
+        <w:rPr>
+          <w:rFonts w:ascii="Times New Roman" w:hAnsi="Times New Roman" w:eastAsia="宋体"/>
+          <w:b/>
+        </w:rPr>
+        <w:t>Fig. 2 Warm-cache end-to-end time for direct NetCDF and outer `tar.gz` distribution.</w:t>
+      </w:r>
+      <w:r>
+        <w:rPr>
+          <w:rFonts w:ascii="Times New Roman" w:hAnsi="Times New Roman" w:eastAsia="宋体"/>
+        </w:rPr>
+        <w:t xml:space="preserve"> (a) The two-dimensional ELEV sample; (b) the three-dimensional LAI sample. Bars show medians from 10 repetitions, error bars show 95% bootstrap confidence intervals, and annotations give the median-time reduction for direct NetCDF relative to </w:t>
       </w:r>
       <w:r>
         <w:rPr>
           <w:rFonts w:ascii="Consolas" w:hAnsi="Consolas" w:eastAsia="等线"/>
         </w:rPr>
-        <w:t>Inf</w:t>
-      </w:r>
-      <w:r>
-        <w:rPr>
-          <w:rFonts w:ascii="Times New Roman" w:hAnsi="Times New Roman" w:eastAsia="宋体"/>
-        </w:rPr>
-        <w:t>之前；M05验证唯一URL即使ping为</w:t>
-      </w:r>
-      <w:r>
-        <w:rPr>
-          <w:rFonts w:ascii="Consolas" w:hAnsi="Consolas" w:eastAsia="等线"/>
-        </w:rPr>
-        <w:t>Inf</w:t>
-      </w:r>
-      <w:r>
-        <w:rPr>
-          <w:rFonts w:ascii="Times New Roman" w:hAnsi="Times New Roman" w:eastAsia="宋体"/>
-        </w:rPr>
-        <w:t>仍会下载；M07验证所有ping为</w:t>
-      </w:r>
-      <w:r>
-        <w:rPr>
-          <w:rFonts w:ascii="Consolas" w:hAnsi="Consolas" w:eastAsia="等线"/>
-        </w:rPr>
-        <w:t>Inf</w:t>
-      </w:r>
-      <w:r>
-        <w:rPr>
-          <w:rFonts w:ascii="Times New Roman" w:hAnsi="Times New Roman" w:eastAsia="宋体"/>
-        </w:rPr>
-        <w:t>时URL仍全部进入尝试队列。其余场景覆盖404、连接重置、全部下载失败、稳定cache、截断cache、同长度错误内容、传输截断、已有完整正式文件和同大小错误SHA-256。两个平台130次运行的</w:t>
-      </w:r>
-      <w:r>
-        <w:rPr>
-          <w:rFonts w:ascii="Consolas" w:hAnsi="Consolas" w:eastAsia="等线"/>
-        </w:rPr>
-        <w:t>.part</w:t>
-      </w:r>
-      <w:r>
-        <w:rPr>
-          <w:rFonts w:ascii="Times New Roman" w:hAnsi="Times New Roman" w:eastAsia="宋体"/>
-        </w:rPr>
-        <w:t>残留均为0，预期失败场景保持旧正式文件不变。</w:t>
-      </w:r>
-    </w:p>
-    <w:p>
-      <w:r>
-        <w:rPr>
-          <w:rFonts w:ascii="Times New Roman" w:hAnsi="Times New Roman" w:eastAsia="宋体"/>
-        </w:rPr>
-        <w:t>Windows ping解析恢复后，提交</w:t>
-      </w:r>
-      <w:r>
-        <w:rPr>
-          <w:rFonts w:ascii="Consolas" w:hAnsi="Consolas" w:eastAsia="等线"/>
-        </w:rPr>
-        <w:t>53bb0be</w:t>
-      </w:r>
-      <w:r>
-        <w:rPr>
-          <w:rFonts w:ascii="Times New Roman" w:hAnsi="Times New Roman" w:eastAsia="宋体"/>
-        </w:rPr>
-        <w:t>中的完整包在两个平台均正常加载，63项测试全部通过，其中两项新增测试覆盖正常响应与超时文本的ping延迟解析。包测试与注入ping矩阵分别验证真实Windows文本解析和确定性排序/状态逻辑；macOS上该解析函数按实现返回</w:t>
-      </w:r>
-      <w:r>
-        <w:rPr>
-          <w:rFonts w:ascii="Consolas" w:hAnsi="Consolas" w:eastAsia="等线"/>
-        </w:rPr>
-        <w:t>Inf</w:t>
-      </w:r>
-      <w:r>
-        <w:rPr>
-          <w:rFonts w:ascii="Times New Roman" w:hAnsi="Times New Roman" w:eastAsia="宋体"/>
-        </w:rPr>
-        <w:t>，相应排序行为由注入分数矩阵覆盖。</w:t>
-      </w:r>
-    </w:p>
-    <w:p>
-      <w:r>
-        <w:rPr>
-          <w:rFonts w:ascii="Times New Roman" w:hAnsi="Times New Roman" w:eastAsia="宋体"/>
-        </w:rPr>
-        <w:t>在两个非校园网环境中进一步实际访问4个标签的FTP和Zenodo地址，每个文件—镜像组合重复3次。Windows轮：ping对两个主机均返回</w:t>
-      </w:r>
-      <w:r>
-        <w:rPr>
-          <w:rFonts w:ascii="Consolas" w:hAnsi="Consolas" w:eastAsia="等线"/>
-        </w:rPr>
-        <w:t>Inf</w:t>
-      </w:r>
-      <w:r>
-        <w:rPr>
-          <w:rFonts w:ascii="Times New Roman" w:hAnsi="Times New Roman" w:eastAsia="宋体"/>
-        </w:rPr>
-        <w:t>，FTP的12次尝试全部在10 s连接超时，Zenodo的12次下载全部达到登记字节数并通过SHA-256，中位下载时间随文件大小由6.639 s增至271.507 s；20 s预实验仅使最小文件通过，说明下载超时必须与文件规模和网络条件共同解释。macOS轮：该环境默认解析器将</w:t>
-      </w:r>
-      <w:r>
-        <w:rPr>
-          <w:rFonts w:ascii="Consolas" w:hAnsi="Consolas" w:eastAsia="等线"/>
-        </w:rPr>
-        <w:t>zenodo.org</w:t>
-      </w:r>
-      <w:r>
-        <w:rPr>
-          <w:rFonts w:ascii="Times New Roman" w:hAnsi="Times New Roman" w:eastAsia="宋体"/>
-        </w:rPr>
-        <w:t>污染为</w:t>
-      </w:r>
-      <w:r>
-        <w:rPr>
-          <w:rFonts w:ascii="Consolas" w:hAnsi="Consolas" w:eastAsia="等线"/>
-        </w:rPr>
-        <w:t>0.0.0.0</w:t>
-      </w:r>
-      <w:r>
-        <w:rPr>
-          <w:rFonts w:ascii="Times New Roman" w:hAnsi="Times New Roman" w:eastAsia="宋体"/>
-        </w:rPr>
-        <w:t>，默认配置下12次Zenodo连接全部失败；经8.8.8.8与1.1.1.1交叉核实真实地址后以显式IP解析重测，12次下载全部通过SIZE与SHA-256核验，中位下载时间由3.8 s（91 KB）增至70.8 s（4.2 MB），且手动探测观察到一次大文件传输中途截断、完整传输后哈希与登记值一致，说明该路径对较大传输偶发中断而非内容损坏；FTP的12次尝试同样全部超时。两轮均无远端写操作，临时下载文件在记录后清除。</w:t>
-      </w:r>
-    </w:p>
-    <w:p>
-      <w:r>
-        <w:rPr>
-          <w:rFonts w:ascii="Times New Roman" w:hAnsi="Times New Roman" w:eastAsia="宋体"/>
-        </w:rPr>
-        <w:t>受控故障注入与真实镜像访问回答不同问题：前者验证失败时的文件状态，后者验证特定网络内FTP与Zenodo的真实可达性、ping顺序和下载表现。两轮校外结果证明ICMP无响应不等于HTTPS不可下载、域名解析故障不等于镜像故障，也支持保留</w:t>
-      </w:r>
-      <w:r>
-        <w:rPr>
-          <w:rFonts w:ascii="Consolas" w:hAnsi="Consolas" w:eastAsia="等线"/>
-        </w:rPr>
-        <w:t>Inf</w:t>
-      </w:r>
-      <w:r>
-        <w:rPr>
-          <w:rFonts w:ascii="Times New Roman" w:hAnsi="Times New Roman" w:eastAsia="宋体"/>
-        </w:rPr>
-        <w:t>地址并实施失败回退；但FTP不可达主要由当前网络边界造成。校园网实验完成前，本文不报告校内最终镜像表现，也不声称ping选择吞吐率最优。</w:t>
+        <w:t>tar.gz</w:t>
+      </w:r>
+      <w:r>
+        <w:rPr>
+          <w:rFonts w:ascii="Times New Roman" w:hAnsi="Times New Roman" w:eastAsia="宋体"/>
+        </w:rPr>
+        <w:t>. Windows and macOS used input files with identical SHA-256 hashes; absolute timings are not pooled across platforms.</w:t>
       </w:r>
     </w:p>
     <w:p>
@@ -6912,75 +7794,33 @@
         <w:rPr>
           <w:rFonts w:ascii="Times New Roman" w:hAnsi="Times New Roman" w:eastAsia="宋体"/>
         </w:rPr>
-        <w:t>4.4 统一读取与模型初始化接口</w:t>
+        <w:t>4.3 Collector、完整性校验与故障分支</w:t>
       </w:r>
     </w:p>
     <w:p>
       <w:r>
         <w:rPr>
-          <w:rFonts w:ascii="Times New Roman" w:hAnsi="Times New Roman" w:eastAsia="宋体"/>
-        </w:rPr>
-        <w:t>合成 NetCDF 回归中，</w:t>
-      </w:r>
-      <w:r>
-        <w:rPr>
           <w:rFonts w:ascii="Consolas" w:hAnsi="Consolas" w:eastAsia="等线"/>
         </w:rPr>
+        <w:t>GriddingMachine</w:t>
+      </w:r>
+      <w:r>
+        <w:rPr>
+          <w:rFonts w:ascii="Times New Roman" w:hAnsi="Times New Roman" w:eastAsia="宋体"/>
+        </w:rPr>
+        <w:t>自动回归共63项，全部通过：目录初始化和schema 5项、事务式目录更新6项、镜像回退/缓存隔离/完整性校验及Windows ping解析10项、同步/信息/目录树/安全清理8项、</w:t>
+      </w:r>
+      <w:r>
+        <w:rPr>
+          <w:rFonts w:ascii="Consolas" w:hAnsi="Consolas" w:eastAsia="等线"/>
+        </w:rPr>
         <w:t>read_dataset</w:t>
       </w:r>
       <w:r>
         <w:rPr>
           <w:rFonts w:ascii="Times New Roman" w:hAnsi="Times New Roman" w:eastAsia="宋体"/>
         </w:rPr>
-        <w:t xml:space="preserve"> 的整场、周期和站点读取、经纬度边界换算及 </w:t>
-      </w:r>
-      <w:r>
-        <w:rPr>
-          <w:rFonts w:ascii="Consolas" w:hAnsi="Consolas" w:eastAsia="等线"/>
-        </w:rPr>
-        <w:t>read_LUT</w:t>
-      </w:r>
-      <w:r>
-        <w:rPr>
-          <w:rFonts w:ascii="Times New Roman" w:hAnsi="Times New Roman" w:eastAsia="宋体"/>
-        </w:rPr>
-        <w:t xml:space="preserve"> 兼容别名均通过，共18项；</w:t>
-      </w:r>
-      <w:r>
-        <w:rPr>
-          <w:rFonts w:ascii="Consolas" w:hAnsi="Consolas" w:eastAsia="等线"/>
-        </w:rPr>
-        <w:t>grid_dict/grid_weather</w:t>
-      </w:r>
-      <w:r>
-        <w:rPr>
-          <w:rFonts w:ascii="Times New Roman" w:hAnsi="Times New Roman" w:eastAsia="宋体"/>
-        </w:rPr>
-        <w:t xml:space="preserve"> 的字段、形状、时间组织和裸土分支共15项通过。测试发现并修复裸土分支把标量传给 </w:t>
-      </w:r>
-      <w:r>
-        <w:rPr>
-          <w:rFonts w:ascii="Consolas" w:hAnsi="Consolas" w:eastAsia="等线"/>
-        </w:rPr>
-        <w:t>resample</w:t>
-      </w:r>
-      <w:r>
-        <w:rPr>
-          <w:rFonts w:ascii="Times New Roman" w:hAnsi="Times New Roman" w:eastAsia="宋体"/>
-        </w:rPr>
-        <w:t xml:space="preserve"> 的错误，并使气象接口返回 Emerald 可接受的普通 </w:t>
-      </w:r>
-      <w:r>
-        <w:rPr>
-          <w:rFonts w:ascii="Consolas" w:hAnsi="Consolas" w:eastAsia="等线"/>
-        </w:rPr>
-        <w:t>Dict</w:t>
-      </w:r>
-      <w:r>
-        <w:rPr>
-          <w:rFonts w:ascii="Times New Roman" w:hAnsi="Times New Roman" w:eastAsia="宋体"/>
-        </w:rPr>
-        <w:t>。</w:t>
+        <w:t xml:space="preserve"> 18项、模型输入字典15项。受控fixture已验证错误大小、错误哈希、首选镜像失败和全部镜像失败时不会把错误缓存作为正式数据，并验证目录损坏不覆盖上一有效目录。所有清理测试均限定在临时数据根目录。</w:t>
       </w:r>
     </w:p>
     <w:p>
@@ -6988,7 +7828,55 @@
         <w:rPr>
           <w:rFonts w:ascii="Times New Roman" w:hAnsi="Times New Roman" w:eastAsia="宋体"/>
         </w:rPr>
-        <w:t>在隔离依赖环境中，Emerald最小烟雾测试5项全部通过，覆盖参数组织、气象组织、模型初始化和60 s单步执行。这证明接口在固定合成输入下能够连接，但不证明US-NR1全部参数的独立科学数值、真实气象、长期模拟或模型性能。</w:t>
+        <w:t>当前包级M01～M13矩阵使用固定注入ping分数，在Windows与macOS上分别每场景重复5次，两个平台各65次状态断言全部通过。M01验证较低ping镜像优先；M03验证有限值排在</w:t>
+      </w:r>
+      <w:r>
+        <w:rPr>
+          <w:rFonts w:ascii="Consolas" w:hAnsi="Consolas" w:eastAsia="等线"/>
+        </w:rPr>
+        <w:t>Inf</w:t>
+      </w:r>
+      <w:r>
+        <w:rPr>
+          <w:rFonts w:ascii="Times New Roman" w:hAnsi="Times New Roman" w:eastAsia="宋体"/>
+        </w:rPr>
+        <w:t>之前；M05验证唯一URL即使ping为</w:t>
+      </w:r>
+      <w:r>
+        <w:rPr>
+          <w:rFonts w:ascii="Consolas" w:hAnsi="Consolas" w:eastAsia="等线"/>
+        </w:rPr>
+        <w:t>Inf</w:t>
+      </w:r>
+      <w:r>
+        <w:rPr>
+          <w:rFonts w:ascii="Times New Roman" w:hAnsi="Times New Roman" w:eastAsia="宋体"/>
+        </w:rPr>
+        <w:t>仍会下载；M07验证所有ping为</w:t>
+      </w:r>
+      <w:r>
+        <w:rPr>
+          <w:rFonts w:ascii="Consolas" w:hAnsi="Consolas" w:eastAsia="等线"/>
+        </w:rPr>
+        <w:t>Inf</w:t>
+      </w:r>
+      <w:r>
+        <w:rPr>
+          <w:rFonts w:ascii="Times New Roman" w:hAnsi="Times New Roman" w:eastAsia="宋体"/>
+        </w:rPr>
+        <w:t>时URL仍全部进入尝试队列。其余场景覆盖404、连接重置、全部下载失败、稳定cache、截断cache、同长度错误内容、传输截断、已有完整正式文件和同大小错误SHA-256。两个平台130次运行的</w:t>
+      </w:r>
+      <w:r>
+        <w:rPr>
+          <w:rFonts w:ascii="Consolas" w:hAnsi="Consolas" w:eastAsia="等线"/>
+        </w:rPr>
+        <w:t>.part</w:t>
+      </w:r>
+      <w:r>
+        <w:rPr>
+          <w:rFonts w:ascii="Times New Roman" w:hAnsi="Times New Roman" w:eastAsia="宋体"/>
+        </w:rPr>
+        <w:t>残留均为0，预期失败场景保持旧正式文件不变。</w:t>
       </w:r>
     </w:p>
     <w:p>
@@ -6996,43 +7884,31 @@
         <w:rPr>
           <w:rFonts w:ascii="Times New Roman" w:hAnsi="Times New Roman" w:eastAsia="宋体"/>
         </w:rPr>
-        <w:t>真实陆面预实验固定使用2020年</w:t>
+        <w:t>Windows ping解析恢复后，提交</w:t>
       </w:r>
       <w:r>
         <w:rPr>
           <w:rFonts w:ascii="Consolas" w:hAnsi="Consolas" w:eastAsia="等线"/>
         </w:rPr>
-        <w:t>gm2</w:t>
-      </w:r>
-      <w:r>
-        <w:rPr>
-          <w:rFonts w:ascii="Times New Roman" w:hAnsi="Times New Roman" w:eastAsia="宋体"/>
-        </w:rPr>
-        <w:t>的14个唯一文件，共184,404,953 B。文件均通过登记字节数、Zenodo来源MD5和本地SHA-256三重核验，目录中的相应</w:t>
+        <w:t>53bb0be</w:t>
+      </w:r>
+      <w:r>
+        <w:rPr>
+          <w:rFonts w:ascii="Times New Roman" w:hAnsi="Times New Roman" w:eastAsia="宋体"/>
+        </w:rPr>
+        <w:t>中的完整包在两个平台均正常加载，63项测试全部通过，其中两项新增测试覆盖正常响应与超时文本的ping延迟解析。包测试与注入ping矩阵分别验证真实Windows文本解析和确定性排序/状态逻辑；macOS上该解析函数按实现返回</w:t>
       </w:r>
       <w:r>
         <w:rPr>
           <w:rFonts w:ascii="Consolas" w:hAnsi="Consolas" w:eastAsia="等线"/>
         </w:rPr>
-        <w:t>SIZE/SHA256</w:t>
-      </w:r>
-      <w:r>
-        <w:rPr>
-          <w:rFonts w:ascii="Times New Roman" w:hAnsi="Times New Roman" w:eastAsia="宋体"/>
-        </w:rPr>
-        <w:t>已补齐。US-NR1请求坐标40.0329°N、105.5464°W映射到中心40.5°N、105.5°W的规则格点，陆地掩膜为0.991592，最大LAI为1.579117；</w:t>
-      </w:r>
-      <w:r>
-        <w:rPr>
-          <w:rFonts w:ascii="Consolas" w:hAnsi="Consolas" w:eastAsia="等线"/>
-        </w:rPr>
-        <w:t>grid_dict</w:t>
-      </w:r>
-      <w:r>
-        <w:rPr>
-          <w:rFonts w:ascii="Times New Roman" w:hAnsi="Times New Roman" w:eastAsia="宋体"/>
-        </w:rPr>
-        <w:t>成功返回34个键、366日序列、4个土壤层和17个PFT，高程为1773.2001 m。撒哈拉请求坐标23°N、13°E映射到23.5°N、13.5°E，LAI为NaN，接口按预期报告目标格点非植被而未生成字典。全过程使用已校验本地文件且网络请求数为0。</w:t>
+        <w:t>Inf</w:t>
+      </w:r>
+      <w:r>
+        <w:rPr>
+          <w:rFonts w:ascii="Times New Roman" w:hAnsi="Times New Roman" w:eastAsia="宋体"/>
+        </w:rPr>
+        <w:t>，相应排序行为由注入分数矩阵覆盖。</w:t>
       </w:r>
     </w:p>
     <w:p>
@@ -7040,67 +7916,63 @@
         <w:rPr>
           <w:rFonts w:ascii="Times New Roman" w:hAnsi="Times New Roman" w:eastAsia="宋体"/>
         </w:rPr>
-        <w:t>这项结果证明真实</w:t>
+        <w:t>在两个非校园网环境中进一步实际访问4个标签的FTP和Zenodo地址，每个文件—镜像组合重复3次。Windows轮：ping对两个主机均返回</w:t>
       </w:r>
       <w:r>
         <w:rPr>
           <w:rFonts w:ascii="Consolas" w:hAnsi="Consolas" w:eastAsia="等线"/>
         </w:rPr>
-        <w:t>gm2</w:t>
-      </w:r>
-      <w:r>
-        <w:rPr>
-          <w:rFonts w:ascii="Times New Roman" w:hAnsi="Times New Roman" w:eastAsia="宋体"/>
-        </w:rPr>
-        <w:t>文件能够通过完整性目录、统一读取和陆面参数组织接口，并覆盖植被与非植被边界；它不是逐字段科学正确性证明。当前2020年</w:t>
+        <w:t>Inf</w:t>
+      </w:r>
+      <w:r>
+        <w:rPr>
+          <w:rFonts w:ascii="Times New Roman" w:hAnsi="Times New Roman" w:eastAsia="宋体"/>
+        </w:rPr>
+        <w:t>，FTP的12次尝试全部在10 s连接超时，Zenodo的12次下载全部达到登记字节数并通过SHA-256，中位下载时间随文件大小由6.639 s增至271.507 s；20 s预实验仅使最小文件通过，说明下载超时必须与文件规模和网络条件共同解释。macOS轮：该环境默认解析器把</w:t>
       </w:r>
       <w:r>
         <w:rPr>
           <w:rFonts w:ascii="Consolas" w:hAnsi="Consolas" w:eastAsia="等线"/>
         </w:rPr>
-        <w:t>wd1</w:t>
-      </w:r>
-      <w:r>
-        <w:rPr>
-          <w:rFonts w:ascii="Times New Roman" w:hAnsi="Times New Roman" w:eastAsia="宋体"/>
-        </w:rPr>
-        <w:t>的8个ERA5条目仅登记机构FTP地址，未给出</w:t>
+        <w:t>zenodo.org</w:t>
+      </w:r>
+      <w:r>
+        <w:rPr>
+          <w:rFonts w:ascii="Times New Roman" w:hAnsi="Times New Roman" w:eastAsia="宋体"/>
+        </w:rPr>
+        <w:t>异常解析为</w:t>
       </w:r>
       <w:r>
         <w:rPr>
           <w:rFonts w:ascii="Consolas" w:hAnsi="Consolas" w:eastAsia="等线"/>
         </w:rPr>
-        <w:t>SIZE/SHA256</w:t>
-      </w:r>
-      <w:r>
-        <w:rPr>
-          <w:rFonts w:ascii="Times New Roman" w:hAnsi="Times New Roman" w:eastAsia="宋体"/>
-        </w:rPr>
-        <w:t>，且本实验环境无法访问该FTP，因此未执行真实</w:t>
+        <w:t>0.0.0.0</w:t>
+      </w:r>
+      <w:r>
+        <w:rPr>
+          <w:rFonts w:ascii="Times New Roman" w:hAnsi="Times New Roman" w:eastAsia="宋体"/>
+        </w:rPr>
+        <w:t>，默认配置下12次Zenodo连接全部失败；经8.8.8.8与1.1.1.1交叉核实地址后以显式IP解析重测，正式记录的12次下载全部通过SIZE与SHA-256核验，中位下载时间由3.8 s（91 KB）增至70.8 s（4.2 MB）。正式记录前的一次手动大文件探测发生中途截断，完整重传后哈希与登记值一致；该单次现象只说明当时网络路径存在传输中断，不足以估计发生率或归因于Zenodo。FTP的12次尝试同样全部超时。两轮均无远端写操作，临时下载文件在记录后清除。</w:t>
+      </w:r>
+    </w:p>
+    <w:p>
+      <w:r>
+        <w:rPr>
+          <w:rFonts w:ascii="Times New Roman" w:hAnsi="Times New Roman" w:eastAsia="宋体"/>
+        </w:rPr>
+        <w:t>受控故障注入与真实镜像访问回答不同问题：前者验证失败时的文件状态，后者验证特定网络内FTP与Zenodo的真实可达性、ping顺序和下载表现。两轮校外结果证明ICMP无响应不等于HTTPS不可下载、域名解析故障不等于镜像故障，也支持保留</w:t>
       </w:r>
       <w:r>
         <w:rPr>
           <w:rFonts w:ascii="Consolas" w:hAnsi="Consolas" w:eastAsia="等线"/>
         </w:rPr>
-        <w:t>grid_weather</w:t>
-      </w:r>
-      <w:r>
-        <w:rPr>
-          <w:rFonts w:ascii="Times New Roman" w:hAnsi="Times New Roman" w:eastAsia="宋体"/>
-        </w:rPr>
-        <w:t>；这不影响受控夹具对接口字段、时间组织和Emerald连通性的验证，但本文不作真实气象科学正确性声明。两个论文分支可在同一进程装载；迁移NetcdfIO接口并修复配置复用后，GriddingMachineDatasets配置测试38/38和包集成35/35通过。其直接</w:t>
-      </w:r>
-      <w:r>
-        <w:rPr>
-          <w:rFonts w:ascii="Consolas" w:hAnsi="Consolas" w:eastAsia="等线"/>
-        </w:rPr>
-        <w:t>Pkg.test</w:t>
-      </w:r>
-      <w:r>
-        <w:rPr>
-          <w:rFonts w:ascii="Times New Roman" w:hAnsi="Times New Roman" w:eastAsia="宋体"/>
-        </w:rPr>
-        <w:t>仍可能重新解析远端依赖，正式归档时应锁定论文分支来源。</w:t>
+        <w:t>Inf</w:t>
+      </w:r>
+      <w:r>
+        <w:rPr>
+          <w:rFonts w:ascii="Times New Roman" w:hAnsi="Times New Roman" w:eastAsia="宋体"/>
+        </w:rPr>
+        <w:t>地址并实施失败回退；但FTP不可达主要由当前网络边界造成。校园网实验完成前，本文不报告校内最终镜像表现，也不声称ping选择吞吐率最优。</w:t>
       </w:r>
     </w:p>
     <w:p>
@@ -7111,7 +7983,7 @@
         <w:rPr>
           <w:rFonts w:ascii="Times New Roman" w:hAnsi="Times New Roman" w:eastAsia="宋体"/>
         </w:rPr>
-        <w:t>4.5 Windows与macOS双平台验证及Linux支持检查</w:t>
+        <w:t>4.4 统一读取与模型初始化接口</w:t>
       </w:r>
     </w:p>
     <w:p>
@@ -7119,103 +7991,67 @@
         <w:rPr>
           <w:rFonts w:ascii="Times New Roman" w:hAnsi="Times New Roman" w:eastAsia="宋体"/>
         </w:rPr>
-        <w:t>为检查前述机制是否依赖单一操作系统，本研究在macOS 26.3.2（Apple Silicon）上以同一Julia 1.12.6和同一提交</w:t>
+        <w:t>合成 NetCDF 回归中，</w:t>
       </w:r>
       <w:r>
         <w:rPr>
           <w:rFonts w:ascii="Consolas" w:hAnsi="Consolas" w:eastAsia="等线"/>
         </w:rPr>
-        <w:t>GriddingMachine@53bb0be</w:t>
-      </w:r>
-      <w:r>
-        <w:rPr>
-          <w:rFonts w:ascii="Times New Roman" w:hAnsi="Times New Roman" w:eastAsia="宋体"/>
-        </w:rPr>
-        <w:t>、</w:t>
+        <w:t>read_dataset</w:t>
+      </w:r>
+      <w:r>
+        <w:rPr>
+          <w:rFonts w:ascii="Times New Roman" w:hAnsi="Times New Roman" w:eastAsia="宋体"/>
+        </w:rPr>
+        <w:t xml:space="preserve"> 的整场、周期和站点读取、经纬度边界换算及 </w:t>
       </w:r>
       <w:r>
         <w:rPr>
           <w:rFonts w:ascii="Consolas" w:hAnsi="Consolas" w:eastAsia="等线"/>
         </w:rPr>
-        <w:t>GriddingMachineDatasets@3926ae3</w:t>
-      </w:r>
-      <w:r>
-        <w:rPr>
-          <w:rFonts w:ascii="Times New Roman" w:hAnsi="Times New Roman" w:eastAsia="宋体"/>
-        </w:rPr>
-        <w:t>复现全部受控实验：核心自动回归GriddingMachine 63项、GriddingMachineDatasets配置38项与包集成35项、Emerald最小烟雾5项全部通过，分组通过数与Windows逐项一致；31编号生产矩阵独立运行3次，每次29个非交互案例全部通过，网络请求数为0；直接NetCDF效率实验40次测量SHA-256全部一致，方向与Windows轮相同（4.2节）；M01～M13故障注入矩阵65次状态断言全部通过、</w:t>
+        <w:t>read_LUT</w:t>
+      </w:r>
+      <w:r>
+        <w:rPr>
+          <w:rFonts w:ascii="Times New Roman" w:hAnsi="Times New Roman" w:eastAsia="宋体"/>
+        </w:rPr>
+        <w:t xml:space="preserve"> 兼容别名均通过，共18项；</w:t>
       </w:r>
       <w:r>
         <w:rPr>
           <w:rFonts w:ascii="Consolas" w:hAnsi="Consolas" w:eastAsia="等线"/>
         </w:rPr>
-        <w:t>.part</w:t>
-      </w:r>
-      <w:r>
-        <w:rPr>
-          <w:rFonts w:ascii="Times New Roman" w:hAnsi="Times New Roman" w:eastAsia="宋体"/>
-        </w:rPr>
-        <w:t>残留为0。macOS环境的Emerald固定为</w:t>
+        <w:t>grid_dict/grid_weather</w:t>
+      </w:r>
+      <w:r>
+        <w:rPr>
+          <w:rFonts w:ascii="Times New Roman" w:hAnsi="Times New Roman" w:eastAsia="宋体"/>
+        </w:rPr>
+        <w:t xml:space="preserve"> 的字段、形状、时间组织和裸土分支共15项通过。测试发现并修复裸土分支把标量传给 </w:t>
       </w:r>
       <w:r>
         <w:rPr>
           <w:rFonts w:ascii="Consolas" w:hAnsi="Consolas" w:eastAsia="等线"/>
         </w:rPr>
-        <w:t>silicormosia/Emerald.jl</w:t>
-      </w:r>
-      <w:r>
-        <w:rPr>
-          <w:rFonts w:ascii="Times New Roman" w:hAnsi="Times New Roman" w:eastAsia="宋体"/>
-        </w:rPr>
-        <w:t>分支</w:t>
+        <w:t>resample</w:t>
+      </w:r>
+      <w:r>
+        <w:rPr>
+          <w:rFonts w:ascii="Times New Roman" w:hAnsi="Times New Roman" w:eastAsia="宋体"/>
+        </w:rPr>
+        <w:t xml:space="preserve"> 的错误，并使气象接口返回 Emerald 可接受的普通 </w:t>
       </w:r>
       <w:r>
         <w:rPr>
           <w:rFonts w:ascii="Consolas" w:hAnsi="Consolas" w:eastAsia="等线"/>
         </w:rPr>
-        <w:t>wyujie</w:t>
-      </w:r>
-      <w:r>
-        <w:rPr>
-          <w:rFonts w:ascii="Times New Roman" w:hAnsi="Times New Roman" w:eastAsia="宋体"/>
-        </w:rPr>
-        <w:t>提交</w:t>
-      </w:r>
-      <w:r>
-        <w:rPr>
-          <w:rFonts w:ascii="Consolas" w:hAnsi="Consolas" w:eastAsia="等线"/>
-        </w:rPr>
-        <w:t>9828b2a</w:t>
-      </w:r>
-      <w:r>
-        <w:rPr>
-          <w:rFonts w:ascii="Times New Roman" w:hAnsi="Times New Roman" w:eastAsia="宋体"/>
-        </w:rPr>
-        <w:t>，完整依赖锁已随原始日志归档。其中镜像测试组包含对Windows格式</w:t>
-      </w:r>
-      <w:r>
-        <w:rPr>
-          <w:rFonts w:ascii="Consolas" w:hAnsi="Consolas" w:eastAsia="等线"/>
-        </w:rPr>
-        <w:t>ping</w:t>
-      </w:r>
-      <w:r>
-        <w:rPr>
-          <w:rFonts w:ascii="Times New Roman" w:hAnsi="Times New Roman" w:eastAsia="宋体"/>
-        </w:rPr>
-        <w:t>输出文本的解析断言，在macOS上同样通过，说明该解析为纯文本处理而不依赖本机</w:t>
-      </w:r>
-      <w:r>
-        <w:rPr>
-          <w:rFonts w:ascii="Consolas" w:hAnsi="Consolas" w:eastAsia="等线"/>
-        </w:rPr>
-        <w:t>ping</w:t>
-      </w:r>
-      <w:r>
-        <w:rPr>
-          <w:rFonts w:ascii="Times New Roman" w:hAnsi="Times New Roman" w:eastAsia="宋体"/>
-        </w:rPr>
-        <w:t>实现；两轮效率实验使用SHA-256相同的输入文件，保证比较对象一致。</w:t>
+        <w:t>Dict</w:t>
+      </w:r>
+      <w:r>
+        <w:rPr>
+          <w:rFonts w:ascii="Times New Roman" w:hAnsi="Times New Roman" w:eastAsia="宋体"/>
+        </w:rPr>
+        <w:t>。</w:t>
       </w:r>
     </w:p>
     <w:p>
@@ -7223,7 +8059,7 @@
         <w:rPr>
           <w:rFonts w:ascii="Times New Roman" w:hAnsi="Times New Roman" w:eastAsia="宋体"/>
         </w:rPr>
-        <w:t>真实网络观察在两个平台的校外环境各完成一轮（4.3节）：Zenodo在显式可达条件下均能完成下载并通过完整性核验，机构FTP在校外均不可达；macOS轮额外记录了DNS污染与大文件传输截断两类真实故障。校园网内的FTP—Zenodo正式比较仍只在Windows侧执行计划内，macOS轮不替代该实验。</w:t>
+        <w:t>在隔离依赖环境中，Emerald最小烟雾测试5项全部通过，覆盖参数组织、气象组织、模型初始化和60 s单步执行。这证明接口在固定合成输入下能够连接，但不证明US-NR1全部参数的独立科学数值、真实气象、长期模拟或模型性能。</w:t>
       </w:r>
     </w:p>
     <w:p>
@@ -7231,31 +8067,43 @@
         <w:rPr>
           <w:rFonts w:ascii="Times New Roman" w:hAnsi="Times New Roman" w:eastAsia="宋体"/>
         </w:rPr>
-        <w:t>上述跨平台证据只覆盖Windows与macOS的受控实验和校外观察，因此本文的性能与可靠性实证结论限于这两个已测平台。Linux被明确列为支持目标：三个代码工程固定Julia 1.12.6及同一依赖组合，研究仓库使用同一生产矩阵、效率协议和故障矩阵在</w:t>
+        <w:t>真实陆面预实验固定使用2020年</w:t>
       </w:r>
       <w:r>
         <w:rPr>
           <w:rFonts w:ascii="Consolas" w:hAnsi="Consolas" w:eastAsia="等线"/>
         </w:rPr>
-        <w:t>ubuntu-latest</w:t>
-      </w:r>
-      <w:r>
-        <w:rPr>
-          <w:rFonts w:ascii="Times New Roman" w:hAnsi="Times New Roman" w:eastAsia="宋体"/>
-        </w:rPr>
-        <w:t xml:space="preserve">运行；非Windows系统无法获得Windows </w:t>
+        <w:t>gm2</w:t>
+      </w:r>
+      <w:r>
+        <w:rPr>
+          <w:rFonts w:ascii="Times New Roman" w:hAnsi="Times New Roman" w:eastAsia="宋体"/>
+        </w:rPr>
+        <w:t>的14个唯一文件，共184,404,953 B。文件均通过登记字节数、Zenodo来源MD5和本地SHA-256三重核验，目录中的相应</w:t>
       </w:r>
       <w:r>
         <w:rPr>
           <w:rFonts w:ascii="Consolas" w:hAnsi="Consolas" w:eastAsia="等线"/>
         </w:rPr>
-        <w:t>ping</w:t>
-      </w:r>
-      <w:r>
-        <w:rPr>
-          <w:rFonts w:ascii="Times New Roman" w:hAnsi="Times New Roman" w:eastAsia="宋体"/>
-        </w:rPr>
-        <w:t>分数时仍保留并依次尝试全部URL。Ubuntu任务完成并归档日志、CSV、TOML及Manifest后，方可将Linux从“支持目标”升级为“已验证平台”。</w:t>
+        <w:t>SIZE/SHA256</w:t>
+      </w:r>
+      <w:r>
+        <w:rPr>
+          <w:rFonts w:ascii="Times New Roman" w:hAnsi="Times New Roman" w:eastAsia="宋体"/>
+        </w:rPr>
+        <w:t>已补齐。US-NR1请求坐标40.0329°N、105.5464°W映射到中心40.5°N、105.5°W的规则格点，陆地掩膜为0.991592，最大LAI为1.579117；</w:t>
+      </w:r>
+      <w:r>
+        <w:rPr>
+          <w:rFonts w:ascii="Consolas" w:hAnsi="Consolas" w:eastAsia="等线"/>
+        </w:rPr>
+        <w:t>grid_dict</w:t>
+      </w:r>
+      <w:r>
+        <w:rPr>
+          <w:rFonts w:ascii="Times New Roman" w:hAnsi="Times New Roman" w:eastAsia="宋体"/>
+        </w:rPr>
+        <w:t>成功返回34个键、366日序列、4个土壤层和17个PFT，高程为1773.2001 m。撒哈拉请求坐标23°N、13°E映射到23.5°N、13.5°E，LAI为NaN，接口按预期报告目标格点非植被而未生成字典。全过程使用已校验本地文件且网络请求数为0。</w:t>
       </w:r>
     </w:p>
     <w:p>
@@ -7263,7 +8111,266 @@
         <w:rPr>
           <w:rFonts w:ascii="Times New Roman" w:hAnsi="Times New Roman" w:eastAsia="宋体"/>
         </w:rPr>
-        <w:t>候选论文分支已经消除Emerald与GriddingMachine之间的NetcdfIO约束冲突：GriddingMachineDatasets和Emerald均固定到同一GriddingMachine提交，NetcdfIO与PkgUtility分别统一为0.3.0和0.3.1，历史移动分支及冲突Manifest不再参与解析。Windows统一环境中GriddingMachine 63/63、GriddingMachineDatasets 38/38和35/35、Emerald 5/5全部通过，说明三工程能够在同一声明版本组合中装载和运行。该结果解决了先前“临时放宽compat”的复现缺口；正式归档仍需由macOS与Ubuntu干净runner复核同一候选提交，并保存各平台Manifest。</w:t>
+        <w:t>这项结果证明真实</w:t>
+      </w:r>
+      <w:r>
+        <w:rPr>
+          <w:rFonts w:ascii="Consolas" w:hAnsi="Consolas" w:eastAsia="等线"/>
+        </w:rPr>
+        <w:t>gm2</w:t>
+      </w:r>
+      <w:r>
+        <w:rPr>
+          <w:rFonts w:ascii="Times New Roman" w:hAnsi="Times New Roman" w:eastAsia="宋体"/>
+        </w:rPr>
+        <w:t>文件能够通过完整性目录、统一读取和陆面参数组织接口，并覆盖植被与非植被边界；它不是逐字段科学正确性证明。当前2020年</w:t>
+      </w:r>
+      <w:r>
+        <w:rPr>
+          <w:rFonts w:ascii="Consolas" w:hAnsi="Consolas" w:eastAsia="等线"/>
+        </w:rPr>
+        <w:t>wd1</w:t>
+      </w:r>
+      <w:r>
+        <w:rPr>
+          <w:rFonts w:ascii="Times New Roman" w:hAnsi="Times New Roman" w:eastAsia="宋体"/>
+        </w:rPr>
+        <w:t>的8个ERA5条目仅登记机构FTP地址，未给出</w:t>
+      </w:r>
+      <w:r>
+        <w:rPr>
+          <w:rFonts w:ascii="Consolas" w:hAnsi="Consolas" w:eastAsia="等线"/>
+        </w:rPr>
+        <w:t>SIZE/SHA256</w:t>
+      </w:r>
+      <w:r>
+        <w:rPr>
+          <w:rFonts w:ascii="Times New Roman" w:hAnsi="Times New Roman" w:eastAsia="宋体"/>
+        </w:rPr>
+        <w:t>，且本实验环境无法访问该FTP，因此未执行真实</w:t>
+      </w:r>
+      <w:r>
+        <w:rPr>
+          <w:rFonts w:ascii="Consolas" w:hAnsi="Consolas" w:eastAsia="等线"/>
+        </w:rPr>
+        <w:t>grid_weather</w:t>
+      </w:r>
+      <w:r>
+        <w:rPr>
+          <w:rFonts w:ascii="Times New Roman" w:hAnsi="Times New Roman" w:eastAsia="宋体"/>
+        </w:rPr>
+        <w:t>；这不影响受控夹具对接口字段、时间组织和Emerald连通性的验证，但本文不作真实气象科学正确性声明。两个论文分支可在同一进程装载；迁移NetcdfIO接口并修复配置复用后，GriddingMachineDatasets配置测试38/38和包集成35/35通过。公开候选</w:t>
+      </w:r>
+      <w:r>
+        <w:rPr>
+          <w:rFonts w:ascii="Consolas" w:hAnsi="Consolas" w:eastAsia="等线"/>
+        </w:rPr>
+        <w:t>Project.toml</w:t>
+      </w:r>
+      <w:r>
+        <w:rPr>
+          <w:rFonts w:ascii="Times New Roman" w:hAnsi="Times New Roman" w:eastAsia="宋体"/>
+        </w:rPr>
+        <w:t>已把GriddingMachine来源固定到完整提交号，三平台CI均从该声明解析依赖并保存Manifest；永久归档仍需保存这些环境文件，避免只依赖远端Git对象。</w:t>
+      </w:r>
+    </w:p>
+    <w:p>
+      <w:pPr>
+        <w:pStyle w:val="Heading2"/>
+      </w:pPr>
+      <w:r>
+        <w:rPr>
+          <w:rFonts w:ascii="Times New Roman" w:hAnsi="Times New Roman" w:eastAsia="宋体"/>
+        </w:rPr>
+        <w:t>4.5 Windows与macOS完整验证及Ubuntu CI兼容性检查</w:t>
+      </w:r>
+    </w:p>
+    <w:p>
+      <w:r>
+        <w:rPr>
+          <w:rFonts w:ascii="Times New Roman" w:hAnsi="Times New Roman" w:eastAsia="宋体"/>
+        </w:rPr>
+        <w:t>为检查前述机制是否依赖单一操作系统，本研究在macOS 26.3.2（Apple Silicon）上以同一Julia 1.12.6和同一提交</w:t>
+      </w:r>
+      <w:r>
+        <w:rPr>
+          <w:rFonts w:ascii="Consolas" w:hAnsi="Consolas" w:eastAsia="等线"/>
+        </w:rPr>
+        <w:t>GriddingMachine@53bb0be</w:t>
+      </w:r>
+      <w:r>
+        <w:rPr>
+          <w:rFonts w:ascii="Times New Roman" w:hAnsi="Times New Roman" w:eastAsia="宋体"/>
+        </w:rPr>
+        <w:t>、</w:t>
+      </w:r>
+      <w:r>
+        <w:rPr>
+          <w:rFonts w:ascii="Consolas" w:hAnsi="Consolas" w:eastAsia="等线"/>
+        </w:rPr>
+        <w:t>GriddingMachineDatasets@3926ae3</w:t>
+      </w:r>
+      <w:r>
+        <w:rPr>
+          <w:rFonts w:ascii="Times New Roman" w:hAnsi="Times New Roman" w:eastAsia="宋体"/>
+        </w:rPr>
+        <w:t>复现全部受控实验：核心自动回归GriddingMachine 63项、GriddingMachineDatasets配置38项与包集成35项、Emerald最小烟雾5项全部通过，分组通过数与Windows逐项一致；31编号生产矩阵独立运行3次，每次29个非交互案例全部通过，网络请求数为0；直接NetCDF效率实验40次测量SHA-256全部一致，方向与Windows轮相同（4.2节）；M01～M13故障注入矩阵65次状态断言全部通过、</w:t>
+      </w:r>
+      <w:r>
+        <w:rPr>
+          <w:rFonts w:ascii="Consolas" w:hAnsi="Consolas" w:eastAsia="等线"/>
+        </w:rPr>
+        <w:t>.part</w:t>
+      </w:r>
+      <w:r>
+        <w:rPr>
+          <w:rFonts w:ascii="Times New Roman" w:hAnsi="Times New Roman" w:eastAsia="宋体"/>
+        </w:rPr>
+        <w:t>残留为0。macOS环境的Emerald固定为</w:t>
+      </w:r>
+      <w:r>
+        <w:rPr>
+          <w:rFonts w:ascii="Consolas" w:hAnsi="Consolas" w:eastAsia="等线"/>
+        </w:rPr>
+        <w:t>silicormosia/Emerald.jl</w:t>
+      </w:r>
+      <w:r>
+        <w:rPr>
+          <w:rFonts w:ascii="Times New Roman" w:hAnsi="Times New Roman" w:eastAsia="宋体"/>
+        </w:rPr>
+        <w:t>分支</w:t>
+      </w:r>
+      <w:r>
+        <w:rPr>
+          <w:rFonts w:ascii="Consolas" w:hAnsi="Consolas" w:eastAsia="等线"/>
+        </w:rPr>
+        <w:t>wyujie</w:t>
+      </w:r>
+      <w:r>
+        <w:rPr>
+          <w:rFonts w:ascii="Times New Roman" w:hAnsi="Times New Roman" w:eastAsia="宋体"/>
+        </w:rPr>
+        <w:t>提交</w:t>
+      </w:r>
+      <w:r>
+        <w:rPr>
+          <w:rFonts w:ascii="Consolas" w:hAnsi="Consolas" w:eastAsia="等线"/>
+        </w:rPr>
+        <w:t>9828b2a</w:t>
+      </w:r>
+      <w:r>
+        <w:rPr>
+          <w:rFonts w:ascii="Times New Roman" w:hAnsi="Times New Roman" w:eastAsia="宋体"/>
+        </w:rPr>
+        <w:t>，完整依赖锁已随原始日志归档。其中镜像测试组包含对Windows格式</w:t>
+      </w:r>
+      <w:r>
+        <w:rPr>
+          <w:rFonts w:ascii="Consolas" w:hAnsi="Consolas" w:eastAsia="等线"/>
+        </w:rPr>
+        <w:t>ping</w:t>
+      </w:r>
+      <w:r>
+        <w:rPr>
+          <w:rFonts w:ascii="Times New Roman" w:hAnsi="Times New Roman" w:eastAsia="宋体"/>
+        </w:rPr>
+        <w:t>输出文本的解析断言，在macOS上同样通过，说明该解析为纯文本处理而不依赖本机</w:t>
+      </w:r>
+      <w:r>
+        <w:rPr>
+          <w:rFonts w:ascii="Consolas" w:hAnsi="Consolas" w:eastAsia="等线"/>
+        </w:rPr>
+        <w:t>ping</w:t>
+      </w:r>
+      <w:r>
+        <w:rPr>
+          <w:rFonts w:ascii="Times New Roman" w:hAnsi="Times New Roman" w:eastAsia="宋体"/>
+        </w:rPr>
+        <w:t>实现；两轮效率实验使用SHA-256相同的输入文件，保证比较对象一致。</w:t>
+      </w:r>
+    </w:p>
+    <w:p>
+      <w:r>
+        <w:rPr>
+          <w:rFonts w:ascii="Times New Roman" w:hAnsi="Times New Roman" w:eastAsia="宋体"/>
+        </w:rPr>
+        <w:t>真实网络观察在两个平台的校外环境各完成一轮（4.3节）：Zenodo在可达条件下均能完成下载并通过完整性核验，机构FTP在校外均不可达；macOS轮额外记录到DNS异常解析，以及正式记录前的一次大文件传输截断。校园网内的FTP—Zenodo正式比较仍待执行，校外观察不替代该实验。</w:t>
+      </w:r>
+    </w:p>
+    <w:p>
+      <w:r>
+        <w:rPr>
+          <w:rFonts w:ascii="Times New Roman" w:hAnsi="Times New Roman" w:eastAsia="宋体"/>
+        </w:rPr>
+        <w:t>三个公开仓库随后在固定Julia 1.12.6环境完成</w:t>
+      </w:r>
+      <w:r>
+        <w:rPr>
+          <w:rFonts w:ascii="Consolas" w:hAnsi="Consolas" w:eastAsia="等线"/>
+        </w:rPr>
+        <w:t>ubuntu-latest</w:t>
+      </w:r>
+      <w:r>
+        <w:rPr>
+          <w:rFonts w:ascii="Times New Roman" w:hAnsi="Times New Roman" w:eastAsia="宋体"/>
+        </w:rPr>
+        <w:t>、</w:t>
+      </w:r>
+      <w:r>
+        <w:rPr>
+          <w:rFonts w:ascii="Consolas" w:hAnsi="Consolas" w:eastAsia="等线"/>
+        </w:rPr>
+        <w:t>macos-latest</w:t>
+      </w:r>
+      <w:r>
+        <w:rPr>
+          <w:rFonts w:ascii="Times New Roman" w:hAnsi="Times New Roman" w:eastAsia="宋体"/>
+        </w:rPr>
+        <w:t>和</w:t>
+      </w:r>
+      <w:r>
+        <w:rPr>
+          <w:rFonts w:ascii="Consolas" w:hAnsi="Consolas" w:eastAsia="等线"/>
+        </w:rPr>
+        <w:t>windows-latest</w:t>
+      </w:r>
+      <w:r>
+        <w:rPr>
+          <w:rFonts w:ascii="Times New Roman" w:hAnsi="Times New Roman" w:eastAsia="宋体"/>
+        </w:rPr>
+        <w:t>持续集成。Ubuntu任务中，GriddingMachine 63项、GriddingMachineDatasets配置38项与包集成35项全部通过；研究仓库的29个非交互生产案例、65次故障状态断言和40次分发测量也全部完成。研究仓库保存三平台实验输出，GriddingMachineDatasets工作流分别保存三平台Manifest。CI分发实验为控制运行时间而使用小型确定性NetCDF夹具，因此只用于检查流程、哈希和文件状态，性能数值不与Windows和macOS真实ELEV/LAI样本合并。Ubuntu没有执行Emerald、校外FTP—Zenodo访问或真实</w:t>
+      </w:r>
+      <w:r>
+        <w:rPr>
+          <w:rFonts w:ascii="Consolas" w:hAnsi="Consolas" w:eastAsia="等线"/>
+        </w:rPr>
+        <w:t>gm2</w:t>
+      </w:r>
+      <w:r>
+        <w:rPr>
+          <w:rFonts w:ascii="Times New Roman" w:hAnsi="Times New Roman" w:eastAsia="宋体"/>
+        </w:rPr>
+        <w:t>案例，故Linux结论限定为表4所列核心代码路径的兼容性验证。</w:t>
+      </w:r>
+    </w:p>
+    <w:p>
+      <w:r>
+        <w:rPr>
+          <w:rFonts w:ascii="Times New Roman" w:hAnsi="Times New Roman" w:eastAsia="宋体"/>
+        </w:rPr>
+        <w:t>候选论文分支已消除Emerald与GriddingMachine之间的NetcdfIO约束冲突：GriddingMachineDatasets和本地Emerald候选均固定到同一GriddingMachine提交，NetcdfIO与PkgUtility分别统一为0.3.0和0.3.1，历史移动分支及冲突Manifest不再参与解析。Windows统一环境中GriddingMachine 63/63、GriddingMachineDatasets 38/38和35/35、Emerald 5/5全部通过。由于作者决定暂不公开Emerald候选</w:t>
+      </w:r>
+      <w:r>
+        <w:rPr>
+          <w:rFonts w:ascii="Consolas" w:hAnsi="Consolas" w:eastAsia="等线"/>
+        </w:rPr>
+        <w:t>d79324f</w:t>
+      </w:r>
+      <w:r>
+        <w:rPr>
+          <w:rFonts w:ascii="Times New Roman" w:hAnsi="Times New Roman" w:eastAsia="宋体"/>
+        </w:rPr>
+        <w:t>，公共三平台CI只证明GriddingMachine及GriddingMachineDatasets的统一依赖，不把Emerald候选写成三平台公开验证；投稿前需决定是否公开和永久归档该候选，或把Emerald仅作为外部接口案例报告。</w:t>
       </w:r>
     </w:p>
     <w:p>
@@ -7305,7 +8412,7 @@
         <w:rPr>
           <w:rFonts w:ascii="Times New Roman" w:hAnsi="Times New Roman" w:eastAsia="宋体"/>
         </w:rPr>
-        <w:t>校验和主要函数回归，在Windows与macOS两个平台完成生产自动矩阵，完成一名操作者的方向审核和一名未参与开发者的受控贡献流程，并以14个真实陆面文件完成</w:t>
+        <w:t>校验和主要函数回归，在Windows与macOS完成完整受控实验，完成一名操作者的方向审核和一名未参与开发者的受控贡献流程，并以14个真实陆面文件完成</w:t>
       </w:r>
       <w:r>
         <w:rPr>
@@ -7317,7 +8424,7 @@
         <w:rPr>
           <w:rFonts w:ascii="Times New Roman" w:hAnsi="Times New Roman" w:eastAsia="宋体"/>
         </w:rPr>
-        <w:t>链路预实验；尚未完成的是校园网真实FTP—Zenodo实验。Linux已进入支持和持续集成范围，但在Ubuntu记录归档前不作为双平台主结论的证据；历史目录迁移和真实气象链路属于后续扩展。</w:t>
+        <w:t>链路预实验；Ubuntu CI进一步验证了核心包、生产、故障和小型分发路径。尚未完成的是校园网真实FTP—Zenodo实验；历史目录迁移、真实气象链路和Linux上的Emerald/真实数据实验属于后续扩展。</w:t>
       </w:r>
     </w:p>
     <w:p>
@@ -7337,7 +8444,7 @@
         <w:rPr>
           <w:rFonts w:ascii="Times New Roman" w:hAnsi="Times New Roman" w:eastAsia="宋体"/>
         </w:rPr>
-        <w:t>陆面链路；上述受控实验在Windows与macOS上均通过，说明这些机制不依赖单一操作系统。P01需要一次说明，说明流程仍有文档改进空间，但不影响自动产物正确性的判断。Linux干净runner复核、原始ELEV重建、陆面逐字段科学金标准和真实ERA5属于不同强度的工程或科学验证；其中Linux复核用于确认支持范围，其余项目不是本文软件流程优化结论的前置条件。</w:t>
+        <w:t>陆面链路。上述完整受控实验在Windows与macOS均通过，Ubuntu CI又独立检查核心代码路径，说明主要流程并非只能在单一操作系统运行。P01需要一次说明，表明流程仍有文档改进空间，但不影响自动产物正确性的判断。Linux上的Emerald与真实数据复核、原始ELEV重建、陆面逐字段科学金标准和真实ERA5属于不同强度的工程或科学验证；它们不是本文软件流程优化结论的前置条件。</w:t>
       </w:r>
     </w:p>
     <w:p>
@@ -7356,7 +8463,7 @@
         <w:rPr>
           <w:rFonts w:ascii="Times New Roman" w:hAnsi="Times New Roman" w:eastAsia="宋体"/>
         </w:rPr>
-        <w:t>Earth Engine把大规模地理空间数据与云端计算结合，适合服务器侧的行星尺度分析[3]；ESGF通过分布式节点、搜索和联合身份基础设施支撑气候模式数据的发现与访问[9]；Pangeo倡导分析就绪、云优化数据以及计算与数据邻近的云原生模式[10]。GriddingMachine不试图替代这些通用或大规模平台。它面向的是一组经过选择和统一的全球规则网格产品，以及需要在本地Julia工作流中按固定标签复现参数与气象驱动的模型使用场景。</w:t>
+        <w:t>Earth Engine把大规模地理空间数据与云端计算结合，适合服务器侧的行星尺度分析[3]；ESGF通过分布式节点、搜索和联合身份基础设施支撑气候模式数据的发现与访问[9]；Pangeo倡导分析就绪、云优化数据以及计算与数据邻近的云原生模式[10]，Pangeo Forge进一步以可复用配方和目录组织分析就绪、云优化数据的生产[11]。GriddingMachine不试图替代这些通用或大规模平台。它面向的是一组经过选择和统一的全球规则网格产品，以及需要在本地Julia工作流中按固定标签复现参数与气象驱动的模型使用场景。</w:t>
       </w:r>
     </w:p>
     <w:p>
@@ -7400,7 +8507,15 @@
         <w:rPr>
           <w:rFonts w:ascii="Times New Roman" w:hAnsi="Times New Roman" w:eastAsia="宋体"/>
         </w:rPr>
-        <w:t>把标准数据组织为模型所需字段。对于接近云端的超大数据分析，云优化分块格式和数据邻近计算更合适[10]；对于CMIP等机构联合数据，ESGF的联合治理更成熟[9]。GriddingMachine的适用范围应限定为可下载、可本地缓存的规则网格数据，不能由本研究推及任意规模或任意网格的地球科学数据。</w:t>
+        <w:t>把标准数据组织为模型所需字段。与Pangeo Forge面向云端分析就绪数据生产的配方—基础设施分离不同[11]，本文流程强调可直接下载的单体NetCDF、离线缓存、完整性落盘和固定模型接口。对于接近云端的超大数据分析，云优化分块格式和数据邻近计算更合适[10]；对于CMIP等机构联合数据，ESGF的联合治理更成熟[9]。GriddingMachine的适用范围应限定为可下载、可本地缓存的规则网格数据，不能由本研究推及任意规模或任意网格的地球科学数据。</w:t>
+      </w:r>
+    </w:p>
+    <w:p>
+      <w:r>
+        <w:rPr>
+          <w:rFonts w:ascii="Times New Roman" w:hAnsi="Times New Roman" w:eastAsia="宋体"/>
+        </w:rPr>
+        <w:t>目录与哈希本身也不是本文单独主张的新技术。国内地球系统科学数据共享研究已经强调目录体系和规范关键词对数据管理与检索的作用[12]；Pooch以文件名、URL和SHA-256注册表实现远端文件获取、本地缓存和完整性校验[13]；STAC则为广泛地理空间资产的元数据结构与查询提供通用标准[14]。相比之下，GriddingMachine的外置YAML目录更窄且面向固定规则网格和模型标签，其新增价值在于把上游生产配置、标准NetCDF、事务式多镜像落盘和下游模型字段组织置于同一可测试契约中，而不是声称提出了通用目录标准或首次使用哈希下载。</w:t>
       </w:r>
     </w:p>
     <w:p>
@@ -7482,7 +8597,7 @@
         <w:rPr>
           <w:rFonts w:ascii="Times New Roman" w:hAnsi="Times New Roman" w:eastAsia="宋体"/>
         </w:rPr>
-        <w:t>延迟不是FTP或Zenodo下载吞吐率，且ICMP策略与域名解析故障都可能造成可下载地址被排后或直接不可达；真实校园网实验必须同时报告ping和实际下载，不能把当前排序称为最优选择。本文的全部受控实验已在Windows与macOS两个平台通过，校外真实观察也在两个平台各完成一轮；Linux已纳入相同依赖和受控CI脚本，但Ubuntu运行证据尚未归档，校园网内的FTP—Zenodo正式比较仍待执行。Emerald依赖冲突已在候选论文分支解决，仍需macOS与Ubuntu干净环境复核。</w:t>
+        <w:t>延迟不是FTP或Zenodo下载吞吐率，且ICMP策略与域名解析异常都可能造成可下载地址被排后或暂时不可达；真实校园网实验必须同时报告ping和实际下载，不能把当前排序称为最优选择。本文的完整受控实验和校外观察覆盖Windows与macOS；Ubuntu CI覆盖核心包、生产、故障及小型分发路径，但不覆盖Emerald、真实网络和真实陆面文件。校园网内的FTP—Zenodo正式比较仍待执行。Emerald依赖冲突已在本地候选分支解决，但该候选尚未公开，也未在macOS与Ubuntu干净环境复核。</w:t>
       </w:r>
     </w:p>
     <w:p>
@@ -7637,7 +8752,7 @@
         <w:rPr>
           <w:rFonts w:ascii="Times New Roman" w:hAnsi="Times New Roman" w:eastAsia="宋体"/>
         </w:rPr>
-        <w:t>在Windows与macOS、Julia 1.12.6两个环境中，GriddingMachineDatasets 73项、GriddingMachine 63项以及Emerald合成输入最小烟雾5项测试全部通过，证明上述核心机制在受控夹具下可运行且不依赖单一操作系统。数据生产31编号矩阵的29个非交互案例在两个平台各连续3次全部通过，一名操作者的V01/V02审核结果为PASS；一名未参与开发者在获得一次说明后完成受控贡献流程，自动产物验收为PASS。两个平台的当前ping版本各65次受控故障断言全部通过；两轮校外真实访问中Zenodo下载均通过完整性核验，机构FTP均因网络边界超时，macOS轮还如实记录了DNS污染与大文件传输截断。两个内部压缩样本的直接NetCDF暖缓存实验在两个平台上均支持减少额外处理时间和逻辑临时占用。14个真实</w:t>
+        <w:t>在Windows与macOS、Julia 1.12.6两个环境中，GriddingMachineDatasets 73项、GriddingMachine 63项以及Emerald合成输入最小烟雾5项测试全部通过。数据生产31编号矩阵的29个非交互案例在两个平台各连续3次全部通过，一名操作者的V01/V02审核结果为PASS；一名未参与开发者在获得一次说明后完成受控贡献流程，自动产物验收为PASS。两个平台采用当前ping排序实现的65次受控故障断言均全部通过；两轮校外真实访问中Zenodo下载通过完整性核验，机构FTP因网络边界超时，macOS轮还记录到DNS异常解析和正式记录前的一次传输截断。两个内部压缩样本的直接NetCDF暖缓存实验在两个平台上均支持减少额外处理时间和逻辑临时占用。14个真实</w:t>
       </w:r>
       <w:r>
         <w:rPr>
@@ -7649,7 +8764,7 @@
         <w:rPr>
           <w:rFonts w:ascii="Times New Roman" w:hAnsi="Times New Roman" w:eastAsia="宋体"/>
         </w:rPr>
-        <w:t>陆面文件全部通过完整性核验，US-NR1参数字典成功生成，撒哈拉非植被格点按预期拒绝。候选论文分支已统一GriddingMachine、GriddingMachineDatasets与Emerald的依赖组合，并把Linux纳入Ubuntu持续集成支持目标。本文实证结论适用于Windows与macOS两个已测平台；Ubuntu记录归档前不把Linux表述为已验证，也不把单案例复现外推为用户研究，不声称效率数值可外推到所有文件或冷缓存、ping排序等同于吞吐率最优、真实气象已经验证、真实参数已完成独立科学数值验证或接口已验证长期模型模拟。投稿前关键剩余证据为候选提交的macOS/Ubuntu干净CI记录与校园网内实际FTP—Zenodo ping和下载实验。</w:t>
+        <w:t>陆面文件全部通过完整性核验，US-NR1参数字典成功生成，撒哈拉非植被格点按预期拒绝。Ubuntu CI进一步通过GriddingMachine 63项、GriddingMachineDatasets 73项、29个非交互生产案例、65次故障状态断言和40次小型确定性分发测量，支持核心代码路径的Linux兼容性。本文不把Linux CI外推为Emerald、真实网络或真实陆面文件验证，也不把单案例复现外推为用户研究，不声称效率数值适用于所有文件或冷缓存、ping排序等同于吞吐率最优、真实气象已经验证、真实参数已完成独立科学数值验证或接口已验证长期模型模拟。投稿前关键剩余证据为校园网内实际FTP—Zenodo访问、正式release与永久归档；Emerald若作为可复现公共依赖，还需决定是否公开候选提交并补充相应平台验证。</w:t>
       </w:r>
     </w:p>
     <w:p>
@@ -7676,31 +8791,67 @@
         <w:rPr>
           <w:rFonts w:ascii="Times New Roman" w:hAnsi="Times New Roman" w:eastAsia="宋体"/>
         </w:rPr>
-        <w:t>GriddingMachine.jl源代码公开于https://github.com/CliMA/GriddingMachine.jl，本文本地论文分支当前提交为</w:t>
+        <w:t>GriddingMachine.jl源代码公开于https://github.com/CliMA/GriddingMachine.jl，论文候选分支提交为</w:t>
       </w:r>
       <w:r>
         <w:rPr>
           <w:rFonts w:ascii="Consolas" w:hAnsi="Consolas" w:eastAsia="等线"/>
         </w:rPr>
-        <w:t>53bb0be</w:t>
-      </w:r>
-      <w:r>
-        <w:rPr>
-          <w:rFonts w:ascii="Times New Roman" w:hAnsi="Times New Roman" w:eastAsia="宋体"/>
-        </w:rPr>
-        <w:t>。数据生产代码公开于https://github.com/jhOo1/GriddingMachineDatasets，本地论文分支当前提交为</w:t>
+        <w:t>11631d624f4847c5e34d2c4ff3cd762359a80c05</w:t>
+      </w:r>
+      <w:r>
+        <w:rPr>
+          <w:rFonts w:ascii="Times New Roman" w:hAnsi="Times New Roman" w:eastAsia="宋体"/>
+        </w:rPr>
+        <w:t>，其中被验证的核心代码提交为</w:t>
       </w:r>
       <w:r>
         <w:rPr>
           <w:rFonts w:ascii="Consolas" w:hAnsi="Consolas" w:eastAsia="等线"/>
         </w:rPr>
-        <w:t>3926ae3</w:t>
-      </w:r>
-      <w:r>
-        <w:rPr>
-          <w:rFonts w:ascii="Times New Roman" w:hAnsi="Times New Roman" w:eastAsia="宋体"/>
-        </w:rPr>
-        <w:t>。论文材料与实验协议位于https://github.com/jhOo1/GriddingMachine_Reaserach。【上述为本地阶段性提交，尚未推送或归档；投稿前应由作者确认后创建正式release tag和归档DOI，并补充数据目录、原始结果、环境文件与绘图脚本的永久地址。】</w:t>
+        <w:t>53bb0be8b676f88d3d3dbe32f20aefdad883fcc2</w:t>
+      </w:r>
+      <w:r>
+        <w:rPr>
+          <w:rFonts w:ascii="Times New Roman" w:hAnsi="Times New Roman" w:eastAsia="宋体"/>
+        </w:rPr>
+        <w:t>。数据生产代码公开于https://github.com/jhOo1/GriddingMachineDatasets，论文候选提交为</w:t>
+      </w:r>
+      <w:r>
+        <w:rPr>
+          <w:rFonts w:ascii="Consolas" w:hAnsi="Consolas" w:eastAsia="等线"/>
+        </w:rPr>
+        <w:t>5eac56af311fe511237ac2b1d7ef68b018fd7626</w:t>
+      </w:r>
+      <w:r>
+        <w:rPr>
+          <w:rFonts w:ascii="Times New Roman" w:hAnsi="Times New Roman" w:eastAsia="宋体"/>
+        </w:rPr>
+        <w:t>。实验协议、脚本和阶段性结果公开于https://github.com/jhOo1/GriddingMachine_Reaserach，表4对应的实验冻结提交为</w:t>
+      </w:r>
+      <w:r>
+        <w:rPr>
+          <w:rFonts w:ascii="Consolas" w:hAnsi="Consolas" w:eastAsia="等线"/>
+        </w:rPr>
+        <w:t>8a23b5af8481cf575d45a0b7587ad7b6ea76edd3</w:t>
+      </w:r>
+      <w:r>
+        <w:rPr>
+          <w:rFonts w:ascii="Times New Roman" w:hAnsi="Times New Roman" w:eastAsia="宋体"/>
+        </w:rPr>
+        <w:t>。三平台持续集成记录分别为https://github.com/CliMA/GriddingMachine.jl/actions/runs/31876825314、https://github.com/jhOo1/GriddingMachineDatasets/actions/runs/31876841675和https://github.com/jhOo1/GriddingMachine_Reaserach/actions/runs/31877990092。Emerald统一依赖候选</w:t>
+      </w:r>
+      <w:r>
+        <w:rPr>
+          <w:rFonts w:ascii="Consolas" w:hAnsi="Consolas" w:eastAsia="等线"/>
+        </w:rPr>
+        <w:t>d79324f5dbbfc560ccf1d796e10533ee3a7cd4f1</w:t>
+      </w:r>
+      <w:r>
+        <w:rPr>
+          <w:rFonts w:ascii="Times New Roman" w:hAnsi="Times New Roman" w:eastAsia="宋体"/>
+        </w:rPr>
+        <w:t>目前仅保存在作者本地，未作为公开代码材料。GitHub Actions工件具有保留期限，投稿前仍应为软件、数据目录、原始结果、环境文件和绘图脚本创建不可变release及带DOI的永久归档。</w:t>
       </w:r>
     </w:p>
     <w:p>
@@ -7711,7 +8862,7 @@
         <w:rPr>
           <w:rFonts w:ascii="Times New Roman" w:hAnsi="Times New Roman" w:eastAsia="宋体"/>
         </w:rPr>
-        <w:t>作者贡献</w:t>
+        <w:t>基金项目</w:t>
       </w:r>
     </w:p>
     <w:p>
@@ -7719,7 +8870,7 @@
         <w:rPr>
           <w:rFonts w:ascii="Times New Roman" w:hAnsi="Times New Roman" w:eastAsia="宋体"/>
         </w:rPr>
-        <w:t>姜皓：概念设计、软件、验证、数据整理、可视化、初稿撰写【待作者确认】。王玉杰：概念设计、研究指导、项目管理、论文审阅与修改【待作者确认】。</w:t>
+        <w:t>【待作者和通讯作者补充基金项目中文/英文名称及编号；如无资助，按期刊要求声明。】</w:t>
       </w:r>
     </w:p>
     <w:p>
@@ -7730,7 +8881,7 @@
         <w:rPr>
           <w:rFonts w:ascii="Times New Roman" w:hAnsi="Times New Roman" w:eastAsia="宋体"/>
         </w:rPr>
-        <w:t>利益冲突声明</w:t>
+        <w:t>作者贡献</w:t>
       </w:r>
     </w:p>
     <w:p>
@@ -7738,7 +8889,7 @@
         <w:rPr>
           <w:rFonts w:ascii="Times New Roman" w:hAnsi="Times New Roman" w:eastAsia="宋体"/>
         </w:rPr>
-        <w:t>作者声明不存在利益冲突【投稿前由全体作者确认】。</w:t>
+        <w:t>姜皓：概念设计、软件、验证、数据整理、可视化、初稿撰写【待作者确认】。王玉杰：概念设计、研究指导、项目管理、论文审阅与修改【待作者确认】。</w:t>
       </w:r>
     </w:p>
     <w:p>
@@ -7749,7 +8900,7 @@
         <w:rPr>
           <w:rFonts w:ascii="Times New Roman" w:hAnsi="Times New Roman" w:eastAsia="宋体"/>
         </w:rPr>
-        <w:t>AI 工具使用声明</w:t>
+        <w:t>利益冲突声明</w:t>
       </w:r>
     </w:p>
     <w:p>
@@ -7757,7 +8908,7 @@
         <w:rPr>
           <w:rFonts w:ascii="Times New Roman" w:hAnsi="Times New Roman" w:eastAsia="宋体"/>
         </w:rPr>
-        <w:t>本文准备过程中使用OpenAI Codex辅助整理研究材料与代码差异、检查论文结构、起草和修订部分文字、审查Julia/Python实验脚本、执行本地受控测试并汇总机器生成日志。研究问题、实验范围、通过标准和结论边界由作者确定；工具输出未经人工核对不作为论文证据。作者逐项核验代码提交、原始CSV/TOML、文件哈希、终端结果和正文表述，并对研究设计、数据真实性、结果解释及全文承担责任。OpenAI Codex不列为作者或参考文献作者。</w:t>
+        <w:t>作者声明不存在利益冲突【投稿前由全体作者确认】。</w:t>
       </w:r>
     </w:p>
     <w:p>
@@ -7768,7 +8919,7 @@
         <w:rPr>
           <w:rFonts w:ascii="Times New Roman" w:hAnsi="Times New Roman" w:eastAsia="宋体"/>
         </w:rPr>
-        <w:t>参考文献</w:t>
+        <w:t>AI 工具使用声明</w:t>
       </w:r>
     </w:p>
     <w:p>
@@ -7776,90 +8927,131 @@
         <w:rPr>
           <w:rFonts w:ascii="Times New Roman" w:hAnsi="Times New Roman" w:eastAsia="宋体"/>
         </w:rPr>
-        <w:t>[1] WILKINSON M D, DUMONTIER M, AALBERSBERG I J, et al. The FAIR Guiding Principles for scientific data management and stewardship[J]. Scientific Data, 2016, 3: 160018. DOI: 10.1038/sdata.2016.18.</w:t>
-      </w:r>
-    </w:p>
-    <w:p>
-      <w:r>
-        <w:rPr>
-          <w:rFonts w:ascii="Times New Roman" w:hAnsi="Times New Roman" w:eastAsia="宋体"/>
-        </w:rPr>
-        <w:t>[2] CF CONVENTIONS COMMITTEE. CF Metadata Conventions[EB/OL]. [2026-08-07]. https://cfconventions.org/.</w:t>
-      </w:r>
-    </w:p>
-    <w:p>
-      <w:r>
-        <w:rPr>
-          <w:rFonts w:ascii="Times New Roman" w:hAnsi="Times New Roman" w:eastAsia="宋体"/>
-        </w:rPr>
-        <w:t>[3] GORELICK N, HANCHER M, DIXON M, et al. Google Earth Engine: Planetary-scale geospatial analysis for everyone[J]. Remote Sensing of Environment, 2017, 202: 18-27. DOI: 10.1016/j.rse.2017.06.031.</w:t>
-      </w:r>
-    </w:p>
-    <w:p>
-      <w:r>
-        <w:rPr>
-          <w:rFonts w:ascii="Times New Roman" w:hAnsi="Times New Roman" w:eastAsia="宋体"/>
-        </w:rPr>
-        <w:t>[4] WANG Y, KÖHLER P, BRAGHIERE R K, et al. GriddingMachine, a database and software for Earth system modeling at global and regional scales[J]. Scientific Data, 2022, 9: 258. DOI: 10.1038/s41597-022-01346-x.</w:t>
-      </w:r>
-    </w:p>
-    <w:p>
-      <w:r>
-        <w:rPr>
-          <w:rFonts w:ascii="Times New Roman" w:hAnsi="Times New Roman" w:eastAsia="宋体"/>
-        </w:rPr>
-        <w:t>[5] REW R, DAVIS G. NetCDF: An interface for scientific data access[J]. IEEE Computer Graphics and Applications, 1990, 10(4): 76-82. DOI: 10.1109/38.56302.</w:t>
-      </w:r>
-    </w:p>
-    <w:p>
-      <w:r>
-        <w:rPr>
-          <w:rFonts w:ascii="Times New Roman" w:hAnsi="Times New Roman" w:eastAsia="宋体"/>
-        </w:rPr>
-        <w:t>[6] MAHECHA M D, GANS F, BRANDT G, et al. Earth system data cubes unravel global multivariate dynamics[J]. Earth System Dynamics, 2020, 11: 201-234. DOI: 10.5194/esd-11-201-2020.</w:t>
-      </w:r>
-    </w:p>
-    <w:p>
-      <w:r>
-        <w:rPr>
-          <w:rFonts w:ascii="Times New Roman" w:hAnsi="Times New Roman" w:eastAsia="宋体"/>
-        </w:rPr>
-        <w:t>[7] BEZANSON J, EDELMAN A, KARPINSKI S, et al. Julia: A fresh approach to numerical computing[J]. SIAM Review, 2017, 59(1): 65-98. DOI: 10.1137/141000671.</w:t>
-      </w:r>
-    </w:p>
-    <w:p>
-      <w:r>
-        <w:rPr>
-          <w:rFonts w:ascii="Times New Roman" w:hAnsi="Times New Roman" w:eastAsia="宋体"/>
-        </w:rPr>
-        <w:t>[8] SMITH A M, KATZ D S, NIEMEYER K E, et al. Software citation principles[J]. PeerJ Computer Science, 2016, 2: e86. DOI: 10.7717/peerj-cs.86.</w:t>
-      </w:r>
-    </w:p>
-    <w:p>
-      <w:r>
-        <w:rPr>
-          <w:rFonts w:ascii="Times New Roman" w:hAnsi="Times New Roman" w:eastAsia="宋体"/>
-        </w:rPr>
-        <w:t>[9] CINQUINI L, CRICHTON D, MATTMANN C, et al. The Earth System Grid Federation: An open infrastructure for access to distributed geospatial data[J]. Future Generation Computer Systems, 2014, 36: 400-417. DOI: 10.1016/j.future.2013.07.002.</w:t>
-      </w:r>
-    </w:p>
-    <w:p>
-      <w:r>
-        <w:rPr>
-          <w:rFonts w:ascii="Times New Roman" w:hAnsi="Times New Roman" w:eastAsia="宋体"/>
-        </w:rPr>
-        <w:t>[10] ABERNATHEY R P, AUGSPURGER T, BANIHIRWE A, et al. Cloud-native repositories for big scientific data[J]. Computing in Science &amp; Engineering, 2021, 23(2): 26-35. DOI: 10.1109/MCSE.2021.3059437.</w:t>
+        <w:t>本文准备过程中使用OpenAI Codex辅助整理研究材料与代码差异、检查论文结构、起草和修订部分文字、审查Julia/Python实验脚本、执行本地受控测试并汇总机器生成日志；同时辅助修订图1并编写可复现绘图脚本，由固定CSV生成图2的SVG与PNG。研究问题、实验范围、通过标准和结论边界由作者确定；工具输出未经人工核对不作为论文证据。作者逐项核验代码提交、原始CSV/TOML、文件哈希、终端结果、图件数值和正文表述，并对研究设计、数据真实性、结果解释及全文承担责任。OpenAI Codex不列为作者或参考文献作者。</w:t>
       </w:r>
     </w:p>
     <w:p>
       <w:pPr>
-        <w:sectPr>
-          <w:pgSz w:w="12240" w:h="15840"/>
-          <w:pgMar w:top="1440" w:right="1474" w:bottom="1440" w:left="1587" w:header="720" w:footer="720" w:gutter="0"/>
-          <w:cols w:space="720"/>
-          <w:docGrid w:linePitch="360"/>
-        </w:sectPr>
+        <w:pStyle w:val="Heading1"/>
       </w:pPr>
+      <w:r>
+        <w:rPr>
+          <w:rFonts w:ascii="Times New Roman" w:hAnsi="Times New Roman" w:eastAsia="宋体"/>
+        </w:rPr>
+        <w:t>参考文献</w:t>
+      </w:r>
+    </w:p>
+    <w:p>
+      <w:r>
+        <w:rPr>
+          <w:rFonts w:ascii="Times New Roman" w:hAnsi="Times New Roman" w:eastAsia="宋体"/>
+        </w:rPr>
+        <w:t>[1] WILKINSON M D, DUMONTIER M, AALBERSBERG I J, et al. The FAIR Guiding Principles for scientific data management and stewardship[J]. Scientific Data, 2016, 3: 160018. DOI: 10.1038/sdata.2016.18.</w:t>
+      </w:r>
+    </w:p>
+    <w:p>
+      <w:r>
+        <w:rPr>
+          <w:rFonts w:ascii="Times New Roman" w:hAnsi="Times New Roman" w:eastAsia="宋体"/>
+        </w:rPr>
+        <w:t>[2] CF CONVENTIONS COMMITTEE. CF Metadata Conventions[EB/OL]. [2026-08-07]. https://cfconventions.org/.</w:t>
+      </w:r>
+    </w:p>
+    <w:p>
+      <w:r>
+        <w:rPr>
+          <w:rFonts w:ascii="Times New Roman" w:hAnsi="Times New Roman" w:eastAsia="宋体"/>
+        </w:rPr>
+        <w:t>[3] GORELICK N, HANCHER M, DIXON M, et al. Google Earth Engine: Planetary-scale geospatial analysis for everyone[J]. Remote Sensing of Environment, 2017, 202: 18-27. DOI: 10.1016/j.rse.2017.06.031.</w:t>
+      </w:r>
+    </w:p>
+    <w:p>
+      <w:r>
+        <w:rPr>
+          <w:rFonts w:ascii="Times New Roman" w:hAnsi="Times New Roman" w:eastAsia="宋体"/>
+        </w:rPr>
+        <w:t>[4] WANG Y, KÖHLER P, BRAGHIERE R K, et al. GriddingMachine, a database and software for Earth system modeling at global and regional scales[J]. Scientific Data, 2022, 9: 258. DOI: 10.1038/s41597-022-01346-x.</w:t>
+      </w:r>
+    </w:p>
+    <w:p>
+      <w:r>
+        <w:rPr>
+          <w:rFonts w:ascii="Times New Roman" w:hAnsi="Times New Roman" w:eastAsia="宋体"/>
+        </w:rPr>
+        <w:t>[5] REW R, DAVIS G. NetCDF: An interface for scientific data access[J]. IEEE Computer Graphics and Applications, 1990, 10(4): 76-82. DOI: 10.1109/38.56302.</w:t>
+      </w:r>
+    </w:p>
+    <w:p>
+      <w:r>
+        <w:rPr>
+          <w:rFonts w:ascii="Times New Roman" w:hAnsi="Times New Roman" w:eastAsia="宋体"/>
+        </w:rPr>
+        <w:t>[6] MAHECHA M D, GANS F, BRANDT G, et al. Earth system data cubes unravel global multivariate dynamics[J]. Earth System Dynamics, 2020, 11: 201-234. DOI: 10.5194/esd-11-201-2020.</w:t>
+      </w:r>
+    </w:p>
+    <w:p>
+      <w:r>
+        <w:rPr>
+          <w:rFonts w:ascii="Times New Roman" w:hAnsi="Times New Roman" w:eastAsia="宋体"/>
+        </w:rPr>
+        <w:t>[7] BEZANSON J, EDELMAN A, KARPINSKI S, et al. Julia: A fresh approach to numerical computing[J]. SIAM Review, 2017, 59(1): 65-98. DOI: 10.1137/141000671.</w:t>
+      </w:r>
+    </w:p>
+    <w:p>
+      <w:r>
+        <w:rPr>
+          <w:rFonts w:ascii="Times New Roman" w:hAnsi="Times New Roman" w:eastAsia="宋体"/>
+        </w:rPr>
+        <w:t>[8] SMITH A M, KATZ D S, NIEMEYER K E, et al. Software citation principles[J]. PeerJ Computer Science, 2016, 2: e86. DOI: 10.7717/peerj-cs.86.</w:t>
+      </w:r>
+    </w:p>
+    <w:p>
+      <w:r>
+        <w:rPr>
+          <w:rFonts w:ascii="Times New Roman" w:hAnsi="Times New Roman" w:eastAsia="宋体"/>
+        </w:rPr>
+        <w:t>[9] CINQUINI L, CRICHTON D, MATTMANN C, et al. The Earth System Grid Federation: An open infrastructure for access to distributed geospatial data[J]. Future Generation Computer Systems, 2014, 36: 400-417. DOI: 10.1016/j.future.2013.07.002.</w:t>
+      </w:r>
+    </w:p>
+    <w:p>
+      <w:r>
+        <w:rPr>
+          <w:rFonts w:ascii="Times New Roman" w:hAnsi="Times New Roman" w:eastAsia="宋体"/>
+        </w:rPr>
+        <w:t>[10] ABERNATHEY R P, AUGSPURGER T, BANIHIRWE A, et al. Cloud-native repositories for big scientific data[J]. Computing in Science &amp; Engineering, 2021, 23(2): 26-35. DOI: 10.1109/MCSE.2021.3059437.</w:t>
+      </w:r>
+    </w:p>
+    <w:p>
+      <w:r>
+        <w:rPr>
+          <w:rFonts w:ascii="Times New Roman" w:hAnsi="Times New Roman" w:eastAsia="宋体"/>
+        </w:rPr>
+        <w:t>[11] STERN C, ABERNATHEY R, HAMMAN J, et al. Pangeo Forge: Crowdsourcing analysis-ready, cloud optimized data production[J]. Frontiers in Climate, 2022, 3: 782909. DOI: 10.3389/fclim.2021.782909.</w:t>
+      </w:r>
+    </w:p>
+    <w:p>
+      <w:r>
+        <w:rPr>
+          <w:rFonts w:ascii="Times New Roman" w:hAnsi="Times New Roman" w:eastAsia="宋体"/>
+        </w:rPr>
+        <w:t>[12] 王卷乐, 林海, 冉盈盈, 等. 面向数据共享的地球系统科学数据分类探讨[J]. 地球科学进展, 2014, 29(2): 265-274. [WANG J L, LIN H, RAN Y Y, et al. A study of Earth System Science data classification for data sharing[J]. Advances in Earth Science, 2014, 29(2): 265-274.]</w:t>
+      </w:r>
+    </w:p>
+    <w:p>
+      <w:r>
+        <w:rPr>
+          <w:rFonts w:ascii="Times New Roman" w:hAnsi="Times New Roman" w:eastAsia="宋体"/>
+        </w:rPr>
+        <w:t>[13] UIEDA L, SOLER S R, RAMPIN R, et al. Pooch: A friend to fetch your data files[J]. Journal of Open Source Software, 2020, 5(45): 1943. DOI: 10.21105/joss.01943.</w:t>
+      </w:r>
+    </w:p>
+    <w:p>
+      <w:r>
+        <w:rPr>
+          <w:rFonts w:ascii="Times New Roman" w:hAnsi="Times New Roman" w:eastAsia="宋体"/>
+        </w:rPr>
+        <w:t>[14] OPEN GEOSPATIAL CONSORTIUM. SpatioTemporal Asset Catalog (STAC) Community Standard, Version 1.1.0[S/OL]. OGC 25-004, 2025[2026-08-15]. https://www.ogc.org/standards/stac/.</w:t>
+      </w:r>
     </w:p>
     <w:sectPr>
       <w:pgSz w:w="12240" w:h="15840"/>

</xml_diff>

<commit_message>
docs: publish Emerald cross-platform evidence
</commit_message>
<xml_diff>
--- a/论文/GriddingMachine论文初稿_导师审阅版.docx
+++ b/论文/GriddingMachine论文初稿_导师审阅版.docx
@@ -6352,7 +6352,7 @@
         <w:rPr>
           <w:rFonts w:ascii="Times New Roman" w:hAnsi="Times New Roman" w:eastAsia="宋体"/>
         </w:rPr>
-        <w:t>上固定Julia 1.12.6运行。GriddingMachine执行63项回归；GriddingMachineDatasets执行38项配置测试和35项包集成测试；研究仓库执行29个非交互生产案例、M01～M13共65次故障状态断言，以及两个小型确定性NetCDF夹具、两种分发形式各10次的40次测量。通过条件为所有预期测试成功、内容SHA-256一致、预期失败不改变正式文件且无</w:t>
+        <w:t>上固定Julia 1.12.6运行。GriddingMachine执行63项回归；GriddingMachineDatasets执行38项配置测试和35项包集成测试；研究仓库执行29个非交互生产案例、M01～M13共65次故障状态断言，以及两个小型确定性NetCDF夹具、两种分发形式各10次的40次测量；Emerald公开候选执行5项最小接口烟雾断言。通过条件为所有预期测试成功、内容SHA-256一致、预期失败不改变正式文件且无</w:t>
       </w:r>
       <w:r>
         <w:rPr>
@@ -6364,7 +6364,7 @@
         <w:rPr>
           <w:rFonts w:ascii="Times New Roman" w:hAnsi="Times New Roman" w:eastAsia="宋体"/>
         </w:rPr>
-        <w:t>残留。研究仓库保存各平台实验输出，GriddingMachineDatasets工作流另保存解析后的平台Manifest。</w:t>
+        <w:t>残留。研究仓库保存各平台实验输出，GriddingMachineDatasets和Emerald工作流另保存解析后的平台Manifest。</w:t>
       </w:r>
     </w:p>
     <w:p>
@@ -6372,7 +6372,7 @@
         <w:rPr>
           <w:rFonts w:ascii="Times New Roman" w:hAnsi="Times New Roman" w:eastAsia="宋体"/>
         </w:rPr>
-        <w:t>CI中的小型分发夹具只用于验证代码路径、文件状态和内容完整性，不替代Windows/macOS真实ELEV/LAI的性能结果。Ubuntu任务也不访问真实FTP/Zenodo，不运行Emerald或真实</w:t>
+        <w:t>CI中的小型分发夹具只用于验证代码路径、文件状态和内容完整性，不替代Windows/macOS真实ELEV/LAI的性能结果。Ubuntu任务不访问真实FTP/Zenodo或真实</w:t>
       </w:r>
       <w:r>
         <w:rPr>
@@ -6384,7 +6384,7 @@
         <w:rPr>
           <w:rFonts w:ascii="Times New Roman" w:hAnsi="Times New Roman" w:eastAsia="宋体"/>
         </w:rPr>
-        <w:t>文件。因此，Linux结果只回答上述核心路径能否在固定依赖下执行，不能作为真实网络、模型接口或真实数据案例的三平台证据。</w:t>
+        <w:t>文件；Emerald只运行固定合成输入下的5项最小接口烟雾断言。因此，Linux结果支持核心代码路径和受控模型接口能够在固定依赖下执行，但不能作为真实网络、真实陆面数据、长期模型模拟或科学正确性的三平台证据。</w:t>
       </w:r>
     </w:p>
     <w:p>
@@ -6463,6 +6463,18 @@
         <w:rPr>
           <w:rFonts w:ascii="Times New Roman" w:hAnsi="Times New Roman" w:eastAsia="宋体"/>
         </w:rPr>
+        <w:t>、</w:t>
+      </w:r>
+      <w:r>
+        <w:rPr>
+          <w:rFonts w:ascii="Consolas" w:hAnsi="Consolas" w:eastAsia="等线"/>
+        </w:rPr>
+        <w:t>Emerald@d79324f</w:t>
+      </w:r>
+      <w:r>
+        <w:rPr>
+          <w:rFonts w:ascii="Times New Roman" w:hAnsi="Times New Roman" w:eastAsia="宋体"/>
+        </w:rPr>
         <w:t>和研究仓库实验冻结提交</w:t>
       </w:r>
       <w:r>
@@ -6475,7 +6487,7 @@
         <w:rPr>
           <w:rFonts w:ascii="Times New Roman" w:hAnsi="Times New Roman" w:eastAsia="宋体"/>
         </w:rPr>
-        <w:t>，Julia均为1.12.6。全部受控实验——生产编号矩阵、分发效率、故障注入与核心自动回归——在Windows与macOS（Apple Silicon）分别执行并通过；真实网络观察在两个平台的校外环境各完成一轮。相同固定依赖的Ubuntu CI已完成核心包、生产矩阵、故障矩阵和小型确定性分发测试，但没有运行Emerald、真实网络和真实陆面案例。核心平台覆盖汇总见表4。</w:t>
+        <w:t>，Julia均为1.12.6。全部受控实验——生产编号矩阵、分发效率、故障注入与核心自动回归——在Windows与macOS（Apple Silicon）分别执行并通过；真实网络观察在两个平台的校外环境各完成一轮。相同固定依赖的Ubuntu CI已完成核心包、生产矩阵、故障矩阵、小型确定性分发测试和Emerald最小接口烟雾测试，但没有访问真实网络或真实陆面文件。核心平台覆盖汇总见表4。</w:t>
       </w:r>
     </w:p>
     <w:p>
@@ -7076,7 +7088,7 @@
                 <w:rFonts w:ascii="Times New Roman" w:hAnsi="Times New Roman" w:eastAsia="宋体"/>
                 <w:sz w:val="18"/>
               </w:rPr>
-              <w:t>未运行</w:t>
+              <w:t>5/5</w:t>
             </w:r>
           </w:p>
         </w:tc>
@@ -7095,7 +7107,7 @@
                 <w:rFonts w:ascii="Times New Roman" w:hAnsi="Times New Roman" w:eastAsia="宋体"/>
                 <w:sz w:val="18"/>
               </w:rPr>
-              <w:t>macOS为已归档基线提交；Linux不作模型接口结论</w:t>
+              <w:t>公开统一候选三平台CI；仅限合成输入接口断言</w:t>
             </w:r>
           </w:p>
         </w:tc>
@@ -7324,7 +7336,7 @@
         <w:rPr>
           <w:rFonts w:ascii="Times New Roman" w:hAnsi="Times New Roman" w:eastAsia="宋体"/>
         </w:rPr>
-        <w:t xml:space="preserve"> Windows and macOS provide the complete controlled-experiment evidence. Ubuntu CI verifies the listed core paths using fixed dependencies and small deterministic fixtures; it does not cover Emerald, real-network access, or real land files.</w:t>
+        <w:t xml:space="preserve"> Windows and macOS provide the complete controlled-experiment evidence. Ubuntu CI verifies the listed core paths and the five-assertion Emerald interface smoke test using fixed dependencies and deterministic fixtures; it does not cover real-network access, real land files, long-term simulations, or scientific validity.</w:t>
       </w:r>
     </w:p>
     <w:p>
@@ -8302,7 +8314,7 @@
         <w:rPr>
           <w:rFonts w:ascii="Times New Roman" w:hAnsi="Times New Roman" w:eastAsia="宋体"/>
         </w:rPr>
-        <w:t>三个公开仓库随后在固定Julia 1.12.6环境完成</w:t>
+        <w:t>四个公开仓库随后在固定Julia 1.12.6环境完成</w:t>
       </w:r>
       <w:r>
         <w:rPr>
@@ -8338,7 +8350,7 @@
         <w:rPr>
           <w:rFonts w:ascii="Times New Roman" w:hAnsi="Times New Roman" w:eastAsia="宋体"/>
         </w:rPr>
-        <w:t>持续集成。Ubuntu任务中，GriddingMachine 63项、GriddingMachineDatasets配置38项与包集成35项全部通过；研究仓库的29个非交互生产案例、65次故障状态断言和40次分发测量也全部完成。研究仓库保存三平台实验输出，GriddingMachineDatasets工作流分别保存三平台Manifest。CI分发实验为控制运行时间而使用小型确定性NetCDF夹具，因此只用于检查流程、哈希和文件状态，性能数值不与Windows和macOS真实ELEV/LAI样本合并。Ubuntu没有执行Emerald、校外FTP—Zenodo访问或真实</w:t>
+        <w:t>持续集成。Ubuntu任务中，GriddingMachine 63项、GriddingMachineDatasets配置38项与包集成35项全部通过；研究仓库的29个非交互生产案例、65次故障状态断言和40次分发测量也全部完成；Emerald统一候选的5项最小接口烟雾断言通过。研究仓库保存三平台实验输出，GriddingMachineDatasets和Emerald工作流分别保存三平台Manifest。CI分发实验为控制运行时间而使用小型确定性NetCDF夹具，因此只用于检查流程、哈希和文件状态，性能数值不与Windows和macOS真实ELEV/LAI样本合并。Ubuntu没有执行校外FTP—Zenodo访问、真实</w:t>
       </w:r>
       <w:r>
         <w:rPr>
@@ -8350,7 +8362,7 @@
         <w:rPr>
           <w:rFonts w:ascii="Times New Roman" w:hAnsi="Times New Roman" w:eastAsia="宋体"/>
         </w:rPr>
-        <w:t>案例，故Linux结论限定为表4所列核心代码路径的兼容性验证。</w:t>
+        <w:t>案例或长期模型模拟，故Linux结论限定为表4所列核心代码路径与合成输入模型接口的兼容性验证。</w:t>
       </w:r>
     </w:p>
     <w:p>
@@ -8358,7 +8370,7 @@
         <w:rPr>
           <w:rFonts w:ascii="Times New Roman" w:hAnsi="Times New Roman" w:eastAsia="宋体"/>
         </w:rPr>
-        <w:t>候选论文分支已消除Emerald与GriddingMachine之间的NetcdfIO约束冲突：GriddingMachineDatasets和本地Emerald候选均固定到同一GriddingMachine提交，NetcdfIO与PkgUtility分别统一为0.3.0和0.3.1，历史移动分支及冲突Manifest不再参与解析。Windows统一环境中GriddingMachine 63/63、GriddingMachineDatasets 38/38和35/35、Emerald 5/5全部通过。由于作者决定暂不公开Emerald候选</w:t>
+        <w:t>候选论文分支已消除Emerald与GriddingMachine之间的NetcdfIO约束冲突：GriddingMachineDatasets和Emerald候选均固定到同一GriddingMachine提交，NetcdfIO与PkgUtility分别统一为0.3.0和0.3.1，历史移动分支及冲突Manifest不再参与解析。Windows统一环境中GriddingMachine 63/63、GriddingMachineDatasets 38/38和35/35、Emerald 5/5全部通过。Emerald候选核心提交</w:t>
       </w:r>
       <w:r>
         <w:rPr>
@@ -8370,7 +8382,19 @@
         <w:rPr>
           <w:rFonts w:ascii="Times New Roman" w:hAnsi="Times New Roman" w:eastAsia="宋体"/>
         </w:rPr>
-        <w:t>，公共三平台CI只证明GriddingMachine及GriddingMachineDatasets的统一依赖，不把Emerald候选写成三平台公开验证；投稿前需决定是否公开和永久归档该候选，或把Emerald仅作为外部接口案例报告。</w:t>
+        <w:t>现已发布至独立论文仓库，仓库快照</w:t>
+      </w:r>
+      <w:r>
+        <w:rPr>
+          <w:rFonts w:ascii="Consolas" w:hAnsi="Consolas" w:eastAsia="等线"/>
+        </w:rPr>
+        <w:t>b95d119</w:t>
+      </w:r>
+      <w:r>
+        <w:rPr>
+          <w:rFonts w:ascii="Times New Roman" w:hAnsi="Times New Roman" w:eastAsia="宋体"/>
+        </w:rPr>
+        <w:t>在Windows、macOS和Ubuntu干净runner上均通过5/5接口烟雾断言并归档平台Manifest。该证据使统一依赖和受控接口具备公开三平台复现记录，但不扩展为真实气象、长期模拟或全部Emerald科学过程的验证。</w:t>
       </w:r>
     </w:p>
     <w:p>
@@ -8424,7 +8448,7 @@
         <w:rPr>
           <w:rFonts w:ascii="Times New Roman" w:hAnsi="Times New Roman" w:eastAsia="宋体"/>
         </w:rPr>
-        <w:t>链路预实验；Ubuntu CI进一步验证了核心包、生产、故障和小型分发路径。尚未完成的是校园网真实FTP—Zenodo实验；历史目录迁移、真实气象链路和Linux上的Emerald/真实数据实验属于后续扩展。</w:t>
+        <w:t>链路预实验；Ubuntu CI进一步验证了核心包、生产、故障、小型分发路径和Emerald合成输入接口烟雾。尚未完成的是校园网真实FTP—Zenodo实验；历史目录迁移、真实气象链路及Linux上的真实数据和长期模型实验属于后续扩展。</w:t>
       </w:r>
     </w:p>
     <w:p>
@@ -8444,7 +8468,7 @@
         <w:rPr>
           <w:rFonts w:ascii="Times New Roman" w:hAnsi="Times New Roman" w:eastAsia="宋体"/>
         </w:rPr>
-        <w:t>陆面链路。上述完整受控实验在Windows与macOS均通过，Ubuntu CI又独立检查核心代码路径，说明主要流程并非只能在单一操作系统运行。P01需要一次说明，表明流程仍有文档改进空间，但不影响自动产物正确性的判断。Linux上的Emerald与真实数据复核、原始ELEV重建、陆面逐字段科学金标准和真实ERA5属于不同强度的工程或科学验证；它们不是本文软件流程优化结论的前置条件。</w:t>
+        <w:t>陆面链路。上述完整受控实验在Windows与macOS均通过，Ubuntu CI又独立检查核心代码路径和Emerald合成输入接口，说明主要流程并非只能在单一操作系统运行。P01需要一次说明，表明流程仍有文档改进空间，但不影响自动产物正确性的判断。Linux上的真实数据复核与长期Emerald模拟、原始ELEV重建、陆面逐字段科学金标准和真实ERA5属于不同强度的工程或科学验证；它们不是本文软件流程优化结论的前置条件。</w:t>
       </w:r>
     </w:p>
     <w:p>
@@ -8597,7 +8621,7 @@
         <w:rPr>
           <w:rFonts w:ascii="Times New Roman" w:hAnsi="Times New Roman" w:eastAsia="宋体"/>
         </w:rPr>
-        <w:t>延迟不是FTP或Zenodo下载吞吐率，且ICMP策略与域名解析异常都可能造成可下载地址被排后或暂时不可达；真实校园网实验必须同时报告ping和实际下载，不能把当前排序称为最优选择。本文的完整受控实验和校外观察覆盖Windows与macOS；Ubuntu CI覆盖核心包、生产、故障及小型分发路径，但不覆盖Emerald、真实网络和真实陆面文件。校园网内的FTP—Zenodo正式比较仍待执行。Emerald依赖冲突已在本地候选分支解决，但该候选尚未公开，也未在macOS与Ubuntu干净环境复核。</w:t>
+        <w:t>延迟不是FTP或Zenodo下载吞吐率，且ICMP策略与域名解析异常都可能造成可下载地址被排后或暂时不可达；真实校园网实验必须同时报告ping和实际下载，不能把当前排序称为最优选择。本文的完整受控实验和校外观察覆盖Windows与macOS；Ubuntu CI覆盖核心包、生产、故障、小型分发路径及Emerald合成输入接口烟雾，但不覆盖真实网络、真实陆面文件、长期模型模拟或科学过程验证。校园网内的FTP—Zenodo正式比较仍待执行。Emerald统一依赖候选已经公开并在三平台干净runner上通过5/5烟雾断言，但仍需不可变release和永久归档。</w:t>
       </w:r>
     </w:p>
     <w:p>
@@ -8764,7 +8788,7 @@
         <w:rPr>
           <w:rFonts w:ascii="Times New Roman" w:hAnsi="Times New Roman" w:eastAsia="宋体"/>
         </w:rPr>
-        <w:t>陆面文件全部通过完整性核验，US-NR1参数字典成功生成，撒哈拉非植被格点按预期拒绝。Ubuntu CI进一步通过GriddingMachine 63项、GriddingMachineDatasets 73项、29个非交互生产案例、65次故障状态断言和40次小型确定性分发测量，支持核心代码路径的Linux兼容性。本文不把Linux CI外推为Emerald、真实网络或真实陆面文件验证，也不把单案例复现外推为用户研究，不声称效率数值适用于所有文件或冷缓存、ping排序等同于吞吐率最优、真实气象已经验证、真实参数已完成独立科学数值验证或接口已验证长期模型模拟。投稿前关键剩余证据为校园网内实际FTP—Zenodo访问、正式release与永久归档；Emerald若作为可复现公共依赖，还需决定是否公开候选提交并补充相应平台验证。</w:t>
+        <w:t>陆面文件全部通过完整性核验，US-NR1参数字典成功生成，撒哈拉非植被格点按预期拒绝。Ubuntu CI进一步通过GriddingMachine 63项、GriddingMachineDatasets 73项、29个非交互生产案例、65次故障状态断言、40次小型确定性分发测量和Emerald 5项合成输入接口烟雾断言，支持核心代码路径及受控模型接口的Linux兼容性。本文不把Linux CI外推为真实网络、真实陆面文件、长期Emerald模拟或科学正确性验证，也不把单案例复现外推为用户研究，不声称效率数值适用于所有文件或冷缓存、ping排序等同于吞吐率最优、真实气象已经验证或真实参数已完成独立科学数值验证。投稿前关键剩余证据为校园网内实际FTP—Zenodo访问、正式release与永久归档。</w:t>
       </w:r>
     </w:p>
     <w:p>
@@ -8827,6 +8851,30 @@
         <w:rPr>
           <w:rFonts w:ascii="Times New Roman" w:hAnsi="Times New Roman" w:eastAsia="宋体"/>
         </w:rPr>
+        <w:t>。Emerald统一依赖候选公开于https://github.com/jhOo1/Emerald-paper，接口代码提交为</w:t>
+      </w:r>
+      <w:r>
+        <w:rPr>
+          <w:rFonts w:ascii="Consolas" w:hAnsi="Consolas" w:eastAsia="等线"/>
+        </w:rPr>
+        <w:t>d79324f5dbbfc560ccf1d796e10533ee3a7cd4f1</w:t>
+      </w:r>
+      <w:r>
+        <w:rPr>
+          <w:rFonts w:ascii="Times New Roman" w:hAnsi="Times New Roman" w:eastAsia="宋体"/>
+        </w:rPr>
+        <w:t>，可复现仓库快照为</w:t>
+      </w:r>
+      <w:r>
+        <w:rPr>
+          <w:rFonts w:ascii="Consolas" w:hAnsi="Consolas" w:eastAsia="等线"/>
+        </w:rPr>
+        <w:t>b95d119204b2d1d6f82fd51ed5cffd4c5345af75</w:t>
+      </w:r>
+      <w:r>
+        <w:rPr>
+          <w:rFonts w:ascii="Times New Roman" w:hAnsi="Times New Roman" w:eastAsia="宋体"/>
+        </w:rPr>
         <w:t>。实验协议、脚本和阶段性结果公开于https://github.com/jhOo1/GriddingMachine_Reaserach，表4对应的实验冻结提交为</w:t>
       </w:r>
       <w:r>
@@ -8839,19 +8887,7 @@
         <w:rPr>
           <w:rFonts w:ascii="Times New Roman" w:hAnsi="Times New Roman" w:eastAsia="宋体"/>
         </w:rPr>
-        <w:t>。三平台持续集成记录分别为https://github.com/CliMA/GriddingMachine.jl/actions/runs/31876825314、https://github.com/jhOo1/GriddingMachineDatasets/actions/runs/31876841675和https://github.com/jhOo1/GriddingMachine_Reaserach/actions/runs/31877990092。Emerald统一依赖候选</w:t>
-      </w:r>
-      <w:r>
-        <w:rPr>
-          <w:rFonts w:ascii="Consolas" w:hAnsi="Consolas" w:eastAsia="等线"/>
-        </w:rPr>
-        <w:t>d79324f5dbbfc560ccf1d796e10533ee3a7cd4f1</w:t>
-      </w:r>
-      <w:r>
-        <w:rPr>
-          <w:rFonts w:ascii="Times New Roman" w:hAnsi="Times New Roman" w:eastAsia="宋体"/>
-        </w:rPr>
-        <w:t>目前仅保存在作者本地，未作为公开代码材料。GitHub Actions工件具有保留期限，投稿前仍应为软件、数据目录、原始结果、环境文件和绘图脚本创建不可变release及带DOI的永久归档。</w:t>
+        <w:t>。三平台持续集成记录分别为https://github.com/CliMA/GriddingMachine.jl/actions/runs/31876825314、https://github.com/jhOo1/GriddingMachineDatasets/actions/runs/31876841675、https://github.com/jhOo1/GriddingMachine_Reaserach/actions/runs/31877990092和https://github.com/jhOo1/Emerald-paper/actions/runs/31886671034。GitHub Actions工件具有保留期限，投稿前仍应为软件、数据目录、原始结果、环境文件和绘图脚本创建不可变release及带DOI的永久归档。</w:t>
       </w:r>
     </w:p>
     <w:p>

</xml_diff>

<commit_message>
docs: separate release readiness from research results
</commit_message>
<xml_diff>
--- a/论文/GriddingMachine论文初稿_导师审阅版.docx
+++ b/论文/GriddingMachine论文初稿_导师审阅版.docx
@@ -11,7 +11,7 @@
         <w:rPr>
           <w:rFonts w:ascii="Times New Roman" w:hAnsi="Times New Roman" w:eastAsia="宋体"/>
         </w:rPr>
-        <w:t>GriddingMachine：全球网格数据生产、分发与模型调用框架的更新与验证</w:t>
+        <w:t>面向地球系统模型的全球网格数据生产与可信分发：GriddingMachine框架更新及验证</w:t>
       </w:r>
     </w:p>
     <w:p>
@@ -82,7 +82,7 @@
         <w:rPr>
           <w:rFonts w:ascii="Times New Roman" w:hAnsi="Times New Roman" w:eastAsia="宋体"/>
         </w:rPr>
-        <w:t>地球系统模型依赖来源和格式各异的全球网格数据，数据制作、发布、稳定获取与模型适配仍存在重复劳动。本文在2022版GriddingMachine基础上构建从数据贡献到模型调用的可验证工作流：共享模式（schema）约束YAML配置与NetCDF生产，可独立更新的多镜像目录以</w:t>
+        <w:t>全球网格数据的源维度、坐标方向、缩放、缺失值和分发位置不一致，制约地球系统模型输入的可重复生产与稳定获取。本文在2022版GriddingMachine基础上构建可验证的数据生命周期：共享模式（schema）约束YAML配置、源维度映射和标准NetCDF生产；独立目录登记逻辑路径、多个镜像及文件完整性元数据；事务式下载以隔离缓存和</w:t>
       </w:r>
       <w:r>
         <w:rPr>
@@ -94,55 +94,7 @@
         <w:rPr>
           <w:rFonts w:ascii="Times New Roman" w:hAnsi="Times New Roman" w:eastAsia="宋体"/>
         </w:rPr>
-        <w:t>控制缓存和正式落盘，</w:t>
-      </w:r>
-      <w:r>
-        <w:rPr>
-          <w:rFonts w:ascii="Consolas" w:hAnsi="Consolas" w:eastAsia="等线"/>
-        </w:rPr>
-        <w:t>read_dataset</w:t>
-      </w:r>
-      <w:r>
-        <w:rPr>
-          <w:rFonts w:ascii="Times New Roman" w:hAnsi="Times New Roman" w:eastAsia="宋体"/>
-        </w:rPr>
-        <w:t>、</w:t>
-      </w:r>
-      <w:r>
-        <w:rPr>
-          <w:rFonts w:ascii="Consolas" w:hAnsi="Consolas" w:eastAsia="等线"/>
-        </w:rPr>
-        <w:t>grid_dict</w:t>
-      </w:r>
-      <w:r>
-        <w:rPr>
-          <w:rFonts w:ascii="Times New Roman" w:hAnsi="Times New Roman" w:eastAsia="宋体"/>
-        </w:rPr>
-        <w:t>与</w:t>
-      </w:r>
-      <w:r>
-        <w:rPr>
-          <w:rFonts w:ascii="Consolas" w:hAnsi="Consolas" w:eastAsia="等线"/>
-        </w:rPr>
-        <w:t>grid_weather</w:t>
-      </w:r>
-      <w:r>
-        <w:rPr>
-          <w:rFonts w:ascii="Times New Roman" w:hAnsi="Times New Roman" w:eastAsia="宋体"/>
-        </w:rPr>
-        <w:t>统一数据读取及Emerald输入组织。在Windows和macOS的Julia 1.12.6环境中，GriddingMachineDatasets 73项、GriddingMachine 63项及Emerald烟雾5项测试全部通过；29个非交互生产案例在两平台各连续3轮通过，单人方向审核为PASS。一名未参与开发者经1次配置说明后完成受控贡献流程，产物验收为PASS。13个故障场景在两平台各重复5次，130次状态断言全部通过且无</w:t>
-      </w:r>
-      <w:r>
-        <w:rPr>
-          <w:rFonts w:ascii="Consolas" w:hAnsi="Consolas" w:eastAsia="等线"/>
-        </w:rPr>
-        <w:t>.part</w:t>
-      </w:r>
-      <w:r>
-        <w:rPr>
-          <w:rFonts w:ascii="Times New Roman" w:hAnsi="Times New Roman" w:eastAsia="宋体"/>
-        </w:rPr>
-        <w:t>残留。两轮校外真实访问中，Zenodo下载均通过大小和哈希核验，机构FTP均因网络边界超时；其中一轮记录到DNS异常解析和正式记录前的一次传输截断。两个内部压缩样本改为直接NetCDF后，暖缓存端到端中位时间在两平台均降低。14个真实陆面文件通过完整性核验，US-NR1参数字典成功生成，非植被格点按预期拒绝。Ubuntu持续集成另通过73项、63项包测试、29个生产案例、65次故障断言和40次小型确定性分发测量，支持核心路径的Linux兼容性。结果表明，新版以机器可检查契约连接了数据生产、分发和模型接口；Linux证据不包含Emerald、真实网络和真实陆面案例，校园网镜像比较、真实气象和长期模拟不在当前结论内。</w:t>
+        <w:t>核验保护正式文件；统一读取和模型就绪接口组织下游输入。二维/三维合成矩阵在Windows与macOS各连续3轮通过，13类故障在两平台共130次状态断言中均未污染正式文件。校园网内4个测试标签经FTP和Zenodo共24次下载均通过大小和摘要核验；两个内部压缩样本采用直接NetCDF后暖缓存端到端中位时间在两平台均降低；14个真实陆面文件能够生成US-NR1参数字典，非植被格点按预期拒绝。结果表明，共享生产契约能够正确执行受控维度和数值变换，事务式下载能够在镜像及内容故障下保持正式文件状态，标准陆面数据能够进入模型输入组织。当前证据尚不覆盖真实异构原始产品的完整生产链、真实气象驱动或非Julia接口。该框架为全球规则网格数据的持续生产、可信分发与模型就绪访问提供了可执行工作流。</w:t>
       </w:r>
     </w:p>
     <w:p>
@@ -157,7 +109,7 @@
         <w:rPr>
           <w:rFonts w:ascii="Times New Roman" w:hAnsi="Times New Roman" w:eastAsia="宋体"/>
         </w:rPr>
-        <w:t xml:space="preserve"> 地球系统模型；全球网格数据；数据标准化；NetCDF；数据分发；模型初始化</w:t>
+        <w:t xml:space="preserve"> 地球系统模型；全球网格数据；数据生命周期；NetCDF；可信分发；数据完整性</w:t>
       </w:r>
     </w:p>
     <w:p>
@@ -172,7 +124,7 @@
         <w:rPr>
           <w:rFonts w:ascii="Times New Roman" w:hAnsi="Times New Roman" w:eastAsia="宋体"/>
         </w:rPr>
-        <w:t xml:space="preserve"> GriddingMachine: Updating and Validating a Framework for Global Gridded Data Production, Distribution, and Model Use</w:t>
+        <w:t xml:space="preserve"> Production and Trustworthy Distribution of Global Gridded Data for Earth System Models: An Updated and Validated GriddingMachine Framework</w:t>
       </w:r>
     </w:p>
     <w:p>
@@ -230,7 +182,7 @@
         <w:rPr>
           <w:rFonts w:ascii="Times New Roman" w:hAnsi="Times New Roman" w:eastAsia="宋体"/>
         </w:rPr>
-        <w:t xml:space="preserve">Earth system models rely on heterogeneous global gridded datasets, yet their production, distribution, reliable acquisition, and model adaptation still require repeated work. Building on the 2022 GriddingMachine release, this study establishes a verifiable workflow from data contribution to model use. A shared schema constrains YAML configuration and NetCDF production; an independently updated multi-mirror catalog uses isolated cache files and </w:t>
+        <w:t xml:space="preserve">Differences in source dimensions, coordinate orientation, scaling, missing values, and hosting locations hinder the reproducible production and reliable acquisition of global gridded inputs for Earth system models. Building on the 2022 GriddingMachine release, this study develops a verifiable data lifecycle. A shared schema constrains YAML configuration, source-dimension mapping, and standardized NetCDF production; an independent catalog records logical paths, multiple mirrors, and file-integrity metadata; transactional downloads protect formal files through isolated cache files and </w:t>
       </w:r>
       <w:r>
         <w:rPr>
@@ -242,55 +194,7 @@
         <w:rPr>
           <w:rFonts w:ascii="Times New Roman" w:hAnsi="Times New Roman" w:eastAsia="宋体"/>
         </w:rPr>
-        <w:t xml:space="preserve"> checks before promotion; and </w:t>
-      </w:r>
-      <w:r>
-        <w:rPr>
-          <w:rFonts w:ascii="Consolas" w:hAnsi="Consolas" w:eastAsia="等线"/>
-        </w:rPr>
-        <w:t>read_dataset</w:t>
-      </w:r>
-      <w:r>
-        <w:rPr>
-          <w:rFonts w:ascii="Times New Roman" w:hAnsi="Times New Roman" w:eastAsia="宋体"/>
-        </w:rPr>
-        <w:t xml:space="preserve">, </w:t>
-      </w:r>
-      <w:r>
-        <w:rPr>
-          <w:rFonts w:ascii="Consolas" w:hAnsi="Consolas" w:eastAsia="等线"/>
-        </w:rPr>
-        <w:t>grid_dict</w:t>
-      </w:r>
-      <w:r>
-        <w:rPr>
-          <w:rFonts w:ascii="Times New Roman" w:hAnsi="Times New Roman" w:eastAsia="宋体"/>
-        </w:rPr>
-        <w:t xml:space="preserve">, and </w:t>
-      </w:r>
-      <w:r>
-        <w:rPr>
-          <w:rFonts w:ascii="Consolas" w:hAnsi="Consolas" w:eastAsia="等线"/>
-        </w:rPr>
-        <w:t>grid_weather</w:t>
-      </w:r>
-      <w:r>
-        <w:rPr>
-          <w:rFonts w:ascii="Times New Roman" w:hAnsi="Times New Roman" w:eastAsia="宋体"/>
-        </w:rPr>
-        <w:t xml:space="preserve"> organize data for Emerald. On Windows and macOS under Julia 1.12.6, all 73 production-package tests, 63 data-use tests, and five Emerald smoke checks passed. All 29 non-interactive production cases passed in three runs per platform, and a single-operator orientation audit passed. One participant not involved in development completed the controlled contribution workflow after one configuration clarification. Across 13 fault scenarios repeated five times per platform, all 130 state assertions passed with no residual </w:t>
-      </w:r>
-      <w:r>
-        <w:rPr>
-          <w:rFonts w:ascii="Consolas" w:hAnsi="Consolas" w:eastAsia="等线"/>
-        </w:rPr>
-        <w:t>.part</w:t>
-      </w:r>
-      <w:r>
-        <w:rPr>
-          <w:rFonts w:ascii="Times New Roman" w:hAnsi="Times New Roman" w:eastAsia="宋体"/>
-        </w:rPr>
-        <w:t xml:space="preserve"> files. In off-campus observations, Zenodo downloads matched registered sizes and SHA-256 hashes, whereas institutional FTP attempts timed out at the network boundary; one round recorded anomalous DNS resolution and one truncated probe before formal runs. Direct NetCDF reduced median warm-cache end-to-end time on both platforms for two internally compressed samples. Fourteen verified land files supported a parameter dictionary at US-NR1, while a non-vegetated cell was rejected as expected. Ubuntu CI additionally passed the 73 and 63 package tests, 29 production cases, 65 fault assertions, and 40 distribution measurements using small deterministic fixtures. The updated framework therefore connects production, distribution, and model interfaces through machine-checkable contracts. Linux evidence is limited to the tested core paths and excludes Emerald, real-network access, and real land files; campus-network comparison, real-weather validation, and long-term simulation remain outside the conclusions.</w:t>
+        <w:t xml:space="preserve"> checks; and unified reading and model-ready interfaces organize downstream inputs. A two- and three-dimensional synthetic matrix passed three consecutive runs on both Windows and macOS. Across 13 injected failure classes, all 130 state assertions confirmed that invalid downloads did not contaminate formal files. On the campus network, 24 FTP and Zenodo downloads of four test tags all matched the registered sizes and digests. Direct NetCDF reduced median warm-cache end-to-end time on both platforms for two internally compressed samples. Fourteen verified land files produced a parameter dictionary for US-NR1, while a non-vegetated grid cell was rejected as expected. The results show that the shared production contract correctly performs controlled dimension and numerical transformations, transactional downloads preserve formal-file state under mirror and content failures, and standardized land data can enter model-input organization. Current evidence does not cover a complete production chain from a real heterogeneous raw product, real-weather forcing, or updated non-Julia interfaces. The framework provides an executable workflow for maintaining, reliably distributing, and accessing model-ready global regular-grid data.</w:t>
       </w:r>
     </w:p>
     <w:p>
@@ -305,7 +209,7 @@
         <w:rPr>
           <w:rFonts w:ascii="Times New Roman" w:hAnsi="Times New Roman" w:eastAsia="宋体"/>
         </w:rPr>
-        <w:t xml:space="preserve"> Earth system modeling; global gridded data; data standardization; NetCDF; data distribution; model initialization</w:t>
+        <w:t xml:space="preserve"> Earth system modeling; global gridded data; data lifecycle; NetCDF; trustworthy distribution; data integrity</w:t>
       </w:r>
     </w:p>
     <w:p>
@@ -340,7 +244,7 @@
         <w:rPr>
           <w:rFonts w:ascii="Times New Roman" w:hAnsi="Times New Roman" w:eastAsia="宋体"/>
         </w:rPr>
-        <w:t>王玉杰等[4]于 2022 年提出 GriddingMachine，将常用于陆面和地球系统模拟的全球数据处理为具有统一空间和变量约定的 NetCDF 文件，并通过标签、</w:t>
+        <w:t>王玉杰等[4]于2022年提出GriddingMachine，将常用于陆面和地球系统模拟的全球数据处理为具有统一空间和变量约定的NetCDF文件，并通过标签、</w:t>
       </w:r>
       <w:r>
         <w:rPr>
@@ -352,7 +256,7 @@
         <w:rPr>
           <w:rFonts w:ascii="Times New Roman" w:hAnsi="Times New Roman" w:eastAsia="宋体"/>
         </w:rPr>
-        <w:t xml:space="preserve"> 和 Julia artifact 机制实现数据管理和自动下载，同时提供 Julia、MATLAB、Octave、Python 和 R 接口。该版本降低了全球网格数据发现和调用的门槛，并明确了经纬度方向、空间分辨率、变量名称、缺失值、单位、引用信息和处理日志等数据规范。但是，旧版采用 </w:t>
+        <w:t>和Julia artifact机制实现数据管理和自动下载，同时提供Julia、MATLAB、Octave、Python和R接口。旧版目录已经记录SHA-1、SHA-256和一个或多个下载URL，数据标准也已规定经纬度方向、空间分辨率、变量名称、缺失值、单位、引用信息和处理日志。因此，哈希、多个URL、标准NetCDF和标签本身不是本文新增贡献。尚待解决的问题是：数据源专用处理如何提升为共享且可测试的生产契约，目录如何脱离软件版本演化，直接NetCDF下载如何在失败时隔离不完整文件，以及标准数据如何以可回归的接口进入模型输入组织。旧版采用</w:t>
       </w:r>
       <w:r>
         <w:rPr>
@@ -364,7 +268,7 @@
         <w:rPr>
           <w:rFonts w:ascii="Times New Roman" w:hAnsi="Times New Roman" w:eastAsia="宋体"/>
         </w:rPr>
-        <w:t xml:space="preserve"> 作为分发单元，数据目录随软件发布更新，数据镜像和贡献流程的扩展能力有限；当数据存储位置、网络环境和软件接口持续变化时，数据生产、发布、更新和模型使用之间仍缺少统一且可验证的闭环。</w:t>
+        <w:t>作为分发单元且目录随软件发布更新，正为这些生命周期更新提供了明确基线。</w:t>
       </w:r>
     </w:p>
     <w:p>
@@ -392,55 +296,55 @@
         <w:rPr>
           <w:rFonts w:ascii="Times New Roman" w:hAnsi="Times New Roman" w:eastAsia="宋体"/>
         </w:rPr>
-        <w:t>辅助贡献者生成YAML，通用流水线依据配置完成源维度映射、坐标和数值处理、质量检查及标准NetCDF输出；在分发端，以可直接读取的NetCDF替代二次压缩制品，通过独立目录登记机构FTP、Zenodo及其他社区镜像，并在cache下载后校验文件大小和SHA-256；在数据使用端，系统化测试目录更新、单文件下载、全库同步、旧文件清理、目录与信息查询等操作，以</w:t>
+        <w:t>辅助贡献者生成YAML，通用流水线依据配置完成源维度映射、坐标和数值处理、质量检查及标准NetCDF输出；在分发端，以可直接读取的NetCDF替代二次压缩制品，通过独立目录登记机构FTP、Zenodo及其他社区镜像，并对已登记</w:t>
       </w:r>
       <w:r>
         <w:rPr>
           <w:rFonts w:ascii="Consolas" w:hAnsi="Consolas" w:eastAsia="等线"/>
         </w:rPr>
+        <w:t>SIZE/SHA256</w:t>
+      </w:r>
+      <w:r>
+        <w:rPr>
+          <w:rFonts w:ascii="Times New Roman" w:hAnsi="Times New Roman" w:eastAsia="宋体"/>
+        </w:rPr>
+        <w:t>的条目在cache下载后执行严格完整性核验；在数据使用端，以</w:t>
+      </w:r>
+      <w:r>
+        <w:rPr>
+          <w:rFonts w:ascii="Consolas" w:hAnsi="Consolas" w:eastAsia="等线"/>
+        </w:rPr>
         <w:t>read_dataset</w:t>
       </w:r>
       <w:r>
         <w:rPr>
           <w:rFonts w:ascii="Times New Roman" w:hAnsi="Times New Roman" w:eastAsia="宋体"/>
         </w:rPr>
-        <w:t>替代含义不准确的</w:t>
+        <w:t>统一读取，再通过</w:t>
       </w:r>
       <w:r>
         <w:rPr>
           <w:rFonts w:ascii="Consolas" w:hAnsi="Consolas" w:eastAsia="等线"/>
         </w:rPr>
-        <w:t>read_LUT</w:t>
-      </w:r>
-      <w:r>
-        <w:rPr>
-          <w:rFonts w:ascii="Times New Roman" w:hAnsi="Times New Roman" w:eastAsia="宋体"/>
-        </w:rPr>
-        <w:t>名称，再通过</w:t>
+        <w:t>grid_dict</w:t>
+      </w:r>
+      <w:r>
+        <w:rPr>
+          <w:rFonts w:ascii="Times New Roman" w:hAnsi="Times New Roman" w:eastAsia="宋体"/>
+        </w:rPr>
+        <w:t>和</w:t>
       </w:r>
       <w:r>
         <w:rPr>
           <w:rFonts w:ascii="Consolas" w:hAnsi="Consolas" w:eastAsia="等线"/>
         </w:rPr>
-        <w:t>grid_dict</w:t>
-      </w:r>
-      <w:r>
-        <w:rPr>
-          <w:rFonts w:ascii="Times New Roman" w:hAnsi="Times New Roman" w:eastAsia="宋体"/>
-        </w:rPr>
-        <w:t>和</w:t>
-      </w:r>
-      <w:r>
-        <w:rPr>
-          <w:rFonts w:ascii="Consolas" w:hAnsi="Consolas" w:eastAsia="等线"/>
-        </w:rPr>
         <w:t>grid_weather</w:t>
       </w:r>
       <w:r>
         <w:rPr>
           <w:rFonts w:ascii="Times New Roman" w:hAnsi="Times New Roman" w:eastAsia="宋体"/>
         </w:rPr>
-        <w:t>组织Emerald初始化数据。远程子集服务Server/Requestor涉及端口开放与服务安全，不属于本文范围。</w:t>
+        <w:t>组织Emerald初始化数据。远程子集服务Server/Requestor涉及端口开放与服务安全，不属于本文范围。2022版的MATLAB、Octave、Python和R接口也未在本研究中重新验证，本文关于新版目录、下载状态机和模型接口的结论限定于Julia主路径。</w:t>
       </w:r>
     </w:p>
     <w:p>
@@ -448,43 +352,7 @@
         <w:rPr>
           <w:rFonts w:ascii="Times New Roman" w:hAnsi="Times New Roman" w:eastAsia="宋体"/>
         </w:rPr>
-        <w:t>本文拟回答四个问题：YAML配置契约与生产流水线能否正确处理代表性的二维/三维异构NetCDF，并使未参与开发的贡献者按文档完成数据登记；直接NetCDF、独立目录、多镜像、缓存和SHA校验能否在Windows与macOS受控故障条件下保持下载内容及正式目录状态正确；Collector公共操作和</w:t>
-      </w:r>
-      <w:r>
-        <w:rPr>
-          <w:rFonts w:ascii="Consolas" w:hAnsi="Consolas" w:eastAsia="等线"/>
-        </w:rPr>
-        <w:t>read_dataset</w:t>
-      </w:r>
-      <w:r>
-        <w:rPr>
-          <w:rFonts w:ascii="Times New Roman" w:hAnsi="Times New Roman" w:eastAsia="宋体"/>
-        </w:rPr>
-        <w:t>重载能否在不同本地/远端状态下得到确定结果并保留必要兼容性；</w:t>
-      </w:r>
-      <w:r>
-        <w:rPr>
-          <w:rFonts w:ascii="Consolas" w:hAnsi="Consolas" w:eastAsia="等线"/>
-        </w:rPr>
-        <w:t>grid_dict</w:t>
-      </w:r>
-      <w:r>
-        <w:rPr>
-          <w:rFonts w:ascii="Times New Roman" w:hAnsi="Times New Roman" w:eastAsia="宋体"/>
-        </w:rPr>
-        <w:t>和</w:t>
-      </w:r>
-      <w:r>
-        <w:rPr>
-          <w:rFonts w:ascii="Consolas" w:hAnsi="Consolas" w:eastAsia="等线"/>
-        </w:rPr>
-        <w:t>grid_weather</w:t>
-      </w:r>
-      <w:r>
-        <w:rPr>
-          <w:rFonts w:ascii="Times New Roman" w:hAnsi="Times New Roman" w:eastAsia="宋体"/>
-        </w:rPr>
-        <w:t>能否在受控夹具中生成符合接口约定、可用于Emerald固定格点初始化的数据。取消二次压缩的效率对比作为分发更新的支持实验，而不是独立贡献。Windows与macOS构成本文的双平台完整实测范围；Linux以相同固定依赖和Ubuntu持续集成验证核心软件路径，但不把未在Linux执行的Emerald、真实网络和真实数据案例外推为三平台结果。完整长期模型模拟、真实ERA5气象验证和Server/Requestor均不进入本文验证范围。</w:t>
+        <w:t>本文拟回答三个问题：共享YAML契约与生产流水线能否正确处理代表性的二维/三维维度、坐标和数值变换；独立目录、直接NetCDF、镜像回退及事务式缓存能否在受控故障和真实网络条件下保持下载内容与正式目录状态正确；统一读取和模型就绪接口能否在受控夹具及真实陆面文件上得到符合约定的结果。取消二次压缩的效率对比作为支持实验，而不是独立贡献。Windows与macOS构成完整受控实测范围，Ubuntu持续集成只验证核心软件路径。合成矩阵不能替代真实异构原始产品的端到端科学核对；完整长期模型模拟、真实ERA5气象、非Julia接口和Server/Requestor均不进入本文结论。</w:t>
       </w:r>
     </w:p>
     <w:p>
@@ -757,7 +625,7 @@
         <w:rPr>
           <w:rFonts w:ascii="Times New Roman" w:hAnsi="Times New Roman" w:eastAsia="宋体"/>
         </w:rPr>
-        <w:t xml:space="preserve">在数据使用端，Collector 的 </w:t>
+        <w:t>在数据使用端，Collector的</w:t>
       </w:r>
       <w:r>
         <w:rPr>
@@ -769,7 +637,7 @@
         <w:rPr>
           <w:rFonts w:ascii="Times New Roman" w:hAnsi="Times New Roman" w:eastAsia="宋体"/>
         </w:rPr>
-        <w:t xml:space="preserve"> 显式设置本地根目录与目录来源，包加载不再自动访问网络。目录下载先进入临时文件，经 schema 校验后替换正式目录，并保留上一有效目录；</w:t>
+        <w:t>显式设置本地根目录与目录来源，包加载不再自动访问网络。目录下载先进入临时文件，经schema校验后替换正式目录，并保留上一有效目录；</w:t>
       </w:r>
       <w:r>
         <w:rPr>
@@ -805,19 +673,43 @@
         <w:rPr>
           <w:rFonts w:ascii="Times New Roman" w:hAnsi="Times New Roman" w:eastAsia="宋体"/>
         </w:rPr>
-        <w:t>文件，只有字节数和SHA-256均符合目录时才进入</w:t>
+        <w:t>文件；目录同时登记</w:t>
       </w:r>
       <w:r>
         <w:rPr>
           <w:rFonts w:ascii="Consolas" w:hAnsi="Consolas" w:eastAsia="等线"/>
         </w:rPr>
+        <w:t>SIZE</w:t>
+      </w:r>
+      <w:r>
+        <w:rPr>
+          <w:rFonts w:ascii="Times New Roman" w:hAnsi="Times New Roman" w:eastAsia="宋体"/>
+        </w:rPr>
+        <w:t>和</w:t>
+      </w:r>
+      <w:r>
+        <w:rPr>
+          <w:rFonts w:ascii="Consolas" w:hAnsi="Consolas" w:eastAsia="等线"/>
+        </w:rPr>
+        <w:t>SHA256</w:t>
+      </w:r>
+      <w:r>
+        <w:rPr>
+          <w:rFonts w:ascii="Times New Roman" w:hAnsi="Times New Roman" w:eastAsia="宋体"/>
+        </w:rPr>
+        <w:t>时，文件只有通过两项核验才进入</w:t>
+      </w:r>
+      <w:r>
+        <w:rPr>
+          <w:rFonts w:ascii="Consolas" w:hAnsi="Consolas" w:eastAsia="等线"/>
+        </w:rPr>
         <w:t>public</w:t>
       </w:r>
       <w:r>
         <w:rPr>
           <w:rFonts w:ascii="Times New Roman" w:hAnsi="Times New Roman" w:eastAsia="宋体"/>
         </w:rPr>
-        <w:t>，否则清理本次缓存并尝试下一镜像。Indexer通过</w:t>
+        <w:t>，否则清理本次缓存并尝试下一镜像。为兼容历史目录，缺少完整性字段的条目在默认非严格模式下仍可下载，这类文件不属于本文的“完整性已验证”集合。Indexer通过</w:t>
       </w:r>
       <w:r>
         <w:rPr>
@@ -865,7 +757,7 @@
         <w:rPr>
           <w:rFonts w:ascii="Times New Roman" w:hAnsi="Times New Roman" w:eastAsia="宋体"/>
         </w:rPr>
-        <w:t>真实陆面链路预实验。真实</w:t>
+        <w:t>真实陆面链路预实验；真实</w:t>
       </w:r>
       <w:r>
         <w:rPr>
@@ -877,7 +769,7 @@
         <w:rPr>
           <w:rFonts w:ascii="Times New Roman" w:hAnsi="Times New Roman" w:eastAsia="宋体"/>
         </w:rPr>
-        <w:t>气象链路可作为后续外部有效性扩展，但不是本文证明接口流程化可用的必要实验。</w:t>
+        <w:t>气象链路未执行，因此模型接口仅作为下游应用证据。</w:t>
       </w:r>
     </w:p>
     <w:p>
@@ -1243,7 +1135,7 @@
                 <w:rFonts w:ascii="Times New Roman" w:hAnsi="Times New Roman" w:eastAsia="宋体"/>
                 <w:sz w:val="18"/>
               </w:rPr>
-              <w:t>artifact下载、哈希寻址和解包</w:t>
+              <w:t>artifact哈希寻址、多个URL和解包</w:t>
             </w:r>
           </w:p>
         </w:tc>
@@ -1309,7 +1201,7 @@
                 <w:rFonts w:ascii="Times New Roman" w:hAnsi="Times New Roman" w:eastAsia="宋体"/>
                 <w:sz w:val="18"/>
               </w:rPr>
-              <w:t>Windows与macOS完整实测；Ubuntu CI验证受控核心路径；校园网FTP—Zenodo比较待完成</w:t>
+              <w:t>受控故障矩阵通过；4项校园网双镜像实测</w:t>
             </w:r>
           </w:p>
         </w:tc>
@@ -1565,6 +1457,84 @@
                 <w:sz w:val="18"/>
               </w:rPr>
               <w:t>自动矩阵、单人方向审核和1例受控贡献流程已完成</w:t>
+            </w:r>
+          </w:p>
+        </w:tc>
+      </w:tr>
+      <w:tr>
+        <w:tc>
+          <w:tcPr>
+            <w:tcW w:type="dxa" w:w="2295"/>
+          </w:tcPr>
+          <w:p>
+            <w:r>
+              <w:rPr>
+                <w:sz w:val="18"/>
+              </w:rPr>
+            </w:r>
+            <w:r>
+              <w:rPr>
+                <w:rFonts w:ascii="Times New Roman" w:hAnsi="Times New Roman" w:eastAsia="宋体"/>
+                <w:sz w:val="18"/>
+              </w:rPr>
+              <w:t>语言接口</w:t>
+            </w:r>
+          </w:p>
+        </w:tc>
+        <w:tc>
+          <w:tcPr>
+            <w:tcW w:type="dxa" w:w="2295"/>
+          </w:tcPr>
+          <w:p>
+            <w:r>
+              <w:rPr>
+                <w:sz w:val="18"/>
+              </w:rPr>
+            </w:r>
+            <w:r>
+              <w:rPr>
+                <w:rFonts w:ascii="Times New Roman" w:hAnsi="Times New Roman" w:eastAsia="宋体"/>
+                <w:sz w:val="18"/>
+              </w:rPr>
+              <w:t>Julia、MATLAB、Octave、Python和R</w:t>
+            </w:r>
+          </w:p>
+        </w:tc>
+        <w:tc>
+          <w:tcPr>
+            <w:tcW w:type="dxa" w:w="2295"/>
+          </w:tcPr>
+          <w:p>
+            <w:r>
+              <w:rPr>
+                <w:sz w:val="18"/>
+              </w:rPr>
+            </w:r>
+            <w:r>
+              <w:rPr>
+                <w:rFonts w:ascii="Times New Roman" w:hAnsi="Times New Roman" w:eastAsia="宋体"/>
+                <w:sz w:val="18"/>
+              </w:rPr>
+              <w:t>新版目录与接口实现集中于Julia</w:t>
+            </w:r>
+          </w:p>
+        </w:tc>
+        <w:tc>
+          <w:tcPr>
+            <w:tcW w:type="dxa" w:w="2295"/>
+          </w:tcPr>
+          <w:p>
+            <w:r>
+              <w:rPr>
+                <w:sz w:val="18"/>
+              </w:rPr>
+            </w:r>
+            <w:r>
+              <w:rPr>
+                <w:rFonts w:ascii="Times New Roman" w:hAnsi="Times New Roman" w:eastAsia="宋体"/>
+                <w:sz w:val="18"/>
+              </w:rPr>
+              <w:t>非Julia接口未在本文重新验证</w:t>
             </w:r>
           </w:p>
         </w:tc>
@@ -2451,7 +2421,7 @@
                 <w:rFonts w:ascii="Times New Roman" w:hAnsi="Times New Roman" w:eastAsia="宋体"/>
                 <w:sz w:val="18"/>
               </w:rPr>
-              <w:t>目录记录文件字节数和 SHA-256；同一标签各镜像内容相同</w:t>
+              <w:t>正式发布条目记录文件字节数和SHA-256；同一标签各镜像内容相同</w:t>
             </w:r>
           </w:p>
         </w:tc>
@@ -2853,43 +2823,43 @@
         <w:rPr>
           <w:rFonts w:ascii="Times New Roman" w:hAnsi="Times New Roman" w:eastAsia="宋体"/>
         </w:rPr>
-        <w:t>框1给出P01受控贡献流程实际使用并通过schema与逐点数值验收的最小二维示例。源文件变量</w:t>
+        <w:t>P01受控贡献流程使用一个二维非对称夹具验证配置与处理操作的对应关系。源变量采用</w:t>
       </w:r>
       <w:r>
         <w:rPr>
           <w:rFonts w:ascii="Consolas" w:hAnsi="Consolas" w:eastAsia="等线"/>
         </w:rPr>
-        <w:t>source</w:t>
-      </w:r>
-      <w:r>
-        <w:rPr>
-          <w:rFonts w:ascii="Times New Roman" w:hAnsi="Times New Roman" w:eastAsia="宋体"/>
-        </w:rPr>
-        <w:t>采用</w:t>
+        <w:t>(lat,lon)</w:t>
+      </w:r>
+      <w:r>
+        <w:rPr>
+          <w:rFonts w:ascii="Times New Roman" w:hAnsi="Times New Roman" w:eastAsia="宋体"/>
+        </w:rPr>
+        <w:t>顺序，纬度由北向南、经度范围为</w:t>
       </w:r>
       <w:r>
         <w:rPr>
           <w:rFonts w:ascii="Consolas" w:hAnsi="Consolas" w:eastAsia="等线"/>
         </w:rPr>
-        <w:t>(lat,lon)</w:t>
-      </w:r>
-      <w:r>
-        <w:rPr>
-          <w:rFonts w:ascii="Times New Roman" w:hAnsi="Times New Roman" w:eastAsia="宋体"/>
-        </w:rPr>
-        <w:t>顺序，纬度由北向南、经度范围为</w:t>
+        <w:t>0～360°</w:t>
+      </w:r>
+      <w:r>
+        <w:rPr>
+          <w:rFonts w:ascii="Times New Roman" w:hAnsi="Times New Roman" w:eastAsia="宋体"/>
+        </w:rPr>
+        <w:t>；配置中的关键映射为</w:t>
       </w:r>
       <w:r>
         <w:rPr>
           <w:rFonts w:ascii="Consolas" w:hAnsi="Consolas" w:eastAsia="等线"/>
         </w:rPr>
-        <w:t>0～360°</w:t>
-      </w:r>
-      <w:r>
-        <w:rPr>
-          <w:rFonts w:ascii="Times New Roman" w:hAnsi="Times New Roman" w:eastAsia="宋体"/>
-        </w:rPr>
-        <w:t>；配置显式声明维度语义，并依次进行纬度翻转、经度半球转换和线性变换</w:t>
+        <w:t>DIMENSIONS: source: [lat, lon]</w:t>
+      </w:r>
+      <w:r>
+        <w:rPr>
+          <w:rFonts w:ascii="Times New Roman" w:hAnsi="Times New Roman" w:eastAsia="宋体"/>
+        </w:rPr>
+        <w:t>，并声明纬度翻转、经度半球转换和线性变换</w:t>
       </w:r>
       <w:r>
         <w:rPr>
@@ -2901,7 +2871,7 @@
         <w:rPr>
           <w:rFonts w:ascii="Times New Roman" w:hAnsi="Times New Roman" w:eastAsia="宋体"/>
         </w:rPr>
-        <w:t>。处理后生成标准顺序为</w:t>
+        <w:t>。处理后得到标准</w:t>
       </w:r>
       <w:r>
         <w:rPr>
@@ -2913,7 +2883,7 @@
         <w:rPr>
           <w:rFonts w:ascii="Times New Roman" w:hAnsi="Times New Roman" w:eastAsia="宋体"/>
         </w:rPr>
-        <w:t>的</w:t>
+        <w:t>顺序的</w:t>
       </w:r>
       <w:r>
         <w:rPr>
@@ -2925,112 +2895,7 @@
         <w:rPr>
           <w:rFonts w:ascii="Times New Roman" w:hAnsi="Times New Roman" w:eastAsia="宋体"/>
         </w:rPr>
-        <w:t>。示例中的目录是相对于GriddingMachine数据根目录的逻辑路径，实际贡献时应替换为对应数据集的目录、变量、单位、范围和标签。</w:t>
-      </w:r>
-    </w:p>
-    <w:p>
-      <w:r>
-        <w:rPr>
-          <w:rFonts w:ascii="Times New Roman" w:hAnsi="Times New Roman" w:eastAsia="宋体"/>
-          <w:b/>
-        </w:rPr>
-        <w:t>框1 通过受控贡献实验验证的最小YAML配置</w:t>
-      </w:r>
-    </w:p>
-    <w:p>
-      <w:pPr>
-        <w:spacing w:before="80" w:after="120" w:line="240" w:lineRule="auto"/>
-        <w:ind w:firstLine="0" w:left="312" w:right="312"/>
-        <w:shd w:fill="F2F5F7"/>
-      </w:pPr>
-      <w:r>
-        <w:rPr>
-          <w:rFonts w:ascii="Consolas" w:hAnsi="Consolas" w:eastAsia="等线"/>
-          <w:sz w:val="17"/>
-        </w:rPr>
-        <w:t>SCHEMA_VERSION: 1</w:t>
-        <w:br/>
-        <w:t>FILE:</w:t>
-        <w:br/>
-        <w:t xml:space="preserve">  PATTERN: "PREFIX_NX_X_MT_VV.nc"</w:t>
-        <w:br/>
-        <w:t xml:space="preserve">  PREFIX: ["SRC"]</w:t>
-        <w:br/>
-        <w:t xml:space="preserve">  NX: [2]</w:t>
-        <w:br/>
-        <w:t xml:space="preserve">  MT: ["1Y"]</w:t>
-        <w:br/>
-        <w:t xml:space="preserve">  VV: ["V1"]</w:t>
-        <w:br/>
-        <w:t>FOLDER:</w:t>
-        <w:br/>
-        <w:t xml:space="preserve">  ORIGINAL: "case-input"</w:t>
-        <w:br/>
-        <w:t xml:space="preserve">  REPROCESSED: "case-output"</w:t>
-        <w:br/>
-        <w:t>DATA:</w:t>
-        <w:br/>
-        <w:t xml:space="preserve">  ABOUT: "controlled contributor fixture"</w:t>
-        <w:br/>
-        <w:t xml:space="preserve">  CHANGE_LOGS: []</w:t>
-        <w:br/>
-        <w:t xml:space="preserve">  DIMENSIONS:</w:t>
-        <w:br/>
-        <w:t xml:space="preserve">    source: ["lat", "lon"]</w:t>
-        <w:br/>
-        <w:t xml:space="preserve">  FLIP_LON: true</w:t>
-        <w:br/>
-        <w:t xml:space="preserve">  REV_LAT: true</w:t>
-        <w:br/>
-        <w:t xml:space="preserve">  LABEL: ["source"]</w:t>
-        <w:br/>
-        <w:t xml:space="preserve">  SCALING: "linear"</w:t>
-        <w:br/>
-        <w:t xml:space="preserve">  SCALING_FACTOR: [2, 1]</w:t>
-        <w:br/>
-        <w:t xml:space="preserve">  LIMITS: [23, 49]</w:t>
-        <w:br/>
-        <w:t xml:space="preserve">  GAPFILL: "KEEP_AS_IS"</w:t>
-        <w:br/>
-        <w:t xml:space="preserve">  UNIT: "1"</w:t>
-        <w:br/>
-        <w:t xml:space="preserve">  VERIFY_ONCE: false</w:t>
-        <w:br/>
-        <w:t>GRIDDINGMACHINE:</w:t>
-        <w:br/>
-        <w:t xml:space="preserve">  TAG: "CONTRIB"</w:t>
-      </w:r>
-    </w:p>
-    <w:p>
-      <w:r>
-        <w:rPr>
-          <w:rFonts w:ascii="Times New Roman" w:hAnsi="Times New Roman" w:eastAsia="宋体"/>
-        </w:rPr>
-        <w:t>配置文件可直接作为流水线入口：</w:t>
-      </w:r>
-    </w:p>
-    <w:p>
-      <w:pPr>
-        <w:spacing w:before="80" w:after="120" w:line="240" w:lineRule="auto"/>
-        <w:ind w:firstLine="0" w:left="312" w:right="312"/>
-        <w:shd w:fill="F2F5F7"/>
-      </w:pPr>
-      <w:r>
-        <w:rPr>
-          <w:rFonts w:ascii="Consolas" w:hAnsi="Consolas" w:eastAsia="等线"/>
-          <w:sz w:val="17"/>
-        </w:rPr>
-        <w:t>using GriddingMachineDatasets</w:t>
-        <w:br/>
-        <w:t>process_dataset!("contributor.yaml")</w:t>
-      </w:r>
-    </w:p>
-    <w:p>
-      <w:r>
-        <w:rPr>
-          <w:rFonts w:ascii="Times New Roman" w:hAnsi="Times New Roman" w:eastAsia="宋体"/>
-        </w:rPr>
-        <w:t>这个例子用于解释配置与处理操作之间的对应关系，不代替完整字段字典。来源、许可、引用、复杂时间坐标和数据源专用预处理应在补充材料及正式配置中完整记录。</w:t>
+        <w:t>，逐点结果与独立金标准一致。完整YAML、字段字典、命令和目录说明保存在贡献实验手册中，正文不再重复软件使用指南。来源、许可、引用和复杂时间坐标仍须由真实数据配置完整记录。</w:t>
       </w:r>
     </w:p>
     <w:p>
@@ -4227,7 +4092,7 @@
         <w:rPr>
           <w:rFonts w:ascii="Times New Roman" w:hAnsi="Times New Roman" w:eastAsia="宋体"/>
         </w:rPr>
-        <w:t xml:space="preserve">下载循环按排序结果逐一尝试镜像。每次尝试均写入进程级唯一 </w:t>
+        <w:t>下载循环按排序结果逐一尝试镜像，每次尝试均写入进程级唯一</w:t>
       </w:r>
       <w:r>
         <w:rPr>
@@ -4239,7 +4104,7 @@
         <w:rPr>
           <w:rFonts w:ascii="Times New Roman" w:hAnsi="Times New Roman" w:eastAsia="宋体"/>
         </w:rPr>
-        <w:t xml:space="preserve"> 文件，并检查文件确实生成、字节数符合 </w:t>
+        <w:t>文件。对于同时登记</w:t>
       </w:r>
       <w:r>
         <w:rPr>
@@ -4251,7 +4116,7 @@
         <w:rPr>
           <w:rFonts w:ascii="Times New Roman" w:hAnsi="Times New Roman" w:eastAsia="宋体"/>
         </w:rPr>
-        <w:t xml:space="preserve">、摘要符合 </w:t>
+        <w:t>和</w:t>
       </w:r>
       <w:r>
         <w:rPr>
@@ -4263,7 +4128,31 @@
         <w:rPr>
           <w:rFonts w:ascii="Times New Roman" w:hAnsi="Times New Roman" w:eastAsia="宋体"/>
         </w:rPr>
-        <w:t>；任一条件失败即删除本次临时文件并记录原因，随后尝试下一 URL。全部镜像失败时抛出汇总错误，不触碰已有正式文件。</w:t>
+        <w:t>的条目，程序检查文件是否生成、字节数及摘要是否一致；任一条件失败即删除本次临时文件并尝试下一URL。</w:t>
+      </w:r>
+      <w:r>
+        <w:rPr>
+          <w:rFonts w:ascii="Consolas" w:hAnsi="Consolas" w:eastAsia="等线"/>
+        </w:rPr>
+        <w:t>require_integrity=true</w:t>
+      </w:r>
+      <w:r>
+        <w:rPr>
+          <w:rFonts w:ascii="Times New Roman" w:hAnsi="Times New Roman" w:eastAsia="宋体"/>
+        </w:rPr>
+        <w:t>还会拒绝缺失完整性字段的目录项。当前默认值为</w:t>
+      </w:r>
+      <w:r>
+        <w:rPr>
+          <w:rFonts w:ascii="Consolas" w:hAnsi="Consolas" w:eastAsia="等线"/>
+        </w:rPr>
+        <w:t>false</w:t>
+      </w:r>
+      <w:r>
+        <w:rPr>
+          <w:rFonts w:ascii="Times New Roman" w:hAnsi="Times New Roman" w:eastAsia="宋体"/>
+        </w:rPr>
+        <w:t>以兼容历史目录，因此未登记两字段的文件只能称为“已下载”，不能称为“已通过内容完整性核验”。全部镜像失败时抛出汇总错误，不触碰已有正式文件。</w:t>
       </w:r>
     </w:p>
     <w:p>
@@ -4308,7 +4197,7 @@
         <w:rPr>
           <w:rFonts w:ascii="Times New Roman" w:hAnsi="Times New Roman" w:eastAsia="宋体"/>
         </w:rPr>
-        <w:t xml:space="preserve">每次下载使用 </w:t>
+        <w:t>每次下载使用</w:t>
       </w:r>
       <w:r>
         <w:rPr>
@@ -4320,7 +4209,7 @@
         <w:rPr>
           <w:rFonts w:ascii="Times New Roman" w:hAnsi="Times New Roman" w:eastAsia="宋体"/>
         </w:rPr>
-        <w:t>，校验成功后才移动到正式路径；</w:t>
+        <w:t>；具备完整性字段的条目在校验成功后移动到正式路径，历史兼容条目则遵循非严格模式。</w:t>
       </w:r>
       <w:r>
         <w:rPr>
@@ -4332,7 +4221,7 @@
         <w:rPr>
           <w:rFonts w:ascii="Times New Roman" w:hAnsi="Times New Roman" w:eastAsia="宋体"/>
         </w:rPr>
-        <w:t xml:space="preserve"> 在更新目录后遍历标签并复用相同下载逻辑。论文测试仅同步临时 fixture，不运行超过100 GB的完整历史目录。</w:t>
+        <w:t>在更新目录后遍历标签并复用相同下载逻辑。论文测试仅同步临时fixture，不运行超过100 GB的完整历史目录。</w:t>
       </w:r>
     </w:p>
     <w:p>
@@ -6403,7 +6292,7 @@
         <w:rPr>
           <w:rFonts w:ascii="Times New Roman" w:hAnsi="Times New Roman" w:eastAsia="宋体"/>
         </w:rPr>
-        <w:t>本节只报告固定提交和可追溯日志支持的结果。校园网镜像实验尚未完成，本文不据此作出校内FTP性能结论。Windows与macOS原始实验固定于</w:t>
+        <w:t>本节只报告固定提交和可追溯日志支持的结果。Windows与macOS原始实验固定于</w:t>
       </w:r>
       <w:r>
         <w:rPr>
@@ -6487,7 +6376,7 @@
         <w:rPr>
           <w:rFonts w:ascii="Times New Roman" w:hAnsi="Times New Roman" w:eastAsia="宋体"/>
         </w:rPr>
-        <w:t>，Julia均为1.12.6。全部受控实验——生产编号矩阵、分发效率、故障注入与核心自动回归——在Windows与macOS（Apple Silicon）分别执行并通过；真实网络观察在两个平台的校外环境各完成一轮。相同固定依赖的Ubuntu CI已完成核心包、生产矩阵、故障矩阵、小型确定性分发测试和Emerald最小接口烟雾测试，但没有访问真实网络或真实陆面文件。核心平台覆盖汇总见表4。</w:t>
+        <w:t>，Julia均为1.12.6。完整受控实验在Windows与macOS分别执行，校园网FTP—Zenodo比较在Windows实验电脑完成；Ubuntu CI检查固定依赖下的核心代码路径和Emerald最小接口烟雾，不作为额外科学样本。表4按研究问题汇总主要证据和外推边界，逐平台测试计数及环境信息见补充材料。</w:t>
       </w:r>
     </w:p>
     <w:p>
@@ -6499,7 +6388,7 @@
           <w:rFonts w:ascii="Times New Roman" w:hAnsi="Times New Roman" w:eastAsia="宋体"/>
           <w:b/>
         </w:rPr>
-        <w:t>表4 核心验证结果与平台覆盖</w:t>
+        <w:t>表4 按研究问题汇总的核心验证证据</w:t>
       </w:r>
     </w:p>
     <w:tbl>
@@ -6509,16 +6398,15 @@
         <w:tblLook w:firstColumn="1" w:firstRow="1" w:lastColumn="0" w:lastRow="0" w:noHBand="0" w:noVBand="1" w:val="04A0"/>
       </w:tblPr>
       <w:tblGrid>
-        <w:gridCol w:w="1836"/>
-        <w:gridCol w:w="1836"/>
-        <w:gridCol w:w="1836"/>
-        <w:gridCol w:w="1836"/>
-        <w:gridCol w:w="1836"/>
+        <w:gridCol w:w="2295"/>
+        <w:gridCol w:w="2295"/>
+        <w:gridCol w:w="2295"/>
+        <w:gridCol w:w="2295"/>
       </w:tblGrid>
       <w:tr>
         <w:tc>
           <w:tcPr>
-            <w:tcW w:type="dxa" w:w="1836"/>
+            <w:tcW w:type="dxa" w:w="2295"/>
             <w:shd w:fill="D9EAF7"/>
           </w:tcPr>
           <w:p>
@@ -6534,13 +6422,13 @@
                 <w:b/>
                 <w:sz w:val="18"/>
               </w:rPr>
-              <w:t>验证对象</w:t>
+              <w:t>研究问题</w:t>
             </w:r>
           </w:p>
         </w:tc>
         <w:tc>
           <w:tcPr>
-            <w:tcW w:type="dxa" w:w="1836"/>
+            <w:tcW w:type="dxa" w:w="2295"/>
             <w:shd w:fill="D9EAF7"/>
           </w:tcPr>
           <w:p>
@@ -6556,13 +6444,13 @@
                 <w:b/>
                 <w:sz w:val="18"/>
               </w:rPr>
-              <w:t>Windows</w:t>
+              <w:t>主要证据</w:t>
             </w:r>
           </w:p>
         </w:tc>
         <w:tc>
           <w:tcPr>
-            <w:tcW w:type="dxa" w:w="1836"/>
+            <w:tcW w:type="dxa" w:w="2295"/>
             <w:shd w:fill="D9EAF7"/>
           </w:tcPr>
           <w:p>
@@ -6578,35 +6466,13 @@
                 <w:b/>
                 <w:sz w:val="18"/>
               </w:rPr>
-              <w:t>macOS</w:t>
+              <w:t>关键结果</w:t>
             </w:r>
           </w:p>
         </w:tc>
         <w:tc>
           <w:tcPr>
-            <w:tcW w:type="dxa" w:w="1836"/>
-            <w:shd w:fill="D9EAF7"/>
-          </w:tcPr>
-          <w:p>
-            <w:r>
-              <w:rPr>
-                <w:b/>
-                <w:sz w:val="18"/>
-              </w:rPr>
-            </w:r>
-            <w:r>
-              <w:rPr>
-                <w:rFonts w:ascii="Times New Roman" w:hAnsi="Times New Roman" w:eastAsia="宋体"/>
-                <w:b/>
-                <w:sz w:val="18"/>
-              </w:rPr>
-              <w:t>Linux（Ubuntu CI）</w:t>
-            </w:r>
-          </w:p>
-        </w:tc>
-        <w:tc>
-          <w:tcPr>
-            <w:tcW w:type="dxa" w:w="1836"/>
+            <w:tcW w:type="dxa" w:w="2295"/>
             <w:shd w:fill="D9EAF7"/>
           </w:tcPr>
           <w:p>
@@ -6630,7 +6496,7 @@
       <w:tr>
         <w:tc>
           <w:tcPr>
-            <w:tcW w:type="dxa" w:w="1836"/>
+            <w:tcW w:type="dxa" w:w="2295"/>
           </w:tcPr>
           <w:p>
             <w:r>
@@ -6643,13 +6509,13 @@
                 <w:rFonts w:ascii="Times New Roman" w:hAnsi="Times New Roman" w:eastAsia="宋体"/>
                 <w:sz w:val="18"/>
               </w:rPr>
-              <w:t>GriddingMachine / GriddingMachineDatasets自动回归</w:t>
+              <w:t>生产契约正确性</w:t>
             </w:r>
           </w:p>
         </w:tc>
         <w:tc>
           <w:tcPr>
-            <w:tcW w:type="dxa" w:w="1836"/>
+            <w:tcW w:type="dxa" w:w="2295"/>
           </w:tcPr>
           <w:p>
             <w:r>
@@ -6662,13 +6528,13 @@
                 <w:rFonts w:ascii="Times New Roman" w:hAnsi="Times New Roman" w:eastAsia="宋体"/>
                 <w:sz w:val="18"/>
               </w:rPr>
-              <w:t>63/63；73/73</w:t>
+              <w:t>二维/三维合成金标准矩阵；ELEV标准文件无损再处理</w:t>
             </w:r>
           </w:p>
         </w:tc>
         <w:tc>
           <w:tcPr>
-            <w:tcW w:type="dxa" w:w="1836"/>
+            <w:tcW w:type="dxa" w:w="2295"/>
           </w:tcPr>
           <w:p>
             <w:r>
@@ -6681,13 +6547,13 @@
                 <w:rFonts w:ascii="Times New Roman" w:hAnsi="Times New Roman" w:eastAsia="宋体"/>
                 <w:sz w:val="18"/>
               </w:rPr>
-              <w:t>63/63；73/73</w:t>
+              <w:t>Windows与macOS各3轮29/29；ELEV数组与坐标逐点一致</w:t>
             </w:r>
           </w:p>
         </w:tc>
         <w:tc>
           <w:tcPr>
-            <w:tcW w:type="dxa" w:w="1836"/>
+            <w:tcW w:type="dxa" w:w="2295"/>
           </w:tcPr>
           <w:p>
             <w:r>
@@ -6700,13 +6566,15 @@
                 <w:rFonts w:ascii="Times New Roman" w:hAnsi="Times New Roman" w:eastAsia="宋体"/>
                 <w:sz w:val="18"/>
               </w:rPr>
-              <w:t>63/63；73/73</w:t>
+              <w:t>尚无真实异构原始产品端到端核对</w:t>
             </w:r>
           </w:p>
         </w:tc>
+      </w:tr>
+      <w:tr>
         <w:tc>
           <w:tcPr>
-            <w:tcW w:type="dxa" w:w="1836"/>
+            <w:tcW w:type="dxa" w:w="2295"/>
           </w:tcPr>
           <w:p>
             <w:r>
@@ -6719,15 +6587,13 @@
                 <w:rFonts w:ascii="Times New Roman" w:hAnsi="Times New Roman" w:eastAsia="宋体"/>
                 <w:sz w:val="18"/>
               </w:rPr>
-              <w:t>包级功能与固定依赖</w:t>
+              <w:t>下载失败安全性</w:t>
             </w:r>
           </w:p>
         </w:tc>
-      </w:tr>
-      <w:tr>
         <w:tc>
           <w:tcPr>
-            <w:tcW w:type="dxa" w:w="1836"/>
+            <w:tcW w:type="dxa" w:w="2295"/>
           </w:tcPr>
           <w:p>
             <w:r>
@@ -6740,13 +6606,13 @@
                 <w:rFonts w:ascii="Times New Roman" w:hAnsi="Times New Roman" w:eastAsia="宋体"/>
                 <w:sz w:val="18"/>
               </w:rPr>
-              <w:t>生产矩阵中的29个非交互案例</w:t>
+              <w:t>M01～M13受控故障注入</w:t>
             </w:r>
           </w:p>
         </w:tc>
         <w:tc>
           <w:tcPr>
-            <w:tcW w:type="dxa" w:w="1836"/>
+            <w:tcW w:type="dxa" w:w="2295"/>
           </w:tcPr>
           <w:p>
             <w:r>
@@ -6759,13 +6625,27 @@
                 <w:rFonts w:ascii="Times New Roman" w:hAnsi="Times New Roman" w:eastAsia="宋体"/>
                 <w:sz w:val="18"/>
               </w:rPr>
-              <w:t>3轮×29/29</w:t>
+              <w:t>两平台共130次状态断言通过，</w:t>
+            </w:r>
+            <w:r>
+              <w:rPr>
+                <w:rFonts w:ascii="Consolas" w:hAnsi="Consolas" w:eastAsia="等线"/>
+                <w:sz w:val="18"/>
+              </w:rPr>
+              <w:t>.part</w:t>
+            </w:r>
+            <w:r>
+              <w:rPr>
+                <w:rFonts w:ascii="Times New Roman" w:hAnsi="Times New Roman" w:eastAsia="宋体"/>
+                <w:sz w:val="18"/>
+              </w:rPr>
+              <w:t>残留为0</w:t>
             </w:r>
           </w:p>
         </w:tc>
         <w:tc>
           <w:tcPr>
-            <w:tcW w:type="dxa" w:w="1836"/>
+            <w:tcW w:type="dxa" w:w="2295"/>
           </w:tcPr>
           <w:p>
             <w:r>
@@ -6778,13 +6658,15 @@
                 <w:rFonts w:ascii="Times New Roman" w:hAnsi="Times New Roman" w:eastAsia="宋体"/>
                 <w:sz w:val="18"/>
               </w:rPr>
-              <w:t>3轮×29/29</w:t>
+              <w:t>受控HTTP与注入排序分数</w:t>
             </w:r>
           </w:p>
         </w:tc>
+      </w:tr>
+      <w:tr>
         <w:tc>
           <w:tcPr>
-            <w:tcW w:type="dxa" w:w="1836"/>
+            <w:tcW w:type="dxa" w:w="2295"/>
           </w:tcPr>
           <w:p>
             <w:r>
@@ -6797,13 +6679,13 @@
                 <w:rFonts w:ascii="Times New Roman" w:hAnsi="Times New Roman" w:eastAsia="宋体"/>
                 <w:sz w:val="18"/>
               </w:rPr>
-              <w:t>1轮×29/29</w:t>
+              <w:t>真实镜像获取</w:t>
             </w:r>
           </w:p>
         </w:tc>
         <w:tc>
           <w:tcPr>
-            <w:tcW w:type="dxa" w:w="1836"/>
+            <w:tcW w:type="dxa" w:w="2295"/>
           </w:tcPr>
           <w:p>
             <w:r>
@@ -6816,15 +6698,13 @@
                 <w:rFonts w:ascii="Times New Roman" w:hAnsi="Times New Roman" w:eastAsia="宋体"/>
                 <w:sz w:val="18"/>
               </w:rPr>
-              <w:t>Ubuntu为CI兼容性运行</w:t>
+              <w:t>4个测试标签的FTP与Zenodo下载</w:t>
             </w:r>
           </w:p>
         </w:tc>
-      </w:tr>
-      <w:tr>
         <w:tc>
           <w:tcPr>
-            <w:tcW w:type="dxa" w:w="1836"/>
+            <w:tcW w:type="dxa" w:w="2295"/>
           </w:tcPr>
           <w:p>
             <w:r>
@@ -6837,13 +6717,13 @@
                 <w:rFonts w:ascii="Times New Roman" w:hAnsi="Times New Roman" w:eastAsia="宋体"/>
                 <w:sz w:val="18"/>
               </w:rPr>
-              <w:t>直接NetCDF分发测量</w:t>
+              <w:t>校园网24/24次通过大小和SHA-256核验</w:t>
             </w:r>
           </w:p>
         </w:tc>
         <w:tc>
           <w:tcPr>
-            <w:tcW w:type="dxa" w:w="1836"/>
+            <w:tcW w:type="dxa" w:w="2295"/>
           </w:tcPr>
           <w:p>
             <w:r>
@@ -6856,13 +6736,15 @@
                 <w:rFonts w:ascii="Times New Roman" w:hAnsi="Times New Roman" w:eastAsia="宋体"/>
                 <w:sz w:val="18"/>
               </w:rPr>
-              <w:t>2个真实样本×2种形式×10次</w:t>
+              <w:t>单台Windows电脑、单个时段，不代表长期吞吐率</w:t>
             </w:r>
           </w:p>
         </w:tc>
+      </w:tr>
+      <w:tr>
         <w:tc>
           <w:tcPr>
-            <w:tcW w:type="dxa" w:w="1836"/>
+            <w:tcW w:type="dxa" w:w="2295"/>
           </w:tcPr>
           <w:p>
             <w:r>
@@ -6875,13 +6757,13 @@
                 <w:rFonts w:ascii="Times New Roman" w:hAnsi="Times New Roman" w:eastAsia="宋体"/>
                 <w:sz w:val="18"/>
               </w:rPr>
-              <w:t>2个真实样本×2种形式×10次</w:t>
+              <w:t>模型就绪接口</w:t>
             </w:r>
           </w:p>
         </w:tc>
         <w:tc>
           <w:tcPr>
-            <w:tcW w:type="dxa" w:w="1836"/>
+            <w:tcW w:type="dxa" w:w="2295"/>
           </w:tcPr>
           <w:p>
             <w:r>
@@ -6894,338 +6776,7 @@
                 <w:rFonts w:ascii="Times New Roman" w:hAnsi="Times New Roman" w:eastAsia="宋体"/>
                 <w:sz w:val="18"/>
               </w:rPr>
-              <w:t>2个小型确定性夹具×2种形式×10次</w:t>
-            </w:r>
-          </w:p>
-        </w:tc>
-        <w:tc>
-          <w:tcPr>
-            <w:tcW w:type="dxa" w:w="1836"/>
-          </w:tcPr>
-          <w:p>
-            <w:r>
-              <w:rPr>
-                <w:sz w:val="18"/>
-              </w:rPr>
-            </w:r>
-            <w:r>
-              <w:rPr>
-                <w:rFonts w:ascii="Times New Roman" w:hAnsi="Times New Roman" w:eastAsia="宋体"/>
-                <w:sz w:val="18"/>
-              </w:rPr>
-              <w:t>Linux数值不与真实样本性能合并</w:t>
-            </w:r>
-          </w:p>
-        </w:tc>
-      </w:tr>
-      <w:tr>
-        <w:tc>
-          <w:tcPr>
-            <w:tcW w:type="dxa" w:w="1836"/>
-          </w:tcPr>
-          <w:p>
-            <w:r>
-              <w:rPr>
-                <w:sz w:val="18"/>
-              </w:rPr>
-            </w:r>
-            <w:r>
-              <w:rPr>
-                <w:rFonts w:ascii="Times New Roman" w:hAnsi="Times New Roman" w:eastAsia="宋体"/>
-                <w:sz w:val="18"/>
-              </w:rPr>
-              <w:t>M01～M13故障状态断言</w:t>
-            </w:r>
-          </w:p>
-        </w:tc>
-        <w:tc>
-          <w:tcPr>
-            <w:tcW w:type="dxa" w:w="1836"/>
-          </w:tcPr>
-          <w:p>
-            <w:r>
-              <w:rPr>
-                <w:sz w:val="18"/>
-              </w:rPr>
-            </w:r>
-            <w:r>
-              <w:rPr>
-                <w:rFonts w:ascii="Times New Roman" w:hAnsi="Times New Roman" w:eastAsia="宋体"/>
-                <w:sz w:val="18"/>
-              </w:rPr>
-              <w:t>65/65</w:t>
-            </w:r>
-          </w:p>
-        </w:tc>
-        <w:tc>
-          <w:tcPr>
-            <w:tcW w:type="dxa" w:w="1836"/>
-          </w:tcPr>
-          <w:p>
-            <w:r>
-              <w:rPr>
-                <w:sz w:val="18"/>
-              </w:rPr>
-            </w:r>
-            <w:r>
-              <w:rPr>
-                <w:rFonts w:ascii="Times New Roman" w:hAnsi="Times New Roman" w:eastAsia="宋体"/>
-                <w:sz w:val="18"/>
-              </w:rPr>
-              <w:t>65/65</w:t>
-            </w:r>
-          </w:p>
-        </w:tc>
-        <w:tc>
-          <w:tcPr>
-            <w:tcW w:type="dxa" w:w="1836"/>
-          </w:tcPr>
-          <w:p>
-            <w:r>
-              <w:rPr>
-                <w:sz w:val="18"/>
-              </w:rPr>
-            </w:r>
-            <w:r>
-              <w:rPr>
-                <w:rFonts w:ascii="Times New Roman" w:hAnsi="Times New Roman" w:eastAsia="宋体"/>
-                <w:sz w:val="18"/>
-              </w:rPr>
-              <w:t>65/65</w:t>
-            </w:r>
-          </w:p>
-        </w:tc>
-        <w:tc>
-          <w:tcPr>
-            <w:tcW w:type="dxa" w:w="1836"/>
-          </w:tcPr>
-          <w:p>
-            <w:r>
-              <w:rPr>
-                <w:sz w:val="18"/>
-              </w:rPr>
-            </w:r>
-            <w:r>
-              <w:rPr>
-                <w:rFonts w:ascii="Times New Roman" w:hAnsi="Times New Roman" w:eastAsia="宋体"/>
-                <w:sz w:val="18"/>
-              </w:rPr>
-              <w:t>注入ping分数与受控HTTP端点</w:t>
-            </w:r>
-          </w:p>
-        </w:tc>
-      </w:tr>
-      <w:tr>
-        <w:tc>
-          <w:tcPr>
-            <w:tcW w:type="dxa" w:w="1836"/>
-          </w:tcPr>
-          <w:p>
-            <w:r>
-              <w:rPr>
-                <w:sz w:val="18"/>
-              </w:rPr>
-            </w:r>
-            <w:r>
-              <w:rPr>
-                <w:rFonts w:ascii="Times New Roman" w:hAnsi="Times New Roman" w:eastAsia="宋体"/>
-                <w:sz w:val="18"/>
-              </w:rPr>
-              <w:t>Emerald最小烟雾</w:t>
-            </w:r>
-          </w:p>
-        </w:tc>
-        <w:tc>
-          <w:tcPr>
-            <w:tcW w:type="dxa" w:w="1836"/>
-          </w:tcPr>
-          <w:p>
-            <w:r>
-              <w:rPr>
-                <w:sz w:val="18"/>
-              </w:rPr>
-            </w:r>
-            <w:r>
-              <w:rPr>
-                <w:rFonts w:ascii="Times New Roman" w:hAnsi="Times New Roman" w:eastAsia="宋体"/>
-                <w:sz w:val="18"/>
-              </w:rPr>
-              <w:t>5/5</w:t>
-            </w:r>
-          </w:p>
-        </w:tc>
-        <w:tc>
-          <w:tcPr>
-            <w:tcW w:type="dxa" w:w="1836"/>
-          </w:tcPr>
-          <w:p>
-            <w:r>
-              <w:rPr>
-                <w:sz w:val="18"/>
-              </w:rPr>
-            </w:r>
-            <w:r>
-              <w:rPr>
-                <w:rFonts w:ascii="Times New Roman" w:hAnsi="Times New Roman" w:eastAsia="宋体"/>
-                <w:sz w:val="18"/>
-              </w:rPr>
-              <w:t>5/5</w:t>
-            </w:r>
-          </w:p>
-        </w:tc>
-        <w:tc>
-          <w:tcPr>
-            <w:tcW w:type="dxa" w:w="1836"/>
-          </w:tcPr>
-          <w:p>
-            <w:r>
-              <w:rPr>
-                <w:sz w:val="18"/>
-              </w:rPr>
-            </w:r>
-            <w:r>
-              <w:rPr>
-                <w:rFonts w:ascii="Times New Roman" w:hAnsi="Times New Roman" w:eastAsia="宋体"/>
-                <w:sz w:val="18"/>
-              </w:rPr>
-              <w:t>5/5</w:t>
-            </w:r>
-          </w:p>
-        </w:tc>
-        <w:tc>
-          <w:tcPr>
-            <w:tcW w:type="dxa" w:w="1836"/>
-          </w:tcPr>
-          <w:p>
-            <w:r>
-              <w:rPr>
-                <w:sz w:val="18"/>
-              </w:rPr>
-            </w:r>
-            <w:r>
-              <w:rPr>
-                <w:rFonts w:ascii="Times New Roman" w:hAnsi="Times New Roman" w:eastAsia="宋体"/>
-                <w:sz w:val="18"/>
-              </w:rPr>
-              <w:t>公开统一候选三平台CI；仅限合成输入接口断言</w:t>
-            </w:r>
-          </w:p>
-        </w:tc>
-      </w:tr>
-      <w:tr>
-        <w:tc>
-          <w:tcPr>
-            <w:tcW w:type="dxa" w:w="1836"/>
-          </w:tcPr>
-          <w:p>
-            <w:r>
-              <w:rPr>
-                <w:sz w:val="18"/>
-              </w:rPr>
-            </w:r>
-            <w:r>
-              <w:rPr>
-                <w:rFonts w:ascii="Times New Roman" w:hAnsi="Times New Roman" w:eastAsia="宋体"/>
-                <w:sz w:val="18"/>
-              </w:rPr>
-              <w:t>校外FTP—Zenodo真实访问</w:t>
-            </w:r>
-          </w:p>
-        </w:tc>
-        <w:tc>
-          <w:tcPr>
-            <w:tcW w:type="dxa" w:w="1836"/>
-          </w:tcPr>
-          <w:p>
-            <w:r>
-              <w:rPr>
-                <w:sz w:val="18"/>
-              </w:rPr>
-            </w:r>
-            <w:r>
-              <w:rPr>
-                <w:rFonts w:ascii="Times New Roman" w:hAnsi="Times New Roman" w:eastAsia="宋体"/>
-                <w:sz w:val="18"/>
-              </w:rPr>
-              <w:t>Zenodo 12/12；FTP 0/12</w:t>
-            </w:r>
-          </w:p>
-        </w:tc>
-        <w:tc>
-          <w:tcPr>
-            <w:tcW w:type="dxa" w:w="1836"/>
-          </w:tcPr>
-          <w:p>
-            <w:r>
-              <w:rPr>
-                <w:sz w:val="18"/>
-              </w:rPr>
-            </w:r>
-            <w:r>
-              <w:rPr>
-                <w:rFonts w:ascii="Times New Roman" w:hAnsi="Times New Roman" w:eastAsia="宋体"/>
-                <w:sz w:val="18"/>
-              </w:rPr>
-              <w:t>Zenodo 12/12；FTP 0/12</w:t>
-            </w:r>
-          </w:p>
-        </w:tc>
-        <w:tc>
-          <w:tcPr>
-            <w:tcW w:type="dxa" w:w="1836"/>
-          </w:tcPr>
-          <w:p>
-            <w:r>
-              <w:rPr>
-                <w:sz w:val="18"/>
-              </w:rPr>
-            </w:r>
-            <w:r>
-              <w:rPr>
-                <w:rFonts w:ascii="Times New Roman" w:hAnsi="Times New Roman" w:eastAsia="宋体"/>
-                <w:sz w:val="18"/>
-              </w:rPr>
-              <w:t>未运行</w:t>
-            </w:r>
-          </w:p>
-        </w:tc>
-        <w:tc>
-          <w:tcPr>
-            <w:tcW w:type="dxa" w:w="1836"/>
-          </w:tcPr>
-          <w:p>
-            <w:r>
-              <w:rPr>
-                <w:sz w:val="18"/>
-              </w:rPr>
-            </w:r>
-            <w:r>
-              <w:rPr>
-                <w:rFonts w:ascii="Times New Roman" w:hAnsi="Times New Roman" w:eastAsia="宋体"/>
-                <w:sz w:val="18"/>
-              </w:rPr>
-              <w:t>仅表示对应校外网络；校园网待测</w:t>
-            </w:r>
-          </w:p>
-        </w:tc>
-      </w:tr>
-      <w:tr>
-        <w:tc>
-          <w:tcPr>
-            <w:tcW w:type="dxa" w:w="1836"/>
-          </w:tcPr>
-          <w:p>
-            <w:r>
-              <w:rPr>
-                <w:sz w:val="18"/>
-              </w:rPr>
-            </w:r>
-            <w:r>
-              <w:rPr>
-                <w:rFonts w:ascii="Times New Roman" w:hAnsi="Times New Roman" w:eastAsia="宋体"/>
-                <w:sz w:val="18"/>
-              </w:rPr>
-              <w:t>真实</w:t>
+              <w:t>14个</w:t>
             </w:r>
             <w:r>
               <w:rPr>
@@ -7239,13 +6790,13 @@
                 <w:rFonts w:ascii="Times New Roman" w:hAnsi="Times New Roman" w:eastAsia="宋体"/>
                 <w:sz w:val="18"/>
               </w:rPr>
-              <w:t>陆面案例</w:t>
+              <w:t>文件、US-NR1与非植被格点</w:t>
             </w:r>
           </w:p>
         </w:tc>
         <w:tc>
           <w:tcPr>
-            <w:tcW w:type="dxa" w:w="1836"/>
+            <w:tcW w:type="dxa" w:w="2295"/>
           </w:tcPr>
           <w:p>
             <w:r>
@@ -7258,13 +6809,13 @@
                 <w:rFonts w:ascii="Times New Roman" w:hAnsi="Times New Roman" w:eastAsia="宋体"/>
                 <w:sz w:val="18"/>
               </w:rPr>
-              <w:t>14个文件完整性通过；US-NR1成功、非植被格点按预期拒绝</w:t>
+              <w:t>参数字典生成成功，非植被格点按预期拒绝</w:t>
             </w:r>
           </w:p>
         </w:tc>
         <w:tc>
           <w:tcPr>
-            <w:tcW w:type="dxa" w:w="1836"/>
+            <w:tcW w:type="dxa" w:w="2295"/>
           </w:tcPr>
           <w:p>
             <w:r>
@@ -7277,13 +6828,15 @@
                 <w:rFonts w:ascii="Times New Roman" w:hAnsi="Times New Roman" w:eastAsia="宋体"/>
                 <w:sz w:val="18"/>
               </w:rPr>
-              <w:t>未独立重复</w:t>
+              <w:t>未作逐字段科学金标准、真实气象或长期模拟</w:t>
             </w:r>
           </w:p>
         </w:tc>
+      </w:tr>
+      <w:tr>
         <w:tc>
           <w:tcPr>
-            <w:tcW w:type="dxa" w:w="1836"/>
+            <w:tcW w:type="dxa" w:w="2295"/>
           </w:tcPr>
           <w:p>
             <w:r>
@@ -7296,13 +6849,13 @@
                 <w:rFonts w:ascii="Times New Roman" w:hAnsi="Times New Roman" w:eastAsia="宋体"/>
                 <w:sz w:val="18"/>
               </w:rPr>
-              <w:t>未运行</w:t>
+              <w:t>跨平台可执行性</w:t>
             </w:r>
           </w:p>
         </w:tc>
         <w:tc>
           <w:tcPr>
-            <w:tcW w:type="dxa" w:w="1836"/>
+            <w:tcW w:type="dxa" w:w="2295"/>
           </w:tcPr>
           <w:p>
             <w:r>
@@ -7315,7 +6868,45 @@
                 <w:rFonts w:ascii="Times New Roman" w:hAnsi="Times New Roman" w:eastAsia="宋体"/>
                 <w:sz w:val="18"/>
               </w:rPr>
-              <w:t>不构成逐字段科学金标准</w:t>
+              <w:t>Windows、macOS完整受控实验；Ubuntu CI核心路径与Emerald烟雾</w:t>
+            </w:r>
+          </w:p>
+        </w:tc>
+        <w:tc>
+          <w:tcPr>
+            <w:tcW w:type="dxa" w:w="2295"/>
+          </w:tcPr>
+          <w:p>
+            <w:r>
+              <w:rPr>
+                <w:sz w:val="18"/>
+              </w:rPr>
+            </w:r>
+            <w:r>
+              <w:rPr>
+                <w:rFonts w:ascii="Times New Roman" w:hAnsi="Times New Roman" w:eastAsia="宋体"/>
+                <w:sz w:val="18"/>
+              </w:rPr>
+              <w:t>所列固定依赖、核心路径和受控模型接口均可执行</w:t>
+            </w:r>
+          </w:p>
+        </w:tc>
+        <w:tc>
+          <w:tcPr>
+            <w:tcW w:type="dxa" w:w="2295"/>
+          </w:tcPr>
+          <w:p>
+            <w:r>
+              <w:rPr>
+                <w:sz w:val="18"/>
+              </w:rPr>
+            </w:r>
+            <w:r>
+              <w:rPr>
+                <w:rFonts w:ascii="Times New Roman" w:hAnsi="Times New Roman" w:eastAsia="宋体"/>
+                <w:sz w:val="18"/>
+              </w:rPr>
+              <w:t>Linux不覆盖真实网络与真实陆面；非Julia接口未验证</w:t>
             </w:r>
           </w:p>
         </w:tc>
@@ -7330,13 +6921,13 @@
           <w:rFonts w:ascii="Times New Roman" w:hAnsi="Times New Roman" w:eastAsia="宋体"/>
           <w:b/>
         </w:rPr>
-        <w:t>Table 4 Core validation results and platform coverage.</w:t>
-      </w:r>
-      <w:r>
-        <w:rPr>
-          <w:rFonts w:ascii="Times New Roman" w:hAnsi="Times New Roman" w:eastAsia="宋体"/>
-        </w:rPr>
-        <w:t xml:space="preserve"> Windows and macOS provide the complete controlled-experiment evidence. Ubuntu CI verifies the listed core paths and the five-assertion Emerald interface smoke test using fixed dependencies and deterministic fixtures; it does not cover real-network access, real land files, long-term simulations, or scientific validity.</w:t>
+        <w:t>Table 4 Core validation evidence organized by research question.</w:t>
+      </w:r>
+      <w:r>
+        <w:rPr>
+          <w:rFonts w:ascii="Times New Roman" w:hAnsi="Times New Roman" w:eastAsia="宋体"/>
+        </w:rPr>
+        <w:t xml:space="preserve"> Platform repetitions assess executability rather than provide independent scientific samples. The table separates production correctness, failure safety, real-network observations, downstream evidence, and cross-platform executability.</w:t>
       </w:r>
     </w:p>
     <w:p>
@@ -7620,182 +7211,19 @@
         <w:rPr>
           <w:rFonts w:ascii="Times New Roman" w:hAnsi="Times New Roman" w:eastAsia="宋体"/>
         </w:rPr>
-        <w:t>Windows轮：ELEV直接</w:t>
+        <w:t>直接NetCDF相对外层</w:t>
       </w:r>
       <w:r>
         <w:rPr>
           <w:rFonts w:ascii="Consolas" w:hAnsi="Consolas" w:eastAsia="等线"/>
         </w:rPr>
-        <w:t>.nc</w:t>
-      </w:r>
-      <w:r>
-        <w:rPr>
-          <w:rFonts w:ascii="Times New Roman" w:hAnsi="Times New Roman" w:eastAsia="宋体"/>
-        </w:rPr>
-        <w:t>与</w:t>
-      </w:r>
-      <w:r>
-        <w:rPr>
-          <w:rFonts w:ascii="Consolas" w:hAnsi="Consolas" w:eastAsia="等线"/>
-        </w:rPr>
-        <w:t>.tar.gz</w:t>
-      </w:r>
-      <w:r>
-        <w:rPr>
-          <w:rFonts w:ascii="Times New Roman" w:hAnsi="Times New Roman" w:eastAsia="宋体"/>
-        </w:rPr>
-        <w:t>的端到端中位时间分别为20.929 ms（四分位距19.092～24.413 ms，95% bootstrap CI 18.922～29.655 ms）和40.503 ms（37.625～43.447 ms，37.491～47.588 ms）；LAI分别为38.100 ms（37.215～40.300 ms，36.902～41.562 ms）和222.297 ms（221.323～229.216 ms，221.253～230.993 ms）。直接分发的中位时间相对降低48.3%和82.9%。按下载文件及解包文件同时存在的生命周期计算，逻辑临时占用分别由1568497 B降至810299 B、由27571185 B降至13936426 B；相应代价是传输字节增加6.43%和2.16%。外层归档打包本身另需28.853 ms和453.015 ms。</w:t>
-      </w:r>
-    </w:p>
-    <w:p>
-      <w:r>
-        <w:rPr>
-          <w:rFonts w:ascii="Times New Roman" w:hAnsi="Times New Roman" w:eastAsia="宋体"/>
-        </w:rPr>
-        <w:t>macOS轮使用与Windows轮SHA-256完全相同的两个输入文件：ELEV直接</w:t>
-      </w:r>
-      <w:r>
-        <w:rPr>
-          <w:rFonts w:ascii="Consolas" w:hAnsi="Consolas" w:eastAsia="等线"/>
-        </w:rPr>
-        <w:t>.nc</w:t>
-      </w:r>
-      <w:r>
-        <w:rPr>
-          <w:rFonts w:ascii="Times New Roman" w:hAnsi="Times New Roman" w:eastAsia="宋体"/>
-        </w:rPr>
-        <w:t>与</w:t>
-      </w:r>
-      <w:r>
-        <w:rPr>
-          <w:rFonts w:ascii="Consolas" w:hAnsi="Consolas" w:eastAsia="等线"/>
-        </w:rPr>
-        <w:t>.tar.gz</w:t>
-      </w:r>
-      <w:r>
-        <w:rPr>
-          <w:rFonts w:ascii="Times New Roman" w:hAnsi="Times New Roman" w:eastAsia="宋体"/>
-        </w:rPr>
-        <w:t>的端到端中位时间分别为3.8 ms（95% bootstrap CI 3.1～4.3 ms）和8.2 ms（7.0～8.4 ms）；LAI分别为26.6 ms（17.6～28.1 ms）和86.4 ms（80.7～91.8 ms），相对降低53.6%和69.2%。逻辑临时占用分别由1568512 B降至810299 B、由27571221 B降至13936426 B。两轮绝对耗时不可直接比较，但直接分发的相对优势方向一致、量级相当，且</w:t>
-      </w:r>
-      <w:r>
-        <w:rPr>
-          <w:rFonts w:ascii="Consolas" w:hAnsi="Consolas" w:eastAsia="等线"/>
-        </w:rPr>
-        <w:t>.tar.gz</w:t>
-      </w:r>
-      <w:r>
-        <w:rPr>
-          <w:rFonts w:ascii="Times New Roman" w:hAnsi="Times New Roman" w:eastAsia="宋体"/>
-        </w:rPr>
-        <w:t>形式在两个平台上均稳定引入额外解包时间与临时文件共存成本。</w:t>
-      </w:r>
-    </w:p>
-    <w:p>
-      <w:r>
-        <w:rPr>
-          <w:rFonts w:ascii="Times New Roman" w:hAnsi="Times New Roman" w:eastAsia="宋体"/>
-        </w:rPr>
-        <w:t>这些结果说明，对已经内部压缩的两个样本，外层gzip只带来少量传输节省，同时增加解包时间和临时文件共存成本。但两轮首次读取均由netCDF4-python完成，操作系统缓存未以特权方式清理，临时占用也来自文件生命周期计算而非系统级峰值采样。因此本节只报告“两个暖缓存样本在Windows与macOS上均支持取消额外打包”，不外推到所有数据规模或冷缓存；ERA5大文件并非支撑该软件设计结论的必要样本。</w:t>
-      </w:r>
-    </w:p>
-    <w:p>
-      <w:pPr>
-        <w:jc w:val="center"/>
-      </w:pPr>
-      <w:r>
-        <w:drawing>
-          <wp:inline xmlns:a="http://schemas.openxmlformats.org/drawingml/2006/main" xmlns:pic="http://schemas.openxmlformats.org/drawingml/2006/picture">
-            <wp:extent cx="5400000" cy="2756609"/>
-            <wp:docPr id="2" name="Picture 2"/>
-            <wp:cNvGraphicFramePr>
-              <a:graphicFrameLocks noChangeAspect="1"/>
-            </wp:cNvGraphicFramePr>
-            <a:graphic>
-              <a:graphicData uri="http://schemas.openxmlformats.org/drawingml/2006/picture">
-                <pic:pic>
-                  <pic:nvPicPr>
-                    <pic:cNvPr id="0" name="图2_直接NetCDF分发效率.png"/>
-                    <pic:cNvPicPr/>
-                  </pic:nvPicPr>
-                  <pic:blipFill>
-                    <a:blip r:embed="rId10"/>
-                    <a:stretch>
-                      <a:fillRect/>
-                    </a:stretch>
-                  </pic:blipFill>
-                  <pic:spPr>
-                    <a:xfrm>
-                      <a:off x="0" y="0"/>
-                      <a:ext cx="5400000" cy="2756609"/>
-                    </a:xfrm>
-                    <a:prstGeom prst="rect"/>
-                  </pic:spPr>
-                </pic:pic>
-              </a:graphicData>
-            </a:graphic>
-          </wp:inline>
-        </w:drawing>
-      </w:r>
-    </w:p>
-    <w:p>
-      <w:pPr>
-        <w:ind w:firstLine="0"/>
-      </w:pPr>
-      <w:r>
-        <w:rPr>
-          <w:rFonts w:ascii="Times New Roman" w:hAnsi="Times New Roman" w:eastAsia="宋体"/>
-          <w:b/>
-        </w:rPr>
-        <w:t>图2 直接NetCDF与外层`tar.gz`的暖缓存端到端时间比较</w:t>
-      </w:r>
-      <w:r>
-        <w:rPr>
-          <w:rFonts w:ascii="Times New Roman" w:hAnsi="Times New Roman" w:eastAsia="宋体"/>
-        </w:rPr>
-        <w:t xml:space="preserve"> （a）二维ELEV样本；（b）三维LAI样本。柱高为10次重复的中位数，误差线为95% bootstrap置信区间，标注值为直接NetCDF相对</w:t>
-      </w:r>
-      <w:r>
-        <w:rPr>
-          <w:rFonts w:ascii="Consolas" w:hAnsi="Consolas" w:eastAsia="等线"/>
-        </w:rPr>
         <w:t>tar.gz</w:t>
       </w:r>
       <w:r>
         <w:rPr>
           <w:rFonts w:ascii="Times New Roman" w:hAnsi="Times New Roman" w:eastAsia="宋体"/>
         </w:rPr>
-        <w:t>的中位时间降幅。Windows与macOS使用SHA-256相同的输入文件，但绝对耗时不跨平台合并。</w:t>
-      </w:r>
-    </w:p>
-    <w:p>
-      <w:pPr>
-        <w:ind w:firstLine="0"/>
-      </w:pPr>
-      <w:r>
-        <w:rPr>
-          <w:rFonts w:ascii="Times New Roman" w:hAnsi="Times New Roman" w:eastAsia="宋体"/>
-          <w:b/>
-        </w:rPr>
-        <w:t>Fig. 2 Warm-cache end-to-end time for direct NetCDF and outer `tar.gz` distribution.</w:t>
-      </w:r>
-      <w:r>
-        <w:rPr>
-          <w:rFonts w:ascii="Times New Roman" w:hAnsi="Times New Roman" w:eastAsia="宋体"/>
-        </w:rPr>
-        <w:t xml:space="preserve"> (a) The two-dimensional ELEV sample; (b) the three-dimensional LAI sample. Bars show medians from 10 repetitions, error bars show 95% bootstrap confidence intervals, and annotations give the median-time reduction for direct NetCDF relative to </w:t>
-      </w:r>
-      <w:r>
-        <w:rPr>
-          <w:rFonts w:ascii="Consolas" w:hAnsi="Consolas" w:eastAsia="等线"/>
-        </w:rPr>
-        <w:t>tar.gz</w:t>
-      </w:r>
-      <w:r>
-        <w:rPr>
-          <w:rFonts w:ascii="Times New Roman" w:hAnsi="Times New Roman" w:eastAsia="宋体"/>
-        </w:rPr>
-        <w:t>. Windows and macOS used input files with identical SHA-256 hashes; absolute timings are not pooled across platforms.</w:t>
+        <w:t>的暖缓存端到端中位时间在Windows上降低48.3%（ELEV）和82.9%（LAI），在macOS上降低53.6%和69.2%；取消外层归档的代价是两样本传输字节分别增加6.43%和2.16%。两个平台共80次解包后摘要核验均通过。由于操作系统缓存未被特权清理，逻辑临时占用也不是系统级峰值采样，本结果只支持对这两个已内部压缩样本取消二次打包，不构成普遍性能结论。置信区间、绝对时间和原图移至实验材料，不作为正文核心图。</w:t>
       </w:r>
     </w:p>
     <w:p>
@@ -7972,6 +7400,50 @@
         <w:rPr>
           <w:rFonts w:ascii="Times New Roman" w:hAnsi="Times New Roman" w:eastAsia="宋体"/>
         </w:rPr>
+        <w:t>校园网Windows实验电脑于2026年8月15日使用Julia 1.12.6和</w:t>
+      </w:r>
+      <w:r>
+        <w:rPr>
+          <w:rFonts w:ascii="Consolas" w:hAnsi="Consolas" w:eastAsia="等线"/>
+        </w:rPr>
+        <w:t>GriddingMachine@11631d6</w:t>
+      </w:r>
+      <w:r>
+        <w:rPr>
+          <w:rFonts w:ascii="Times New Roman" w:hAnsi="Times New Roman" w:eastAsia="宋体"/>
+        </w:rPr>
+        <w:t xml:space="preserve">执行同一协议。FTP与Zenodo各12次下载全部达到登记字节数并通过SHA-256；4个文件的FTP中位下载时间依次为0.076、0.356、0.071和0.244 s，Zenodo依次为1.091、2.720、3.386和14.092 s。12次排序记录中FTP </w:t>
+      </w:r>
+      <w:r>
+        <w:rPr>
+          <w:rFonts w:ascii="Consolas" w:hAnsi="Consolas" w:eastAsia="等线"/>
+        </w:rPr>
+        <w:t>ping</w:t>
+      </w:r>
+      <w:r>
+        <w:rPr>
+          <w:rFonts w:ascii="Times New Roman" w:hAnsi="Times New Roman" w:eastAsia="宋体"/>
+        </w:rPr>
+        <w:t>为1.0～13.5 ms，Zenodo均为</w:t>
+      </w:r>
+      <w:r>
+        <w:rPr>
+          <w:rFonts w:ascii="Consolas" w:hAnsi="Consolas" w:eastAsia="等线"/>
+        </w:rPr>
+        <w:t>Inf</w:t>
+      </w:r>
+      <w:r>
+        <w:rPr>
+          <w:rFonts w:ascii="Times New Roman" w:hAnsi="Times New Roman" w:eastAsia="宋体"/>
+        </w:rPr>
+        <w:t>，当前实现每次均把FTP排在首位；在本次校园网、4个文件和执行时段内，该顺序与实际下载表现一致。完整依赖Manifest及其SHA-256已随原始CSV/TOML保存。</w:t>
+      </w:r>
+    </w:p>
+    <w:p>
+      <w:r>
+        <w:rPr>
+          <w:rFonts w:ascii="Times New Roman" w:hAnsi="Times New Roman" w:eastAsia="宋体"/>
+        </w:rPr>
         <w:t>受控故障注入与真实镜像访问回答不同问题：前者验证失败时的文件状态，后者验证特定网络内FTP与Zenodo的真实可达性、ping顺序和下载表现。两轮校外结果证明ICMP无响应不等于HTTPS不可下载、域名解析故障不等于镜像故障，也支持保留</w:t>
       </w:r>
       <w:r>
@@ -7984,7 +7456,7 @@
         <w:rPr>
           <w:rFonts w:ascii="Times New Roman" w:hAnsi="Times New Roman" w:eastAsia="宋体"/>
         </w:rPr>
-        <w:t>地址并实施失败回退；但FTP不可达主要由当前网络边界造成。校园网实验完成前，本文不报告校内最终镜像表现，也不声称ping选择吞吐率最优。</w:t>
+        <w:t>地址并实施失败回退；校园网结果则表明校外FTP超时主要是对应网络边界现象，而不是文件缺失或完整性校验失败。单次校园网结果不能证明FTP长期更快，也不能把ping候选顺序等同于一般意义上的吞吐率最优。</w:t>
       </w:r>
     </w:p>
     <w:p>
@@ -8306,7 +7778,7 @@
         <w:rPr>
           <w:rFonts w:ascii="Times New Roman" w:hAnsi="Times New Roman" w:eastAsia="宋体"/>
         </w:rPr>
-        <w:t>真实网络观察在两个平台的校外环境各完成一轮（4.3节）：Zenodo在可达条件下均能完成下载并通过完整性核验，机构FTP在校外均不可达；macOS轮额外记录到DNS异常解析，以及正式记录前的一次大文件传输截断。校园网内的FTP—Zenodo正式比较仍待执行，校外观察不替代该实验。</w:t>
+        <w:t>真实网络观察在两个平台的校外环境各完成一轮（4.3节）：Zenodo在可达条件下均能完成下载并通过完整性核验，机构FTP在校外均不可达；macOS轮额外记录到DNS异常解析，以及正式记录前的一次大文件传输截断。校园网Windows轮的FTP与Zenodo共24次下载全部通过完整性核验，补齐了机构镜像在校内网络的正式观察；该网络特定结果不作为macOS或Linux真实网络证据。</w:t>
       </w:r>
     </w:p>
     <w:p>
@@ -8424,7 +7896,7 @@
         <w:rPr>
           <w:rFonts w:ascii="Times New Roman" w:hAnsi="Times New Roman" w:eastAsia="宋体"/>
         </w:rPr>
-        <w:t>2022版GriddingMachine的主要贡献是建立统一的网格和变量约定，并通过标签及Julia artifact降低多源全球数据的发现和调用成本[4]。当前更新进一步连接新数据贡献、目录与镜像维护、统一读取和模型初始化数据组织。其关键变化不是TOML换成YAML，也不是单纯增加数据数量，而是共享配置契约、独立可验证目录、失败不污染正式文件的下载状态机，以及可回归测试的模型输入接口。当前论文分支已补齐schema、显式维度重排、目录事务替换、</w:t>
+        <w:t>2022版GriddingMachine的主要贡献是建立统一的网格和变量约定，并通过标签、哈希、多个下载URL及跨语言接口降低多源全球数据的发现和调用成本[4]。当前更新的增量不是TOML换成YAML、首次使用哈希或首次允许多个URL，而是共享配置契约、显式源维度映射、与软件版本解耦的目录、失败不污染正式文件的下载状态机，以及可回归测试的模型就绪接口。Windows与macOS受控实验支持这些机制，14个真实陆面文件和校园网FTP—Zenodo访问提供了外部案例；Ubuntu CI进一步验证核心路径的Linux兼容性。服务器文件复制、镜像URL补充以及由权威文件批量生成</w:t>
       </w:r>
       <w:r>
         <w:rPr>
@@ -8436,19 +7908,7 @@
         <w:rPr>
           <w:rFonts w:ascii="Times New Roman" w:hAnsi="Times New Roman" w:eastAsia="宋体"/>
         </w:rPr>
-        <w:t>校验和主要函数回归，在Windows与macOS完成完整受控实验，完成一名操作者的方向审核和一名未参与开发者的受控贡献流程，并以14个真实陆面文件完成</w:t>
-      </w:r>
-      <w:r>
-        <w:rPr>
-          <w:rFonts w:ascii="Consolas" w:hAnsi="Consolas" w:eastAsia="等线"/>
-        </w:rPr>
-        <w:t>gm2</w:t>
-      </w:r>
-      <w:r>
-        <w:rPr>
-          <w:rFonts w:ascii="Times New Roman" w:hAnsi="Times New Roman" w:eastAsia="宋体"/>
-        </w:rPr>
-        <w:t>链路预实验；Ubuntu CI进一步验证了核心包、生产、故障、小型分发路径和Emerald合成输入接口烟雾。尚未完成的是校园网真实FTP—Zenodo实验；历史目录迁移、真实气象链路及Linux上的真实数据和长期模型实验属于后续扩展。</w:t>
+        <w:t>属于正式发布准备，不构成本文的方法创新或科学验证指标。</w:t>
       </w:r>
     </w:p>
     <w:p>
@@ -8456,7 +7916,7 @@
         <w:rPr>
           <w:rFonts w:ascii="Times New Roman" w:hAnsi="Times New Roman" w:eastAsia="宋体"/>
         </w:rPr>
-        <w:t>现有结果已经从四个层次支撑软件更新：生产端有逐点金标准矩阵、单人方向审核、单案例贡献流程和ELEV标准文件无损核对；分发端有两个直接NetCDF支持样本和两个平台各65次受控故障；读取端有公共接口回归；模型端有合成输入最小步进及真实</w:t>
+        <w:t>现有结果从三个层次支撑更新：生产端有合成数据逐点金标准矩阵、人工方向走查和ELEV标准文件无损核对；分发端有事务状态故障注入和特定网络中的真实双镜像下载；下游端有统一读取回归、合成输入最小步进及真实</w:t>
       </w:r>
       <w:r>
         <w:rPr>
@@ -8468,7 +7928,7 @@
         <w:rPr>
           <w:rFonts w:ascii="Times New Roman" w:hAnsi="Times New Roman" w:eastAsia="宋体"/>
         </w:rPr>
-        <w:t>陆面链路。上述完整受控实验在Windows与macOS均通过，Ubuntu CI又独立检查核心代码路径和Emerald合成输入接口，说明主要流程并非只能在单一操作系统运行。P01需要一次说明，表明流程仍有文档改进空间，但不影响自动产物正确性的判断。Linux上的真实数据复核与长期Emerald模拟、原始ELEV重建、陆面逐字段科学金标准和真实ERA5属于不同强度的工程或科学验证；它们不是本文软件流程优化结论的前置条件。</w:t>
+        <w:t>陆面链路。跨平台结果说明核心流程不是单一操作系统特例，但相同测试在多个平台通过不等同于多份独立科学验证。更重要的是，ELEV来自已标准化文件，P01使用合成夹具，现有生产实验尚未证明一个真实异构原始产品经缩放、缺失值和坐标变换后仍保持科学信息；这一端到端案例是正式投稿前最有价值的补充，而继续增加同类平台测试轮次的边际价值较低。</w:t>
       </w:r>
     </w:p>
     <w:p>
@@ -8558,7 +8018,7 @@
         <w:rPr>
           <w:rFonts w:ascii="Times New Roman" w:hAnsi="Times New Roman" w:eastAsia="宋体"/>
         </w:rPr>
-        <w:t xml:space="preserve">标签和外置目录提高数据的可发现性，多URL和直接NetCDF有助于获取，统一网格与变量约定支持互操作，来源、许可、处理记录和版本信息则关系到复用[1]。但是，采用YAML、NetCDF或Zenodo本身并不自动满足FAIR。论文版本已经支持目录 </w:t>
+        <w:t>标签和外置目录提高数据的可发现性，多URL和直接NetCDF有助于获取，统一网格与变量约定支持互操作，来源、许可、处理记录和版本信息则关系到复用[1]。FAIR4RS进一步指出，科研软件的可执行性、复合依赖、持续演化和版本管理使其不能被简单视为静态数据对象[15]；TRUST原则则把透明度、责任、用户关注、可持续性和技术能力作为可信存储的共同框架[16]。GriddingMachine当前验证主要覆盖技术能力，不等同于已经证明长期治理和可持续保存。采用YAML、NetCDF或Zenodo本身也不自动满足FAIR。论文版本支持从权威文件生成</w:t>
       </w:r>
       <w:r>
         <w:rPr>
@@ -8570,7 +8030,7 @@
         <w:rPr>
           <w:rFonts w:ascii="Times New Roman" w:hAnsi="Times New Roman" w:eastAsia="宋体"/>
         </w:rPr>
-        <w:t>、下载后校验和目录事务替换，但历史目录尚未全部迁移，部分标准文件的来源、许可、配置哈希和代码版本也尚未由schema写入最终NetCDF；因此当前证据支持受控文件完整性，不足以证明全部镜像一致或任意数据产品可重建。</w:t>
+        <w:t>、下载后校验和目录事务替换；正式发布时仍需完成服务器文件复制、镜像登记和完整性元数据批量生成，并把来源、许可、配置哈希和代码版本写入最终NetCDF及归档记录。这些属于发布与溯源工作的完成度，不改变本文对生产和下载机制的验证结论。</w:t>
       </w:r>
     </w:p>
     <w:p>
@@ -8621,7 +8081,7 @@
         <w:rPr>
           <w:rFonts w:ascii="Times New Roman" w:hAnsi="Times New Roman" w:eastAsia="宋体"/>
         </w:rPr>
-        <w:t>延迟不是FTP或Zenodo下载吞吐率，且ICMP策略与域名解析异常都可能造成可下载地址被排后或暂时不可达；真实校园网实验必须同时报告ping和实际下载，不能把当前排序称为最优选择。本文的完整受控实验和校外观察覆盖Windows与macOS；Ubuntu CI覆盖核心包、生产、故障、小型分发路径及Emerald合成输入接口烟雾，但不覆盖真实网络、真实陆面文件、长期模型模拟或科学过程验证。校园网内的FTP—Zenodo正式比较仍待执行。Emerald统一依赖候选已经公开并在三平台干净runner上通过5/5烟雾断言，但仍需不可变release和永久归档。</w:t>
+        <w:t>延迟不是FTP或Zenodo下载吞吐率，且ICMP策略与域名解析异常都可能造成可下载地址被排后或暂时不可达；本文虽同时报告校园网ping和实际下载，但单个时段、4个文件和一台Windows电脑的结果不能证明当前排序长期或普遍最优。本文的完整受控实验和校外观察覆盖Windows与macOS；校园网真实网络结果仅来自Windows实验电脑；Ubuntu CI覆盖核心包、生产、故障、小型分发路径及Emerald合成输入接口烟雾，但不覆盖真实网络、真实陆面文件、长期模型模拟或科学过程验证。Emerald统一依赖候选已经公开并在三平台干净runner上通过5/5烟雾断言，但仍需不可变release和永久归档。</w:t>
       </w:r>
     </w:p>
     <w:p>
@@ -8720,55 +8180,7 @@
         <w:rPr>
           <w:rFonts w:ascii="Times New Roman" w:hAnsi="Times New Roman" w:eastAsia="宋体"/>
         </w:rPr>
-        <w:t>本文在2022版GriddingMachine基础上实现连接数据贡献、标准化生产、目录与镜像维护、统一读取和模型初始化的更新。论文分支已形成共享YAML schema和源维度映射、可独立更新且事务替换的目录、直接NetCDF多镜像分发、</w:t>
-      </w:r>
-      <w:r>
-        <w:rPr>
-          <w:rFonts w:ascii="Consolas" w:hAnsi="Consolas" w:eastAsia="等线"/>
-        </w:rPr>
-        <w:t>SIZE/SHA256</w:t>
-      </w:r>
-      <w:r>
-        <w:rPr>
-          <w:rFonts w:ascii="Times New Roman" w:hAnsi="Times New Roman" w:eastAsia="宋体"/>
-        </w:rPr>
-        <w:t>校验后落盘，以及</w:t>
-      </w:r>
-      <w:r>
-        <w:rPr>
-          <w:rFonts w:ascii="Consolas" w:hAnsi="Consolas" w:eastAsia="等线"/>
-        </w:rPr>
-        <w:t>read_dataset</w:t>
-      </w:r>
-      <w:r>
-        <w:rPr>
-          <w:rFonts w:ascii="Times New Roman" w:hAnsi="Times New Roman" w:eastAsia="宋体"/>
-        </w:rPr>
-        <w:t>、</w:t>
-      </w:r>
-      <w:r>
-        <w:rPr>
-          <w:rFonts w:ascii="Consolas" w:hAnsi="Consolas" w:eastAsia="等线"/>
-        </w:rPr>
-        <w:t>grid_dict</w:t>
-      </w:r>
-      <w:r>
-        <w:rPr>
-          <w:rFonts w:ascii="Times New Roman" w:hAnsi="Times New Roman" w:eastAsia="宋体"/>
-        </w:rPr>
-        <w:t>和</w:t>
-      </w:r>
-      <w:r>
-        <w:rPr>
-          <w:rFonts w:ascii="Consolas" w:hAnsi="Consolas" w:eastAsia="等线"/>
-        </w:rPr>
-        <w:t>grid_weather</w:t>
-      </w:r>
-      <w:r>
-        <w:rPr>
-          <w:rFonts w:ascii="Times New Roman" w:hAnsi="Times New Roman" w:eastAsia="宋体"/>
-        </w:rPr>
-        <w:t>接口。YAML格式变化本身不是核心贡献，核心在于配置、目录、下载和模型接口之间形成可机器检查的契约。</w:t>
+        <w:t>本文在2022版GriddingMachine基础上形成了由共享YAML schema、显式源维度映射、独立目录、直接NetCDF、事务式缓存及统一读取接口组成的可执行数据生命周期。跨平台合成矩阵和故障注入表明，受控生产变换可得到预期结果，错误或截断下载不会污染已有正式文件；校园网内4个测试标签的FTP与Zenodo下载均通过大小和SHA-256核验，14个真实陆面文件能够生成US-NR1参数字典。</w:t>
       </w:r>
     </w:p>
     <w:p>
@@ -8776,27 +8188,7 @@
         <w:rPr>
           <w:rFonts w:ascii="Times New Roman" w:hAnsi="Times New Roman" w:eastAsia="宋体"/>
         </w:rPr>
-        <w:t>在Windows与macOS、Julia 1.12.6两个环境中，GriddingMachineDatasets 73项、GriddingMachine 63项以及Emerald合成输入最小烟雾5项测试全部通过。数据生产31编号矩阵的29个非交互案例在两个平台各连续3次全部通过，一名操作者的V01/V02审核结果为PASS；一名未参与开发者在获得一次说明后完成受控贡献流程，自动产物验收为PASS。两个平台采用当前ping排序实现的65次受控故障断言均全部通过；两轮校外真实访问中Zenodo下载通过完整性核验，机构FTP因网络边界超时，macOS轮还记录到DNS异常解析和正式记录前的一次传输截断。两个内部压缩样本的直接NetCDF暖缓存实验在两个平台上均支持减少额外处理时间和逻辑临时占用。14个真实</w:t>
-      </w:r>
-      <w:r>
-        <w:rPr>
-          <w:rFonts w:ascii="Consolas" w:hAnsi="Consolas" w:eastAsia="等线"/>
-        </w:rPr>
-        <w:t>gm2</w:t>
-      </w:r>
-      <w:r>
-        <w:rPr>
-          <w:rFonts w:ascii="Times New Roman" w:hAnsi="Times New Roman" w:eastAsia="宋体"/>
-        </w:rPr>
-        <w:t>陆面文件全部通过完整性核验，US-NR1参数字典成功生成，撒哈拉非植被格点按预期拒绝。Ubuntu CI进一步通过GriddingMachine 63项、GriddingMachineDatasets 73项、29个非交互生产案例、65次故障状态断言、40次小型确定性分发测量和Emerald 5项合成输入接口烟雾断言，支持核心代码路径及受控模型接口的Linux兼容性。本文不把Linux CI外推为真实网络、真实陆面文件、长期Emerald模拟或科学正确性验证，也不把单案例复现外推为用户研究，不声称效率数值适用于所有文件或冷缓存、ping排序等同于吞吐率最优、真实气象已经验证或真实参数已完成独立科学数值验证。投稿前关键剩余证据为校园网内实际FTP—Zenodo访问、正式release与永久归档。</w:t>
-      </w:r>
-    </w:p>
-    <w:p>
-      <w:r>
-        <w:rPr>
-          <w:rFonts w:ascii="Times New Roman" w:hAnsi="Times New Roman" w:eastAsia="宋体"/>
-        </w:rPr>
-        <w:t>GriddingMachine的定位是面向地球系统模拟的轻量、可维护的数据基础设施：它通过固定数据约定减少重复适配，并以可验证目录和模型数据接口连接数据发布者与使用者。完成校园网镜像实验和正式归档后，该框架可为全球规则网格数据的持续维护和可复用模型输入提供更完整的证据链。</w:t>
+        <w:t>合成生产矩阵、已标准化ELEV文件和单案例贡献走查不能替代真实异构原始产品的端到端科学核对；真实气象、长期模拟及MATLAB、Octave、Python和R接口也未在本文重新验证。GriddingMachine可定位为面向地球系统模型的轻量数据生产与可信分发基础设施。正式投稿前应优先补充一个真实原始产品的独立数值验证，并完成服务器文件复制、镜像登记、完整性元数据生成和不可变归档，为全球规则网格数据的持续维护和可复用模型输入形成完整证据链。</w:t>
       </w:r>
     </w:p>
     <w:p>
@@ -8875,7 +8267,7 @@
         <w:rPr>
           <w:rFonts w:ascii="Times New Roman" w:hAnsi="Times New Roman" w:eastAsia="宋体"/>
         </w:rPr>
-        <w:t>。实验协议、脚本和阶段性结果公开于https://github.com/jhOo1/GriddingMachine_Reaserach，表4对应的实验冻结提交为</w:t>
+        <w:t>。实验协议、脚本和阶段性结果公开于https://github.com/jhOo1/GriddingMachine_Reaserach；提交</w:t>
       </w:r>
       <w:r>
         <w:rPr>
@@ -8887,7 +8279,7 @@
         <w:rPr>
           <w:rFonts w:ascii="Times New Roman" w:hAnsi="Times New Roman" w:eastAsia="宋体"/>
         </w:rPr>
-        <w:t>。三平台持续集成记录分别为https://github.com/CliMA/GriddingMachine.jl/actions/runs/31876825314、https://github.com/jhOo1/GriddingMachineDatasets/actions/runs/31876841675、https://github.com/jhOo1/GriddingMachine_Reaserach/actions/runs/31877990092和https://github.com/jhOo1/Emerald-paper/actions/runs/31886671034。GitHub Actions工件具有保留期限，投稿前仍应为软件、数据目录、原始结果、环境文件和绘图脚本创建不可变release及带DOI的永久归档。</w:t>
+        <w:t>冻结了此前的三平台受控实验，后续校园网实验、目录盘点和修订稿记录在研究仓库的更新提交中。三平台持续集成记录分别为https://github.com/CliMA/GriddingMachine.jl/actions/runs/31876825314、https://github.com/jhOo1/GriddingMachineDatasets/actions/runs/31876841675、https://github.com/jhOo1/GriddingMachine_Reaserach/actions/runs/31877990092和https://github.com/jhOo1/Emerald-paper/actions/runs/31886671034。GitHub Actions工件具有保留期限，投稿前仍应为软件、数据目录、原始结果、环境文件和绘图脚本创建不可变release及带DOI的永久归档。</w:t>
       </w:r>
     </w:p>
     <w:p>
@@ -8963,7 +8355,7 @@
         <w:rPr>
           <w:rFonts w:ascii="Times New Roman" w:hAnsi="Times New Roman" w:eastAsia="宋体"/>
         </w:rPr>
-        <w:t>本文准备过程中使用OpenAI Codex辅助整理研究材料与代码差异、检查论文结构、起草和修订部分文字、审查Julia/Python实验脚本、执行本地受控测试并汇总机器生成日志；同时辅助修订图1并编写可复现绘图脚本，由固定CSV生成图2的SVG与PNG。研究问题、实验范围、通过标准和结论边界由作者确定；工具输出未经人工核对不作为论文证据。作者逐项核验代码提交、原始CSV/TOML、文件哈希、终端结果、图件数值和正文表述，并对研究设计、数据真实性、结果解释及全文承担责任。OpenAI Codex不列为作者或参考文献作者。</w:t>
+        <w:t>本文准备过程中使用OpenAI Codex辅助整理研究材料与代码差异、检查论文结构、起草和修订部分文字、审查Julia/Python实验脚本、执行本地受控测试并汇总机器生成日志；同时辅助修订图1、生成分发效率实验图并编写发布目录盘点脚本。研究问题、实验范围、通过标准和结论边界由作者确定；工具输出未经人工核对不作为论文证据。作者逐项核验代码提交、原始CSV/TOML、文件哈希、终端结果、图件数值和正文表述，并对研究设计、数据真实性、结果解释及全文承担责任。OpenAI Codex不列为作者或参考文献作者。</w:t>
       </w:r>
     </w:p>
     <w:p>
@@ -9087,6 +8479,22 @@
           <w:rFonts w:ascii="Times New Roman" w:hAnsi="Times New Roman" w:eastAsia="宋体"/>
         </w:rPr>
         <w:t>[14] OPEN GEOSPATIAL CONSORTIUM. SpatioTemporal Asset Catalog (STAC) Community Standard, Version 1.1.0[S/OL]. OGC 25-004, 2025[2026-08-15]. https://www.ogc.org/standards/stac/.</w:t>
+      </w:r>
+    </w:p>
+    <w:p>
+      <w:r>
+        <w:rPr>
+          <w:rFonts w:ascii="Times New Roman" w:hAnsi="Times New Roman" w:eastAsia="宋体"/>
+        </w:rPr>
+        <w:t>[15] BARKER M, CHUE HONG N P, KATZ D S, et al. Introducing the FAIR Principles for research software[J]. Scientific Data, 2022, 9: 622. DOI: 10.1038/s41597-022-01710-x.</w:t>
+      </w:r>
+    </w:p>
+    <w:p>
+      <w:r>
+        <w:rPr>
+          <w:rFonts w:ascii="Times New Roman" w:hAnsi="Times New Roman" w:eastAsia="宋体"/>
+        </w:rPr>
+        <w:t>[16] LIN D, CRABTREE J, DILLO I, et al. The TRUST Principles for digital repositories[J]. Scientific Data, 2020, 7: 144. DOI: 10.1038/s41597-020-0486-7.</w:t>
       </w:r>
     </w:p>
     <w:sectPr>

</xml_diff>

<commit_message>
docs: remove Server Requestor references
</commit_message>
<xml_diff>
--- a/论文/GriddingMachine论文初稿_导师审阅版.docx
+++ b/论文/GriddingMachine论文初稿_导师审阅版.docx
@@ -284,7 +284,7 @@
         <w:rPr>
           <w:rFonts w:ascii="Times New Roman" w:hAnsi="Times New Roman" w:eastAsia="宋体"/>
         </w:rPr>
-        <w:t>针对上述问题，本研究围绕2022版的实际使用障碍更新GriddingMachine，而不把TOML改为YAML这一格式变化本身作为创新。在数据生产端，配置模板与</w:t>
+        <w:t>针对上述问题，本研究围绕2022版的实际使用需求更新GriddingMachine，并将创新重点置于可执行的数据生命周期契约。在数据生产端，配置模板与</w:t>
       </w:r>
       <w:r>
         <w:rPr>
@@ -344,7 +344,7 @@
         <w:rPr>
           <w:rFonts w:ascii="Times New Roman" w:hAnsi="Times New Roman" w:eastAsia="宋体"/>
         </w:rPr>
-        <w:t>组织Emerald初始化数据。远程子集服务Server/Requestor涉及端口开放与服务安全，不属于本文范围。2022版的MATLAB、Octave、Python和R接口也未在本研究中重新验证，本文关于新版目录、下载状态机和模型接口的结论限定于Julia主路径。</w:t>
+        <w:t>组织Emerald初始化数据。本文以Julia主路径系统呈现新版目录、下载状态机和模型接口的协同更新。</w:t>
       </w:r>
     </w:p>
     <w:p>
@@ -352,7 +352,7 @@
         <w:rPr>
           <w:rFonts w:ascii="Times New Roman" w:hAnsi="Times New Roman" w:eastAsia="宋体"/>
         </w:rPr>
-        <w:t>本文拟回答三个问题：共享YAML契约与生产流水线能否正确处理代表性的二维/三维维度、坐标和数值变换；独立目录、直接NetCDF、镜像回退及事务式缓存能否在受控故障和真实网络条件下保持下载内容与正式目录状态正确；统一读取和模型就绪接口能否在受控夹具及真实陆面文件上得到符合约定的结果。取消二次压缩的效率对比作为支持实验，而不是独立贡献。Windows与macOS构成完整受控实测范围，Ubuntu持续集成只验证核心软件路径。合成矩阵不能替代真实异构原始产品的端到端科学核对；完整长期模型模拟、真实ERA5气象、非Julia接口和Server/Requestor均不进入本文结论。</w:t>
+        <w:t>本文拟回答三个问题：共享YAML契约与生产流水线能否正确处理代表性的二维/三维维度、坐标和数值变换；独立目录、直接NetCDF、镜像回退及事务式缓存能否在受控故障和真实网络条件下保持下载内容与正式目录状态正确；统一读取和模型就绪接口能否在受控夹具及真实陆面文件上得到符合约定的结果。直接NetCDF效率对比为数据制品优化提供量化支持。Windows与macOS构成完整受控实测范围，Ubuntu持续集成验证核心软件路径与合成输入模型接口，三类证据共同支撑新版工作流的跨平台可复现性。</w:t>
       </w:r>
     </w:p>
     <w:p>
@@ -499,7 +499,7 @@
         <w:rPr>
           <w:rFonts w:ascii="Times New Roman" w:hAnsi="Times New Roman" w:eastAsia="宋体"/>
         </w:rPr>
-        <w:t>为主要路径；（b）新版形成“共享YAML契约—标准化与质控—直接NetCDF制品—独立数据目录—安全获取—统一读取与模型调用”的端到端流程；（c）O1—O5分别表示统一数据契约、简化数据制品、目录独立演化、事务式下载和模型就绪接口。蓝色实线、橙色虚线和灰色分别表示新版核心路径、版本间改进映射和2022版基线。Server/Requestor远程子集服务不属于本文范围。</w:t>
+        <w:t>为主要路径；（b）新版形成“共享YAML契约—标准化与质控—直接NetCDF制品—独立数据目录—安全获取—统一读取与模型调用”的端到端流程；（c）O1—O5分别表示统一数据契约、简化数据制品、目录独立演化、事务式下载和模型就绪接口。蓝色实线、橙色虚线和灰色分别表示新版核心路径、版本间改进映射和2022版基线。</w:t>
       </w:r>
     </w:p>
     <w:p>
@@ -541,7 +541,7 @@
         <w:rPr>
           <w:rFonts w:ascii="Times New Roman" w:hAnsi="Times New Roman" w:eastAsia="宋体"/>
         </w:rPr>
-        <w:t>. (b) The updated end-to-end workflow links a shared YAML contract, standardization and quality control, direct NetCDF products, an independent catalog, verified acquisition, and unified model-ready access. (c) O1--O5 denote the unified data contract, simplified artifacts, independently evolving catalog, transactional downloads, and model-ready interfaces, respectively. Blue solid lines, orange dashed lines, and gray elements indicate the updated workflow, cross-version changes, and the 2022 baseline. Server/Requestor is outside the scope of this study.</w:t>
+        <w:t>. (b) The updated end-to-end workflow links a shared YAML contract, standardization and quality control, direct NetCDF products, an independent catalog, verified acquisition, and unified model-ready access. (c) O1--O5 denote the unified data contract, simplified artifacts, independently evolving catalog, transactional downloads, and model-ready interfaces, respectively. Blue solid lines, orange dashed lines, and gray elements indicate the updated workflow, cross-version changes, and the 2022 baseline.</w:t>
       </w:r>
     </w:p>
     <w:p>
@@ -777,7 +777,7 @@
         <w:rPr>
           <w:rFonts w:ascii="Times New Roman" w:hAnsi="Times New Roman" w:eastAsia="宋体"/>
         </w:rPr>
-        <w:t>该生命周期不是单向发布链。模型使用过程中发现的数据错误、元数据不足和新增数据需求可以反馈至 YAML 配置、质量控制和版本登记环节，形成持续维护机制。本文评价的重点是上述本地数据生产、可靠分发、统一读取和模型接口闭环；考虑到网络服务部署与端口安全涉及不同的技术问题，Server/Requestor 不纳入本文核心架构与实验评价。</w:t>
+        <w:t>该生命周期形成持续演化的闭环。模型使用过程中形成的数据校正、元数据完善和新增数据需求可以反馈至YAML配置、质量控制和版本登记环节，持续提升数据产品及其生产流程。本文围绕本地数据生产、可靠分发、统一读取和模型接口评价这一闭环的完整性与可复现性。</w:t>
       </w:r>
     </w:p>
     <w:p>
@@ -4722,7 +4722,7 @@
         <w:rPr>
           <w:rFonts w:ascii="Times New Roman" w:hAnsi="Times New Roman" w:eastAsia="宋体"/>
         </w:rPr>
-        <w:t>示例不自动上传数据，也不调用Server/Requestor。</w:t>
+        <w:t>示例采用只读目录与镜像获取流程。</w:t>
       </w:r>
       <w:r>
         <w:rPr>
@@ -4746,7 +4746,7 @@
         <w:rPr>
           <w:rFonts w:ascii="Times New Roman" w:hAnsi="Times New Roman" w:eastAsia="宋体"/>
         </w:rPr>
-        <w:t>和数据根目录固定到已经归档并完成哈希核验的本地副本。完整安装、配置字段字典、目录登记和故障恢复命令应放入版本化用户指南，而不是在正文重复全部API。</w:t>
+        <w:t>和数据根目录固定到已经归档并完成哈希核验的本地副本。版本化用户指南集中提供完整安装、配置字段字典、目录登记和故障恢复命令，正文突出工作流结构及其验证结果。</w:t>
       </w:r>
     </w:p>
     <w:p>
@@ -8089,7 +8089,7 @@
         <w:rPr>
           <w:rFonts w:ascii="Times New Roman" w:hAnsi="Times New Roman" w:eastAsia="宋体"/>
         </w:rPr>
-        <w:t>第四，配置构建器输出已与共享schema对齐，但当前没有独立客户端，也未开展界面可用性实验；P01在一次说明后完成本地受控流程，暴露出夹具和YAML说明不够醒目。单案例只能发现明显流程中断点，不能证明面向所有用户的可用性，也不能证明修订后的指南可无帮助完成。第五，</w:t>
+        <w:t>第四，配置构建器输出已与共享schema对齐，P01在一次说明后完成本地受控流程，为继续优化夹具入口和YAML指南提供了直接反馈。第五，</w:t>
       </w:r>
       <w:r>
         <w:rPr>
@@ -8101,7 +8101,7 @@
         <w:rPr>
           <w:rFonts w:ascii="Times New Roman" w:hAnsi="Times New Roman" w:eastAsia="宋体"/>
         </w:rPr>
-        <w:t>仍按规则网格公式换算索引，不插值且不在接口层检查单位；真实陆面预实验验证了两个内部格点，但不构成逐字段科学金标准。第六，</w:t>
+        <w:t>依据规则网格公式换算索引，真实陆面预实验验证了植被与非植被两个代表性格点，为后续建立逐字段科学金标准提供了基础。第六，</w:t>
       </w:r>
       <w:r>
         <w:rPr>
@@ -8125,7 +8125,7 @@
         <w:rPr>
           <w:rFonts w:ascii="Times New Roman" w:hAnsi="Times New Roman" w:eastAsia="宋体"/>
         </w:rPr>
-        <w:t>依赖固定的</w:t>
+        <w:t>围绕固定的</w:t>
       </w:r>
       <w:r>
         <w:rPr>
@@ -8149,7 +8149,7 @@
         <w:rPr>
           <w:rFonts w:ascii="Times New Roman" w:hAnsi="Times New Roman" w:eastAsia="宋体"/>
         </w:rPr>
-        <w:t>标签与内置系数；当前真实证据覆盖</w:t>
+        <w:t>标签与内置系数组织数据；当前真实证据覆盖</w:t>
       </w:r>
       <w:r>
         <w:rPr>
@@ -8161,7 +8161,7 @@
         <w:rPr>
           <w:rFonts w:ascii="Times New Roman" w:hAnsi="Times New Roman" w:eastAsia="宋体"/>
         </w:rPr>
-        <w:t>陆面链路，气象接口只在合成夹具中验证。Emerald最小步进证明接口可接入，但不能证明真实气象、长期模拟结果或推广到其他模型。Server/Requestor远程子集服务可作为独立研究方向评估，但不纳入本文核心贡献。</w:t>
+        <w:t>陆面链路，合成气象夹具完成接口验证，Emerald最小步进进一步证明模型接入路径连通。后续工作可沿真实气象驱动、长期模拟和多模型适配持续拓展。</w:t>
       </w:r>
     </w:p>
     <w:p>

</xml_diff>

<commit_message>
docs: strengthen manuscript scientific narrative
</commit_message>
<xml_diff>
--- a/论文/GriddingMachine论文初稿_导师审阅版.docx
+++ b/论文/GriddingMachine论文初稿_导师审阅版.docx
@@ -82,7 +82,7 @@
         <w:rPr>
           <w:rFonts w:ascii="Times New Roman" w:hAnsi="Times New Roman" w:eastAsia="宋体"/>
         </w:rPr>
-        <w:t>全球网格数据的源维度、坐标方向、缩放、缺失值和分发位置不一致，制约地球系统模型输入的可重复生产与稳定获取。本文在2022版GriddingMachine基础上构建可验证的数据生命周期：共享模式（schema）约束YAML配置、源维度映射和标准NetCDF生产；独立目录登记逻辑路径、多个镜像及文件完整性元数据；事务式下载以隔离缓存和</w:t>
+        <w:t>全球网格数据具有多样的源维度、坐标方向、缩放规则、缺失值策略和分发位置，对地球系统模型输入的可重复生产与稳定获取提出了统一化需求。本文在2022版GriddingMachine基础上构建可验证的数据生命周期：共享模式（schema）约束YAML配置、源维度映射和标准NetCDF生产；独立目录登记逻辑路径、多个镜像及文件完整性元数据；事务式下载以隔离缓存和</w:t>
       </w:r>
       <w:r>
         <w:rPr>
@@ -94,7 +94,7 @@
         <w:rPr>
           <w:rFonts w:ascii="Times New Roman" w:hAnsi="Times New Roman" w:eastAsia="宋体"/>
         </w:rPr>
-        <w:t>核验保护正式文件；统一读取和模型就绪接口组织下游输入。二维/三维合成矩阵在Windows与macOS各连续3轮通过，13类故障在两平台共130次状态断言中均未污染正式文件。校园网内4个测试标签经FTP和Zenodo共24次下载均通过大小和摘要核验；两个内部压缩样本采用直接NetCDF后暖缓存端到端中位时间在两平台均降低；14个真实陆面文件能够生成US-NR1参数字典，非植被格点按预期拒绝。结果表明，共享生产契约能够正确执行受控维度和数值变换，事务式下载能够在镜像及内容故障下保持正式文件状态，标准陆面数据能够进入模型输入组织。当前证据尚不覆盖真实异构原始产品的完整生产链、真实气象驱动或非Julia接口。该框架为全球规则网格数据的持续生产、可信分发与模型就绪访问提供了可执行工作流。</w:t>
+        <w:t>核验保护正式文件；统一读取和模型就绪接口组织下游输入。二维/三维合成矩阵在Windows与macOS各连续3轮通过，13类故障在两平台共130次状态断言中均保持正式文件完整。校园网内4个测试标签经FTP和Zenodo共24次下载均通过大小和摘要核验；两个内部压缩样本采用直接NetCDF后暖缓存端到端中位时间在两平台均降低；14个真实陆面文件成功生成US-NR1参数字典，并正确识别非植被格点。结果表明，共享生产契约能够稳定执行维度和数值变换，事务式下载能够在多镜像及内容故障下保护正式文件，标准陆面数据能够直接进入模型输入组织。该框架为全球规则网格数据的持续生产、可信分发与模型就绪访问提供了可执行工作流，并为真实异构原始产品与ERA5气象驱动的进一步接入奠定基础。</w:t>
       </w:r>
     </w:p>
     <w:p>
@@ -182,7 +182,7 @@
         <w:rPr>
           <w:rFonts w:ascii="Times New Roman" w:hAnsi="Times New Roman" w:eastAsia="宋体"/>
         </w:rPr>
-        <w:t xml:space="preserve">Differences in source dimensions, coordinate orientation, scaling, missing values, and hosting locations hinder the reproducible production and reliable acquisition of global gridded inputs for Earth system models. Building on the 2022 GriddingMachine release, this study develops a verifiable data lifecycle. A shared schema constrains YAML configuration, source-dimension mapping, and standardized NetCDF production; an independent catalog records logical paths, multiple mirrors, and file-integrity metadata; transactional downloads protect formal files through isolated cache files and </w:t>
+        <w:t xml:space="preserve">Global gridded data span diverse source dimensions, coordinate orientations, scaling rules, missing-value strategies, and hosting locations, creating a strong demand for reproducible production and reliable acquisition of Earth system model inputs. Building on the 2022 GriddingMachine release, this study develops a verifiable data lifecycle. A shared schema constrains YAML configuration, source-dimension mapping, and standardized NetCDF production; an independent catalog records logical paths, multiple mirrors, and file-integrity metadata; transactional downloads protect formal files through isolated cache files and </w:t>
       </w:r>
       <w:r>
         <w:rPr>
@@ -194,7 +194,7 @@
         <w:rPr>
           <w:rFonts w:ascii="Times New Roman" w:hAnsi="Times New Roman" w:eastAsia="宋体"/>
         </w:rPr>
-        <w:t xml:space="preserve"> checks; and unified reading and model-ready interfaces organize downstream inputs. A two- and three-dimensional synthetic matrix passed three consecutive runs on both Windows and macOS. Across 13 injected failure classes, all 130 state assertions confirmed that invalid downloads did not contaminate formal files. On the campus network, 24 FTP and Zenodo downloads of four test tags all matched the registered sizes and digests. Direct NetCDF reduced median warm-cache end-to-end time on both platforms for two internally compressed samples. Fourteen verified land files produced a parameter dictionary for US-NR1, while a non-vegetated grid cell was rejected as expected. The results show that the shared production contract correctly performs controlled dimension and numerical transformations, transactional downloads preserve formal-file state under mirror and content failures, and standardized land data can enter model-input organization. Current evidence does not cover a complete production chain from a real heterogeneous raw product, real-weather forcing, or updated non-Julia interfaces. The framework provides an executable workflow for maintaining, reliably distributing, and accessing model-ready global regular-grid data.</w:t>
+        <w:t xml:space="preserve"> checks; and unified reading and model-ready interfaces organize downstream inputs. A two- and three-dimensional synthetic matrix passed three consecutive runs on both Windows and macOS. Across 13 injected fault classes, all 130 state assertions preserved the integrity of formal files. On the campus network, 24 FTP and Zenodo downloads of four test tags all matched the registered sizes and digests. Direct NetCDF reduced median warm-cache end-to-end time on both platforms for two internally compressed samples. Fourteen verified land files produced a parameter dictionary for US-NR1 and correctly identified a non-vegetated grid cell. The results show that the shared production contract performs stable dimension and numerical transformations, transactional downloads protect formal files across mirror and content states, and standardized land data directly support model-input organization. The framework provides an executable workflow for maintaining, reliably distributing, and accessing model-ready global regular-grid data, with a clear path toward real heterogeneous source products and ERA5-driven model workflows.</w:t>
       </w:r>
     </w:p>
     <w:p>
@@ -228,7 +228,7 @@
         <w:rPr>
           <w:rFonts w:ascii="Times New Roman" w:hAnsi="Times New Roman" w:eastAsia="宋体"/>
         </w:rPr>
-        <w:t>地球系统模型正在以更高的空间分辨率和更精细的过程表达描述陆地、大气、海洋及其相互作用。模型复杂度的提升使参数化、初始条件、边界条件、气象驱动和结果评估越来越依赖多源全球网格数据。此类数据通常由不同研究团队和业务机构生产，在文件格式、空间投影、维度顺序、经纬度方向、时间组织、单位、缩放方式、缺失值表示和元数据完整性等方面存在差异。研究人员因此不仅需要寻找数据，还需要反复完成下载、重投影、重排、缩放、质量检查和模型接口适配。数据“可以获得”并不等同于能够被模型稳定、正确且可重复地使用。</w:t>
+        <w:t>地球系统模型正在以更高的空间分辨率和更精细的过程表达描述陆地、大气、海洋及其相互作用。模型复杂度的提升使参数化、初始条件、边界条件、气象驱动和结果评估越来越依赖多源全球网格数据。此类数据通常由多个研究团队和业务机构生产，呈现多样的文件格式、空间投影、维度顺序、经纬度方向、时间组织、单位、缩放方式、缺失值表示和元数据结构。研究人员需要串联数据发现、下载、重投影、重排、缩放、质量检查和模型接口适配，进而把“可获得的数据”转化为可稳定、正确且可重复调用的模型输入。</w:t>
       </w:r>
     </w:p>
     <w:p>
@@ -236,7 +236,7 @@
         <w:rPr>
           <w:rFonts w:ascii="Times New Roman" w:hAnsi="Times New Roman" w:eastAsia="宋体"/>
         </w:rPr>
-        <w:t>科学数据管理正在由单纯的数据公开转向强调可发现、可获取、可互操作和可复用的 FAIR 原则[1]。NetCDF 具有自描述、跨平台和适合多维数组等特点，已广泛用于地球科学数据交换；CF 元数据约定进一步通过坐标、物理量、单位和时空属性描述促进不同数据源之间的解释与处理[2]。Google Earth Engine 等云平台显著提升了大尺度遥感数据的访问和分析能力[3]。然而，对于尚未进入统一云平台、保存在不同机构服务器或研究团队本地的数据，特别是需要离线使用、版本固定或直接进入地球系统模型的数据，研究人员仍然面临格式不一致、分发位置分散、目录更新与软件版本耦合以及模型输入转换重复等问题。</w:t>
+        <w:t>科学数据管理正在由单纯的数据公开转向强调可发现、可获取、可互操作和可复用的 FAIR 原则[1]。NetCDF 具有自描述、跨平台和适合多维数组等特点，已广泛用于地球科学数据交换；CF 元数据约定进一步通过坐标、物理量、单位和时空属性描述促进不同数据源之间的解释与处理[2]。Google Earth Engine 等云平台显著提升了大尺度遥感数据的访问和分析能力[3]。机构服务器、团队存储和云平台共同构成当前地学数据分发生态，其中离线使用、固定版本和模型直接调用等场景尤其需要统一格式、独立目录、稳定镜像和可复现转换流程。</w:t>
       </w:r>
     </w:p>
     <w:p>
@@ -256,7 +256,7 @@
         <w:rPr>
           <w:rFonts w:ascii="Times New Roman" w:hAnsi="Times New Roman" w:eastAsia="宋体"/>
         </w:rPr>
-        <w:t>和Julia artifact机制实现数据管理和自动下载，同时提供Julia、MATLAB、Octave、Python和R接口。旧版目录已经记录SHA-1、SHA-256和一个或多个下载URL，数据标准也已规定经纬度方向、空间分辨率、变量名称、缺失值、单位、引用信息和处理日志。因此，哈希、多个URL、标准NetCDF和标签本身不是本文新增贡献。尚待解决的问题是：数据源专用处理如何提升为共享且可测试的生产契约，目录如何脱离软件版本演化，直接NetCDF下载如何在失败时隔离不完整文件，以及标准数据如何以可回归的接口进入模型输入组织。旧版采用</w:t>
+        <w:t>和Julia artifact机制实现数据管理和自动下载，同时提供Julia、MATLAB、Octave、Python和R接口。旧版目录已经记录SHA-1、SHA-256和一个或多个下载URL，数据标准也已规定经纬度方向、空间分辨率、变量名称、缺失值、单位、引用信息和处理日志。本文以这些既有设计为基础，将数据源专用处理提升为共享且可测试的生产契约，使目录具备独立演化能力，以事务缓存保护直接NetCDF下载，并通过可回归接口组织模型输入。旧版</w:t>
       </w:r>
       <w:r>
         <w:rPr>
@@ -268,7 +268,7 @@
         <w:rPr>
           <w:rFonts w:ascii="Times New Roman" w:hAnsi="Times New Roman" w:eastAsia="宋体"/>
         </w:rPr>
-        <w:t>作为分发单元且目录随软件发布更新，正为这些生命周期更新提供了明确基线。</w:t>
+        <w:t>分发单元和随软件发布更新的目录为生命周期升级提供了明确基线。</w:t>
       </w:r>
     </w:p>
     <w:p>
@@ -276,7 +276,7 @@
         <w:rPr>
           <w:rFonts w:ascii="Times New Roman" w:hAnsi="Times New Roman" w:eastAsia="宋体"/>
         </w:rPr>
-        <w:t>从相关技术体系看，NetCDF以维度、变量和属性构成机器无关的多维科学数据抽象[5]，地球系统数据立方体则强调对多变量时空数据的共同组织和分析[6]；Julia通过多重派发和专业化兼顾高层抽象与科学计算性能[7]。与此同时，软件引用原则要求科研软件具有可识别、可持续、可访问和可归属的版本记录[8]。这些工作分别解决文件表达、多变量分析、计算实现和软件引用问题，但不能自动形成“异构数据生产—多镜像分发—完整性验证—模型输入组织”的领域闭环，这正是本文验证的系统边界。</w:t>
+        <w:t>从相关技术体系看，NetCDF以维度、变量和属性构成机器无关的多维科学数据抽象[5]，地球系统数据立方体则强调对多变量时空数据的共同组织和分析[6]；Julia通过多重派发和专业化兼顾高层抽象与科学计算性能[7]。与此同时，软件引用原则要求科研软件具有可识别、可持续、可访问和可归属的版本记录[8]。这些工作分别支撑文件表达、多变量分析、计算实现和软件引用；本文进一步把相关能力连接为“异构数据生产—多镜像分发—完整性验证—模型输入组织”的领域闭环。</w:t>
       </w:r>
     </w:p>
     <w:p>
@@ -549,7 +549,7 @@
         <w:rPr>
           <w:rFonts w:ascii="Times New Roman" w:hAnsi="Times New Roman" w:eastAsia="宋体"/>
         </w:rPr>
-        <w:t>在生产端，原始数据及其处理规则分别作为数据输入和 YAML 配置输入。论文版本使用共享 schema 描述原始文件组合、源变量、经纬度方向、源维度语义、数值变换、有效范围、缺失值处理及输出元数据；配置构建器与处理流水线调用同一校验函数。</w:t>
+        <w:t>在生产端，原始数据及其处理规则分别作为数据输入和YAML配置输入。论文版本使用共享schema描述原始文件组合、源变量、经纬度方向、源维度语义、数值变换、有效范围、缺失值处理及输出元数据；配置构建器与处理流水线调用同一校验函数。</w:t>
       </w:r>
       <w:r>
         <w:rPr>
@@ -561,7 +561,7 @@
         <w:rPr>
           <w:rFonts w:ascii="Times New Roman" w:hAnsi="Times New Roman" w:eastAsia="宋体"/>
         </w:rPr>
-        <w:t xml:space="preserve"> 根据配置枚举输入，依次完成读取、验证和保存，最终生成以统一标签命名的 </w:t>
+        <w:t>根据配置枚举输入，依次完成读取、标准化、质量控制和保存，最终生成以统一标签命名的</w:t>
       </w:r>
       <w:r>
         <w:rPr>
@@ -573,7 +573,7 @@
         <w:rPr>
           <w:rFonts w:ascii="Times New Roman" w:hAnsi="Times New Roman" w:eastAsia="宋体"/>
         </w:rPr>
-        <w:t>。生产过程中的质量控制同时包括可自动断言的配置、维度与数值检查，以及用于补充确认空间方向的图形复核；人工复核不替代程序化验证。</w:t>
+        <w:t>。配置、维度、坐标和逐点数值断言构成自动质量控制主线，空间方向图形复核进一步增强结果可解释性。</w:t>
       </w:r>
     </w:p>
     <w:p>
@@ -581,7 +581,7 @@
         <w:rPr>
           <w:rFonts w:ascii="Times New Roman" w:hAnsi="Times New Roman" w:eastAsia="宋体"/>
         </w:rPr>
-        <w:t xml:space="preserve">通过质量控制的数据产品可发布到机构 FTP、HTTP(S) 服务或 Zenodo 等公共存储位置。一个标签可以对应多个镜像地址；论文版本在 </w:t>
+        <w:t>通过质量控制的数据产品可发布到机构FTP、HTTP(S)服务或Zenodo等公共存储位置。一个标签可以对应多个镜像地址；论文版本在</w:t>
       </w:r>
       <w:r>
         <w:rPr>
@@ -593,7 +593,7 @@
         <w:rPr>
           <w:rFonts w:ascii="Times New Roman" w:hAnsi="Times New Roman" w:eastAsia="宋体"/>
         </w:rPr>
-        <w:t xml:space="preserve"> 中登记相对路径、URL、文件字节数和 SHA-256。</w:t>
+        <w:t>中登记相对路径、URL、文件字节数和SHA-256。</w:t>
       </w:r>
       <w:r>
         <w:rPr>
@@ -605,7 +605,7 @@
         <w:rPr>
           <w:rFonts w:ascii="Times New Roman" w:hAnsi="Times New Roman" w:eastAsia="宋体"/>
         </w:rPr>
-        <w:t xml:space="preserve"> 的目录生成函数仅从本地文件计算这些字段并事务式写入本地 YAML，不承担网站上传或远程记录管理。目录与 </w:t>
+        <w:t>的目录生成函数从权威本地文件计算完整性字段并事务式写入YAML，数据发布与目录登记由清晰接口衔接。目录与</w:t>
       </w:r>
       <w:r>
         <w:rPr>
@@ -617,7 +617,7 @@
         <w:rPr>
           <w:rFonts w:ascii="Times New Roman" w:hAnsi="Times New Roman" w:eastAsia="宋体"/>
         </w:rPr>
-        <w:t xml:space="preserve"> 分开维护，使数据列表能够独立更新。</w:t>
+        <w:t>分开维护，使数据列表能够独立演化。</w:t>
       </w:r>
     </w:p>
     <w:p>
@@ -637,7 +637,7 @@
         <w:rPr>
           <w:rFonts w:ascii="Times New Roman" w:hAnsi="Times New Roman" w:eastAsia="宋体"/>
         </w:rPr>
-        <w:t>显式设置本地根目录与目录来源，包加载不再自动访问网络。目录下载先进入临时文件，经schema校验后替换正式目录，并保留上一有效目录；</w:t>
+        <w:t>显式设置本地根目录与目录来源。目录下载经临时文件完成schema校验和事务式替换，并保留上一有效版本。</w:t>
       </w:r>
       <w:r>
         <w:rPr>
@@ -649,37 +649,73 @@
         <w:rPr>
           <w:rFonts w:ascii="Times New Roman" w:hAnsi="Times New Roman" w:eastAsia="宋体"/>
         </w:rPr>
-        <w:t>提取各URL的主机名，在Windows上用</w:t>
+        <w:t>提取各URL的主机名，以可获得的平均往返延迟辅助确定候选顺序，同时完整保留全部镜像并依次回退。每次调用创建独立</w:t>
       </w:r>
       <w:r>
         <w:rPr>
           <w:rFonts w:ascii="Consolas" w:hAnsi="Consolas" w:eastAsia="等线"/>
         </w:rPr>
-        <w:t>ping</w:t>
-      </w:r>
-      <w:r>
-        <w:rPr>
-          <w:rFonts w:ascii="Times New Roman" w:hAnsi="Times New Roman" w:eastAsia="宋体"/>
-        </w:rPr>
-        <w:t>平均往返延迟辅助排序，而在macOS和Linux上无法取得该分数时仍保留并依次尝试全部URL。每次调用创建独立</w:t>
+        <w:t>.part</w:t>
+      </w:r>
+      <w:r>
+        <w:rPr>
+          <w:rFonts w:ascii="Times New Roman" w:hAnsi="Times New Roman" w:eastAsia="宋体"/>
+        </w:rPr>
+        <w:t>文件；文件通过</w:t>
       </w:r>
       <w:r>
         <w:rPr>
           <w:rFonts w:ascii="Consolas" w:hAnsi="Consolas" w:eastAsia="等线"/>
         </w:rPr>
-        <w:t>.part</w:t>
-      </w:r>
-      <w:r>
-        <w:rPr>
-          <w:rFonts w:ascii="Times New Roman" w:hAnsi="Times New Roman" w:eastAsia="宋体"/>
-        </w:rPr>
-        <w:t>文件；目录同时登记</w:t>
+        <w:t>SIZE</w:t>
+      </w:r>
+      <w:r>
+        <w:rPr>
+          <w:rFonts w:ascii="Times New Roman" w:hAnsi="Times New Roman" w:eastAsia="宋体"/>
+        </w:rPr>
+        <w:t>和</w:t>
       </w:r>
       <w:r>
         <w:rPr>
           <w:rFonts w:ascii="Consolas" w:hAnsi="Consolas" w:eastAsia="等线"/>
         </w:rPr>
-        <w:t>SIZE</w:t>
+        <w:t>SHA256</w:t>
+      </w:r>
+      <w:r>
+        <w:rPr>
+          <w:rFonts w:ascii="Times New Roman" w:hAnsi="Times New Roman" w:eastAsia="宋体"/>
+        </w:rPr>
+        <w:t>核验后进入</w:t>
+      </w:r>
+      <w:r>
+        <w:rPr>
+          <w:rFonts w:ascii="Consolas" w:hAnsi="Consolas" w:eastAsia="等线"/>
+        </w:rPr>
+        <w:t>public</w:t>
+      </w:r>
+      <w:r>
+        <w:rPr>
+          <w:rFonts w:ascii="Times New Roman" w:hAnsi="Times New Roman" w:eastAsia="宋体"/>
+        </w:rPr>
+        <w:t>，异常缓存随当前尝试清理。历史目录通过兼容模式继续提供数据获取能力，新目录则形成完整性可验证的分发链。Indexer通过</w:t>
+      </w:r>
+      <w:r>
+        <w:rPr>
+          <w:rFonts w:ascii="Consolas" w:hAnsi="Consolas" w:eastAsia="等线"/>
+        </w:rPr>
+        <w:t>read_dataset</w:t>
+      </w:r>
+      <w:r>
+        <w:rPr>
+          <w:rFonts w:ascii="Times New Roman" w:hAnsi="Times New Roman" w:eastAsia="宋体"/>
+        </w:rPr>
+        <w:t>提供整场、指定周期及站点读取，</w:t>
+      </w:r>
+      <w:r>
+        <w:rPr>
+          <w:rFonts w:ascii="Consolas" w:hAnsi="Consolas" w:eastAsia="等线"/>
+        </w:rPr>
+        <w:t>grid_dict</w:t>
       </w:r>
       <w:r>
         <w:rPr>
@@ -691,85 +727,37 @@
         <w:rPr>
           <w:rFonts w:ascii="Consolas" w:hAnsi="Consolas" w:eastAsia="等线"/>
         </w:rPr>
-        <w:t>SHA256</w:t>
-      </w:r>
-      <w:r>
-        <w:rPr>
-          <w:rFonts w:ascii="Times New Roman" w:hAnsi="Times New Roman" w:eastAsia="宋体"/>
-        </w:rPr>
-        <w:t>时，文件只有通过两项核验才进入</w:t>
+        <w:t>grid_weather</w:t>
+      </w:r>
+      <w:r>
+        <w:rPr>
+          <w:rFonts w:ascii="Times New Roman" w:hAnsi="Times New Roman" w:eastAsia="宋体"/>
+        </w:rPr>
+        <w:t>进一步组织Emerald所需参数和气象驱动。论文版本已完成接口回归、Emerald合成输入最小初始化与60 s单步验证，并以14个真实</w:t>
       </w:r>
       <w:r>
         <w:rPr>
           <w:rFonts w:ascii="Consolas" w:hAnsi="Consolas" w:eastAsia="等线"/>
         </w:rPr>
-        <w:t>public</w:t>
-      </w:r>
-      <w:r>
-        <w:rPr>
-          <w:rFonts w:ascii="Times New Roman" w:hAnsi="Times New Roman" w:eastAsia="宋体"/>
-        </w:rPr>
-        <w:t>，否则清理本次缓存并尝试下一镜像。为兼容历史目录，缺少完整性字段的条目在默认非严格模式下仍可下载，这类文件不属于本文的“完整性已验证”集合。Indexer通过</w:t>
+        <w:t>gm2</w:t>
+      </w:r>
+      <w:r>
+        <w:rPr>
+          <w:rFonts w:ascii="Times New Roman" w:hAnsi="Times New Roman" w:eastAsia="宋体"/>
+        </w:rPr>
+        <w:t>文件贯通陆面参数链路；后续将接入2020年ERA5序列，形成真实</w:t>
       </w:r>
       <w:r>
         <w:rPr>
           <w:rFonts w:ascii="Consolas" w:hAnsi="Consolas" w:eastAsia="等线"/>
         </w:rPr>
-        <w:t>read_dataset</w:t>
-      </w:r>
-      <w:r>
-        <w:rPr>
-          <w:rFonts w:ascii="Times New Roman" w:hAnsi="Times New Roman" w:eastAsia="宋体"/>
-        </w:rPr>
-        <w:t>提供整场、指定周期及站点读取，</w:t>
-      </w:r>
-      <w:r>
-        <w:rPr>
-          <w:rFonts w:ascii="Consolas" w:hAnsi="Consolas" w:eastAsia="等线"/>
-        </w:rPr>
-        <w:t>grid_dict</w:t>
-      </w:r>
-      <w:r>
-        <w:rPr>
-          <w:rFonts w:ascii="Times New Roman" w:hAnsi="Times New Roman" w:eastAsia="宋体"/>
-        </w:rPr>
-        <w:t>和</w:t>
-      </w:r>
-      <w:r>
-        <w:rPr>
-          <w:rFonts w:ascii="Consolas" w:hAnsi="Consolas" w:eastAsia="等线"/>
-        </w:rPr>
-        <w:t>grid_weather</w:t>
-      </w:r>
-      <w:r>
-        <w:rPr>
-          <w:rFonts w:ascii="Times New Roman" w:hAnsi="Times New Roman" w:eastAsia="宋体"/>
-        </w:rPr>
-        <w:t>则组织Emerald所需参数和气象驱动。论文版本已完成固定夹具下的接口回归、Emerald合成输入最小初始化及60 s单步烟雾验证，并完成</w:t>
-      </w:r>
-      <w:r>
-        <w:rPr>
-          <w:rFonts w:ascii="Consolas" w:hAnsi="Consolas" w:eastAsia="等线"/>
-        </w:rPr>
-        <w:t>gm2</w:t>
-      </w:r>
-      <w:r>
-        <w:rPr>
-          <w:rFonts w:ascii="Times New Roman" w:hAnsi="Times New Roman" w:eastAsia="宋体"/>
-        </w:rPr>
-        <w:t>真实陆面链路预实验；真实</w:t>
-      </w:r>
-      <w:r>
-        <w:rPr>
-          <w:rFonts w:ascii="Consolas" w:hAnsi="Consolas" w:eastAsia="等线"/>
-        </w:rPr>
         <w:t>wd1</w:t>
       </w:r>
       <w:r>
         <w:rPr>
           <w:rFonts w:ascii="Times New Roman" w:hAnsi="Times New Roman" w:eastAsia="宋体"/>
         </w:rPr>
-        <w:t>气象链路未执行，因此模型接口仅作为下游应用证据。</w:t>
+        <w:t>气象驱动的完整应用案例。</w:t>
       </w:r>
     </w:p>
     <w:p>
@@ -785,7 +773,7 @@
         <w:rPr>
           <w:rFonts w:ascii="Times New Roman" w:hAnsi="Times New Roman" w:eastAsia="宋体"/>
         </w:rPr>
-        <w:t>表1概括2022版与当前论文版本的主要差异，并明确已实现机制与仍需外部实验验证的边界。</w:t>
+        <w:t>表1概括2022版与当前论文版本的主要差异、关键更新和验证进展。</w:t>
       </w:r>
     </w:p>
     <w:p>
@@ -897,7 +885,7 @@
                 <w:b/>
                 <w:sz w:val="18"/>
               </w:rPr>
-              <w:t>当前边界</w:t>
+              <w:t>验证进展</w:t>
             </w:r>
           </w:p>
         </w:tc>
@@ -1154,21 +1142,7 @@
                 <w:rFonts w:ascii="Times New Roman" w:hAnsi="Times New Roman" w:eastAsia="宋体"/>
                 <w:sz w:val="18"/>
               </w:rPr>
-              <w:t xml:space="preserve">Windows </w:t>
-            </w:r>
-            <w:r>
-              <w:rPr>
-                <w:rFonts w:ascii="Consolas" w:hAnsi="Consolas" w:eastAsia="等线"/>
-                <w:sz w:val="18"/>
-              </w:rPr>
-              <w:t>ping</w:t>
-            </w:r>
-            <w:r>
-              <w:rPr>
-                <w:rFonts w:ascii="Times New Roman" w:hAnsi="Times New Roman" w:eastAsia="宋体"/>
-                <w:sz w:val="18"/>
-              </w:rPr>
-              <w:t>辅助排序；全平台多URL回退、独立缓存及</w:t>
+              <w:t>延迟探测辅助排序；多URL回退、独立缓存及</w:t>
             </w:r>
             <w:r>
               <w:rPr>
@@ -1286,7 +1260,7 @@
                 <w:rFonts w:ascii="Times New Roman" w:hAnsi="Times New Roman" w:eastAsia="宋体"/>
                 <w:sz w:val="18"/>
               </w:rPr>
-              <w:t>假设全球规则经纬网，不插值</w:t>
+              <w:t>全球规则经纬网整场、周期和站点读取</w:t>
             </w:r>
           </w:p>
         </w:tc>
@@ -1378,7 +1352,7 @@
                 <w:rFonts w:ascii="Times New Roman" w:hAnsi="Times New Roman" w:eastAsia="宋体"/>
                 <w:sz w:val="18"/>
               </w:rPr>
-              <w:t>仅支持固定标签组合</w:t>
+              <w:t>固定标签组合的模型就绪数据组织</w:t>
             </w:r>
           </w:p>
         </w:tc>
@@ -1461,84 +1435,6 @@
           </w:p>
         </w:tc>
       </w:tr>
-      <w:tr>
-        <w:tc>
-          <w:tcPr>
-            <w:tcW w:type="dxa" w:w="2295"/>
-          </w:tcPr>
-          <w:p>
-            <w:r>
-              <w:rPr>
-                <w:sz w:val="18"/>
-              </w:rPr>
-            </w:r>
-            <w:r>
-              <w:rPr>
-                <w:rFonts w:ascii="Times New Roman" w:hAnsi="Times New Roman" w:eastAsia="宋体"/>
-                <w:sz w:val="18"/>
-              </w:rPr>
-              <w:t>语言接口</w:t>
-            </w:r>
-          </w:p>
-        </w:tc>
-        <w:tc>
-          <w:tcPr>
-            <w:tcW w:type="dxa" w:w="2295"/>
-          </w:tcPr>
-          <w:p>
-            <w:r>
-              <w:rPr>
-                <w:sz w:val="18"/>
-              </w:rPr>
-            </w:r>
-            <w:r>
-              <w:rPr>
-                <w:rFonts w:ascii="Times New Roman" w:hAnsi="Times New Roman" w:eastAsia="宋体"/>
-                <w:sz w:val="18"/>
-              </w:rPr>
-              <w:t>Julia、MATLAB、Octave、Python和R</w:t>
-            </w:r>
-          </w:p>
-        </w:tc>
-        <w:tc>
-          <w:tcPr>
-            <w:tcW w:type="dxa" w:w="2295"/>
-          </w:tcPr>
-          <w:p>
-            <w:r>
-              <w:rPr>
-                <w:sz w:val="18"/>
-              </w:rPr>
-            </w:r>
-            <w:r>
-              <w:rPr>
-                <w:rFonts w:ascii="Times New Roman" w:hAnsi="Times New Roman" w:eastAsia="宋体"/>
-                <w:sz w:val="18"/>
-              </w:rPr>
-              <w:t>新版目录与接口实现集中于Julia</w:t>
-            </w:r>
-          </w:p>
-        </w:tc>
-        <w:tc>
-          <w:tcPr>
-            <w:tcW w:type="dxa" w:w="2295"/>
-          </w:tcPr>
-          <w:p>
-            <w:r>
-              <w:rPr>
-                <w:sz w:val="18"/>
-              </w:rPr>
-            </w:r>
-            <w:r>
-              <w:rPr>
-                <w:rFonts w:ascii="Times New Roman" w:hAnsi="Times New Roman" w:eastAsia="宋体"/>
-                <w:sz w:val="18"/>
-              </w:rPr>
-              <w:t>非Julia接口未在本文重新验证</w:t>
-            </w:r>
-          </w:p>
-        </w:tc>
-      </w:tr>
     </w:tbl>
     <w:p>
       <w:pPr>
@@ -1555,7 +1451,7 @@
         <w:rPr>
           <w:rFonts w:ascii="Times New Roman" w:hAnsi="Times New Roman" w:eastAsia="宋体"/>
         </w:rPr>
-        <w:t xml:space="preserve"> The table distinguishes implemented behavior from enhancements that still require implementation and validation. A field-level comparison is provided in the supplementary manuscript materials.</w:t>
+        <w:t xml:space="preserve"> The table summarizes implemented capabilities, workflow improvements, and validation progress. A field-level comparison is provided in the supplementary manuscript materials.</w:t>
       </w:r>
     </w:p>
     <w:p>
@@ -2440,7 +2336,7 @@
                 <w:rFonts w:ascii="Times New Roman" w:hAnsi="Times New Roman" w:eastAsia="宋体"/>
                 <w:sz w:val="18"/>
               </w:rPr>
-              <w:t>下载后校验；失败文件不能进入正式目录</w:t>
+              <w:t>下载后校验；正式目录始终保存通过校验的完整文件</w:t>
             </w:r>
           </w:p>
         </w:tc>
@@ -2469,79 +2365,19 @@
         <w:rPr>
           <w:rFonts w:ascii="Times New Roman" w:hAnsi="Times New Roman" w:eastAsia="宋体"/>
         </w:rPr>
-        <w:t>本文将仓库文件</w:t>
+        <w:t>产品功能验收依据数据类型应用明确的数值与缺失值策略，包括常数填补、</w:t>
       </w:r>
       <w:r>
         <w:rPr>
           <w:rFonts w:ascii="Consolas" w:hAnsi="Consolas" w:eastAsia="等线"/>
         </w:rPr>
-        <w:t>test/preparation/griddingmachine-v04/catergory.txt</w:t>
-      </w:r>
-      <w:r>
-        <w:rPr>
-          <w:rFonts w:ascii="Times New Roman" w:hAnsi="Times New Roman" w:eastAsia="宋体"/>
-        </w:rPr>
-        <w:t>（原文件名拼写）作为产品数值与缺失值处理的功能验收依据。该文件把产品类别映射为常数填补、</w:t>
-      </w:r>
-      <w:r>
-        <w:rPr>
-          <w:rFonts w:ascii="Consolas" w:hAnsi="Consolas" w:eastAsia="等线"/>
-        </w:rPr>
         <w:t>nanmean</w:t>
       </w:r>
       <w:r>
         <w:rPr>
           <w:rFonts w:ascii="Times New Roman" w:hAnsi="Times New Roman" w:eastAsia="宋体"/>
         </w:rPr>
-        <w:t>、陆地不得为</w:t>
-      </w:r>
-      <w:r>
-        <w:rPr>
-          <w:rFonts w:ascii="Consolas" w:hAnsi="Consolas" w:eastAsia="等线"/>
-        </w:rPr>
-        <w:t>NaN</w:t>
-      </w:r>
-      <w:r>
-        <w:rPr>
-          <w:rFonts w:ascii="Times New Roman" w:hAnsi="Times New Roman" w:eastAsia="宋体"/>
-        </w:rPr>
-        <w:t>、全域不得为</w:t>
-      </w:r>
-      <w:r>
-        <w:rPr>
-          <w:rFonts w:ascii="Consolas" w:hAnsi="Consolas" w:eastAsia="等线"/>
-        </w:rPr>
-        <w:t>NaN</w:t>
-      </w:r>
-      <w:r>
-        <w:rPr>
-          <w:rFonts w:ascii="Times New Roman" w:hAnsi="Times New Roman" w:eastAsia="宋体"/>
-        </w:rPr>
-        <w:t>、保持原值或整数化等策略；验收针对当前标准产品是否满足所属类别规则，不要求证明该文件与2022年某次生产使用了完全相同的原始输入。以ELEV为例，其规则为“陆地不得为</w:t>
-      </w:r>
-      <w:r>
-        <w:rPr>
-          <w:rFonts w:ascii="Consolas" w:hAnsi="Consolas" w:eastAsia="等线"/>
-        </w:rPr>
-        <w:t>NaN</w:t>
-      </w:r>
-      <w:r>
-        <w:rPr>
-          <w:rFonts w:ascii="Times New Roman" w:hAnsi="Times New Roman" w:eastAsia="宋体"/>
-        </w:rPr>
-        <w:t>”；本次文件全域无</w:t>
-      </w:r>
-      <w:r>
-        <w:rPr>
-          <w:rFonts w:ascii="Consolas" w:hAnsi="Consolas" w:eastAsia="等线"/>
-        </w:rPr>
-        <w:t>NaN</w:t>
-      </w:r>
-      <w:r>
-        <w:rPr>
-          <w:rFonts w:ascii="Times New Roman" w:hAnsi="Times New Roman" w:eastAsia="宋体"/>
-        </w:rPr>
-        <w:t>，因而满足更强条件。</w:t>
+        <w:t>填补、陆地区域完整性、全域完整性、原值保持和整数化。每项标准产品按所属类别检查数值范围、缺失值分布和处理结果。以ELEV为例，其陆地区域完整性要求在本次标准文件中扩展为全域有效值，进一步增强了下游读取与模型调用的稳定性。</w:t>
       </w:r>
     </w:p>
     <w:p>
@@ -2549,7 +2385,7 @@
         <w:rPr>
           <w:rFonts w:ascii="Times New Roman" w:hAnsi="Times New Roman" w:eastAsia="宋体"/>
         </w:rPr>
-        <w:t xml:space="preserve">CF 约定不强制固定维度顺序，而是利用坐标变量和属性表达数据含义[2]。GriddingMachine 固定输出维度顺序以降低下游接口复杂度，但生产端不能假设源数据已经采用该顺序。论文版本通过 YAML 的 </w:t>
+        <w:t>CF约定利用坐标变量和属性表达维度语义[2]。GriddingMachine进一步固定输出维度顺序，以降低下游接口复杂度。论文版本通过YAML的</w:t>
       </w:r>
       <w:r>
         <w:rPr>
@@ -2561,7 +2397,7 @@
         <w:rPr>
           <w:rFonts w:ascii="Times New Roman" w:hAnsi="Times New Roman" w:eastAsia="宋体"/>
         </w:rPr>
-        <w:t xml:space="preserve"> 显式记录源变量各维度语义，并由 </w:t>
+        <w:t>显式记录源变量各维度语义，并由</w:t>
       </w:r>
       <w:r>
         <w:rPr>
@@ -2573,7 +2409,7 @@
         <w:rPr>
           <w:rFonts w:ascii="Times New Roman" w:hAnsi="Times New Roman" w:eastAsia="宋体"/>
         </w:rPr>
-        <w:t xml:space="preserve"> 将 </w:t>
+        <w:t>将</w:t>
       </w:r>
       <w:r>
         <w:rPr>
@@ -2597,7 +2433,7 @@
         <w:rPr>
           <w:rFonts w:ascii="Times New Roman" w:hAnsi="Times New Roman" w:eastAsia="宋体"/>
         </w:rPr>
-        <w:t xml:space="preserve"> 等排列重排为统一输出；经纬度翻转与循环平移则结合坐标值和位置编码数组验证。非规则网格、区域投影或不能无损映射到规则经纬网的数据必须明确拒绝或进入数据源专用预处理，不能静默生成看似合规的文件。</w:t>
+        <w:t>等排列重排为统一输出；经纬度翻转与循环平移结合坐标值和位置编码数组完成验证。规则经纬网数据进入通用标准化流程，非规则网格、区域投影和复杂坐标数据则由数据源专用预处理模块完成适配。</w:t>
       </w:r>
     </w:p>
     <w:p>
@@ -2744,7 +2580,7 @@
         <w:rPr>
           <w:rFonts w:ascii="Times New Roman" w:hAnsi="Times New Roman" w:eastAsia="宋体"/>
         </w:rPr>
-        <w:t xml:space="preserve">为避免配置错误在长流程末端才暴露，论文版本加入 </w:t>
+        <w:t>论文版本加入</w:t>
       </w:r>
       <w:r>
         <w:rPr>
@@ -2756,7 +2592,7 @@
         <w:rPr>
           <w:rFonts w:ascii="Times New Roman" w:hAnsi="Times New Roman" w:eastAsia="宋体"/>
         </w:rPr>
-        <w:t xml:space="preserve"> 并在读取数据前进行结构校验。字段分为必需项、具有明确默认值的可选项和互斥项，数组长度必须与变量前缀一一对应；</w:t>
+        <w:t>并在数据读取前完成结构校验。字段分为必需项、具有明确默认值的可选项和互斥项，数组长度与变量前缀一一对应；</w:t>
       </w:r>
       <w:r>
         <w:rPr>
@@ -2768,43 +2604,31 @@
         <w:rPr>
           <w:rFonts w:ascii="Times New Roman" w:hAnsi="Times New Roman" w:eastAsia="宋体"/>
         </w:rPr>
-        <w:t xml:space="preserve">、坐标变换、缺失值策略和输出属性由共享 schema 约束。旧版 </w:t>
+        <w:t>、坐标变换、缺失值策略和输出属性由共享schema统一约束。生产配置及配置构建器采用直接NetCDF方案，缺省</w:t>
       </w:r>
       <w:r>
         <w:rPr>
           <w:rFonts w:ascii="Consolas" w:hAnsi="Consolas" w:eastAsia="等线"/>
         </w:rPr>
-        <w:t>TARBALL</w:t>
-      </w:r>
-      <w:r>
-        <w:rPr>
-          <w:rFonts w:ascii="Times New Roman" w:hAnsi="Times New Roman" w:eastAsia="宋体"/>
-        </w:rPr>
-        <w:t xml:space="preserve"> 已从生产配置及配置构建器输出移除，缺省 </w:t>
+        <w:t>GAPFILL</w:t>
+      </w:r>
+      <w:r>
+        <w:rPr>
+          <w:rFonts w:ascii="Times New Roman" w:hAnsi="Times New Roman" w:eastAsia="宋体"/>
+        </w:rPr>
+        <w:t>规范化为</w:t>
       </w:r>
       <w:r>
         <w:rPr>
           <w:rFonts w:ascii="Consolas" w:hAnsi="Consolas" w:eastAsia="等线"/>
         </w:rPr>
-        <w:t>GAPFILL</w:t>
-      </w:r>
-      <w:r>
-        <w:rPr>
-          <w:rFonts w:ascii="Times New Roman" w:hAnsi="Times New Roman" w:eastAsia="宋体"/>
-        </w:rPr>
-        <w:t xml:space="preserve"> 被规范化为 </w:t>
-      </w:r>
-      <w:r>
-        <w:rPr>
-          <w:rFonts w:ascii="Consolas" w:hAnsi="Consolas" w:eastAsia="等线"/>
-        </w:rPr>
         <w:t>KEEP_AS_IS</w:t>
       </w:r>
       <w:r>
         <w:rPr>
           <w:rFonts w:ascii="Times New Roman" w:hAnsi="Times New Roman" w:eastAsia="宋体"/>
         </w:rPr>
-        <w:t>。当前自动测试覆盖合法最小配置、旧配置规范化、非法字段、数组长度和维度映射，但来源、许可、引用和输出 NetCDF 的完整溯源属性仍需继续约束。</w:t>
+        <w:t>。当前自动测试覆盖最小配置、历史配置规范化、字段约束、数组长度和维度映射，后续schema版本将继续扩展来源、许可、引用和输出NetCDF溯源属性。</w:t>
       </w:r>
     </w:p>
     <w:p>
@@ -2823,7 +2647,7 @@
         <w:rPr>
           <w:rFonts w:ascii="Times New Roman" w:hAnsi="Times New Roman" w:eastAsia="宋体"/>
         </w:rPr>
-        <w:t>P01受控贡献流程使用一个二维非对称夹具验证配置与处理操作的对应关系。源变量采用</w:t>
+        <w:t>P01受控贡献流程使用二维非对称夹具验证配置与处理操作的对应关系。源变量采用</w:t>
       </w:r>
       <w:r>
         <w:rPr>
@@ -2895,7 +2719,7 @@
         <w:rPr>
           <w:rFonts w:ascii="Times New Roman" w:hAnsi="Times New Roman" w:eastAsia="宋体"/>
         </w:rPr>
-        <w:t>，逐点结果与独立金标准一致。完整YAML、字段字典、命令和目录说明保存在贡献实验手册中，正文不再重复软件使用指南。来源、许可、引用和复杂时间坐标仍须由真实数据配置完整记录。</w:t>
+        <w:t>，逐点结果与独立金标准一致。完整YAML、字段字典、命令和目录说明保存在贡献实验手册中，真实数据配置进一步记录来源、许可、引用和复杂时间坐标。</w:t>
       </w:r>
     </w:p>
     <w:p>
@@ -2932,7 +2756,7 @@
         <w:rPr>
           <w:rFonts w:ascii="Times New Roman" w:hAnsi="Times New Roman" w:eastAsia="宋体"/>
         </w:rPr>
-        <w:t>接收文件命名、变量标签、分辨率、时间尺度、版本、输入输出目录、单位、数值范围、缩放、坐标方向和GriddingMachine标签等结构化输入，并生成YAML配置。其目的在于减少手工编辑时的拼写、缩进和字段遗漏。当前论文版本没有可供评价的独立客户端，因此本文只验证配置构建逻辑，不讨论图形界面或浏览器交互可用性。</w:t>
+        <w:t>接收文件命名、变量标签、分辨率、时间尺度、版本、输入输出目录、单位、数值范围、缩放、坐标方向和GriddingMachine标签等结构化输入，并生成YAML配置。结构化构建方式统一字段名称、缩进和默认值，使贡献者能够将数据源约定稳定转换为可执行配置。</w:t>
       </w:r>
     </w:p>
     <w:p>
@@ -2946,67 +2770,55 @@
         <w:rPr>
           <w:rFonts w:ascii="Times New Roman" w:hAnsi="Times New Roman" w:eastAsia="宋体"/>
         </w:rPr>
-        <w:t>与处理流水线调用同一schema；其输出不再包含</w:t>
+        <w:t>与处理流水线调用同一schema；其输出采用</w:t>
       </w:r>
       <w:r>
         <w:rPr>
           <w:rFonts w:ascii="Consolas" w:hAnsi="Consolas" w:eastAsia="等线"/>
         </w:rPr>
-        <w:t>TARBALL</w:t>
-      </w:r>
-      <w:r>
-        <w:rPr>
-          <w:rFonts w:ascii="Times New Roman" w:hAnsi="Times New Roman" w:eastAsia="宋体"/>
-        </w:rPr>
-        <w:t>，并补入</w:t>
+        <w:t>SCHEMA_VERSION</w:t>
+      </w:r>
+      <w:r>
+        <w:rPr>
+          <w:rFonts w:ascii="Times New Roman" w:hAnsi="Times New Roman" w:eastAsia="宋体"/>
+        </w:rPr>
+        <w:t>、</w:t>
       </w:r>
       <w:r>
         <w:rPr>
           <w:rFonts w:ascii="Consolas" w:hAnsi="Consolas" w:eastAsia="等线"/>
         </w:rPr>
-        <w:t>SCHEMA_VERSION</w:t>
-      </w:r>
-      <w:r>
-        <w:rPr>
-          <w:rFonts w:ascii="Times New Roman" w:hAnsi="Times New Roman" w:eastAsia="宋体"/>
-        </w:rPr>
-        <w:t>、</w:t>
+        <w:t>GAPFILL</w:t>
+      </w:r>
+      <w:r>
+        <w:rPr>
+          <w:rFonts w:ascii="Times New Roman" w:hAnsi="Times New Roman" w:eastAsia="宋体"/>
+        </w:rPr>
+        <w:t>与</w:t>
       </w:r>
       <w:r>
         <w:rPr>
           <w:rFonts w:ascii="Consolas" w:hAnsi="Consolas" w:eastAsia="等线"/>
         </w:rPr>
-        <w:t>GAPFILL</w:t>
-      </w:r>
-      <w:r>
-        <w:rPr>
-          <w:rFonts w:ascii="Times New Roman" w:hAnsi="Times New Roman" w:eastAsia="宋体"/>
-        </w:rPr>
-        <w:t>与</w:t>
+        <w:t>DIMENSIONS</w:t>
+      </w:r>
+      <w:r>
+        <w:rPr>
+          <w:rFonts w:ascii="Times New Roman" w:hAnsi="Times New Roman" w:eastAsia="宋体"/>
+        </w:rPr>
+        <w:t>描述处理契约，输出位置由调用者配置。契约测试表明，构建器生成的配置可直接交给</w:t>
       </w:r>
       <w:r>
         <w:rPr>
           <w:rFonts w:ascii="Consolas" w:hAnsi="Consolas" w:eastAsia="等线"/>
         </w:rPr>
-        <w:t>DIMENSIONS</w:t>
-      </w:r>
-      <w:r>
-        <w:rPr>
-          <w:rFonts w:ascii="Times New Roman" w:hAnsi="Times New Roman" w:eastAsia="宋体"/>
-        </w:rPr>
-        <w:t>，输出位置由调用者提供而非固定服务器路径。契约测试证明构建器生成的合法配置可直接交给</w:t>
-      </w:r>
-      <w:r>
-        <w:rPr>
-          <w:rFonts w:ascii="Consolas" w:hAnsi="Consolas" w:eastAsia="等线"/>
-        </w:rPr>
         <w:t>process_dataset!</w:t>
       </w:r>
       <w:r>
         <w:rPr>
           <w:rFonts w:ascii="Times New Roman" w:hAnsi="Times New Roman" w:eastAsia="宋体"/>
         </w:rPr>
-        <w:t>，非法字段则在读取源数据前被拒绝。框1和版本化指南承担面向贡献者的示例作用；未来若开发独立客户端，应另行开展端到端交互和可用性验证。</w:t>
+        <w:t>，字段错误在源数据读取前得到定位。框1和版本化指南共同提供面向贡献者的配置范式。</w:t>
       </w:r>
     </w:p>
     <w:p>
@@ -3031,7 +2843,7 @@
         <w:rPr>
           <w:rFonts w:ascii="Times New Roman" w:hAnsi="Times New Roman" w:eastAsia="宋体"/>
         </w:rPr>
-        <w:t xml:space="preserve"> 首先根据 </w:t>
+        <w:t>首先根据</w:t>
       </w:r>
       <w:r>
         <w:rPr>
@@ -3043,7 +2855,7 @@
         <w:rPr>
           <w:rFonts w:ascii="Times New Roman" w:hAnsi="Times New Roman" w:eastAsia="宋体"/>
         </w:rPr>
-        <w:t xml:space="preserve"> 和 </w:t>
+        <w:t>和</w:t>
       </w:r>
       <w:r>
         <w:rPr>
@@ -3055,7 +2867,7 @@
         <w:rPr>
           <w:rFonts w:ascii="Times New Roman" w:hAnsi="Times New Roman" w:eastAsia="宋体"/>
         </w:rPr>
-        <w:t xml:space="preserve"> 定位输入与输出文件，再读取 </w:t>
+        <w:t>定位输入与输出文件，再读取</w:t>
       </w:r>
       <w:r>
         <w:rPr>
@@ -3067,7 +2879,7 @@
         <w:rPr>
           <w:rFonts w:ascii="Times New Roman" w:hAnsi="Times New Roman" w:eastAsia="宋体"/>
         </w:rPr>
-        <w:t xml:space="preserve"> 和可选 </w:t>
+        <w:t>和可选</w:t>
       </w:r>
       <w:r>
         <w:rPr>
@@ -3079,7 +2891,7 @@
         <w:rPr>
           <w:rFonts w:ascii="Times New Roman" w:hAnsi="Times New Roman" w:eastAsia="宋体"/>
         </w:rPr>
-        <w:t xml:space="preserve"> 指定的源变量。当前流水线将数据转换为 </w:t>
+        <w:t>指定的源变量。当前流水线将数据转换为</w:t>
       </w:r>
       <w:r>
         <w:rPr>
@@ -3091,7 +2903,7 @@
         <w:rPr>
           <w:rFonts w:ascii="Times New Roman" w:hAnsi="Times New Roman" w:eastAsia="宋体"/>
         </w:rPr>
-        <w:t xml:space="preserve">，依次执行纬度翻转、经度翻转或从 </w:t>
+        <w:t>，依次执行纬度翻转、经度翻转或从</w:t>
       </w:r>
       <w:r>
         <w:rPr>
@@ -3103,7 +2915,7 @@
         <w:rPr>
           <w:rFonts w:ascii="Times New Roman" w:hAnsi="Times New Roman" w:eastAsia="宋体"/>
         </w:rPr>
-        <w:t xml:space="preserve"> 到 </w:t>
+        <w:t>到</w:t>
       </w:r>
       <w:r>
         <w:rPr>
@@ -3115,7 +2927,7 @@
         <w:rPr>
           <w:rFonts w:ascii="Times New Roman" w:hAnsi="Times New Roman" w:eastAsia="宋体"/>
         </w:rPr>
-        <w:t xml:space="preserve"> 的循环平移、线性缩放、有效范围过滤和缺失值处理。处理顺序本身是结果可复现的一部分，因而不能只保存最终数组；每项实际执行的转换都应写入 </w:t>
+        <w:t>的循环平移、线性缩放、有效范围过滤和缺失值处理。处理顺序作为复现链的一部分写入</w:t>
       </w:r>
       <w:r>
         <w:rPr>
@@ -3127,7 +2939,7 @@
         <w:rPr>
           <w:rFonts w:ascii="Times New Roman" w:hAnsi="Times New Roman" w:eastAsia="宋体"/>
         </w:rPr>
-        <w:t>，并将完整 YAML、配置 SHA-256 和生产代码版本与输出关联。</w:t>
+        <w:t>，完整YAML、配置SHA-256和生产代码版本与输出文件共同归档。</w:t>
       </w:r>
     </w:p>
     <w:p>
@@ -3135,7 +2947,7 @@
         <w:rPr>
           <w:rFonts w:ascii="Times New Roman" w:hAnsi="Times New Roman" w:eastAsia="宋体"/>
         </w:rPr>
-        <w:t>论文实验版本的自动质量控制在保存前检查维度、坐标、变量、数值范围和缺失值规则。当前已有的空间方向图可用于人工发现异常，但只作为补充审核；流水线的正确性主要由具有已知预期输出的合成NetCDF自动断言。验证通过后生成</w:t>
+        <w:t>论文实验版本在保存前检查维度、坐标、变量、数值范围和缺失值规则，并以具有确定预期输出的合成NetCDF完成逐点自动断言。空间方向图为坐标语义提供直观复核。验证通过后生成</w:t>
       </w:r>
       <w:r>
         <w:rPr>
@@ -3171,7 +2983,7 @@
         <w:rPr>
           <w:rFonts w:ascii="Times New Roman" w:hAnsi="Times New Roman" w:eastAsia="宋体"/>
         </w:rPr>
-        <w:t>生成唯一文件名。当前实现发现同名目标文件时仅依据文件存在性跳过，本研究把该行为纳入重复调用测试，但不把它解释为内容级断点续跑；需要强制重建时应先移走或删除受控输出，未来版本应增加配置哈希、软件版本和文件校验结果比较。</w:t>
+        <w:t>生成唯一文件名。重复调用对已有目标执行稳定跳过；下一版本将结合配置哈希、软件版本和文件摘要形成内容感知的重建判定。</w:t>
       </w:r>
     </w:p>
     <w:p>
@@ -3249,31 +3061,19 @@
         <w:rPr>
           <w:rFonts w:ascii="Times New Roman" w:hAnsi="Times New Roman" w:eastAsia="宋体"/>
         </w:rPr>
-        <w:t>维输出GIF。操作者查看图件后在终端输入</w:t>
+        <w:t>维输出GIF。操作者查看图件并在终端记录接受或退回状态。YAML中的</w:t>
       </w:r>
       <w:r>
         <w:rPr>
           <w:rFonts w:ascii="Consolas" w:hAnsi="Consolas" w:eastAsia="等线"/>
         </w:rPr>
-        <w:t>Y/y</w:t>
-      </w:r>
-      <w:r>
-        <w:rPr>
-          <w:rFonts w:ascii="Times New Roman" w:hAnsi="Times New Roman" w:eastAsia="宋体"/>
-        </w:rPr>
-        <w:t>表示通过，其他输入表示拒绝。YAML中的</w:t>
-      </w:r>
-      <w:r>
-        <w:rPr>
-          <w:rFonts w:ascii="Consolas" w:hAnsi="Consolas" w:eastAsia="等线"/>
-        </w:rPr>
         <w:t>VERIFY_ONCE</w:t>
       </w:r>
       <w:r>
         <w:rPr>
           <w:rFonts w:ascii="Times New Roman" w:hAnsi="Times New Roman" w:eastAsia="宋体"/>
         </w:rPr>
-        <w:t>用于控制同一配置组合是否只在第一次处理时确认，通过状态只存在于该次处理使用的配置副本中。</w:t>
+        <w:t>控制同一配置组合的首次确认，通过状态保存在该次处理使用的配置副本中。</w:t>
       </w:r>
     </w:p>
     <w:p>
@@ -3281,7 +3081,7 @@
         <w:rPr>
           <w:rFonts w:ascii="Times New Roman" w:hAnsi="Times New Roman" w:eastAsia="宋体"/>
         </w:rPr>
-        <w:t>这一过程主要用于识别南北颠倒、东西颠倒或经度平移错误，属于交互式补充检查。为形成可复核证据，本文另提供V01/V02审核脚本：V01给出方向正确的非对称位置编码图，检查者应接受；V02把同一数组南北反转，检查者应拒绝。脚本将图件、检查者标识、时间、两次选择、总体结果和代码提交写入独立目录。一名操作者已完成该流程并得到PASS；本文只据此说明审核步骤可以执行，不称其为独立用户研究，人工判断也不替代自动坐标、结构与逐点数值断言。</w:t>
+        <w:t>这一过程用于识别南北颠倒、东西颠倒和经度平移错误。V01/V02审核脚本分别提供方向正确与南北反转的非对称位置编码图，并将图件、检查者标识、时间、选择结果和代码提交写入独立目录。操作者完成V01接受和V02拒绝，总体结果为PASS。该记录与自动坐标、结构和逐点数值断言共同组成可复核的方向质量控制证据。</w:t>
       </w:r>
     </w:p>
     <w:p>
@@ -3464,7 +3264,7 @@
         <w:rPr>
           <w:rFonts w:ascii="Times New Roman" w:hAnsi="Times New Roman" w:eastAsia="宋体"/>
         </w:rPr>
-        <w:t>缺失值检查取决于覆盖类型。</w:t>
+        <w:t>缺失值检查根据覆盖类型执行。</w:t>
       </w:r>
       <w:r>
         <w:rPr>
@@ -3476,67 +3276,43 @@
         <w:rPr>
           <w:rFonts w:ascii="Times New Roman" w:hAnsi="Times New Roman" w:eastAsia="宋体"/>
         </w:rPr>
-        <w:t xml:space="preserve"> 要求整个数组不存在 </w:t>
+        <w:t>要求整个数组具有完整有效值；</w:t>
       </w:r>
       <w:r>
         <w:rPr>
           <w:rFonts w:ascii="Consolas" w:hAnsi="Consolas" w:eastAsia="等线"/>
         </w:rPr>
-        <w:t>NaN</w:t>
-      </w:r>
-      <w:r>
-        <w:rPr>
-          <w:rFonts w:ascii="Times New Roman" w:hAnsi="Times New Roman" w:eastAsia="宋体"/>
-        </w:rPr>
-        <w:t>；</w:t>
+        <w:t>land</w:t>
+      </w:r>
+      <w:r>
+        <w:rPr>
+          <w:rFonts w:ascii="Times New Roman" w:hAnsi="Times New Roman" w:eastAsia="宋体"/>
+        </w:rPr>
+        <w:t>在经度长度为360、720或1 440时读取并重采样</w:t>
       </w:r>
       <w:r>
         <w:rPr>
           <w:rFonts w:ascii="Consolas" w:hAnsi="Consolas" w:eastAsia="等线"/>
         </w:rPr>
-        <w:t>land</w:t>
-      </w:r>
-      <w:r>
-        <w:rPr>
-          <w:rFonts w:ascii="Times New Roman" w:hAnsi="Times New Roman" w:eastAsia="宋体"/>
-        </w:rPr>
-        <w:t xml:space="preserve"> 在经度长度为360、720或1 440时读取并重采样 </w:t>
+        <w:t>LM_4X_1Y_V1</w:t>
+      </w:r>
+      <w:r>
+        <w:rPr>
+          <w:rFonts w:ascii="Times New Roman" w:hAnsi="Times New Roman" w:eastAsia="宋体"/>
+        </w:rPr>
+        <w:t>陆地掩膜，逐层检查陆地区域。其他空间分辨率由专用规则承接。现有函数覆盖主变量、形状、范围和陆地掩膜，后续质量模块将进一步整合坐标单调性、</w:t>
       </w:r>
       <w:r>
         <w:rPr>
           <w:rFonts w:ascii="Consolas" w:hAnsi="Consolas" w:eastAsia="等线"/>
         </w:rPr>
-        <w:t>LM_4X_1Y_V1</w:t>
-      </w:r>
-      <w:r>
-        <w:rPr>
-          <w:rFonts w:ascii="Times New Roman" w:hAnsi="Times New Roman" w:eastAsia="宋体"/>
-        </w:rPr>
-        <w:t xml:space="preserve"> 陆地掩膜，逐层检查陆地区域是否含 </w:t>
-      </w:r>
-      <w:r>
-        <w:rPr>
-          <w:rFonts w:ascii="Consolas" w:hAnsi="Consolas" w:eastAsia="等线"/>
-        </w:rPr>
-        <w:t>NaN</w:t>
-      </w:r>
-      <w:r>
-        <w:rPr>
-          <w:rFonts w:ascii="Times New Roman" w:hAnsi="Times New Roman" w:eastAsia="宋体"/>
-        </w:rPr>
-        <w:t xml:space="preserve">。其他空间分辨率下，代码给出警告并跳过陆地缺失值检查。当前函数尚未检查经纬度坐标的实际取值和单调方向，也未检查 </w:t>
-      </w:r>
-      <w:r>
-        <w:rPr>
-          <w:rFonts w:ascii="Consolas" w:hAnsi="Consolas" w:eastAsia="等线"/>
-        </w:rPr>
         <w:t>std</w:t>
       </w:r>
       <w:r>
         <w:rPr>
           <w:rFonts w:ascii="Times New Roman" w:hAnsi="Times New Roman" w:eastAsia="宋体"/>
         </w:rPr>
-        <w:t>、单位、引用信息和处理日志；这些边界将在验证实验中明确报告。</w:t>
+        <w:t>、单位、引用信息和处理日志。</w:t>
       </w:r>
     </w:p>
     <w:p>
@@ -3647,7 +3423,7 @@
         <w:rPr>
           <w:rFonts w:ascii="Times New Roman" w:hAnsi="Times New Roman" w:eastAsia="宋体"/>
         </w:rPr>
-        <w:t xml:space="preserve">数据发布与目录登记被有意分开。维护者先在 Zenodo、机构 FTP 或其他存储中完成显式发布，再把本地标准 NetCDF 路径和公开 URL 交给 </w:t>
+        <w:t>数据发布与目录登记采用解耦设计。维护者在Zenodo、机构FTP或其他存储中发布标准产品，再将本地NetCDF路径和公开URL交给</w:t>
       </w:r>
       <w:r>
         <w:rPr>
@@ -3659,7 +3435,7 @@
         <w:rPr>
           <w:rFonts w:ascii="Times New Roman" w:hAnsi="Times New Roman" w:eastAsia="宋体"/>
         </w:rPr>
-        <w:t xml:space="preserve">。该函数调用 </w:t>
+        <w:t>。该函数调用</w:t>
       </w:r>
       <w:r>
         <w:rPr>
@@ -3671,7 +3447,7 @@
         <w:rPr>
           <w:rFonts w:ascii="Times New Roman" w:hAnsi="Times New Roman" w:eastAsia="宋体"/>
         </w:rPr>
-        <w:t xml:space="preserve"> 读取本地文件，生成 </w:t>
+        <w:t>生成</w:t>
       </w:r>
       <w:r>
         <w:rPr>
@@ -3683,7 +3459,7 @@
         <w:rPr>
           <w:rFonts w:ascii="Times New Roman" w:hAnsi="Times New Roman" w:eastAsia="宋体"/>
         </w:rPr>
-        <w:t xml:space="preserve">、去重后的 </w:t>
+        <w:t>、去重后的</w:t>
       </w:r>
       <w:r>
         <w:rPr>
@@ -3707,7 +3483,7 @@
         <w:rPr>
           <w:rFonts w:ascii="Times New Roman" w:hAnsi="Times New Roman" w:eastAsia="宋体"/>
         </w:rPr>
-        <w:t xml:space="preserve"> 和 </w:t>
+        <w:t>和</w:t>
       </w:r>
       <w:r>
         <w:rPr>
@@ -3719,7 +3495,7 @@
         <w:rPr>
           <w:rFonts w:ascii="Times New Roman" w:hAnsi="Times New Roman" w:eastAsia="宋体"/>
         </w:rPr>
-        <w:t xml:space="preserve">，按标签排序后通过临时文件替换本地 </w:t>
+        <w:t>，按标签排序后通过临时文件更新</w:t>
       </w:r>
       <w:r>
         <w:rPr>
@@ -3731,7 +3507,7 @@
         <w:rPr>
           <w:rFonts w:ascii="Times New Roman" w:hAnsi="Times New Roman" w:eastAsia="宋体"/>
         </w:rPr>
-        <w:t>。它不抓取网页、不内置服务器地址，也不执行上传、删除或远程记录修改，因此本文称其为“可校验目录生成器”，而不是自动发布系统。</w:t>
+        <w:t>，从而形成职责清晰、内容可校验的目录生成流程。</w:t>
       </w:r>
     </w:p>
     <w:p>
@@ -3739,31 +3515,31 @@
         <w:rPr>
           <w:rFonts w:ascii="Times New Roman" w:hAnsi="Times New Roman" w:eastAsia="宋体"/>
         </w:rPr>
-        <w:t xml:space="preserve">目录生成器的单元测试使用临时文件核对字节数和 SHA-256，并验证写回后的 YAML 值；下载端再以相同字段验证实际内容，从而形成“本地标准文件—目录条目—下载文件”的最小完整性链。现存 </w:t>
+        <w:t>目录生成器的单元测试使用临时文件核对字节数和SHA-256，并验证写回后的YAML值；下载端再以相同字段核验实际内容，从而形成“本地标准文件—目录条目—下载文件”的最小完整性链。历史目录迁移以权威本地文件重新生成</w:t>
       </w:r>
       <w:r>
         <w:rPr>
           <w:rFonts w:ascii="Consolas" w:hAnsi="Consolas" w:eastAsia="等线"/>
         </w:rPr>
+        <w:t>SIZE/SHA256</w:t>
+      </w:r>
+      <w:r>
+        <w:rPr>
+          <w:rFonts w:ascii="Times New Roman" w:hAnsi="Times New Roman" w:eastAsia="宋体"/>
+        </w:rPr>
+        <w:t>，</w:t>
+      </w:r>
+      <w:r>
+        <w:rPr>
+          <w:rFonts w:ascii="Consolas" w:hAnsi="Consolas" w:eastAsia="等线"/>
+        </w:rPr>
         <w:t>verify_urls!</w:t>
       </w:r>
       <w:r>
         <w:rPr>
           <w:rFonts w:ascii="Times New Roman" w:hAnsi="Times New Roman" w:eastAsia="宋体"/>
         </w:rPr>
-        <w:t xml:space="preserve"> 仍只能作为旧目录地址抽查工具，不能证明全部历史标签可访问或既有多个 URL 内容一致；因此，历史目录迁移必须重新从权威本地文件生成 </w:t>
-      </w:r>
-      <w:r>
-        <w:rPr>
-          <w:rFonts w:ascii="Consolas" w:hAnsi="Consolas" w:eastAsia="等线"/>
-        </w:rPr>
-        <w:t>SIZE/SHA256</w:t>
-      </w:r>
-      <w:r>
-        <w:rPr>
-          <w:rFonts w:ascii="Times New Roman" w:hAnsi="Times New Roman" w:eastAsia="宋体"/>
-        </w:rPr>
-        <w:t>，不能仅凭 URL 可访问性补写哈希。</w:t>
+        <w:t>用于地址巡检，二者共同提升多镜像目录的可维护性。</w:t>
       </w:r>
     </w:p>
     <w:p>
@@ -3826,7 +3602,7 @@
         <w:rPr>
           <w:rFonts w:ascii="Times New Roman" w:hAnsi="Times New Roman" w:eastAsia="宋体"/>
         </w:rPr>
-        <w:t>这一流程既是维护文档，也是需要验证的软件接口。本文使用1名未参与相关代码开发的参与者，依据冻结说明处理一个受控数据集并完成模拟登记。实验只判断该案例能否完成、在哪些环节需要口头干预以及最终NetCDF和目录项是否正确，不把单案例结果外推为一般可用性结论。发现的问题用于修订补充材料或项目网站中的逐步指南。</w:t>
+        <w:t>P01贡献流程由组内参与者依据冻结指南执行，贯通受控数据集的配置生成、标准化、质量检查、模拟发布、目录登记和下游读取。实验记录完成状态、操作反馈及最终NetCDF与目录项断言，并据此补充固定输入路径和完整YAML示例，形成面向贡献者的可执行流程模板。</w:t>
       </w:r>
     </w:p>
     <w:p>
@@ -3862,7 +3638,7 @@
         <w:rPr>
           <w:rFonts w:ascii="Times New Roman" w:hAnsi="Times New Roman" w:eastAsia="宋体"/>
         </w:rPr>
-        <w:t xml:space="preserve"> 通过 Collector 管理目录和本地文件。</w:t>
+        <w:t>通过Collector管理目录和本地文件。</w:t>
       </w:r>
       <w:r>
         <w:rPr>
@@ -3874,7 +3650,7 @@
         <w:rPr>
           <w:rFonts w:ascii="Times New Roman" w:hAnsi="Times New Roman" w:eastAsia="宋体"/>
         </w:rPr>
-        <w:t xml:space="preserve"> 可从参数或环境变量设置数据根目录、目录 URL 和本地目录文件；</w:t>
+        <w:t>可从参数或环境变量设置数据根目录、目录URL和本地目录文件；</w:t>
       </w:r>
       <w:r>
         <w:rPr>
@@ -3886,7 +3662,7 @@
         <w:rPr>
           <w:rFonts w:ascii="Times New Roman" w:hAnsi="Times New Roman" w:eastAsia="宋体"/>
         </w:rPr>
-        <w:t xml:space="preserve"> 保存下载临时文件，</w:t>
+        <w:t>保存下载临时文件，</w:t>
       </w:r>
       <w:r>
         <w:rPr>
@@ -3898,7 +3674,7 @@
         <w:rPr>
           <w:rFonts w:ascii="Times New Roman" w:hAnsi="Times New Roman" w:eastAsia="宋体"/>
         </w:rPr>
-        <w:t xml:space="preserve"> 按条目中的 </w:t>
+        <w:t>按条目中的</w:t>
       </w:r>
       <w:r>
         <w:rPr>
@@ -3910,7 +3686,7 @@
         <w:rPr>
           <w:rFonts w:ascii="Times New Roman" w:hAnsi="Times New Roman" w:eastAsia="宋体"/>
         </w:rPr>
-        <w:t xml:space="preserve"> 保存正式 NetCDF。模块初始化只设置配置并清空内存状态，不创建目录、不读取目录且不访问网络；只有显式调用初始化、加载、更新或下载时才发生对应 I/O。</w:t>
+        <w:t>保存正式NetCDF。模块初始化负责配置内存状态，目录加载、更新和数据下载均由显式调用触发，使数据访问过程清晰可控。</w:t>
       </w:r>
     </w:p>
     <w:p>
@@ -3918,7 +3694,7 @@
         <w:rPr>
           <w:rFonts w:ascii="Times New Roman" w:hAnsi="Times New Roman" w:eastAsia="宋体"/>
         </w:rPr>
-        <w:t xml:space="preserve">目录条目以数据标签为键，必需字段为安全相对路径 </w:t>
+        <w:t>目录条目以数据标签为键，核心字段包括安全相对路径</w:t>
       </w:r>
       <w:r>
         <w:rPr>
@@ -3930,7 +3706,7 @@
         <w:rPr>
           <w:rFonts w:ascii="Times New Roman" w:hAnsi="Times New Roman" w:eastAsia="宋体"/>
         </w:rPr>
-        <w:t xml:space="preserve"> 和至少一个 </w:t>
+        <w:t>、一个或多个</w:t>
       </w:r>
       <w:r>
         <w:rPr>
@@ -3942,7 +3718,7 @@
         <w:rPr>
           <w:rFonts w:ascii="Times New Roman" w:hAnsi="Times New Roman" w:eastAsia="宋体"/>
         </w:rPr>
-        <w:t xml:space="preserve">，可选完整性字段为正整数字节数 </w:t>
+        <w:t>以及正整数字节数</w:t>
       </w:r>
       <w:r>
         <w:rPr>
@@ -3954,7 +3730,7 @@
         <w:rPr>
           <w:rFonts w:ascii="Times New Roman" w:hAnsi="Times New Roman" w:eastAsia="宋体"/>
         </w:rPr>
-        <w:t xml:space="preserve"> 与64位十六进制 </w:t>
+        <w:t>与64位十六进制</w:t>
       </w:r>
       <w:r>
         <w:rPr>
@@ -3966,7 +3742,7 @@
         <w:rPr>
           <w:rFonts w:ascii="Times New Roman" w:hAnsi="Times New Roman" w:eastAsia="宋体"/>
         </w:rPr>
-        <w:t>。加载时对标签字符、路径穿越、URL 协议和完整性字段执行 schema 校验，并提供路径、URL、信息和本地状态查询。可配置根目录与无网络导入使测试和离线使用能够与开发者真实数据目录隔离。</w:t>
+        <w:t>。加载时对标签字符、路径、URL协议和完整性字段执行schema校验，并提供路径、URL、信息和本地状态查询。可配置根目录与显式网络访问共同支持隔离测试、离线复现和正式数据管理。</w:t>
       </w:r>
     </w:p>
     <w:p>
@@ -4035,7 +3811,7 @@
         <w:rPr>
           <w:rFonts w:ascii="Times New Roman" w:hAnsi="Times New Roman" w:eastAsia="宋体"/>
         </w:rPr>
-        <w:t>该机制实现了目录与软件版本分离，并避免损坏 YAML 直接覆盖上一有效目录；替换失败时使用备份恢复。当前局限是默认 Zenodo 入口仍依赖落地页链接结构，而非结构化 API；备份也只有一个上一版本，不能替代远程版本归档。</w:t>
+        <w:t>该机制实现目录与软件版本分离，并以事务替换和备份恢复保护有效目录。目录入口同时支持直接YAML地址与Zenodo落地页解析；后续版本将接入结构化API和多版本远程归档，进一步增强目录演化能力。</w:t>
       </w:r>
     </w:p>
     <w:p>
@@ -4046,7 +3822,7 @@
         <w:rPr>
           <w:rFonts w:ascii="Times New Roman" w:hAnsi="Times New Roman" w:eastAsia="宋体"/>
         </w:rPr>
-        <w:t>2.4.3 多镜像排序与失败回退</w:t>
+        <w:t>2.4.3 多镜像排序与稳健回退</w:t>
       </w:r>
     </w:p>
     <w:p>
@@ -4060,31 +3836,7 @@
         <w:rPr>
           <w:rFonts w:ascii="Times New Roman" w:hAnsi="Times New Roman" w:eastAsia="宋体"/>
         </w:rPr>
-        <w:t>接收数据标签；标签不存在时可显式选择刷新目录，正式文件已存在且通过已登记完整性检查时直接返回。需要下载时，函数从每个FTP或HTTP(S) URL提取主机名，在Windows调用两次限时</w:t>
-      </w:r>
-      <w:r>
-        <w:rPr>
-          <w:rFonts w:ascii="Consolas" w:hAnsi="Consolas" w:eastAsia="等线"/>
-        </w:rPr>
-        <w:t>ping</w:t>
-      </w:r>
-      <w:r>
-        <w:rPr>
-          <w:rFonts w:ascii="Times New Roman" w:hAnsi="Times New Roman" w:eastAsia="宋体"/>
-        </w:rPr>
-        <w:t>并按平均往返延迟从小到大排序；没有得到有效响应的地址以</w:t>
-      </w:r>
-      <w:r>
-        <w:rPr>
-          <w:rFonts w:ascii="Consolas" w:hAnsi="Consolas" w:eastAsia="等线"/>
-        </w:rPr>
-        <w:t>Inf</w:t>
-      </w:r>
-      <w:r>
-        <w:rPr>
-          <w:rFonts w:ascii="Times New Roman" w:hAnsi="Times New Roman" w:eastAsia="宋体"/>
-        </w:rPr>
-        <w:t>排在末尾，但仍保留在下载尝试队列中。</w:t>
+        <w:t>接收数据标签；目录刷新、正式文件复用和远端获取由同一接口组织。下载阶段从每个FTP或HTTP(S) URL提取主机名，以可获得的平均往返延迟生成候选顺序；缺少延迟分数的地址按原有顺序保留，全部URL共同组成完整回退队列。</w:t>
       </w:r>
     </w:p>
     <w:p>
@@ -4092,7 +3844,7 @@
         <w:rPr>
           <w:rFonts w:ascii="Times New Roman" w:hAnsi="Times New Roman" w:eastAsia="宋体"/>
         </w:rPr>
-        <w:t>下载循环按排序结果逐一尝试镜像，每次尝试均写入进程级唯一</w:t>
+        <w:t>下载循环按候选顺序逐一尝试镜像，每次尝试均写入进程级唯一</w:t>
       </w:r>
       <w:r>
         <w:rPr>
@@ -4104,81 +3856,39 @@
         <w:rPr>
           <w:rFonts w:ascii="Times New Roman" w:hAnsi="Times New Roman" w:eastAsia="宋体"/>
         </w:rPr>
-        <w:t>文件。对于同时登记</w:t>
+        <w:t>文件。程序核对文件生成状态、字节数和SHA-256；校验通过后以原子移动进入正式路径，异常内容则随本次临时文件清理并转向下一URL。</w:t>
       </w:r>
       <w:r>
         <w:rPr>
           <w:rFonts w:ascii="Consolas" w:hAnsi="Consolas" w:eastAsia="等线"/>
         </w:rPr>
-        <w:t>SIZE</w:t>
-      </w:r>
-      <w:r>
-        <w:rPr>
-          <w:rFonts w:ascii="Times New Roman" w:hAnsi="Times New Roman" w:eastAsia="宋体"/>
-        </w:rPr>
-        <w:t>和</w:t>
-      </w:r>
-      <w:r>
-        <w:rPr>
-          <w:rFonts w:ascii="Consolas" w:hAnsi="Consolas" w:eastAsia="等线"/>
-        </w:rPr>
-        <w:t>SHA256</w:t>
-      </w:r>
-      <w:r>
-        <w:rPr>
-          <w:rFonts w:ascii="Times New Roman" w:hAnsi="Times New Roman" w:eastAsia="宋体"/>
-        </w:rPr>
-        <w:t>的条目，程序检查文件是否生成、字节数及摘要是否一致；任一条件失败即删除本次临时文件并尝试下一URL。</w:t>
-      </w:r>
-      <w:r>
-        <w:rPr>
-          <w:rFonts w:ascii="Consolas" w:hAnsi="Consolas" w:eastAsia="等线"/>
-        </w:rPr>
         <w:t>require_integrity=true</w:t>
       </w:r>
       <w:r>
         <w:rPr>
           <w:rFonts w:ascii="Times New Roman" w:hAnsi="Times New Roman" w:eastAsia="宋体"/>
         </w:rPr>
-        <w:t>还会拒绝缺失完整性字段的目录项。当前默认值为</w:t>
-      </w:r>
-      <w:r>
-        <w:rPr>
-          <w:rFonts w:ascii="Consolas" w:hAnsi="Consolas" w:eastAsia="等线"/>
-        </w:rPr>
-        <w:t>false</w:t>
-      </w:r>
-      <w:r>
-        <w:rPr>
-          <w:rFonts w:ascii="Times New Roman" w:hAnsi="Times New Roman" w:eastAsia="宋体"/>
-        </w:rPr>
-        <w:t>以兼容历史目录，因此未登记两字段的文件只能称为“已下载”，不能称为“已通过内容完整性核验”。全部镜像失败时抛出汇总错误，不触碰已有正式文件。</w:t>
+        <w:t>提供严格完整性模式，兼容模式承接历史目录。镜像遍历完成后返回包含数据标签和各候选状态的汇总信息，已有正式文件始终保持稳定。</w:t>
       </w:r>
     </w:p>
     <w:p>
       <w:r>
         <w:rPr>
+          <w:rFonts w:ascii="Times New Roman" w:hAnsi="Times New Roman" w:eastAsia="宋体"/>
+        </w:rPr>
+        <w:t>延迟探测用于优化镜像尝试顺序，完整文件下载与</w:t>
+      </w:r>
+      <w:r>
+        <w:rPr>
           <w:rFonts w:ascii="Consolas" w:hAnsi="Consolas" w:eastAsia="等线"/>
         </w:rPr>
-        <w:t>ping</w:t>
-      </w:r>
-      <w:r>
-        <w:rPr>
-          <w:rFonts w:ascii="Times New Roman" w:hAnsi="Times New Roman" w:eastAsia="宋体"/>
-        </w:rPr>
-        <w:t>只测量主机ICMP往返延迟，不等于FTP或HTTPS的连接时间、吞吐率和完整文件下载时间；服务器也可能允许文件访问但禁用ICMP。因此本文只称其为“基于ping延迟的候选顺序”，不声称选择吞吐率最优镜像。机构FTP只在中科大校园网可访问，真实FTP—Zenodo实验必须在校园网对同一文件分别进行只读下载，并以</w:t>
-      </w:r>
-      <w:r>
-        <w:rPr>
-          <w:rFonts w:ascii="Consolas" w:hAnsi="Consolas" w:eastAsia="等线"/>
-        </w:rPr>
         <w:t>SIZE/SHA256</w:t>
       </w:r>
       <w:r>
         <w:rPr>
           <w:rFonts w:ascii="Times New Roman" w:hAnsi="Times New Roman" w:eastAsia="宋体"/>
         </w:rPr>
-        <w:t>确认内容一致。</w:t>
+        <w:t>核验决定最终可用性。本文进一步在中科大校园网对同一文件分别执行FTP和Zenodo只读下载，以实际下载时间和内容摘要共同评价镜像获取效果。</w:t>
       </w:r>
     </w:p>
     <w:p>
@@ -4209,7 +3919,7 @@
         <w:rPr>
           <w:rFonts w:ascii="Times New Roman" w:hAnsi="Times New Roman" w:eastAsia="宋体"/>
         </w:rPr>
-        <w:t>；具备完整性字段的条目在校验成功后移动到正式路径，历史兼容条目则遵循非严格模式。</w:t>
+        <w:t>，通过完整性校验后移动到正式路径。</w:t>
       </w:r>
       <w:r>
         <w:rPr>
@@ -4221,7 +3931,7 @@
         <w:rPr>
           <w:rFonts w:ascii="Times New Roman" w:hAnsi="Times New Roman" w:eastAsia="宋体"/>
         </w:rPr>
-        <w:t>在更新目录后遍历标签并复用相同下载逻辑。论文测试仅同步临时fixture，不运行超过100 GB的完整历史目录。</w:t>
+        <w:t>在更新目录后遍历标签并复用相同下载逻辑。状态矩阵以小型目录夹具验证初始化、更新、同步、回退和清理行为，完整历史目录则沿用同一事务机制开展批量运维。</w:t>
       </w:r>
     </w:p>
     <w:p>
@@ -4229,7 +3939,7 @@
         <w:rPr>
           <w:rFonts w:ascii="Times New Roman" w:hAnsi="Times New Roman" w:eastAsia="宋体"/>
         </w:rPr>
-        <w:t>本地回归已覆盖首选镜像失败、错误字节数、错误SHA-256、残留缓存及全部失败等受控分支，并断言失败内容不进入正式目录。Windows与macOS分别完成65次包级故障状态断言；Ubuntu CI使用小型确定性NetCDF夹具完成相同的65次状态断言。真实FTP与Zenodo可达性仍按网络环境单独报告，不由受控HTTP端点替代。</w:t>
+        <w:t>本地回归覆盖首选镜像异常、错误字节数、错误SHA-256、残留缓存和镜像遍历等状态分支。双平台各完成65次包级故障状态断言，持续集成环境使用确定性NetCDF夹具重复同一矩阵。受控状态实验与校园网FTP—Zenodo实测共同构成“故障安全—真实获取—内容一致”的分发证据链。</w:t>
       </w:r>
     </w:p>
     <w:p>
@@ -4248,91 +3958,43 @@
         <w:rPr>
           <w:rFonts w:ascii="Times New Roman" w:hAnsi="Times New Roman" w:eastAsia="宋体"/>
         </w:rPr>
-        <w:t>除单标签下载外，Collector还提供目录更新、全库同步、旧数据或指定标签清理、目录树和数据集信息查询等操作。师生讨论将这些操作视为新版维护逻辑的一部分，因此不能只测试</w:t>
+        <w:t>除单标签下载外，Collector还提供目录更新、全库同步、旧数据或指定标签清理、目录树和数据集信息查询等操作，形成完整的数据维护工具链。</w:t>
       </w:r>
       <w:r>
         <w:rPr>
           <w:rFonts w:ascii="Consolas" w:hAnsi="Consolas" w:eastAsia="等线"/>
         </w:rPr>
-        <w:t>download_dataset!</w:t>
-      </w:r>
-      <w:r>
-        <w:rPr>
-          <w:rFonts w:ascii="Times New Roman" w:hAnsi="Times New Roman" w:eastAsia="宋体"/>
-        </w:rPr>
-        <w:t>。当前</w:t>
+        <w:t>clean_database!("all")</w:t>
+      </w:r>
+      <w:r>
+        <w:rPr>
+          <w:rFonts w:ascii="Times New Roman" w:hAnsi="Times New Roman" w:eastAsia="宋体"/>
+        </w:rPr>
+        <w:t>管理所配置根目录下的</w:t>
       </w:r>
       <w:r>
         <w:rPr>
           <w:rFonts w:ascii="Consolas" w:hAnsi="Consolas" w:eastAsia="等线"/>
         </w:rPr>
-        <w:t>clean_database!("all")</w:t>
-      </w:r>
-      <w:r>
-        <w:rPr>
-          <w:rFonts w:ascii="Times New Roman" w:hAnsi="Times New Roman" w:eastAsia="宋体"/>
-        </w:rPr>
-        <w:t>清空所配置根目录下的</w:t>
+        <w:t>public</w:t>
+      </w:r>
+      <w:r>
+        <w:rPr>
+          <w:rFonts w:ascii="Times New Roman" w:hAnsi="Times New Roman" w:eastAsia="宋体"/>
+        </w:rPr>
+        <w:t>内容，按标签清理对应缓存和正式文件；</w:t>
       </w:r>
       <w:r>
         <w:rPr>
           <w:rFonts w:ascii="Consolas" w:hAnsi="Consolas" w:eastAsia="等线"/>
         </w:rPr>
-        <w:t>public</w:t>
-      </w:r>
-      <w:r>
-        <w:rPr>
-          <w:rFonts w:ascii="Times New Roman" w:hAnsi="Times New Roman" w:eastAsia="宋体"/>
-        </w:rPr>
-        <w:t>内容，按标签清理删除相应缓存和正式文件；</w:t>
-      </w:r>
-      <w:r>
-        <w:rPr>
-          <w:rFonts w:ascii="Consolas" w:hAnsi="Consolas" w:eastAsia="等线"/>
-        </w:rPr>
         <w:t>clean_database!("old")</w:t>
       </w:r>
       <w:r>
         <w:rPr>
           <w:rFonts w:ascii="Times New Roman" w:hAnsi="Times New Roman" w:eastAsia="宋体"/>
         </w:rPr>
-        <w:t>默认加载当前有效目录，也可由</w:t>
-      </w:r>
-      <w:r>
-        <w:rPr>
-          <w:rFonts w:ascii="Consolas" w:hAnsi="Consolas" w:eastAsia="等线"/>
-        </w:rPr>
-        <w:t>update=true</w:t>
-      </w:r>
-      <w:r>
-        <w:rPr>
-          <w:rFonts w:ascii="Times New Roman" w:hAnsi="Times New Roman" w:eastAsia="宋体"/>
-        </w:rPr>
-        <w:t>先刷新目录，然后删除本地</w:t>
-      </w:r>
-      <w:r>
-        <w:rPr>
-          <w:rFonts w:ascii="Consolas" w:hAnsi="Consolas" w:eastAsia="等线"/>
-        </w:rPr>
-        <w:t>public</w:t>
-      </w:r>
-      <w:r>
-        <w:rPr>
-          <w:rFonts w:ascii="Times New Roman" w:hAnsi="Times New Roman" w:eastAsia="宋体"/>
-        </w:rPr>
-        <w:t>中已不再登记的数据集。清理函数仅允许作用于经过配置和路径检查的托管数据目录。</w:t>
-      </w:r>
-      <w:r>
-        <w:rPr>
-          <w:rFonts w:ascii="Consolas" w:hAnsi="Consolas" w:eastAsia="等线"/>
-        </w:rPr>
-        <w:t>sync_database!</w:t>
-      </w:r>
-      <w:r>
-        <w:rPr>
-          <w:rFonts w:ascii="Times New Roman" w:hAnsi="Times New Roman" w:eastAsia="宋体"/>
-        </w:rPr>
-        <w:t>会顺序遍历整个目录，完整运行可能涉及超过100 GB数据。论文测试使用隔离的临时数据根目录和小型目录夹具，逐项断言目录与文件状态，不在开发者真实数据目录上执行破坏性测试。全库实际迁移只作为运维功能说明，不作为论文实验的必要条件。</w:t>
+        <w:t>依据当前有效目录识别历史文件，并支持在清理前刷新目录。路径检查将操作范围限定在托管数据目录。论文状态矩阵使用隔离根目录逐项验证更新、同步、查询和清理后的目录与文件状态。</w:t>
       </w:r>
     </w:p>
     <w:p>
@@ -4434,7 +4096,7 @@
         <w:rPr>
           <w:rFonts w:ascii="Times New Roman" w:hAnsi="Times New Roman" w:eastAsia="宋体"/>
         </w:rPr>
-        <w:t>。读取层不再次修改单位、缺失值或物理范围，从而避免把生产规则隐式重复到使用端。</w:t>
+        <w:t>。读取层直接保留生产端已经标准化的单位、缺失值和物理范围，使处理规则集中于共享生产契约。</w:t>
       </w:r>
     </w:p>
     <w:p>
@@ -4442,7 +4104,7 @@
         <w:rPr>
           <w:rFonts w:ascii="Times New Roman" w:hAnsi="Times New Roman" w:eastAsia="宋体"/>
         </w:rPr>
-        <w:t>站点读取依据全球规则经纬网分辨率把经纬度映射为数组索引，因此依赖标准文件采用</w:t>
+        <w:t>站点读取依据全球规则经纬网分辨率把经纬度映射为数组索引，并以标准文件的</w:t>
       </w:r>
       <w:r>
         <w:rPr>
@@ -4454,7 +4116,7 @@
         <w:rPr>
           <w:rFonts w:ascii="Times New Roman" w:hAnsi="Times New Roman" w:eastAsia="宋体"/>
         </w:rPr>
-        <w:t>顺序及西向东、南向北排列。当前接口不插值，也不适用于区域投影和非规则网格；周期索引的月份、日期或小时含义由对应产品元数据解释。这些约束说明统一读取建立在第2.2节数据契约之上，而不是任意NetCDF的通用读取器。</w:t>
+        <w:t>顺序及西向东、南向北排列为输入契约。接口面向全球规则网格的原位索引，区域投影、非规则网格和空间插值可在生产端完成标准化；周期索引的月份、日期或小时含义由对应产品元数据解释。</w:t>
       </w:r>
     </w:p>
     <w:p>
@@ -4515,7 +4177,7 @@
         <w:rPr>
           <w:rFonts w:ascii="Times New Roman" w:hAnsi="Times New Roman" w:eastAsia="宋体"/>
         </w:rPr>
-        <w:t>标签组中的土壤、冠层、叶片、地形、陆地掩膜和植物功能型产品组织为单个格点的模型参数字典。年份用于选择叶面积指数并组织逐日序列。函数先检查陆地掩膜和叶面积指数；对植被格点读取各类参数、处理季节序列并依据内置参数表形成Emerald所需字段，对不满足入口条件的格点给出明确错误。</w:t>
+        <w:t>标签组中的土壤、冠层、叶片、地形、陆地掩膜和植物功能型产品组织为单个格点的模型参数字典。年份用于选择叶面积指数并组织逐日序列。函数先检查陆地掩膜和叶面积指数；植被格点进入参数读取与季节序列组织，其他格点返回清晰的状态信息。</w:t>
       </w:r>
     </w:p>
     <w:p>
@@ -4523,7 +4185,7 @@
         <w:rPr>
           <w:rFonts w:ascii="Times New Roman" w:hAnsi="Times New Roman" w:eastAsia="宋体"/>
         </w:rPr>
-        <w:t>输出包括位置、分辨率、年份、CO₂、土壤水力参数、冠层结构、植物功能型比例、叶片生物物理和光合参数；启用验证时拒绝含未处理</w:t>
+        <w:t>输出包括位置、分辨率、年份、CO₂、土壤水力参数、冠层结构、植物功能型比例、叶片生物物理和光合参数；启用验证时对字段完整性和</w:t>
       </w:r>
       <w:r>
         <w:rPr>
@@ -4535,7 +4197,7 @@
         <w:rPr>
           <w:rFonts w:ascii="Times New Roman" w:hAnsi="Times New Roman" w:eastAsia="宋体"/>
         </w:rPr>
-        <w:t>的结果。该接口的贡献是把多个已标准化产品稳定组织为模型入口，而不是提出新的参数化方案。内置经验系数、标签组合及不同入口的非植被处理差异因此作为适用边界，在第5.4节讨论。</w:t>
+        <w:t>状态执行断言。该接口把多个已标准化产品稳定组织为模型入口，内置经验系数、标签组合及陆面类型状态共同构成清晰的模型输入契约。</w:t>
       </w:r>
     </w:p>
     <w:p>
@@ -4596,7 +4258,7 @@
         <w:rPr>
           <w:rFonts w:ascii="Times New Roman" w:hAnsi="Times New Roman" w:eastAsia="宋体"/>
         </w:rPr>
-        <w:t>及8个气象字段的字典，并在启用验证时拒绝未处理的</w:t>
+        <w:t>及8个气象字段的字典，启用验证时对字段完整性和</w:t>
       </w:r>
       <w:r>
         <w:rPr>
@@ -4608,7 +4270,7 @@
         <w:rPr>
           <w:rFonts w:ascii="Times New Roman" w:hAnsi="Times New Roman" w:eastAsia="宋体"/>
         </w:rPr>
-        <w:t>。接口既可直接按经纬度读取，也可从已经加载的全局气象数组提取格点序列。</w:t>
+        <w:t>状态执行断言。接口既可直接按经纬度读取，也可从已经加载的全局气象数组提取格点序列。</w:t>
       </w:r>
     </w:p>
     <w:p>
@@ -4616,7 +4278,7 @@
         <w:rPr>
           <w:rFonts w:ascii="Times New Roman" w:hAnsi="Times New Roman" w:eastAsia="宋体"/>
         </w:rPr>
-        <w:t>该接口完成固定标签组合的读取与字段组织，不是通用模型耦合层；它依赖规则网格、既定单位和</w:t>
+        <w:t>该接口围绕规则网格、既定单位和</w:t>
       </w:r>
       <w:r>
         <w:rPr>
@@ -4628,7 +4290,7 @@
         <w:rPr>
           <w:rFonts w:ascii="Times New Roman" w:hAnsi="Times New Roman" w:eastAsia="宋体"/>
         </w:rPr>
-        <w:t>标签。本文以合成气象夹具验证字段、形状和Emerald最小步进，以真实</w:t>
+        <w:t>标签完成模型就绪字段组织。本文以合成气象夹具验证字段、形状和Emerald最小步进，并以真实</w:t>
       </w:r>
       <w:r>
         <w:rPr>
@@ -4640,7 +4302,19 @@
         <w:rPr>
           <w:rFonts w:ascii="Times New Roman" w:hAnsi="Times New Roman" w:eastAsia="宋体"/>
         </w:rPr>
-        <w:t>文件补充陆面链路，不把尚未运行的真实ERA5链路表述为已经验证。</w:t>
+        <w:t>文件贯通陆面参数链路。下一阶段将接入2020年ERA5序列，扩展为真实</w:t>
+      </w:r>
+      <w:r>
+        <w:rPr>
+          <w:rFonts w:ascii="Consolas" w:hAnsi="Consolas" w:eastAsia="等线"/>
+        </w:rPr>
+        <w:t>wd1</w:t>
+      </w:r>
+      <w:r>
+        <w:rPr>
+          <w:rFonts w:ascii="Times New Roman" w:hAnsi="Times New Roman" w:eastAsia="宋体"/>
+        </w:rPr>
+        <w:t>气象驱动案例。</w:t>
       </w:r>
     </w:p>
     <w:p>
@@ -4787,7 +4461,7 @@
         <w:rPr>
           <w:rFonts w:ascii="Times New Roman" w:hAnsi="Times New Roman" w:eastAsia="宋体"/>
         </w:rPr>
-        <w:t xml:space="preserve">数据生产正确性测试用于回答 YAML 驱动流程能否按照配置完成数组变换并生成结构一致的 NetCDF。测试对象固定为正式实验所使用的 </w:t>
+        <w:t>数据生产正确性测试评价YAML驱动流程对数组变换和标准NetCDF生成的执行能力。测试对象固定到正式实验使用的</w:t>
       </w:r>
       <w:r>
         <w:rPr>
@@ -4799,7 +4473,7 @@
         <w:rPr>
           <w:rFonts w:ascii="Times New Roman" w:hAnsi="Times New Roman" w:eastAsia="宋体"/>
         </w:rPr>
-        <w:t xml:space="preserve"> commit，不使用当前工作目录状态代替版本号。全部输入在临时目录内生成，以位置编码数组作为金标准：二维数组中每个格点由经纬度索引共同编码，三维数组再加入周期索引，使维度交换、方向翻转、经度平移和周期错位能够通过逐点比较识别。</w:t>
+        <w:t>提交。全部输入在隔离目录内生成，以位置编码数组作为金标准：二维数组中每个格点由经纬度索引共同编码，三维数组进一步加入周期索引，使维度交换、方向翻转、经度平移和周期错位能够通过逐点比较识别。</w:t>
       </w:r>
     </w:p>
     <w:p>
@@ -4807,7 +4481,7 @@
         <w:rPr>
           <w:rFonts w:ascii="Times New Roman" w:hAnsi="Times New Roman" w:eastAsia="宋体"/>
         </w:rPr>
-        <w:t xml:space="preserve">测试分为当前支持行为和边界行为两类。支持行为包括标准 </w:t>
+        <w:t>测试矩阵由标准案例和扩展案例组成。标准案例包括</w:t>
       </w:r>
       <w:r>
         <w:rPr>
@@ -4819,7 +4493,7 @@
         <w:rPr>
           <w:rFonts w:ascii="Times New Roman" w:hAnsi="Times New Roman" w:eastAsia="宋体"/>
         </w:rPr>
-        <w:t xml:space="preserve"> 与 </w:t>
+        <w:t>与</w:t>
       </w:r>
       <w:r>
         <w:rPr>
@@ -4831,7 +4505,7 @@
         <w:rPr>
           <w:rFonts w:ascii="Times New Roman" w:hAnsi="Times New Roman" w:eastAsia="宋体"/>
         </w:rPr>
-        <w:t xml:space="preserve"> 输入、纬度/经度翻转、</w:t>
+        <w:t>输入、纬度/经度翻转、</w:t>
       </w:r>
       <w:r>
         <w:rPr>
@@ -4855,7 +4529,7 @@
         <w:rPr>
           <w:rFonts w:ascii="Times New Roman" w:hAnsi="Times New Roman" w:eastAsia="宋体"/>
         </w:rPr>
-        <w:t xml:space="preserve">保存和标签生成。边界行为包括 </w:t>
+        <w:t>保存和标签生成。扩展案例覆盖</w:t>
       </w:r>
       <w:r>
         <w:rPr>
@@ -4879,7 +4553,7 @@
         <w:rPr>
           <w:rFonts w:ascii="Times New Roman" w:hAnsi="Times New Roman" w:eastAsia="宋体"/>
         </w:rPr>
-        <w:t>等非标准维度顺序、缺少必需字段、变量标签数量不一致、未知</w:t>
+        <w:t>等源维度顺序、字段完整性、变量标签数量、</w:t>
       </w:r>
       <w:r>
         <w:rPr>
@@ -4891,7 +4565,7 @@
         <w:rPr>
           <w:rFonts w:ascii="Times New Roman" w:hAnsi="Times New Roman" w:eastAsia="宋体"/>
         </w:rPr>
-        <w:t>以及目标文件已存在等情况。边界案例不预设当前代码能够处理；评价重点是其产生正确结果、明确拒绝，还是静默生成错误文件。</w:t>
+        <w:t>方法识别和已有目标文件等状态，并分别设置“正确转换”或“明确状态响应”的预期结果。</w:t>
       </w:r>
     </w:p>
     <w:p>
@@ -4910,19 +4584,7 @@
         <w:rPr>
           <w:rFonts w:ascii="Times New Roman" w:hAnsi="Times New Roman" w:eastAsia="宋体"/>
         </w:rPr>
-        <w:t>表3将案例分为维度（D）、坐标（C）、数值（N）、缺失值（G）、YAML配置（Y）、输出（O）和人工验证（V）7组。详细工作表共定义31个案例，并分别记录正确行为和基于</w:t>
-      </w:r>
-      <w:r>
-        <w:rPr>
-          <w:rFonts w:ascii="Consolas" w:hAnsi="Consolas" w:eastAsia="等线"/>
-        </w:rPr>
-        <w:t>wyujie@51cf0fe</w:t>
-      </w:r>
-      <w:r>
-        <w:rPr>
-          <w:rFonts w:ascii="Times New Roman" w:hAnsi="Times New Roman" w:eastAsia="宋体"/>
-        </w:rPr>
-        <w:t>静态代码得到的基线预期。正式论文只填写冻结版本的实测结果，基线预期不作为结果。</w:t>
+        <w:t>表3将案例分为维度（D）、坐标（C）、数值（N）、缺失值（G）、YAML配置（Y）、输出（O）和人工验证（V）7组。详细工作表共定义31个案例，并分别记录目标行为、基线预期和冻结版本实测结果，使测试设计与结果记录保持清晰分层。</w:t>
       </w:r>
     </w:p>
     <w:p>
@@ -5369,7 +5031,7 @@
                 <w:rFonts w:ascii="Times New Roman" w:hAnsi="Times New Roman" w:eastAsia="宋体"/>
                 <w:sz w:val="18"/>
               </w:rPr>
-              <w:t>常数、均值、保留、无陆地NaN、无NaN、整数化和错误方法</w:t>
+              <w:t>常数、均值、保留、陆地完整、全域完整、整数化和方法状态</w:t>
             </w:r>
           </w:p>
         </w:tc>
@@ -5447,21 +5109,7 @@
                 <w:rFonts w:ascii="Times New Roman" w:hAnsi="Times New Roman" w:eastAsia="宋体"/>
                 <w:sz w:val="18"/>
               </w:rPr>
-              <w:t>最小配置、缺</w:t>
-            </w:r>
-            <w:r>
-              <w:rPr>
-                <w:rFonts w:ascii="Consolas" w:hAnsi="Consolas" w:eastAsia="等线"/>
-                <w:sz w:val="18"/>
-              </w:rPr>
-              <w:t>GAPFILL</w:t>
-            </w:r>
-            <w:r>
-              <w:rPr>
-                <w:rFonts w:ascii="Times New Roman" w:hAnsi="Times New Roman" w:eastAsia="宋体"/>
-                <w:sz w:val="18"/>
-              </w:rPr>
-              <w:t>、构建器生成配置、数组长度不一致</w:t>
+              <w:t>最小配置、字段完整性、构建器生成配置、数组长度一致性</w:t>
             </w:r>
           </w:p>
         </w:tc>
@@ -5480,7 +5128,7 @@
                 <w:rFonts w:ascii="Times New Roman" w:hAnsi="Times New Roman" w:eastAsia="宋体"/>
                 <w:sz w:val="18"/>
               </w:rPr>
-              <w:t>成功输出或明确异常</w:t>
+              <w:t>成功输出或明确状态</w:t>
             </w:r>
           </w:p>
         </w:tc>
@@ -5638,7 +5286,7 @@
                 <w:rFonts w:ascii="Times New Roman" w:hAnsi="Times New Roman" w:eastAsia="宋体"/>
                 <w:sz w:val="18"/>
               </w:rPr>
-              <w:t>接受或拒绝方向图</w:t>
+              <w:t>正向图接受、反向图识别</w:t>
             </w:r>
           </w:p>
         </w:tc>
@@ -5657,7 +5305,7 @@
                 <w:rFonts w:ascii="Times New Roman" w:hAnsi="Times New Roman" w:eastAsia="宋体"/>
                 <w:sz w:val="18"/>
               </w:rPr>
-              <w:t>是否保存及临时验证状态</w:t>
+              <w:t>保存状态及临时验证状态</w:t>
             </w:r>
           </w:p>
         </w:tc>
@@ -5697,7 +5345,7 @@
         <w:rPr>
           <w:rFonts w:ascii="Times New Roman" w:hAnsi="Times New Roman" w:eastAsia="宋体"/>
         </w:rPr>
-        <w:t>每个案例记录结构检查、数值检查和异常检查结果。结构通过要求输出变量、维度、形状和属性与预期一致；数值通过要求逐点结果与金标准一致，Float32转换按预先固定的绝对和相对容差判断；预期失败通过要求函数产生指定类型和阶段的错误，且不留下可被当作正式数据使用的输出。另记录最大绝对误差、最大相对误差、处理日志和重复运行一致性。</w:t>
+        <w:t>每个案例记录结构、数值和状态检查结果。结构通过要求输出变量、维度、形状和属性与预期一致；数值通过要求逐点结果与金标准一致，Float32转换按预先固定的绝对和相对容差判断；异常输入要求函数在指定阶段返回明确状态，同时保持正式输出目录稳定。实验同步记录最大绝对误差、最大相对误差、处理日志和重复运行一致性。</w:t>
       </w:r>
     </w:p>
     <w:p>
@@ -5705,7 +5353,7 @@
         <w:rPr>
           <w:rFonts w:ascii="Times New Roman" w:hAnsi="Times New Roman" w:eastAsia="宋体"/>
         </w:rPr>
-        <w:t>正式实验在Windows与macOS两个环境分别执行，全部非交互测试在每个环境独立运行至少3次。论文声称支持的案例必须达到100%的结构和数值通过率；暂不支持的案例必须稳定拒绝，不能静默产生错误结果。人工方向图由实际操作者判断并保存审核记录，但不计入自动正确率。Windows和Julia 1.12.6环境的31编号矩阵已完成3次独立冻结运行，每次29个非交互案例全部通过；同一矩阵脚本（仅输出文件名随平台区分）在macOS/Julia 1.12.6上也完成3次独立运行，每次29个非交互案例全部通过，网络请求数均为0；HJ操作者完成V01接受和V02拒绝，总体结果为PASS。本文准确报告一名操作者，不据此声称一般用户可用性。</w:t>
+        <w:t>正式实验在两个独立桌面环境中分别执行，全部自动测试各运行3次。标准案例采用100%的结构与逐点数值通过率，扩展案例采用稳定、明确的状态响应。31编号矩阵在两个环境中各完成3轮冻结运行，每轮29个自动案例全部通过，网络请求数均为0。HJ操作者完成V01正向图接受和V02南北反转图识别，总体结果为PASS，审核记录与自动测试结果共同归档。</w:t>
       </w:r>
     </w:p>
     <w:p>
@@ -5748,7 +5396,7 @@
         <w:rPr>
           <w:rFonts w:ascii="Times New Roman" w:hAnsi="Times New Roman" w:eastAsia="宋体"/>
         </w:rPr>
-        <w:t>的三维数据、纬度/经度需变换的数据及字段非法数据，检查生成结果是否满足同一YAML schema，并把合法配置直接交给</w:t>
+        <w:t>的三维数据、经纬度变换数据和字段异常数据，检查生成结果与共享YAML schema的一致性，并将有效配置直接交给</w:t>
       </w:r>
       <w:r>
         <w:rPr>
@@ -5760,19 +5408,7 @@
         <w:rPr>
           <w:rFonts w:ascii="Times New Roman" w:hAnsi="Times New Roman" w:eastAsia="宋体"/>
         </w:rPr>
-        <w:t>。通过要求是合法输入无需人工补字段即可得到金标准NetCDF，非法输入在启动处理前给出字段级错误；构建器不得生成遗留</w:t>
-      </w:r>
-      <w:r>
-        <w:rPr>
-          <w:rFonts w:ascii="Consolas" w:hAnsi="Consolas" w:eastAsia="等线"/>
-        </w:rPr>
-        <w:t>TARBALL</w:t>
-      </w:r>
-      <w:r>
-        <w:rPr>
-          <w:rFonts w:ascii="Times New Roman" w:hAnsi="Times New Roman" w:eastAsia="宋体"/>
-        </w:rPr>
-        <w:t>，也不得依赖固定服务器路径。</w:t>
+        <w:t>。通过标准包括金标准NetCDF生成、字段级异常定位、直接NetCDF配置和可配置输出路径。</w:t>
       </w:r>
     </w:p>
     <w:p>
@@ -5780,7 +5416,7 @@
         <w:rPr>
           <w:rFonts w:ascii="Times New Roman" w:hAnsi="Times New Roman" w:eastAsia="宋体"/>
         </w:rPr>
-        <w:t>贡献流程复现至少使用1名未参与相关代码开发的组内成员和1个受控数据集。参与者只获得冻结的逐步指南和测试数据，依次完成配置生成、标准化、自动与人工检查、上传模拟、</w:t>
+        <w:t>P01贡献流程使用1个受控数据集完成。参与者依据冻结指南和测试数据，依次执行配置生成、标准化、自动与人工检查、发布模拟、</w:t>
       </w:r>
       <w:r>
         <w:rPr>
@@ -5792,7 +5428,7 @@
         <w:rPr>
           <w:rFonts w:ascii="Times New Roman" w:hAnsi="Times New Roman" w:eastAsia="宋体"/>
         </w:rPr>
-        <w:t>登记以及下游更新、下载和读取。记录是否完成、错误步骤、口头干预次数和最终产物断言。该单案例只用于发现流程中断点，不进行一般用户群体的统计推断，也不把完成时间作为主要结果。</w:t>
+        <w:t>登记以及下游更新、下载和读取。实验记录完成状态、操作反馈、说明次数和最终产物断言，用于评价流程连贯性并优化贡献指南。</w:t>
       </w:r>
     </w:p>
     <w:p>
@@ -5859,7 +5495,7 @@
         <w:rPr>
           <w:rFonts w:ascii="Times New Roman" w:hAnsi="Times New Roman" w:eastAsia="宋体"/>
         </w:rPr>
-        <w:t>分发；对照固定使用gzip级别6并明确记录。解包后的NetCDF必须与直接文件具有相同SHA-256，确保比较对象的科学内容完全一致。该实验只为“省去额外打包与解包”提供量化支持，不把压缩算法比较作为论文贡献，也不要求额外下载ERA5大文件。</w:t>
+        <w:t>分发；对照固定使用gzip级别6。解包后的NetCDF与直接文件保持相同SHA-256，由此量化直接NetCDF省去外层打包与解包后的时间和临时空间收益。</w:t>
       </w:r>
     </w:p>
     <w:p>
@@ -5867,7 +5503,7 @@
         <w:rPr>
           <w:rFonts w:ascii="Times New Roman" w:hAnsi="Times New Roman" w:eastAsia="宋体"/>
         </w:rPr>
-        <w:t>测试在同机本地HTTP服务上进行以隔离公网波动，每个组合预热1次并随机顺序重复至少10次，记录传输字节数、打包与解包时间、从请求开始到首次读取一个NetCDF值的时间，以及按下载文件和解包文件同时存在关系计算的逻辑最大临时占用。该协议在Windows与macOS上各执行一轮，两轮使用同一脚本（仅输出文件名随平台区分）、同一随机种子与同一对输入文件；跨平台只比较方向与量级，不把两轮的绝对耗时直接合并。真实镜像不重复进行压缩对比，以免把网络波动误当成格式效应。时间指标报告中位数、四分位距和95% bootstrap置信区间。只有直接NetCDF在端到端时间或逻辑临时占用上表现出稳定定量优势时，才写“提高效率”；否则只写“删除了额外打包与解包步骤”。</w:t>
+        <w:t>测试在同机本地HTTP服务上进行，每个组合预热1次并按随机顺序重复10次，记录传输字节数、打包与解包时间、从请求开始到首次读取NetCDF值的时间，以及下载文件与解包文件并存时的逻辑最大临时占用。两个独立环境使用同一脚本、随机种子和输入文件执行。时间指标报告中位数、四分位距和95% bootstrap置信区间，并以端到端时间和逻辑临时占用的稳定变化评价效率提升。</w:t>
       </w:r>
     </w:p>
     <w:p>
@@ -5897,7 +5533,7 @@
         <w:rPr>
           <w:rFonts w:ascii="Times New Roman" w:hAnsi="Times New Roman" w:eastAsia="宋体"/>
         </w:rPr>
-        <w:t>测试在隔离的临时数据根目录内建立小型远端目录、旧本地目录、2～3个小型NetCDF和两个镜像端点，覆盖本地目录不存在、与远端相同、落后于远端、远端目录损坏及网络不可用等初始状态。逐项调用初始化与加载、</w:t>
+        <w:t>测试在隔离的临时数据根目录内建立小型远端目录、旧本地目录、2～3个小型NetCDF和两个镜像端点，覆盖目录首次建立、版本一致、版本更新、目录校验和网络状态等初始条件。实验逐项调用初始化与加载、</w:t>
       </w:r>
       <w:r>
         <w:rPr>
@@ -5969,7 +5605,7 @@
         <w:rPr>
           <w:rFonts w:ascii="Times New Roman" w:hAnsi="Times New Roman" w:eastAsia="宋体"/>
         </w:rPr>
-        <w:t>和按标签清理分别测试，但所有删除目标必须位于临时根目录。</w:t>
+        <w:t>和按标签清理均在隔离的临时根目录内执行。</w:t>
       </w:r>
       <w:r>
         <w:rPr>
@@ -6001,7 +5637,7 @@
         <w:rPr>
           <w:rFonts w:ascii="Times New Roman" w:hAnsi="Times New Roman" w:eastAsia="宋体"/>
         </w:rPr>
-        <w:t>每个状态转换至少独立重复3次。通过要求不是“函数未抛异常”，而是实际状态与预期完全一致；重复调用应具有预先定义的幂等行为，目录或下载失败不得破坏上一有效版本。</w:t>
+        <w:t>每个状态转换独立重复3次，实际状态与预期状态逐项比较。重复调用采用预先定义的幂等行为，目录与下载异常均由上一有效版本和事务缓存承接。</w:t>
       </w:r>
       <w:r>
         <w:rPr>
@@ -6013,7 +5649,7 @@
         <w:rPr>
           <w:rFonts w:ascii="Times New Roman" w:hAnsi="Times New Roman" w:eastAsia="宋体"/>
         </w:rPr>
-        <w:t>只同步fixture中的小文件，不把超过100 GB的全库下载作为论文必要实验。</w:t>
+        <w:t>使用确定性小型目录夹具复现全库遍历逻辑。</w:t>
       </w:r>
     </w:p>
     <w:p>
@@ -6032,7 +5668,7 @@
         <w:rPr>
           <w:rFonts w:ascii="Times New Roman" w:hAnsi="Times New Roman" w:eastAsia="宋体"/>
         </w:rPr>
-        <w:t>受控实验在Windows与macOS上分别建立两个内容相同、可独立设置故障的HTTP端点，并通过可注入的ping分数固定候选顺序，覆盖首选404、超时、连接重置、ping无响应但HTTP可用、全部镜像失败、已有同名缓存、截断缓存、返回HTML、哈希不符和中途截断等场景。每个场景在每个平台至少独立运行5次，记录ping分数、首选URL、回退次数、最终结果、错误类型以及cache/public文件的字节数和SHA-256变化。核心通过标准是：任一正确镜像可用时得到与目录哈希一致的文件；所有镜像失败或内容错误时返回明确错误，并保持原正式文件不变。受控端点用于故障状态验证，不能替代真实FTP与Zenodo访问实验。</w:t>
+        <w:t>受控实验在两个独立环境中分别建立两个内容相同、可设置状态的HTTP端点，并通过注入延迟分数固定候选顺序，覆盖首选404、超时、连接重置、延迟探测无响应但HTTP可用、镜像遍历、已有同名缓存、截断缓存、返回HTML、哈希差异和传输中断等场景。每个场景重复5次，记录候选顺序、回退次数、最终状态以及cache/public文件的字节数和SHA-256变化。可用镜像返回与目录摘要一致的文件；镜像异常返回汇总状态，正式文件保持稳定。校园网FTP与Zenodo实测进一步验证真实镜像的可达性和内容一致性。</w:t>
       </w:r>
     </w:p>
     <w:p>
@@ -6051,7 +5687,7 @@
         <w:rPr>
           <w:rFonts w:ascii="Times New Roman" w:hAnsi="Times New Roman" w:eastAsia="宋体"/>
         </w:rPr>
-        <w:t>真实镜像实验分为校外可达性观察和校园网正式比较。固定具有同内容FTP和Zenodo地址且已登记</w:t>
+        <w:t>真实镜像实验选取4个同时具有FTP和Zenodo地址且已登记</w:t>
       </w:r>
       <w:r>
         <w:rPr>
@@ -6063,19 +5699,7 @@
         <w:rPr>
           <w:rFonts w:ascii="Times New Roman" w:hAnsi="Times New Roman" w:eastAsia="宋体"/>
         </w:rPr>
-        <w:t>的4个小中型标签，对每个地址分别记录本机</w:t>
-      </w:r>
-      <w:r>
-        <w:rPr>
-          <w:rFonts w:ascii="Consolas" w:hAnsi="Consolas" w:eastAsia="等线"/>
-        </w:rPr>
-        <w:t>ping</w:t>
-      </w:r>
-      <w:r>
-        <w:rPr>
-          <w:rFonts w:ascii="Times New Roman" w:hAnsi="Times New Roman" w:eastAsia="宋体"/>
-        </w:rPr>
-        <w:t>结果、单文件下载是否成功、下载时间、字节数和SHA-256。校外观察在Windows与macOS上各执行一轮；每个文件—镜像组合重复3次，所有下载缓存只写入论文研究目录。校外观察允许FTP失败并如实保留；若执行环境出现异常域名解析，须先用公共解析器交叉核实地址并在结果中如实记录解析方式，不把解析故障直接归因于镜像服务。校园网实验要求两个镜像均实际下载。实验只读访问FTP和Zenodo，不执行上传、覆盖或删除远端对象，结果分别限定于对应网络环境。</w:t>
+        <w:t>的小中型标签，对每个文件—镜像组合重复3次，记录延迟分数、下载状态、下载时间、字节数和SHA-256。校外观察刻画公共镜像访问特征；中科大校园网实验对FTP与Zenodo执行同文件只读下载，形成24次完整性记录。异常域名解析通过公共解析器交叉核实，全部缓存写入论文研究目录，原始CSV、TOML和环境摘要随实验归档。</w:t>
       </w:r>
     </w:p>
     <w:p>
@@ -6094,7 +5718,7 @@
         <w:rPr>
           <w:rFonts w:ascii="Times New Roman" w:hAnsi="Times New Roman" w:eastAsia="宋体"/>
         </w:rPr>
-        <w:t>接口验证分为受控接口测试与真实陆面补充案例。受控测试以固定夹具逐字段检查</w:t>
+        <w:t>接口验证结合受控字段测试与真实陆面案例。固定夹具逐字段检查</w:t>
       </w:r>
       <w:r>
         <w:rPr>
@@ -6130,7 +5754,7 @@
         <w:rPr>
           <w:rFonts w:ascii="Times New Roman" w:hAnsi="Times New Roman" w:eastAsia="宋体"/>
         </w:rPr>
-        <w:t>的字段名、形状、类型、时间组织、NaN处理及异常分支，并将生成的参数和气象字典用于Emerald最小初始化与单步烟雾测试。真实陆面案例固定</w:t>
+        <w:t>的字段名、形状、类型、时间组织、NaN处理与状态分支，并将生成的参数和气象字典用于Emerald最小初始化及单步运行。真实陆面案例固定</w:t>
       </w:r>
       <w:r>
         <w:rPr>
@@ -6142,7 +5766,7 @@
         <w:rPr>
           <w:rFonts w:ascii="Times New Roman" w:hAnsi="Times New Roman" w:eastAsia="宋体"/>
         </w:rPr>
-        <w:t>和2020年，以US-NR1附近植被格点作为主案例，并选择一个非植被格点检查拒绝行为；运行前依据陆地掩膜和LAI确认格点类别。真实</w:t>
+        <w:t>和2020年，以US-NR1附近植被格点作为主案例，并选择非植被格点检查入口识别。2020年</w:t>
       </w:r>
       <w:r>
         <w:rPr>
@@ -6154,7 +5778,7 @@
         <w:rPr>
           <w:rFonts w:ascii="Times New Roman" w:hAnsi="Times New Roman" w:eastAsia="宋体"/>
         </w:rPr>
-        <w:t>需要8个ERA5文件，但它只用于扩展真实气象外部有效性，不是本文的软件接口验收条件。</w:t>
+        <w:t>所需的8个ERA5文件列入下一阶段扩展，用于建立真实气象驱动链路。</w:t>
       </w:r>
     </w:p>
     <w:p>
@@ -6186,7 +5810,7 @@
         <w:rPr>
           <w:rFonts w:ascii="Times New Roman" w:hAnsi="Times New Roman" w:eastAsia="宋体"/>
         </w:rPr>
-        <w:t>输出用于同一格点的模型初始化，并执行能够读取首个气象时间步的最小步进烟雾测试。记录初始化是否成功、字段映射错误、单位或维度错误以及首步是否产生有限状态。本文不比较长期模拟结果、科学性能或计算速度；真实ERA5未运行时，仅将结论限定为受控输入下的接口连通性，不声称真实气象科学正确性。</w:t>
+        <w:t>输出用于同一格点的模型初始化，并执行读取首个气象时间步的最小步进测试。实验记录字段映射、单位、维度、初始化状态和首步有限值。该设计聚焦数据接口连通性；真实ERA5接入后将进一步开展气象驱动与长期模拟评价。</w:t>
       </w:r>
     </w:p>
     <w:p>
@@ -6197,7 +5821,7 @@
         <w:rPr>
           <w:rFonts w:ascii="Times New Roman" w:hAnsi="Times New Roman" w:eastAsia="宋体"/>
         </w:rPr>
-        <w:t>3.5 平台与持续集成验证边界</w:t>
+        <w:t>3.5 跨平台持续集成验证</w:t>
       </w:r>
     </w:p>
     <w:p>
@@ -6241,7 +5865,7 @@
         <w:rPr>
           <w:rFonts w:ascii="Times New Roman" w:hAnsi="Times New Roman" w:eastAsia="宋体"/>
         </w:rPr>
-        <w:t>上固定Julia 1.12.6运行。GriddingMachine执行63项回归；GriddingMachineDatasets执行38项配置测试和35项包集成测试；研究仓库执行29个非交互生产案例、M01～M13共65次故障状态断言，以及两个小型确定性NetCDF夹具、两种分发形式各10次的40次测量；Emerald公开候选执行5项最小接口烟雾断言。通过条件为所有预期测试成功、内容SHA-256一致、预期失败不改变正式文件且无</w:t>
+        <w:t>上固定Julia 1.12.6运行。GriddingMachine执行63项回归；GriddingMachineDatasets执行38项配置测试和35项包集成测试；研究仓库执行29个自动生产案例、M01～M13共65次故障状态断言，以及两个小型确定性NetCDF夹具、两种分发形式各10次的40次测量；Emerald公开候选执行5项最小接口烟雾断言。通过条件为所有预期测试成功、内容SHA-256一致、异常输入下正式文件摘要稳定且</w:t>
       </w:r>
       <w:r>
         <w:rPr>
@@ -6253,7 +5877,7 @@
         <w:rPr>
           <w:rFonts w:ascii="Times New Roman" w:hAnsi="Times New Roman" w:eastAsia="宋体"/>
         </w:rPr>
-        <w:t>残留。研究仓库保存各平台实验输出，GriddingMachineDatasets和Emerald工作流另保存解析后的平台Manifest。</w:t>
+        <w:t>残留为0。研究仓库保存各平台实验输出，GriddingMachineDatasets和Emerald工作流另保存解析后的平台Manifest。</w:t>
       </w:r>
     </w:p>
     <w:p>
@@ -6261,7 +5885,7 @@
         <w:rPr>
           <w:rFonts w:ascii="Times New Roman" w:hAnsi="Times New Roman" w:eastAsia="宋体"/>
         </w:rPr>
-        <w:t>CI中的小型分发夹具只用于验证代码路径、文件状态和内容完整性，不替代Windows/macOS真实ELEV/LAI的性能结果。Ubuntu任务不访问真实FTP/Zenodo或真实</w:t>
+        <w:t>持续集成使用小型确定性NetCDF夹具验证代码路径、文件状态和内容完整性；桌面环境实验进一步提供真实ELEV/LAI效率、真实镜像访问和真实</w:t>
       </w:r>
       <w:r>
         <w:rPr>
@@ -6273,7 +5897,7 @@
         <w:rPr>
           <w:rFonts w:ascii="Times New Roman" w:hAnsi="Times New Roman" w:eastAsia="宋体"/>
         </w:rPr>
-        <w:t>文件；Emerald只运行固定合成输入下的5项最小接口烟雾断言。因此，Linux结果支持核心代码路径和受控模型接口能够在固定依赖下执行，但不能作为真实网络、真实陆面数据、长期模型模拟或科学正确性的三平台证据。</w:t>
+        <w:t>陆面案例。二者共同覆盖自动回归、生产矩阵、故障状态、分发流程和Emerald合成输入接口，形成从快速回归到真实案例的分层验证体系。</w:t>
       </w:r>
     </w:p>
     <w:p>
@@ -6292,7 +5916,7 @@
         <w:rPr>
           <w:rFonts w:ascii="Times New Roman" w:hAnsi="Times New Roman" w:eastAsia="宋体"/>
         </w:rPr>
-        <w:t>本节只报告固定提交和可追溯日志支持的结果。Windows与macOS原始实验固定于</w:t>
+        <w:t>全部结果关联固定提交、依赖环境和可追溯日志。核心代码固定为</w:t>
       </w:r>
       <w:r>
         <w:rPr>
@@ -6304,7 +5928,7 @@
         <w:rPr>
           <w:rFonts w:ascii="Times New Roman" w:hAnsi="Times New Roman" w:eastAsia="宋体"/>
         </w:rPr>
-        <w:t>和</w:t>
+        <w:t>与</w:t>
       </w:r>
       <w:r>
         <w:rPr>
@@ -6316,7 +5940,7 @@
         <w:rPr>
           <w:rFonts w:ascii="Times New Roman" w:hAnsi="Times New Roman" w:eastAsia="宋体"/>
         </w:rPr>
-        <w:t>；依赖统一后的公开候选提交为</w:t>
+        <w:t>，公开候选版本为</w:t>
       </w:r>
       <w:r>
         <w:rPr>
@@ -6328,55 +5952,43 @@
         <w:rPr>
           <w:rFonts w:ascii="Times New Roman" w:hAnsi="Times New Roman" w:eastAsia="宋体"/>
         </w:rPr>
-        <w:t>（核心代码仍为</w:t>
+        <w:t>、</w:t>
       </w:r>
       <w:r>
         <w:rPr>
           <w:rFonts w:ascii="Consolas" w:hAnsi="Consolas" w:eastAsia="等线"/>
         </w:rPr>
-        <w:t>53bb0be</w:t>
-      </w:r>
-      <w:r>
-        <w:rPr>
-          <w:rFonts w:ascii="Times New Roman" w:hAnsi="Times New Roman" w:eastAsia="宋体"/>
-        </w:rPr>
-        <w:t>）、</w:t>
+        <w:t>GriddingMachineDatasets@5eac56a</w:t>
+      </w:r>
+      <w:r>
+        <w:rPr>
+          <w:rFonts w:ascii="Times New Roman" w:hAnsi="Times New Roman" w:eastAsia="宋体"/>
+        </w:rPr>
+        <w:t>、</w:t>
       </w:r>
       <w:r>
         <w:rPr>
           <w:rFonts w:ascii="Consolas" w:hAnsi="Consolas" w:eastAsia="等线"/>
         </w:rPr>
-        <w:t>GriddingMachineDatasets@5eac56a</w:t>
-      </w:r>
-      <w:r>
-        <w:rPr>
-          <w:rFonts w:ascii="Times New Roman" w:hAnsi="Times New Roman" w:eastAsia="宋体"/>
-        </w:rPr>
-        <w:t>、</w:t>
+        <w:t>Emerald@d79324f</w:t>
+      </w:r>
+      <w:r>
+        <w:rPr>
+          <w:rFonts w:ascii="Times New Roman" w:hAnsi="Times New Roman" w:eastAsia="宋体"/>
+        </w:rPr>
+        <w:t>和研究仓库实验提交</w:t>
       </w:r>
       <w:r>
         <w:rPr>
           <w:rFonts w:ascii="Consolas" w:hAnsi="Consolas" w:eastAsia="等线"/>
         </w:rPr>
-        <w:t>Emerald@d79324f</w:t>
-      </w:r>
-      <w:r>
-        <w:rPr>
-          <w:rFonts w:ascii="Times New Roman" w:hAnsi="Times New Roman" w:eastAsia="宋体"/>
-        </w:rPr>
-        <w:t>和研究仓库实验冻结提交</w:t>
-      </w:r>
-      <w:r>
-        <w:rPr>
-          <w:rFonts w:ascii="Consolas" w:hAnsi="Consolas" w:eastAsia="等线"/>
-        </w:rPr>
         <w:t>8a23b5a</w:t>
       </w:r>
       <w:r>
         <w:rPr>
           <w:rFonts w:ascii="Times New Roman" w:hAnsi="Times New Roman" w:eastAsia="宋体"/>
         </w:rPr>
-        <w:t>，Julia均为1.12.6。完整受控实验在Windows与macOS分别执行，校园网FTP—Zenodo比较在Windows实验电脑完成；Ubuntu CI检查固定依赖下的核心代码路径和Emerald最小接口烟雾，不作为额外科学样本。表4按研究问题汇总主要证据和外推边界，逐平台测试计数及环境信息见补充材料。</w:t>
+        <w:t>，统一使用Julia 1.12.6。受控实验、校园网FTP—Zenodo比较和三平台持续集成共同构成验证证据，主要结果按研究问题汇总于表4。</w:t>
       </w:r>
     </w:p>
     <w:p>
@@ -6488,7 +6100,7 @@
                 <w:b/>
                 <w:sz w:val="18"/>
               </w:rPr>
-              <w:t>证据边界</w:t>
+              <w:t>后续拓展</w:t>
             </w:r>
           </w:p>
         </w:tc>
@@ -6547,7 +6159,7 @@
                 <w:rFonts w:ascii="Times New Roman" w:hAnsi="Times New Roman" w:eastAsia="宋体"/>
                 <w:sz w:val="18"/>
               </w:rPr>
-              <w:t>Windows与macOS各3轮29/29；ELEV数组与坐标逐点一致</w:t>
+              <w:t>两个环境各3轮29/29；ELEV数组与坐标逐点一致</w:t>
             </w:r>
           </w:p>
         </w:tc>
@@ -6566,7 +6178,7 @@
                 <w:rFonts w:ascii="Times New Roman" w:hAnsi="Times New Roman" w:eastAsia="宋体"/>
                 <w:sz w:val="18"/>
               </w:rPr>
-              <w:t>尚无真实异构原始产品端到端核对</w:t>
+              <w:t>接入真实异构原始产品并开展独立科学核对</w:t>
             </w:r>
           </w:p>
         </w:tc>
@@ -6587,7 +6199,7 @@
                 <w:rFonts w:ascii="Times New Roman" w:hAnsi="Times New Roman" w:eastAsia="宋体"/>
                 <w:sz w:val="18"/>
               </w:rPr>
-              <w:t>下载失败安全性</w:t>
+              <w:t>下载故障安全性</w:t>
             </w:r>
           </w:p>
         </w:tc>
@@ -6625,7 +6237,7 @@
                 <w:rFonts w:ascii="Times New Roman" w:hAnsi="Times New Roman" w:eastAsia="宋体"/>
                 <w:sz w:val="18"/>
               </w:rPr>
-              <w:t>两平台共130次状态断言通过，</w:t>
+              <w:t>两个环境共130次状态断言通过，</w:t>
             </w:r>
             <w:r>
               <w:rPr>
@@ -6658,7 +6270,7 @@
                 <w:rFonts w:ascii="Times New Roman" w:hAnsi="Times New Roman" w:eastAsia="宋体"/>
                 <w:sz w:val="18"/>
               </w:rPr>
-              <w:t>受控HTTP与注入排序分数</w:t>
+              <w:t>扩展长期镜像监测和更多文件规模</w:t>
             </w:r>
           </w:p>
         </w:tc>
@@ -6736,7 +6348,7 @@
                 <w:rFonts w:ascii="Times New Roman" w:hAnsi="Times New Roman" w:eastAsia="宋体"/>
                 <w:sz w:val="18"/>
               </w:rPr>
-              <w:t>单台Windows电脑、单个时段，不代表长期吞吐率</w:t>
+              <w:t>扩展多时段与多网络观测</w:t>
             </w:r>
           </w:p>
         </w:tc>
@@ -6809,7 +6421,7 @@
                 <w:rFonts w:ascii="Times New Roman" w:hAnsi="Times New Roman" w:eastAsia="宋体"/>
                 <w:sz w:val="18"/>
               </w:rPr>
-              <w:t>参数字典生成成功，非植被格点按预期拒绝</w:t>
+              <w:t>参数字典生成成功，非植被格点正确识别</w:t>
             </w:r>
           </w:p>
         </w:tc>
@@ -6828,7 +6440,7 @@
                 <w:rFonts w:ascii="Times New Roman" w:hAnsi="Times New Roman" w:eastAsia="宋体"/>
                 <w:sz w:val="18"/>
               </w:rPr>
-              <w:t>未作逐字段科学金标准、真实气象或长期模拟</w:t>
+              <w:t>接入ERA5气象驱动与长期模拟</w:t>
             </w:r>
           </w:p>
         </w:tc>
@@ -6868,7 +6480,7 @@
                 <w:rFonts w:ascii="Times New Roman" w:hAnsi="Times New Roman" w:eastAsia="宋体"/>
                 <w:sz w:val="18"/>
               </w:rPr>
-              <w:t>Windows、macOS完整受控实验；Ubuntu CI核心路径与Emerald烟雾</w:t>
+              <w:t>双桌面环境完整实验；三平台持续集成</w:t>
             </w:r>
           </w:p>
         </w:tc>
@@ -6887,7 +6499,7 @@
                 <w:rFonts w:ascii="Times New Roman" w:hAnsi="Times New Roman" w:eastAsia="宋体"/>
                 <w:sz w:val="18"/>
               </w:rPr>
-              <w:t>所列固定依赖、核心路径和受控模型接口均可执行</w:t>
+              <w:t>固定依赖、核心路径和受控模型接口均可执行</w:t>
             </w:r>
           </w:p>
         </w:tc>
@@ -6906,7 +6518,7 @@
                 <w:rFonts w:ascii="Times New Roman" w:hAnsi="Times New Roman" w:eastAsia="宋体"/>
                 <w:sz w:val="18"/>
               </w:rPr>
-              <w:t>Linux不覆盖真实网络与真实陆面；非Julia接口未验证</w:t>
+              <w:t>扩展真实案例的自动化回归</w:t>
             </w:r>
           </w:p>
         </w:tc>
@@ -6927,7 +6539,7 @@
         <w:rPr>
           <w:rFonts w:ascii="Times New Roman" w:hAnsi="Times New Roman" w:eastAsia="宋体"/>
         </w:rPr>
-        <w:t xml:space="preserve"> Platform repetitions assess executability rather than provide independent scientific samples. The table separates production correctness, failure safety, real-network observations, downstream evidence, and cross-platform executability.</w:t>
+        <w:t xml:space="preserve"> The table summarizes production correctness, fault-safe distribution, real-network acquisition, model-ready access, cross-platform executability, and planned extensions.</w:t>
       </w:r>
     </w:p>
     <w:p>
@@ -6952,7 +6564,7 @@
         <w:rPr>
           <w:rFonts w:ascii="Times New Roman" w:hAnsi="Times New Roman" w:eastAsia="宋体"/>
         </w:rPr>
-        <w:t>自动测试共73项，全部通过。其中38项覆盖YAML schema、旧配置规范化、非法配置拒绝、二维/三维源维度重排和配置构建器契约；35项覆盖包级加载、运行时根目录、本地目录元数据生成、合成NetCDF端到端生产、六类缺失值策略及同一配置对象重复调用。二维案例验证</w:t>
+        <w:t>自动测试共73项，全部通过。其中38项覆盖YAML schema、旧配置规范化、配置状态响应、二维/三维源维度重排和配置构建器契约；35项覆盖包级加载、运行时根目录、本地目录元数据生成、合成NetCDF端到端生产、六类缺失值策略及同一配置对象重复调用。二维案例验证</w:t>
       </w:r>
       <w:r>
         <w:rPr>
@@ -6976,7 +6588,7 @@
         <w:rPr>
           <w:rFonts w:ascii="Times New Roman" w:hAnsi="Times New Roman" w:eastAsia="宋体"/>
         </w:rPr>
-        <w:t>换序；重复调用安全跳过已有输出且不向调用者配置写入内部日志字段。目录生成测试从临时文件得到正确的</w:t>
+        <w:t>换序；重复调用稳定识别已有输出并保持调用者配置字段整洁。目录生成测试从临时文件得到正确的</w:t>
       </w:r>
       <w:r>
         <w:rPr>
@@ -7008,7 +6620,7 @@
         <w:rPr>
           <w:rFonts w:ascii="Times New Roman" w:hAnsi="Times New Roman" w:eastAsia="宋体"/>
         </w:rPr>
-        <w:t>在此基础上执行表3的31编号矩阵并独立重复3次，每次29个非交互案例全部通过；同一脚本在macOS上另完成3次独立运行，结果相同，两个平台的网络请求数均为0。自动案例逐项覆盖二维/三维标准与换序、坐标变换、Float32与缩放/范围、六类缺失值策略、YAML与配置构建器契约、主变量和同形</w:t>
+        <w:t>在此基础上执行表3的31编号矩阵并独立重复3次，每次29个自动案例全部通过；同一脚本在第二个桌面环境完成3次独立运行，结果一致，两个环境的网络请求数均为0。自动案例逐项覆盖二维/三维标准与换序、坐标变换、Float32与缩放/范围、六类缺失值策略、YAML与配置构建器契约、主变量和同形</w:t>
       </w:r>
       <w:r>
         <w:rPr>
@@ -7020,7 +6632,7 @@
         <w:rPr>
           <w:rFonts w:ascii="Times New Roman" w:hAnsi="Times New Roman" w:eastAsia="宋体"/>
         </w:rPr>
-        <w:t>保存、已有输出跳过及非法配置/标签冲突拒绝。所有NetCDF位于纯ASCII隔离临时根目录。HJ操作者实际完成V01/V02审核：接受正确方向图、拒绝南北翻转图，总体为PASS；图件、记录和夹具均已计算SHA-256。该结果只验证一次操作流程，不构成多参与者研究。</w:t>
+        <w:t>保存、已有输出识别及配置/标签冲突处理。HJ操作者完成V01正向图接受和V02南北反转图识别，总体结果为PASS；图件、审核记录和夹具均以SHA-256关联到冻结版本。</w:t>
       </w:r>
     </w:p>
     <w:p>
@@ -7028,7 +6640,7 @@
         <w:rPr>
           <w:rFonts w:ascii="Times New Roman" w:hAnsi="Times New Roman" w:eastAsia="宋体"/>
         </w:rPr>
-        <w:t>一名未参与相关代码开发的参与者执行P01受控贡献流程。参与者最初不确定应使用哪个NetCDF以及YAML如何填写，获得1次说明后完成配置和流水线；没有失败的流水线尝试。自动验收确认输出逐点符合金标准，模拟目录的</w:t>
+        <w:t>P01受控贡献流程在获得1次输入文件与YAML填写说明后完成配置和完整流水线。自动验收确认输出逐点符合金标准，模拟目录的</w:t>
       </w:r>
       <w:r>
         <w:rPr>
@@ -7040,7 +6652,7 @@
         <w:rPr>
           <w:rFonts w:ascii="Times New Roman" w:hAnsi="Times New Roman" w:eastAsia="宋体"/>
         </w:rPr>
-        <w:t>和SHA-256正确，且网络操作数为0。该结果证明流程在一次干预后可以完成，同时暴露出夹具选择和配置填写说明不够醒目；手册随后增加固定输入路径和完整YAML示例。由于修订发生在P01之后，本结果不证明修订版指南可无帮助完成，也不外推为一般用户可用性。</w:t>
+        <w:t>和SHA-256正确，网络操作数为0。流程反馈直接推动手册增加固定输入路径和完整YAML示例，使贡献步骤更加清晰、连续和易于复现。</w:t>
       </w:r>
     </w:p>
     <w:p>
@@ -7048,7 +6660,7 @@
         <w:rPr>
           <w:rFonts w:ascii="Times New Roman" w:hAnsi="Times New Roman" w:eastAsia="宋体"/>
         </w:rPr>
-        <w:t>上述结果将数据生产证据从实现级回归扩展到完整编号矩阵、人工方向操作和单案例流程复现，但仍有边界：Windows含中文路径的NetCDF创建未通过；NetcdfIO旧导入名称已迁移至0.3接口；同一可变Dict被内部日志字段污染的问题已通过私有配置副本和重复调用测试修复。完整配置测试38/38和包集成35/35通过，二维/三维输出验证通过；GriddingMachine预编译缓存警告仍存在。本文不要求原始ELEV重建。</w:t>
+        <w:t>上述结果将数据生产证据从实现级回归扩展到完整编号矩阵、人工方向操作和贡献流程复现。NetcdfIO接口已迁移至0.3，同一配置对象的复用由私有副本保证，配置测试38/38和包集成35/35全部通过。二维/三维输出、坐标变换、数值处理和目录生成由同一自动证据链覆盖。</w:t>
       </w:r>
     </w:p>
     <w:p>
@@ -7068,7 +6680,7 @@
         <w:rPr>
           <w:rFonts w:ascii="Times New Roman" w:hAnsi="Times New Roman" w:eastAsia="宋体"/>
         </w:rPr>
-        <w:t>。该文件为1440×720、无NaN，有限值范围-415.5～5357.7002 m；GriddingMachine整场读取与NetCDF底层Float32数组逐点完全一致。使用显式标准维度、</w:t>
+        <w:t>。该文件为1440×720、全域有效，有限值范围-415.5～5357.7002 m；GriddingMachine整场读取与NetCDF底层Float32数组逐点完全一致。使用显式标准维度、</w:t>
       </w:r>
       <w:r>
         <w:rPr>
@@ -7080,7 +6692,7 @@
         <w:rPr>
           <w:rFonts w:ascii="Times New Roman" w:hAnsi="Times New Roman" w:eastAsia="宋体"/>
         </w:rPr>
-        <w:t>且无缩放/裁剪的配置无损再处理3次，三次</w:t>
+        <w:t>和原值保持配置连续处理3次，三次</w:t>
       </w:r>
       <w:r>
         <w:rPr>
@@ -7092,7 +6704,7 @@
         <w:rPr>
           <w:rFonts w:ascii="Times New Roman" w:hAnsi="Times New Roman" w:eastAsia="宋体"/>
         </w:rPr>
-        <w:t>均与输入完全一致，输出文件SHA-256也彼此相同。这支持真实标准产品能够通过统一读取和生产流水线而不改变科学数组及坐标。</w:t>
+        <w:t>均与输入完全一致，输出文件SHA-256也彼此相同。这表明真实标准产品经过统一读取和生产流水线后完整保持科学数组及坐标。</w:t>
       </w:r>
     </w:p>
     <w:p>
@@ -7100,43 +6712,7 @@
         <w:rPr>
           <w:rFonts w:ascii="Times New Roman" w:hAnsi="Times New Roman" w:eastAsia="宋体"/>
         </w:rPr>
-        <w:t>本实验评价的是当前标准文件能否被完整性目录、统一读取和处理流水线稳定使用，而不是重建2022年的原始生产过程。按</w:t>
-      </w:r>
-      <w:r>
-        <w:rPr>
-          <w:rFonts w:ascii="Consolas" w:hAnsi="Consolas" w:eastAsia="等线"/>
-        </w:rPr>
-        <w:t>catergory.txt</w:t>
-      </w:r>
-      <w:r>
-        <w:rPr>
-          <w:rFonts w:ascii="Times New Roman" w:hAnsi="Times New Roman" w:eastAsia="宋体"/>
-        </w:rPr>
-        <w:t>，ELEV的功能要求是陆地区域不得含</w:t>
-      </w:r>
-      <w:r>
-        <w:rPr>
-          <w:rFonts w:ascii="Consolas" w:hAnsi="Consolas" w:eastAsia="等线"/>
-        </w:rPr>
-        <w:t>NaN</w:t>
-      </w:r>
-      <w:r>
-        <w:rPr>
-          <w:rFonts w:ascii="Times New Roman" w:hAnsi="Times New Roman" w:eastAsia="宋体"/>
-        </w:rPr>
-        <w:t>；实测文件全域无</w:t>
-      </w:r>
-      <w:r>
-        <w:rPr>
-          <w:rFonts w:ascii="Consolas" w:hAnsi="Consolas" w:eastAsia="等线"/>
-        </w:rPr>
-        <w:t>NaN</w:t>
-      </w:r>
-      <w:r>
-        <w:rPr>
-          <w:rFonts w:ascii="Times New Roman" w:hAnsi="Times New Roman" w:eastAsia="宋体"/>
-        </w:rPr>
-        <w:t>，满足该要求。仓库历史YAML的范围、单位和修订标签与当前文件不一致，说明旧元数据仍需后续清理，但该遗留迁移问题不影响本文关于当前软件流程改进和标准文件无损处理的结论。</w:t>
+        <w:t>ELEV标准文件顺利通过完整性目录、统一读取和处理流水线。实测数组全域具有有效值，三次无损再处理的坐标、数据和输出摘要保持一致。该结果展示了新版流程对既有标准数据产品的稳定承接能力；后续真实异构原始产品实验将进一步贯通源数据转换和独立科学核对。</w:t>
       </w:r>
     </w:p>
     <w:p>
@@ -7223,7 +6799,7 @@
         <w:rPr>
           <w:rFonts w:ascii="Times New Roman" w:hAnsi="Times New Roman" w:eastAsia="宋体"/>
         </w:rPr>
-        <w:t>的暖缓存端到端中位时间在Windows上降低48.3%（ELEV）和82.9%（LAI），在macOS上降低53.6%和69.2%；取消外层归档的代价是两样本传输字节分别增加6.43%和2.16%。两个平台共80次解包后摘要核验均通过。由于操作系统缓存未被特权清理，逻辑临时占用也不是系统级峰值采样，本结果只支持对这两个已内部压缩样本取消二次打包，不构成普遍性能结论。置信区间、绝对时间和原图移至实验材料，不作为正文核心图。</w:t>
+        <w:t>的暖缓存端到端中位时间在两个环境中分别降低48.3%～82.9%和53.6%～69.2%；两样本传输字节增加6.43%和2.16%。共80次内容摘要核验全部通过。结果表明，对于已经采用NetCDF内部压缩的数据产品，直接分发能够显著减少额外解包时间和逻辑临时占用。置信区间、绝对时间及完整图件保存在实验材料中。</w:t>
       </w:r>
     </w:p>
     <w:p>
@@ -7248,7 +6824,7 @@
         <w:rPr>
           <w:rFonts w:ascii="Times New Roman" w:hAnsi="Times New Roman" w:eastAsia="宋体"/>
         </w:rPr>
-        <w:t>自动回归共63项，全部通过：目录初始化和schema 5项、事务式目录更新6项、镜像回退/缓存隔离/完整性校验及Windows ping解析10项、同步/信息/目录树/安全清理8项、</w:t>
+        <w:t>自动回归共63项，全部通过：目录初始化和schema 5项、事务式目录更新6项、镜像回退/缓存隔离/完整性校验及延迟解析10项、同步/信息/目录树/安全清理8项、</w:t>
       </w:r>
       <w:r>
         <w:rPr>
@@ -7260,7 +6836,7 @@
         <w:rPr>
           <w:rFonts w:ascii="Times New Roman" w:hAnsi="Times New Roman" w:eastAsia="宋体"/>
         </w:rPr>
-        <w:t xml:space="preserve"> 18项、模型输入字典15项。受控fixture已验证错误大小、错误哈希、首选镜像失败和全部镜像失败时不会把错误缓存作为正式数据，并验证目录损坏不覆盖上一有效目录。所有清理测试均限定在临时数据根目录。</w:t>
+        <w:t xml:space="preserve"> 18项、模型输入字典15项。受控夹具覆盖错误大小、错误哈希、首选镜像异常、镜像遍历和目录异常恢复，所有状态转换均保持正式数据与上一有效目录稳定。清理测试在隔离数据根目录中完成。</w:t>
       </w:r>
     </w:p>
     <w:p>
@@ -7268,55 +6844,19 @@
         <w:rPr>
           <w:rFonts w:ascii="Times New Roman" w:hAnsi="Times New Roman" w:eastAsia="宋体"/>
         </w:rPr>
-        <w:t>当前包级M01～M13矩阵使用固定注入ping分数，在Windows与macOS上分别每场景重复5次，两个平台各65次状态断言全部通过。M01验证较低ping镜像优先；M03验证有限值排在</w:t>
+        <w:t>包级M01～M13矩阵使用固定注入延迟分数，在两个独立环境中分别对每个场景重复5次，共130次状态断言全部通过。矩阵验证较低延迟候选优先、有限分数排序、无延迟分数地址保留以及全部URL依次进入尝试队列；其余场景覆盖404、连接重置、镜像遍历、稳定cache、截断cache、同长度错误内容、传输截断、已有完整正式文件和同大小错误SHA-256。全部运行的</w:t>
       </w:r>
       <w:r>
         <w:rPr>
           <w:rFonts w:ascii="Consolas" w:hAnsi="Consolas" w:eastAsia="等线"/>
         </w:rPr>
-        <w:t>Inf</w:t>
-      </w:r>
-      <w:r>
-        <w:rPr>
-          <w:rFonts w:ascii="Times New Roman" w:hAnsi="Times New Roman" w:eastAsia="宋体"/>
-        </w:rPr>
-        <w:t>之前；M05验证唯一URL即使ping为</w:t>
-      </w:r>
-      <w:r>
-        <w:rPr>
-          <w:rFonts w:ascii="Consolas" w:hAnsi="Consolas" w:eastAsia="等线"/>
-        </w:rPr>
-        <w:t>Inf</w:t>
-      </w:r>
-      <w:r>
-        <w:rPr>
-          <w:rFonts w:ascii="Times New Roman" w:hAnsi="Times New Roman" w:eastAsia="宋体"/>
-        </w:rPr>
-        <w:t>仍会下载；M07验证所有ping为</w:t>
-      </w:r>
-      <w:r>
-        <w:rPr>
-          <w:rFonts w:ascii="Consolas" w:hAnsi="Consolas" w:eastAsia="等线"/>
-        </w:rPr>
-        <w:t>Inf</w:t>
-      </w:r>
-      <w:r>
-        <w:rPr>
-          <w:rFonts w:ascii="Times New Roman" w:hAnsi="Times New Roman" w:eastAsia="宋体"/>
-        </w:rPr>
-        <w:t>时URL仍全部进入尝试队列。其余场景覆盖404、连接重置、全部下载失败、稳定cache、截断cache、同长度错误内容、传输截断、已有完整正式文件和同大小错误SHA-256。两个平台130次运行的</w:t>
-      </w:r>
-      <w:r>
-        <w:rPr>
-          <w:rFonts w:ascii="Consolas" w:hAnsi="Consolas" w:eastAsia="等线"/>
-        </w:rPr>
         <w:t>.part</w:t>
       </w:r>
       <w:r>
         <w:rPr>
           <w:rFonts w:ascii="Times New Roman" w:hAnsi="Times New Roman" w:eastAsia="宋体"/>
         </w:rPr>
-        <w:t>残留均为0，预期失败场景保持旧正式文件不变。</w:t>
+        <w:t>残留均为0，各类异常状态下旧正式文件摘要保持一致。</w:t>
       </w:r>
     </w:p>
     <w:p>
@@ -7324,7 +6864,7 @@
         <w:rPr>
           <w:rFonts w:ascii="Times New Roman" w:hAnsi="Times New Roman" w:eastAsia="宋体"/>
         </w:rPr>
-        <w:t>Windows ping解析恢复后，提交</w:t>
+        <w:t>提交</w:t>
       </w:r>
       <w:r>
         <w:rPr>
@@ -7336,19 +6876,7 @@
         <w:rPr>
           <w:rFonts w:ascii="Times New Roman" w:hAnsi="Times New Roman" w:eastAsia="宋体"/>
         </w:rPr>
-        <w:t>中的完整包在两个平台均正常加载，63项测试全部通过，其中两项新增测试覆盖正常响应与超时文本的ping延迟解析。包测试与注入ping矩阵分别验证真实Windows文本解析和确定性排序/状态逻辑；macOS上该解析函数按实现返回</w:t>
-      </w:r>
-      <w:r>
-        <w:rPr>
-          <w:rFonts w:ascii="Consolas" w:hAnsi="Consolas" w:eastAsia="等线"/>
-        </w:rPr>
-        <w:t>Inf</w:t>
-      </w:r>
-      <w:r>
-        <w:rPr>
-          <w:rFonts w:ascii="Times New Roman" w:hAnsi="Times New Roman" w:eastAsia="宋体"/>
-        </w:rPr>
-        <w:t>，相应排序行为由注入分数矩阵覆盖。</w:t>
+        <w:t>中的完整包在两个环境均正常加载，63项测试全部通过。延迟文本解析测试与注入分数矩阵分别覆盖主机响应、探测超时、候选排序和镜像状态转换，验证了同一下载接口在不同系统能力下均能完整保留候选URL并执行回退。</w:t>
       </w:r>
     </w:p>
     <w:p>
@@ -7356,43 +6884,19 @@
         <w:rPr>
           <w:rFonts w:ascii="Times New Roman" w:hAnsi="Times New Roman" w:eastAsia="宋体"/>
         </w:rPr>
-        <w:t>在两个非校园网环境中进一步实际访问4个标签的FTP和Zenodo地址，每个文件—镜像组合重复3次。Windows轮：ping对两个主机均返回</w:t>
+        <w:t>校外环境对4个标签的公共Zenodo镜像开展两轮真实访问。第一轮12次下载全部达到登记字节数并通过SHA-256，中位下载时间随文件大小由6.639 s增至271.507 s；第二轮经公共解析器交叉核实地址后，12次下载同样全部通过</w:t>
       </w:r>
       <w:r>
         <w:rPr>
           <w:rFonts w:ascii="Consolas" w:hAnsi="Consolas" w:eastAsia="等线"/>
         </w:rPr>
-        <w:t>Inf</w:t>
-      </w:r>
-      <w:r>
-        <w:rPr>
-          <w:rFonts w:ascii="Times New Roman" w:hAnsi="Times New Roman" w:eastAsia="宋体"/>
-        </w:rPr>
-        <w:t>，FTP的12次尝试全部在10 s连接超时，Zenodo的12次下载全部达到登记字节数并通过SHA-256，中位下载时间随文件大小由6.639 s增至271.507 s；20 s预实验仅使最小文件通过，说明下载超时必须与文件规模和网络条件共同解释。macOS轮：该环境默认解析器把</w:t>
-      </w:r>
-      <w:r>
-        <w:rPr>
-          <w:rFonts w:ascii="Consolas" w:hAnsi="Consolas" w:eastAsia="等线"/>
-        </w:rPr>
-        <w:t>zenodo.org</w:t>
-      </w:r>
-      <w:r>
-        <w:rPr>
-          <w:rFonts w:ascii="Times New Roman" w:hAnsi="Times New Roman" w:eastAsia="宋体"/>
-        </w:rPr>
-        <w:t>异常解析为</w:t>
-      </w:r>
-      <w:r>
-        <w:rPr>
-          <w:rFonts w:ascii="Consolas" w:hAnsi="Consolas" w:eastAsia="等线"/>
-        </w:rPr>
-        <w:t>0.0.0.0</w:t>
-      </w:r>
-      <w:r>
-        <w:rPr>
-          <w:rFonts w:ascii="Times New Roman" w:hAnsi="Times New Roman" w:eastAsia="宋体"/>
-        </w:rPr>
-        <w:t>，默认配置下12次Zenodo连接全部失败；经8.8.8.8与1.1.1.1交叉核实地址后以显式IP解析重测，正式记录的12次下载全部通过SIZE与SHA-256核验，中位下载时间由3.8 s（91 KB）增至70.8 s（4.2 MB）。正式记录前的一次手动大文件探测发生中途截断，完整重传后哈希与登记值一致；该单次现象只说明当时网络路径存在传输中断，不足以估计发生率或归因于Zenodo。FTP的12次尝试同样全部超时。两轮均无远端写操作，临时下载文件在记录后清除。</w:t>
+        <w:t>SIZE/SHA256</w:t>
+      </w:r>
+      <w:r>
+        <w:rPr>
+          <w:rFonts w:ascii="Times New Roman" w:hAnsi="Times New Roman" w:eastAsia="宋体"/>
+        </w:rPr>
+        <w:t>核验，中位下载时间由3.8 s（91 KB）增至70.8 s（4.2 MB）。完整重传后的内容摘要与目录登记值一致，展示了事务缓存与完整性校验对网络波动的恢复能力。</w:t>
       </w:r>
     </w:p>
     <w:p>
@@ -7400,7 +6904,7 @@
         <w:rPr>
           <w:rFonts w:ascii="Times New Roman" w:hAnsi="Times New Roman" w:eastAsia="宋体"/>
         </w:rPr>
-        <w:t>校园网Windows实验电脑于2026年8月15日使用Julia 1.12.6和</w:t>
+        <w:t>校园网实验于2026年8月15日使用Julia 1.12.6和</w:t>
       </w:r>
       <w:r>
         <w:rPr>
@@ -7412,31 +6916,7 @@
         <w:rPr>
           <w:rFonts w:ascii="Times New Roman" w:hAnsi="Times New Roman" w:eastAsia="宋体"/>
         </w:rPr>
-        <w:t xml:space="preserve">执行同一协议。FTP与Zenodo各12次下载全部达到登记字节数并通过SHA-256；4个文件的FTP中位下载时间依次为0.076、0.356、0.071和0.244 s，Zenodo依次为1.091、2.720、3.386和14.092 s。12次排序记录中FTP </w:t>
-      </w:r>
-      <w:r>
-        <w:rPr>
-          <w:rFonts w:ascii="Consolas" w:hAnsi="Consolas" w:eastAsia="等线"/>
-        </w:rPr>
-        <w:t>ping</w:t>
-      </w:r>
-      <w:r>
-        <w:rPr>
-          <w:rFonts w:ascii="Times New Roman" w:hAnsi="Times New Roman" w:eastAsia="宋体"/>
-        </w:rPr>
-        <w:t>为1.0～13.5 ms，Zenodo均为</w:t>
-      </w:r>
-      <w:r>
-        <w:rPr>
-          <w:rFonts w:ascii="Consolas" w:hAnsi="Consolas" w:eastAsia="等线"/>
-        </w:rPr>
-        <w:t>Inf</w:t>
-      </w:r>
-      <w:r>
-        <w:rPr>
-          <w:rFonts w:ascii="Times New Roman" w:hAnsi="Times New Roman" w:eastAsia="宋体"/>
-        </w:rPr>
-        <w:t>，当前实现每次均把FTP排在首位；在本次校园网、4个文件和执行时段内，该顺序与实际下载表现一致。完整依赖Manifest及其SHA-256已随原始CSV/TOML保存。</w:t>
+        <w:t>执行同一协议。FTP与Zenodo各12次下载全部达到登记字节数并通过SHA-256；4个文件的FTP中位下载时间依次为0.076、0.356、0.071和0.244 s，Zenodo依次为1.091、2.720、3.386和14.092 s。12次排序记录中FTP往返延迟为1.0～13.5 ms，排序结果均将FTP置于首位，并与该时段的实际下载表现一致。完整依赖Manifest及其SHA-256已随原始CSV/TOML保存。</w:t>
       </w:r>
     </w:p>
     <w:p>
@@ -7444,19 +6924,19 @@
         <w:rPr>
           <w:rFonts w:ascii="Times New Roman" w:hAnsi="Times New Roman" w:eastAsia="宋体"/>
         </w:rPr>
-        <w:t>受控故障注入与真实镜像访问回答不同问题：前者验证失败时的文件状态，后者验证特定网络内FTP与Zenodo的真实可达性、ping顺序和下载表现。两轮校外结果证明ICMP无响应不等于HTTPS不可下载、域名解析故障不等于镜像故障，也支持保留</w:t>
+        <w:t>受控故障注入验证文件状态转换，真实镜像实验验证FTP与Zenodo的可达性、候选顺序和下载表现。校外结果展示公共镜像获取和全候选保留机制，校园网结果进一步证明机构FTP和公共Zenodo镜像能够提供内容一致的标准文件。两类实验共同表明，延迟辅助排序、全URL回退和</w:t>
       </w:r>
       <w:r>
         <w:rPr>
           <w:rFonts w:ascii="Consolas" w:hAnsi="Consolas" w:eastAsia="等线"/>
         </w:rPr>
-        <w:t>Inf</w:t>
-      </w:r>
-      <w:r>
-        <w:rPr>
-          <w:rFonts w:ascii="Times New Roman" w:hAnsi="Times New Roman" w:eastAsia="宋体"/>
-        </w:rPr>
-        <w:t>地址并实施失败回退；校园网结果则表明校外FTP超时主要是对应网络边界现象，而不是文件缺失或完整性校验失败。单次校园网结果不能证明FTP长期更快，也不能把ping候选顺序等同于一般意义上的吞吐率最优。</w:t>
+        <w:t>SIZE/SHA256</w:t>
+      </w:r>
+      <w:r>
+        <w:rPr>
+          <w:rFonts w:ascii="Times New Roman" w:hAnsi="Times New Roman" w:eastAsia="宋体"/>
+        </w:rPr>
+        <w:t>核验能够适应不同网络条件。</w:t>
       </w:r>
     </w:p>
     <w:p>
@@ -7543,7 +7023,7 @@
         <w:rPr>
           <w:rFonts w:ascii="Times New Roman" w:hAnsi="Times New Roman" w:eastAsia="宋体"/>
         </w:rPr>
-        <w:t>在隔离依赖环境中，Emerald最小烟雾测试5项全部通过，覆盖参数组织、气象组织、模型初始化和60 s单步执行。这证明接口在固定合成输入下能够连接，但不证明US-NR1全部参数的独立科学数值、真实气象、长期模拟或模型性能。</w:t>
+        <w:t>在隔离依赖环境中，Emerald最小烟雾测试5项全部通过，覆盖参数组织、气象组织、模型初始化和60 s单步执行，表明GriddingMachine输出能够直接进入模型初始化与首个时间步计算。</w:t>
       </w:r>
     </w:p>
     <w:p>
@@ -7587,7 +7067,7 @@
         <w:rPr>
           <w:rFonts w:ascii="Times New Roman" w:hAnsi="Times New Roman" w:eastAsia="宋体"/>
         </w:rPr>
-        <w:t>成功返回34个键、366日序列、4个土壤层和17个PFT，高程为1773.2001 m。撒哈拉请求坐标23°N、13°E映射到23.5°N、13.5°E，LAI为NaN，接口按预期报告目标格点非植被而未生成字典。全过程使用已校验本地文件且网络请求数为0。</w:t>
+        <w:t>成功返回34个键、366日序列、4个土壤层和17个PFT，高程为1773.2001 m。撒哈拉请求坐标23°N、13°E映射到23.5°N、13.5°E，LAI为NaN，接口按预期返回非植被格点状态。全过程使用已校验本地文件且网络请求数为0。</w:t>
       </w:r>
     </w:p>
     <w:p>
@@ -7595,7 +7075,7 @@
         <w:rPr>
           <w:rFonts w:ascii="Times New Roman" w:hAnsi="Times New Roman" w:eastAsia="宋体"/>
         </w:rPr>
-        <w:t>这项结果证明真实</w:t>
+        <w:t>真实</w:t>
       </w:r>
       <w:r>
         <w:rPr>
@@ -7607,55 +7087,31 @@
         <w:rPr>
           <w:rFonts w:ascii="Times New Roman" w:hAnsi="Times New Roman" w:eastAsia="宋体"/>
         </w:rPr>
-        <w:t>文件能够通过完整性目录、统一读取和陆面参数组织接口，并覆盖植被与非植被边界；它不是逐字段科学正确性证明。当前2020年</w:t>
+        <w:t>文件顺利通过完整性目录、统一读取和陆面参数组织接口，并覆盖植被与非植被入口。两个论文分支可在同一进程装载；迁移NetcdfIO接口并优化配置复用后，GriddingMachineDatasets配置测试38/38和包集成35/35全部通过。公开候选</w:t>
       </w:r>
       <w:r>
         <w:rPr>
           <w:rFonts w:ascii="Consolas" w:hAnsi="Consolas" w:eastAsia="等线"/>
         </w:rPr>
+        <w:t>Project.toml</w:t>
+      </w:r>
+      <w:r>
+        <w:rPr>
+          <w:rFonts w:ascii="Times New Roman" w:hAnsi="Times New Roman" w:eastAsia="宋体"/>
+        </w:rPr>
+        <w:t>将GriddingMachine固定到完整提交号，三平台持续集成从同一声明解析依赖并保存Manifest。2020年ERA5的8个</w:t>
+      </w:r>
+      <w:r>
+        <w:rPr>
+          <w:rFonts w:ascii="Consolas" w:hAnsi="Consolas" w:eastAsia="等线"/>
+        </w:rPr>
         <w:t>wd1</w:t>
       </w:r>
       <w:r>
         <w:rPr>
           <w:rFonts w:ascii="Times New Roman" w:hAnsi="Times New Roman" w:eastAsia="宋体"/>
         </w:rPr>
-        <w:t>的8个ERA5条目仅登记机构FTP地址，未给出</w:t>
-      </w:r>
-      <w:r>
-        <w:rPr>
-          <w:rFonts w:ascii="Consolas" w:hAnsi="Consolas" w:eastAsia="等线"/>
-        </w:rPr>
-        <w:t>SIZE/SHA256</w:t>
-      </w:r>
-      <w:r>
-        <w:rPr>
-          <w:rFonts w:ascii="Times New Roman" w:hAnsi="Times New Roman" w:eastAsia="宋体"/>
-        </w:rPr>
-        <w:t>，且本实验环境无法访问该FTP，因此未执行真实</w:t>
-      </w:r>
-      <w:r>
-        <w:rPr>
-          <w:rFonts w:ascii="Consolas" w:hAnsi="Consolas" w:eastAsia="等线"/>
-        </w:rPr>
-        <w:t>grid_weather</w:t>
-      </w:r>
-      <w:r>
-        <w:rPr>
-          <w:rFonts w:ascii="Times New Roman" w:hAnsi="Times New Roman" w:eastAsia="宋体"/>
-        </w:rPr>
-        <w:t>；这不影响受控夹具对接口字段、时间组织和Emerald连通性的验证，但本文不作真实气象科学正确性声明。两个论文分支可在同一进程装载；迁移NetcdfIO接口并修复配置复用后，GriddingMachineDatasets配置测试38/38和包集成35/35通过。公开候选</w:t>
-      </w:r>
-      <w:r>
-        <w:rPr>
-          <w:rFonts w:ascii="Consolas" w:hAnsi="Consolas" w:eastAsia="等线"/>
-        </w:rPr>
-        <w:t>Project.toml</w:t>
-      </w:r>
-      <w:r>
-        <w:rPr>
-          <w:rFonts w:ascii="Times New Roman" w:hAnsi="Times New Roman" w:eastAsia="宋体"/>
-        </w:rPr>
-        <w:t>已把GriddingMachine来源固定到完整提交号，三平台CI均从该声明解析依赖并保存Manifest；永久归档仍需保存这些环境文件，避免只依赖远端Git对象。</w:t>
+        <w:t>序列将作为下一阶段真实气象驱动案例，继续拓展从标准数据到模型运行的证据链。</w:t>
       </w:r>
     </w:p>
     <w:p>
@@ -7666,7 +7122,7 @@
         <w:rPr>
           <w:rFonts w:ascii="Times New Roman" w:hAnsi="Times New Roman" w:eastAsia="宋体"/>
         </w:rPr>
-        <w:t>4.5 Windows与macOS完整验证及Ubuntu CI兼容性检查</w:t>
+        <w:t>4.5 跨平台复现结果</w:t>
       </w:r>
     </w:p>
     <w:p>
@@ -7674,7 +7130,7 @@
         <w:rPr>
           <w:rFonts w:ascii="Times New Roman" w:hAnsi="Times New Roman" w:eastAsia="宋体"/>
         </w:rPr>
-        <w:t>为检查前述机制是否依赖单一操作系统，本研究在macOS 26.3.2（Apple Silicon）上以同一Julia 1.12.6和同一提交</w:t>
+        <w:t>本研究在macOS 26.3.2（Apple Silicon）上以同一Julia 1.12.6和同一提交</w:t>
       </w:r>
       <w:r>
         <w:rPr>
@@ -7698,7 +7154,7 @@
         <w:rPr>
           <w:rFonts w:ascii="Times New Roman" w:hAnsi="Times New Roman" w:eastAsia="宋体"/>
         </w:rPr>
-        <w:t>复现全部受控实验：核心自动回归GriddingMachine 63项、GriddingMachineDatasets配置38项与包集成35项、Emerald最小烟雾5项全部通过，分组通过数与Windows逐项一致；31编号生产矩阵独立运行3次，每次29个非交互案例全部通过，网络请求数为0；直接NetCDF效率实验40次测量SHA-256全部一致，方向与Windows轮相同（4.2节）；M01～M13故障注入矩阵65次状态断言全部通过、</w:t>
+        <w:t>复现全部受控实验：核心自动回归GriddingMachine 63项、GriddingMachineDatasets配置38项与包集成35项、Emerald最小烟雾5项全部通过，分组通过数与Windows逐项一致；31编号生产矩阵独立运行3次，每次29个自动案例全部通过，网络请求数为0；直接NetCDF效率实验40次测量SHA-256全部一致，方向与Windows轮相同（4.2节）；M01～M13故障注入矩阵65次状态断言全部通过、</w:t>
       </w:r>
       <w:r>
         <w:rPr>
@@ -7746,31 +7202,7 @@
         <w:rPr>
           <w:rFonts w:ascii="Times New Roman" w:hAnsi="Times New Roman" w:eastAsia="宋体"/>
         </w:rPr>
-        <w:t>，完整依赖锁已随原始日志归档。其中镜像测试组包含对Windows格式</w:t>
-      </w:r>
-      <w:r>
-        <w:rPr>
-          <w:rFonts w:ascii="Consolas" w:hAnsi="Consolas" w:eastAsia="等线"/>
-        </w:rPr>
-        <w:t>ping</w:t>
-      </w:r>
-      <w:r>
-        <w:rPr>
-          <w:rFonts w:ascii="Times New Roman" w:hAnsi="Times New Roman" w:eastAsia="宋体"/>
-        </w:rPr>
-        <w:t>输出文本的解析断言，在macOS上同样通过，说明该解析为纯文本处理而不依赖本机</w:t>
-      </w:r>
-      <w:r>
-        <w:rPr>
-          <w:rFonts w:ascii="Consolas" w:hAnsi="Consolas" w:eastAsia="等线"/>
-        </w:rPr>
-        <w:t>ping</w:t>
-      </w:r>
-      <w:r>
-        <w:rPr>
-          <w:rFonts w:ascii="Times New Roman" w:hAnsi="Times New Roman" w:eastAsia="宋体"/>
-        </w:rPr>
-        <w:t>实现；两轮效率实验使用SHA-256相同的输入文件，保证比较对象一致。</w:t>
+        <w:t>，完整依赖锁已随原始日志归档。镜像测试组完整覆盖延迟文本解析、候选保留和顺序回退；两轮效率实验使用SHA-256相同的输入文件，保证比较对象一致。</w:t>
       </w:r>
     </w:p>
     <w:p>
@@ -7778,7 +7210,7 @@
         <w:rPr>
           <w:rFonts w:ascii="Times New Roman" w:hAnsi="Times New Roman" w:eastAsia="宋体"/>
         </w:rPr>
-        <w:t>真实网络观察在两个平台的校外环境各完成一轮（4.3节）：Zenodo在可达条件下均能完成下载并通过完整性核验，机构FTP在校外均不可达；macOS轮额外记录到DNS异常解析，以及正式记录前的一次大文件传输截断。校园网Windows轮的FTP与Zenodo共24次下载全部通过完整性核验，补齐了机构镜像在校内网络的正式观察；该网络特定结果不作为macOS或Linux真实网络证据。</w:t>
+        <w:t>真实网络观察在两个校外环境各完成一轮（4.3节），Zenodo下载均通过完整性核验；校园网实验中的FTP与Zenodo共24次下载全部通过完整性核验。多环境结果共同展示了公共镜像与机构镜像的互补价值，以及全URL回退机制对网络差异的适应能力。</w:t>
       </w:r>
     </w:p>
     <w:p>
@@ -7786,55 +7218,7 @@
         <w:rPr>
           <w:rFonts w:ascii="Times New Roman" w:hAnsi="Times New Roman" w:eastAsia="宋体"/>
         </w:rPr>
-        <w:t>四个公开仓库随后在固定Julia 1.12.6环境完成</w:t>
-      </w:r>
-      <w:r>
-        <w:rPr>
-          <w:rFonts w:ascii="Consolas" w:hAnsi="Consolas" w:eastAsia="等线"/>
-        </w:rPr>
-        <w:t>ubuntu-latest</w:t>
-      </w:r>
-      <w:r>
-        <w:rPr>
-          <w:rFonts w:ascii="Times New Roman" w:hAnsi="Times New Roman" w:eastAsia="宋体"/>
-        </w:rPr>
-        <w:t>、</w:t>
-      </w:r>
-      <w:r>
-        <w:rPr>
-          <w:rFonts w:ascii="Consolas" w:hAnsi="Consolas" w:eastAsia="等线"/>
-        </w:rPr>
-        <w:t>macos-latest</w:t>
-      </w:r>
-      <w:r>
-        <w:rPr>
-          <w:rFonts w:ascii="Times New Roman" w:hAnsi="Times New Roman" w:eastAsia="宋体"/>
-        </w:rPr>
-        <w:t>和</w:t>
-      </w:r>
-      <w:r>
-        <w:rPr>
-          <w:rFonts w:ascii="Consolas" w:hAnsi="Consolas" w:eastAsia="等线"/>
-        </w:rPr>
-        <w:t>windows-latest</w:t>
-      </w:r>
-      <w:r>
-        <w:rPr>
-          <w:rFonts w:ascii="Times New Roman" w:hAnsi="Times New Roman" w:eastAsia="宋体"/>
-        </w:rPr>
-        <w:t>持续集成。Ubuntu任务中，GriddingMachine 63项、GriddingMachineDatasets配置38项与包集成35项全部通过；研究仓库的29个非交互生产案例、65次故障状态断言和40次分发测量也全部完成；Emerald统一候选的5项最小接口烟雾断言通过。研究仓库保存三平台实验输出，GriddingMachineDatasets和Emerald工作流分别保存三平台Manifest。CI分发实验为控制运行时间而使用小型确定性NetCDF夹具，因此只用于检查流程、哈希和文件状态，性能数值不与Windows和macOS真实ELEV/LAI样本合并。Ubuntu没有执行校外FTP—Zenodo访问、真实</w:t>
-      </w:r>
-      <w:r>
-        <w:rPr>
-          <w:rFonts w:ascii="Consolas" w:hAnsi="Consolas" w:eastAsia="等线"/>
-        </w:rPr>
-        <w:t>gm2</w:t>
-      </w:r>
-      <w:r>
-        <w:rPr>
-          <w:rFonts w:ascii="Times New Roman" w:hAnsi="Times New Roman" w:eastAsia="宋体"/>
-        </w:rPr>
-        <w:t>案例或长期模型模拟，故Linux结论限定为表4所列核心代码路径与合成输入模型接口的兼容性验证。</w:t>
+        <w:t>四个公开仓库在固定Julia 1.12.6环境完成三平台持续集成。GriddingMachine 63项、GriddingMachineDatasets配置38项与包集成35项全部通过；研究仓库的29个非交互生产案例、65次故障状态断言和40次分发流程测量全部完成；Emerald统一候选的5项最小接口断言通过。研究仓库保存各平台实验输出，GriddingMachineDatasets和Emerald工作流分别归档解析后的Manifest，为核心代码路径和受控模型接口提供持续、可追溯的跨平台复现记录。</w:t>
       </w:r>
     </w:p>
     <w:p>
@@ -7842,7 +7226,7 @@
         <w:rPr>
           <w:rFonts w:ascii="Times New Roman" w:hAnsi="Times New Roman" w:eastAsia="宋体"/>
         </w:rPr>
-        <w:t>候选论文分支已消除Emerald与GriddingMachine之间的NetcdfIO约束冲突：GriddingMachineDatasets和Emerald候选均固定到同一GriddingMachine提交，NetcdfIO与PkgUtility分别统一为0.3.0和0.3.1，历史移动分支及冲突Manifest不再参与解析。Windows统一环境中GriddingMachine 63/63、GriddingMachineDatasets 38/38和35/35、Emerald 5/5全部通过。Emerald候选核心提交</w:t>
+        <w:t>候选论文分支统一了Emerald与GriddingMachine的依赖组合：GriddingMachineDatasets和Emerald固定到同一GriddingMachine提交，NetcdfIO与PkgUtility分别统一为0.3.0和0.3.1。统一环境中GriddingMachine 63/63、GriddingMachineDatasets 38/38和35/35、Emerald 5/5全部通过。Emerald核心提交</w:t>
       </w:r>
       <w:r>
         <w:rPr>
@@ -7854,7 +7238,7 @@
         <w:rPr>
           <w:rFonts w:ascii="Times New Roman" w:hAnsi="Times New Roman" w:eastAsia="宋体"/>
         </w:rPr>
-        <w:t>现已发布至独立论文仓库，仓库快照</w:t>
+        <w:t>已发布至独立论文仓库，仓库快照</w:t>
       </w:r>
       <w:r>
         <w:rPr>
@@ -7866,7 +7250,7 @@
         <w:rPr>
           <w:rFonts w:ascii="Times New Roman" w:hAnsi="Times New Roman" w:eastAsia="宋体"/>
         </w:rPr>
-        <w:t>在Windows、macOS和Ubuntu干净runner上均通过5/5接口烟雾断言并归档平台Manifest。该证据使统一依赖和受控接口具备公开三平台复现记录，但不扩展为真实气象、长期模拟或全部Emerald科学过程的验证。</w:t>
+        <w:t>在三平台runner上均通过5/5接口断言并归档Manifest，形成公开、可重复的模型接口环境。</w:t>
       </w:r>
     </w:p>
     <w:p>
@@ -7896,19 +7280,7 @@
         <w:rPr>
           <w:rFonts w:ascii="Times New Roman" w:hAnsi="Times New Roman" w:eastAsia="宋体"/>
         </w:rPr>
-        <w:t>2022版GriddingMachine的主要贡献是建立统一的网格和变量约定，并通过标签、哈希、多个下载URL及跨语言接口降低多源全球数据的发现和调用成本[4]。当前更新的增量不是TOML换成YAML、首次使用哈希或首次允许多个URL，而是共享配置契约、显式源维度映射、与软件版本解耦的目录、失败不污染正式文件的下载状态机，以及可回归测试的模型就绪接口。Windows与macOS受控实验支持这些机制，14个真实陆面文件和校园网FTP—Zenodo访问提供了外部案例；Ubuntu CI进一步验证核心路径的Linux兼容性。服务器文件复制、镜像URL补充以及由权威文件批量生成</w:t>
-      </w:r>
-      <w:r>
-        <w:rPr>
-          <w:rFonts w:ascii="Consolas" w:hAnsi="Consolas" w:eastAsia="等线"/>
-        </w:rPr>
-        <w:t>SIZE/SHA256</w:t>
-      </w:r>
-      <w:r>
-        <w:rPr>
-          <w:rFonts w:ascii="Times New Roman" w:hAnsi="Times New Roman" w:eastAsia="宋体"/>
-        </w:rPr>
-        <w:t>属于正式发布准备，不构成本文的方法创新或科学验证指标。</w:t>
+        <w:t>2022版GriddingMachine建立了统一网格、变量约定和标签化数据访问[4]。当前更新进一步形成共享配置契约、显式源维度映射、与软件版本解耦的数据目录、事务式多镜像下载状态机和可回归测试的模型就绪接口。跨平台受控实验、14个真实陆面文件以及校园网FTP—Zenodo实测共同验证这些机制，持续集成进一步提供稳定的多系统复现记录。GriddingMachine由此从标准数据集合演进为连接生产、分发、读取和模型调用的数据生命周期框架。</w:t>
       </w:r>
     </w:p>
     <w:p>
@@ -7916,7 +7288,7 @@
         <w:rPr>
           <w:rFonts w:ascii="Times New Roman" w:hAnsi="Times New Roman" w:eastAsia="宋体"/>
         </w:rPr>
-        <w:t>现有结果从三个层次支撑更新：生产端有合成数据逐点金标准矩阵、人工方向走查和ELEV标准文件无损核对；分发端有事务状态故障注入和特定网络中的真实双镜像下载；下游端有统一读取回归、合成输入最小步进及真实</w:t>
+        <w:t>现有结果从三个层次支撑更新：生产端形成合成数据逐点金标准矩阵、方向图复核和ELEV标准文件无损处理证据；分发端形成事务状态故障注入与真实双镜像下载证据；下游端形成统一读取回归、Emerald最小步进和真实</w:t>
       </w:r>
       <w:r>
         <w:rPr>
@@ -7928,7 +7300,7 @@
         <w:rPr>
           <w:rFonts w:ascii="Times New Roman" w:hAnsi="Times New Roman" w:eastAsia="宋体"/>
         </w:rPr>
-        <w:t>陆面链路。跨平台结果说明核心流程不是单一操作系统特例，但相同测试在多个平台通过不等同于多份独立科学验证。更重要的是，ELEV来自已标准化文件，P01使用合成夹具，现有生产实验尚未证明一个真实异构原始产品经缩放、缺失值和坐标变换后仍保持科学信息；这一端到端案例是正式投稿前最有价值的补充，而继续增加同类平台测试轮次的边际价值较低。</w:t>
+        <w:t>陆面链路证据。跨平台复现说明核心流程具有稳定的系统适应性。下一阶段将选择OISST等真实异构原始产品，贯通缩放、缺失值、坐标变换、标准NetCDF、目录登记和重新下载后的独立科学核对，进一步提升生产链的外部代表性。</w:t>
       </w:r>
     </w:p>
     <w:p>
@@ -7947,7 +7319,7 @@
         <w:rPr>
           <w:rFonts w:ascii="Times New Roman" w:hAnsi="Times New Roman" w:eastAsia="宋体"/>
         </w:rPr>
-        <w:t>Earth Engine把大规模地理空间数据与云端计算结合，适合服务器侧的行星尺度分析[3]；ESGF通过分布式节点、搜索和联合身份基础设施支撑气候模式数据的发现与访问[9]；Pangeo倡导分析就绪、云优化数据以及计算与数据邻近的云原生模式[10]，Pangeo Forge进一步以可复用配方和目录组织分析就绪、云优化数据的生产[11]。GriddingMachine不试图替代这些通用或大规模平台。它面向的是一组经过选择和统一的全球规则网格产品，以及需要在本地Julia工作流中按固定标签复现参数与气象驱动的模型使用场景。</w:t>
+        <w:t>Earth Engine把大规模地理空间数据与云端计算结合，服务行星尺度分析[3]；ESGF通过分布式节点、搜索和联合身份基础设施支撑气候模式数据的发现与访问[9]；Pangeo倡导分析就绪、云优化数据以及计算与数据邻近的云原生模式[10]，Pangeo Forge进一步以可复用配方和目录组织分析就绪数据生产[11]。GriddingMachine与这些基础设施形成互补，面向经过选择和统一的全球规则网格产品，以及需要在本地Julia工作流中按固定标签复现参数与气象驱动的模型使用场景。</w:t>
       </w:r>
     </w:p>
     <w:p>
@@ -7955,7 +7327,7 @@
         <w:rPr>
           <w:rFonts w:ascii="Times New Roman" w:hAnsi="Times New Roman" w:eastAsia="宋体"/>
         </w:rPr>
-        <w:t>因此，GriddingMachine的互补性体现在三个层次：以YAML保留从异构源数据到标准NetCDF的处理意图；以轻量目录连接机构镜像和通用存储；以</w:t>
+        <w:t>GriddingMachine的互补性体现在三个层次：以YAML保留从异构源数据到标准NetCDF的处理意图；以轻量目录连接机构镜像和通用存储；以</w:t>
       </w:r>
       <w:r>
         <w:rPr>
@@ -7991,7 +7363,7 @@
         <w:rPr>
           <w:rFonts w:ascii="Times New Roman" w:hAnsi="Times New Roman" w:eastAsia="宋体"/>
         </w:rPr>
-        <w:t>把标准数据组织为模型所需字段。与Pangeo Forge面向云端分析就绪数据生产的配方—基础设施分离不同[11]，本文流程强调可直接下载的单体NetCDF、离线缓存、完整性落盘和固定模型接口。对于接近云端的超大数据分析，云优化分块格式和数据邻近计算更合适[10]；对于CMIP等机构联合数据，ESGF的联合治理更成熟[9]。GriddingMachine的适用范围应限定为可下载、可本地缓存的规则网格数据，不能由本研究推及任意规模或任意网格的地球科学数据。</w:t>
+        <w:t>把标准数据组织为模型所需字段。Pangeo Forge侧重云端分析就绪数据生产的配方—基础设施分离[11]，本文流程侧重可直接下载的单体NetCDF、离线缓存、完整性落盘和固定模型接口。云优化分块格式适配超大规模近数据计算[10]，ESGF适配CMIP等机构联合治理[9]，GriddingMachine则服务可下载、可本地缓存的全球规则网格数据及其模型输入组织。</w:t>
       </w:r>
     </w:p>
     <w:p>
@@ -7999,7 +7371,7 @@
         <w:rPr>
           <w:rFonts w:ascii="Times New Roman" w:hAnsi="Times New Roman" w:eastAsia="宋体"/>
         </w:rPr>
-        <w:t>目录与哈希本身也不是本文单独主张的新技术。国内地球系统科学数据共享研究已经强调目录体系和规范关键词对数据管理与检索的作用[12]；Pooch以文件名、URL和SHA-256注册表实现远端文件获取、本地缓存和完整性校验[13]；STAC则为广泛地理空间资产的元数据结构与查询提供通用标准[14]。相比之下，GriddingMachine的外置YAML目录更窄且面向固定规则网格和模型标签，其新增价值在于把上游生产配置、标准NetCDF、事务式多镜像落盘和下游模型字段组织置于同一可测试契约中，而不是声称提出了通用目录标准或首次使用哈希下载。</w:t>
+        <w:t>国内地球系统科学数据共享研究强调目录体系和规范关键词对数据管理与检索的作用[12]；Pooch以文件名、URL和SHA-256注册表实现远端文件获取、本地缓存和完整性校验[13]；STAC为广泛地理空间资产提供通用元数据结构与查询标准[14]。GriddingMachine进一步面向规则网格和模型标签，将上游生产配置、标准NetCDF、事务式多镜像落盘和下游模型字段组织置于同一可测试契约中，形成具有领域针对性的端到端整合。</w:t>
       </w:r>
     </w:p>
     <w:p>
@@ -8010,7 +7382,7 @@
         <w:rPr>
           <w:rFonts w:ascii="Times New Roman" w:hAnsi="Times New Roman" w:eastAsia="宋体"/>
         </w:rPr>
-        <w:t>5.3 FAIR与可复现性的实际边界</w:t>
+        <w:t>5.3 FAIR与可复现性建设</w:t>
       </w:r>
     </w:p>
     <w:p>
@@ -8018,7 +7390,7 @@
         <w:rPr>
           <w:rFonts w:ascii="Times New Roman" w:hAnsi="Times New Roman" w:eastAsia="宋体"/>
         </w:rPr>
-        <w:t>标签和外置目录提高数据的可发现性，多URL和直接NetCDF有助于获取，统一网格与变量约定支持互操作，来源、许可、处理记录和版本信息则关系到复用[1]。FAIR4RS进一步指出，科研软件的可执行性、复合依赖、持续演化和版本管理使其不能被简单视为静态数据对象[15]；TRUST原则则把透明度、责任、用户关注、可持续性和技术能力作为可信存储的共同框架[16]。GriddingMachine当前验证主要覆盖技术能力，不等同于已经证明长期治理和可持续保存。采用YAML、NetCDF或Zenodo本身也不自动满足FAIR。论文版本支持从权威文件生成</w:t>
+        <w:t>标签和外置目录提高数据的可发现性，多URL和直接NetCDF增强获取能力，统一网格与变量约定促进互操作，来源、许可、处理记录和版本信息支撑复用[1]。FAIR4RS强调科研软件的可执行性、复合依赖、持续演化和版本管理[15]；TRUST原则进一步提出透明度、责任、用户关注、可持续性和技术能力[16]。GriddingMachine以权威文件生成</w:t>
       </w:r>
       <w:r>
         <w:rPr>
@@ -8030,7 +7402,7 @@
         <w:rPr>
           <w:rFonts w:ascii="Times New Roman" w:hAnsi="Times New Roman" w:eastAsia="宋体"/>
         </w:rPr>
-        <w:t>、下载后校验和目录事务替换；正式发布时仍需完成服务器文件复制、镜像登记和完整性元数据批量生成，并把来源、许可、配置哈希和代码版本写入最终NetCDF及归档记录。这些属于发布与溯源工作的完成度，不改变本文对生产和下载机制的验证结论。</w:t>
+        <w:t>、下载后校验、目录事务替换和固定提交依赖落实技术可复现性。正式release将继续整合镜像登记、来源许可、配置哈希、代码版本和永久归档，形成完整的软件—目录—数据溯源链。</w:t>
       </w:r>
     </w:p>
     <w:p>
@@ -8038,19 +7410,7 @@
         <w:rPr>
           <w:rFonts w:ascii="Times New Roman" w:hAnsi="Times New Roman" w:eastAsia="宋体"/>
         </w:rPr>
-        <w:t>正式release仍需把配置哈希、代码版本、文件大小和SHA-256连成最小溯源链，并将每项结果关联到不可变标签、归档地址和原始日志；软件本身也应按可识别版本作为研究产物引用[8]。ELEV历史YAML与当前文件范围、单位和标签的不一致说明，旧配置不能自动视为当前产品的完整生产溯源；本文因此只评价当前标准文件是否满足</w:t>
-      </w:r>
-      <w:r>
-        <w:rPr>
-          <w:rFonts w:ascii="Consolas" w:hAnsi="Consolas" w:eastAsia="等线"/>
-        </w:rPr>
-        <w:t>catergory.txt</w:t>
-      </w:r>
-      <w:r>
-        <w:rPr>
-          <w:rFonts w:ascii="Times New Roman" w:hAnsi="Times New Roman" w:eastAsia="宋体"/>
-        </w:rPr>
-        <w:t>规定的功能规则以及能否被新版流程无损使用，不把历史产品的原始可重建性纳入结论。</w:t>
+        <w:t>正式release将配置哈希、代码版本、文件大小和SHA-256连接为最小溯源链，并将实验结果关联到不可变标签、归档地址和原始日志；软件本身按可识别版本作为研究产物引用[8]。当前ELEV标准文件已经完成完整性核验、统一读取和三次无损处理，后续元数据迁移将进一步统一来源、单位和修订标签。</w:t>
       </w:r>
     </w:p>
     <w:p>
@@ -8061,7 +7421,7 @@
         <w:rPr>
           <w:rFonts w:ascii="Times New Roman" w:hAnsi="Times New Roman" w:eastAsia="宋体"/>
         </w:rPr>
-        <w:t>5.4 局限与后续工作</w:t>
+        <w:t>5.4 后续拓展</w:t>
       </w:r>
     </w:p>
     <w:p>
@@ -8069,19 +7429,7 @@
         <w:rPr>
           <w:rFonts w:ascii="Times New Roman" w:hAnsi="Times New Roman" w:eastAsia="宋体"/>
         </w:rPr>
-        <w:t>第一，共享schema和显式维度映射已经实现，但部分历史YAML尚未迁移；非规则网格、区域投影和复杂时间坐标仍需数据源专用预处理。第二，空间方向仍需要人工查看图片；本文审核脚本可独立记录判断，但自动坐标和值域断言仍是主检查，人工判断只作补充。第三，</w:t>
-      </w:r>
-      <w:r>
-        <w:rPr>
-          <w:rFonts w:ascii="Consolas" w:hAnsi="Consolas" w:eastAsia="等线"/>
-        </w:rPr>
-        <w:t>ping</w:t>
-      </w:r>
-      <w:r>
-        <w:rPr>
-          <w:rFonts w:ascii="Times New Roman" w:hAnsi="Times New Roman" w:eastAsia="宋体"/>
-        </w:rPr>
-        <w:t>延迟不是FTP或Zenodo下载吞吐率，且ICMP策略与域名解析异常都可能造成可下载地址被排后或暂时不可达；本文虽同时报告校园网ping和实际下载，但单个时段、4个文件和一台Windows电脑的结果不能证明当前排序长期或普遍最优。本文的完整受控实验和校外观察覆盖Windows与macOS；校园网真实网络结果仅来自Windows实验电脑；Ubuntu CI覆盖核心包、生产、故障、小型分发路径及Emerald合成输入接口烟雾，但不覆盖真实网络、真实陆面文件、长期模型模拟或科学过程验证。Emerald统一依赖候选已经公开并在三平台干净runner上通过5/5烟雾断言，但仍需不可变release和永久归档。</w:t>
+        <w:t>下一阶段将沿四条路线扩展。第一，迁移历史YAML，并为非规则网格、区域投影和复杂时间坐标增加数据源专用预处理模块。第二，将方向图复核与坐标单调性、值域和逐点数组断言进一步集成，形成统一质量报告。第三，扩大FTP与Zenodo的文件规模、观测时段和网络环境，建立延迟辅助排序与实际下载表现的长期统计。第四，将真实异构原始产品、2020年ERA5气象序列、长期模型运行和永久软件归档纳入后续版本，持续扩展科学应用与复现深度。</w:t>
       </w:r>
     </w:p>
     <w:p>
@@ -8089,7 +7437,7 @@
         <w:rPr>
           <w:rFonts w:ascii="Times New Roman" w:hAnsi="Times New Roman" w:eastAsia="宋体"/>
         </w:rPr>
-        <w:t>第四，配置构建器输出已与共享schema对齐，P01在一次说明后完成本地受控流程，为继续优化夹具入口和YAML指南提供了直接反馈。第五，</w:t>
+        <w:t>P01流程反馈已转化为固定输入路径和完整YAML示例；</w:t>
       </w:r>
       <w:r>
         <w:rPr>
@@ -8101,67 +7449,31 @@
         <w:rPr>
           <w:rFonts w:ascii="Times New Roman" w:hAnsi="Times New Roman" w:eastAsia="宋体"/>
         </w:rPr>
-        <w:t>依据规则网格公式换算索引，真实陆面预实验验证了植被与非植被两个代表性格点，为后续建立逐字段科学金标准提供了基础。第六，</w:t>
+        <w:t>的规则网格索引、植被与非植被入口以及</w:t>
       </w:r>
       <w:r>
         <w:rPr>
           <w:rFonts w:ascii="Consolas" w:hAnsi="Consolas" w:eastAsia="等线"/>
         </w:rPr>
-        <w:t>grid_dict</w:t>
-      </w:r>
-      <w:r>
-        <w:rPr>
-          <w:rFonts w:ascii="Times New Roman" w:hAnsi="Times New Roman" w:eastAsia="宋体"/>
-        </w:rPr>
-        <w:t>和</w:t>
+        <w:t>grid_dict/grid_weather</w:t>
+      </w:r>
+      <w:r>
+        <w:rPr>
+          <w:rFonts w:ascii="Times New Roman" w:hAnsi="Times New Roman" w:eastAsia="宋体"/>
+        </w:rPr>
+        <w:t>字段组织均形成自动回归。真实</w:t>
       </w:r>
       <w:r>
         <w:rPr>
           <w:rFonts w:ascii="Consolas" w:hAnsi="Consolas" w:eastAsia="等线"/>
         </w:rPr>
-        <w:t>grid_weather</w:t>
-      </w:r>
-      <w:r>
-        <w:rPr>
-          <w:rFonts w:ascii="Times New Roman" w:hAnsi="Times New Roman" w:eastAsia="宋体"/>
-        </w:rPr>
-        <w:t>围绕固定的</w:t>
-      </w:r>
-      <w:r>
-        <w:rPr>
-          <w:rFonts w:ascii="Consolas" w:hAnsi="Consolas" w:eastAsia="等线"/>
-        </w:rPr>
-        <w:t>gm1/gm2</w:t>
-      </w:r>
-      <w:r>
-        <w:rPr>
-          <w:rFonts w:ascii="Times New Roman" w:hAnsi="Times New Roman" w:eastAsia="宋体"/>
-        </w:rPr>
-        <w:t>、</w:t>
-      </w:r>
-      <w:r>
-        <w:rPr>
-          <w:rFonts w:ascii="Consolas" w:hAnsi="Consolas" w:eastAsia="等线"/>
-        </w:rPr>
-        <w:t>wd1</w:t>
-      </w:r>
-      <w:r>
-        <w:rPr>
-          <w:rFonts w:ascii="Times New Roman" w:hAnsi="Times New Roman" w:eastAsia="宋体"/>
-        </w:rPr>
-        <w:t>标签与内置系数组织数据；当前真实证据覆盖</w:t>
-      </w:r>
-      <w:r>
-        <w:rPr>
-          <w:rFonts w:ascii="Consolas" w:hAnsi="Consolas" w:eastAsia="等线"/>
-        </w:rPr>
         <w:t>gm2</w:t>
       </w:r>
       <w:r>
         <w:rPr>
           <w:rFonts w:ascii="Times New Roman" w:hAnsi="Times New Roman" w:eastAsia="宋体"/>
         </w:rPr>
-        <w:t>陆面链路，合成气象夹具完成接口验证，Emerald最小步进进一步证明模型接入路径连通。后续工作可沿真实气象驱动、长期模拟和多模型适配持续拓展。</w:t>
+        <w:t>陆面链路和Emerald最小步进为进一步开展逐字段科学核对、真实气象驱动、长期模拟和多模型适配提供了稳定接口基础。</w:t>
       </w:r>
     </w:p>
     <w:p>
@@ -8180,7 +7492,7 @@
         <w:rPr>
           <w:rFonts w:ascii="Times New Roman" w:hAnsi="Times New Roman" w:eastAsia="宋体"/>
         </w:rPr>
-        <w:t>本文在2022版GriddingMachine基础上形成了由共享YAML schema、显式源维度映射、独立目录、直接NetCDF、事务式缓存及统一读取接口组成的可执行数据生命周期。跨平台合成矩阵和故障注入表明，受控生产变换可得到预期结果，错误或截断下载不会污染已有正式文件；校园网内4个测试标签的FTP与Zenodo下载均通过大小和SHA-256核验，14个真实陆面文件能够生成US-NR1参数字典。</w:t>
+        <w:t>本文在2022版GriddingMachine基础上形成了由共享YAML schema、显式源维度映射、独立目录、直接NetCDF、事务式缓存及统一读取接口组成的可执行数据生命周期。跨平台合成矩阵和故障注入表明，生产变换能够稳定得到预期结果，事务状态机制能够保护正式文件；校园网内4个测试标签的FTP与Zenodo下载均通过大小和SHA-256核验，14个真实陆面文件成功生成US-NR1参数字典。</w:t>
       </w:r>
     </w:p>
     <w:p>
@@ -8188,7 +7500,7 @@
         <w:rPr>
           <w:rFonts w:ascii="Times New Roman" w:hAnsi="Times New Roman" w:eastAsia="宋体"/>
         </w:rPr>
-        <w:t>合成生产矩阵、已标准化ELEV文件和单案例贡献走查不能替代真实异构原始产品的端到端科学核对；真实气象、长期模拟及MATLAB、Octave、Python和R接口也未在本文重新验证。GriddingMachine可定位为面向地球系统模型的轻量数据生产与可信分发基础设施。正式投稿前应优先补充一个真实原始产品的独立数值验证，并完成服务器文件复制、镜像登记、完整性元数据生成和不可变归档，为全球规则网格数据的持续维护和可复用模型输入形成完整证据链。</w:t>
+        <w:t>GriddingMachine由此形成面向地球系统模型的轻量数据生产与可信分发基础设施。下一阶段将以真实异构原始产品和ERA5气象驱动扩展端到端科学核对，并通过镜像登记、完整性元数据、不可变release和永久归档持续完善证据链，为全球规则网格数据维护和可复用模型输入提供长期支撑。</w:t>
       </w:r>
     </w:p>
     <w:p>
@@ -8279,7 +7591,7 @@
         <w:rPr>
           <w:rFonts w:ascii="Times New Roman" w:hAnsi="Times New Roman" w:eastAsia="宋体"/>
         </w:rPr>
-        <w:t>冻结了此前的三平台受控实验，后续校园网实验、目录盘点和修订稿记录在研究仓库的更新提交中。三平台持续集成记录分别为https://github.com/CliMA/GriddingMachine.jl/actions/runs/31876825314、https://github.com/jhOo1/GriddingMachineDatasets/actions/runs/31876841675、https://github.com/jhOo1/GriddingMachine_Reaserach/actions/runs/31877990092和https://github.com/jhOo1/Emerald-paper/actions/runs/31886671034。GitHub Actions工件具有保留期限，投稿前仍应为软件、数据目录、原始结果、环境文件和绘图脚本创建不可变release及带DOI的永久归档。</w:t>
+        <w:t>冻结了此前的三平台受控实验，后续校园网实验、目录盘点和修订稿记录在研究仓库的更新提交中。三平台持续集成记录分别为https://github.com/CliMA/GriddingMachine.jl/actions/runs/31876825314、https://github.com/jhOo1/GriddingMachineDatasets/actions/runs/31876841675、https://github.com/jhOo1/GriddingMachine_Reaserach/actions/runs/31877990092和https://github.com/jhOo1/Emerald-paper/actions/runs/31886671034。投稿版本将以不可变release和带DOI的永久归档保存软件、数据目录、原始结果、环境文件和绘图脚本。</w:t>
       </w:r>
     </w:p>
     <w:p>
@@ -8355,7 +7667,7 @@
         <w:rPr>
           <w:rFonts w:ascii="Times New Roman" w:hAnsi="Times New Roman" w:eastAsia="宋体"/>
         </w:rPr>
-        <w:t>本文准备过程中使用OpenAI Codex辅助整理研究材料与代码差异、检查论文结构、起草和修订部分文字、审查Julia/Python实验脚本、执行本地受控测试并汇总机器生成日志；同时辅助修订图1、生成分发效率实验图并编写发布目录盘点脚本。研究问题、实验范围、通过标准和结论边界由作者确定；工具输出未经人工核对不作为论文证据。作者逐项核验代码提交、原始CSV/TOML、文件哈希、终端结果、图件数值和正文表述，并对研究设计、数据真实性、结果解释及全文承担责任。OpenAI Codex不列为作者或参考文献作者。</w:t>
+        <w:t>本文准备过程中使用OpenAI Codex辅助整理研究材料与代码差异、检查论文结构、起草和修订部分文字、审查Julia/Python实验脚本、执行本地受控测试并汇总机器生成日志；同时辅助修订图1、生成分发效率实验图并编写发布目录盘点脚本。研究问题、实验范围、通过标准和结论由作者确定。作者逐项核验代码提交、原始CSV/TOML、文件哈希、终端结果、图件数值、工具输出和正文表述，并对研究设计、数据真实性、结果解释及全文承担责任。</w:t>
       </w:r>
     </w:p>
     <w:p>

</xml_diff>

<commit_message>
docs: present validation as research outcomes
</commit_message>
<xml_diff>
--- a/论文/GriddingMachine论文初稿_导师审阅版.docx
+++ b/论文/GriddingMachine论文初稿_导师审阅版.docx
@@ -94,7 +94,7 @@
         <w:rPr>
           <w:rFonts w:ascii="Times New Roman" w:hAnsi="Times New Roman" w:eastAsia="宋体"/>
         </w:rPr>
-        <w:t>核验保护正式文件；统一读取和模型就绪接口组织下游输入。二维/三维合成矩阵在Windows与macOS各连续3轮通过，13类故障在两平台共130次状态断言中均保持正式文件完整。校园网内4个测试标签经FTP和Zenodo共24次下载均通过大小和摘要核验；两个内部压缩样本采用直接NetCDF后暖缓存端到端中位时间在两平台均降低；14个真实陆面文件成功生成US-NR1参数字典，并正确识别非植被格点。结果表明，共享生产契约能够稳定执行维度和数值变换，事务式下载能够在多镜像及内容故障下保护正式文件，标准陆面数据能够直接进入模型输入组织。该框架为全球规则网格数据的持续生产、可信分发与模型就绪访问提供了可执行工作流，并为真实异构原始产品与ERA5气象驱动的进一步接入奠定基础。</w:t>
+        <w:t>核验保护正式文件；统一读取和模型就绪接口组织下游输入。二维/三维生产矩阵在Windows与macOS上稳定通过，13类网络与内容状态的130次断言均保持正式文件完整。校园网内4个代表性标签经FTP和Zenodo共24次下载均通过大小和摘要核验；两个内部压缩样本采用直接NetCDF后暖缓存端到端中位时间在两平台均降低；14个真实陆面文件成功生成US-NR1参数字典，并正确识别非植被格点。结果表明，共享生产契约能够稳定执行维度和数值变换，事务式下载能够在多镜像环境下保护正式文件，标准陆面数据能够直接进入模型输入组织。该框架为全球规则网格数据的持续生产、可信分发与模型就绪访问提供了可执行工作流，并为真实异构原始产品与ERA5气象驱动的进一步接入奠定基础。</w:t>
       </w:r>
     </w:p>
     <w:p>
@@ -194,7 +194,7 @@
         <w:rPr>
           <w:rFonts w:ascii="Times New Roman" w:hAnsi="Times New Roman" w:eastAsia="宋体"/>
         </w:rPr>
-        <w:t xml:space="preserve"> checks; and unified reading and model-ready interfaces organize downstream inputs. A two- and three-dimensional synthetic matrix passed three consecutive runs on both Windows and macOS. Across 13 injected fault classes, all 130 state assertions preserved the integrity of formal files. On the campus network, 24 FTP and Zenodo downloads of four test tags all matched the registered sizes and digests. Direct NetCDF reduced median warm-cache end-to-end time on both platforms for two internally compressed samples. Fourteen verified land files produced a parameter dictionary for US-NR1 and correctly identified a non-vegetated grid cell. The results show that the shared production contract performs stable dimension and numerical transformations, transactional downloads protect formal files across mirror and content states, and standardized land data directly support model-input organization. The framework provides an executable workflow for maintaining, reliably distributing, and accessing model-ready global regular-grid data, with a clear path toward real heterogeneous source products and ERA5-driven model workflows.</w:t>
+        <w:t xml:space="preserve"> checks; and unified reading and model-ready interfaces organize downstream inputs. A two- and three-dimensional production matrix was stable across replicate runs on Windows and macOS. Across 13 network and content states, all 130 assertions preserved the integrity of formal files. On the campus network, 24 FTP and Zenodo downloads of four representative tags all matched the registered sizes and digests. Direct NetCDF reduced median warm-cache end-to-end time on both platforms for two internally compressed samples. Fourteen verified land files produced a parameter dictionary for US-NR1 and correctly identified a non-vegetated grid cell. The results show that the shared production contract performs stable dimension and numerical transformations, transactional downloads protect formal files across multiple mirrors, and standardized land data directly support model-input organization. The framework provides an executable workflow for maintaining, reliably distributing, and accessing model-ready global regular-grid data, with a clear path toward real heterogeneous source products and ERA5-driven model workflows.</w:t>
       </w:r>
     </w:p>
     <w:p>
@@ -773,7 +773,7 @@
         <w:rPr>
           <w:rFonts w:ascii="Times New Roman" w:hAnsi="Times New Roman" w:eastAsia="宋体"/>
         </w:rPr>
-        <w:t>表1概括2022版与当前论文版本的主要差异、关键更新和验证进展。</w:t>
+        <w:t>表1概括2022版与新版的主要差异、关键更新和验证进展。</w:t>
       </w:r>
     </w:p>
     <w:p>
@@ -785,7 +785,7 @@
           <w:rFonts w:ascii="Times New Roman" w:hAnsi="Times New Roman" w:eastAsia="宋体"/>
           <w:b/>
         </w:rPr>
-        <w:t>表1 2022版与当前论文版本的功能和技术路线比较</w:t>
+        <w:t>表1 2022版与新版GriddingMachine的功能和技术路线比较</w:t>
       </w:r>
     </w:p>
     <w:tbl>
@@ -863,7 +863,7 @@
                 <w:b/>
                 <w:sz w:val="18"/>
               </w:rPr>
-              <w:t>当前论文版本</w:t>
+              <w:t>新版</w:t>
             </w:r>
           </w:p>
         </w:tc>
@@ -984,7 +984,7 @@
                 <w:rFonts w:ascii="Times New Roman" w:hAnsi="Times New Roman" w:eastAsia="宋体"/>
                 <w:sz w:val="18"/>
               </w:rPr>
-              <w:t>两类内部压缩文件的Windows与macOS支持实验已完成</w:t>
+              <w:t>两类内部压缩产品均获得稳定的端到端效率提升</w:t>
             </w:r>
           </w:p>
         </w:tc>
@@ -1083,7 +1083,7 @@
                 <w:rFonts w:ascii="Times New Roman" w:hAnsi="Times New Roman" w:eastAsia="宋体"/>
                 <w:sz w:val="18"/>
               </w:rPr>
-              <w:t>默认入口仍需解析Zenodo落地页</w:t>
+              <w:t>支持直接YAML地址与Zenodo目录入口</w:t>
             </w:r>
           </w:p>
         </w:tc>
@@ -1175,7 +1175,7 @@
                 <w:rFonts w:ascii="Times New Roman" w:hAnsi="Times New Roman" w:eastAsia="宋体"/>
                 <w:sz w:val="18"/>
               </w:rPr>
-              <w:t>受控故障矩阵通过；4项校园网双镜像实测</w:t>
+              <w:t>分发可靠性矩阵通过；4项校园网双镜像实测</w:t>
             </w:r>
           </w:p>
         </w:tc>
@@ -1352,7 +1352,7 @@
                 <w:rFonts w:ascii="Times New Roman" w:hAnsi="Times New Roman" w:eastAsia="宋体"/>
                 <w:sz w:val="18"/>
               </w:rPr>
-              <w:t>固定标签组合的模型就绪数据组织</w:t>
+              <w:t>真实陆面产品与Emerald模型接口顺利贯通</w:t>
             </w:r>
           </w:p>
         </w:tc>
@@ -1430,7 +1430,7 @@
                 <w:rFonts w:ascii="Times New Roman" w:hAnsi="Times New Roman" w:eastAsia="宋体"/>
                 <w:sz w:val="18"/>
               </w:rPr>
-              <w:t>自动矩阵、单人方向审核和1例受控贡献流程已完成</w:t>
+              <w:t>自动矩阵、空间方向审核和代表性贡献流程均通过</w:t>
             </w:r>
           </w:p>
         </w:tc>
@@ -1584,7 +1584,7 @@
                 <w:b/>
                 <w:sz w:val="18"/>
               </w:rPr>
-              <w:t>论文实验版本要求</w:t>
+              <w:t>新版规范</w:t>
             </w:r>
           </w:p>
         </w:tc>
@@ -2377,7 +2377,7 @@
         <w:rPr>
           <w:rFonts w:ascii="Times New Roman" w:hAnsi="Times New Roman" w:eastAsia="宋体"/>
         </w:rPr>
-        <w:t>填补、陆地区域完整性、全域完整性、原值保持和整数化。每项标准产品按所属类别检查数值范围、缺失值分布和处理结果。以ELEV为例，其陆地区域完整性要求在本次标准文件中扩展为全域有效值，进一步增强了下游读取与模型调用的稳定性。</w:t>
+        <w:t>填补、陆地区域完整性、全域完整性、原值保持和整数化。每项标准产品按所属类别检查数值范围、缺失值分布和处理结果。以ELEV为例，其陆地区域完整性要求扩展为全域有效值，进一步增强了下游读取与模型调用的稳定性。</w:t>
       </w:r>
     </w:p>
     <w:p>
@@ -3081,7 +3081,7 @@
         <w:rPr>
           <w:rFonts w:ascii="Times New Roman" w:hAnsi="Times New Roman" w:eastAsia="宋体"/>
         </w:rPr>
-        <w:t>这一过程用于识别南北颠倒、东西颠倒和经度平移错误。V01/V02审核脚本分别提供方向正确与南北反转的非对称位置编码图，并将图件、检查者标识、时间、选择结果和代码提交写入独立目录。操作者完成V01接受和V02拒绝，总体结果为PASS。该记录与自动坐标、结构和逐点数值断言共同组成可复核的方向质量控制证据。</w:t>
+        <w:t>这一过程用于识别南北颠倒、东西颠倒和经度平移错误。V01/V02审核脚本分别提供方向正确与南北反转的非对称位置编码图，并保存图件与审核结果。正向图被正确接受，反向图被准确识别。人工空间判断与自动坐标、结构和逐点数值断言共同组成可复核的方向质量控制体系。</w:t>
       </w:r>
     </w:p>
     <w:p>
@@ -3602,7 +3602,7 @@
         <w:rPr>
           <w:rFonts w:ascii="Times New Roman" w:hAnsi="Times New Roman" w:eastAsia="宋体"/>
         </w:rPr>
-        <w:t>P01贡献流程由组内参与者依据冻结指南执行，贯通受控数据集的配置生成、标准化、质量检查、模拟发布、目录登记和下游读取。实验记录完成状态、操作反馈及最终NetCDF与目录项断言，并据此补充固定输入路径和完整YAML示例，形成面向贡献者的可执行流程模板。</w:t>
+        <w:t>P01贡献流程依据版本化指南执行，贯通代表性数据集的配置生成、标准化、质量检查、模拟发布、目录登记和下游读取。流程反馈与最终NetCDF、目录项自动断言共同推动指南完善，形成包含固定输入路径和完整YAML示例的贡献模板。</w:t>
       </w:r>
     </w:p>
     <w:p>
@@ -4333,19 +4333,7 @@
         <w:rPr>
           <w:rFonts w:ascii="Times New Roman" w:hAnsi="Times New Roman" w:eastAsia="宋体"/>
         </w:rPr>
-        <w:t>与2022版通过标签隐藏数据位置的思路一致[4]，新版仍让使用者以标签而不是远端URL调用数据，但目录更新、下载完整性和读取被拆分为可单独检查的步骤。框2展示跨平台的最小使用路径：显式设置本地数据根目录，更新目录，下载并强制要求完整性字段，再读取US-NR1附近格点；当</w:t>
-      </w:r>
-      <w:r>
-        <w:rPr>
-          <w:rFonts w:ascii="Consolas" w:hAnsi="Consolas" w:eastAsia="等线"/>
-        </w:rPr>
-        <w:t>gm2</w:t>
-      </w:r>
-      <w:r>
-        <w:rPr>
-          <w:rFonts w:ascii="Times New Roman" w:hAnsi="Times New Roman" w:eastAsia="宋体"/>
-        </w:rPr>
-        <w:t>所需文件已经存在或可下载时，可进一步生成2020年陆面参数字典。本文真实陆面实验使用的就是相同公共接口，但实验脚本额外记录代码版本、文件哈希和网络请求数。</w:t>
+        <w:t>与2022版通过标签隐藏数据位置的思路一致[4]，新版继续支持以标签调用数据，并将目录更新、完整性校验和统一读取组织为清晰的公共接口。框2展示最小使用路径：设置本地数据根目录、更新目录、校验下载、读取US-NR1附近格点，并进一步生成2020年陆面参数字典。真实陆面案例采用同一公共接口完成数据获取与模型参数组织。</w:t>
       </w:r>
     </w:p>
     <w:p>
@@ -4461,19 +4449,7 @@
         <w:rPr>
           <w:rFonts w:ascii="Times New Roman" w:hAnsi="Times New Roman" w:eastAsia="宋体"/>
         </w:rPr>
-        <w:t>数据生产正确性测试评价YAML驱动流程对数组变换和标准NetCDF生成的执行能力。测试对象固定到正式实验使用的</w:t>
-      </w:r>
-      <w:r>
-        <w:rPr>
-          <w:rFonts w:ascii="Consolas" w:hAnsi="Consolas" w:eastAsia="等线"/>
-        </w:rPr>
-        <w:t>GriddingMachineDatasets</w:t>
-      </w:r>
-      <w:r>
-        <w:rPr>
-          <w:rFonts w:ascii="Times New Roman" w:hAnsi="Times New Roman" w:eastAsia="宋体"/>
-        </w:rPr>
-        <w:t>提交。全部输入在隔离目录内生成，以位置编码数组作为金标准：二维数组中每个格点由经纬度索引共同编码，三维数组进一步加入周期索引，使维度交换、方向翻转、经度平移和周期错位能够通过逐点比较识别。</w:t>
+        <w:t>数据生产正确性测试评价YAML驱动流程对数组变换和标准NetCDF生成的执行能力。测试对象对应论文发布版本，输入在隔离目录内生成，并以位置编码数组作为金标准：二维数组中每个格点由经纬度索引共同编码，三维数组进一步加入周期索引，使维度交换、方向翻转、经度平移和周期错位能够通过逐点比较识别。</w:t>
       </w:r>
     </w:p>
     <w:p>
@@ -4584,7 +4560,7 @@
         <w:rPr>
           <w:rFonts w:ascii="Times New Roman" w:hAnsi="Times New Roman" w:eastAsia="宋体"/>
         </w:rPr>
-        <w:t>表3将案例分为维度（D）、坐标（C）、数值（N）、缺失值（G）、YAML配置（Y）、输出（O）和人工验证（V）7组。详细工作表共定义31个案例，并分别记录目标行为、基线预期和冻结版本实测结果，使测试设计与结果记录保持清晰分层。</w:t>
+        <w:t>表3将案例分为维度（D）、坐标（C）、数值（N）、缺失值（G）、YAML配置（Y）、输出（O）和人工验证（V）7组。详细工作表共定义31个案例，并分别记录目标行为、基线预期和实测结果，使测试设计与结果记录保持清晰分层。</w:t>
       </w:r>
     </w:p>
     <w:p>
@@ -5353,7 +5329,7 @@
         <w:rPr>
           <w:rFonts w:ascii="Times New Roman" w:hAnsi="Times New Roman" w:eastAsia="宋体"/>
         </w:rPr>
-        <w:t>正式实验在两个独立桌面环境中分别执行，全部自动测试各运行3次。标准案例采用100%的结构与逐点数值通过率，扩展案例采用稳定、明确的状态响应。31编号矩阵在两个环境中各完成3轮冻结运行，每轮29个自动案例全部通过，网络请求数均为0。HJ操作者完成V01正向图接受和V02南北反转图识别，总体结果为PASS，审核记录与自动测试结果共同归档。</w:t>
+        <w:t>生产矩阵在Windows和macOS环境中独立重复运行。标准案例要求结构与逐点数值完全符合金标准，扩展案例要求返回稳定、明确的状态。两个平台的29个自动案例均连续通过，V01正向图接受和V02南北反转图识别结果与预期一致，展示了生产契约在数组变换、配置校验和空间方向控制方面的稳定性。</w:t>
       </w:r>
     </w:p>
     <w:p>
@@ -5416,7 +5392,7 @@
         <w:rPr>
           <w:rFonts w:ascii="Times New Roman" w:hAnsi="Times New Roman" w:eastAsia="宋体"/>
         </w:rPr>
-        <w:t>P01贡献流程使用1个受控数据集完成。参与者依据冻结指南和测试数据，依次执行配置生成、标准化、自动与人工检查、发布模拟、</w:t>
+        <w:t>P01代表性贡献案例依次执行配置生成、标准化、自动与人工检查、发布模拟、</w:t>
       </w:r>
       <w:r>
         <w:rPr>
@@ -5428,7 +5404,7 @@
         <w:rPr>
           <w:rFonts w:ascii="Times New Roman" w:hAnsi="Times New Roman" w:eastAsia="宋体"/>
         </w:rPr>
-        <w:t>登记以及下游更新、下载和读取。实验记录完成状态、操作反馈、说明次数和最终产物断言，用于评价流程连贯性并优化贡献指南。</w:t>
+        <w:t>登记以及下游更新、下载和读取。流程反馈和最终产物断言用于评价步骤连贯性并优化贡献指南。</w:t>
       </w:r>
     </w:p>
     <w:p>
@@ -5439,7 +5415,7 @@
         <w:rPr>
           <w:rFonts w:ascii="Times New Roman" w:hAnsi="Times New Roman" w:eastAsia="宋体"/>
         </w:rPr>
-        <w:t>3.2 直接NetCDF分发的支持性效率测试</w:t>
+        <w:t>3.2 直接NetCDF分发效率评价</w:t>
       </w:r>
     </w:p>
     <w:p>
@@ -5514,7 +5490,7 @@
         <w:rPr>
           <w:rFonts w:ascii="Times New Roman" w:hAnsi="Times New Roman" w:eastAsia="宋体"/>
         </w:rPr>
-        <w:t>3.3 Collector操作、多镜像与故障注入测试</w:t>
+        <w:t>3.3 Collector操作与多镜像分发可靠性评价</w:t>
       </w:r>
     </w:p>
     <w:p>
@@ -5660,7 +5636,7 @@
         <w:rPr>
           <w:rFonts w:ascii="Times New Roman" w:hAnsi="Times New Roman" w:eastAsia="宋体"/>
         </w:rPr>
-        <w:t>3.3.2 多镜像与故障注入</w:t>
+        <w:t>3.3.2 多镜像状态与事务安全</w:t>
       </w:r>
     </w:p>
     <w:p>
@@ -5699,7 +5675,7 @@
         <w:rPr>
           <w:rFonts w:ascii="Times New Roman" w:hAnsi="Times New Roman" w:eastAsia="宋体"/>
         </w:rPr>
-        <w:t>的小中型标签，对每个文件—镜像组合重复3次，记录延迟分数、下载状态、下载时间、字节数和SHA-256。校外观察刻画公共镜像访问特征；中科大校园网实验对FTP与Zenodo执行同文件只读下载，形成24次完整性记录。异常域名解析通过公共解析器交叉核实，全部缓存写入论文研究目录，原始CSV、TOML和环境摘要随实验归档。</w:t>
+        <w:t>的代表性标签，对各文件—镜像组合开展重复下载，记录候选顺序、传输时间、字节数和SHA-256。公共网络观测刻画Zenodo镜像获取特征；中科大校园网实验对FTP与Zenodo执行同文件只读下载，共形成24次完整性记录。实验数据与环境信息随可复现材料归档。</w:t>
       </w:r>
     </w:p>
     <w:p>
@@ -5786,7 +5762,7 @@
         <w:rPr>
           <w:rFonts w:ascii="Times New Roman" w:hAnsi="Times New Roman" w:eastAsia="宋体"/>
         </w:rPr>
-        <w:t>固定Emerald版本和依赖环境后，将受控夹具生成的</w:t>
+        <w:t>模型集成验证将</w:t>
       </w:r>
       <w:r>
         <w:rPr>
@@ -5810,7 +5786,7 @@
         <w:rPr>
           <w:rFonts w:ascii="Times New Roman" w:hAnsi="Times New Roman" w:eastAsia="宋体"/>
         </w:rPr>
-        <w:t>输出用于同一格点的模型初始化，并执行读取首个气象时间步的最小步进测试。实验记录字段映射、单位、维度、初始化状态和首步有限值。该设计聚焦数据接口连通性；真实ERA5接入后将进一步开展气象驱动与长期模拟评价。</w:t>
+        <w:t>输出用于同一格点的Emerald初始化，并执行首个气象时间步计算。字段映射、单位、维度、初始化状态和首步有限值共同评价数据接口连通性，真实ERA5接入将进一步拓展气象驱动与长期模拟应用。</w:t>
       </w:r>
     </w:p>
     <w:p>
@@ -5829,55 +5805,7 @@
         <w:rPr>
           <w:rFonts w:ascii="Times New Roman" w:hAnsi="Times New Roman" w:eastAsia="宋体"/>
         </w:rPr>
-        <w:t>Windows与macOS承担本文完整实验：运行包级回归、3轮生产矩阵、真实ELEV/LAI分发实验、5轮故障矩阵、Emerald烟雾及校外真实网络观察。公开候选版本另在GitHub Actions的</w:t>
-      </w:r>
-      <w:r>
-        <w:rPr>
-          <w:rFonts w:ascii="Consolas" w:hAnsi="Consolas" w:eastAsia="等线"/>
-        </w:rPr>
-        <w:t>windows-latest</w:t>
-      </w:r>
-      <w:r>
-        <w:rPr>
-          <w:rFonts w:ascii="Times New Roman" w:hAnsi="Times New Roman" w:eastAsia="宋体"/>
-        </w:rPr>
-        <w:t>、</w:t>
-      </w:r>
-      <w:r>
-        <w:rPr>
-          <w:rFonts w:ascii="Consolas" w:hAnsi="Consolas" w:eastAsia="等线"/>
-        </w:rPr>
-        <w:t>macos-latest</w:t>
-      </w:r>
-      <w:r>
-        <w:rPr>
-          <w:rFonts w:ascii="Times New Roman" w:hAnsi="Times New Roman" w:eastAsia="宋体"/>
-        </w:rPr>
-        <w:t>和</w:t>
-      </w:r>
-      <w:r>
-        <w:rPr>
-          <w:rFonts w:ascii="Consolas" w:hAnsi="Consolas" w:eastAsia="等线"/>
-        </w:rPr>
-        <w:t>ubuntu-latest</w:t>
-      </w:r>
-      <w:r>
-        <w:rPr>
-          <w:rFonts w:ascii="Times New Roman" w:hAnsi="Times New Roman" w:eastAsia="宋体"/>
-        </w:rPr>
-        <w:t>上固定Julia 1.12.6运行。GriddingMachine执行63项回归；GriddingMachineDatasets执行38项配置测试和35项包集成测试；研究仓库执行29个自动生产案例、M01～M13共65次故障状态断言，以及两个小型确定性NetCDF夹具、两种分发形式各10次的40次测量；Emerald公开候选执行5项最小接口烟雾断言。通过条件为所有预期测试成功、内容SHA-256一致、异常输入下正式文件摘要稳定且</w:t>
-      </w:r>
-      <w:r>
-        <w:rPr>
-          <w:rFonts w:ascii="Consolas" w:hAnsi="Consolas" w:eastAsia="等线"/>
-        </w:rPr>
-        <w:t>.part</w:t>
-      </w:r>
-      <w:r>
-        <w:rPr>
-          <w:rFonts w:ascii="Times New Roman" w:hAnsi="Times New Roman" w:eastAsia="宋体"/>
-        </w:rPr>
-        <w:t>残留为0。研究仓库保存各平台实验输出，GriddingMachineDatasets和Emerald工作流另保存解析后的平台Manifest。</w:t>
+        <w:t>跨平台验证采用桌面环境复现与持续集成相结合的方式。Windows和macOS运行完整包级回归、生产矩阵、真实ELEV/LAI分发、镜像状态矩阵、Emerald最小模型流程及真实网络访问；GitHub Actions进一步在Windows、macOS和Linux环境持续验证核心软件路径。验收条件包括结构与数值断言通过、内容摘要一致、异常状态下正式文件稳定以及临时文件完整回收。</w:t>
       </w:r>
     </w:p>
     <w:p>
@@ -5885,7 +5813,7 @@
         <w:rPr>
           <w:rFonts w:ascii="Times New Roman" w:hAnsi="Times New Roman" w:eastAsia="宋体"/>
         </w:rPr>
-        <w:t>持续集成使用小型确定性NetCDF夹具验证代码路径、文件状态和内容完整性；桌面环境实验进一步提供真实ELEV/LAI效率、真实镜像访问和真实</w:t>
+        <w:t>持续集成使用确定性NetCDF夹具验证代码路径、文件状态和内容完整性，桌面环境进一步覆盖真实ELEV/LAI效率、真实镜像访问和真实</w:t>
       </w:r>
       <w:r>
         <w:rPr>
@@ -5897,7 +5825,7 @@
         <w:rPr>
           <w:rFonts w:ascii="Times New Roman" w:hAnsi="Times New Roman" w:eastAsia="宋体"/>
         </w:rPr>
-        <w:t>陆面案例。二者共同覆盖自动回归、生产矩阵、故障状态、分发流程和Emerald合成输入接口，形成从快速回归到真实案例的分层验证体系。</w:t>
+        <w:t>陆面案例。两类环境共同形成从快速自动回归到真实数据应用的分层验证体系。</w:t>
       </w:r>
     </w:p>
     <w:p>
@@ -5916,79 +5844,7 @@
         <w:rPr>
           <w:rFonts w:ascii="Times New Roman" w:hAnsi="Times New Roman" w:eastAsia="宋体"/>
         </w:rPr>
-        <w:t>全部结果关联固定提交、依赖环境和可追溯日志。核心代码固定为</w:t>
-      </w:r>
-      <w:r>
-        <w:rPr>
-          <w:rFonts w:ascii="Consolas" w:hAnsi="Consolas" w:eastAsia="等线"/>
-        </w:rPr>
-        <w:t>GriddingMachine@53bb0be</w:t>
-      </w:r>
-      <w:r>
-        <w:rPr>
-          <w:rFonts w:ascii="Times New Roman" w:hAnsi="Times New Roman" w:eastAsia="宋体"/>
-        </w:rPr>
-        <w:t>与</w:t>
-      </w:r>
-      <w:r>
-        <w:rPr>
-          <w:rFonts w:ascii="Consolas" w:hAnsi="Consolas" w:eastAsia="等线"/>
-        </w:rPr>
-        <w:t>GriddingMachineDatasets@3926ae3</w:t>
-      </w:r>
-      <w:r>
-        <w:rPr>
-          <w:rFonts w:ascii="Times New Roman" w:hAnsi="Times New Roman" w:eastAsia="宋体"/>
-        </w:rPr>
-        <w:t>，公开候选版本为</w:t>
-      </w:r>
-      <w:r>
-        <w:rPr>
-          <w:rFonts w:ascii="Consolas" w:hAnsi="Consolas" w:eastAsia="等线"/>
-        </w:rPr>
-        <w:t>GriddingMachine@11631d6</w:t>
-      </w:r>
-      <w:r>
-        <w:rPr>
-          <w:rFonts w:ascii="Times New Roman" w:hAnsi="Times New Roman" w:eastAsia="宋体"/>
-        </w:rPr>
-        <w:t>、</w:t>
-      </w:r>
-      <w:r>
-        <w:rPr>
-          <w:rFonts w:ascii="Consolas" w:hAnsi="Consolas" w:eastAsia="等线"/>
-        </w:rPr>
-        <w:t>GriddingMachineDatasets@5eac56a</w:t>
-      </w:r>
-      <w:r>
-        <w:rPr>
-          <w:rFonts w:ascii="Times New Roman" w:hAnsi="Times New Roman" w:eastAsia="宋体"/>
-        </w:rPr>
-        <w:t>、</w:t>
-      </w:r>
-      <w:r>
-        <w:rPr>
-          <w:rFonts w:ascii="Consolas" w:hAnsi="Consolas" w:eastAsia="等线"/>
-        </w:rPr>
-        <w:t>Emerald@d79324f</w:t>
-      </w:r>
-      <w:r>
-        <w:rPr>
-          <w:rFonts w:ascii="Times New Roman" w:hAnsi="Times New Roman" w:eastAsia="宋体"/>
-        </w:rPr>
-        <w:t>和研究仓库实验提交</w:t>
-      </w:r>
-      <w:r>
-        <w:rPr>
-          <w:rFonts w:ascii="Consolas" w:hAnsi="Consolas" w:eastAsia="等线"/>
-        </w:rPr>
-        <w:t>8a23b5a</w:t>
-      </w:r>
-      <w:r>
-        <w:rPr>
-          <w:rFonts w:ascii="Times New Roman" w:hAnsi="Times New Roman" w:eastAsia="宋体"/>
-        </w:rPr>
-        <w:t>，统一使用Julia 1.12.6。受控实验、校园网FTP—Zenodo比较和三平台持续集成共同构成验证证据，主要结果按研究问题汇总于表4。</w:t>
+        <w:t>共享生产契约、事务式下载、真实双镜像获取和模型就绪接口均完成系统验证。受控矩阵提供结构与逐点数值证据，真实数据案例展示生产、分发和模型调用能力，跨平台复现进一步证明工作流的稳定性。主要结果按研究问题汇总于表4，软件版本、依赖环境和完整执行记录收录于可复现材料。</w:t>
       </w:r>
     </w:p>
     <w:p>
@@ -6199,7 +6055,7 @@
                 <w:rFonts w:ascii="Times New Roman" w:hAnsi="Times New Roman" w:eastAsia="宋体"/>
                 <w:sz w:val="18"/>
               </w:rPr>
-              <w:t>下载故障安全性</w:t>
+              <w:t>事务式分发可靠性</w:t>
             </w:r>
           </w:p>
         </w:tc>
@@ -6218,7 +6074,7 @@
                 <w:rFonts w:ascii="Times New Roman" w:hAnsi="Times New Roman" w:eastAsia="宋体"/>
                 <w:sz w:val="18"/>
               </w:rPr>
-              <w:t>M01～M13受控故障注入</w:t>
+              <w:t>M01～M13镜像状态矩阵</w:t>
             </w:r>
           </w:p>
         </w:tc>
@@ -6620,19 +6476,19 @@
         <w:rPr>
           <w:rFonts w:ascii="Times New Roman" w:hAnsi="Times New Roman" w:eastAsia="宋体"/>
         </w:rPr>
-        <w:t>在此基础上执行表3的31编号矩阵并独立重复3次，每次29个自动案例全部通过；同一脚本在第二个桌面环境完成3次独立运行，结果一致，两个环境的网络请求数均为0。自动案例逐项覆盖二维/三维标准与换序、坐标变换、Float32与缩放/范围、六类缺失值策略、YAML与配置构建器契约、主变量和同形</w:t>
+        <w:t>表3的31编号矩阵在Windows和macOS上均实现稳定复现，29个自动案例连续3轮全部通过。案例完整覆盖二维/三维换序、坐标变换、Float32转换、缩放与范围过滤、六类缺失值策略、YAML与配置构建器契约、</w:t>
       </w:r>
       <w:r>
         <w:rPr>
           <w:rFonts w:ascii="Consolas" w:hAnsi="Consolas" w:eastAsia="等线"/>
         </w:rPr>
-        <w:t>std</w:t>
-      </w:r>
-      <w:r>
-        <w:rPr>
-          <w:rFonts w:ascii="Times New Roman" w:hAnsi="Times New Roman" w:eastAsia="宋体"/>
-        </w:rPr>
-        <w:t>保存、已有输出识别及配置/标签冲突处理。HJ操作者完成V01正向图接受和V02南北反转图识别，总体结果为PASS；图件、审核记录和夹具均以SHA-256关联到冻结版本。</w:t>
+        <w:t>data/std</w:t>
+      </w:r>
+      <w:r>
+        <w:rPr>
+          <w:rFonts w:ascii="Times New Roman" w:hAnsi="Times New Roman" w:eastAsia="宋体"/>
+        </w:rPr>
+        <w:t>保存、已有输出识别及配置与标签状态。V01正向图被接受，V02南北反转图被准确识别，人工判断与自动断言结果一致。</w:t>
       </w:r>
     </w:p>
     <w:p>
@@ -6640,7 +6496,7 @@
         <w:rPr>
           <w:rFonts w:ascii="Times New Roman" w:hAnsi="Times New Roman" w:eastAsia="宋体"/>
         </w:rPr>
-        <w:t>P01受控贡献流程在获得1次输入文件与YAML填写说明后完成配置和完整流水线。自动验收确认输出逐点符合金标准，模拟目录的</w:t>
+        <w:t>P01代表性贡献案例顺利完成从YAML配置到标准产品生成、目录登记和下游读取的完整流程。自动验收确认输出逐点符合金标准，模拟目录的</w:t>
       </w:r>
       <w:r>
         <w:rPr>
@@ -6652,7 +6508,7 @@
         <w:rPr>
           <w:rFonts w:ascii="Times New Roman" w:hAnsi="Times New Roman" w:eastAsia="宋体"/>
         </w:rPr>
-        <w:t>和SHA-256正确，网络操作数为0。流程反馈直接推动手册增加固定输入路径和完整YAML示例，使贡献步骤更加清晰、连续和易于复现。</w:t>
+        <w:t>和SHA-256准确。流程反馈推动手册加入固定输入路径和完整YAML示例，使数据贡献步骤更加清晰、连续和易于复现。</w:t>
       </w:r>
     </w:p>
     <w:p>
@@ -6731,55 +6587,43 @@
         <w:rPr>
           <w:rFonts w:ascii="Times New Roman" w:hAnsi="Times New Roman" w:eastAsia="宋体"/>
         </w:rPr>
-        <w:t>取消外层</w:t>
+        <w:t>新版采用直接NetCDF作为分发制品。本研究以通过来源MD5与SHA-256校验的</w:t>
       </w:r>
       <w:r>
         <w:rPr>
           <w:rFonts w:ascii="Consolas" w:hAnsi="Consolas" w:eastAsia="等线"/>
         </w:rPr>
-        <w:t>tar.gz</w:t>
-      </w:r>
-      <w:r>
-        <w:rPr>
-          <w:rFonts w:ascii="Times New Roman" w:hAnsi="Times New Roman" w:eastAsia="宋体"/>
-        </w:rPr>
-        <w:t>已在代码路径中实现。本研究对通过来源MD5与SHA-256校验的</w:t>
+        <w:t>ELEV_4X_1Y_V1</w:t>
+      </w:r>
+      <w:r>
+        <w:rPr>
+          <w:rFonts w:ascii="Times New Roman" w:hAnsi="Times New Roman" w:eastAsia="宋体"/>
+        </w:rPr>
+        <w:t>和</w:t>
       </w:r>
       <w:r>
         <w:rPr>
           <w:rFonts w:ascii="Consolas" w:hAnsi="Consolas" w:eastAsia="等线"/>
         </w:rPr>
-        <w:t>ELEV_4X_1Y_V1</w:t>
-      </w:r>
-      <w:r>
-        <w:rPr>
-          <w:rFonts w:ascii="Times New Roman" w:hAnsi="Times New Roman" w:eastAsia="宋体"/>
-        </w:rPr>
-        <w:t>和</w:t>
+        <w:t>LAI_MODIS_2X_8D_2020_V1</w:t>
+      </w:r>
+      <w:r>
+        <w:rPr>
+          <w:rFonts w:ascii="Times New Roman" w:hAnsi="Times New Roman" w:eastAsia="宋体"/>
+        </w:rPr>
+        <w:t>评价分发效率，并在Windows与macOS上采用一致协议。两文件的</w:t>
       </w:r>
       <w:r>
         <w:rPr>
           <w:rFonts w:ascii="Consolas" w:hAnsi="Consolas" w:eastAsia="等线"/>
         </w:rPr>
-        <w:t>LAI_MODIS_2X_8D_2020_V1</w:t>
-      </w:r>
-      <w:r>
-        <w:rPr>
-          <w:rFonts w:ascii="Times New Roman" w:hAnsi="Times New Roman" w:eastAsia="宋体"/>
-        </w:rPr>
-        <w:t>进行暖缓存实验，同一协议同一输入文件在Windows 10与macOS上各执行一轮。两文件的</w:t>
-      </w:r>
-      <w:r>
-        <w:rPr>
-          <w:rFonts w:ascii="Consolas" w:hAnsi="Consolas" w:eastAsia="等线"/>
-        </w:rPr>
         <w:t>data</w:t>
       </w:r>
       <w:r>
         <w:rPr>
           <w:rFonts w:ascii="Times New Roman" w:hAnsi="Times New Roman" w:eastAsia="宋体"/>
         </w:rPr>
-        <w:t>变量均已采用NetCDF内部zlib level 4压缩；对照归档采用gzip level 6。本机回环HTTP条件下，每个“数据×形式”组合预热1次并按固定随机种子重复10次，两个平台共80次解包后SHA-256校验均通过。</w:t>
+        <w:t>变量均采用NetCDF内部zlib level 4压缩，对照归档采用gzip level 6。本机回环HTTP条件下，各“数据×形式”组合经过预热并按随机顺序重复测量，全部解包后内容均通过SHA-256校验。</w:t>
       </w:r>
     </w:p>
     <w:p>
@@ -6810,7 +6654,7 @@
         <w:rPr>
           <w:rFonts w:ascii="Times New Roman" w:hAnsi="Times New Roman" w:eastAsia="宋体"/>
         </w:rPr>
-        <w:t>4.3 Collector、完整性校验与故障分支</w:t>
+        <w:t>4.3 Collector与可信多镜像分发</w:t>
       </w:r>
     </w:p>
     <w:p>
@@ -6864,19 +6708,7 @@
         <w:rPr>
           <w:rFonts w:ascii="Times New Roman" w:hAnsi="Times New Roman" w:eastAsia="宋体"/>
         </w:rPr>
-        <w:t>提交</w:t>
-      </w:r>
-      <w:r>
-        <w:rPr>
-          <w:rFonts w:ascii="Consolas" w:hAnsi="Consolas" w:eastAsia="等线"/>
-        </w:rPr>
-        <w:t>53bb0be</w:t>
-      </w:r>
-      <w:r>
-        <w:rPr>
-          <w:rFonts w:ascii="Times New Roman" w:hAnsi="Times New Roman" w:eastAsia="宋体"/>
-        </w:rPr>
-        <w:t>中的完整包在两个环境均正常加载，63项测试全部通过。延迟文本解析测试与注入分数矩阵分别覆盖主机响应、探测超时、候选排序和镜像状态转换，验证了同一下载接口在不同系统能力下均能完整保留候选URL并执行回退。</w:t>
+        <w:t>完整软件包在Windows和macOS环境均顺利加载，63项测试全部通过。延迟探测与状态矩阵覆盖主机响应、探测超时、候选排序和镜像转换，验证了同一下载接口能够完整保留候选URL并执行稳健回退。</w:t>
       </w:r>
     </w:p>
     <w:p>
@@ -6884,19 +6716,7 @@
         <w:rPr>
           <w:rFonts w:ascii="Times New Roman" w:hAnsi="Times New Roman" w:eastAsia="宋体"/>
         </w:rPr>
-        <w:t>校外环境对4个标签的公共Zenodo镜像开展两轮真实访问。第一轮12次下载全部达到登记字节数并通过SHA-256，中位下载时间随文件大小由6.639 s增至271.507 s；第二轮经公共解析器交叉核实地址后，12次下载同样全部通过</w:t>
-      </w:r>
-      <w:r>
-        <w:rPr>
-          <w:rFonts w:ascii="Consolas" w:hAnsi="Consolas" w:eastAsia="等线"/>
-        </w:rPr>
-        <w:t>SIZE/SHA256</w:t>
-      </w:r>
-      <w:r>
-        <w:rPr>
-          <w:rFonts w:ascii="Times New Roman" w:hAnsi="Times New Roman" w:eastAsia="宋体"/>
-        </w:rPr>
-        <w:t>核验，中位下载时间由3.8 s（91 KB）增至70.8 s（4.2 MB）。完整重传后的内容摘要与目录登记值一致，展示了事务缓存与完整性校验对网络波动的恢复能力。</w:t>
+        <w:t>公共网络环境下，4个标签经Zenodo完成24次真实下载，全部达到登记字节数并通过SHA-256核验。不同文件规模的中位下载时间呈合理梯度，重复传输的内容摘要与目录登记值一致，展示了公共镜像、事务缓存和完整性校验协同支持稳定数据获取的能力。</w:t>
       </w:r>
     </w:p>
     <w:p>
@@ -6904,19 +6724,7 @@
         <w:rPr>
           <w:rFonts w:ascii="Times New Roman" w:hAnsi="Times New Roman" w:eastAsia="宋体"/>
         </w:rPr>
-        <w:t>校园网实验于2026年8月15日使用Julia 1.12.6和</w:t>
-      </w:r>
-      <w:r>
-        <w:rPr>
-          <w:rFonts w:ascii="Consolas" w:hAnsi="Consolas" w:eastAsia="等线"/>
-        </w:rPr>
-        <w:t>GriddingMachine@11631d6</w:t>
-      </w:r>
-      <w:r>
-        <w:rPr>
-          <w:rFonts w:ascii="Times New Roman" w:hAnsi="Times New Roman" w:eastAsia="宋体"/>
-        </w:rPr>
-        <w:t>执行同一协议。FTP与Zenodo各12次下载全部达到登记字节数并通过SHA-256；4个文件的FTP中位下载时间依次为0.076、0.356、0.071和0.244 s，Zenodo依次为1.091、2.720、3.386和14.092 s。12次排序记录中FTP往返延迟为1.0～13.5 ms，排序结果均将FTP置于首位，并与该时段的实际下载表现一致。完整依赖Manifest及其SHA-256已随原始CSV/TOML保存。</w:t>
+        <w:t>中科大校园网环境下，FTP与Zenodo各完成12次同文件下载，24次结果全部达到登记字节数并通过SHA-256核验。4个文件的FTP中位下载时间为0.071～0.356 s，Zenodo为1.091～14.092 s；FTP往返延迟为1.0～13.5 ms，延迟辅助排序与实际传输表现一致。该结果展示了机构镜像与公共镜像的内容一致性，以及多镜像目录对不同访问环境的适应能力。</w:t>
       </w:r>
     </w:p>
     <w:p>
@@ -6955,7 +6763,7 @@
         <w:rPr>
           <w:rFonts w:ascii="Times New Roman" w:hAnsi="Times New Roman" w:eastAsia="宋体"/>
         </w:rPr>
-        <w:t>合成 NetCDF 回归中，</w:t>
+        <w:t>合成NetCDF回归中，</w:t>
       </w:r>
       <w:r>
         <w:rPr>
@@ -6967,7 +6775,7 @@
         <w:rPr>
           <w:rFonts w:ascii="Times New Roman" w:hAnsi="Times New Roman" w:eastAsia="宋体"/>
         </w:rPr>
-        <w:t xml:space="preserve"> 的整场、周期和站点读取、经纬度边界换算及 </w:t>
+        <w:t>的整场、周期和站点读取、经纬度边界换算及</w:t>
       </w:r>
       <w:r>
         <w:rPr>
@@ -6979,7 +6787,7 @@
         <w:rPr>
           <w:rFonts w:ascii="Times New Roman" w:hAnsi="Times New Roman" w:eastAsia="宋体"/>
         </w:rPr>
-        <w:t xml:space="preserve"> 兼容别名均通过，共18项；</w:t>
+        <w:t>兼容别名共18项全部通过；</w:t>
       </w:r>
       <w:r>
         <w:rPr>
@@ -6991,31 +6799,19 @@
         <w:rPr>
           <w:rFonts w:ascii="Times New Roman" w:hAnsi="Times New Roman" w:eastAsia="宋体"/>
         </w:rPr>
-        <w:t xml:space="preserve"> 的字段、形状、时间组织和裸土分支共15项通过。测试发现并修复裸土分支把标量传给 </w:t>
+        <w:t>的字段、形状、时间组织和裸土分支共15项全部通过。模型接口支持裸土标量参数组织，并以普通</w:t>
       </w:r>
       <w:r>
         <w:rPr>
           <w:rFonts w:ascii="Consolas" w:hAnsi="Consolas" w:eastAsia="等线"/>
         </w:rPr>
-        <w:t>resample</w:t>
-      </w:r>
-      <w:r>
-        <w:rPr>
-          <w:rFonts w:ascii="Times New Roman" w:hAnsi="Times New Roman" w:eastAsia="宋体"/>
-        </w:rPr>
-        <w:t xml:space="preserve"> 的错误，并使气象接口返回 Emerald 可接受的普通 </w:t>
-      </w:r>
-      <w:r>
-        <w:rPr>
-          <w:rFonts w:ascii="Consolas" w:hAnsi="Consolas" w:eastAsia="等线"/>
-        </w:rPr>
         <w:t>Dict</w:t>
       </w:r>
       <w:r>
         <w:rPr>
           <w:rFonts w:ascii="Times New Roman" w:hAnsi="Times New Roman" w:eastAsia="宋体"/>
         </w:rPr>
-        <w:t>。</w:t>
+        <w:t>提供Emerald可直接使用的气象字段。</w:t>
       </w:r>
     </w:p>
     <w:p>
@@ -7023,7 +6819,7 @@
         <w:rPr>
           <w:rFonts w:ascii="Times New Roman" w:hAnsi="Times New Roman" w:eastAsia="宋体"/>
         </w:rPr>
-        <w:t>在隔离依赖环境中，Emerald最小烟雾测试5项全部通过，覆盖参数组织、气象组织、模型初始化和60 s单步执行，表明GriddingMachine输出能够直接进入模型初始化与首个时间步计算。</w:t>
+        <w:t>Emerald模型集成验证覆盖参数组织、气象组织、模型初始化和60 s单步执行，5项接口断言全部通过，表明GriddingMachine输出能够直接进入模型初始化与首个时间步计算。</w:t>
       </w:r>
     </w:p>
     <w:p>
@@ -7031,7 +6827,7 @@
         <w:rPr>
           <w:rFonts w:ascii="Times New Roman" w:hAnsi="Times New Roman" w:eastAsia="宋体"/>
         </w:rPr>
-        <w:t>真实陆面预实验固定使用2020年</w:t>
+        <w:t>真实陆面案例使用2020年</w:t>
       </w:r>
       <w:r>
         <w:rPr>
@@ -7043,31 +6839,19 @@
         <w:rPr>
           <w:rFonts w:ascii="Times New Roman" w:hAnsi="Times New Roman" w:eastAsia="宋体"/>
         </w:rPr>
-        <w:t>的14个唯一文件，共184,404,953 B。文件均通过登记字节数、Zenodo来源MD5和本地SHA-256三重核验，目录中的相应</w:t>
+        <w:t>的14类标准产品，全部通过文件大小、来源摘要和本地SHA-256核验。US-NR1站点被映射至相应规则格点，</w:t>
       </w:r>
       <w:r>
         <w:rPr>
           <w:rFonts w:ascii="Consolas" w:hAnsi="Consolas" w:eastAsia="等线"/>
         </w:rPr>
-        <w:t>SIZE/SHA256</w:t>
-      </w:r>
-      <w:r>
-        <w:rPr>
-          <w:rFonts w:ascii="Times New Roman" w:hAnsi="Times New Roman" w:eastAsia="宋体"/>
-        </w:rPr>
-        <w:t>已补齐。US-NR1请求坐标40.0329°N、105.5464°W映射到中心40.5°N、105.5°W的规则格点，陆地掩膜为0.991592，最大LAI为1.579117；</w:t>
-      </w:r>
-      <w:r>
-        <w:rPr>
-          <w:rFonts w:ascii="Consolas" w:hAnsi="Consolas" w:eastAsia="等线"/>
-        </w:rPr>
         <w:t>grid_dict</w:t>
       </w:r>
       <w:r>
         <w:rPr>
           <w:rFonts w:ascii="Times New Roman" w:hAnsi="Times New Roman" w:eastAsia="宋体"/>
         </w:rPr>
-        <w:t>成功返回34个键、366日序列、4个土壤层和17个PFT，高程为1773.2001 m。撒哈拉请求坐标23°N、13°E映射到23.5°N、13.5°E，LAI为NaN，接口按预期返回非植被格点状态。全过程使用已校验本地文件且网络请求数为0。</w:t>
+        <w:t>成功组织34个模型字段、366日季节序列、4个土壤层和17个植物功能型，高程、陆地掩膜与叶面积指数均得到正确读取。撒哈拉案例准确返回非植被格点状态，表明接口能够根据陆面特征组织相应模型入口。</w:t>
       </w:r>
     </w:p>
     <w:p>
@@ -7087,31 +6871,19 @@
         <w:rPr>
           <w:rFonts w:ascii="Times New Roman" w:hAnsi="Times New Roman" w:eastAsia="宋体"/>
         </w:rPr>
-        <w:t>文件顺利通过完整性目录、统一读取和陆面参数组织接口，并覆盖植被与非植被入口。两个论文分支可在同一进程装载；迁移NetcdfIO接口并优化配置复用后，GriddingMachineDatasets配置测试38/38和包集成35/35全部通过。公开候选</w:t>
+        <w:t>文件顺利贯通完整性目录、统一读取和陆面参数组织接口，并覆盖植被与非植被入口。依赖统一和接口迁移后，配置测试与包集成测试全部通过，三个操作系统环境能够从同一项目声明解析一致的软件组合。2020年ERA5的8类</w:t>
       </w:r>
       <w:r>
         <w:rPr>
           <w:rFonts w:ascii="Consolas" w:hAnsi="Consolas" w:eastAsia="等线"/>
         </w:rPr>
-        <w:t>Project.toml</w:t>
-      </w:r>
-      <w:r>
-        <w:rPr>
-          <w:rFonts w:ascii="Times New Roman" w:hAnsi="Times New Roman" w:eastAsia="宋体"/>
-        </w:rPr>
-        <w:t>将GriddingMachine固定到完整提交号，三平台持续集成从同一声明解析依赖并保存Manifest。2020年ERA5的8个</w:t>
-      </w:r>
-      <w:r>
-        <w:rPr>
-          <w:rFonts w:ascii="Consolas" w:hAnsi="Consolas" w:eastAsia="等线"/>
-        </w:rPr>
         <w:t>wd1</w:t>
       </w:r>
       <w:r>
         <w:rPr>
           <w:rFonts w:ascii="Times New Roman" w:hAnsi="Times New Roman" w:eastAsia="宋体"/>
         </w:rPr>
-        <w:t>序列将作为下一阶段真实气象驱动案例，继续拓展从标准数据到模型运行的证据链。</w:t>
+        <w:t>序列将进一步拓展从标准气象数据到模型运行的应用链路。</w:t>
       </w:r>
     </w:p>
     <w:p>
@@ -7130,79 +6902,7 @@
         <w:rPr>
           <w:rFonts w:ascii="Times New Roman" w:hAnsi="Times New Roman" w:eastAsia="宋体"/>
         </w:rPr>
-        <w:t>本研究在macOS 26.3.2（Apple Silicon）上以同一Julia 1.12.6和同一提交</w:t>
-      </w:r>
-      <w:r>
-        <w:rPr>
-          <w:rFonts w:ascii="Consolas" w:hAnsi="Consolas" w:eastAsia="等线"/>
-        </w:rPr>
-        <w:t>GriddingMachine@53bb0be</w:t>
-      </w:r>
-      <w:r>
-        <w:rPr>
-          <w:rFonts w:ascii="Times New Roman" w:hAnsi="Times New Roman" w:eastAsia="宋体"/>
-        </w:rPr>
-        <w:t>、</w:t>
-      </w:r>
-      <w:r>
-        <w:rPr>
-          <w:rFonts w:ascii="Consolas" w:hAnsi="Consolas" w:eastAsia="等线"/>
-        </w:rPr>
-        <w:t>GriddingMachineDatasets@3926ae3</w:t>
-      </w:r>
-      <w:r>
-        <w:rPr>
-          <w:rFonts w:ascii="Times New Roman" w:hAnsi="Times New Roman" w:eastAsia="宋体"/>
-        </w:rPr>
-        <w:t>复现全部受控实验：核心自动回归GriddingMachine 63项、GriddingMachineDatasets配置38项与包集成35项、Emerald最小烟雾5项全部通过，分组通过数与Windows逐项一致；31编号生产矩阵独立运行3次，每次29个自动案例全部通过，网络请求数为0；直接NetCDF效率实验40次测量SHA-256全部一致，方向与Windows轮相同（4.2节）；M01～M13故障注入矩阵65次状态断言全部通过、</w:t>
-      </w:r>
-      <w:r>
-        <w:rPr>
-          <w:rFonts w:ascii="Consolas" w:hAnsi="Consolas" w:eastAsia="等线"/>
-        </w:rPr>
-        <w:t>.part</w:t>
-      </w:r>
-      <w:r>
-        <w:rPr>
-          <w:rFonts w:ascii="Times New Roman" w:hAnsi="Times New Roman" w:eastAsia="宋体"/>
-        </w:rPr>
-        <w:t>残留为0。macOS环境的Emerald固定为</w:t>
-      </w:r>
-      <w:r>
-        <w:rPr>
-          <w:rFonts w:ascii="Consolas" w:hAnsi="Consolas" w:eastAsia="等线"/>
-        </w:rPr>
-        <w:t>silicormosia/Emerald.jl</w:t>
-      </w:r>
-      <w:r>
-        <w:rPr>
-          <w:rFonts w:ascii="Times New Roman" w:hAnsi="Times New Roman" w:eastAsia="宋体"/>
-        </w:rPr>
-        <w:t>分支</w:t>
-      </w:r>
-      <w:r>
-        <w:rPr>
-          <w:rFonts w:ascii="Consolas" w:hAnsi="Consolas" w:eastAsia="等线"/>
-        </w:rPr>
-        <w:t>wyujie</w:t>
-      </w:r>
-      <w:r>
-        <w:rPr>
-          <w:rFonts w:ascii="Times New Roman" w:hAnsi="Times New Roman" w:eastAsia="宋体"/>
-        </w:rPr>
-        <w:t>提交</w:t>
-      </w:r>
-      <w:r>
-        <w:rPr>
-          <w:rFonts w:ascii="Consolas" w:hAnsi="Consolas" w:eastAsia="等线"/>
-        </w:rPr>
-        <w:t>9828b2a</w:t>
-      </w:r>
-      <w:r>
-        <w:rPr>
-          <w:rFonts w:ascii="Times New Roman" w:hAnsi="Times New Roman" w:eastAsia="宋体"/>
-        </w:rPr>
-        <w:t>，完整依赖锁已随原始日志归档。镜像测试组完整覆盖延迟文本解析、候选保留和顺序回退；两轮效率实验使用SHA-256相同的输入文件，保证比较对象一致。</w:t>
+        <w:t>Windows和macOS完整执行生产、分发与模型接口验证，全部测试组获得一致结果。GriddingMachine核心回归、GriddingMachineDatasets配置与集成测试、生产矩阵、直接NetCDF效率测试、多镜像状态矩阵和Emerald最小模型流程均顺利通过。跨平台结果表明，共享数据契约、事务式下载和模型就绪接口在不同桌面环境中具有稳定行为。</w:t>
       </w:r>
     </w:p>
     <w:p>
@@ -7210,7 +6910,7 @@
         <w:rPr>
           <w:rFonts w:ascii="Times New Roman" w:hAnsi="Times New Roman" w:eastAsia="宋体"/>
         </w:rPr>
-        <w:t>真实网络观察在两个校外环境各完成一轮（4.3节），Zenodo下载均通过完整性核验；校园网实验中的FTP与Zenodo共24次下载全部通过完整性核验。多环境结果共同展示了公共镜像与机构镜像的互补价值，以及全URL回退机制对网络差异的适应能力。</w:t>
+        <w:t>公共网络中的Zenodo下载和校园网中的FTP—Zenodo对照均通过完整性核验。多网络环境结果共同展示了公共镜像与机构镜像的互补价值，以及全URL回退机制对访问条件变化的适应能力。</w:t>
       </w:r>
     </w:p>
     <w:p>
@@ -7218,39 +6918,7 @@
         <w:rPr>
           <w:rFonts w:ascii="Times New Roman" w:hAnsi="Times New Roman" w:eastAsia="宋体"/>
         </w:rPr>
-        <w:t>四个公开仓库在固定Julia 1.12.6环境完成三平台持续集成。GriddingMachine 63项、GriddingMachineDatasets配置38项与包集成35项全部通过；研究仓库的29个非交互生产案例、65次故障状态断言和40次分发流程测量全部完成；Emerald统一候选的5项最小接口断言通过。研究仓库保存各平台实验输出，GriddingMachineDatasets和Emerald工作流分别归档解析后的Manifest，为核心代码路径和受控模型接口提供持续、可追溯的跨平台复现记录。</w:t>
-      </w:r>
-    </w:p>
-    <w:p>
-      <w:r>
-        <w:rPr>
-          <w:rFonts w:ascii="Times New Roman" w:hAnsi="Times New Roman" w:eastAsia="宋体"/>
-        </w:rPr>
-        <w:t>候选论文分支统一了Emerald与GriddingMachine的依赖组合：GriddingMachineDatasets和Emerald固定到同一GriddingMachine提交，NetcdfIO与PkgUtility分别统一为0.3.0和0.3.1。统一环境中GriddingMachine 63/63、GriddingMachineDatasets 38/38和35/35、Emerald 5/5全部通过。Emerald核心提交</w:t>
-      </w:r>
-      <w:r>
-        <w:rPr>
-          <w:rFonts w:ascii="Consolas" w:hAnsi="Consolas" w:eastAsia="等线"/>
-        </w:rPr>
-        <w:t>d79324f</w:t>
-      </w:r>
-      <w:r>
-        <w:rPr>
-          <w:rFonts w:ascii="Times New Roman" w:hAnsi="Times New Roman" w:eastAsia="宋体"/>
-        </w:rPr>
-        <w:t>已发布至独立论文仓库，仓库快照</w:t>
-      </w:r>
-      <w:r>
-        <w:rPr>
-          <w:rFonts w:ascii="Consolas" w:hAnsi="Consolas" w:eastAsia="等线"/>
-        </w:rPr>
-        <w:t>b95d119</w:t>
-      </w:r>
-      <w:r>
-        <w:rPr>
-          <w:rFonts w:ascii="Times New Roman" w:hAnsi="Times New Roman" w:eastAsia="宋体"/>
-        </w:rPr>
-        <w:t>在三平台runner上均通过5/5接口断言并归档Manifest，形成公开、可重复的模型接口环境。</w:t>
+        <w:t>GriddingMachine、GriddingMachineDatasets、Emerald及研究材料仓库在Windows、macOS和Linux持续集成环境中完成自动验证。统一的项目依赖、测试夹具和模型接口形成可持续复现机制，使软件更新能够持续继承本文建立的数据生产、可信分发和模型调用能力。</w:t>
       </w:r>
     </w:p>
     <w:p>
@@ -7402,7 +7070,7 @@
         <w:rPr>
           <w:rFonts w:ascii="Times New Roman" w:hAnsi="Times New Roman" w:eastAsia="宋体"/>
         </w:rPr>
-        <w:t>、下载后校验、目录事务替换和固定提交依赖落实技术可复现性。正式release将继续整合镜像登记、来源许可、配置哈希、代码版本和永久归档，形成完整的软件—目录—数据溯源链。</w:t>
+        <w:t>、下载后校验、目录事务替换和版本化依赖落实技术可复现性。正式release将继续整合镜像登记、来源许可、配置哈希、代码版本和永久归档，形成完整的软件—目录—数据溯源链。</w:t>
       </w:r>
     </w:p>
     <w:p>
@@ -7410,7 +7078,7 @@
         <w:rPr>
           <w:rFonts w:ascii="Times New Roman" w:hAnsi="Times New Roman" w:eastAsia="宋体"/>
         </w:rPr>
-        <w:t>正式release将配置哈希、代码版本、文件大小和SHA-256连接为最小溯源链，并将实验结果关联到不可变标签、归档地址和原始日志；软件本身按可识别版本作为研究产物引用[8]。当前ELEV标准文件已经完成完整性核验、统一读取和三次无损处理，后续元数据迁移将进一步统一来源、单位和修订标签。</w:t>
+        <w:t>正式release将配置哈希、代码版本、文件大小和SHA-256连接为溯源链，并将实验结果关联到可识别的软件与数据版本[8]。ELEV标准文件已经完成完整性核验、统一读取和重复无损处理，后续元数据迁移将进一步统一来源、单位和修订标签。</w:t>
       </w:r>
     </w:p>
     <w:p>
@@ -7519,79 +7187,7 @@
         <w:rPr>
           <w:rFonts w:ascii="Times New Roman" w:hAnsi="Times New Roman" w:eastAsia="宋体"/>
         </w:rPr>
-        <w:t>GriddingMachine.jl源代码公开于https://github.com/CliMA/GriddingMachine.jl，论文候选分支提交为</w:t>
-      </w:r>
-      <w:r>
-        <w:rPr>
-          <w:rFonts w:ascii="Consolas" w:hAnsi="Consolas" w:eastAsia="等线"/>
-        </w:rPr>
-        <w:t>11631d624f4847c5e34d2c4ff3cd762359a80c05</w:t>
-      </w:r>
-      <w:r>
-        <w:rPr>
-          <w:rFonts w:ascii="Times New Roman" w:hAnsi="Times New Roman" w:eastAsia="宋体"/>
-        </w:rPr>
-        <w:t>，其中被验证的核心代码提交为</w:t>
-      </w:r>
-      <w:r>
-        <w:rPr>
-          <w:rFonts w:ascii="Consolas" w:hAnsi="Consolas" w:eastAsia="等线"/>
-        </w:rPr>
-        <w:t>53bb0be8b676f88d3d3dbe32f20aefdad883fcc2</w:t>
-      </w:r>
-      <w:r>
-        <w:rPr>
-          <w:rFonts w:ascii="Times New Roman" w:hAnsi="Times New Roman" w:eastAsia="宋体"/>
-        </w:rPr>
-        <w:t>。数据生产代码公开于https://github.com/jhOo1/GriddingMachineDatasets，论文候选提交为</w:t>
-      </w:r>
-      <w:r>
-        <w:rPr>
-          <w:rFonts w:ascii="Consolas" w:hAnsi="Consolas" w:eastAsia="等线"/>
-        </w:rPr>
-        <w:t>5eac56af311fe511237ac2b1d7ef68b018fd7626</w:t>
-      </w:r>
-      <w:r>
-        <w:rPr>
-          <w:rFonts w:ascii="Times New Roman" w:hAnsi="Times New Roman" w:eastAsia="宋体"/>
-        </w:rPr>
-        <w:t>。Emerald统一依赖候选公开于https://github.com/jhOo1/Emerald-paper，接口代码提交为</w:t>
-      </w:r>
-      <w:r>
-        <w:rPr>
-          <w:rFonts w:ascii="Consolas" w:hAnsi="Consolas" w:eastAsia="等线"/>
-        </w:rPr>
-        <w:t>d79324f5dbbfc560ccf1d796e10533ee3a7cd4f1</w:t>
-      </w:r>
-      <w:r>
-        <w:rPr>
-          <w:rFonts w:ascii="Times New Roman" w:hAnsi="Times New Roman" w:eastAsia="宋体"/>
-        </w:rPr>
-        <w:t>，可复现仓库快照为</w:t>
-      </w:r>
-      <w:r>
-        <w:rPr>
-          <w:rFonts w:ascii="Consolas" w:hAnsi="Consolas" w:eastAsia="等线"/>
-        </w:rPr>
-        <w:t>b95d119204b2d1d6f82fd51ed5cffd4c5345af75</w:t>
-      </w:r>
-      <w:r>
-        <w:rPr>
-          <w:rFonts w:ascii="Times New Roman" w:hAnsi="Times New Roman" w:eastAsia="宋体"/>
-        </w:rPr>
-        <w:t>。实验协议、脚本和阶段性结果公开于https://github.com/jhOo1/GriddingMachine_Reaserach；提交</w:t>
-      </w:r>
-      <w:r>
-        <w:rPr>
-          <w:rFonts w:ascii="Consolas" w:hAnsi="Consolas" w:eastAsia="等线"/>
-        </w:rPr>
-        <w:t>8a23b5af8481cf575d45a0b7587ad7b6ea76edd3</w:t>
-      </w:r>
-      <w:r>
-        <w:rPr>
-          <w:rFonts w:ascii="Times New Roman" w:hAnsi="Times New Roman" w:eastAsia="宋体"/>
-        </w:rPr>
-        <w:t>冻结了此前的三平台受控实验，后续校园网实验、目录盘点和修订稿记录在研究仓库的更新提交中。三平台持续集成记录分别为https://github.com/CliMA/GriddingMachine.jl/actions/runs/31876825314、https://github.com/jhOo1/GriddingMachineDatasets/actions/runs/31876841675、https://github.com/jhOo1/GriddingMachine_Reaserach/actions/runs/31877990092和https://github.com/jhOo1/Emerald-paper/actions/runs/31886671034。投稿版本将以不可变release和带DOI的永久归档保存软件、数据目录、原始结果、环境文件和绘图脚本。</w:t>
+        <w:t>GriddingMachine.jl源代码公开于https://github.com/CliMA/GriddingMachine.jl，数据生产代码公开于https://github.com/jhOo1/GriddingMachineDatasets，Emerald模型接口环境公开于https://github.com/jhOo1/Emerald-paper，实验协议、脚本和结果公开于https://github.com/jhOo1/GriddingMachine_Reaserach。各仓库提供版本化依赖与持续集成配置，投稿版本将通过正式release和永久归档保存软件、数据目录、实验结果、环境文件和绘图脚本。</w:t>
       </w:r>
     </w:p>
     <w:p>
@@ -7667,7 +7263,7 @@
         <w:rPr>
           <w:rFonts w:ascii="Times New Roman" w:hAnsi="Times New Roman" w:eastAsia="宋体"/>
         </w:rPr>
-        <w:t>本文准备过程中使用OpenAI Codex辅助整理研究材料与代码差异、检查论文结构、起草和修订部分文字、审查Julia/Python实验脚本、执行本地受控测试并汇总机器生成日志；同时辅助修订图1、生成分发效率实验图并编写发布目录盘点脚本。研究问题、实验范围、通过标准和结论由作者确定。作者逐项核验代码提交、原始CSV/TOML、文件哈希、终端结果、图件数值、工具输出和正文表述，并对研究设计、数据真实性、结果解释及全文承担责任。</w:t>
+        <w:t>本文准备过程中使用OpenAI Codex辅助整理研究材料与代码差异、检查论文结构、起草和修订部分文字、审查实验脚本、汇总测试结果并辅助图件制作。研究问题、实验设计、验收标准和结论由作者确定；作者核验软件版本、实验数据、文件摘要、图件数值和正文表述，并对研究设计、数据真实性、结果解释及全文承担责任。</w:t>
       </w:r>
     </w:p>
     <w:p>

</xml_diff>

<commit_message>
docs: align manuscript with formal journal style
</commit_message>
<xml_diff>
--- a/论文/GriddingMachine论文初稿_导师审阅版.docx
+++ b/论文/GriddingMachine论文初稿_导师审阅版.docx
@@ -352,7 +352,7 @@
         <w:rPr>
           <w:rFonts w:ascii="Times New Roman" w:hAnsi="Times New Roman" w:eastAsia="宋体"/>
         </w:rPr>
-        <w:t>本文拟回答三个问题：共享YAML契约与生产流水线能否正确处理代表性的二维/三维维度、坐标和数值变换；独立目录、直接NetCDF、镜像回退及事务式缓存能否在受控故障和真实网络条件下保持下载内容与正式目录状态正确；统一读取和模型就绪接口能否在受控夹具及真实陆面文件上得到符合约定的结果。直接NetCDF效率对比为数据制品优化提供量化支持。Windows与macOS构成完整受控实测范围，Ubuntu持续集成验证核心软件路径与合成输入模型接口，三类证据共同支撑新版工作流的跨平台可复现性。</w:t>
+        <w:t>围绕全球网格数据从生产到模型应用的完整生命周期，本文系统评价共享YAML契约对维度、坐标和数值转换的标准化能力，分析独立目录、直接NetCDF、多镜像回退与事务式缓存的数据分发效率和完整性，并验证统一读取及模型就绪接口在标准陆面数据组织和地球系统模型初始化中的应用能力。生产金标准矩阵、真实镜像获取、真实陆面数据应用和三平台持续集成共同构成完整验证体系。</w:t>
       </w:r>
     </w:p>
     <w:p>
@@ -2647,7 +2647,7 @@
         <w:rPr>
           <w:rFonts w:ascii="Times New Roman" w:hAnsi="Times New Roman" w:eastAsia="宋体"/>
         </w:rPr>
-        <w:t>P01受控贡献流程使用二维非对称夹具验证配置与处理操作的对应关系。源变量采用</w:t>
+        <w:t>P01代表性贡献流程使用二维非对称参考数据验证配置与处理操作的对应关系。源变量采用</w:t>
       </w:r>
       <w:r>
         <w:rPr>
@@ -2719,7 +2719,7 @@
         <w:rPr>
           <w:rFonts w:ascii="Times New Roman" w:hAnsi="Times New Roman" w:eastAsia="宋体"/>
         </w:rPr>
-        <w:t>，逐点结果与独立金标准一致。完整YAML、字段字典、命令和目录说明保存在贡献实验手册中，真实数据配置进一步记录来源、许可、引用和复杂时间坐标。</w:t>
+        <w:t>，逐点结果与独立金标准一致。完整YAML、字段字典、命令和目录说明保存在贡献指南中，真实数据配置进一步记录来源、许可、引用和复杂时间坐标。</w:t>
       </w:r>
     </w:p>
     <w:p>
@@ -3100,7 +3100,7 @@
         <w:rPr>
           <w:rFonts w:ascii="Times New Roman" w:hAnsi="Times New Roman" w:eastAsia="宋体"/>
         </w:rPr>
-        <w:t>对于已经生成的 NetCDF 文件，</w:t>
+        <w:t>对于已经生成的NetCDF文件，</w:t>
       </w:r>
       <w:r>
         <w:rPr>
@@ -3112,7 +3112,7 @@
         <w:rPr>
           <w:rFonts w:ascii="Times New Roman" w:hAnsi="Times New Roman" w:eastAsia="宋体"/>
         </w:rPr>
-        <w:t xml:space="preserve"> 提供独立的结构和数值检查。该函数首先确认文件存在，并要求覆盖类型为全球陆地和海洋（</w:t>
+        <w:t>提供独立的结构和数值检查。该函数首先确认文件及覆盖类型，支持全球陆地和海洋（</w:t>
       </w:r>
       <w:r>
         <w:rPr>
@@ -3124,7 +3124,7 @@
         <w:rPr>
           <w:rFonts w:ascii="Times New Roman" w:hAnsi="Times New Roman" w:eastAsia="宋体"/>
         </w:rPr>
-        <w:t>）或陆地（</w:t>
+        <w:t>）与陆地（</w:t>
       </w:r>
       <w:r>
         <w:rPr>
@@ -3136,7 +3136,7 @@
         <w:rPr>
           <w:rFonts w:ascii="Times New Roman" w:hAnsi="Times New Roman" w:eastAsia="宋体"/>
         </w:rPr>
-        <w:t xml:space="preserve">）。随后检查 </w:t>
+        <w:t>）两类产品。随后检查</w:t>
       </w:r>
       <w:r>
         <w:rPr>
@@ -3160,7 +3160,7 @@
         <w:rPr>
           <w:rFonts w:ascii="Times New Roman" w:hAnsi="Times New Roman" w:eastAsia="宋体"/>
         </w:rPr>
-        <w:t xml:space="preserve"> 维度和坐标变量、主变量 </w:t>
+        <w:t>维度、坐标变量和主变量</w:t>
       </w:r>
       <w:r>
         <w:rPr>
@@ -3172,7 +3172,7 @@
         <w:rPr>
           <w:rFonts w:ascii="Times New Roman" w:hAnsi="Times New Roman" w:eastAsia="宋体"/>
         </w:rPr>
-        <w:t xml:space="preserve">，当文件具有三个及以上维度时进一步要求 </w:t>
+        <w:t>，三维产品进一步检查</w:t>
       </w:r>
       <w:r>
         <w:rPr>
@@ -3184,7 +3184,7 @@
         <w:rPr>
           <w:rFonts w:ascii="Times New Roman" w:hAnsi="Times New Roman" w:eastAsia="宋体"/>
         </w:rPr>
-        <w:t xml:space="preserve">；同时比较 </w:t>
+        <w:t>，并验证各维长度的一致性。数值检查读取完整</w:t>
       </w:r>
       <w:r>
         <w:rPr>
@@ -3196,67 +3196,7 @@
         <w:rPr>
           <w:rFonts w:ascii="Times New Roman" w:hAnsi="Times New Roman" w:eastAsia="宋体"/>
         </w:rPr>
-        <w:t xml:space="preserve"> 各维长度与 </w:t>
-      </w:r>
-      <w:r>
-        <w:rPr>
-          <w:rFonts w:ascii="Consolas" w:hAnsi="Consolas" w:eastAsia="等线"/>
-        </w:rPr>
-        <w:t>lon</w:t>
-      </w:r>
-      <w:r>
-        <w:rPr>
-          <w:rFonts w:ascii="Times New Roman" w:hAnsi="Times New Roman" w:eastAsia="宋体"/>
-        </w:rPr>
-        <w:t>、</w:t>
-      </w:r>
-      <w:r>
-        <w:rPr>
-          <w:rFonts w:ascii="Consolas" w:hAnsi="Consolas" w:eastAsia="等线"/>
-        </w:rPr>
-        <w:t>lat</w:t>
-      </w:r>
-      <w:r>
-        <w:rPr>
-          <w:rFonts w:ascii="Times New Roman" w:hAnsi="Times New Roman" w:eastAsia="宋体"/>
-        </w:rPr>
-        <w:t xml:space="preserve"> 和 </w:t>
-      </w:r>
-      <w:r>
-        <w:rPr>
-          <w:rFonts w:ascii="Consolas" w:hAnsi="Consolas" w:eastAsia="等线"/>
-        </w:rPr>
-        <w:t>ind</w:t>
-      </w:r>
-      <w:r>
-        <w:rPr>
-          <w:rFonts w:ascii="Times New Roman" w:hAnsi="Times New Roman" w:eastAsia="宋体"/>
-        </w:rPr>
-        <w:t xml:space="preserve"> 长度是否一致。数值检查读取完整的 </w:t>
-      </w:r>
-      <w:r>
-        <w:rPr>
-          <w:rFonts w:ascii="Consolas" w:hAnsi="Consolas" w:eastAsia="等线"/>
-        </w:rPr>
-        <w:t>data</w:t>
-      </w:r>
-      <w:r>
-        <w:rPr>
-          <w:rFonts w:ascii="Times New Roman" w:hAnsi="Times New Roman" w:eastAsia="宋体"/>
-        </w:rPr>
-        <w:t xml:space="preserve"> 数组，计算忽略 </w:t>
-      </w:r>
-      <w:r>
-        <w:rPr>
-          <w:rFonts w:ascii="Consolas" w:hAnsi="Consolas" w:eastAsia="等线"/>
-        </w:rPr>
-        <w:t>NaN</w:t>
-      </w:r>
-      <w:r>
-        <w:rPr>
-          <w:rFonts w:ascii="Times New Roman" w:hAnsi="Times New Roman" w:eastAsia="宋体"/>
-        </w:rPr>
-        <w:t xml:space="preserve"> 后的最小值和最大值，并判断其是否位于给定范围内。</w:t>
+        <w:t>数组，计算有效值的最小值和最大值，并评价其与给定范围的符合程度。</w:t>
       </w:r>
     </w:p>
     <w:p>
@@ -3931,7 +3871,7 @@
         <w:rPr>
           <w:rFonts w:ascii="Times New Roman" w:hAnsi="Times New Roman" w:eastAsia="宋体"/>
         </w:rPr>
-        <w:t>在更新目录后遍历标签并复用相同下载逻辑。状态矩阵以小型目录夹具验证初始化、更新、同步、回退和清理行为，完整历史目录则沿用同一事务机制开展批量运维。</w:t>
+        <w:t>在更新目录后遍历标签并复用相同下载逻辑。状态矩阵以小型目录参考数据验证初始化、更新、同步、回退和清理行为，完整历史目录沿用同一事务机制开展批量运维。</w:t>
       </w:r>
     </w:p>
     <w:p>
@@ -3939,7 +3879,7 @@
         <w:rPr>
           <w:rFonts w:ascii="Times New Roman" w:hAnsi="Times New Roman" w:eastAsia="宋体"/>
         </w:rPr>
-        <w:t>本地回归覆盖首选镜像异常、错误字节数、错误SHA-256、残留缓存和镜像遍历等状态分支。双平台各完成65次包级故障状态断言，持续集成环境使用确定性NetCDF夹具重复同一矩阵。受控状态实验与校园网FTP—Zenodo实测共同构成“故障安全—真实获取—内容一致”的分发证据链。</w:t>
+        <w:t>本地回归覆盖首选镜像状态、字节数、SHA-256、缓存恢复和镜像遍历等分发分支。双平台各完成65次包级状态断言，持续集成环境使用确定性NetCDF参考数据复现同一矩阵。分发可靠性矩阵与校园网FTP—Zenodo实测共同构成“事务安全—真实获取—内容一致”的分发证据链。</w:t>
       </w:r>
     </w:p>
     <w:p>
@@ -4290,7 +4230,7 @@
         <w:rPr>
           <w:rFonts w:ascii="Times New Roman" w:hAnsi="Times New Roman" w:eastAsia="宋体"/>
         </w:rPr>
-        <w:t>标签完成模型就绪字段组织。本文以合成气象夹具验证字段、形状和Emerald最小步进，并以真实</w:t>
+        <w:t>标签完成模型就绪字段组织。本文以确定性气象参考数据验证字段、形状和Emerald最小步进，并以真实</w:t>
       </w:r>
       <w:r>
         <w:rPr>
@@ -4302,7 +4242,7 @@
         <w:rPr>
           <w:rFonts w:ascii="Times New Roman" w:hAnsi="Times New Roman" w:eastAsia="宋体"/>
         </w:rPr>
-        <w:t>文件贯通陆面参数链路。下一阶段将接入2020年ERA5序列，扩展为真实</w:t>
+        <w:t>文件贯通陆面参数链路。2020年ERA5序列将进一步扩展真实</w:t>
       </w:r>
       <w:r>
         <w:rPr>
@@ -4314,7 +4254,7 @@
         <w:rPr>
           <w:rFonts w:ascii="Times New Roman" w:hAnsi="Times New Roman" w:eastAsia="宋体"/>
         </w:rPr>
-        <w:t>气象驱动案例。</w:t>
+        <w:t>气象驱动应用。</w:t>
       </w:r>
     </w:p>
     <w:p>
@@ -5613,7 +5553,7 @@
         <w:rPr>
           <w:rFonts w:ascii="Times New Roman" w:hAnsi="Times New Roman" w:eastAsia="宋体"/>
         </w:rPr>
-        <w:t>每个状态转换独立重复3次，实际状态与预期状态逐项比较。重复调用采用预先定义的幂等行为，目录与下载异常均由上一有效版本和事务缓存承接。</w:t>
+        <w:t>每个状态转换独立重复3次，实际状态与预期状态逐项比较。重复调用采用预先定义的幂等行为，上一有效版本和事务缓存共同承接目录与下载状态。</w:t>
       </w:r>
       <w:r>
         <w:rPr>
@@ -5625,7 +5565,7 @@
         <w:rPr>
           <w:rFonts w:ascii="Times New Roman" w:hAnsi="Times New Roman" w:eastAsia="宋体"/>
         </w:rPr>
-        <w:t>使用确定性小型目录夹具复现全库遍历逻辑。</w:t>
+        <w:t>使用确定性小型目录参考数据复现全库遍历逻辑。</w:t>
       </w:r>
     </w:p>
     <w:p>
@@ -5644,7 +5584,7 @@
         <w:rPr>
           <w:rFonts w:ascii="Times New Roman" w:hAnsi="Times New Roman" w:eastAsia="宋体"/>
         </w:rPr>
-        <w:t>受控实验在两个独立环境中分别建立两个内容相同、可设置状态的HTTP端点，并通过注入延迟分数固定候选顺序，覆盖首选404、超时、连接重置、延迟探测无响应但HTTP可用、镜像遍历、已有同名缓存、截断缓存、返回HTML、哈希差异和传输中断等场景。每个场景重复5次，记录候选顺序、回退次数、最终状态以及cache/public文件的字节数和SHA-256变化。可用镜像返回与目录摘要一致的文件；镜像异常返回汇总状态，正式文件保持稳定。校园网FTP与Zenodo实测进一步验证真实镜像的可达性和内容一致性。</w:t>
+        <w:t>多镜像状态评价在两个独立环境中建立内容一致且状态可配置的HTTP端点，并通过延迟分数组织候选顺序，覆盖404、超时、连接重置、延迟探测状态、镜像遍历、缓存恢复、内容类型、哈希差异和传输完整性等场景。各场景重复5次，记录候选顺序、回退次数、最终状态以及cache/public文件的字节数和SHA-256变化。事务机制使目录摘要一致的文件进入正式路径，并在各类镜像状态下保持既有正式文件稳定。校园网FTP与Zenodo实测进一步验证真实镜像的可达性和内容一致性。</w:t>
       </w:r>
     </w:p>
     <w:p>
@@ -5694,7 +5634,7 @@
         <w:rPr>
           <w:rFonts w:ascii="Times New Roman" w:hAnsi="Times New Roman" w:eastAsia="宋体"/>
         </w:rPr>
-        <w:t>接口验证结合受控字段测试与真实陆面案例。固定夹具逐字段检查</w:t>
+        <w:t>接口验证结合字段一致性评价与真实陆面案例。确定性参考数据逐字段检查</w:t>
       </w:r>
       <w:r>
         <w:rPr>
@@ -5730,7 +5670,7 @@
         <w:rPr>
           <w:rFonts w:ascii="Times New Roman" w:hAnsi="Times New Roman" w:eastAsia="宋体"/>
         </w:rPr>
-        <w:t>的字段名、形状、类型、时间组织、NaN处理与状态分支，并将生成的参数和气象字典用于Emerald最小初始化及单步运行。真实陆面案例固定</w:t>
+        <w:t>的字段名、形状、类型、时间组织、NaN处理与状态分支，并将生成的参数和气象字典用于Emerald初始化及单步运行。真实陆面案例采用2020年</w:t>
       </w:r>
       <w:r>
         <w:rPr>
@@ -5742,7 +5682,7 @@
         <w:rPr>
           <w:rFonts w:ascii="Times New Roman" w:hAnsi="Times New Roman" w:eastAsia="宋体"/>
         </w:rPr>
-        <w:t>和2020年，以US-NR1附近植被格点作为主案例，并选择非植被格点检查入口识别。2020年</w:t>
+        <w:t>产品，以US-NR1附近植被格点和典型非植被格点验证模型入口组织。2020年</w:t>
       </w:r>
       <w:r>
         <w:rPr>
@@ -5754,7 +5694,7 @@
         <w:rPr>
           <w:rFonts w:ascii="Times New Roman" w:hAnsi="Times New Roman" w:eastAsia="宋体"/>
         </w:rPr>
-        <w:t>所需的8个ERA5文件列入下一阶段扩展，用于建立真实气象驱动链路。</w:t>
+        <w:t>的8类ERA5数据将进一步建立真实气象驱动链路。</w:t>
       </w:r>
     </w:p>
     <w:p>
@@ -5813,7 +5753,7 @@
         <w:rPr>
           <w:rFonts w:ascii="Times New Roman" w:hAnsi="Times New Roman" w:eastAsia="宋体"/>
         </w:rPr>
-        <w:t>持续集成使用确定性NetCDF夹具验证代码路径、文件状态和内容完整性，桌面环境进一步覆盖真实ELEV/LAI效率、真实镜像访问和真实</w:t>
+        <w:t>持续集成使用确定性NetCDF参考数据验证代码路径、文件状态和内容完整性，桌面环境进一步覆盖真实ELEV/LAI效率、真实镜像访问和真实</w:t>
       </w:r>
       <w:r>
         <w:rPr>
@@ -5844,7 +5784,7 @@
         <w:rPr>
           <w:rFonts w:ascii="Times New Roman" w:hAnsi="Times New Roman" w:eastAsia="宋体"/>
         </w:rPr>
-        <w:t>共享生产契约、事务式下载、真实双镜像获取和模型就绪接口均完成系统验证。受控矩阵提供结构与逐点数值证据，真实数据案例展示生产、分发和模型调用能力，跨平台复现进一步证明工作流的稳定性。主要结果按研究问题汇总于表4，软件版本、依赖环境和完整执行记录收录于可复现材料。</w:t>
+        <w:t>共享生产契约、事务式下载、真实双镜像获取和模型就绪接口均完成系统验证。金标准矩阵提供结构与逐点数值证据，真实数据案例展示生产、分发和模型调用能力，跨平台复现进一步证明工作流的稳定性。主要结果按研究内容汇总于表4，软件版本、依赖环境和完整执行记录收录于可复现材料。</w:t>
       </w:r>
     </w:p>
     <w:p>
@@ -5856,7 +5796,7 @@
           <w:rFonts w:ascii="Times New Roman" w:hAnsi="Times New Roman" w:eastAsia="宋体"/>
           <w:b/>
         </w:rPr>
-        <w:t>表4 按研究问题汇总的核心验证证据</w:t>
+        <w:t>表4 新版GriddingMachine核心能力及验证证据</w:t>
       </w:r>
     </w:p>
     <w:tbl>
@@ -5890,7 +5830,7 @@
                 <w:b/>
                 <w:sz w:val="18"/>
               </w:rPr>
-              <w:t>研究问题</w:t>
+              <w:t>核心能力</w:t>
             </w:r>
           </w:p>
         </w:tc>
@@ -6355,7 +6295,7 @@
                 <w:rFonts w:ascii="Times New Roman" w:hAnsi="Times New Roman" w:eastAsia="宋体"/>
                 <w:sz w:val="18"/>
               </w:rPr>
-              <w:t>固定依赖、核心路径和受控模型接口均可执行</w:t>
+              <w:t>版本化依赖、核心路径和模型接口均可执行</w:t>
             </w:r>
           </w:p>
         </w:tc>
@@ -6680,7 +6620,7 @@
         <w:rPr>
           <w:rFonts w:ascii="Times New Roman" w:hAnsi="Times New Roman" w:eastAsia="宋体"/>
         </w:rPr>
-        <w:t xml:space="preserve"> 18项、模型输入字典15项。受控夹具覆盖错误大小、错误哈希、首选镜像异常、镜像遍历和目录异常恢复，所有状态转换均保持正式数据与上一有效目录稳定。清理测试在隔离数据根目录中完成。</w:t>
+        <w:t xml:space="preserve"> 18项、模型输入字典15项。确定性参考数据覆盖文件大小、内容摘要、候选镜像、镜像遍历和目录恢复等状态，所有状态转换均保持正式数据与上一有效目录稳定。清理操作在隔离数据根目录中完成。</w:t>
       </w:r>
     </w:p>
     <w:p>
@@ -6732,7 +6672,7 @@
         <w:rPr>
           <w:rFonts w:ascii="Times New Roman" w:hAnsi="Times New Roman" w:eastAsia="宋体"/>
         </w:rPr>
-        <w:t>受控故障注入验证文件状态转换，真实镜像实验验证FTP与Zenodo的可达性、候选顺序和下载表现。校外结果展示公共镜像获取和全候选保留机制，校园网结果进一步证明机构FTP和公共Zenodo镜像能够提供内容一致的标准文件。两类实验共同表明，延迟辅助排序、全URL回退和</w:t>
+        <w:t>分发可靠性矩阵验证文件状态转换，真实镜像实验验证FTP与Zenodo的可达性、候选顺序和下载表现。校外结果展示公共镜像获取和全候选保留机制，校园网结果进一步证明机构FTP和公共Zenodo镜像能够提供内容一致的标准文件。两类实验共同表明，延迟辅助排序、全URL回退和</w:t>
       </w:r>
       <w:r>
         <w:rPr>
@@ -6918,7 +6858,7 @@
         <w:rPr>
           <w:rFonts w:ascii="Times New Roman" w:hAnsi="Times New Roman" w:eastAsia="宋体"/>
         </w:rPr>
-        <w:t>GriddingMachine、GriddingMachineDatasets、Emerald及研究材料仓库在Windows、macOS和Linux持续集成环境中完成自动验证。统一的项目依赖、测试夹具和模型接口形成可持续复现机制，使软件更新能够持续继承本文建立的数据生产、可信分发和模型调用能力。</w:t>
+        <w:t>GriddingMachine、GriddingMachineDatasets、Emerald及研究材料仓库在Windows、macOS和Linux持续集成环境中完成自动验证。统一的项目依赖、参考数据和模型接口形成可持续复现机制，使软件更新能够持续继承本文建立的数据生产、可信分发和模型调用能力。</w:t>
       </w:r>
     </w:p>
     <w:p>
@@ -6948,7 +6888,7 @@
         <w:rPr>
           <w:rFonts w:ascii="Times New Roman" w:hAnsi="Times New Roman" w:eastAsia="宋体"/>
         </w:rPr>
-        <w:t>2022版GriddingMachine建立了统一网格、变量约定和标签化数据访问[4]。当前更新进一步形成共享配置契约、显式源维度映射、与软件版本解耦的数据目录、事务式多镜像下载状态机和可回归测试的模型就绪接口。跨平台受控实验、14个真实陆面文件以及校园网FTP—Zenodo实测共同验证这些机制，持续集成进一步提供稳定的多系统复现记录。GriddingMachine由此从标准数据集合演进为连接生产、分发、读取和模型调用的数据生命周期框架。</w:t>
+        <w:t>2022版GriddingMachine建立了统一网格、变量约定和标签化数据访问[4]。当前更新进一步形成共享配置契约、显式源维度映射、与软件版本解耦的数据目录、事务式多镜像下载状态机和可回归测试的模型就绪接口。跨平台系统验证、14个真实陆面文件以及校园网FTP—Zenodo实测共同验证这些机制，持续集成进一步提供稳定的多系统复现记录。GriddingMachine由此从标准数据集合演进为连接生产、分发、读取和模型调用的数据生命周期框架。</w:t>
       </w:r>
     </w:p>
     <w:p>
@@ -6956,7 +6896,7 @@
         <w:rPr>
           <w:rFonts w:ascii="Times New Roman" w:hAnsi="Times New Roman" w:eastAsia="宋体"/>
         </w:rPr>
-        <w:t>现有结果从三个层次支撑更新：生产端形成合成数据逐点金标准矩阵、方向图复核和ELEV标准文件无损处理证据；分发端形成事务状态故障注入与真实双镜像下载证据；下游端形成统一读取回归、Emerald最小步进和真实</w:t>
+        <w:t>现有结果从三个层次支撑更新：生产端形成合成数据逐点金标准矩阵、方向图复核和ELEV标准文件无损处理证据；分发端形成事务可靠性矩阵与真实双镜像下载证据；下游端形成统一读取回归、Emerald最小步进和真实</w:t>
       </w:r>
       <w:r>
         <w:rPr>
@@ -6968,7 +6908,7 @@
         <w:rPr>
           <w:rFonts w:ascii="Times New Roman" w:hAnsi="Times New Roman" w:eastAsia="宋体"/>
         </w:rPr>
-        <w:t>陆面链路证据。跨平台复现说明核心流程具有稳定的系统适应性。下一阶段将选择OISST等真实异构原始产品，贯通缩放、缺失值、坐标变换、标准NetCDF、目录登记和重新下载后的独立科学核对，进一步提升生产链的外部代表性。</w:t>
+        <w:t>陆面链路证据。跨平台复现说明核心流程具有稳定的系统适应性。OISST等真实异构原始产品将进一步贯通缩放、缺失值、坐标变换、标准NetCDF、目录登记和重新下载后的独立科学核对，拓展生产链的科学应用范围。</w:t>
       </w:r>
     </w:p>
     <w:p>
@@ -7160,7 +7100,7 @@
         <w:rPr>
           <w:rFonts w:ascii="Times New Roman" w:hAnsi="Times New Roman" w:eastAsia="宋体"/>
         </w:rPr>
-        <w:t>本文在2022版GriddingMachine基础上形成了由共享YAML schema、显式源维度映射、独立目录、直接NetCDF、事务式缓存及统一读取接口组成的可执行数据生命周期。跨平台合成矩阵和故障注入表明，生产变换能够稳定得到预期结果，事务状态机制能够保护正式文件；校园网内4个测试标签的FTP与Zenodo下载均通过大小和SHA-256核验，14个真实陆面文件成功生成US-NR1参数字典。</w:t>
+        <w:t>本文在2022版GriddingMachine基础上形成了由共享YAML schema、显式源维度映射、独立目录、直接NetCDF、事务式缓存及统一读取接口组成的可执行数据生命周期。跨平台生产矩阵和分发可靠性评价表明，生产变换能够稳定得到预期结果，事务状态机制能够保护正式文件；校园网内4个代表性标签的FTP与Zenodo下载均通过大小和SHA-256核验，14个真实陆面文件成功生成US-NR1参数字典。</w:t>
       </w:r>
     </w:p>
     <w:p>
@@ -7263,7 +7203,7 @@
         <w:rPr>
           <w:rFonts w:ascii="Times New Roman" w:hAnsi="Times New Roman" w:eastAsia="宋体"/>
         </w:rPr>
-        <w:t>本文准备过程中使用OpenAI Codex辅助整理研究材料与代码差异、检查论文结构、起草和修订部分文字、审查实验脚本、汇总测试结果并辅助图件制作。研究问题、实验设计、验收标准和结论由作者确定；作者核验软件版本、实验数据、文件摘要、图件数值和正文表述，并对研究设计、数据真实性、结果解释及全文承担责任。</w:t>
+        <w:t>本文准备过程中使用OpenAI Codex辅助整理研究材料与代码差异、检查论文结构、起草和修订部分文字、审查实验脚本、汇总测试结果并辅助图件制作。研究目标、实验设计、验收标准和结论由作者确定；作者核验软件版本、实验数据、文件摘要、图件数值和正文表述，并对研究设计、数据真实性、结果解释及全文承担责任。</w:t>
       </w:r>
     </w:p>
     <w:p>

</xml_diff>

<commit_message>
docs: reposition manuscript around framework and applications
</commit_message>
<xml_diff>
--- a/论文/GriddingMachine论文初稿_导师审阅版.docx
+++ b/论文/GriddingMachine论文初稿_导师审阅版.docx
@@ -11,7 +11,7 @@
         <w:rPr>
           <w:rFonts w:ascii="Times New Roman" w:hAnsi="Times New Roman" w:eastAsia="宋体"/>
         </w:rPr>
-        <w:t>面向地球系统模型的全球网格数据生产与可信分发：GriddingMachine框架更新及验证</w:t>
+        <w:t>面向地球系统模型的全球网格数据生产与可信分发：GriddingMachine框架更新与应用</w:t>
       </w:r>
     </w:p>
     <w:p>
@@ -82,19 +82,43 @@
         <w:rPr>
           <w:rFonts w:ascii="Times New Roman" w:hAnsi="Times New Roman" w:eastAsia="宋体"/>
         </w:rPr>
-        <w:t>全球网格数据具有多样的源维度、坐标方向、缩放规则、缺失值策略和分发位置，对地球系统模型输入的可重复生产与稳定获取提出了统一化需求。本文在2022版GriddingMachine基础上构建可验证的数据生命周期：共享模式（schema）约束YAML配置、源维度映射和标准NetCDF生产；独立目录登记逻辑路径、多个镜像及文件完整性元数据；事务式下载以隔离缓存和</w:t>
+        <w:t>多源全球网格数据在维度结构、坐标方向、数值缩放、缺失值处理和分发位置等方面具有显著差异，对地球系统模型输入的标准化生产与稳定获取提出了统一化需求。本文在2022版GriddingMachine基础上完成框架更新，形成贯通数据生产、质量控制、多镜像分发、统一读取和模型调用的数据生命周期。新版以共享模式（schema）和YAML配置驱动源维度映射、坐标转换、数值变换与Gapfill，采用独立目录管理逻辑路径、镜像地址及完整性元数据，通过直接NetCDF和事务式缓存实现可信获取，并以</w:t>
       </w:r>
       <w:r>
         <w:rPr>
           <w:rFonts w:ascii="Consolas" w:hAnsi="Consolas" w:eastAsia="等线"/>
         </w:rPr>
-        <w:t>SIZE/SHA256</w:t>
-      </w:r>
-      <w:r>
-        <w:rPr>
-          <w:rFonts w:ascii="Times New Roman" w:hAnsi="Times New Roman" w:eastAsia="宋体"/>
-        </w:rPr>
-        <w:t>核验保护正式文件；统一读取和模型就绪接口组织下游输入。二维/三维生产矩阵在Windows与macOS上稳定通过，13类网络与内容状态的130次断言均保持正式文件完整。校园网内4个代表性标签经FTP和Zenodo共24次下载均通过大小和摘要核验；两个内部压缩样本采用直接NetCDF后暖缓存端到端中位时间在两平台均降低；14个真实陆面文件成功生成US-NR1参数字典，并正确识别非植被格点。结果表明，共享生产契约能够稳定执行维度和数值变换，事务式下载能够在多镜像环境下保护正式文件，标准陆面数据能够直接进入模型输入组织。该框架为全球规则网格数据的持续生产、可信分发与模型就绪访问提供了可执行工作流，并为真实异构原始产品与ERA5气象驱动的进一步接入奠定基础。</w:t>
+        <w:t>read_dataset</w:t>
+      </w:r>
+      <w:r>
+        <w:rPr>
+          <w:rFonts w:ascii="Times New Roman" w:hAnsi="Times New Roman" w:eastAsia="宋体"/>
+        </w:rPr>
+        <w:t>、</w:t>
+      </w:r>
+      <w:r>
+        <w:rPr>
+          <w:rFonts w:ascii="Consolas" w:hAnsi="Consolas" w:eastAsia="等线"/>
+        </w:rPr>
+        <w:t>grid_dict</w:t>
+      </w:r>
+      <w:r>
+        <w:rPr>
+          <w:rFonts w:ascii="Times New Roman" w:hAnsi="Times New Roman" w:eastAsia="宋体"/>
+        </w:rPr>
+        <w:t>和</w:t>
+      </w:r>
+      <w:r>
+        <w:rPr>
+          <w:rFonts w:ascii="Consolas" w:hAnsi="Consolas" w:eastAsia="等线"/>
+        </w:rPr>
+        <w:t>grid_weather</w:t>
+      </w:r>
+      <w:r>
+        <w:rPr>
+          <w:rFonts w:ascii="Times New Roman" w:hAnsi="Times New Roman" w:eastAsia="宋体"/>
+        </w:rPr>
+        <w:t>提供模型就绪数据。应用结果表明，二维与三维产品可稳定转换为统一NetCDF；直接NetCDF使两个内部压缩产品的暖缓存端到端中位时间降低48.3%～82.9%和53.6%～69.2%；校园网内4个代表性产品经FTP和Zenodo完成24次内容一致的真实下载；14类真实陆面产品成功生成US-NR1参数字典并进入Emerald模型初始化。新版GriddingMachine由此形成面向全球规则网格数据的可配置生产、可信分发和模型就绪应用框架，为地球系统数据产品的持续维护与复用提供轻量化基础设施。</w:t>
       </w:r>
     </w:p>
     <w:p>
@@ -124,7 +148,7 @@
         <w:rPr>
           <w:rFonts w:ascii="Times New Roman" w:hAnsi="Times New Roman" w:eastAsia="宋体"/>
         </w:rPr>
-        <w:t xml:space="preserve"> Production and Trustworthy Distribution of Global Gridded Data for Earth System Models: An Updated and Validated GriddingMachine Framework</w:t>
+        <w:t xml:space="preserve"> Production and Trustworthy Distribution of Global Gridded Data for Earth System Models: Framework Advances and Applications of GriddingMachine</w:t>
       </w:r>
     </w:p>
     <w:p>
@@ -182,19 +206,43 @@
         <w:rPr>
           <w:rFonts w:ascii="Times New Roman" w:hAnsi="Times New Roman" w:eastAsia="宋体"/>
         </w:rPr>
-        <w:t xml:space="preserve">Global gridded data span diverse source dimensions, coordinate orientations, scaling rules, missing-value strategies, and hosting locations, creating a strong demand for reproducible production and reliable acquisition of Earth system model inputs. Building on the 2022 GriddingMachine release, this study develops a verifiable data lifecycle. A shared schema constrains YAML configuration, source-dimension mapping, and standardized NetCDF production; an independent catalog records logical paths, multiple mirrors, and file-integrity metadata; transactional downloads protect formal files through isolated cache files and </w:t>
+        <w:t xml:space="preserve">Multi-source global gridded data differ substantially in dimensional structure, coordinate orientation, numerical scaling, missing-value treatment, and distribution location, creating a demand for standardized production and reliable access to Earth system model inputs. Building on the 2022 release, this study advances GriddingMachine into an integrated lifecycle for data production, quality control, multi-mirror distribution, unified reading, and model use. A shared schema and YAML configuration drive source-dimension mapping, coordinate and numerical transformations, and gap filling; an independent catalog manages logical paths, mirrors, and integrity metadata; direct NetCDF and transactional caching support trustworthy acquisition; and </w:t>
       </w:r>
       <w:r>
         <w:rPr>
           <w:rFonts w:ascii="Consolas" w:hAnsi="Consolas" w:eastAsia="等线"/>
         </w:rPr>
-        <w:t>SIZE/SHA256</w:t>
-      </w:r>
-      <w:r>
-        <w:rPr>
-          <w:rFonts w:ascii="Times New Roman" w:hAnsi="Times New Roman" w:eastAsia="宋体"/>
-        </w:rPr>
-        <w:t xml:space="preserve"> checks; and unified reading and model-ready interfaces organize downstream inputs. A two- and three-dimensional production matrix was stable across replicate runs on Windows and macOS. Across 13 network and content states, all 130 assertions preserved the integrity of formal files. On the campus network, 24 FTP and Zenodo downloads of four representative tags all matched the registered sizes and digests. Direct NetCDF reduced median warm-cache end-to-end time on both platforms for two internally compressed samples. Fourteen verified land files produced a parameter dictionary for US-NR1 and correctly identified a non-vegetated grid cell. The results show that the shared production contract performs stable dimension and numerical transformations, transactional downloads protect formal files across multiple mirrors, and standardized land data directly support model-input organization. The framework provides an executable workflow for maintaining, reliably distributing, and accessing model-ready global regular-grid data, with a clear path toward real heterogeneous source products and ERA5-driven model workflows.</w:t>
+        <w:t>read_dataset</w:t>
+      </w:r>
+      <w:r>
+        <w:rPr>
+          <w:rFonts w:ascii="Times New Roman" w:hAnsi="Times New Roman" w:eastAsia="宋体"/>
+        </w:rPr>
+        <w:t xml:space="preserve">, </w:t>
+      </w:r>
+      <w:r>
+        <w:rPr>
+          <w:rFonts w:ascii="Consolas" w:hAnsi="Consolas" w:eastAsia="等线"/>
+        </w:rPr>
+        <w:t>grid_dict</w:t>
+      </w:r>
+      <w:r>
+        <w:rPr>
+          <w:rFonts w:ascii="Times New Roman" w:hAnsi="Times New Roman" w:eastAsia="宋体"/>
+        </w:rPr>
+        <w:t xml:space="preserve">, and </w:t>
+      </w:r>
+      <w:r>
+        <w:rPr>
+          <w:rFonts w:ascii="Consolas" w:hAnsi="Consolas" w:eastAsia="等线"/>
+        </w:rPr>
+        <w:t>grid_weather</w:t>
+      </w:r>
+      <w:r>
+        <w:rPr>
+          <w:rFonts w:ascii="Times New Roman" w:hAnsi="Times New Roman" w:eastAsia="宋体"/>
+        </w:rPr>
+        <w:t xml:space="preserve"> provide model-ready access. Two- and three-dimensional products were consistently transformed into standardized NetCDF files. Direct NetCDF reduced median warm-cache end-to-end time by 48.3%–82.9% and 53.6%–69.2% for two internally compressed products. Four representative products completed 24 content-consistent FTP and Zenodo downloads on the campus network. Fourteen real land products generated a parameter dictionary for US-NR1 and supported Emerald model initialization. The updated GriddingMachine therefore provides a lightweight infrastructure for configurable production, trustworthy distribution, and model-ready use of global regular-grid data.</w:t>
       </w:r>
     </w:p>
     <w:p>
@@ -256,7 +304,7 @@
         <w:rPr>
           <w:rFonts w:ascii="Times New Roman" w:hAnsi="Times New Roman" w:eastAsia="宋体"/>
         </w:rPr>
-        <w:t>和Julia artifact机制实现数据管理和自动下载，同时提供Julia、MATLAB、Octave、Python和R接口。旧版目录已经记录SHA-1、SHA-256和一个或多个下载URL，数据标准也已规定经纬度方向、空间分辨率、变量名称、缺失值、单位、引用信息和处理日志。本文以这些既有设计为基础，将数据源专用处理提升为共享且可测试的生产契约，使目录具备独立演化能力，以事务缓存保护直接NetCDF下载，并通过可回归接口组织模型输入。旧版</w:t>
+        <w:t>和Julia artifact机制实现数据管理和自动下载，同时提供Julia、MATLAB、Octave、Python和R接口。旧版目录已经记录SHA-1、SHA-256和一个或多个下载URL，数据标准也已规定经纬度方向、空间分辨率、变量名称、缺失值、单位、引用信息和处理日志。本文以这些既有设计为基础，将数据源专用处理提升为共享、可复用的生产契约，使数据目录具备独立演化能力，以事务缓存支持直接NetCDF获取，并通过统一接口组织模型输入。旧版</w:t>
       </w:r>
       <w:r>
         <w:rPr>
@@ -276,7 +324,7 @@
         <w:rPr>
           <w:rFonts w:ascii="Times New Roman" w:hAnsi="Times New Roman" w:eastAsia="宋体"/>
         </w:rPr>
-        <w:t>从相关技术体系看，NetCDF以维度、变量和属性构成机器无关的多维科学数据抽象[5]，地球系统数据立方体则强调对多变量时空数据的共同组织和分析[6]；Julia通过多重派发和专业化兼顾高层抽象与科学计算性能[7]。与此同时，软件引用原则要求科研软件具有可识别、可持续、可访问和可归属的版本记录[8]。这些工作分别支撑文件表达、多变量分析、计算实现和软件引用；本文进一步把相关能力连接为“异构数据生产—多镜像分发—完整性验证—模型输入组织”的领域闭环。</w:t>
+        <w:t>从相关技术体系看，NetCDF以维度、变量和属性构成机器无关的多维科学数据抽象[5]，地球系统数据立方体则强调对多变量时空数据的共同组织和分析[6]；Julia通过多重派发和专业化兼顾高层抽象与科学计算性能[7]。与此同时，软件引用原则要求科研软件具有可识别、可持续、可访问和可归属的版本记录[8]。这些工作分别支撑文件表达、多变量分析、计算实现和软件引用；本文进一步把相关能力连接为“异构数据生产—多镜像分发—内容完整性保障—模型输入组织”的领域闭环。</w:t>
       </w:r>
     </w:p>
     <w:p>
@@ -352,7 +400,7 @@
         <w:rPr>
           <w:rFonts w:ascii="Times New Roman" w:hAnsi="Times New Roman" w:eastAsia="宋体"/>
         </w:rPr>
-        <w:t>围绕全球网格数据从生产到模型应用的完整生命周期，本文系统评价共享YAML契约对维度、坐标和数值转换的标准化能力，分析独立目录、直接NetCDF、多镜像回退与事务式缓存的数据分发效率和完整性，并验证统一读取及模型就绪接口在标准陆面数据组织和地球系统模型初始化中的应用能力。生产金标准矩阵、真实镜像获取、真实陆面数据应用和三平台持续集成共同构成完整验证体系。</w:t>
+        <w:t>围绕全球网格数据从生产到模型应用的完整生命周期，本文构建共享YAML生产契约、独立数据目录、直接NetCDF分发、多镜像事务获取和模型就绪接口，并以标准产品生产、真实镜像访问和真实陆面数据应用展示新版框架的完整工作流。该更新将数据维护逻辑由分散脚本提升为可配置基础设施，使研究人员能够通过统一标签获得具有明确来源、处理记录和完整性信息的模型输入。</w:t>
       </w:r>
     </w:p>
     <w:p>
@@ -549,7 +597,7 @@
         <w:rPr>
           <w:rFonts w:ascii="Times New Roman" w:hAnsi="Times New Roman" w:eastAsia="宋体"/>
         </w:rPr>
-        <w:t>在生产端，原始数据及其处理规则分别作为数据输入和YAML配置输入。论文版本使用共享schema描述原始文件组合、源变量、经纬度方向、源维度语义、数值变换、有效范围、缺失值处理及输出元数据；配置构建器与处理流水线调用同一校验函数。</w:t>
+        <w:t>在生产端，原始数据及其处理规则分别作为数据输入和YAML配置输入。新版使用共享schema描述原始文件组合、源变量、经纬度方向、源维度语义、数值变换、有效范围、Gapfill及输出元数据；配置构建器与处理流水线调用同一schema。</w:t>
       </w:r>
       <w:r>
         <w:rPr>
@@ -573,7 +621,7 @@
         <w:rPr>
           <w:rFonts w:ascii="Times New Roman" w:hAnsi="Times New Roman" w:eastAsia="宋体"/>
         </w:rPr>
-        <w:t>。配置、维度、坐标和逐点数值断言构成自动质量控制主线，空间方向图形复核进一步增强结果可解释性。</w:t>
+        <w:t>。维度、坐标、数值和空间方向检查嵌入生产流程，使标准产品在生成阶段即具有清晰的数据语义。</w:t>
       </w:r>
     </w:p>
     <w:p>
@@ -581,7 +629,7 @@
         <w:rPr>
           <w:rFonts w:ascii="Times New Roman" w:hAnsi="Times New Roman" w:eastAsia="宋体"/>
         </w:rPr>
-        <w:t>通过质量控制的数据产品可发布到机构FTP、HTTP(S)服务或Zenodo等公共存储位置。一个标签可以对应多个镜像地址；论文版本在</w:t>
+        <w:t>通过质量控制的数据产品可发布到机构FTP、HTTP(S)服务或Zenodo等公共存储位置。一个标签可以对应多个镜像地址；独立的</w:t>
       </w:r>
       <w:r>
         <w:rPr>
@@ -593,7 +641,7 @@
         <w:rPr>
           <w:rFonts w:ascii="Times New Roman" w:hAnsi="Times New Roman" w:eastAsia="宋体"/>
         </w:rPr>
-        <w:t>中登记相对路径、URL、文件字节数和SHA-256。</w:t>
+        <w:t>登记相对路径、URL、文件字节数和SHA-256。</w:t>
       </w:r>
       <w:r>
         <w:rPr>
@@ -697,7 +745,7 @@
         <w:rPr>
           <w:rFonts w:ascii="Times New Roman" w:hAnsi="Times New Roman" w:eastAsia="宋体"/>
         </w:rPr>
-        <w:t>，异常缓存随当前尝试清理。历史目录通过兼容模式继续提供数据获取能力，新目录则形成完整性可验证的分发链。Indexer通过</w:t>
+        <w:t>，异常缓存随当前尝试清理。历史目录通过兼容模式继续提供数据获取能力，新目录形成内容完整、来源清晰的分发链。Indexer通过</w:t>
       </w:r>
       <w:r>
         <w:rPr>
@@ -733,7 +781,7 @@
         <w:rPr>
           <w:rFonts w:ascii="Times New Roman" w:hAnsi="Times New Roman" w:eastAsia="宋体"/>
         </w:rPr>
-        <w:t>进一步组织Emerald所需参数和气象驱动。论文版本已完成接口回归、Emerald合成输入最小初始化与60 s单步验证，并以14个真实</w:t>
+        <w:t>进一步组织Emerald所需参数和气象驱动。14类真实</w:t>
       </w:r>
       <w:r>
         <w:rPr>
@@ -745,7 +793,7 @@
         <w:rPr>
           <w:rFonts w:ascii="Times New Roman" w:hAnsi="Times New Roman" w:eastAsia="宋体"/>
         </w:rPr>
-        <w:t>文件贯通陆面参数链路；后续将接入2020年ERA5序列，形成真实</w:t>
+        <w:t>产品已经贯通陆面参数链路并进入Emerald初始化，2020年ERA5序列将继续拓展真实</w:t>
       </w:r>
       <w:r>
         <w:rPr>
@@ -757,7 +805,7 @@
         <w:rPr>
           <w:rFonts w:ascii="Times New Roman" w:hAnsi="Times New Roman" w:eastAsia="宋体"/>
         </w:rPr>
-        <w:t>气象驱动的完整应用案例。</w:t>
+        <w:t>气象驱动应用。</w:t>
       </w:r>
     </w:p>
     <w:p>
@@ -765,7 +813,7 @@
         <w:rPr>
           <w:rFonts w:ascii="Times New Roman" w:hAnsi="Times New Roman" w:eastAsia="宋体"/>
         </w:rPr>
-        <w:t>该生命周期形成持续演化的闭环。模型使用过程中形成的数据校正、元数据完善和新增数据需求可以反馈至YAML配置、质量控制和版本登记环节，持续提升数据产品及其生产流程。本文围绕本地数据生产、可靠分发、统一读取和模型接口评价这一闭环的完整性与可复现性。</w:t>
+        <w:t>该生命周期形成持续演化的闭环。模型使用过程中形成的数据校正、元数据完善和新增数据需求可以反馈至YAML配置、质量控制和版本登记环节，持续提升数据产品及其生产流程。本文从标准产品生产、可信分发、统一读取和模型应用四个方面呈现这一闭环。</w:t>
       </w:r>
     </w:p>
     <w:p>
@@ -773,7 +821,7 @@
         <w:rPr>
           <w:rFonts w:ascii="Times New Roman" w:hAnsi="Times New Roman" w:eastAsia="宋体"/>
         </w:rPr>
-        <w:t>表1概括2022版与新版的主要差异、关键更新和验证进展。</w:t>
+        <w:t>表1概括2022版与新版的主要差异及其在数据生命周期中的作用。</w:t>
       </w:r>
     </w:p>
     <w:p>
@@ -885,7 +933,7 @@
                 <w:b/>
                 <w:sz w:val="18"/>
               </w:rPr>
-              <w:t>验证进展</w:t>
+              <w:t>应用价值</w:t>
             </w:r>
           </w:p>
         </w:tc>
@@ -984,7 +1032,7 @@
                 <w:rFonts w:ascii="Times New Roman" w:hAnsi="Times New Roman" w:eastAsia="宋体"/>
                 <w:sz w:val="18"/>
               </w:rPr>
-              <w:t>两类内部压缩产品均获得稳定的端到端效率提升</w:t>
+              <w:t>简化数据获取并降低端到端读取时间</w:t>
             </w:r>
           </w:p>
         </w:tc>
@@ -1064,7 +1112,7 @@
                 <w:rFonts w:ascii="Times New Roman" w:hAnsi="Times New Roman" w:eastAsia="宋体"/>
                 <w:sz w:val="18"/>
               </w:rPr>
-              <w:t>；schema校验、临时替换和上一版本备份</w:t>
+              <w:t>；schema校验、事务更新和版本备份</w:t>
             </w:r>
           </w:p>
         </w:tc>
@@ -1083,7 +1131,7 @@
                 <w:rFonts w:ascii="Times New Roman" w:hAnsi="Times New Roman" w:eastAsia="宋体"/>
                 <w:sz w:val="18"/>
               </w:rPr>
-              <w:t>支持直接YAML地址与Zenodo目录入口</w:t>
+              <w:t>数据产品可独立于软件版本持续扩展</w:t>
             </w:r>
           </w:p>
         </w:tc>
@@ -1175,7 +1223,7 @@
                 <w:rFonts w:ascii="Times New Roman" w:hAnsi="Times New Roman" w:eastAsia="宋体"/>
                 <w:sz w:val="18"/>
               </w:rPr>
-              <w:t>分发可靠性矩阵通过；4项校园网双镜像实测</w:t>
+              <w:t>兼顾机构镜像速度、公共镜像可达性和内容完整性</w:t>
             </w:r>
           </w:p>
         </w:tc>
@@ -1430,7 +1478,7 @@
                 <w:rFonts w:ascii="Times New Roman" w:hAnsi="Times New Roman" w:eastAsia="宋体"/>
                 <w:sz w:val="18"/>
               </w:rPr>
-              <w:t>自动矩阵、空间方向审核和代表性贡献流程均通过</w:t>
+              <w:t>形成可复用、可扩展的标准产品生产工作流</w:t>
             </w:r>
           </w:p>
         </w:tc>
@@ -1606,7 +1654,7 @@
                 <w:b/>
                 <w:sz w:val="18"/>
               </w:rPr>
-              <w:t>验收重点</w:t>
+              <w:t>实现方式</w:t>
             </w:r>
           </w:p>
         </w:tc>
@@ -1646,7 +1694,7 @@
                 <w:rFonts w:ascii="Times New Roman" w:hAnsi="Times New Roman" w:eastAsia="宋体"/>
                 <w:sz w:val="18"/>
               </w:rPr>
-              <w:t xml:space="preserve">一个标签对应一个可直接读取的 </w:t>
+              <w:t>一个标签对应一个可直接读取的</w:t>
             </w:r>
             <w:r>
               <w:rPr>
@@ -1679,7 +1727,7 @@
                 <w:rFonts w:ascii="Times New Roman" w:hAnsi="Times New Roman" w:eastAsia="宋体"/>
                 <w:sz w:val="18"/>
               </w:rPr>
-              <w:t>文件可打开；坐标范围、间距和单调性正确</w:t>
+              <w:t>NetCDF统一保存数据、坐标与自描述元数据</w:t>
             </w:r>
           </w:p>
         </w:tc>
@@ -1719,7 +1767,7 @@
                 <w:rFonts w:ascii="Times New Roman" w:hAnsi="Times New Roman" w:eastAsia="宋体"/>
                 <w:sz w:val="18"/>
               </w:rPr>
-              <w:t xml:space="preserve">二维 </w:t>
+              <w:t>二维</w:t>
             </w:r>
             <w:r>
               <w:rPr>
@@ -1733,7 +1781,7 @@
                 <w:rFonts w:ascii="Times New Roman" w:hAnsi="Times New Roman" w:eastAsia="宋体"/>
                 <w:sz w:val="18"/>
               </w:rPr>
-              <w:t xml:space="preserve">；三维 </w:t>
+              <w:t>；三维</w:t>
             </w:r>
             <w:r>
               <w:rPr>
@@ -1766,7 +1814,7 @@
                 <w:rFonts w:ascii="Times New Roman" w:hAnsi="Times New Roman" w:eastAsia="宋体"/>
                 <w:sz w:val="18"/>
               </w:rPr>
-              <w:t>对不同维度排列进行逐点金标准比较</w:t>
+              <w:t>通用维度映射将多种源排列转换为统一结构</w:t>
             </w:r>
           </w:p>
         </w:tc>
@@ -1813,7 +1861,7 @@
                 <w:rFonts w:ascii="Times New Roman" w:hAnsi="Times New Roman" w:eastAsia="宋体"/>
                 <w:sz w:val="18"/>
               </w:rPr>
-              <w:t xml:space="preserve"> 自西向东并统一到 </w:t>
+              <w:t>自西向东并统一到</w:t>
             </w:r>
             <w:r>
               <w:rPr>
@@ -1841,7 +1889,7 @@
                 <w:rFonts w:ascii="Times New Roman" w:hAnsi="Times New Roman" w:eastAsia="宋体"/>
                 <w:sz w:val="18"/>
               </w:rPr>
-              <w:t xml:space="preserve"> 自南向北</w:t>
+              <w:t>自南向北</w:t>
             </w:r>
           </w:p>
         </w:tc>
@@ -1860,7 +1908,7 @@
                 <w:rFonts w:ascii="Times New Roman" w:hAnsi="Times New Roman" w:eastAsia="宋体"/>
                 <w:sz w:val="18"/>
               </w:rPr>
-              <w:t>翻转和循环平移后数值位置正确</w:t>
+              <w:t>翻转和循环平移保持数据与坐标同步</w:t>
             </w:r>
           </w:p>
         </w:tc>
@@ -1907,7 +1955,7 @@
                 <w:rFonts w:ascii="Times New Roman" w:hAnsi="Times New Roman" w:eastAsia="宋体"/>
                 <w:sz w:val="18"/>
               </w:rPr>
-              <w:t xml:space="preserve"> 必需；</w:t>
+              <w:t>为主变量；</w:t>
             </w:r>
             <w:r>
               <w:rPr>
@@ -1921,21 +1969,7 @@
                 <w:rFonts w:ascii="Times New Roman" w:hAnsi="Times New Roman" w:eastAsia="宋体"/>
                 <w:sz w:val="18"/>
               </w:rPr>
-              <w:t xml:space="preserve"> 可选但必须与 </w:t>
-            </w:r>
-            <w:r>
-              <w:rPr>
-                <w:rFonts w:ascii="Consolas" w:hAnsi="Consolas" w:eastAsia="等线"/>
-                <w:sz w:val="18"/>
-              </w:rPr>
-              <w:t>data</w:t>
-            </w:r>
-            <w:r>
-              <w:rPr>
-                <w:rFonts w:ascii="Times New Roman" w:hAnsi="Times New Roman" w:eastAsia="宋体"/>
-                <w:sz w:val="18"/>
-              </w:rPr>
-              <w:t xml:space="preserve"> 同形；输出为实际物理值</w:t>
+              <w:t>保存同形不确定性；输出为实际物理值</w:t>
             </w:r>
           </w:p>
         </w:tc>
@@ -1954,7 +1988,7 @@
                 <w:rFonts w:ascii="Times New Roman" w:hAnsi="Times New Roman" w:eastAsia="宋体"/>
                 <w:sz w:val="18"/>
               </w:rPr>
-              <w:t>变量、形状、类型、单位和数值正确</w:t>
+              <w:t>统一变量命名、类型、单位和数值表达</w:t>
             </w:r>
           </w:p>
         </w:tc>
@@ -1975,7 +2009,7 @@
                 <w:rFonts w:ascii="Times New Roman" w:hAnsi="Times New Roman" w:eastAsia="宋体"/>
                 <w:sz w:val="18"/>
               </w:rPr>
-              <w:t>缺失值与范围</w:t>
+              <w:t>Gapfill与范围</w:t>
             </w:r>
           </w:p>
         </w:tc>
@@ -1994,21 +2028,7 @@
                 <w:rFonts w:ascii="Times New Roman" w:hAnsi="Times New Roman" w:eastAsia="宋体"/>
                 <w:sz w:val="18"/>
               </w:rPr>
-              <w:t xml:space="preserve">读取接口统一返回 </w:t>
-            </w:r>
-            <w:r>
-              <w:rPr>
-                <w:rFonts w:ascii="Consolas" w:hAnsi="Consolas" w:eastAsia="等线"/>
-                <w:sz w:val="18"/>
-              </w:rPr>
-              <w:t>NaN</w:t>
-            </w:r>
-            <w:r>
-              <w:rPr>
-                <w:rFonts w:ascii="Times New Roman" w:hAnsi="Times New Roman" w:eastAsia="宋体"/>
-                <w:sz w:val="18"/>
-              </w:rPr>
-              <w:t>；有效范围、填充值和 gap-filling 规则显式记录</w:t>
+              <w:t>有效范围、填充值和Gapfill策略由YAML显式声明</w:t>
             </w:r>
           </w:p>
         </w:tc>
@@ -2027,7 +2047,70 @@
                 <w:rFonts w:ascii="Times New Roman" w:hAnsi="Times New Roman" w:eastAsia="宋体"/>
                 <w:sz w:val="18"/>
               </w:rPr>
-              <w:t>按产品类别验收缺失值掩膜及填补结果</w:t>
+              <w:t>支持数值常数、</w:t>
+            </w:r>
+            <w:r>
+              <w:rPr>
+                <w:rFonts w:ascii="Consolas" w:hAnsi="Consolas" w:eastAsia="等线"/>
+                <w:sz w:val="18"/>
+              </w:rPr>
+              <w:t>MEAN</w:t>
+            </w:r>
+            <w:r>
+              <w:rPr>
+                <w:rFonts w:ascii="Times New Roman" w:hAnsi="Times New Roman" w:eastAsia="宋体"/>
+                <w:sz w:val="18"/>
+              </w:rPr>
+              <w:t>、</w:t>
+            </w:r>
+            <w:r>
+              <w:rPr>
+                <w:rFonts w:ascii="Consolas" w:hAnsi="Consolas" w:eastAsia="等线"/>
+                <w:sz w:val="18"/>
+              </w:rPr>
+              <w:t>KEEP_AS_IS</w:t>
+            </w:r>
+            <w:r>
+              <w:rPr>
+                <w:rFonts w:ascii="Times New Roman" w:hAnsi="Times New Roman" w:eastAsia="宋体"/>
+                <w:sz w:val="18"/>
+              </w:rPr>
+              <w:t>、</w:t>
+            </w:r>
+            <w:r>
+              <w:rPr>
+                <w:rFonts w:ascii="Consolas" w:hAnsi="Consolas" w:eastAsia="等线"/>
+                <w:sz w:val="18"/>
+              </w:rPr>
+              <w:t>INT_NAN_TO_1</w:t>
+            </w:r>
+            <w:r>
+              <w:rPr>
+                <w:rFonts w:ascii="Times New Roman" w:hAnsi="Times New Roman" w:eastAsia="宋体"/>
+                <w:sz w:val="18"/>
+              </w:rPr>
+              <w:t>、</w:t>
+            </w:r>
+            <w:r>
+              <w:rPr>
+                <w:rFonts w:ascii="Consolas" w:hAnsi="Consolas" w:eastAsia="等线"/>
+                <w:sz w:val="18"/>
+              </w:rPr>
+              <w:t>NO_LAND_NAN</w:t>
+            </w:r>
+            <w:r>
+              <w:rPr>
+                <w:rFonts w:ascii="Times New Roman" w:hAnsi="Times New Roman" w:eastAsia="宋体"/>
+                <w:sz w:val="18"/>
+              </w:rPr>
+              <w:t>和</w:t>
+            </w:r>
+            <w:r>
+              <w:rPr>
+                <w:rFonts w:ascii="Consolas" w:hAnsi="Consolas" w:eastAsia="等线"/>
+                <w:sz w:val="18"/>
+              </w:rPr>
+              <w:t>NO_NAN</w:t>
             </w:r>
           </w:p>
         </w:tc>
@@ -2067,7 +2150,7 @@
                 <w:rFonts w:ascii="Times New Roman" w:hAnsi="Times New Roman" w:eastAsia="宋体"/>
                 <w:sz w:val="18"/>
               </w:rPr>
-              <w:t xml:space="preserve">至少包含单位、可读说明；可映射时使用 CF </w:t>
+              <w:t xml:space="preserve">包含单位、可读说明；可映射时使用CF </w:t>
             </w:r>
             <w:r>
               <w:rPr>
@@ -2100,7 +2183,7 @@
                 <w:rFonts w:ascii="Times New Roman" w:hAnsi="Times New Roman" w:eastAsia="宋体"/>
                 <w:sz w:val="18"/>
               </w:rPr>
-              <w:t>schema、单位和标准名检查</w:t>
+              <w:t>元数据随产品生成并进入统一目录</w:t>
             </w:r>
           </w:p>
         </w:tc>
@@ -2159,7 +2242,7 @@
                 <w:rFonts w:ascii="Times New Roman" w:hAnsi="Times New Roman" w:eastAsia="宋体"/>
                 <w:sz w:val="18"/>
               </w:rPr>
-              <w:t>必填属性完整且链接有效</w:t>
+              <w:t>产品保留完整来源和处理上下文</w:t>
             </w:r>
           </w:p>
         </w:tc>
@@ -2199,7 +2282,7 @@
                 <w:rFonts w:ascii="Times New Roman" w:hAnsi="Times New Roman" w:eastAsia="宋体"/>
                 <w:sz w:val="18"/>
               </w:rPr>
-              <w:t>记录生产软件 commit/release、YAML schema 版本和配置哈希</w:t>
+              <w:t>记录生产软件release、YAML schema版本和配置哈希</w:t>
             </w:r>
           </w:p>
         </w:tc>
@@ -2218,7 +2301,7 @@
                 <w:rFonts w:ascii="Times New Roman" w:hAnsi="Times New Roman" w:eastAsia="宋体"/>
                 <w:sz w:val="18"/>
               </w:rPr>
-              <w:t>能由同一配置重建并对应实验清单</w:t>
+              <w:t>同一配置可重建相应标准产品</w:t>
             </w:r>
           </w:p>
         </w:tc>
@@ -2277,7 +2360,7 @@
                 <w:rFonts w:ascii="Times New Roman" w:hAnsi="Times New Roman" w:eastAsia="宋体"/>
                 <w:sz w:val="18"/>
               </w:rPr>
-              <w:t>格式合法、全目录唯一、与文件名一致</w:t>
+              <w:t>标签与文件名共同形成稳定产品标识</w:t>
             </w:r>
           </w:p>
         </w:tc>
@@ -2336,7 +2419,7 @@
                 <w:rFonts w:ascii="Times New Roman" w:hAnsi="Times New Roman" w:eastAsia="宋体"/>
                 <w:sz w:val="18"/>
               </w:rPr>
-              <w:t>下载后校验；正式目录始终保存通过校验的完整文件</w:t>
+              <w:t>下载后核验并以事务方式进入正式目录</w:t>
             </w:r>
           </w:p>
         </w:tc>
@@ -2357,7 +2440,7 @@
         <w:rPr>
           <w:rFonts w:ascii="Times New Roman" w:hAnsi="Times New Roman" w:eastAsia="宋体"/>
         </w:rPr>
-        <w:t xml:space="preserve"> Each requirement is evaluated by automated tests against the frozen experimental release. A detailed working table, including field-level checks, is maintained with the manuscript materials.</w:t>
+        <w:t xml:space="preserve"> The specification connects grid structure, gap filling, metadata, provenance, versioning, and distribution integrity within a unified production contract.</w:t>
       </w:r>
     </w:p>
     <w:p>
@@ -2365,19 +2448,91 @@
         <w:rPr>
           <w:rFonts w:ascii="Times New Roman" w:hAnsi="Times New Roman" w:eastAsia="宋体"/>
         </w:rPr>
-        <w:t>产品功能验收依据数据类型应用明确的数值与缺失值策略，包括常数填补、</w:t>
+        <w:t>缺失值处理由YAML中的</w:t>
       </w:r>
       <w:r>
         <w:rPr>
           <w:rFonts w:ascii="Consolas" w:hAnsi="Consolas" w:eastAsia="等线"/>
         </w:rPr>
+        <w:t>GAPFILL</w:t>
+      </w:r>
+      <w:r>
+        <w:rPr>
+          <w:rFonts w:ascii="Times New Roman" w:hAnsi="Times New Roman" w:eastAsia="宋体"/>
+        </w:rPr>
+        <w:t>字段驱动，并依据产品物理含义选择相应策略。数值常数和</w:t>
+      </w:r>
+      <w:r>
+        <w:rPr>
+          <w:rFonts w:ascii="Consolas" w:hAnsi="Consolas" w:eastAsia="等线"/>
+        </w:rPr>
+        <w:t>MEAN</w:t>
+      </w:r>
+      <w:r>
+        <w:rPr>
+          <w:rFonts w:ascii="Times New Roman" w:hAnsi="Times New Roman" w:eastAsia="宋体"/>
+        </w:rPr>
+        <w:t>分别以给定值或分层</w:t>
+      </w:r>
+      <w:r>
+        <w:rPr>
+          <w:rFonts w:ascii="Consolas" w:hAnsi="Consolas" w:eastAsia="等线"/>
+        </w:rPr>
         <w:t>nanmean</w:t>
       </w:r>
       <w:r>
         <w:rPr>
           <w:rFonts w:ascii="Times New Roman" w:hAnsi="Times New Roman" w:eastAsia="宋体"/>
         </w:rPr>
-        <w:t>填补、陆地区域完整性、全域完整性、原值保持和整数化。每项标准产品按所属类别检查数值范围、缺失值分布和处理结果。以ELEV为例，其陆地区域完整性要求扩展为全域有效值，进一步增强了下游读取与模型调用的稳定性。</w:t>
+        <w:t>填补陆地区域缺失值；</w:t>
+      </w:r>
+      <w:r>
+        <w:rPr>
+          <w:rFonts w:ascii="Consolas" w:hAnsi="Consolas" w:eastAsia="等线"/>
+        </w:rPr>
+        <w:t>KEEP_AS_IS</w:t>
+      </w:r>
+      <w:r>
+        <w:rPr>
+          <w:rFonts w:ascii="Times New Roman" w:hAnsi="Times New Roman" w:eastAsia="宋体"/>
+        </w:rPr>
+        <w:t>保持原始数组；</w:t>
+      </w:r>
+      <w:r>
+        <w:rPr>
+          <w:rFonts w:ascii="Consolas" w:hAnsi="Consolas" w:eastAsia="等线"/>
+        </w:rPr>
+        <w:t>INT_NAN_TO_1</w:t>
+      </w:r>
+      <w:r>
+        <w:rPr>
+          <w:rFonts w:ascii="Times New Roman" w:hAnsi="Times New Roman" w:eastAsia="宋体"/>
+        </w:rPr>
+        <w:t>将缺失值补为1并对数组整数化；</w:t>
+      </w:r>
+      <w:r>
+        <w:rPr>
+          <w:rFonts w:ascii="Consolas" w:hAnsi="Consolas" w:eastAsia="等线"/>
+        </w:rPr>
+        <w:t>NO_LAND_NAN</w:t>
+      </w:r>
+      <w:r>
+        <w:rPr>
+          <w:rFonts w:ascii="Times New Roman" w:hAnsi="Times New Roman" w:eastAsia="宋体"/>
+        </w:rPr>
+        <w:t>和</w:t>
+      </w:r>
+      <w:r>
+        <w:rPr>
+          <w:rFonts w:ascii="Consolas" w:hAnsi="Consolas" w:eastAsia="等线"/>
+        </w:rPr>
+        <w:t>NO_NAN</w:t>
+      </w:r>
+      <w:r>
+        <w:rPr>
+          <w:rFonts w:ascii="Times New Roman" w:hAnsi="Times New Roman" w:eastAsia="宋体"/>
+        </w:rPr>
+        <w:t>分别检查陆地区域与全域的数据完整性。Gapfill由此统一连接有效范围过滤、陆海掩膜、缺失值处置和输出精度，为不同地球系统数据产品提供可配置的数据完善方法。ELEV采用常数0填补策略，为统一读取和模型调用提供连续地形场。</w:t>
       </w:r>
     </w:p>
     <w:p>
@@ -2385,7 +2540,7 @@
         <w:rPr>
           <w:rFonts w:ascii="Times New Roman" w:hAnsi="Times New Roman" w:eastAsia="宋体"/>
         </w:rPr>
-        <w:t>CF约定利用坐标变量和属性表达维度语义[2]。GriddingMachine进一步固定输出维度顺序，以降低下游接口复杂度。论文版本通过YAML的</w:t>
+        <w:t>CF约定利用坐标变量和属性表达维度语义[2]。GriddingMachine进一步固定输出维度顺序，以降低下游接口复杂度。新版通过YAML的</w:t>
       </w:r>
       <w:r>
         <w:rPr>
@@ -2433,7 +2588,7 @@
         <w:rPr>
           <w:rFonts w:ascii="Times New Roman" w:hAnsi="Times New Roman" w:eastAsia="宋体"/>
         </w:rPr>
-        <w:t>等排列重排为统一输出；经纬度翻转与循环平移结合坐标值和位置编码数组完成验证。规则经纬网数据进入通用标准化流程，非规则网格、区域投影和复杂坐标数据则由数据源专用预处理模块完成适配。</w:t>
+        <w:t>等排列重排为统一输出；经纬度翻转与循环平移同步作用于坐标和数据值。规则经纬网数据进入通用标准化流程，非规则网格、区域投影和复杂坐标数据由数据源专用预处理模块完成适配。</w:t>
       </w:r>
     </w:p>
     <w:p>
@@ -2580,7 +2735,7 @@
         <w:rPr>
           <w:rFonts w:ascii="Times New Roman" w:hAnsi="Times New Roman" w:eastAsia="宋体"/>
         </w:rPr>
-        <w:t>论文版本加入</w:t>
+        <w:t>新版加入</w:t>
       </w:r>
       <w:r>
         <w:rPr>
@@ -2592,7 +2747,7 @@
         <w:rPr>
           <w:rFonts w:ascii="Times New Roman" w:hAnsi="Times New Roman" w:eastAsia="宋体"/>
         </w:rPr>
-        <w:t>并在数据读取前完成结构校验。字段分为必需项、具有明确默认值的可选项和互斥项，数组长度与变量前缀一一对应；</w:t>
+        <w:t>并在数据读取前解析配置结构。字段分为必需项、具有明确默认值的可选项和互斥项，数组长度与变量前缀一一对应；</w:t>
       </w:r>
       <w:r>
         <w:rPr>
@@ -2604,7 +2759,7 @@
         <w:rPr>
           <w:rFonts w:ascii="Times New Roman" w:hAnsi="Times New Roman" w:eastAsia="宋体"/>
         </w:rPr>
-        <w:t>、坐标变换、缺失值策略和输出属性由共享schema统一约束。生产配置及配置构建器采用直接NetCDF方案，缺省</w:t>
+        <w:t>、坐标变换、Gapfill和输出属性由共享schema统一约束。生产配置及配置构建器采用直接NetCDF方案，缺省</w:t>
       </w:r>
       <w:r>
         <w:rPr>
@@ -2628,7 +2783,7 @@
         <w:rPr>
           <w:rFonts w:ascii="Times New Roman" w:hAnsi="Times New Roman" w:eastAsia="宋体"/>
         </w:rPr>
-        <w:t>。当前自动测试覆盖最小配置、历史配置规范化、字段约束、数组长度和维度映射，后续schema版本将继续扩展来源、许可、引用和输出NetCDF溯源属性。</w:t>
+        <w:t>。版本化schema同时承接历史配置，并持续扩展来源、许可、引用和输出NetCDF溯源属性。</w:t>
       </w:r>
     </w:p>
     <w:p>
@@ -2647,7 +2802,7 @@
         <w:rPr>
           <w:rFonts w:ascii="Times New Roman" w:hAnsi="Times New Roman" w:eastAsia="宋体"/>
         </w:rPr>
-        <w:t>P01代表性贡献流程使用二维非对称参考数据验证配置与处理操作的对应关系。源变量采用</w:t>
+        <w:t>P01代表性贡献流程使用二维非对称参考数据呈现配置与处理操作的对应关系。源变量采用</w:t>
       </w:r>
       <w:r>
         <w:rPr>
@@ -2806,7 +2961,7 @@
         <w:rPr>
           <w:rFonts w:ascii="Times New Roman" w:hAnsi="Times New Roman" w:eastAsia="宋体"/>
         </w:rPr>
-        <w:t>描述处理契约，输出位置由调用者配置。契约测试表明，构建器生成的配置可直接交给</w:t>
+        <w:t>描述处理契约，输出位置由调用者配置。构建器生成的配置可直接交给</w:t>
       </w:r>
       <w:r>
         <w:rPr>
@@ -2818,7 +2973,7 @@
         <w:rPr>
           <w:rFonts w:ascii="Times New Roman" w:hAnsi="Times New Roman" w:eastAsia="宋体"/>
         </w:rPr>
-        <w:t>，字段错误在源数据读取前得到定位。框1和版本化指南共同提供面向贡献者的配置范式。</w:t>
+        <w:t>，字段信息在源数据读取前完成解析。框1和版本化指南共同提供面向贡献者的配置范式。</w:t>
       </w:r>
     </w:p>
     <w:p>
@@ -2947,7 +3102,7 @@
         <w:rPr>
           <w:rFonts w:ascii="Times New Roman" w:hAnsi="Times New Roman" w:eastAsia="宋体"/>
         </w:rPr>
-        <w:t>论文实验版本在保存前检查维度、坐标、变量、数值范围和缺失值规则，并以具有确定预期输出的合成NetCDF完成逐点自动断言。空间方向图为坐标语义提供直观复核。验证通过后生成</w:t>
+        <w:t>生产流程在保存前检查维度、坐标、变量、数值范围和Gapfill结果，空间方向图进一步呈现坐标语义。质量控制完成后生成</w:t>
       </w:r>
       <w:r>
         <w:rPr>
@@ -2983,7 +3138,7 @@
         <w:rPr>
           <w:rFonts w:ascii="Times New Roman" w:hAnsi="Times New Roman" w:eastAsia="宋体"/>
         </w:rPr>
-        <w:t>生成唯一文件名。重复调用对已有目标执行稳定跳过；下一版本将结合配置哈希、软件版本和文件摘要形成内容感知的重建判定。</w:t>
+        <w:t>生成唯一文件名。重复调用可识别已有目标；内容感知机制将进一步结合配置哈希、软件版本和文件摘要管理产品重建。</w:t>
       </w:r>
     </w:p>
     <w:p>
@@ -3005,7 +3160,7 @@
         <w:rPr>
           <w:rFonts w:ascii="Times New Roman" w:hAnsi="Times New Roman" w:eastAsia="宋体"/>
         </w:rPr>
-        <w:t>2.3.1 处理过程中的方向验证</w:t>
+        <w:t>2.3.1 处理过程中的空间方向控制</w:t>
       </w:r>
     </w:p>
     <w:p>
@@ -3081,7 +3236,7 @@
         <w:rPr>
           <w:rFonts w:ascii="Times New Roman" w:hAnsi="Times New Roman" w:eastAsia="宋体"/>
         </w:rPr>
-        <w:t>这一过程用于识别南北颠倒、东西颠倒和经度平移错误。V01/V02审核脚本分别提供方向正确与南北反转的非对称位置编码图，并保存图件与审核结果。正向图被正确接受，反向图被准确识别。人工空间判断与自动坐标、结构和逐点数值断言共同组成可复核的方向质量控制体系。</w:t>
+        <w:t>这一过程用于识别南北方向、东西方向和经度平移状态。V01/V02脚本分别提供方向正确与南北反转的非对称位置编码图，正向图与反向图均得到准确识别。人工空间判断与自动坐标、结构和逐点数值检查共同组成直观的方向质量控制体系。</w:t>
       </w:r>
     </w:p>
     <w:p>
@@ -3271,7 +3426,7 @@
         <w:rPr>
           <w:rFonts w:ascii="Times New Roman" w:hAnsi="Times New Roman" w:eastAsia="宋体"/>
         </w:rPr>
-        <w:t xml:space="preserve">数据文件名由 </w:t>
+        <w:t>数据文件名由</w:t>
       </w:r>
       <w:r>
         <w:rPr>
@@ -3283,7 +3438,7 @@
         <w:rPr>
           <w:rFonts w:ascii="Times New Roman" w:hAnsi="Times New Roman" w:eastAsia="宋体"/>
         </w:rPr>
-        <w:t xml:space="preserve"> 生成，基本形式为 </w:t>
+        <w:t>生成，基本形式为</w:t>
       </w:r>
       <w:r>
         <w:rPr>
@@ -3295,7 +3450,7 @@
         <w:rPr>
           <w:rFonts w:ascii="Times New Roman" w:hAnsi="Times New Roman" w:eastAsia="宋体"/>
         </w:rPr>
-        <w:t xml:space="preserve">。其中 </w:t>
+        <w:t>。其中</w:t>
       </w:r>
       <w:r>
         <w:rPr>
@@ -3307,7 +3462,7 @@
         <w:rPr>
           <w:rFonts w:ascii="Times New Roman" w:hAnsi="Times New Roman" w:eastAsia="宋体"/>
         </w:rPr>
-        <w:t xml:space="preserve"> 表示空间分辨率，</w:t>
+        <w:t>表示空间分辨率，</w:t>
       </w:r>
       <w:r>
         <w:rPr>
@@ -3319,7 +3474,7 @@
         <w:rPr>
           <w:rFonts w:ascii="Times New Roman" w:hAnsi="Times New Roman" w:eastAsia="宋体"/>
         </w:rPr>
-        <w:t xml:space="preserve"> 表示时间分辨率，</w:t>
+        <w:t>表示时间分辨率，</w:t>
       </w:r>
       <w:r>
         <w:rPr>
@@ -3331,7 +3486,7 @@
         <w:rPr>
           <w:rFonts w:ascii="Times New Roman" w:hAnsi="Times New Roman" w:eastAsia="宋体"/>
         </w:rPr>
-        <w:t xml:space="preserve"> 和 </w:t>
+        <w:t>和</w:t>
       </w:r>
       <w:r>
         <w:rPr>
@@ -3343,7 +3498,7 @@
         <w:rPr>
           <w:rFonts w:ascii="Times New Roman" w:hAnsi="Times New Roman" w:eastAsia="宋体"/>
         </w:rPr>
-        <w:t xml:space="preserve"> 为可选部分。生成输出路径时，代码读取当前 </w:t>
+        <w:t>为可选部分。生成输出路径时，代码读取当前</w:t>
       </w:r>
       <w:r>
         <w:rPr>
@@ -3355,7 +3510,7 @@
         <w:rPr>
           <w:rFonts w:ascii="Times New Roman" w:hAnsi="Times New Roman" w:eastAsia="宋体"/>
         </w:rPr>
-        <w:t>，如果拟生成标签已经存在则触发断言，从而避免直接产生同名数据文件。</w:t>
+        <w:t>并识别标签状态，以保持数据产品标识的唯一性。</w:t>
       </w:r>
     </w:p>
     <w:p>
@@ -3455,7 +3610,7 @@
         <w:rPr>
           <w:rFonts w:ascii="Times New Roman" w:hAnsi="Times New Roman" w:eastAsia="宋体"/>
         </w:rPr>
-        <w:t>目录生成器的单元测试使用临时文件核对字节数和SHA-256，并验证写回后的YAML值；下载端再以相同字段核验实际内容，从而形成“本地标准文件—目录条目—下载文件”的最小完整性链。历史目录迁移以权威本地文件重新生成</w:t>
+        <w:t>目录生成器从本地标准文件计算字节数和SHA-256并写入YAML，下载端以相同字段确认实际内容，从而形成“本地标准文件—目录条目—下载文件”的完整性链。历史目录迁移以权威本地文件重新生成</w:t>
       </w:r>
       <w:r>
         <w:rPr>
@@ -3542,7 +3697,7 @@
         <w:rPr>
           <w:rFonts w:ascii="Times New Roman" w:hAnsi="Times New Roman" w:eastAsia="宋体"/>
         </w:rPr>
-        <w:t>P01贡献流程依据版本化指南执行，贯通代表性数据集的配置生成、标准化、质量检查、模拟发布、目录登记和下游读取。流程反馈与最终NetCDF、目录项自动断言共同推动指南完善，形成包含固定输入路径和完整YAML示例的贡献模板。</w:t>
+        <w:t>P01贡献流程依据版本化指南贯通代表性数据集的配置生成、标准化、质量检查、发布、目录登记和下游读取。最终NetCDF与目录项保持一致，并形成包含固定输入路径和完整YAML示例的贡献模板。</w:t>
       </w:r>
     </w:p>
     <w:p>
@@ -3682,7 +3837,7 @@
         <w:rPr>
           <w:rFonts w:ascii="Times New Roman" w:hAnsi="Times New Roman" w:eastAsia="宋体"/>
         </w:rPr>
-        <w:t>。加载时对标签字符、路径、URL协议和完整性字段执行schema校验，并提供路径、URL、信息和本地状态查询。可配置根目录与显式网络访问共同支持隔离测试、离线复现和正式数据管理。</w:t>
+        <w:t>。加载时对标签字符、路径、URL协议和完整性字段执行schema校验，并提供路径、URL、信息和本地状态查询。可配置根目录与显式网络访问共同支持独立工作环境、离线复现和正式数据管理。</w:t>
       </w:r>
     </w:p>
     <w:p>
@@ -3871,7 +4026,7 @@
         <w:rPr>
           <w:rFonts w:ascii="Times New Roman" w:hAnsi="Times New Roman" w:eastAsia="宋体"/>
         </w:rPr>
-        <w:t>在更新目录后遍历标签并复用相同下载逻辑。状态矩阵以小型目录参考数据验证初始化、更新、同步、回退和清理行为，完整历史目录沿用同一事务机制开展批量运维。</w:t>
+        <w:t>在更新目录后遍历标签并复用相同下载逻辑。小型目录参考数据呈现初始化、更新、同步、回退和清理行为，完整历史目录沿用同一事务机制开展批量运维。</w:t>
       </w:r>
     </w:p>
     <w:p>
@@ -3879,7 +4034,7 @@
         <w:rPr>
           <w:rFonts w:ascii="Times New Roman" w:hAnsi="Times New Roman" w:eastAsia="宋体"/>
         </w:rPr>
-        <w:t>本地回归覆盖首选镜像状态、字节数、SHA-256、缓存恢复和镜像遍历等分发分支。双平台各完成65次包级状态断言，持续集成环境使用确定性NetCDF参考数据复现同一矩阵。分发可靠性矩阵与校园网FTP—Zenodo实测共同构成“事务安全—真实获取—内容一致”的分发证据链。</w:t>
+        <w:t>镜像状态分析覆盖候选顺序、字节数、SHA-256、缓存恢复和镜像遍历等分发环节。跨平台运行与校园网FTP—Zenodo实测共同呈现“事务安全—真实获取—内容一致”的分发链路。</w:t>
       </w:r>
     </w:p>
     <w:p>
@@ -3934,7 +4089,7 @@
         <w:rPr>
           <w:rFonts w:ascii="Times New Roman" w:hAnsi="Times New Roman" w:eastAsia="宋体"/>
         </w:rPr>
-        <w:t>依据当前有效目录识别历史文件，并支持在清理前刷新目录。路径检查将操作范围限定在托管数据目录。论文状态矩阵使用隔离根目录逐项验证更新、同步、查询和清理后的目录与文件状态。</w:t>
+        <w:t>依据当前有效目录识别历史文件，并支持在清理前刷新目录。路径检查将操作范围限定在托管数据目录，更新、同步、查询和清理共享统一的目录状态。</w:t>
       </w:r>
     </w:p>
     <w:p>
@@ -4125,7 +4280,7 @@
         <w:rPr>
           <w:rFonts w:ascii="Times New Roman" w:hAnsi="Times New Roman" w:eastAsia="宋体"/>
         </w:rPr>
-        <w:t>输出包括位置、分辨率、年份、CO₂、土壤水力参数、冠层结构、植物功能型比例、叶片生物物理和光合参数；启用验证时对字段完整性和</w:t>
+        <w:t>输出包括位置、分辨率、年份、CO₂、土壤水力参数、冠层结构、植物功能型比例、叶片生物物理和光合参数；启用质量控制时同步检查字段完整性和</w:t>
       </w:r>
       <w:r>
         <w:rPr>
@@ -4137,7 +4292,7 @@
         <w:rPr>
           <w:rFonts w:ascii="Times New Roman" w:hAnsi="Times New Roman" w:eastAsia="宋体"/>
         </w:rPr>
-        <w:t>状态执行断言。该接口把多个已标准化产品稳定组织为模型入口，内置经验系数、标签组合及陆面类型状态共同构成清晰的模型输入契约。</w:t>
+        <w:t>状态。该接口把多个已标准化产品稳定组织为模型入口，内置经验系数、标签组合及陆面类型状态共同构成清晰的模型输入契约。</w:t>
       </w:r>
     </w:p>
     <w:p>
@@ -4198,7 +4353,7 @@
         <w:rPr>
           <w:rFonts w:ascii="Times New Roman" w:hAnsi="Times New Roman" w:eastAsia="宋体"/>
         </w:rPr>
-        <w:t>及8个气象字段的字典，启用验证时对字段完整性和</w:t>
+        <w:t>及8个气象字段的字典，启用质量控制时同步检查字段完整性和</w:t>
       </w:r>
       <w:r>
         <w:rPr>
@@ -4210,7 +4365,7 @@
         <w:rPr>
           <w:rFonts w:ascii="Times New Roman" w:hAnsi="Times New Roman" w:eastAsia="宋体"/>
         </w:rPr>
-        <w:t>状态执行断言。接口既可直接按经纬度读取，也可从已经加载的全局气象数组提取格点序列。</w:t>
+        <w:t>状态。接口既可直接按经纬度读取，也可从已经加载的全局气象数组提取格点序列。</w:t>
       </w:r>
     </w:p>
     <w:p>
@@ -4230,7 +4385,7 @@
         <w:rPr>
           <w:rFonts w:ascii="Times New Roman" w:hAnsi="Times New Roman" w:eastAsia="宋体"/>
         </w:rPr>
-        <w:t>标签完成模型就绪字段组织。本文以确定性气象参考数据验证字段、形状和Emerald最小步进，并以真实</w:t>
+        <w:t>标签完成模型就绪字段组织。确定性气象参考数据用于组织字段、形状和Emerald最小步进，真实</w:t>
       </w:r>
       <w:r>
         <w:rPr>
@@ -4336,7 +4491,7 @@
         <w:rPr>
           <w:rFonts w:ascii="Times New Roman" w:hAnsi="Times New Roman" w:eastAsia="宋体"/>
         </w:rPr>
-        <w:t>和缺失文件下载会访问目录及其镜像；离线复现时可把</w:t>
+        <w:t>和缺失文件下载访问目录及其镜像；离线复现可将</w:t>
       </w:r>
       <w:r>
         <w:rPr>
@@ -4348,7 +4503,7 @@
         <w:rPr>
           <w:rFonts w:ascii="Times New Roman" w:hAnsi="Times New Roman" w:eastAsia="宋体"/>
         </w:rPr>
-        <w:t>和数据根目录固定到已经归档并完成哈希核验的本地副本。版本化用户指南集中提供完整安装、配置字段字典、目录登记和故障恢复命令，正文突出工作流结构及其验证结果。</w:t>
+        <w:t>和数据根目录指向已经归档并完成哈希核验的本地副本。版本化用户指南集中提供完整安装、配置字段字典、目录登记和状态恢复命令，正文突出工作流结构及其应用方式。</w:t>
       </w:r>
     </w:p>
     <w:p>
@@ -4359,7 +4514,7 @@
         <w:rPr>
           <w:rFonts w:ascii="Times New Roman" w:hAnsi="Times New Roman" w:eastAsia="宋体"/>
         </w:rPr>
-        <w:t>3 验证方法</w:t>
+        <w:t>3 典型应用与分析方法</w:t>
       </w:r>
     </w:p>
     <w:p>
@@ -4370,7 +4525,7 @@
         <w:rPr>
           <w:rFonts w:ascii="Times New Roman" w:hAnsi="Times New Roman" w:eastAsia="宋体"/>
         </w:rPr>
-        <w:t>3.1 数据生产正确性测试</w:t>
+        <w:t>3.1 标准数据生产与质量控制</w:t>
       </w:r>
     </w:p>
     <w:p>
@@ -4381,7 +4536,7 @@
         <w:rPr>
           <w:rFonts w:ascii="Times New Roman" w:hAnsi="Times New Roman" w:eastAsia="宋体"/>
         </w:rPr>
-        <w:t>3.1.1 测试目标与合成数据</w:t>
+        <w:t>3.1.1 维度、坐标与数值转换场景</w:t>
       </w:r>
     </w:p>
     <w:p>
@@ -4389,7 +4544,7 @@
         <w:rPr>
           <w:rFonts w:ascii="Times New Roman" w:hAnsi="Times New Roman" w:eastAsia="宋体"/>
         </w:rPr>
-        <w:t>数据生产正确性测试评价YAML驱动流程对数组变换和标准NetCDF生成的执行能力。测试对象对应论文发布版本，输入在隔离目录内生成，并以位置编码数组作为金标准：二维数组中每个格点由经纬度索引共同编码，三维数组进一步加入周期索引，使维度交换、方向翻转、经度平移和周期错位能够通过逐点比较识别。</w:t>
+        <w:t>为展示YAML驱动流程对多维地学数据的标准化能力，本文设计具有明确空间语义的位置编码数组：二维数组由经纬度索引共同编码，三维数组进一步加入周期索引。该设计能够清晰呈现维度交换、方向翻转、经度平移和周期组织前后的对应关系，并为标准NetCDF生产提供逐点参照。</w:t>
       </w:r>
     </w:p>
     <w:p>
@@ -4397,7 +4552,7 @@
         <w:rPr>
           <w:rFonts w:ascii="Times New Roman" w:hAnsi="Times New Roman" w:eastAsia="宋体"/>
         </w:rPr>
-        <w:t>测试矩阵由标准案例和扩展案例组成。标准案例包括</w:t>
+        <w:t>生产场景包括</w:t>
       </w:r>
       <w:r>
         <w:rPr>
@@ -4421,19 +4576,43 @@
         <w:rPr>
           <w:rFonts w:ascii="Times New Roman" w:hAnsi="Times New Roman" w:eastAsia="宋体"/>
         </w:rPr>
-        <w:t>输入、纬度/经度翻转、</w:t>
+        <w:t>标准输入、</w:t>
       </w:r>
       <w:r>
         <w:rPr>
           <w:rFonts w:ascii="Consolas" w:hAnsi="Consolas" w:eastAsia="等线"/>
         </w:rPr>
+        <w:t>(lat,lon)</w:t>
+      </w:r>
+      <w:r>
+        <w:rPr>
+          <w:rFonts w:ascii="Times New Roman" w:hAnsi="Times New Roman" w:eastAsia="宋体"/>
+        </w:rPr>
+        <w:t>与</w:t>
+      </w:r>
+      <w:r>
+        <w:rPr>
+          <w:rFonts w:ascii="Consolas" w:hAnsi="Consolas" w:eastAsia="等线"/>
+        </w:rPr>
+        <w:t>(ind,lat,lon)</w:t>
+      </w:r>
+      <w:r>
+        <w:rPr>
+          <w:rFonts w:ascii="Times New Roman" w:hAnsi="Times New Roman" w:eastAsia="宋体"/>
+        </w:rPr>
+        <w:t>源排列、纬度和经度翻转、</w:t>
+      </w:r>
+      <w:r>
+        <w:rPr>
+          <w:rFonts w:ascii="Consolas" w:hAnsi="Consolas" w:eastAsia="等线"/>
+        </w:rPr>
         <w:t>0～360°</w:t>
       </w:r>
       <w:r>
         <w:rPr>
           <w:rFonts w:ascii="Times New Roman" w:hAnsi="Times New Roman" w:eastAsia="宋体"/>
         </w:rPr>
-        <w:t>经度平移、线性缩放、范围过滤、各类缺失值处理、</w:t>
+        <w:t>经度平移、线性缩放、范围过滤、Gapfill、</w:t>
       </w:r>
       <w:r>
         <w:rPr>
@@ -4445,43 +4624,7 @@
         <w:rPr>
           <w:rFonts w:ascii="Times New Roman" w:hAnsi="Times New Roman" w:eastAsia="宋体"/>
         </w:rPr>
-        <w:t>保存和标签生成。扩展案例覆盖</w:t>
-      </w:r>
-      <w:r>
-        <w:rPr>
-          <w:rFonts w:ascii="Consolas" w:hAnsi="Consolas" w:eastAsia="等线"/>
-        </w:rPr>
-        <w:t>(lat,lon)</w:t>
-      </w:r>
-      <w:r>
-        <w:rPr>
-          <w:rFonts w:ascii="Times New Roman" w:hAnsi="Times New Roman" w:eastAsia="宋体"/>
-        </w:rPr>
-        <w:t>、</w:t>
-      </w:r>
-      <w:r>
-        <w:rPr>
-          <w:rFonts w:ascii="Consolas" w:hAnsi="Consolas" w:eastAsia="等线"/>
-        </w:rPr>
-        <w:t>(ind,lat,lon)</w:t>
-      </w:r>
-      <w:r>
-        <w:rPr>
-          <w:rFonts w:ascii="Times New Roman" w:hAnsi="Times New Roman" w:eastAsia="宋体"/>
-        </w:rPr>
-        <w:t>等源维度顺序、字段完整性、变量标签数量、</w:t>
-      </w:r>
-      <w:r>
-        <w:rPr>
-          <w:rFonts w:ascii="Consolas" w:hAnsi="Consolas" w:eastAsia="等线"/>
-        </w:rPr>
-        <w:t>GAPFILL</w:t>
-      </w:r>
-      <w:r>
-        <w:rPr>
-          <w:rFonts w:ascii="Times New Roman" w:hAnsi="Times New Roman" w:eastAsia="宋体"/>
-        </w:rPr>
-        <w:t>方法识别和已有目标文件等状态，并分别设置“正确转换”或“明确状态响应”的预期结果。</w:t>
+        <w:t>保存和标签生成。配置字段、变量数量、已有产品和标签状态共同覆盖标准产品从源数据到目录登记的主要环节。</w:t>
       </w:r>
     </w:p>
     <w:p>
@@ -4492,7 +4635,7 @@
         <w:rPr>
           <w:rFonts w:ascii="Times New Roman" w:hAnsi="Times New Roman" w:eastAsia="宋体"/>
         </w:rPr>
-        <w:t>3.1.2 测试矩阵</w:t>
+        <w:t>3.1.2 标准产品生产场景</w:t>
       </w:r>
     </w:p>
     <w:p>
@@ -4500,7 +4643,7 @@
         <w:rPr>
           <w:rFonts w:ascii="Times New Roman" w:hAnsi="Times New Roman" w:eastAsia="宋体"/>
         </w:rPr>
-        <w:t>表3将案例分为维度（D）、坐标（C）、数值（N）、缺失值（G）、YAML配置（Y）、输出（O）和人工验证（V）7组。详细工作表共定义31个案例，并分别记录目标行为、基线预期和实测结果，使测试设计与结果记录保持清晰分层。</w:t>
+        <w:t>表3将标准产品生产分为维度（D）、坐标（C）、数值（N）、Gapfill（G）、YAML配置（Y）、输出（O）和空间方向检查（V）7组，共覆盖31个代表性场景。各组对应共享生产契约中的一个关键环节，并以结构、数值或产品状态描述处理结果。</w:t>
       </w:r>
     </w:p>
     <w:p>
@@ -4512,7 +4655,7 @@
           <w:rFonts w:ascii="Times New Roman" w:hAnsi="Times New Roman" w:eastAsia="宋体"/>
           <w:b/>
         </w:rPr>
-        <w:t>表3 GriddingMachineDatasets 合成 NetCDF 测试矩阵（正文摘要）</w:t>
+        <w:t>表3 GriddingMachineDatasets标准产品生产场景</w:t>
       </w:r>
     </w:p>
     <w:tbl>
@@ -4546,7 +4689,7 @@
                 <w:b/>
                 <w:sz w:val="18"/>
               </w:rPr>
-              <w:t>组别</w:t>
+              <w:t>环节</w:t>
             </w:r>
           </w:p>
         </w:tc>
@@ -4568,7 +4711,7 @@
                 <w:b/>
                 <w:sz w:val="18"/>
               </w:rPr>
-              <w:t>案例数</w:t>
+              <w:t>场景数</w:t>
             </w:r>
           </w:p>
         </w:tc>
@@ -4590,7 +4733,7 @@
                 <w:b/>
                 <w:sz w:val="18"/>
               </w:rPr>
-              <w:t>主要组合</w:t>
+              <w:t>主要内容</w:t>
             </w:r>
           </w:p>
         </w:tc>
@@ -4612,7 +4755,7 @@
                 <w:b/>
                 <w:sz w:val="18"/>
               </w:rPr>
-              <w:t>核心断言</w:t>
+              <w:t>处理结果</w:t>
             </w:r>
           </w:p>
         </w:tc>
@@ -4909,7 +5052,7 @@
                 <w:rFonts w:ascii="Times New Roman" w:hAnsi="Times New Roman" w:eastAsia="宋体"/>
                 <w:sz w:val="18"/>
               </w:rPr>
-              <w:t>G 缺失值</w:t>
+              <w:t>G Gapfill</w:t>
             </w:r>
           </w:p>
         </w:tc>
@@ -4947,7 +5090,21 @@
                 <w:rFonts w:ascii="Times New Roman" w:hAnsi="Times New Roman" w:eastAsia="宋体"/>
                 <w:sz w:val="18"/>
               </w:rPr>
-              <w:t>常数、均值、保留、陆地完整、全域完整、整数化和方法状态</w:t>
+              <w:t>常数、</w:t>
+            </w:r>
+            <w:r>
+              <w:rPr>
+                <w:rFonts w:ascii="Consolas" w:hAnsi="Consolas" w:eastAsia="等线"/>
+                <w:sz w:val="18"/>
+              </w:rPr>
+              <w:t>nanmean</w:t>
+            </w:r>
+            <w:r>
+              <w:rPr>
+                <w:rFonts w:ascii="Times New Roman" w:hAnsi="Times New Roman" w:eastAsia="宋体"/>
+                <w:sz w:val="18"/>
+              </w:rPr>
+              <w:t>、原值保持、陆地完整、全域完整和整数化</w:t>
             </w:r>
           </w:p>
         </w:tc>
@@ -4966,7 +5123,7 @@
                 <w:rFonts w:ascii="Times New Roman" w:hAnsi="Times New Roman" w:eastAsia="宋体"/>
                 <w:sz w:val="18"/>
               </w:rPr>
-              <w:t>修改位置、填充值、日志和返回值</w:t>
+              <w:t>填补位置、填充值、覆盖范围和处理记录</w:t>
             </w:r>
           </w:p>
         </w:tc>
@@ -5044,7 +5201,7 @@
                 <w:rFonts w:ascii="Times New Roman" w:hAnsi="Times New Roman" w:eastAsia="宋体"/>
                 <w:sz w:val="18"/>
               </w:rPr>
-              <w:t>成功输出或明确状态</w:t>
+              <w:t>配置解析、字段定位和产品生成</w:t>
             </w:r>
           </w:p>
         </w:tc>
@@ -5124,7 +5281,7 @@
                 <w:rFonts w:ascii="Times New Roman" w:hAnsi="Times New Roman" w:eastAsia="宋体"/>
                 <w:sz w:val="18"/>
               </w:rPr>
-              <w:t>、已有文件、标签冲突</w:t>
+              <w:t>、已有文件、标签状态</w:t>
             </w:r>
           </w:p>
         </w:tc>
@@ -5143,7 +5300,7 @@
                 <w:rFonts w:ascii="Times New Roman" w:hAnsi="Times New Roman" w:eastAsia="宋体"/>
                 <w:sz w:val="18"/>
               </w:rPr>
-              <w:t>变量、属性、跳过策略和唯一性</w:t>
+              <w:t>变量、属性、版本策略和标签唯一性</w:t>
             </w:r>
           </w:p>
         </w:tc>
@@ -5164,7 +5321,7 @@
                 <w:rFonts w:ascii="Times New Roman" w:hAnsi="Times New Roman" w:eastAsia="宋体"/>
                 <w:sz w:val="18"/>
               </w:rPr>
-              <w:t>V 人工检查</w:t>
+              <w:t>V 方向检查</w:t>
             </w:r>
           </w:p>
         </w:tc>
@@ -5202,7 +5359,7 @@
                 <w:rFonts w:ascii="Times New Roman" w:hAnsi="Times New Roman" w:eastAsia="宋体"/>
                 <w:sz w:val="18"/>
               </w:rPr>
-              <w:t>正向图接受、反向图识别</w:t>
+              <w:t>正向图识别、反向图识别</w:t>
             </w:r>
           </w:p>
         </w:tc>
@@ -5221,7 +5378,7 @@
                 <w:rFonts w:ascii="Times New Roman" w:hAnsi="Times New Roman" w:eastAsia="宋体"/>
                 <w:sz w:val="18"/>
               </w:rPr>
-              <w:t>保存状态及临时验证状态</w:t>
+              <w:t>空间方向与坐标语义一致</w:t>
             </w:r>
           </w:p>
         </w:tc>
@@ -5236,13 +5393,13 @@
           <w:rFonts w:ascii="Times New Roman" w:hAnsi="Times New Roman" w:eastAsia="宋体"/>
           <w:b/>
         </w:rPr>
-        <w:t>Table 3 Synthetic NetCDF test matrix for GriddingMachineDatasets.</w:t>
-      </w:r>
-      <w:r>
-        <w:rPr>
-          <w:rFonts w:ascii="Times New Roman" w:hAnsi="Times New Roman" w:eastAsia="宋体"/>
-        </w:rPr>
-        <w:t xml:space="preserve"> The matrix evaluates dimensions, coordinates, numerical transformations, missing-value handling, YAML configurations, output files, and interactive orientation checks. Detailed fixtures and expected outcomes are fixed before code changes; only measurements from the frozen release will be reported as results.</w:t>
+        <w:t>Table 3 Representative standardized-product production scenarios in GriddingMachineDatasets.</w:t>
+      </w:r>
+      <w:r>
+        <w:rPr>
+          <w:rFonts w:ascii="Times New Roman" w:hAnsi="Times New Roman" w:eastAsia="宋体"/>
+        </w:rPr>
+        <w:t xml:space="preserve"> The scenarios cover dimensions, coordinates, numerical transformations, gap filling, YAML configuration, product output, and spatial-orientation inspection.</w:t>
       </w:r>
     </w:p>
     <w:p>
@@ -5253,7 +5410,7 @@
         <w:rPr>
           <w:rFonts w:ascii="Times New Roman" w:hAnsi="Times New Roman" w:eastAsia="宋体"/>
         </w:rPr>
-        <w:t>3.1.3 指标与通过标准</w:t>
+        <w:t>3.1.3 产品质量控制</w:t>
       </w:r>
     </w:p>
     <w:p>
@@ -5261,7 +5418,7 @@
         <w:rPr>
           <w:rFonts w:ascii="Times New Roman" w:hAnsi="Times New Roman" w:eastAsia="宋体"/>
         </w:rPr>
-        <w:t>每个案例记录结构、数值和状态检查结果。结构通过要求输出变量、维度、形状和属性与预期一致；数值通过要求逐点结果与金标准一致，Float32转换按预先固定的绝对和相对容差判断；异常输入要求函数在指定阶段返回明确状态，同时保持正式输出目录稳定。实验同步记录最大绝对误差、最大相对误差、处理日志和重复运行一致性。</w:t>
+        <w:t>产品质量控制覆盖变量、维度、形状、属性、坐标方向、数值范围和Gapfill结果。输出数组与位置编码参照逐点对应，Float32转换采用统一的绝对和相对容差；配置与产品状态通过明确的流程信息反馈给维护者。质量报告同步保存最大绝对误差、最大相对误差、处理历史和重复生产一致性。</w:t>
       </w:r>
     </w:p>
     <w:p>
@@ -5269,7 +5426,7 @@
         <w:rPr>
           <w:rFonts w:ascii="Times New Roman" w:hAnsi="Times New Roman" w:eastAsia="宋体"/>
         </w:rPr>
-        <w:t>生产矩阵在Windows和macOS环境中独立重复运行。标准案例要求结构与逐点数值完全符合金标准，扩展案例要求返回稳定、明确的状态。两个平台的29个自动案例均连续通过，V01正向图接受和V02南北反转图识别结果与预期一致，展示了生产契约在数组变换、配置校验和空间方向控制方面的稳定性。</w:t>
+        <w:t>标准产品生产流程在Windows和macOS环境中均保持一致行为。29个自动场景连续完成，V01正向图和V02南北反转图均得到准确识别，展示了共享生产契约在数组变换、配置解析和空间方向控制方面的稳定性。</w:t>
       </w:r>
     </w:p>
     <w:p>
@@ -5280,18 +5437,12 @@
         <w:rPr>
           <w:rFonts w:ascii="Times New Roman" w:hAnsi="Times New Roman" w:eastAsia="宋体"/>
         </w:rPr>
-        <w:t>3.1.4 YAML配置契约与贡献流程复现</w:t>
+        <w:t>3.1.4 YAML配置与数据贡献工作流</w:t>
       </w:r>
     </w:p>
     <w:p>
       <w:r>
         <w:rPr>
-          <w:rFonts w:ascii="Times New Roman" w:hAnsi="Times New Roman" w:eastAsia="宋体"/>
-        </w:rPr>
-        <w:t>配置契约测试向</w:t>
-      </w:r>
-      <w:r>
-        <w:rPr>
           <w:rFonts w:ascii="Consolas" w:hAnsi="Consolas" w:eastAsia="等线"/>
         </w:rPr>
         <w:t>YamlBuilder</w:t>
@@ -5300,7 +5451,7 @@
         <w:rPr>
           <w:rFonts w:ascii="Times New Roman" w:hAnsi="Times New Roman" w:eastAsia="宋体"/>
         </w:rPr>
-        <w:t>提供最小二维数据、含</w:t>
+        <w:t>面向二维数据、含</w:t>
       </w:r>
       <w:r>
         <w:rPr>
@@ -5312,7 +5463,7 @@
         <w:rPr>
           <w:rFonts w:ascii="Times New Roman" w:hAnsi="Times New Roman" w:eastAsia="宋体"/>
         </w:rPr>
-        <w:t>的三维数据、经纬度变换数据和字段异常数据，检查生成结果与共享YAML schema的一致性，并将有效配置直接交给</w:t>
+        <w:t>的三维数据和经纬度变换数据生成符合共享schema的配置，并将配置直接交给</w:t>
       </w:r>
       <w:r>
         <w:rPr>
@@ -5324,7 +5475,7 @@
         <w:rPr>
           <w:rFonts w:ascii="Times New Roman" w:hAnsi="Times New Roman" w:eastAsia="宋体"/>
         </w:rPr>
-        <w:t>。通过标准包括金标准NetCDF生成、字段级异常定位、直接NetCDF配置和可配置输出路径。</w:t>
+        <w:t>。字段级信息、直接NetCDF输出和可配置路径共同构成面向数据贡献者的生产入口。</w:t>
       </w:r>
     </w:p>
     <w:p>
@@ -5332,7 +5483,7 @@
         <w:rPr>
           <w:rFonts w:ascii="Times New Roman" w:hAnsi="Times New Roman" w:eastAsia="宋体"/>
         </w:rPr>
-        <w:t>P01代表性贡献案例依次执行配置生成、标准化、自动与人工检查、发布模拟、</w:t>
+        <w:t>P01代表性贡献案例依次完成配置生成、标准化、自动与人工质量检查、产品发布、</w:t>
       </w:r>
       <w:r>
         <w:rPr>
@@ -5344,7 +5495,7 @@
         <w:rPr>
           <w:rFonts w:ascii="Times New Roman" w:hAnsi="Times New Roman" w:eastAsia="宋体"/>
         </w:rPr>
-        <w:t>登记以及下游更新、下载和读取。流程反馈和最终产物断言用于评价步骤连贯性并优化贡献指南。</w:t>
+        <w:t>登记以及下游更新、下载和读取，呈现数据贡献者使用新版工作流的完整路径。</w:t>
       </w:r>
     </w:p>
     <w:p>
@@ -5363,7 +5514,7 @@
         <w:rPr>
           <w:rFonts w:ascii="Times New Roman" w:hAnsi="Times New Roman" w:eastAsia="宋体"/>
         </w:rPr>
-        <w:t>实验选择二维静态高程</w:t>
+        <w:t>直接NetCDF分发效率采用二维静态高程</w:t>
       </w:r>
       <w:r>
         <w:rPr>
@@ -5387,7 +5538,7 @@
         <w:rPr>
           <w:rFonts w:ascii="Times New Roman" w:hAnsi="Times New Roman" w:eastAsia="宋体"/>
         </w:rPr>
-        <w:t>，覆盖小型二维与中型三维内部压缩产品。每个标准NetCDF分别以原始</w:t>
+        <w:t>进行分析，代表不同规模和维度的内部压缩产品。每个标准NetCDF分别以原始</w:t>
       </w:r>
       <w:r>
         <w:rPr>
@@ -5411,7 +5562,7 @@
         <w:rPr>
           <w:rFonts w:ascii="Times New Roman" w:hAnsi="Times New Roman" w:eastAsia="宋体"/>
         </w:rPr>
-        <w:t>分发；对照固定使用gzip级别6。解包后的NetCDF与直接文件保持相同SHA-256，由此量化直接NetCDF省去外层打包与解包后的时间和临时空间收益。</w:t>
+        <w:t>分发，对照归档采用gzip级别6。两种形式解包后的NetCDF具有相同SHA-256，据此量化省去外层打包与解包带来的时间和临时空间收益。</w:t>
       </w:r>
     </w:p>
     <w:p>
@@ -5419,7 +5570,7 @@
         <w:rPr>
           <w:rFonts w:ascii="Times New Roman" w:hAnsi="Times New Roman" w:eastAsia="宋体"/>
         </w:rPr>
-        <w:t>测试在同机本地HTTP服务上进行，每个组合预热1次并按随机顺序重复10次，记录传输字节数、打包与解包时间、从请求开始到首次读取NetCDF值的时间，以及下载文件与解包文件并存时的逻辑最大临时占用。两个独立环境使用同一脚本、随机种子和输入文件执行。时间指标报告中位数、四分位距和95% bootstrap置信区间，并以端到端时间和逻辑临时占用的稳定变化评价效率提升。</w:t>
+        <w:t>性能分析在本地HTTP服务中采用随机顺序重复测量，记录传输字节数、打包与解包时间、从请求开始到首次读取NetCDF值的端到端时间，以及下载文件与解包文件并存时的逻辑临时占用。两个独立环境使用一致的脚本和输入文件，时间指标以中位数、四分位距和95% bootstrap置信区间表示。</w:t>
       </w:r>
     </w:p>
     <w:p>
@@ -5430,7 +5581,7 @@
         <w:rPr>
           <w:rFonts w:ascii="Times New Roman" w:hAnsi="Times New Roman" w:eastAsia="宋体"/>
         </w:rPr>
-        <w:t>3.3 Collector操作与多镜像分发可靠性评价</w:t>
+        <w:t>3.3 数据目录与多镜像分发分析</w:t>
       </w:r>
     </w:p>
     <w:p>
@@ -5441,7 +5592,7 @@
         <w:rPr>
           <w:rFonts w:ascii="Times New Roman" w:hAnsi="Times New Roman" w:eastAsia="宋体"/>
         </w:rPr>
-        <w:t>3.3.1 公共操作状态矩阵</w:t>
+        <w:t>3.3.1 数据目录生命周期</w:t>
       </w:r>
     </w:p>
     <w:p>
@@ -5449,12 +5600,24 @@
         <w:rPr>
           <w:rFonts w:ascii="Times New Roman" w:hAnsi="Times New Roman" w:eastAsia="宋体"/>
         </w:rPr>
-        <w:t>测试在隔离的临时数据根目录内建立小型远端目录、旧本地目录、2～3个小型NetCDF和两个镜像端点，覆盖目录首次建立、版本一致、版本更新、目录校验和网络状态等初始条件。实验逐项调用初始化与加载、</w:t>
+        <w:t>数据目录生命周期涵盖首次建立、版本更新、目录同步、产品获取、状态查询和历史数据整理。代表性目录包含不同版本的</w:t>
       </w:r>
       <w:r>
         <w:rPr>
           <w:rFonts w:ascii="Consolas" w:hAnsi="Consolas" w:eastAsia="等线"/>
         </w:rPr>
+        <w:t>Artifacts.yaml</w:t>
+      </w:r>
+      <w:r>
+        <w:rPr>
+          <w:rFonts w:ascii="Times New Roman" w:hAnsi="Times New Roman" w:eastAsia="宋体"/>
+        </w:rPr>
+        <w:t>、多个NetCDF产品和两个镜像端点，并依次调用</w:t>
+      </w:r>
+      <w:r>
+        <w:rPr>
+          <w:rFonts w:ascii="Consolas" w:hAnsi="Consolas" w:eastAsia="等线"/>
+        </w:rPr>
         <w:t>update_database!</w:t>
       </w:r>
       <w:r>
@@ -5497,55 +5660,19 @@
         <w:rPr>
           <w:rFonts w:ascii="Times New Roman" w:hAnsi="Times New Roman" w:eastAsia="宋体"/>
         </w:rPr>
-        <w:t>、目录树和数据集信息查询，并检查返回值、内存标签、目录版本、cache和public文件状态。</w:t>
+        <w:t>及目录信息接口。cache与public目录分别承担事务缓存和正式产品保存，</w:t>
       </w:r>
       <w:r>
         <w:rPr>
           <w:rFonts w:ascii="Consolas" w:hAnsi="Consolas" w:eastAsia="等线"/>
         </w:rPr>
-        <w:t>clean_database!("old")</w:t>
-      </w:r>
-      <w:r>
-        <w:rPr>
-          <w:rFonts w:ascii="Times New Roman" w:hAnsi="Times New Roman" w:eastAsia="宋体"/>
-        </w:rPr>
-        <w:t>、</w:t>
-      </w:r>
-      <w:r>
-        <w:rPr>
-          <w:rFonts w:ascii="Consolas" w:hAnsi="Consolas" w:eastAsia="等线"/>
-        </w:rPr>
-        <w:t>clean_database!("all")</w:t>
-      </w:r>
-      <w:r>
-        <w:rPr>
-          <w:rFonts w:ascii="Times New Roman" w:hAnsi="Times New Roman" w:eastAsia="宋体"/>
-        </w:rPr>
-        <w:t>和按标签清理均在隔离的临时根目录内执行。</w:t>
-      </w:r>
-      <w:r>
-        <w:rPr>
-          <w:rFonts w:ascii="Consolas" w:hAnsi="Consolas" w:eastAsia="等线"/>
-        </w:rPr>
         <w:t>read_dataset</w:t>
       </w:r>
       <w:r>
         <w:rPr>
           <w:rFonts w:ascii="Times New Roman" w:hAnsi="Times New Roman" w:eastAsia="宋体"/>
         </w:rPr>
-        <w:t>的4类重载和</w:t>
-      </w:r>
-      <w:r>
-        <w:rPr>
-          <w:rFonts w:ascii="Consolas" w:hAnsi="Consolas" w:eastAsia="等线"/>
-        </w:rPr>
-        <w:t>read_LUT</w:t>
-      </w:r>
-      <w:r>
-        <w:rPr>
-          <w:rFonts w:ascii="Times New Roman" w:hAnsi="Times New Roman" w:eastAsia="宋体"/>
-        </w:rPr>
-        <w:t>兼容别名也纳入同一回归矩阵。</w:t>
+        <w:t>的整场、周期和站点读取共同连接目录与数据使用环节。</w:t>
       </w:r>
     </w:p>
     <w:p>
@@ -5553,7 +5680,7 @@
         <w:rPr>
           <w:rFonts w:ascii="Times New Roman" w:hAnsi="Times New Roman" w:eastAsia="宋体"/>
         </w:rPr>
-        <w:t>每个状态转换独立重复3次，实际状态与预期状态逐项比较。重复调用采用预先定义的幂等行为，上一有效版本和事务缓存共同承接目录与下载状态。</w:t>
+        <w:t>各状态转换通过重复调用考察幂等行为，上一有效版本和事务缓存共同承接目录与下载状态。</w:t>
       </w:r>
       <w:r>
         <w:rPr>
@@ -5565,7 +5692,7 @@
         <w:rPr>
           <w:rFonts w:ascii="Times New Roman" w:hAnsi="Times New Roman" w:eastAsia="宋体"/>
         </w:rPr>
-        <w:t>使用确定性小型目录参考数据复现全库遍历逻辑。</w:t>
+        <w:t>使用确定性小型目录参考数据呈现全库遍历逻辑。</w:t>
       </w:r>
     </w:p>
     <w:p>
@@ -5584,7 +5711,7 @@
         <w:rPr>
           <w:rFonts w:ascii="Times New Roman" w:hAnsi="Times New Roman" w:eastAsia="宋体"/>
         </w:rPr>
-        <w:t>多镜像状态评价在两个独立环境中建立内容一致且状态可配置的HTTP端点，并通过延迟分数组织候选顺序，覆盖404、超时、连接重置、延迟探测状态、镜像遍历、缓存恢复、内容类型、哈希差异和传输完整性等场景。各场景重复5次，记录候选顺序、回退次数、最终状态以及cache/public文件的字节数和SHA-256变化。事务机制使目录摘要一致的文件进入正式路径，并在各类镜像状态下保持既有正式文件稳定。校园网FTP与Zenodo实测进一步验证真实镜像的可达性和内容一致性。</w:t>
+        <w:t>多镜像状态分析在两个独立环境中建立内容一致且状态可配置的HTTP端点，并通过延迟分数组织候选顺序，覆盖404、超时、连接重置、延迟探测状态、镜像遍历、缓存恢复、内容类型、哈希差异和传输完整性等场景。各场景重复5次，记录候选顺序、回退次数、最终状态以及cache/public文件的字节数和SHA-256变化。事务机制使目录摘要一致的文件进入正式路径，并在各类镜像状态下保持既有正式文件稳定。校园网FTP与Zenodo访问进一步呈现真实镜像的可达性和内容一致性。</w:t>
       </w:r>
     </w:p>
     <w:p>
@@ -5595,7 +5722,7 @@
         <w:rPr>
           <w:rFonts w:ascii="Times New Roman" w:hAnsi="Times New Roman" w:eastAsia="宋体"/>
         </w:rPr>
-        <w:t>3.3.3 真实镜像补充检查</w:t>
+        <w:t>3.3.3 真实镜像访问</w:t>
       </w:r>
     </w:p>
     <w:p>
@@ -5626,7 +5753,7 @@
         <w:rPr>
           <w:rFonts w:ascii="Times New Roman" w:hAnsi="Times New Roman" w:eastAsia="宋体"/>
         </w:rPr>
-        <w:t>3.4 统一读取与模型初始化案例</w:t>
+        <w:t>3.4 统一读取与模型就绪应用</w:t>
       </w:r>
     </w:p>
     <w:p>
@@ -5634,7 +5761,7 @@
         <w:rPr>
           <w:rFonts w:ascii="Times New Roman" w:hAnsi="Times New Roman" w:eastAsia="宋体"/>
         </w:rPr>
-        <w:t>接口验证结合字段一致性评价与真实陆面案例。确定性参考数据逐字段检查</w:t>
+        <w:t>模型就绪应用连接</w:t>
       </w:r>
       <w:r>
         <w:rPr>
@@ -5658,7 +5785,7 @@
         <w:rPr>
           <w:rFonts w:ascii="Times New Roman" w:hAnsi="Times New Roman" w:eastAsia="宋体"/>
         </w:rPr>
-        <w:t>和</w:t>
+        <w:t>、</w:t>
       </w:r>
       <w:r>
         <w:rPr>
@@ -5670,7 +5797,7 @@
         <w:rPr>
           <w:rFonts w:ascii="Times New Roman" w:hAnsi="Times New Roman" w:eastAsia="宋体"/>
         </w:rPr>
-        <w:t>的字段名、形状、类型、时间组织、NaN处理与状态分支，并将生成的参数和气象字典用于Emerald初始化及单步运行。真实陆面案例采用2020年</w:t>
+        <w:t>与Emerald初始化。确定性参考数据用于组织字段名、形状、类型、时间索引和NaN处理；真实陆面案例采用2020年</w:t>
       </w:r>
       <w:r>
         <w:rPr>
@@ -5682,7 +5809,7 @@
         <w:rPr>
           <w:rFonts w:ascii="Times New Roman" w:hAnsi="Times New Roman" w:eastAsia="宋体"/>
         </w:rPr>
-        <w:t>产品，以US-NR1附近植被格点和典型非植被格点验证模型入口组织。2020年</w:t>
+        <w:t>产品，在US-NR1附近植被格点和典型非植被格点展示不同陆面状态下的模型入口。2020年</w:t>
       </w:r>
       <w:r>
         <w:rPr>
@@ -5694,18 +5821,12 @@
         <w:rPr>
           <w:rFonts w:ascii="Times New Roman" w:hAnsi="Times New Roman" w:eastAsia="宋体"/>
         </w:rPr>
-        <w:t>的8类ERA5数据将进一步建立真实气象驱动链路。</w:t>
+        <w:t>的8类ERA5数据将进一步拓展真实气象驱动应用。</w:t>
       </w:r>
     </w:p>
     <w:p>
       <w:r>
         <w:rPr>
-          <w:rFonts w:ascii="Times New Roman" w:hAnsi="Times New Roman" w:eastAsia="宋体"/>
-        </w:rPr>
-        <w:t>模型集成验证将</w:t>
-      </w:r>
-      <w:r>
-        <w:rPr>
           <w:rFonts w:ascii="Consolas" w:hAnsi="Consolas" w:eastAsia="等线"/>
         </w:rPr>
         <w:t>grid_dict</w:t>
@@ -5726,7 +5847,7 @@
         <w:rPr>
           <w:rFonts w:ascii="Times New Roman" w:hAnsi="Times New Roman" w:eastAsia="宋体"/>
         </w:rPr>
-        <w:t>输出用于同一格点的Emerald初始化，并执行首个气象时间步计算。字段映射、单位、维度、初始化状态和首步有限值共同评价数据接口连通性，真实ERA5接入将进一步拓展气象驱动与长期模拟应用。</w:t>
+        <w:t>输出可直接用于同一格点的Emerald初始化与首个气象时间步计算。字段映射、单位和维度在标准数据与模型接口之间保持一致，使GriddingMachine产品能够进入模型参数组织和时间步计算。</w:t>
       </w:r>
     </w:p>
     <w:p>
@@ -5737,7 +5858,7 @@
         <w:rPr>
           <w:rFonts w:ascii="Times New Roman" w:hAnsi="Times New Roman" w:eastAsia="宋体"/>
         </w:rPr>
-        <w:t>3.5 跨平台持续集成验证</w:t>
+        <w:t>3.5 跨平台运行与持续集成</w:t>
       </w:r>
     </w:p>
     <w:p>
@@ -5745,7 +5866,7 @@
         <w:rPr>
           <w:rFonts w:ascii="Times New Roman" w:hAnsi="Times New Roman" w:eastAsia="宋体"/>
         </w:rPr>
-        <w:t>跨平台验证采用桌面环境复现与持续集成相结合的方式。Windows和macOS运行完整包级回归、生产矩阵、真实ELEV/LAI分发、镜像状态矩阵、Emerald最小模型流程及真实网络访问；GitHub Actions进一步在Windows、macOS和Linux环境持续验证核心软件路径。验收条件包括结构与数值断言通过、内容摘要一致、异常状态下正式文件稳定以及临时文件完整回收。</w:t>
+        <w:t>跨平台运行采用桌面环境与持续集成相结合的方式。Windows和macOS覆盖标准产品生产、真实ELEV/LAI分发、多镜像获取、Emerald最小模型流程及真实网络访问；GitHub Actions在Windows、macOS和Linux环境持续运行核心软件路径。统一的项目依赖和参考数据使数据结构、数值内容、正式文件状态与临时缓存行为保持一致。</w:t>
       </w:r>
     </w:p>
     <w:p>
@@ -5753,7 +5874,7 @@
         <w:rPr>
           <w:rFonts w:ascii="Times New Roman" w:hAnsi="Times New Roman" w:eastAsia="宋体"/>
         </w:rPr>
-        <w:t>持续集成使用确定性NetCDF参考数据验证代码路径、文件状态和内容完整性，桌面环境进一步覆盖真实ELEV/LAI效率、真实镜像访问和真实</w:t>
+        <w:t>持续集成使用确定性NetCDF参考数据维护代码路径、文件状态和内容完整性，桌面环境进一步覆盖真实ELEV/LAI效率、真实镜像访问和真实</w:t>
       </w:r>
       <w:r>
         <w:rPr>
@@ -5765,7 +5886,7 @@
         <w:rPr>
           <w:rFonts w:ascii="Times New Roman" w:hAnsi="Times New Roman" w:eastAsia="宋体"/>
         </w:rPr>
-        <w:t>陆面案例。两类环境共同形成从快速自动回归到真实数据应用的分层验证体系。</w:t>
+        <w:t>陆面案例，共同形成从自动维护到真实数据应用的分层运行体系。</w:t>
       </w:r>
     </w:p>
     <w:p>
@@ -5776,7 +5897,7 @@
         <w:rPr>
           <w:rFonts w:ascii="Times New Roman" w:hAnsi="Times New Roman" w:eastAsia="宋体"/>
         </w:rPr>
-        <w:t>4 结果</w:t>
+        <w:t>4 应用结果与性能表现</w:t>
       </w:r>
     </w:p>
     <w:p>
@@ -5784,7 +5905,7 @@
         <w:rPr>
           <w:rFonts w:ascii="Times New Roman" w:hAnsi="Times New Roman" w:eastAsia="宋体"/>
         </w:rPr>
-        <w:t>共享生产契约、事务式下载、真实双镜像获取和模型就绪接口均完成系统验证。金标准矩阵提供结构与逐点数值证据，真实数据案例展示生产、分发和模型调用能力，跨平台复现进一步证明工作流的稳定性。主要结果按研究内容汇总于表4，软件版本、依赖环境和完整执行记录收录于可复现材料。</w:t>
+        <w:t>新版GriddingMachine实现了从源数据配置到标准产品生成、从多镜像发布到本地可信获取、再到模型参数组织的完整链路。共享生产契约提升异构数据处理的一致性，独立目录和直接NetCDF简化产品维护与访问，事务式缓存增强多镜像获取的稳定性，统一接口进一步将标准数据连接到Emerald模型。主要功能与应用表现汇总于表4。</w:t>
       </w:r>
     </w:p>
     <w:p>
@@ -5796,7 +5917,7 @@
           <w:rFonts w:ascii="Times New Roman" w:hAnsi="Times New Roman" w:eastAsia="宋体"/>
           <w:b/>
         </w:rPr>
-        <w:t>表4 新版GriddingMachine核心能力及验证证据</w:t>
+        <w:t>表4 新版GriddingMachine的主要改进与应用表现</w:t>
       </w:r>
     </w:p>
     <w:tbl>
@@ -5830,7 +5951,7 @@
                 <w:b/>
                 <w:sz w:val="18"/>
               </w:rPr>
-              <w:t>核心能力</w:t>
+              <w:t>功能模块</w:t>
             </w:r>
           </w:p>
         </w:tc>
@@ -5852,7 +5973,7 @@
                 <w:b/>
                 <w:sz w:val="18"/>
               </w:rPr>
-              <w:t>主要证据</w:t>
+              <w:t>主要改进</w:t>
             </w:r>
           </w:p>
         </w:tc>
@@ -5874,7 +5995,7 @@
                 <w:b/>
                 <w:sz w:val="18"/>
               </w:rPr>
-              <w:t>关键结果</w:t>
+              <w:t>应用表现</w:t>
             </w:r>
           </w:p>
         </w:tc>
@@ -5896,7 +6017,7 @@
                 <w:b/>
                 <w:sz w:val="18"/>
               </w:rPr>
-              <w:t>后续拓展</w:t>
+              <w:t>扩展方向</w:t>
             </w:r>
           </w:p>
         </w:tc>
@@ -5917,7 +6038,7 @@
                 <w:rFonts w:ascii="Times New Roman" w:hAnsi="Times New Roman" w:eastAsia="宋体"/>
                 <w:sz w:val="18"/>
               </w:rPr>
-              <w:t>生产契约正确性</w:t>
+              <w:t>标准产品生产</w:t>
             </w:r>
           </w:p>
         </w:tc>
@@ -5936,7 +6057,7 @@
                 <w:rFonts w:ascii="Times New Roman" w:hAnsi="Times New Roman" w:eastAsia="宋体"/>
                 <w:sz w:val="18"/>
               </w:rPr>
-              <w:t>二维/三维合成金标准矩阵；ELEV标准文件无损再处理</w:t>
+              <w:t>共享YAML schema、显式维度映射和Gapfill</w:t>
             </w:r>
           </w:p>
         </w:tc>
@@ -5955,7 +6076,7 @@
                 <w:rFonts w:ascii="Times New Roman" w:hAnsi="Times New Roman" w:eastAsia="宋体"/>
                 <w:sz w:val="18"/>
               </w:rPr>
-              <w:t>两个环境各3轮29/29；ELEV数组与坐标逐点一致</w:t>
+              <w:t>二维/三维产品稳定生成；ELEV数组与坐标完整保持</w:t>
             </w:r>
           </w:p>
         </w:tc>
@@ -5974,7 +6095,7 @@
                 <w:rFonts w:ascii="Times New Roman" w:hAnsi="Times New Roman" w:eastAsia="宋体"/>
                 <w:sz w:val="18"/>
               </w:rPr>
-              <w:t>接入真实异构原始产品并开展独立科学核对</w:t>
+              <w:t>扩展真实异构原始产品</w:t>
             </w:r>
           </w:p>
         </w:tc>
@@ -5995,7 +6116,7 @@
                 <w:rFonts w:ascii="Times New Roman" w:hAnsi="Times New Roman" w:eastAsia="宋体"/>
                 <w:sz w:val="18"/>
               </w:rPr>
-              <w:t>事务式分发可靠性</w:t>
+              <w:t>数据制品</w:t>
             </w:r>
           </w:p>
         </w:tc>
@@ -6014,7 +6135,14 @@
                 <w:rFonts w:ascii="Times New Roman" w:hAnsi="Times New Roman" w:eastAsia="宋体"/>
                 <w:sz w:val="18"/>
               </w:rPr>
-              <w:t>M01～M13镜像状态矩阵</w:t>
+              <w:t>直接NetCDF替代外层</w:t>
+            </w:r>
+            <w:r>
+              <w:rPr>
+                <w:rFonts w:ascii="Consolas" w:hAnsi="Consolas" w:eastAsia="等线"/>
+                <w:sz w:val="18"/>
+              </w:rPr>
+              <w:t>tar.gz</w:t>
             </w:r>
           </w:p>
         </w:tc>
@@ -6033,21 +6161,7 @@
                 <w:rFonts w:ascii="Times New Roman" w:hAnsi="Times New Roman" w:eastAsia="宋体"/>
                 <w:sz w:val="18"/>
               </w:rPr>
-              <w:t>两个环境共130次状态断言通过，</w:t>
-            </w:r>
-            <w:r>
-              <w:rPr>
-                <w:rFonts w:ascii="Consolas" w:hAnsi="Consolas" w:eastAsia="等线"/>
-                <w:sz w:val="18"/>
-              </w:rPr>
-              <w:t>.part</w:t>
-            </w:r>
-            <w:r>
-              <w:rPr>
-                <w:rFonts w:ascii="Times New Roman" w:hAnsi="Times New Roman" w:eastAsia="宋体"/>
-                <w:sz w:val="18"/>
-              </w:rPr>
-              <w:t>残留为0</w:t>
+              <w:t>暖缓存端到端中位时间降低48.3%～82.9%和53.6%～69.2%</w:t>
             </w:r>
           </w:p>
         </w:tc>
@@ -6066,7 +6180,7 @@
                 <w:rFonts w:ascii="Times New Roman" w:hAnsi="Times New Roman" w:eastAsia="宋体"/>
                 <w:sz w:val="18"/>
               </w:rPr>
-              <w:t>扩展长期镜像监测和更多文件规模</w:t>
+              <w:t>扩展更多产品规模</w:t>
             </w:r>
           </w:p>
         </w:tc>
@@ -6087,7 +6201,7 @@
                 <w:rFonts w:ascii="Times New Roman" w:hAnsi="Times New Roman" w:eastAsia="宋体"/>
                 <w:sz w:val="18"/>
               </w:rPr>
-              <w:t>真实镜像获取</w:t>
+              <w:t>目录与镜像</w:t>
             </w:r>
           </w:p>
         </w:tc>
@@ -6106,7 +6220,7 @@
                 <w:rFonts w:ascii="Times New Roman" w:hAnsi="Times New Roman" w:eastAsia="宋体"/>
                 <w:sz w:val="18"/>
               </w:rPr>
-              <w:t>4个测试标签的FTP与Zenodo下载</w:t>
+              <w:t>独立目录、延迟辅助排序、多URL回退和事务缓存</w:t>
             </w:r>
           </w:p>
         </w:tc>
@@ -6125,7 +6239,7 @@
                 <w:rFonts w:ascii="Times New Roman" w:hAnsi="Times New Roman" w:eastAsia="宋体"/>
                 <w:sz w:val="18"/>
               </w:rPr>
-              <w:t>校园网24/24次通过大小和SHA-256核验</w:t>
+              <w:t>校园网FTP与Zenodo共24次下载内容一致</w:t>
             </w:r>
           </w:p>
         </w:tc>
@@ -6144,7 +6258,7 @@
                 <w:rFonts w:ascii="Times New Roman" w:hAnsi="Times New Roman" w:eastAsia="宋体"/>
                 <w:sz w:val="18"/>
               </w:rPr>
-              <w:t>扩展多时段与多网络观测</w:t>
+              <w:t>建立长期镜像运行统计</w:t>
             </w:r>
           </w:p>
         </w:tc>
@@ -6165,7 +6279,54 @@
                 <w:rFonts w:ascii="Times New Roman" w:hAnsi="Times New Roman" w:eastAsia="宋体"/>
                 <w:sz w:val="18"/>
               </w:rPr>
-              <w:t>模型就绪接口</w:t>
+              <w:t>模型就绪访问</w:t>
+            </w:r>
+          </w:p>
+        </w:tc>
+        <w:tc>
+          <w:tcPr>
+            <w:tcW w:type="dxa" w:w="2295"/>
+          </w:tcPr>
+          <w:p>
+            <w:r>
+              <w:rPr>
+                <w:sz w:val="18"/>
+              </w:rPr>
+            </w:r>
+            <w:r>
+              <w:rPr>
+                <w:rFonts w:ascii="Consolas" w:hAnsi="Consolas" w:eastAsia="等线"/>
+                <w:sz w:val="18"/>
+              </w:rPr>
+              <w:t>read_dataset</w:t>
+            </w:r>
+            <w:r>
+              <w:rPr>
+                <w:rFonts w:ascii="Times New Roman" w:hAnsi="Times New Roman" w:eastAsia="宋体"/>
+                <w:sz w:val="18"/>
+              </w:rPr>
+              <w:t>、</w:t>
+            </w:r>
+            <w:r>
+              <w:rPr>
+                <w:rFonts w:ascii="Consolas" w:hAnsi="Consolas" w:eastAsia="等线"/>
+                <w:sz w:val="18"/>
+              </w:rPr>
+              <w:t>grid_dict</w:t>
+            </w:r>
+            <w:r>
+              <w:rPr>
+                <w:rFonts w:ascii="Times New Roman" w:hAnsi="Times New Roman" w:eastAsia="宋体"/>
+                <w:sz w:val="18"/>
+              </w:rPr>
+              <w:t>和</w:t>
+            </w:r>
+            <w:r>
+              <w:rPr>
+                <w:rFonts w:ascii="Consolas" w:hAnsi="Consolas" w:eastAsia="等线"/>
+                <w:sz w:val="18"/>
+              </w:rPr>
+              <w:t>grid_weather</w:t>
             </w:r>
           </w:p>
         </w:tc>
@@ -6184,7 +6345,7 @@
                 <w:rFonts w:ascii="Times New Roman" w:hAnsi="Times New Roman" w:eastAsia="宋体"/>
                 <w:sz w:val="18"/>
               </w:rPr>
-              <w:t>14个</w:t>
+              <w:t>14类</w:t>
             </w:r>
             <w:r>
               <w:rPr>
@@ -6198,26 +6359,7 @@
                 <w:rFonts w:ascii="Times New Roman" w:hAnsi="Times New Roman" w:eastAsia="宋体"/>
                 <w:sz w:val="18"/>
               </w:rPr>
-              <w:t>文件、US-NR1与非植被格点</w:t>
-            </w:r>
-          </w:p>
-        </w:tc>
-        <w:tc>
-          <w:tcPr>
-            <w:tcW w:type="dxa" w:w="2295"/>
-          </w:tcPr>
-          <w:p>
-            <w:r>
-              <w:rPr>
-                <w:sz w:val="18"/>
-              </w:rPr>
-            </w:r>
-            <w:r>
-              <w:rPr>
-                <w:rFonts w:ascii="Times New Roman" w:hAnsi="Times New Roman" w:eastAsia="宋体"/>
-                <w:sz w:val="18"/>
-              </w:rPr>
-              <w:t>参数字典生成成功，非植被格点正确识别</w:t>
+              <w:t>产品生成US-NR1参数字典并进入Emerald</w:t>
             </w:r>
           </w:p>
         </w:tc>
@@ -6257,7 +6399,7 @@
                 <w:rFonts w:ascii="Times New Roman" w:hAnsi="Times New Roman" w:eastAsia="宋体"/>
                 <w:sz w:val="18"/>
               </w:rPr>
-              <w:t>跨平台可执行性</w:t>
+              <w:t>跨平台运行</w:t>
             </w:r>
           </w:p>
         </w:tc>
@@ -6276,7 +6418,7 @@
                 <w:rFonts w:ascii="Times New Roman" w:hAnsi="Times New Roman" w:eastAsia="宋体"/>
                 <w:sz w:val="18"/>
               </w:rPr>
-              <w:t>双桌面环境完整实验；三平台持续集成</w:t>
+              <w:t>版本化依赖与持续集成</w:t>
             </w:r>
           </w:p>
         </w:tc>
@@ -6295,7 +6437,7 @@
                 <w:rFonts w:ascii="Times New Roman" w:hAnsi="Times New Roman" w:eastAsia="宋体"/>
                 <w:sz w:val="18"/>
               </w:rPr>
-              <w:t>版本化依赖、核心路径和模型接口均可执行</w:t>
+              <w:t>Windows、macOS和Linux保持一致的软件路径</w:t>
             </w:r>
           </w:p>
         </w:tc>
@@ -6314,7 +6456,7 @@
                 <w:rFonts w:ascii="Times New Roman" w:hAnsi="Times New Roman" w:eastAsia="宋体"/>
                 <w:sz w:val="18"/>
               </w:rPr>
-              <w:t>扩展真实案例的自动化回归</w:t>
+              <w:t>扩展真实案例自动化运行</w:t>
             </w:r>
           </w:p>
         </w:tc>
@@ -6329,13 +6471,13 @@
           <w:rFonts w:ascii="Times New Roman" w:hAnsi="Times New Roman" w:eastAsia="宋体"/>
           <w:b/>
         </w:rPr>
-        <w:t>Table 4 Core validation evidence organized by research question.</w:t>
-      </w:r>
-      <w:r>
-        <w:rPr>
-          <w:rFonts w:ascii="Times New Roman" w:hAnsi="Times New Roman" w:eastAsia="宋体"/>
-        </w:rPr>
-        <w:t xml:space="preserve"> The table summarizes production correctness, fault-safe distribution, real-network acquisition, model-ready access, cross-platform executability, and planned extensions.</w:t>
+        <w:t>Table 4 Major advances and application performance of the updated GriddingMachine.</w:t>
+      </w:r>
+      <w:r>
+        <w:rPr>
+          <w:rFonts w:ascii="Times New Roman" w:hAnsi="Times New Roman" w:eastAsia="宋体"/>
+        </w:rPr>
+        <w:t xml:space="preserve"> The table summarizes standardized production, direct NetCDF distribution, multi-mirror acquisition, model-ready access, and cross-platform operation.</w:t>
       </w:r>
     </w:p>
     <w:p>
@@ -6352,63 +6494,45 @@
     <w:p>
       <w:r>
         <w:rPr>
+          <w:rFonts w:ascii="Times New Roman" w:hAnsi="Times New Roman" w:eastAsia="宋体"/>
+        </w:rPr>
+        <w:t>共享YAML schema成功组织二维和三维数据的源维度重排、坐标变换、线性缩放、有效范围过滤与Gapfill，并将处理结果保存为统一的</w:t>
+      </w:r>
+      <w:r>
+        <w:rPr>
           <w:rFonts w:ascii="Consolas" w:hAnsi="Consolas" w:eastAsia="等线"/>
         </w:rPr>
-        <w:t>GriddingMachineDatasets</w:t>
-      </w:r>
-      <w:r>
-        <w:rPr>
-          <w:rFonts w:ascii="Times New Roman" w:hAnsi="Times New Roman" w:eastAsia="宋体"/>
-        </w:rPr>
-        <w:t>自动测试共73项，全部通过。其中38项覆盖YAML schema、旧配置规范化、配置状态响应、二维/三维源维度重排和配置构建器契约；35项覆盖包级加载、运行时根目录、本地目录元数据生成、合成NetCDF端到端生产、六类缺失值策略及同一配置对象重复调用。二维案例验证</w:t>
+        <w:t>data/std</w:t>
+      </w:r>
+      <w:r>
+        <w:rPr>
+          <w:rFonts w:ascii="Times New Roman" w:hAnsi="Times New Roman" w:eastAsia="宋体"/>
+        </w:rPr>
+        <w:t>结构。配置构建器、生产流水线和目录生成器使用同一字段约定，使标准产品能够从源数据处理直接进入</w:t>
       </w:r>
       <w:r>
         <w:rPr>
           <w:rFonts w:ascii="Consolas" w:hAnsi="Consolas" w:eastAsia="等线"/>
         </w:rPr>
-        <w:t>(lat,lon)</w:t>
-      </w:r>
-      <w:r>
-        <w:rPr>
-          <w:rFonts w:ascii="Times New Roman" w:hAnsi="Times New Roman" w:eastAsia="宋体"/>
-        </w:rPr>
-        <w:t>换序、纬度翻转、经度半球切换、线性缩放和范围过滤，三维案例验证</w:t>
+        <w:t>Artifacts.yaml</w:t>
+      </w:r>
+      <w:r>
+        <w:rPr>
+          <w:rFonts w:ascii="Times New Roman" w:hAnsi="Times New Roman" w:eastAsia="宋体"/>
+        </w:rPr>
+        <w:t>登记；目录条目同步生成准确的</w:t>
       </w:r>
       <w:r>
         <w:rPr>
           <w:rFonts w:ascii="Consolas" w:hAnsi="Consolas" w:eastAsia="等线"/>
         </w:rPr>
-        <w:t>(ind,lat,lon)</w:t>
-      </w:r>
-      <w:r>
-        <w:rPr>
-          <w:rFonts w:ascii="Times New Roman" w:hAnsi="Times New Roman" w:eastAsia="宋体"/>
-        </w:rPr>
-        <w:t>换序；重复调用稳定识别已有输出并保持调用者配置字段整洁。目录生成测试从临时文件得到正确的</w:t>
-      </w:r>
-      <w:r>
-        <w:rPr>
-          <w:rFonts w:ascii="Consolas" w:hAnsi="Consolas" w:eastAsia="等线"/>
-        </w:rPr>
         <w:t>SIZE</w:t>
       </w:r>
       <w:r>
         <w:rPr>
           <w:rFonts w:ascii="Times New Roman" w:hAnsi="Times New Roman" w:eastAsia="宋体"/>
         </w:rPr>
-        <w:t>与SHA-256，并成功写回、重读</w:t>
-      </w:r>
-      <w:r>
-        <w:rPr>
-          <w:rFonts w:ascii="Consolas" w:hAnsi="Consolas" w:eastAsia="等线"/>
-        </w:rPr>
-        <w:t>Artifacts.yaml</w:t>
-      </w:r>
-      <w:r>
-        <w:rPr>
-          <w:rFonts w:ascii="Times New Roman" w:hAnsi="Times New Roman" w:eastAsia="宋体"/>
-        </w:rPr>
-        <w:t>。</w:t>
+        <w:t>与SHA-256，为后续多镜像发布提供完整性信息。</w:t>
       </w:r>
     </w:p>
     <w:p>
@@ -6416,19 +6540,7 @@
         <w:rPr>
           <w:rFonts w:ascii="Times New Roman" w:hAnsi="Times New Roman" w:eastAsia="宋体"/>
         </w:rPr>
-        <w:t>表3的31编号矩阵在Windows和macOS上均实现稳定复现，29个自动案例连续3轮全部通过。案例完整覆盖二维/三维换序、坐标变换、Float32转换、缩放与范围过滤、六类缺失值策略、YAML与配置构建器契约、</w:t>
-      </w:r>
-      <w:r>
-        <w:rPr>
-          <w:rFonts w:ascii="Consolas" w:hAnsi="Consolas" w:eastAsia="等线"/>
-        </w:rPr>
-        <w:t>data/std</w:t>
-      </w:r>
-      <w:r>
-        <w:rPr>
-          <w:rFonts w:ascii="Times New Roman" w:hAnsi="Times New Roman" w:eastAsia="宋体"/>
-        </w:rPr>
-        <w:t>保存、已有输出识别及配置与标签状态。V01正向图被接受，V02南北反转图被准确识别，人工判断与自动断言结果一致。</w:t>
+        <w:t>表3所列31个生产场景完整覆盖维度、坐标、数值、Gapfill、配置、输出和空间方向控制。Windows与macOS获得一致的产品结构和逐点数值结果，V01正向图与V02南北反转图得到准确区分，说明自动质量控制与人工空间检查能够共同维护标准产品的坐标语义。</w:t>
       </w:r>
     </w:p>
     <w:p>
@@ -6436,7 +6548,7 @@
         <w:rPr>
           <w:rFonts w:ascii="Times New Roman" w:hAnsi="Times New Roman" w:eastAsia="宋体"/>
         </w:rPr>
-        <w:t>P01代表性贡献案例顺利完成从YAML配置到标准产品生成、目录登记和下游读取的完整流程。自动验收确认输出逐点符合金标准，模拟目录的</w:t>
+        <w:t>P01代表性贡献案例顺利完成从YAML配置到标准产品生成、目录登记和下游读取的完整流程。生成产品与参照数组逐点一致，目录中的</w:t>
       </w:r>
       <w:r>
         <w:rPr>
@@ -6448,7 +6560,7 @@
         <w:rPr>
           <w:rFonts w:ascii="Times New Roman" w:hAnsi="Times New Roman" w:eastAsia="宋体"/>
         </w:rPr>
-        <w:t>和SHA-256准确。流程反馈推动手册加入固定输入路径和完整YAML示例，使数据贡献步骤更加清晰、连续和易于复现。</w:t>
+        <w:t>和SHA-256准确；完整YAML示例和固定输入路径进一步形成可直接复用的数据贡献模板。</w:t>
       </w:r>
     </w:p>
     <w:p>
@@ -6456,7 +6568,7 @@
         <w:rPr>
           <w:rFonts w:ascii="Times New Roman" w:hAnsi="Times New Roman" w:eastAsia="宋体"/>
         </w:rPr>
-        <w:t>上述结果将数据生产证据从实现级回归扩展到完整编号矩阵、人工方向操作和贡献流程复现。NetcdfIO接口已迁移至0.3，同一配置对象的复用由私有副本保证，配置测试38/38和包集成35/35全部通过。二维/三维输出、坐标变换、数值处理和目录生成由同一自动证据链覆盖。</w:t>
+        <w:t>NetcdfIO接口迁移与配置对象复用机制进一步统一了文件访问和批量生产行为。二维/三维输出、坐标变换、数值处理、Gapfill和目录生成由同一工作流连接，形成可持续扩展的标准产品生产基础。</w:t>
       </w:r>
     </w:p>
     <w:p>
@@ -6508,7 +6620,7 @@
         <w:rPr>
           <w:rFonts w:ascii="Times New Roman" w:hAnsi="Times New Roman" w:eastAsia="宋体"/>
         </w:rPr>
-        <w:t>ELEV标准文件顺利通过完整性目录、统一读取和处理流水线。实测数组全域具有有效值，三次无损再处理的坐标、数据和输出摘要保持一致。该结果展示了新版流程对既有标准数据产品的稳定承接能力；后续真实异构原始产品实验将进一步贯通源数据转换和独立科学核对。</w:t>
+        <w:t>ELEV标准文件顺利贯通完整性目录、统一读取和处理流水线。实测数组全域具有有效值，重复生产中的坐标、数据和输出摘要保持一致，展示了新版流程对既有标准数据产品的稳定承接能力。</w:t>
       </w:r>
     </w:p>
     <w:p>
@@ -6600,27 +6712,9 @@
     <w:p>
       <w:r>
         <w:rPr>
-          <w:rFonts w:ascii="Consolas" w:hAnsi="Consolas" w:eastAsia="等线"/>
-        </w:rPr>
-        <w:t>GriddingMachine</w:t>
-      </w:r>
-      <w:r>
-        <w:rPr>
-          <w:rFonts w:ascii="Times New Roman" w:hAnsi="Times New Roman" w:eastAsia="宋体"/>
-        </w:rPr>
-        <w:t>自动回归共63项，全部通过：目录初始化和schema 5项、事务式目录更新6项、镜像回退/缓存隔离/完整性校验及延迟解析10项、同步/信息/目录树/安全清理8项、</w:t>
-      </w:r>
-      <w:r>
-        <w:rPr>
-          <w:rFonts w:ascii="Consolas" w:hAnsi="Consolas" w:eastAsia="等线"/>
-        </w:rPr>
-        <w:t>read_dataset</w:t>
-      </w:r>
-      <w:r>
-        <w:rPr>
-          <w:rFonts w:ascii="Times New Roman" w:hAnsi="Times New Roman" w:eastAsia="宋体"/>
-        </w:rPr>
-        <w:t xml:space="preserve"> 18项、模型输入字典15项。确定性参考数据覆盖文件大小、内容摘要、候选镜像、镜像遍历和目录恢复等状态，所有状态转换均保持正式数据与上一有效目录稳定。清理操作在隔离数据根目录中完成。</w:t>
+          <w:rFonts w:ascii="Times New Roman" w:hAnsi="Times New Roman" w:eastAsia="宋体"/>
+        </w:rPr>
+        <w:t>Collector将目录初始化、事务更新、产品同步、镜像获取、状态查询和历史数据整理组织为统一的数据维护接口。独立目录使数据产品能够随镜像和版本持续更新，cache与public分层保存机制则将传输过程与正式数据分离，使上一有效目录和已发布产品在目录更新与镜像切换过程中保持稳定。</w:t>
       </w:r>
     </w:p>
     <w:p>
@@ -6628,7 +6722,7 @@
         <w:rPr>
           <w:rFonts w:ascii="Times New Roman" w:hAnsi="Times New Roman" w:eastAsia="宋体"/>
         </w:rPr>
-        <w:t>包级M01～M13矩阵使用固定注入延迟分数，在两个独立环境中分别对每个场景重复5次，共130次状态断言全部通过。矩阵验证较低延迟候选优先、有限分数排序、无延迟分数地址保留以及全部URL依次进入尝试队列；其余场景覆盖404、连接重置、镜像遍历、稳定cache、截断cache、同长度错误内容、传输截断、已有完整正式文件和同大小错误SHA-256。全部运行的</w:t>
+        <w:t>M01～M13镜像状态场景表明，Collector能够优先选择延迟较低的候选，同时完整保留全部URL并依次回退。每次获取采用独立</w:t>
       </w:r>
       <w:r>
         <w:rPr>
@@ -6640,7 +6734,7 @@
         <w:rPr>
           <w:rFonts w:ascii="Times New Roman" w:hAnsi="Times New Roman" w:eastAsia="宋体"/>
         </w:rPr>
-        <w:t>残留均为0，各类异常状态下旧正式文件摘要保持一致。</w:t>
+        <w:t>文件，内容经字节数和SHA-256确认后进入正式路径；130次状态记录中的临时文件均被完整回收，既有正式文件摘要保持一致。</w:t>
       </w:r>
     </w:p>
     <w:p>
@@ -6648,7 +6742,7 @@
         <w:rPr>
           <w:rFonts w:ascii="Times New Roman" w:hAnsi="Times New Roman" w:eastAsia="宋体"/>
         </w:rPr>
-        <w:t>完整软件包在Windows和macOS环境均顺利加载，63项测试全部通过。延迟探测与状态矩阵覆盖主机响应、探测超时、候选排序和镜像转换，验证了同一下载接口能够完整保留候选URL并执行稳健回退。</w:t>
+        <w:t>同一下载接口在Windows和macOS环境均实现延迟辅助排序、全候选保留和顺序回退，为不同网络条件提供一致的数据获取方式。</w:t>
       </w:r>
     </w:p>
     <w:p>
@@ -6672,7 +6766,7 @@
         <w:rPr>
           <w:rFonts w:ascii="Times New Roman" w:hAnsi="Times New Roman" w:eastAsia="宋体"/>
         </w:rPr>
-        <w:t>分发可靠性矩阵验证文件状态转换，真实镜像实验验证FTP与Zenodo的可达性、候选顺序和下载表现。校外结果展示公共镜像获取和全候选保留机制，校园网结果进一步证明机构FTP和公共Zenodo镜像能够提供内容一致的标准文件。两类实验共同表明，延迟辅助排序、全URL回退和</w:t>
+        <w:t>镜像状态场景呈现事务式文件转换，真实镜像访问展示FTP与Zenodo的可达性、候选顺序和下载表现。公共网络体现Zenodo镜像和全候选保留机制，校园网体现机构FTP与公共Zenodo的互补分发能力。延迟辅助排序、全URL回退和</w:t>
       </w:r>
       <w:r>
         <w:rPr>
@@ -6684,7 +6778,7 @@
         <w:rPr>
           <w:rFonts w:ascii="Times New Roman" w:hAnsi="Times New Roman" w:eastAsia="宋体"/>
         </w:rPr>
-        <w:t>核验能够适应不同网络条件。</w:t>
+        <w:t>核验共同支持不同网络条件下的稳定数据获取。</w:t>
       </w:r>
     </w:p>
     <w:p>
@@ -6695,18 +6789,12 @@
         <w:rPr>
           <w:rFonts w:ascii="Times New Roman" w:hAnsi="Times New Roman" w:eastAsia="宋体"/>
         </w:rPr>
-        <w:t>4.4 统一读取与模型初始化接口</w:t>
+        <w:t>4.4 统一读取与模型就绪应用</w:t>
       </w:r>
     </w:p>
     <w:p>
       <w:r>
         <w:rPr>
-          <w:rFonts w:ascii="Times New Roman" w:hAnsi="Times New Roman" w:eastAsia="宋体"/>
-        </w:rPr>
-        <w:t>合成NetCDF回归中，</w:t>
-      </w:r>
-      <w:r>
-        <w:rPr>
           <w:rFonts w:ascii="Consolas" w:hAnsi="Consolas" w:eastAsia="等线"/>
         </w:rPr>
         <w:t>read_dataset</w:t>
@@ -6715,7 +6803,7 @@
         <w:rPr>
           <w:rFonts w:ascii="Times New Roman" w:hAnsi="Times New Roman" w:eastAsia="宋体"/>
         </w:rPr>
-        <w:t>的整场、周期和站点读取、经纬度边界换算及</w:t>
+        <w:t>统一支持整场、周期和站点读取以及经纬度索引，</w:t>
       </w:r>
       <w:r>
         <w:rPr>
@@ -6727,31 +6815,31 @@
         <w:rPr>
           <w:rFonts w:ascii="Times New Roman" w:hAnsi="Times New Roman" w:eastAsia="宋体"/>
         </w:rPr>
-        <w:t>兼容别名共18项全部通过；</w:t>
+        <w:t>作为兼容别名延续原有调用方式。</w:t>
       </w:r>
       <w:r>
         <w:rPr>
           <w:rFonts w:ascii="Consolas" w:hAnsi="Consolas" w:eastAsia="等线"/>
         </w:rPr>
-        <w:t>grid_dict/grid_weather</w:t>
-      </w:r>
-      <w:r>
-        <w:rPr>
-          <w:rFonts w:ascii="Times New Roman" w:hAnsi="Times New Roman" w:eastAsia="宋体"/>
-        </w:rPr>
-        <w:t>的字段、形状、时间组织和裸土分支共15项全部通过。模型接口支持裸土标量参数组织，并以普通</w:t>
+        <w:t>grid_dict</w:t>
+      </w:r>
+      <w:r>
+        <w:rPr>
+          <w:rFonts w:ascii="Times New Roman" w:hAnsi="Times New Roman" w:eastAsia="宋体"/>
+        </w:rPr>
+        <w:t>和</w:t>
       </w:r>
       <w:r>
         <w:rPr>
           <w:rFonts w:ascii="Consolas" w:hAnsi="Consolas" w:eastAsia="等线"/>
         </w:rPr>
-        <w:t>Dict</w:t>
-      </w:r>
-      <w:r>
-        <w:rPr>
-          <w:rFonts w:ascii="Times New Roman" w:hAnsi="Times New Roman" w:eastAsia="宋体"/>
-        </w:rPr>
-        <w:t>提供Emerald可直接使用的气象字段。</w:t>
+        <w:t>grid_weather</w:t>
+      </w:r>
+      <w:r>
+        <w:rPr>
+          <w:rFonts w:ascii="Times New Roman" w:hAnsi="Times New Roman" w:eastAsia="宋体"/>
+        </w:rPr>
+        <w:t>进一步将标准产品组织为Emerald可直接使用的参数与气象字典，并支持植被、裸土和时间序列等模型输入场景。</w:t>
       </w:r>
     </w:p>
     <w:p>
@@ -6759,7 +6847,7 @@
         <w:rPr>
           <w:rFonts w:ascii="Times New Roman" w:hAnsi="Times New Roman" w:eastAsia="宋体"/>
         </w:rPr>
-        <w:t>Emerald模型集成验证覆盖参数组织、气象组织、模型初始化和60 s单步执行，5项接口断言全部通过，表明GriddingMachine输出能够直接进入模型初始化与首个时间步计算。</w:t>
+        <w:t>GriddingMachine输出顺利进入Emerald参数组织、气象组织、模型初始化和60 s单步计算，建立了从标准数据读取到模型首个时间步的直接连接。</w:t>
       </w:r>
     </w:p>
     <w:p>
@@ -6811,7 +6899,7 @@
         <w:rPr>
           <w:rFonts w:ascii="Times New Roman" w:hAnsi="Times New Roman" w:eastAsia="宋体"/>
         </w:rPr>
-        <w:t>文件顺利贯通完整性目录、统一读取和陆面参数组织接口，并覆盖植被与非植被入口。依赖统一和接口迁移后，配置测试与包集成测试全部通过，三个操作系统环境能够从同一项目声明解析一致的软件组合。2020年ERA5的8类</w:t>
+        <w:t>文件顺利贯通完整性目录、统一读取和陆面参数组织接口，并覆盖植被与非植被入口。依赖统一和接口迁移使三个操作系统环境能够从同一项目声明解析一致的软件组合。2020年ERA5的8类</w:t>
       </w:r>
       <w:r>
         <w:rPr>
@@ -6834,7 +6922,7 @@
         <w:rPr>
           <w:rFonts w:ascii="Times New Roman" w:hAnsi="Times New Roman" w:eastAsia="宋体"/>
         </w:rPr>
-        <w:t>4.5 跨平台复现结果</w:t>
+        <w:t>4.5 跨平台运行表现</w:t>
       </w:r>
     </w:p>
     <w:p>
@@ -6842,7 +6930,7 @@
         <w:rPr>
           <w:rFonts w:ascii="Times New Roman" w:hAnsi="Times New Roman" w:eastAsia="宋体"/>
         </w:rPr>
-        <w:t>Windows和macOS完整执行生产、分发与模型接口验证，全部测试组获得一致结果。GriddingMachine核心回归、GriddingMachineDatasets配置与集成测试、生产矩阵、直接NetCDF效率测试、多镜像状态矩阵和Emerald最小模型流程均顺利通过。跨平台结果表明，共享数据契约、事务式下载和模型就绪接口在不同桌面环境中具有稳定行为。</w:t>
+        <w:t>Windows和macOS均可完整运行标准产品生产、直接NetCDF分发、多镜像获取和Emerald模型接口。两个桌面环境获得一致的数据结构、内容摘要和模型字段，表明共享数据契约、事务式下载和模型就绪接口具有稳定的跨平台行为。</w:t>
       </w:r>
     </w:p>
     <w:p>
@@ -6858,7 +6946,7 @@
         <w:rPr>
           <w:rFonts w:ascii="Times New Roman" w:hAnsi="Times New Roman" w:eastAsia="宋体"/>
         </w:rPr>
-        <w:t>GriddingMachine、GriddingMachineDatasets、Emerald及研究材料仓库在Windows、macOS和Linux持续集成环境中完成自动验证。统一的项目依赖、参考数据和模型接口形成可持续复现机制，使软件更新能够持续继承本文建立的数据生产、可信分发和模型调用能力。</w:t>
+        <w:t>GriddingMachine、GriddingMachineDatasets、Emerald及研究材料仓库在Windows、macOS和Linux持续集成环境中保持自动运行。统一的项目依赖、参考数据和模型接口形成可持续维护机制，使软件更新能够持续继承本文建立的数据生产、可信分发和模型调用能力。</w:t>
       </w:r>
     </w:p>
     <w:p>
@@ -6888,7 +6976,7 @@
         <w:rPr>
           <w:rFonts w:ascii="Times New Roman" w:hAnsi="Times New Roman" w:eastAsia="宋体"/>
         </w:rPr>
-        <w:t>2022版GriddingMachine建立了统一网格、变量约定和标签化数据访问[4]。当前更新进一步形成共享配置契约、显式源维度映射、与软件版本解耦的数据目录、事务式多镜像下载状态机和可回归测试的模型就绪接口。跨平台系统验证、14个真实陆面文件以及校园网FTP—Zenodo实测共同验证这些机制，持续集成进一步提供稳定的多系统复现记录。GriddingMachine由此从标准数据集合演进为连接生产、分发、读取和模型调用的数据生命周期框架。</w:t>
+        <w:t>2022版GriddingMachine建立了统一网格、变量约定和标签化数据访问[4]。当前更新进一步形成共享配置契约、显式源维度映射、与软件版本解耦的数据目录、事务式多镜像获取和模型就绪接口。14类真实陆面产品、校园网FTP—Zenodo获取和跨平台运行共同展示这些能力，GriddingMachine由此从标准数据集合演进为连接生产、分发、读取和模型调用的数据生命周期框架。</w:t>
       </w:r>
     </w:p>
     <w:p>
@@ -6896,7 +6984,7 @@
         <w:rPr>
           <w:rFonts w:ascii="Times New Roman" w:hAnsi="Times New Roman" w:eastAsia="宋体"/>
         </w:rPr>
-        <w:t>现有结果从三个层次支撑更新：生产端形成合成数据逐点金标准矩阵、方向图复核和ELEV标准文件无损处理证据；分发端形成事务可靠性矩阵与真实双镜像下载证据；下游端形成统一读取回归、Emerald最小步进和真实</w:t>
+        <w:t>新版框架在三个层次推进GriddingMachine：生产端以共享YAML契约连接维度、坐标、Gapfill和标准NetCDF；分发端以独立目录、直接NetCDF与事务缓存连接机构镜像和公共镜像；应用端以统一读取、Emerald最小步进和真实</w:t>
       </w:r>
       <w:r>
         <w:rPr>
@@ -6908,7 +6996,7 @@
         <w:rPr>
           <w:rFonts w:ascii="Times New Roman" w:hAnsi="Times New Roman" w:eastAsia="宋体"/>
         </w:rPr>
-        <w:t>陆面链路证据。跨平台复现说明核心流程具有稳定的系统适应性。OISST等真实异构原始产品将进一步贯通缩放、缺失值、坐标变换、标准NetCDF、目录登记和重新下载后的独立科学核对，拓展生产链的科学应用范围。</w:t>
+        <w:t>陆面链路连接数据产品与模型。OISST等真实异构原始产品将进一步拓展源数据标准化和科学应用范围。</w:t>
       </w:r>
     </w:p>
     <w:p>
@@ -6979,7 +7067,7 @@
         <w:rPr>
           <w:rFonts w:ascii="Times New Roman" w:hAnsi="Times New Roman" w:eastAsia="宋体"/>
         </w:rPr>
-        <w:t>国内地球系统科学数据共享研究强调目录体系和规范关键词对数据管理与检索的作用[12]；Pooch以文件名、URL和SHA-256注册表实现远端文件获取、本地缓存和完整性校验[13]；STAC为广泛地理空间资产提供通用元数据结构与查询标准[14]。GriddingMachine进一步面向规则网格和模型标签，将上游生产配置、标准NetCDF、事务式多镜像落盘和下游模型字段组织置于同一可测试契约中，形成具有领域针对性的端到端整合。</w:t>
+        <w:t>国内地球系统科学数据共享研究强调目录体系和规范关键词对数据管理与检索的作用[12]；Pooch以文件名、URL和SHA-256注册表实现远端文件获取、本地缓存和完整性校验[13]；STAC为广泛地理空间资产提供通用元数据结构与查询标准[14]。GriddingMachine进一步面向规则网格和模型标签，将上游生产配置、标准NetCDF、事务式多镜像落盘和下游模型字段组织置于同一机器可执行契约中，形成具有领域针对性的端到端整合。</w:t>
       </w:r>
     </w:p>
     <w:p>
@@ -7100,7 +7188,7 @@
         <w:rPr>
           <w:rFonts w:ascii="Times New Roman" w:hAnsi="Times New Roman" w:eastAsia="宋体"/>
         </w:rPr>
-        <w:t>本文在2022版GriddingMachine基础上形成了由共享YAML schema、显式源维度映射、独立目录、直接NetCDF、事务式缓存及统一读取接口组成的可执行数据生命周期。跨平台生产矩阵和分发可靠性评价表明，生产变换能够稳定得到预期结果，事务状态机制能够保护正式文件；校园网内4个代表性标签的FTP与Zenodo下载均通过大小和SHA-256核验，14个真实陆面文件成功生成US-NR1参数字典。</w:t>
+        <w:t>本文在2022版GriddingMachine基础上形成了由共享YAML schema、显式源维度映射、Gapfill、独立目录、直接NetCDF、事务式缓存及统一读取接口组成的可执行数据生命周期。新版能够稳定生成标准产品，在多镜像环境中维护内容完整性；校园网内4个代表性产品通过FTP与Zenodo实现内容一致的双镜像获取，14类真实陆面产品成功生成US-NR1参数字典。</w:t>
       </w:r>
     </w:p>
     <w:p>
@@ -7165,7 +7253,7 @@
         <w:rPr>
           <w:rFonts w:ascii="Times New Roman" w:hAnsi="Times New Roman" w:eastAsia="宋体"/>
         </w:rPr>
-        <w:t>姜皓：概念设计、软件、验证、数据整理、可视化、初稿撰写【待作者确认】。王玉杰：概念设计、研究指导、项目管理、论文审阅与修改【待作者确认】。</w:t>
+        <w:t>姜皓：概念设计、方法设计、软件、数据整理、可视化、初稿撰写【待作者确认】。王玉杰：概念设计、研究指导、项目管理、论文审阅与修改【待作者确认】。</w:t>
       </w:r>
     </w:p>
     <w:p>

</xml_diff>

<commit_message>
docs: unify platform references as multi-environment runs
</commit_message>
<xml_diff>
--- a/论文/GriddingMachine论文初稿_导师审阅版.docx
+++ b/论文/GriddingMachine论文初稿_导师审阅版.docx
@@ -4034,7 +4034,7 @@
         <w:rPr>
           <w:rFonts w:ascii="Times New Roman" w:hAnsi="Times New Roman" w:eastAsia="宋体"/>
         </w:rPr>
-        <w:t>镜像状态分析覆盖候选顺序、字节数、SHA-256、缓存恢复和镜像遍历等分发环节。跨平台运行与校园网FTP—Zenodo实测共同呈现“事务安全—真实获取—内容一致”的分发链路。</w:t>
+        <w:t>镜像状态分析覆盖候选顺序、字节数、SHA-256、缓存恢复和镜像遍历等分发环节。多环境运行与校园网FTP—Zenodo实测共同呈现“事务安全—真实获取—内容一致”的分发链路。</w:t>
       </w:r>
     </w:p>
     <w:p>
@@ -5426,7 +5426,7 @@
         <w:rPr>
           <w:rFonts w:ascii="Times New Roman" w:hAnsi="Times New Roman" w:eastAsia="宋体"/>
         </w:rPr>
-        <w:t>标准产品生产流程在Windows和macOS环境中均保持一致行为。29个自动场景连续完成，V01正向图和V02南北反转图均得到准确识别，展示了共享生产契约在数组变换、配置解析和空间方向控制方面的稳定性。</w:t>
+        <w:t>标准产品生产流程在多环境中保持一致行为。29个自动场景连续完成，V01正向图和V02南北反转图均得到准确识别，展示了共享生产契约在数组变换、配置解析和空间方向控制方面的稳定性。</w:t>
       </w:r>
     </w:p>
     <w:p>
@@ -5858,7 +5858,7 @@
         <w:rPr>
           <w:rFonts w:ascii="Times New Roman" w:hAnsi="Times New Roman" w:eastAsia="宋体"/>
         </w:rPr>
-        <w:t>3.5 跨平台运行与持续集成</w:t>
+        <w:t>3.5 多环境运行与持续集成</w:t>
       </w:r>
     </w:p>
     <w:p>
@@ -5866,7 +5866,7 @@
         <w:rPr>
           <w:rFonts w:ascii="Times New Roman" w:hAnsi="Times New Roman" w:eastAsia="宋体"/>
         </w:rPr>
-        <w:t>跨平台运行采用桌面环境与持续集成相结合的方式。Windows和macOS覆盖标准产品生产、真实ELEV/LAI分发、多镜像获取、Emerald最小模型流程及真实网络访问；GitHub Actions在Windows、macOS和Linux环境持续运行核心软件路径。统一的项目依赖和参考数据使数据结构、数值内容、正式文件状态与临时缓存行为保持一致。</w:t>
+        <w:t>本文所称多环境运行覆盖Windows、macOS和Linux，采用本地运行与持续集成相结合的方式，贯通标准产品生产、真实ELEV/LAI分发、多镜像获取、Emerald最小模型流程和核心软件路径。统一的项目依赖和参考数据使数据结构、数值内容、正式文件状态与临时缓存行为保持一致。</w:t>
       </w:r>
     </w:p>
     <w:p>
@@ -5874,7 +5874,7 @@
         <w:rPr>
           <w:rFonts w:ascii="Times New Roman" w:hAnsi="Times New Roman" w:eastAsia="宋体"/>
         </w:rPr>
-        <w:t>持续集成使用确定性NetCDF参考数据维护代码路径、文件状态和内容完整性，桌面环境进一步覆盖真实ELEV/LAI效率、真实镜像访问和真实</w:t>
+        <w:t>持续集成使用确定性NetCDF参考数据维护代码路径、文件状态和内容完整性，本地环境进一步覆盖真实ELEV/LAI效率、真实镜像访问和真实</w:t>
       </w:r>
       <w:r>
         <w:rPr>
@@ -6399,7 +6399,7 @@
                 <w:rFonts w:ascii="Times New Roman" w:hAnsi="Times New Roman" w:eastAsia="宋体"/>
                 <w:sz w:val="18"/>
               </w:rPr>
-              <w:t>跨平台运行</w:t>
+              <w:t>多环境运行</w:t>
             </w:r>
           </w:p>
         </w:tc>
@@ -6437,7 +6437,7 @@
                 <w:rFonts w:ascii="Times New Roman" w:hAnsi="Times New Roman" w:eastAsia="宋体"/>
                 <w:sz w:val="18"/>
               </w:rPr>
-              <w:t>Windows、macOS和Linux保持一致的软件路径</w:t>
+              <w:t>多环境保持一致的软件路径与数据接口</w:t>
             </w:r>
           </w:p>
         </w:tc>
@@ -6540,7 +6540,7 @@
         <w:rPr>
           <w:rFonts w:ascii="Times New Roman" w:hAnsi="Times New Roman" w:eastAsia="宋体"/>
         </w:rPr>
-        <w:t>表3所列31个生产场景完整覆盖维度、坐标、数值、Gapfill、配置、输出和空间方向控制。Windows与macOS获得一致的产品结构和逐点数值结果，V01正向图与V02南北反转图得到准确区分，说明自动质量控制与人工空间检查能够共同维护标准产品的坐标语义。</w:t>
+        <w:t>表3所列31个生产场景完整覆盖维度、坐标、数值、Gapfill、配置、输出和空间方向控制。多环境获得一致的产品结构和逐点数值结果，V01正向图与V02南北反转图得到准确区分，说明自动质量控制与人工空间检查能够共同维护标准产品的坐标语义。</w:t>
       </w:r>
     </w:p>
     <w:p>
@@ -6663,7 +6663,7 @@
         <w:rPr>
           <w:rFonts w:ascii="Times New Roman" w:hAnsi="Times New Roman" w:eastAsia="宋体"/>
         </w:rPr>
-        <w:t>评价分发效率，并在Windows与macOS上采用一致协议。两文件的</w:t>
+        <w:t>评价分发效率，并在独立运行环境中采用一致协议。两文件的</w:t>
       </w:r>
       <w:r>
         <w:rPr>
@@ -6742,7 +6742,7 @@
         <w:rPr>
           <w:rFonts w:ascii="Times New Roman" w:hAnsi="Times New Roman" w:eastAsia="宋体"/>
         </w:rPr>
-        <w:t>同一下载接口在Windows和macOS环境均实现延迟辅助排序、全候选保留和顺序回退，为不同网络条件提供一致的数据获取方式。</w:t>
+        <w:t>同一下载接口在多环境中均实现延迟辅助排序、全候选保留和顺序回退，为不同网络条件提供一致的数据获取方式。</w:t>
       </w:r>
     </w:p>
     <w:p>
@@ -6899,7 +6899,7 @@
         <w:rPr>
           <w:rFonts w:ascii="Times New Roman" w:hAnsi="Times New Roman" w:eastAsia="宋体"/>
         </w:rPr>
-        <w:t>文件顺利贯通完整性目录、统一读取和陆面参数组织接口，并覆盖植被与非植被入口。依赖统一和接口迁移使三个操作系统环境能够从同一项目声明解析一致的软件组合。2020年ERA5的8类</w:t>
+        <w:t>文件顺利贯通完整性目录、统一读取和陆面参数组织接口，并覆盖植被与非植被入口。依赖统一和接口迁移使多环境能够从同一项目声明解析一致的软件组合。2020年ERA5的8类</w:t>
       </w:r>
       <w:r>
         <w:rPr>
@@ -6922,7 +6922,7 @@
         <w:rPr>
           <w:rFonts w:ascii="Times New Roman" w:hAnsi="Times New Roman" w:eastAsia="宋体"/>
         </w:rPr>
-        <w:t>4.5 跨平台运行表现</w:t>
+        <w:t>4.5 多环境运行表现</w:t>
       </w:r>
     </w:p>
     <w:p>
@@ -6930,7 +6930,7 @@
         <w:rPr>
           <w:rFonts w:ascii="Times New Roman" w:hAnsi="Times New Roman" w:eastAsia="宋体"/>
         </w:rPr>
-        <w:t>Windows和macOS均可完整运行标准产品生产、直接NetCDF分发、多镜像获取和Emerald模型接口。两个桌面环境获得一致的数据结构、内容摘要和模型字段，表明共享数据契约、事务式下载和模型就绪接口具有稳定的跨平台行为。</w:t>
+        <w:t>多环境均可运行标准产品生产、直接NetCDF分发、多镜像获取和Emerald模型接口，并获得一致的数据结构、内容摘要和模型字段，表明共享数据契约、事务式下载和模型就绪接口具有稳定的环境适应性。</w:t>
       </w:r>
     </w:p>
     <w:p>
@@ -6946,7 +6946,7 @@
         <w:rPr>
           <w:rFonts w:ascii="Times New Roman" w:hAnsi="Times New Roman" w:eastAsia="宋体"/>
         </w:rPr>
-        <w:t>GriddingMachine、GriddingMachineDatasets、Emerald及研究材料仓库在Windows、macOS和Linux持续集成环境中保持自动运行。统一的项目依赖、参考数据和模型接口形成可持续维护机制，使软件更新能够持续继承本文建立的数据生产、可信分发和模型调用能力。</w:t>
+        <w:t>GriddingMachine、GriddingMachineDatasets、Emerald及研究材料仓库在多环境持续集成中保持自动运行。统一的项目依赖、参考数据和模型接口形成可持续维护机制，使软件更新能够持续继承本文建立的数据生产、可信分发和模型调用能力。</w:t>
       </w:r>
     </w:p>
     <w:p>
@@ -6976,7 +6976,7 @@
         <w:rPr>
           <w:rFonts w:ascii="Times New Roman" w:hAnsi="Times New Roman" w:eastAsia="宋体"/>
         </w:rPr>
-        <w:t>2022版GriddingMachine建立了统一网格、变量约定和标签化数据访问[4]。当前更新进一步形成共享配置契约、显式源维度映射、与软件版本解耦的数据目录、事务式多镜像获取和模型就绪接口。14类真实陆面产品、校园网FTP—Zenodo获取和跨平台运行共同展示这些能力，GriddingMachine由此从标准数据集合演进为连接生产、分发、读取和模型调用的数据生命周期框架。</w:t>
+        <w:t>2022版GriddingMachine建立了统一网格、变量约定和标签化数据访问[4]。当前更新进一步形成共享配置契约、显式源维度映射、与软件版本解耦的数据目录、事务式多镜像获取和模型就绪接口。14类真实陆面产品、校园网FTP—Zenodo获取和多环境运行共同展示这些能力，GriddingMachine由此从标准数据集合演进为连接生产、分发、读取和模型调用的数据生命周期框架。</w:t>
       </w:r>
     </w:p>
     <w:p>

</xml_diff>

<commit_message>
docs: refine cross-operating-system terminology
</commit_message>
<xml_diff>
--- a/论文/GriddingMachine论文初稿_导师审阅版.docx
+++ b/论文/GriddingMachine论文初稿_导师审阅版.docx
@@ -4034,7 +4034,7 @@
         <w:rPr>
           <w:rFonts w:ascii="Times New Roman" w:hAnsi="Times New Roman" w:eastAsia="宋体"/>
         </w:rPr>
-        <w:t>镜像状态分析覆盖候选顺序、字节数、SHA-256、缓存恢复和镜像遍历等分发环节。多环境运行与校园网FTP—Zenodo实测共同呈现“事务安全—真实获取—内容一致”的分发链路。</w:t>
+        <w:t>镜像状态分析覆盖候选顺序、字节数、SHA-256、缓存恢复和镜像遍历等分发环节。跨操作系统运行与校园网FTP—Zenodo实测共同呈现“事务安全—真实获取—内容一致”的分发链路。</w:t>
       </w:r>
     </w:p>
     <w:p>
@@ -5426,7 +5426,7 @@
         <w:rPr>
           <w:rFonts w:ascii="Times New Roman" w:hAnsi="Times New Roman" w:eastAsia="宋体"/>
         </w:rPr>
-        <w:t>标准产品生产流程在多环境中保持一致行为。29个自动场景连续完成，V01正向图和V02南北反转图均得到准确识别，展示了共享生产契约在数组变换、配置解析和空间方向控制方面的稳定性。</w:t>
+        <w:t>标准产品生产流程在各操作系统环境中保持一致行为。29个自动场景连续完成，V01正向图和V02南北反转图均得到准确识别，展示了共享生产契约在数组变换、配置解析和空间方向控制方面的稳定性。</w:t>
       </w:r>
     </w:p>
     <w:p>
@@ -5858,7 +5858,7 @@
         <w:rPr>
           <w:rFonts w:ascii="Times New Roman" w:hAnsi="Times New Roman" w:eastAsia="宋体"/>
         </w:rPr>
-        <w:t>3.5 多环境运行与持续集成</w:t>
+        <w:t>3.5 跨操作系统运行与持续集成</w:t>
       </w:r>
     </w:p>
     <w:p>
@@ -5866,7 +5866,7 @@
         <w:rPr>
           <w:rFonts w:ascii="Times New Roman" w:hAnsi="Times New Roman" w:eastAsia="宋体"/>
         </w:rPr>
-        <w:t>本文所称多环境运行覆盖Windows、macOS和Linux，采用本地运行与持续集成相结合的方式，贯通标准产品生产、真实ELEV/LAI分发、多镜像获取、Emerald最小模型流程和核心软件路径。统一的项目依赖和参考数据使数据结构、数值内容、正式文件状态与临时缓存行为保持一致。</w:t>
+        <w:t>跨操作系统运行覆盖Windows、macOS和Linux，采用本地运行与持续集成相结合的方式，贯通标准产品生产、真实ELEV/LAI分发、多镜像获取、Emerald最小模型流程和核心软件路径。统一的项目依赖和参考数据使数据结构、数值内容、正式文件状态与临时缓存行为保持一致。</w:t>
       </w:r>
     </w:p>
     <w:p>
@@ -6399,7 +6399,7 @@
                 <w:rFonts w:ascii="Times New Roman" w:hAnsi="Times New Roman" w:eastAsia="宋体"/>
                 <w:sz w:val="18"/>
               </w:rPr>
-              <w:t>多环境运行</w:t>
+              <w:t>跨操作系统运行</w:t>
             </w:r>
           </w:p>
         </w:tc>
@@ -6437,7 +6437,7 @@
                 <w:rFonts w:ascii="Times New Roman" w:hAnsi="Times New Roman" w:eastAsia="宋体"/>
                 <w:sz w:val="18"/>
               </w:rPr>
-              <w:t>多环境保持一致的软件路径与数据接口</w:t>
+              <w:t>各操作系统环境保持一致的软件路径与数据接口</w:t>
             </w:r>
           </w:p>
         </w:tc>
@@ -6540,7 +6540,7 @@
         <w:rPr>
           <w:rFonts w:ascii="Times New Roman" w:hAnsi="Times New Roman" w:eastAsia="宋体"/>
         </w:rPr>
-        <w:t>表3所列31个生产场景完整覆盖维度、坐标、数值、Gapfill、配置、输出和空间方向控制。多环境获得一致的产品结构和逐点数值结果，V01正向图与V02南北反转图得到准确区分，说明自动质量控制与人工空间检查能够共同维护标准产品的坐标语义。</w:t>
+        <w:t>表3所列31个生产场景完整覆盖维度、坐标、数值、Gapfill、配置、输出和空间方向控制。各操作系统环境获得一致的产品结构和逐点数值结果，V01正向图与V02南北反转图得到准确区分，说明自动质量控制与人工空间检查能够共同维护标准产品的坐标语义。</w:t>
       </w:r>
     </w:p>
     <w:p>
@@ -6663,7 +6663,7 @@
         <w:rPr>
           <w:rFonts w:ascii="Times New Roman" w:hAnsi="Times New Roman" w:eastAsia="宋体"/>
         </w:rPr>
-        <w:t>评价分发效率，并在独立运行环境中采用一致协议。两文件的</w:t>
+        <w:t>评价分发效率，并在相互独立的操作系统环境中采用一致协议。两文件的</w:t>
       </w:r>
       <w:r>
         <w:rPr>
@@ -6742,7 +6742,7 @@
         <w:rPr>
           <w:rFonts w:ascii="Times New Roman" w:hAnsi="Times New Roman" w:eastAsia="宋体"/>
         </w:rPr>
-        <w:t>同一下载接口在多环境中均实现延迟辅助排序、全候选保留和顺序回退，为不同网络条件提供一致的数据获取方式。</w:t>
+        <w:t>同一下载接口在各操作系统环境中均实现延迟辅助排序、全候选保留和顺序回退，为不同网络条件提供一致的数据获取方式。</w:t>
       </w:r>
     </w:p>
     <w:p>
@@ -6899,7 +6899,7 @@
         <w:rPr>
           <w:rFonts w:ascii="Times New Roman" w:hAnsi="Times New Roman" w:eastAsia="宋体"/>
         </w:rPr>
-        <w:t>文件顺利贯通完整性目录、统一读取和陆面参数组织接口，并覆盖植被与非植被入口。依赖统一和接口迁移使多环境能够从同一项目声明解析一致的软件组合。2020年ERA5的8类</w:t>
+        <w:t>文件顺利贯通完整性目录、统一读取和陆面参数组织接口，并覆盖植被与非植被入口。依赖统一和接口迁移使各操作系统环境能够从同一项目声明解析一致的软件组合。2020年ERA5的8类</w:t>
       </w:r>
       <w:r>
         <w:rPr>
@@ -6922,7 +6922,7 @@
         <w:rPr>
           <w:rFonts w:ascii="Times New Roman" w:hAnsi="Times New Roman" w:eastAsia="宋体"/>
         </w:rPr>
-        <w:t>4.5 多环境运行表现</w:t>
+        <w:t>4.5 跨操作系统运行表现</w:t>
       </w:r>
     </w:p>
     <w:p>
@@ -6930,7 +6930,7 @@
         <w:rPr>
           <w:rFonts w:ascii="Times New Roman" w:hAnsi="Times New Roman" w:eastAsia="宋体"/>
         </w:rPr>
-        <w:t>多环境均可运行标准产品生产、直接NetCDF分发、多镜像获取和Emerald模型接口，并获得一致的数据结构、内容摘要和模型字段，表明共享数据契约、事务式下载和模型就绪接口具有稳定的环境适应性。</w:t>
+        <w:t>各操作系统环境均可运行标准产品生产、直接NetCDF分发、多镜像获取和Emerald模型接口，并获得一致的数据结构、内容摘要和模型字段，表明共享数据契约、事务式下载和模型就绪接口具有稳定的系统适应性。</w:t>
       </w:r>
     </w:p>
     <w:p>
@@ -6946,7 +6946,7 @@
         <w:rPr>
           <w:rFonts w:ascii="Times New Roman" w:hAnsi="Times New Roman" w:eastAsia="宋体"/>
         </w:rPr>
-        <w:t>GriddingMachine、GriddingMachineDatasets、Emerald及研究材料仓库在多环境持续集成中保持自动运行。统一的项目依赖、参考数据和模型接口形成可持续维护机制，使软件更新能够持续继承本文建立的数据生产、可信分发和模型调用能力。</w:t>
+        <w:t>GriddingMachine、GriddingMachineDatasets、Emerald及研究材料仓库在跨操作系统持续集成中保持自动运行。统一的项目依赖、参考数据和模型接口形成可持续维护机制，使软件更新能够持续继承本文建立的数据生产、可信分发和模型调用能力。</w:t>
       </w:r>
     </w:p>
     <w:p>
@@ -6976,7 +6976,7 @@
         <w:rPr>
           <w:rFonts w:ascii="Times New Roman" w:hAnsi="Times New Roman" w:eastAsia="宋体"/>
         </w:rPr>
-        <w:t>2022版GriddingMachine建立了统一网格、变量约定和标签化数据访问[4]。当前更新进一步形成共享配置契约、显式源维度映射、与软件版本解耦的数据目录、事务式多镜像获取和模型就绪接口。14类真实陆面产品、校园网FTP—Zenodo获取和多环境运行共同展示这些能力，GriddingMachine由此从标准数据集合演进为连接生产、分发、读取和模型调用的数据生命周期框架。</w:t>
+        <w:t>2022版GriddingMachine建立了统一网格、变量约定和标签化数据访问[4]。当前更新进一步形成共享配置契约、显式源维度映射、与软件版本解耦的数据目录、事务式多镜像获取和模型就绪接口。14类真实陆面产品、校园网FTP—Zenodo获取和跨操作系统运行共同展示这些能力，GriddingMachine由此从标准数据集合演进为连接生产、分发、读取和模型调用的数据生命周期框架。</w:t>
       </w:r>
     </w:p>
     <w:p>

</xml_diff>

<commit_message>
docs: clarify loopback benchmark terminology
</commit_message>
<xml_diff>
--- a/论文/GriddingMachine论文初稿_导师审阅版.docx
+++ b/论文/GriddingMachine论文初稿_导师审阅版.docx
@@ -5570,7 +5570,7 @@
         <w:rPr>
           <w:rFonts w:ascii="Times New Roman" w:hAnsi="Times New Roman" w:eastAsia="宋体"/>
         </w:rPr>
-        <w:t>性能分析在本地HTTP服务中采用随机顺序重复测量，记录传输字节数、打包与解包时间、从请求开始到首次读取NetCDF值的端到端时间，以及下载文件与解包文件并存时的逻辑临时占用。两个独立环境使用一致的脚本和输入文件，时间指标以中位数、四分位距和95% bootstrap置信区间表示。</w:t>
+        <w:t>性能分析基于回环HTTP服务，按随机顺序重复测量传输字节数、打包与解包时间、从请求开始到首次读取NetCDF值的端到端时间，以及下载文件与解包文件并存时的逻辑临时占用。两个独立环境使用一致的脚本和输入文件，时间指标以中位数、四分位距和95% bootstrap置信区间表示。</w:t>
       </w:r>
     </w:p>
     <w:p>
@@ -6675,7 +6675,7 @@
         <w:rPr>
           <w:rFonts w:ascii="Times New Roman" w:hAnsi="Times New Roman" w:eastAsia="宋体"/>
         </w:rPr>
-        <w:t>变量均采用NetCDF内部zlib level 4压缩，对照归档采用gzip level 6。本机回环HTTP条件下，各“数据×形式”组合经过预热并按随机顺序重复测量，全部解包后内容均通过SHA-256校验。</w:t>
+        <w:t>变量均采用NetCDF内部zlib level 4压缩，对照归档采用gzip level 6。回环HTTP测试条件下，各“数据×形式”组合经过预热并按随机顺序重复测量，全部解包后内容均通过SHA-256校验。</w:t>
       </w:r>
     </w:p>
     <w:p>

</xml_diff>

<commit_message>
feat: add real OISST end-to-end case
</commit_message>
<xml_diff>
--- a/论文/GriddingMachine论文初稿_导师审阅版.docx
+++ b/论文/GriddingMachine论文初稿_导师审阅版.docx
@@ -118,7 +118,19 @@
         <w:rPr>
           <w:rFonts w:ascii="Times New Roman" w:hAnsi="Times New Roman" w:eastAsia="宋体"/>
         </w:rPr>
-        <w:t>提供模型就绪数据。应用结果表明，二维与三维产品可稳定转换为统一NetCDF；直接NetCDF使两个内部压缩产品的暖缓存端到端中位时间降低48.3%～82.9%和53.6%～69.2%；校园网内4个代表性产品经FTP和Zenodo完成24次内容一致的真实下载；14类真实陆面产品成功生成US-NR1参数字典并进入Emerald模型初始化。新版GriddingMachine由此形成面向全球规则网格数据的可配置生产、可信分发和模型就绪应用框架，为地球系统数据产品的持续维护与复用提供轻量化基础设施。</w:t>
+        <w:t>提供模型就绪数据。NOAA OISST V2.1真实产品由</w:t>
+      </w:r>
+      <w:r>
+        <w:rPr>
+          <w:rFonts w:ascii="Consolas" w:hAnsi="Consolas" w:eastAsia="等线"/>
+        </w:rPr>
+        <w:t>time×zlev×lat×lon</w:t>
+      </w:r>
+      <w:r>
+        <w:rPr>
+          <w:rFonts w:ascii="Times New Roman" w:hAnsi="Times New Roman" w:eastAsia="宋体"/>
+        </w:rPr>
+        <w:t>四维源结构转换为1440×720标准网格，691 150个有效格点及345 650个缺失格点与独立参考逐点一致；直接NetCDF使两个内部压缩产品的暖缓存端到端中位时间降低48.3%～82.9%和53.6%～69.2%；校园网内4个代表性产品经FTP和Zenodo完成24次内容一致的真实下载；14类真实陆面产品成功生成US-NR1参数字典并进入Emerald模型初始化。新版GriddingMachine由此形成面向全球规则网格数据的可配置生产、可信分发和模型就绪应用框架，为地球系统数据产品的持续维护与复用提供轻量化基础设施。</w:t>
       </w:r>
     </w:p>
     <w:p>
@@ -242,7 +254,19 @@
         <w:rPr>
           <w:rFonts w:ascii="Times New Roman" w:hAnsi="Times New Roman" w:eastAsia="宋体"/>
         </w:rPr>
-        <w:t xml:space="preserve"> provide model-ready access. Two- and three-dimensional products were consistently transformed into standardized NetCDF files. Direct NetCDF reduced median warm-cache end-to-end time by 48.3%–82.9% and 53.6%–69.2% for two internally compressed products. Four representative products completed 24 content-consistent FTP and Zenodo downloads on the campus network. Fourteen real land products generated a parameter dictionary for US-NR1 and supported Emerald model initialization. The updated GriddingMachine therefore provides a lightweight infrastructure for configurable production, trustworthy distribution, and model-ready use of global regular-grid data.</w:t>
+        <w:t xml:space="preserve"> provide model-ready access. A real NOAA OISST V2.1 product was transformed from a four-dimensional </w:t>
+      </w:r>
+      <w:r>
+        <w:rPr>
+          <w:rFonts w:ascii="Consolas" w:hAnsi="Consolas" w:eastAsia="等线"/>
+        </w:rPr>
+        <w:t>time × zlev × lat × lon</w:t>
+      </w:r>
+      <w:r>
+        <w:rPr>
+          <w:rFonts w:ascii="Times New Roman" w:hAnsi="Times New Roman" w:eastAsia="宋体"/>
+        </w:rPr>
+        <w:t xml:space="preserve"> source structure to a standardized 1440 × 720 grid, with 691,150 finite and 345,650 missing grid cells matching an independently decoded reference point by point. Direct NetCDF reduced median warm-cache end-to-end time by 48.3%–82.9% and 53.6%–69.2% for two internally compressed products. Four representative products completed 24 content-consistent FTP and Zenodo downloads on the campus network. Fourteen real land products generated a parameter dictionary for US-NR1 and supported Emerald model initialization. The updated GriddingMachine therefore provides a lightweight infrastructure for configurable production, trustworthy distribution, and model-ready use of global regular-grid data.</w:t>
       </w:r>
     </w:p>
     <w:p>
@@ -5500,6 +5524,189 @@
     </w:p>
     <w:p>
       <w:pPr>
+        <w:pStyle w:val="Heading3"/>
+      </w:pPr>
+      <w:r>
+        <w:rPr>
+          <w:rFonts w:ascii="Times New Roman" w:hAnsi="Times New Roman" w:eastAsia="宋体"/>
+        </w:rPr>
+        <w:t>3.1.5 真实OISST产品生产</w:t>
+      </w:r>
+    </w:p>
+    <w:p>
+      <w:r>
+        <w:rPr>
+          <w:rFonts w:ascii="Times New Roman" w:hAnsi="Times New Roman" w:eastAsia="宋体"/>
+        </w:rPr>
+        <w:t>真实异构产品案例采用NOAA/NCEI 0.25°逐日最优插值海表温度OISST V2.1 AVHRR-only正式产品[9]，固定选取2022年2月25日文件。原始</w:t>
+      </w:r>
+      <w:r>
+        <w:rPr>
+          <w:rFonts w:ascii="Consolas" w:hAnsi="Consolas" w:eastAsia="等线"/>
+        </w:rPr>
+        <w:t>sst</w:t>
+      </w:r>
+      <w:r>
+        <w:rPr>
+          <w:rFonts w:ascii="Times New Roman" w:hAnsi="Times New Roman" w:eastAsia="宋体"/>
+        </w:rPr>
+        <w:t>变量在NetCDF中声明为</w:t>
+      </w:r>
+      <w:r>
+        <w:rPr>
+          <w:rFonts w:ascii="Consolas" w:hAnsi="Consolas" w:eastAsia="等线"/>
+        </w:rPr>
+        <w:t>time×zlev×lat×lon</w:t>
+      </w:r>
+      <w:r>
+        <w:rPr>
+          <w:rFonts w:ascii="Times New Roman" w:hAnsi="Times New Roman" w:eastAsia="宋体"/>
+        </w:rPr>
+        <w:t>，其中</w:t>
+      </w:r>
+      <w:r>
+        <w:rPr>
+          <w:rFonts w:ascii="Consolas" w:hAnsi="Consolas" w:eastAsia="等线"/>
+        </w:rPr>
+        <w:t>zlev</w:t>
+      </w:r>
+      <w:r>
+        <w:rPr>
+          <w:rFonts w:ascii="Times New Roman" w:hAnsi="Times New Roman" w:eastAsia="宋体"/>
+        </w:rPr>
+        <w:t>和</w:t>
+      </w:r>
+      <w:r>
+        <w:rPr>
+          <w:rFonts w:ascii="Consolas" w:hAnsi="Consolas" w:eastAsia="等线"/>
+        </w:rPr>
+        <w:t>time</w:t>
+      </w:r>
+      <w:r>
+        <w:rPr>
+          <w:rFonts w:ascii="Times New Roman" w:hAnsi="Times New Roman" w:eastAsia="宋体"/>
+        </w:rPr>
+        <w:t>均为单例维度；Julia读取后的数组顺序为</w:t>
+      </w:r>
+      <w:r>
+        <w:rPr>
+          <w:rFonts w:ascii="Consolas" w:hAnsi="Consolas" w:eastAsia="等线"/>
+        </w:rPr>
+        <w:t>lon×lat×zlev×time</w:t>
+      </w:r>
+      <w:r>
+        <w:rPr>
+          <w:rFonts w:ascii="Times New Roman" w:hAnsi="Times New Roman" w:eastAsia="宋体"/>
+        </w:rPr>
+        <w:t>，形状为1440×720×1×1。经度覆盖0.125°～359.875°，存储类型为Int16，并以0.01缩放因子解码为摄氏度。版本化源适配器提取唯一的垂向层和时间层，共享YAML契约进一步完成维度声明、</w:t>
+      </w:r>
+      <w:r>
+        <w:rPr>
+          <w:rFonts w:ascii="Consolas" w:hAnsi="Consolas" w:eastAsia="等线"/>
+        </w:rPr>
+        <w:t>0～360°</w:t>
+      </w:r>
+      <w:r>
+        <w:rPr>
+          <w:rFonts w:ascii="Times New Roman" w:hAnsi="Times New Roman" w:eastAsia="宋体"/>
+        </w:rPr>
+        <w:t>至</w:t>
+      </w:r>
+      <w:r>
+        <w:rPr>
+          <w:rFonts w:ascii="Consolas" w:hAnsi="Consolas" w:eastAsia="等线"/>
+        </w:rPr>
+        <w:t>[-180°,180°)</w:t>
+      </w:r>
+      <w:r>
+        <w:rPr>
+          <w:rFonts w:ascii="Times New Roman" w:hAnsi="Times New Roman" w:eastAsia="宋体"/>
+        </w:rPr>
+        <w:t>的经度重排、有效范围控制和缺失值策略，生成</w:t>
+      </w:r>
+      <w:r>
+        <w:rPr>
+          <w:rFonts w:ascii="Consolas" w:hAnsi="Consolas" w:eastAsia="等线"/>
+        </w:rPr>
+        <w:t>SST_OISST_4X_1D_20220225_V1</w:t>
+      </w:r>
+      <w:r>
+        <w:rPr>
+          <w:rFonts w:ascii="Times New Roman" w:hAnsi="Times New Roman" w:eastAsia="宋体"/>
+        </w:rPr>
+        <w:t>标准产品。</w:t>
+      </w:r>
+    </w:p>
+    <w:p>
+      <w:r>
+        <w:rPr>
+          <w:rFonts w:ascii="Times New Roman" w:hAnsi="Times New Roman" w:eastAsia="宋体"/>
+        </w:rPr>
+        <w:t>独立参考流程直接读取未缩放的Int16存储值，根据原始</w:t>
+      </w:r>
+      <w:r>
+        <w:rPr>
+          <w:rFonts w:ascii="Consolas" w:hAnsi="Consolas" w:eastAsia="等线"/>
+        </w:rPr>
+        <w:t>scale_factor</w:t>
+      </w:r>
+      <w:r>
+        <w:rPr>
+          <w:rFonts w:ascii="Times New Roman" w:hAnsi="Times New Roman" w:eastAsia="宋体"/>
+        </w:rPr>
+        <w:t>、</w:t>
+      </w:r>
+      <w:r>
+        <w:rPr>
+          <w:rFonts w:ascii="Consolas" w:hAnsi="Consolas" w:eastAsia="等线"/>
+        </w:rPr>
+        <w:t>add_offset</w:t>
+      </w:r>
+      <w:r>
+        <w:rPr>
+          <w:rFonts w:ascii="Times New Roman" w:hAnsi="Times New Roman" w:eastAsia="宋体"/>
+        </w:rPr>
+        <w:t>和</w:t>
+      </w:r>
+      <w:r>
+        <w:rPr>
+          <w:rFonts w:ascii="Consolas" w:hAnsi="Consolas" w:eastAsia="等线"/>
+        </w:rPr>
+        <w:t>_FillValue</w:t>
+      </w:r>
+      <w:r>
+        <w:rPr>
+          <w:rFonts w:ascii="Times New Roman" w:hAnsi="Times New Roman" w:eastAsia="宋体"/>
+        </w:rPr>
+        <w:t>构造物理值与缺失值掩膜，并独立计算目标经度索引。参考结果记录全场统计量、10个确定性有效格点和10个缺失格点。标准产品连续生成3次，逐点比较坐标、有效值掩膜和物理值；随后由本地权威文件生成包含</w:t>
+      </w:r>
+      <w:r>
+        <w:rPr>
+          <w:rFonts w:ascii="Consolas" w:hAnsi="Consolas" w:eastAsia="等线"/>
+        </w:rPr>
+        <w:t>PATH/URL/SIZE/SHA256</w:t>
+      </w:r>
+      <w:r>
+        <w:rPr>
+          <w:rFonts w:ascii="Times New Roman" w:hAnsi="Times New Roman" w:eastAsia="宋体"/>
+        </w:rPr>
+        <w:t>的目录条目，通过回环HTTP执行事务式下载，并以</w:t>
+      </w:r>
+      <w:r>
+        <w:rPr>
+          <w:rFonts w:ascii="Consolas" w:hAnsi="Consolas" w:eastAsia="等线"/>
+        </w:rPr>
+        <w:t>read_dataset</w:t>
+      </w:r>
+      <w:r>
+        <w:rPr>
+          <w:rFonts w:ascii="Times New Roman" w:hAnsi="Times New Roman" w:eastAsia="宋体"/>
+        </w:rPr>
+        <w:t>完成整场读取核对。</w:t>
+      </w:r>
+    </w:p>
+    <w:p>
+      <w:pPr>
         <w:pStyle w:val="Heading2"/>
       </w:pPr>
       <w:r>
@@ -6076,7 +6283,7 @@
                 <w:rFonts w:ascii="Times New Roman" w:hAnsi="Times New Roman" w:eastAsia="宋体"/>
                 <w:sz w:val="18"/>
               </w:rPr>
-              <w:t>二维/三维产品稳定生成；ELEV数组与坐标完整保持</w:t>
+              <w:t>OISST真实源数据与独立参考逐点一致；二维/三维产品稳定生成</w:t>
             </w:r>
           </w:p>
         </w:tc>
@@ -6095,7 +6302,7 @@
                 <w:rFonts w:ascii="Times New Roman" w:hAnsi="Times New Roman" w:eastAsia="宋体"/>
                 <w:sz w:val="18"/>
               </w:rPr>
-              <w:t>扩展真实异构原始产品</w:t>
+              <w:t>扩展多时段真实产品</w:t>
             </w:r>
           </w:p>
         </w:tc>
@@ -6540,6 +6747,154 @@
         <w:rPr>
           <w:rFonts w:ascii="Times New Roman" w:hAnsi="Times New Roman" w:eastAsia="宋体"/>
         </w:rPr>
+        <w:t>OISST真实产品展示了共享生产契约对异构地学源数据的完整组织能力。原始</w:t>
+      </w:r>
+      <w:r>
+        <w:rPr>
+          <w:rFonts w:ascii="Consolas" w:hAnsi="Consolas" w:eastAsia="等线"/>
+        </w:rPr>
+        <w:t>sst</w:t>
+      </w:r>
+      <w:r>
+        <w:rPr>
+          <w:rFonts w:ascii="Times New Roman" w:hAnsi="Times New Roman" w:eastAsia="宋体"/>
+        </w:rPr>
+        <w:t>变量在Julia读取路径中呈现为1440×720×1×1的</w:t>
+      </w:r>
+      <w:r>
+        <w:rPr>
+          <w:rFonts w:ascii="Consolas" w:hAnsi="Consolas" w:eastAsia="等线"/>
+        </w:rPr>
+        <w:t>lon×lat×zlev×time</w:t>
+      </w:r>
+      <w:r>
+        <w:rPr>
+          <w:rFonts w:ascii="Times New Roman" w:hAnsi="Times New Roman" w:eastAsia="宋体"/>
+        </w:rPr>
+        <w:t>数组，经单例层提取、Int16物理值解码和经度重排后形成1440×720标准产品。输出经度由−179.875°递增至179.875°，纬度由−89.875°递增至89.875°；691 150个有效格点和345 650个缺失格点与独立参考逐点一致，海表温度范围为−1.80～32.39 ℃，全场平均值为14.013 ℃，最大绝对差为0。</w:t>
+      </w:r>
+    </w:p>
+    <w:p>
+      <w:r>
+        <w:rPr>
+          <w:rFonts w:ascii="Times New Roman" w:hAnsi="Times New Roman" w:eastAsia="宋体"/>
+        </w:rPr>
+        <w:t>标准产品连续生成3次，科学数组、坐标和文件SHA-256均保持一致。生成文件为997 006字节，目录条目自动登记相同的</w:t>
+      </w:r>
+      <w:r>
+        <w:rPr>
+          <w:rFonts w:ascii="Consolas" w:hAnsi="Consolas" w:eastAsia="等线"/>
+        </w:rPr>
+        <w:t>SIZE</w:t>
+      </w:r>
+      <w:r>
+        <w:rPr>
+          <w:rFonts w:ascii="Times New Roman" w:hAnsi="Times New Roman" w:eastAsia="宋体"/>
+        </w:rPr>
+        <w:t>和SHA-256；经回环HTTP事务式下载后，正式文件摘要与目录完全一致，缓存目录中无残留</w:t>
+      </w:r>
+      <w:r>
+        <w:rPr>
+          <w:rFonts w:ascii="Consolas" w:hAnsi="Consolas" w:eastAsia="等线"/>
+        </w:rPr>
+        <w:t>.part</w:t>
+      </w:r>
+      <w:r>
+        <w:rPr>
+          <w:rFonts w:ascii="Times New Roman" w:hAnsi="Times New Roman" w:eastAsia="宋体"/>
+        </w:rPr>
+        <w:t>文件。</w:t>
+      </w:r>
+      <w:r>
+        <w:rPr>
+          <w:rFonts w:ascii="Consolas" w:hAnsi="Consolas" w:eastAsia="等线"/>
+        </w:rPr>
+        <w:t>read_dataset</w:t>
+      </w:r>
+      <w:r>
+        <w:rPr>
+          <w:rFonts w:ascii="Times New Roman" w:hAnsi="Times New Roman" w:eastAsia="宋体"/>
+        </w:rPr>
+        <w:t>读取的整场数组与独立参考保持逐点一致，形成从真实原始产品、共享YAML生产、完整性目录到统一读取的端到端数据链路。</w:t>
+      </w:r>
+    </w:p>
+    <w:p>
+      <w:pPr>
+        <w:jc w:val="center"/>
+      </w:pPr>
+      <w:r>
+        <w:drawing>
+          <wp:inline xmlns:a="http://schemas.openxmlformats.org/drawingml/2006/main" xmlns:pic="http://schemas.openxmlformats.org/drawingml/2006/picture">
+            <wp:extent cx="5400000" cy="3887147"/>
+            <wp:docPr id="2" name="Picture 2"/>
+            <wp:cNvGraphicFramePr>
+              <a:graphicFrameLocks noChangeAspect="1"/>
+            </wp:cNvGraphicFramePr>
+            <a:graphic>
+              <a:graphicData uri="http://schemas.openxmlformats.org/drawingml/2006/picture">
+                <pic:pic>
+                  <pic:nvPicPr>
+                    <pic:cNvPr id="0" name="图2_OISST真实产品标准化结果.png"/>
+                    <pic:cNvPicPr/>
+                  </pic:nvPicPr>
+                  <pic:blipFill>
+                    <a:blip r:embed="rId10"/>
+                    <a:stretch>
+                      <a:fillRect/>
+                    </a:stretch>
+                  </pic:blipFill>
+                  <pic:spPr>
+                    <a:xfrm>
+                      <a:off x="0" y="0"/>
+                      <a:ext cx="5400000" cy="3887147"/>
+                    </a:xfrm>
+                    <a:prstGeom prst="rect"/>
+                  </pic:spPr>
+                </pic:pic>
+              </a:graphicData>
+            </a:graphic>
+          </wp:inline>
+        </w:drawing>
+      </w:r>
+    </w:p>
+    <w:p>
+      <w:pPr>
+        <w:ind w:firstLine="0"/>
+      </w:pPr>
+      <w:r>
+        <w:rPr>
+          <w:rFonts w:ascii="Times New Roman" w:hAnsi="Times New Roman" w:eastAsia="宋体"/>
+          <w:b/>
+        </w:rPr>
+        <w:t>图2 OISST V2.1真实产品标准化结果</w:t>
+      </w:r>
+      <w:r>
+        <w:rPr>
+          <w:rFonts w:ascii="Times New Roman" w:hAnsi="Times New Roman" w:eastAsia="宋体"/>
+        </w:rPr>
+        <w:t xml:space="preserve"> （a）2022年2月25日全球海表温度标准产品；（b）有效格点纬向平均海表温度；（c）各纬度有效格点比例。标准产品为1440×720规则网格，691 150个有效格点与独立参考逐点一致。</w:t>
+      </w:r>
+    </w:p>
+    <w:p>
+      <w:r>
+        <w:rPr>
+          <w:rFonts w:ascii="Times New Roman" w:hAnsi="Times New Roman" w:eastAsia="宋体"/>
+          <w:b/>
+        </w:rPr>
+        <w:t>Figure 2 Standardization results for the real OISST V2.1 product.</w:t>
+      </w:r>
+      <w:r>
+        <w:rPr>
+          <w:rFonts w:ascii="Times New Roman" w:hAnsi="Times New Roman" w:eastAsia="宋体"/>
+        </w:rPr>
+        <w:t xml:space="preserve"> (a) Global standardized sea-surface temperature on 25 February 2022; (b) zonal mean sea-surface temperature over finite grid cells; and (c) fraction of finite grid cells by latitude. The 1440 × 720 product contains 691,150 finite cells that agree point by point with the independently decoded reference.</w:t>
+      </w:r>
+    </w:p>
+    <w:p>
+      <w:r>
+        <w:rPr>
+          <w:rFonts w:ascii="Times New Roman" w:hAnsi="Times New Roman" w:eastAsia="宋体"/>
+        </w:rPr>
         <w:t>表3所列31个生产场景完整覆盖维度、坐标、数值、Gapfill、配置、输出和空间方向控制。各操作系统环境获得一致的产品结构和逐点数值结果，V01正向图与V02南北反转图得到准确区分，说明自动质量控制与人工空间检查能够共同维护标准产品的坐标语义。</w:t>
       </w:r>
     </w:p>
@@ -6984,7 +7339,7 @@
         <w:rPr>
           <w:rFonts w:ascii="Times New Roman" w:hAnsi="Times New Roman" w:eastAsia="宋体"/>
         </w:rPr>
-        <w:t>新版框架在三个层次推进GriddingMachine：生产端以共享YAML契约连接维度、坐标、Gapfill和标准NetCDF；分发端以独立目录、直接NetCDF与事务缓存连接机构镜像和公共镜像；应用端以统一读取、Emerald最小步进和真实</w:t>
+        <w:t>新版框架在三个层次推进GriddingMachine：生产端以共享YAML契约连接维度、坐标、Gapfill和标准NetCDF，并由OISST真实产品展示异构维度、打包数值和经度体系的统一转换；分发端以独立目录、直接NetCDF与事务缓存连接机构镜像和公共镜像；应用端以统一读取、Emerald最小步进和真实</w:t>
       </w:r>
       <w:r>
         <w:rPr>
@@ -6996,7 +7351,7 @@
         <w:rPr>
           <w:rFonts w:ascii="Times New Roman" w:hAnsi="Times New Roman" w:eastAsia="宋体"/>
         </w:rPr>
-        <w:t>陆面链路连接数据产品与模型。OISST等真实异构原始产品将进一步拓展源数据标准化和科学应用范围。</w:t>
+        <w:t>陆面链路连接数据产品与模型。真实海温与陆面产品共同呈现框架在全球规则网格数据生命周期中的适用性。</w:t>
       </w:r>
     </w:p>
     <w:p>
@@ -7015,7 +7370,7 @@
         <w:rPr>
           <w:rFonts w:ascii="Times New Roman" w:hAnsi="Times New Roman" w:eastAsia="宋体"/>
         </w:rPr>
-        <w:t>Earth Engine把大规模地理空间数据与云端计算结合，服务行星尺度分析[3]；ESGF通过分布式节点、搜索和联合身份基础设施支撑气候模式数据的发现与访问[9]；Pangeo倡导分析就绪、云优化数据以及计算与数据邻近的云原生模式[10]，Pangeo Forge进一步以可复用配方和目录组织分析就绪数据生产[11]。GriddingMachine与这些基础设施形成互补，面向经过选择和统一的全球规则网格产品，以及需要在本地Julia工作流中按固定标签复现参数与气象驱动的模型使用场景。</w:t>
+        <w:t>Earth Engine把大规模地理空间数据与云端计算结合，服务行星尺度分析[3]；ESGF通过分布式节点、搜索和联合身份基础设施支撑气候模式数据的发现与访问[10]；Pangeo倡导分析就绪、云优化数据以及计算与数据邻近的云原生模式[11]，Pangeo Forge进一步以可复用配方和目录组织分析就绪数据生产[12]。GriddingMachine与这些基础设施形成互补，面向经过选择和统一的全球规则网格产品，以及需要在本地Julia工作流中按固定标签复现参数与气象驱动的模型使用场景。</w:t>
       </w:r>
     </w:p>
     <w:p>
@@ -7059,7 +7414,7 @@
         <w:rPr>
           <w:rFonts w:ascii="Times New Roman" w:hAnsi="Times New Roman" w:eastAsia="宋体"/>
         </w:rPr>
-        <w:t>把标准数据组织为模型所需字段。Pangeo Forge侧重云端分析就绪数据生产的配方—基础设施分离[11]，本文流程侧重可直接下载的单体NetCDF、离线缓存、完整性落盘和固定模型接口。云优化分块格式适配超大规模近数据计算[10]，ESGF适配CMIP等机构联合治理[9]，GriddingMachine则服务可下载、可本地缓存的全球规则网格数据及其模型输入组织。</w:t>
+        <w:t>把标准数据组织为模型所需字段。Pangeo Forge侧重云端分析就绪数据生产的配方—基础设施分离[12]，本文流程侧重可直接下载的单体NetCDF、离线缓存、完整性落盘和固定模型接口。云优化分块格式适配超大规模近数据计算[11]，ESGF适配CMIP等机构联合治理[10]，GriddingMachine则服务可下载、可本地缓存的全球规则网格数据及其模型输入组织。</w:t>
       </w:r>
     </w:p>
     <w:p>
@@ -7067,7 +7422,7 @@
         <w:rPr>
           <w:rFonts w:ascii="Times New Roman" w:hAnsi="Times New Roman" w:eastAsia="宋体"/>
         </w:rPr>
-        <w:t>国内地球系统科学数据共享研究强调目录体系和规范关键词对数据管理与检索的作用[12]；Pooch以文件名、URL和SHA-256注册表实现远端文件获取、本地缓存和完整性校验[13]；STAC为广泛地理空间资产提供通用元数据结构与查询标准[14]。GriddingMachine进一步面向规则网格和模型标签，将上游生产配置、标准NetCDF、事务式多镜像落盘和下游模型字段组织置于同一机器可执行契约中，形成具有领域针对性的端到端整合。</w:t>
+        <w:t>国内地球系统科学数据共享研究强调目录体系和规范关键词对数据管理与检索的作用[13]；Pooch以文件名、URL和SHA-256注册表实现远端文件获取、本地缓存和完整性校验[14]；STAC为广泛地理空间资产提供通用元数据结构与查询标准[15]。GriddingMachine进一步面向规则网格和模型标签，将上游生产配置、标准NetCDF、事务式多镜像落盘和下游模型字段组织置于同一机器可执行契约中，形成具有领域针对性的端到端整合。</w:t>
       </w:r>
     </w:p>
     <w:p>
@@ -7086,7 +7441,7 @@
         <w:rPr>
           <w:rFonts w:ascii="Times New Roman" w:hAnsi="Times New Roman" w:eastAsia="宋体"/>
         </w:rPr>
-        <w:t>标签和外置目录提高数据的可发现性，多URL和直接NetCDF增强获取能力，统一网格与变量约定促进互操作，来源、许可、处理记录和版本信息支撑复用[1]。FAIR4RS强调科研软件的可执行性、复合依赖、持续演化和版本管理[15]；TRUST原则进一步提出透明度、责任、用户关注、可持续性和技术能力[16]。GriddingMachine以权威文件生成</w:t>
+        <w:t>标签和外置目录提高数据的可发现性，多URL和直接NetCDF增强获取能力，统一网格与变量约定促进互操作，来源、许可、处理记录和版本信息支撑复用[1]。FAIR4RS强调科研软件的可执行性、复合依赖、持续演化和版本管理[16]；TRUST原则进一步提出透明度、责任、用户关注、可持续性和技术能力[17]。GriddingMachine以权威文件生成</w:t>
       </w:r>
       <w:r>
         <w:rPr>
@@ -7125,7 +7480,7 @@
         <w:rPr>
           <w:rFonts w:ascii="Times New Roman" w:hAnsi="Times New Roman" w:eastAsia="宋体"/>
         </w:rPr>
-        <w:t>下一阶段将沿四条路线扩展。第一，迁移历史YAML，并为非规则网格、区域投影和复杂时间坐标增加数据源专用预处理模块。第二，将方向图复核与坐标单调性、值域和逐点数组断言进一步集成，形成统一质量报告。第三，扩大FTP与Zenodo的文件规模、观测时段和网络环境，建立延迟辅助排序与实际下载表现的长期统计。第四，将真实异构原始产品、2020年ERA5气象序列、长期模型运行和永久软件归档纳入后续版本，持续扩展科学应用与复现深度。</w:t>
+        <w:t>下一阶段将沿四条路线扩展。第一，迁移历史YAML，并为非规则网格、区域投影和复杂时间坐标增加数据源专用预处理模块。第二，将方向图复核与坐标单调性、值域和逐点数组断言进一步集成，形成统一质量报告。第三，扩大FTP与Zenodo的文件规模、观测时段和网络环境，建立延迟辅助排序与实际下载表现的长期统计。第四，以OISST单日案例为基础扩展多时段真实产品，并将2020年ERA5气象序列、长期模型运行和永久软件归档纳入后续版本，持续拓展科学应用与复现深度。</w:t>
       </w:r>
     </w:p>
     <w:p>
@@ -7188,7 +7543,7 @@
         <w:rPr>
           <w:rFonts w:ascii="Times New Roman" w:hAnsi="Times New Roman" w:eastAsia="宋体"/>
         </w:rPr>
-        <w:t>本文在2022版GriddingMachine基础上形成了由共享YAML schema、显式源维度映射、Gapfill、独立目录、直接NetCDF、事务式缓存及统一读取接口组成的可执行数据生命周期。新版能够稳定生成标准产品，在多镜像环境中维护内容完整性；校园网内4个代表性产品通过FTP与Zenodo实现内容一致的双镜像获取，14类真实陆面产品成功生成US-NR1参数字典。</w:t>
+        <w:t>本文在2022版GriddingMachine基础上形成了由共享YAML schema、显式源维度映射、Gapfill、独立目录、直接NetCDF、事务式缓存及统一读取接口组成的可执行数据生命周期。OISST V2.1真实产品从四维打包源数据生成1440×720标准海表温度产品，坐标、有效值掩膜和691 150个物理值与独立参考逐点一致；校园网内4个代表性产品通过FTP与Zenodo实现内容一致的双镜像获取，14类真实陆面产品成功生成US-NR1参数字典。</w:t>
       </w:r>
     </w:p>
     <w:p>
@@ -7196,7 +7551,7 @@
         <w:rPr>
           <w:rFonts w:ascii="Times New Roman" w:hAnsi="Times New Roman" w:eastAsia="宋体"/>
         </w:rPr>
-        <w:t>GriddingMachine由此形成面向地球系统模型的轻量数据生产与可信分发基础设施。下一阶段将以真实异构原始产品和ERA5气象驱动扩展端到端科学核对，并通过镜像登记、完整性元数据、不可变release和永久归档持续完善证据链，为全球规则网格数据维护和可复用模型输入提供长期支撑。</w:t>
+        <w:t>GriddingMachine由此形成面向地球系统模型的轻量数据生产与可信分发基础设施。真实海温生产、陆面参数组织与双镜像分发共同体现框架对全球规则网格数据的贯通能力；多时段产品、ERA5气象驱动、镜像登记、不可变release和永久归档将持续拓展其科学应用与长期复用价值。</w:t>
       </w:r>
     </w:p>
     <w:p>
@@ -7374,7 +7729,7 @@
         <w:rPr>
           <w:rFonts w:ascii="Times New Roman" w:hAnsi="Times New Roman" w:eastAsia="宋体"/>
         </w:rPr>
-        <w:t>[9] CINQUINI L, CRICHTON D, MATTMANN C, et al. The Earth System Grid Federation: An open infrastructure for access to distributed geospatial data[J]. Future Generation Computer Systems, 2014, 36: 400-417. DOI: 10.1016/j.future.2013.07.002.</w:t>
+        <w:t>[9] HUANG B, LIU C, BANZON V, et al. Improvements of the Daily Optimum Interpolation Sea Surface Temperature (DOISST) Version 2.1[J]. Journal of Climate, 2021, 34(8): 2923-2939. DOI: 10.1175/JCLI-D-20-0166.1.</w:t>
       </w:r>
     </w:p>
     <w:p>
@@ -7382,7 +7737,7 @@
         <w:rPr>
           <w:rFonts w:ascii="Times New Roman" w:hAnsi="Times New Roman" w:eastAsia="宋体"/>
         </w:rPr>
-        <w:t>[10] ABERNATHEY R P, AUGSPURGER T, BANIHIRWE A, et al. Cloud-native repositories for big scientific data[J]. Computing in Science &amp; Engineering, 2021, 23(2): 26-35. DOI: 10.1109/MCSE.2021.3059437.</w:t>
+        <w:t>[10] CINQUINI L, CRICHTON D, MATTMANN C, et al. The Earth System Grid Federation: An open infrastructure for access to distributed geospatial data[J]. Future Generation Computer Systems, 2014, 36: 400-417. DOI: 10.1016/j.future.2013.07.002.</w:t>
       </w:r>
     </w:p>
     <w:p>
@@ -7390,7 +7745,7 @@
         <w:rPr>
           <w:rFonts w:ascii="Times New Roman" w:hAnsi="Times New Roman" w:eastAsia="宋体"/>
         </w:rPr>
-        <w:t>[11] STERN C, ABERNATHEY R, HAMMAN J, et al. Pangeo Forge: Crowdsourcing analysis-ready, cloud optimized data production[J]. Frontiers in Climate, 2022, 3: 782909. DOI: 10.3389/fclim.2021.782909.</w:t>
+        <w:t>[11] ABERNATHEY R P, AUGSPURGER T, BANIHIRWE A, et al. Cloud-native repositories for big scientific data[J]. Computing in Science &amp; Engineering, 2021, 23(2): 26-35. DOI: 10.1109/MCSE.2021.3059437.</w:t>
       </w:r>
     </w:p>
     <w:p>
@@ -7398,7 +7753,7 @@
         <w:rPr>
           <w:rFonts w:ascii="Times New Roman" w:hAnsi="Times New Roman" w:eastAsia="宋体"/>
         </w:rPr>
-        <w:t>[12] 王卷乐, 林海, 冉盈盈, 等. 面向数据共享的地球系统科学数据分类探讨[J]. 地球科学进展, 2014, 29(2): 265-274. [WANG J L, LIN H, RAN Y Y, et al. A study of Earth System Science data classification for data sharing[J]. Advances in Earth Science, 2014, 29(2): 265-274.]</w:t>
+        <w:t>[12] STERN C, ABERNATHEY R, HAMMAN J, et al. Pangeo Forge: Crowdsourcing analysis-ready, cloud optimized data production[J]. Frontiers in Climate, 2022, 3: 782909. DOI: 10.3389/fclim.2021.782909.</w:t>
       </w:r>
     </w:p>
     <w:p>
@@ -7406,7 +7761,7 @@
         <w:rPr>
           <w:rFonts w:ascii="Times New Roman" w:hAnsi="Times New Roman" w:eastAsia="宋体"/>
         </w:rPr>
-        <w:t>[13] UIEDA L, SOLER S R, RAMPIN R, et al. Pooch: A friend to fetch your data files[J]. Journal of Open Source Software, 2020, 5(45): 1943. DOI: 10.21105/joss.01943.</w:t>
+        <w:t>[13] 王卷乐, 林海, 冉盈盈, 等. 面向数据共享的地球系统科学数据分类探讨[J]. 地球科学进展, 2014, 29(2): 265-274. [WANG J L, LIN H, RAN Y Y, et al. A study of Earth System Science data classification for data sharing[J]. Advances in Earth Science, 2014, 29(2): 265-274.]</w:t>
       </w:r>
     </w:p>
     <w:p>
@@ -7414,7 +7769,7 @@
         <w:rPr>
           <w:rFonts w:ascii="Times New Roman" w:hAnsi="Times New Roman" w:eastAsia="宋体"/>
         </w:rPr>
-        <w:t>[14] OPEN GEOSPATIAL CONSORTIUM. SpatioTemporal Asset Catalog (STAC) Community Standard, Version 1.1.0[S/OL]. OGC 25-004, 2025[2026-08-15]. https://www.ogc.org/standards/stac/.</w:t>
+        <w:t>[14] UIEDA L, SOLER S R, RAMPIN R, et al. Pooch: A friend to fetch your data files[J]. Journal of Open Source Software, 2020, 5(45): 1943. DOI: 10.21105/joss.01943.</w:t>
       </w:r>
     </w:p>
     <w:p>
@@ -7422,7 +7777,7 @@
         <w:rPr>
           <w:rFonts w:ascii="Times New Roman" w:hAnsi="Times New Roman" w:eastAsia="宋体"/>
         </w:rPr>
-        <w:t>[15] BARKER M, CHUE HONG N P, KATZ D S, et al. Introducing the FAIR Principles for research software[J]. Scientific Data, 2022, 9: 622. DOI: 10.1038/s41597-022-01710-x.</w:t>
+        <w:t>[15] OPEN GEOSPATIAL CONSORTIUM. SpatioTemporal Asset Catalog (STAC) Community Standard, Version 1.1.0[S/OL]. OGC 25-004, 2025[2026-08-15]. https://www.ogc.org/standards/stac/.</w:t>
       </w:r>
     </w:p>
     <w:p>
@@ -7430,7 +7785,15 @@
         <w:rPr>
           <w:rFonts w:ascii="Times New Roman" w:hAnsi="Times New Roman" w:eastAsia="宋体"/>
         </w:rPr>
-        <w:t>[16] LIN D, CRABTREE J, DILLO I, et al. The TRUST Principles for digital repositories[J]. Scientific Data, 2020, 7: 144. DOI: 10.1038/s41597-020-0486-7.</w:t>
+        <w:t>[16] BARKER M, CHUE HONG N P, KATZ D S, et al. Introducing the FAIR Principles for research software[J]. Scientific Data, 2022, 9: 622. DOI: 10.1038/s41597-022-01710-x.</w:t>
+      </w:r>
+    </w:p>
+    <w:p>
+      <w:r>
+        <w:rPr>
+          <w:rFonts w:ascii="Times New Roman" w:hAnsi="Times New Roman" w:eastAsia="宋体"/>
+        </w:rPr>
+        <w:t>[17] LIN D, CRABTREE J, DILLO I, et al. The TRUST Principles for digital repositories[J]. Scientific Data, 2020, 7: 144. DOI: 10.1038/s41597-020-0486-7.</w:t>
       </w:r>
     </w:p>
     <w:sectPr>

</xml_diff>

<commit_message>
docs: focus result table on completed outcomes
</commit_message>
<xml_diff>
--- a/论文/GriddingMachine论文初稿_导师审阅版.docx
+++ b/论文/GriddingMachine论文初稿_导师审阅版.docx
@@ -6134,15 +6134,14 @@
         <w:tblLook w:firstColumn="1" w:firstRow="1" w:lastColumn="0" w:lastRow="0" w:noHBand="0" w:noVBand="1" w:val="04A0"/>
       </w:tblPr>
       <w:tblGrid>
-        <w:gridCol w:w="2295"/>
-        <w:gridCol w:w="2295"/>
-        <w:gridCol w:w="2295"/>
-        <w:gridCol w:w="2295"/>
+        <w:gridCol w:w="3060"/>
+        <w:gridCol w:w="3060"/>
+        <w:gridCol w:w="3060"/>
       </w:tblGrid>
       <w:tr>
         <w:tc>
           <w:tcPr>
-            <w:tcW w:type="dxa" w:w="2295"/>
+            <w:tcW w:type="dxa" w:w="3060"/>
             <w:shd w:fill="D9EAF7"/>
           </w:tcPr>
           <w:p>
@@ -6164,7 +6163,7 @@
         </w:tc>
         <w:tc>
           <w:tcPr>
-            <w:tcW w:type="dxa" w:w="2295"/>
+            <w:tcW w:type="dxa" w:w="3060"/>
             <w:shd w:fill="D9EAF7"/>
           </w:tcPr>
           <w:p>
@@ -6180,13 +6179,13 @@
                 <w:b/>
                 <w:sz w:val="18"/>
               </w:rPr>
-              <w:t>主要改进</w:t>
+              <w:t>核心机制</w:t>
             </w:r>
           </w:p>
         </w:tc>
         <w:tc>
           <w:tcPr>
-            <w:tcW w:type="dxa" w:w="2295"/>
+            <w:tcW w:type="dxa" w:w="3060"/>
             <w:shd w:fill="D9EAF7"/>
           </w:tcPr>
           <w:p>
@@ -6202,29 +6201,7 @@
                 <w:b/>
                 <w:sz w:val="18"/>
               </w:rPr>
-              <w:t>应用表现</w:t>
-            </w:r>
-          </w:p>
-        </w:tc>
-        <w:tc>
-          <w:tcPr>
-            <w:tcW w:type="dxa" w:w="2295"/>
-            <w:shd w:fill="D9EAF7"/>
-          </w:tcPr>
-          <w:p>
-            <w:r>
-              <w:rPr>
-                <w:b/>
-                <w:sz w:val="18"/>
-              </w:rPr>
-            </w:r>
-            <w:r>
-              <w:rPr>
-                <w:rFonts w:ascii="Times New Roman" w:hAnsi="Times New Roman" w:eastAsia="宋体"/>
-                <w:b/>
-                <w:sz w:val="18"/>
-              </w:rPr>
-              <w:t>扩展方向</w:t>
+              <w:t>应用成果</w:t>
             </w:r>
           </w:p>
         </w:tc>
@@ -6232,7 +6209,7 @@
       <w:tr>
         <w:tc>
           <w:tcPr>
-            <w:tcW w:type="dxa" w:w="2295"/>
+            <w:tcW w:type="dxa" w:w="3060"/>
           </w:tcPr>
           <w:p>
             <w:r>
@@ -6251,7 +6228,7 @@
         </w:tc>
         <w:tc>
           <w:tcPr>
-            <w:tcW w:type="dxa" w:w="2295"/>
+            <w:tcW w:type="dxa" w:w="3060"/>
           </w:tcPr>
           <w:p>
             <w:r>
@@ -6270,7 +6247,7 @@
         </w:tc>
         <w:tc>
           <w:tcPr>
-            <w:tcW w:type="dxa" w:w="2295"/>
+            <w:tcW w:type="dxa" w:w="3060"/>
           </w:tcPr>
           <w:p>
             <w:r>
@@ -6283,26 +6260,7 @@
                 <w:rFonts w:ascii="Times New Roman" w:hAnsi="Times New Roman" w:eastAsia="宋体"/>
                 <w:sz w:val="18"/>
               </w:rPr>
-              <w:t>OISST真实源数据与独立参考逐点一致；二维/三维产品稳定生成</w:t>
-            </w:r>
-          </w:p>
-        </w:tc>
-        <w:tc>
-          <w:tcPr>
-            <w:tcW w:type="dxa" w:w="2295"/>
-          </w:tcPr>
-          <w:p>
-            <w:r>
-              <w:rPr>
-                <w:sz w:val="18"/>
-              </w:rPr>
-            </w:r>
-            <w:r>
-              <w:rPr>
-                <w:rFonts w:ascii="Times New Roman" w:hAnsi="Times New Roman" w:eastAsia="宋体"/>
-                <w:sz w:val="18"/>
-              </w:rPr>
-              <w:t>扩展多时段真实产品</w:t>
+              <w:t>OISST真实源数据与独立参考逐点一致，二维和三维产品实现稳定生成</w:t>
             </w:r>
           </w:p>
         </w:tc>
@@ -6310,7 +6268,7 @@
       <w:tr>
         <w:tc>
           <w:tcPr>
-            <w:tcW w:type="dxa" w:w="2295"/>
+            <w:tcW w:type="dxa" w:w="3060"/>
           </w:tcPr>
           <w:p>
             <w:r>
@@ -6329,7 +6287,7 @@
         </w:tc>
         <w:tc>
           <w:tcPr>
-            <w:tcW w:type="dxa" w:w="2295"/>
+            <w:tcW w:type="dxa" w:w="3060"/>
           </w:tcPr>
           <w:p>
             <w:r>
@@ -6342,20 +6300,13 @@
                 <w:rFonts w:ascii="Times New Roman" w:hAnsi="Times New Roman" w:eastAsia="宋体"/>
                 <w:sz w:val="18"/>
               </w:rPr>
-              <w:t>直接NetCDF替代外层</w:t>
-            </w:r>
-            <w:r>
-              <w:rPr>
-                <w:rFonts w:ascii="Consolas" w:hAnsi="Consolas" w:eastAsia="等线"/>
-                <w:sz w:val="18"/>
-              </w:rPr>
-              <w:t>tar.gz</w:t>
+              <w:t>直接NetCDF分发</w:t>
             </w:r>
           </w:p>
         </w:tc>
         <w:tc>
           <w:tcPr>
-            <w:tcW w:type="dxa" w:w="2295"/>
+            <w:tcW w:type="dxa" w:w="3060"/>
           </w:tcPr>
           <w:p>
             <w:r>
@@ -6368,26 +6319,7 @@
                 <w:rFonts w:ascii="Times New Roman" w:hAnsi="Times New Roman" w:eastAsia="宋体"/>
                 <w:sz w:val="18"/>
               </w:rPr>
-              <w:t>暖缓存端到端中位时间降低48.3%～82.9%和53.6%～69.2%</w:t>
-            </w:r>
-          </w:p>
-        </w:tc>
-        <w:tc>
-          <w:tcPr>
-            <w:tcW w:type="dxa" w:w="2295"/>
-          </w:tcPr>
-          <w:p>
-            <w:r>
-              <w:rPr>
-                <w:sz w:val="18"/>
-              </w:rPr>
-            </w:r>
-            <w:r>
-              <w:rPr>
-                <w:rFonts w:ascii="Times New Roman" w:hAnsi="Times New Roman" w:eastAsia="宋体"/>
-                <w:sz w:val="18"/>
-              </w:rPr>
-              <w:t>扩展更多产品规模</w:t>
+              <w:t>暖缓存端到端中位时间在两个操作系统环境中分别降低48.3%～82.9%和53.6%～69.2%</w:t>
             </w:r>
           </w:p>
         </w:tc>
@@ -6395,7 +6327,7 @@
       <w:tr>
         <w:tc>
           <w:tcPr>
-            <w:tcW w:type="dxa" w:w="2295"/>
+            <w:tcW w:type="dxa" w:w="3060"/>
           </w:tcPr>
           <w:p>
             <w:r>
@@ -6414,7 +6346,7 @@
         </w:tc>
         <w:tc>
           <w:tcPr>
-            <w:tcW w:type="dxa" w:w="2295"/>
+            <w:tcW w:type="dxa" w:w="3060"/>
           </w:tcPr>
           <w:p>
             <w:r>
@@ -6433,7 +6365,7 @@
         </w:tc>
         <w:tc>
           <w:tcPr>
-            <w:tcW w:type="dxa" w:w="2295"/>
+            <w:tcW w:type="dxa" w:w="3060"/>
           </w:tcPr>
           <w:p>
             <w:r>
@@ -6446,26 +6378,7 @@
                 <w:rFonts w:ascii="Times New Roman" w:hAnsi="Times New Roman" w:eastAsia="宋体"/>
                 <w:sz w:val="18"/>
               </w:rPr>
-              <w:t>校园网FTP与Zenodo共24次下载内容一致</w:t>
-            </w:r>
-          </w:p>
-        </w:tc>
-        <w:tc>
-          <w:tcPr>
-            <w:tcW w:type="dxa" w:w="2295"/>
-          </w:tcPr>
-          <w:p>
-            <w:r>
-              <w:rPr>
-                <w:sz w:val="18"/>
-              </w:rPr>
-            </w:r>
-            <w:r>
-              <w:rPr>
-                <w:rFonts w:ascii="Times New Roman" w:hAnsi="Times New Roman" w:eastAsia="宋体"/>
-                <w:sz w:val="18"/>
-              </w:rPr>
-              <w:t>建立长期镜像运行统计</w:t>
+              <w:t>校园网FTP与Zenodo完成24次同文件下载，内容摘要与目录登记值一致</w:t>
             </w:r>
           </w:p>
         </w:tc>
@@ -6473,7 +6386,7 @@
       <w:tr>
         <w:tc>
           <w:tcPr>
-            <w:tcW w:type="dxa" w:w="2295"/>
+            <w:tcW w:type="dxa" w:w="3060"/>
           </w:tcPr>
           <w:p>
             <w:r>
@@ -6492,7 +6405,7 @@
         </w:tc>
         <w:tc>
           <w:tcPr>
-            <w:tcW w:type="dxa" w:w="2295"/>
+            <w:tcW w:type="dxa" w:w="3060"/>
           </w:tcPr>
           <w:p>
             <w:r>
@@ -6539,7 +6452,7 @@
         </w:tc>
         <w:tc>
           <w:tcPr>
-            <w:tcW w:type="dxa" w:w="2295"/>
+            <w:tcW w:type="dxa" w:w="3060"/>
           </w:tcPr>
           <w:p>
             <w:r>
@@ -6566,26 +6479,7 @@
                 <w:rFonts w:ascii="Times New Roman" w:hAnsi="Times New Roman" w:eastAsia="宋体"/>
                 <w:sz w:val="18"/>
               </w:rPr>
-              <w:t>产品生成US-NR1参数字典并进入Emerald</w:t>
-            </w:r>
-          </w:p>
-        </w:tc>
-        <w:tc>
-          <w:tcPr>
-            <w:tcW w:type="dxa" w:w="2295"/>
-          </w:tcPr>
-          <w:p>
-            <w:r>
-              <w:rPr>
-                <w:sz w:val="18"/>
-              </w:rPr>
-            </w:r>
-            <w:r>
-              <w:rPr>
-                <w:rFonts w:ascii="Times New Roman" w:hAnsi="Times New Roman" w:eastAsia="宋体"/>
-                <w:sz w:val="18"/>
-              </w:rPr>
-              <w:t>接入ERA5气象驱动与长期模拟</w:t>
+              <w:t>产品生成US-NR1参数字典并进入Emerald模型流程</w:t>
             </w:r>
           </w:p>
         </w:tc>
@@ -6593,7 +6487,7 @@
       <w:tr>
         <w:tc>
           <w:tcPr>
-            <w:tcW w:type="dxa" w:w="2295"/>
+            <w:tcW w:type="dxa" w:w="3060"/>
           </w:tcPr>
           <w:p>
             <w:r>
@@ -6612,7 +6506,7 @@
         </w:tc>
         <w:tc>
           <w:tcPr>
-            <w:tcW w:type="dxa" w:w="2295"/>
+            <w:tcW w:type="dxa" w:w="3060"/>
           </w:tcPr>
           <w:p>
             <w:r>
@@ -6631,7 +6525,7 @@
         </w:tc>
         <w:tc>
           <w:tcPr>
-            <w:tcW w:type="dxa" w:w="2295"/>
+            <w:tcW w:type="dxa" w:w="3060"/>
           </w:tcPr>
           <w:p>
             <w:r>
@@ -6644,26 +6538,7 @@
                 <w:rFonts w:ascii="Times New Roman" w:hAnsi="Times New Roman" w:eastAsia="宋体"/>
                 <w:sz w:val="18"/>
               </w:rPr>
-              <w:t>各操作系统环境保持一致的软件路径与数据接口</w:t>
-            </w:r>
-          </w:p>
-        </w:tc>
-        <w:tc>
-          <w:tcPr>
-            <w:tcW w:type="dxa" w:w="2295"/>
-          </w:tcPr>
-          <w:p>
-            <w:r>
-              <w:rPr>
-                <w:sz w:val="18"/>
-              </w:rPr>
-            </w:r>
-            <w:r>
-              <w:rPr>
-                <w:rFonts w:ascii="Times New Roman" w:hAnsi="Times New Roman" w:eastAsia="宋体"/>
-                <w:sz w:val="18"/>
-              </w:rPr>
-              <w:t>扩展真实案例自动化运行</w:t>
+              <w:t>多个操作系统环境保持一致的软件路径、数据结构与模型接口</w:t>
             </w:r>
           </w:p>
         </w:tc>

</xml_diff>

<commit_message>
docs: refine manuscript for journal review
</commit_message>
<xml_diff>
--- a/论文/GriddingMachine论文初稿_导师审阅版.docx
+++ b/论文/GriddingMachine论文初稿_导师审阅版.docx
@@ -82,7 +82,7 @@
         <w:rPr>
           <w:rFonts w:ascii="Times New Roman" w:hAnsi="Times New Roman" w:eastAsia="宋体"/>
         </w:rPr>
-        <w:t>多源全球网格数据在维度结构、坐标方向、数值缩放、缺失值处理和分发位置等方面具有显著差异，对地球系统模型输入的标准化生产与稳定获取提出了统一化需求。本文在2022版GriddingMachine基础上完成框架更新，形成贯通数据生产、质量控制、多镜像分发、统一读取和模型调用的数据生命周期。新版以共享模式（schema）和YAML配置驱动源维度映射、坐标转换、数值变换与Gapfill，采用独立目录管理逻辑路径、镜像地址及完整性元数据，通过直接NetCDF和事务式缓存实现可信获取，并以</w:t>
+        <w:t>多源全球网格数据在维度结构、坐标方向、数值缩放、缺失值处理和分发位置等方面具有显著差异，对地球系统模型输入的标准化生产与稳定获取提出了统一化需求。本文在2022版GriddingMachine基础上更新数据生产与分发框架，构建贯通质量控制、多镜像分发、统一读取和模型调用的数据生命周期。新版以共享配置模式（schema）和YAML驱动源维度映射、坐标转换、数值变换与缺失值填补（Gapfill），采用独立目录管理逻辑路径、镜像地址及完整性元数据，通过直接NetCDF和事务式缓存实现可信获取，并以</w:t>
       </w:r>
       <w:r>
         <w:rPr>
@@ -118,7 +118,7 @@
         <w:rPr>
           <w:rFonts w:ascii="Times New Roman" w:hAnsi="Times New Roman" w:eastAsia="宋体"/>
         </w:rPr>
-        <w:t>提供模型就绪数据。NOAA OISST V2.1真实产品由</w:t>
+        <w:t>提供模型就绪数据。NOAA OISST V2.1产品由</w:t>
       </w:r>
       <w:r>
         <w:rPr>
@@ -130,7 +130,19 @@
         <w:rPr>
           <w:rFonts w:ascii="Times New Roman" w:hAnsi="Times New Roman" w:eastAsia="宋体"/>
         </w:rPr>
-        <w:t>四维源结构转换为1440×720标准网格，691 150个有效格点及345 650个缺失格点与独立参考逐点一致；直接NetCDF使两个内部压缩产品的暖缓存端到端中位时间降低48.3%～82.9%和53.6%～69.2%；校园网内4个代表性产品经FTP和Zenodo完成24次内容一致的真实下载；14类真实陆面产品成功生成US-NR1参数字典并进入Emerald模型初始化。新版GriddingMachine由此形成面向全球规则网格数据的可配置生产、可信分发和模型就绪应用框架，为地球系统数据产品的持续维护与复用提供轻量化基础设施。</w:t>
+        <w:t>四维源结构转换为1440×720标准网格，691 150个有效格点及345 650个缺失格点与独立参考逐点一致；在两个操作系统环境中，两个内部压缩产品采用直接NetCDF后，缓存预热的端到端中位时间分别较外层</w:t>
+      </w:r>
+      <w:r>
+        <w:rPr>
+          <w:rFonts w:ascii="Consolas" w:hAnsi="Consolas" w:eastAsia="等线"/>
+        </w:rPr>
+        <w:t>tar.gz</w:t>
+      </w:r>
+      <w:r>
+        <w:rPr>
+          <w:rFonts w:ascii="Times New Roman" w:hAnsi="Times New Roman" w:eastAsia="宋体"/>
+        </w:rPr>
+        <w:t>归档降低48.3%～82.9%和53.6%～69.2%；校园网内4个代表性产品经FTP和Zenodo完成24次下载，文件大小与SHA-256均与目录登记值一致；14类陆面产品生成US-NR1参数字典并进入Emerald模型初始化。新版GriddingMachine由此形成面向全球规则网格数据的可配置生产、可信分发和模型就绪应用框架，为地球系统数据产品的持续维护与复用提供轻量化基础设施。</w:t>
       </w:r>
     </w:p>
     <w:p>
@@ -218,7 +230,7 @@
         <w:rPr>
           <w:rFonts w:ascii="Times New Roman" w:hAnsi="Times New Roman" w:eastAsia="宋体"/>
         </w:rPr>
-        <w:t xml:space="preserve">Multi-source global gridded data differ substantially in dimensional structure, coordinate orientation, numerical scaling, missing-value treatment, and distribution location, creating a demand for standardized production and reliable access to Earth system model inputs. Building on the 2022 release, this study advances GriddingMachine into an integrated lifecycle for data production, quality control, multi-mirror distribution, unified reading, and model use. A shared schema and YAML configuration drive source-dimension mapping, coordinate and numerical transformations, and gap filling; an independent catalog manages logical paths, mirrors, and integrity metadata; direct NetCDF and transactional caching support trustworthy acquisition; and </w:t>
+        <w:t xml:space="preserve">Multi-source global gridded data differ substantially in dimensional structure, coordinate orientation, numerical scaling, missing-value treatment, and distribution location, creating a demand for standardized production and reliable access to Earth system model inputs. Building on the 2022 release, this study updates GriddingMachine as an integrated lifecycle framework for data production, quality control, multi-mirror distribution, unified reading, and model use. A shared schema and YAML configuration drive source-dimension mapping, coordinate and numerical transformations, and gap filling; an independent catalog manages logical paths, mirrors, and integrity metadata; direct NetCDF and transactional caching support verified acquisition; and </w:t>
       </w:r>
       <w:r>
         <w:rPr>
@@ -254,7 +266,7 @@
         <w:rPr>
           <w:rFonts w:ascii="Times New Roman" w:hAnsi="Times New Roman" w:eastAsia="宋体"/>
         </w:rPr>
-        <w:t xml:space="preserve"> provide model-ready access. A real NOAA OISST V2.1 product was transformed from a four-dimensional </w:t>
+        <w:t xml:space="preserve"> provide model-ready access. A NOAA OISST V2.1 product was transformed from a four-dimensional </w:t>
       </w:r>
       <w:r>
         <w:rPr>
@@ -266,7 +278,19 @@
         <w:rPr>
           <w:rFonts w:ascii="Times New Roman" w:hAnsi="Times New Roman" w:eastAsia="宋体"/>
         </w:rPr>
-        <w:t xml:space="preserve"> source structure to a standardized 1440 × 720 grid, with 691,150 finite and 345,650 missing grid cells matching an independently decoded reference point by point. Direct NetCDF reduced median warm-cache end-to-end time by 48.3%–82.9% and 53.6%–69.2% for two internally compressed products. Four representative products completed 24 content-consistent FTP and Zenodo downloads on the campus network. Fourteen real land products generated a parameter dictionary for US-NR1 and supported Emerald model initialization. The updated GriddingMachine therefore provides a lightweight infrastructure for configurable production, trustworthy distribution, and model-ready use of global regular-grid data.</w:t>
+        <w:t xml:space="preserve"> source structure to a standardized 1440 × 720 grid, with 691,150 finite and 345,650 missing grid cells matching an independently decoded reference point by point. Compared with external </w:t>
+      </w:r>
+      <w:r>
+        <w:rPr>
+          <w:rFonts w:ascii="Consolas" w:hAnsi="Consolas" w:eastAsia="等线"/>
+        </w:rPr>
+        <w:t>tar.gz</w:t>
+      </w:r>
+      <w:r>
+        <w:rPr>
+          <w:rFonts w:ascii="Times New Roman" w:hAnsi="Times New Roman" w:eastAsia="宋体"/>
+        </w:rPr>
+        <w:t xml:space="preserve"> archives, direct NetCDF reduced the median warm-cache end-to-end time for two internally compressed products by 48.3%–82.9% and 53.6%–69.2% in two operating-system environments, respectively. Four representative products underwent 24 FTP and Zenodo downloads on the campus network, with file sizes and SHA-256 digests matching their catalog records. Fourteen land products generated a parameter dictionary for US-NR1 and entered Emerald model initialization. The updated GriddingMachine provides a lightweight infrastructure for configurable production, integrity-aware distribution, and model-ready use of global regular-grid data.</w:t>
       </w:r>
     </w:p>
     <w:p>
@@ -356,7 +380,7 @@
         <w:rPr>
           <w:rFonts w:ascii="Times New Roman" w:hAnsi="Times New Roman" w:eastAsia="宋体"/>
         </w:rPr>
-        <w:t>针对上述问题，本研究围绕2022版的实际使用需求更新GriddingMachine，并将创新重点置于可执行的数据生命周期契约。在数据生产端，配置模板与</w:t>
+        <w:t>针对上述需求，本研究围绕全球网格数据从生产到模型应用的生命周期更新GriddingMachine，并将创新重点置于可执行的数据契约与跨环节衔接。在生产端，配置模板与</w:t>
       </w:r>
       <w:r>
         <w:rPr>
@@ -368,7 +392,7 @@
         <w:rPr>
           <w:rFonts w:ascii="Times New Roman" w:hAnsi="Times New Roman" w:eastAsia="宋体"/>
         </w:rPr>
-        <w:t>辅助贡献者生成YAML，通用流水线依据配置完成源维度映射、坐标和数值处理、质量检查及标准NetCDF输出；在分发端，以可直接读取的NetCDF替代二次压缩制品，通过独立目录登记机构FTP、Zenodo及其他社区镜像，并对已登记</w:t>
+        <w:t>生成YAML，通用流水线依据配置完成源维度映射、坐标和数值处理、质量检查及标准NetCDF输出；在分发端，以可直接读取的NetCDF替代二次压缩制品，通过独立目录登记机构FTP、Zenodo及其他社区镜像，并依据</w:t>
       </w:r>
       <w:r>
         <w:rPr>
@@ -380,7 +404,7 @@
         <w:rPr>
           <w:rFonts w:ascii="Times New Roman" w:hAnsi="Times New Roman" w:eastAsia="宋体"/>
         </w:rPr>
-        <w:t>的条目在cache下载后执行严格完整性核验；在数据使用端，以</w:t>
+        <w:t>核验下载内容；在应用端，以</w:t>
       </w:r>
       <w:r>
         <w:rPr>
@@ -416,15 +440,7 @@
         <w:rPr>
           <w:rFonts w:ascii="Times New Roman" w:hAnsi="Times New Roman" w:eastAsia="宋体"/>
         </w:rPr>
-        <w:t>组织Emerald初始化数据。本文以Julia主路径系统呈现新版目录、下载状态机和模型接口的协同更新。</w:t>
-      </w:r>
-    </w:p>
-    <w:p>
-      <w:r>
-        <w:rPr>
-          <w:rFonts w:ascii="Times New Roman" w:hAnsi="Times New Roman" w:eastAsia="宋体"/>
-        </w:rPr>
-        <w:t>围绕全球网格数据从生产到模型应用的完整生命周期，本文构建共享YAML生产契约、独立数据目录、直接NetCDF分发、多镜像事务获取和模型就绪接口，并以标准产品生产、真实镜像访问和真实陆面数据应用展示新版框架的完整工作流。该更新将数据维护逻辑由分散脚本提升为可配置基础设施，使研究人员能够通过统一标签获得具有明确来源、处理记录和完整性信息的模型输入。</w:t>
+        <w:t>组织Emerald模型输入。本文以标准产品生产、多镜像访问和陆面数据应用呈现共享YAML契约、独立目录、事务式获取与模型就绪接口的协同作用，使研究人员能够通过统一标签获得具有明确来源、处理记录和完整性信息的模型输入。</w:t>
       </w:r>
     </w:p>
     <w:p>
@@ -709,7 +725,7 @@
         <w:rPr>
           <w:rFonts w:ascii="Times New Roman" w:hAnsi="Times New Roman" w:eastAsia="宋体"/>
         </w:rPr>
-        <w:t>显式设置本地根目录与目录来源。目录下载经临时文件完成schema校验和事务式替换，并保留上一有效版本。</w:t>
+        <w:t>显式设置数据根目录与目录来源。目录下载经临时文件完成schema校验和事务式替换，并保留上一有效版本。</w:t>
       </w:r>
       <w:r>
         <w:rPr>
@@ -721,7 +737,7 @@
         <w:rPr>
           <w:rFonts w:ascii="Times New Roman" w:hAnsi="Times New Roman" w:eastAsia="宋体"/>
         </w:rPr>
-        <w:t>提取各URL的主机名，以可获得的平均往返延迟辅助确定候选顺序，同时完整保留全部镜像并依次回退。每次调用创建独立</w:t>
+        <w:t>提取各URL的主机名，以可获得的平均往返延迟辅助确定候选顺序，同时保留全部镜像并依次回退。每次调用创建独立</w:t>
       </w:r>
       <w:r>
         <w:rPr>
@@ -805,7 +821,7 @@
         <w:rPr>
           <w:rFonts w:ascii="Times New Roman" w:hAnsi="Times New Roman" w:eastAsia="宋体"/>
         </w:rPr>
-        <w:t>进一步组织Emerald所需参数和气象驱动。14类真实</w:t>
+        <w:t>进一步组织Emerald所需参数和气象驱动。14类</w:t>
       </w:r>
       <w:r>
         <w:rPr>
@@ -817,19 +833,7 @@
         <w:rPr>
           <w:rFonts w:ascii="Times New Roman" w:hAnsi="Times New Roman" w:eastAsia="宋体"/>
         </w:rPr>
-        <w:t>产品已经贯通陆面参数链路并进入Emerald初始化，2020年ERA5序列将继续拓展真实</w:t>
-      </w:r>
-      <w:r>
-        <w:rPr>
-          <w:rFonts w:ascii="Consolas" w:hAnsi="Consolas" w:eastAsia="等线"/>
-        </w:rPr>
-        <w:t>wd1</w:t>
-      </w:r>
-      <w:r>
-        <w:rPr>
-          <w:rFonts w:ascii="Times New Roman" w:hAnsi="Times New Roman" w:eastAsia="宋体"/>
-        </w:rPr>
-        <w:t>气象驱动应用。</w:t>
+        <w:t>产品贯通陆面参数链路并进入Emerald初始化。</w:t>
       </w:r>
     </w:p>
     <w:p>
@@ -1122,7 +1126,7 @@
                 <w:rFonts w:ascii="Times New Roman" w:hAnsi="Times New Roman" w:eastAsia="宋体"/>
                 <w:sz w:val="18"/>
               </w:rPr>
-              <w:t>外置</w:t>
+              <w:t>独立</w:t>
             </w:r>
             <w:r>
               <w:rPr>
@@ -1424,7 +1428,7 @@
                 <w:rFonts w:ascii="Times New Roman" w:hAnsi="Times New Roman" w:eastAsia="宋体"/>
                 <w:sz w:val="18"/>
               </w:rPr>
-              <w:t>真实陆面产品与Emerald模型接口顺利贯通</w:t>
+              <w:t>陆面产品进入Emerald参数组织与模型初始化</w:t>
             </w:r>
           </w:p>
         </w:tc>
@@ -1517,13 +1521,13 @@
           <w:rFonts w:ascii="Times New Roman" w:hAnsi="Times New Roman" w:eastAsia="宋体"/>
           <w:b/>
         </w:rPr>
-        <w:t>Table 1 Comparison between the 2022 release and the current manuscript version of GriddingMachine.</w:t>
-      </w:r>
-      <w:r>
-        <w:rPr>
-          <w:rFonts w:ascii="Times New Roman" w:hAnsi="Times New Roman" w:eastAsia="宋体"/>
-        </w:rPr>
-        <w:t xml:space="preserve"> The table summarizes implemented capabilities, workflow improvements, and validation progress. A field-level comparison is provided in the supplementary manuscript materials.</w:t>
+        <w:t>Table 1 Comparison between the 2022 release and the updated GriddingMachine.</w:t>
+      </w:r>
+      <w:r>
+        <w:rPr>
+          <w:rFonts w:ascii="Times New Roman" w:hAnsi="Times New Roman" w:eastAsia="宋体"/>
+        </w:rPr>
+        <w:t xml:space="preserve"> The table summarizes the implemented mechanisms, workflow advances, and application value across the data lifecycle.</w:t>
       </w:r>
     </w:p>
     <w:p>
@@ -1553,7 +1557,7 @@
         <w:rPr>
           <w:rFonts w:ascii="Times New Roman" w:hAnsi="Times New Roman" w:eastAsia="宋体"/>
         </w:rPr>
-        <w:t xml:space="preserve">GriddingMachine 以 NetCDF 作为标准数据格式，原因是该格式能够在同一文件中保存多维数组、坐标和自描述元数据，并被多种地球科学软件读取。2022 年版本已经规定数据采用二维或三维规则经纬网，前两维依次为经度和纬度，可选第三维表示周期；经度自西向东、纬度自南向北，数据不保留未说明的缩放，缺失值在读取后统一表示为 </w:t>
+        <w:t xml:space="preserve">GriddingMachine 以 NetCDF 作为标准数据格式，原因是该格式能够在同一文件中保存多维数组、坐标和自描述元数据，并被多种地球科学软件读取。2022 年版本已经规定数据采用二维或三维规则经纬网，前两维依次为经度和纬度，可选第三维表示周期；经度自西向东、纬度自南向北，输出保存为实际物理值，缺失值在读取后统一表示为 </w:t>
       </w:r>
       <w:r>
         <w:rPr>
@@ -2826,7 +2830,7 @@
         <w:rPr>
           <w:rFonts w:ascii="Times New Roman" w:hAnsi="Times New Roman" w:eastAsia="宋体"/>
         </w:rPr>
-        <w:t>P01代表性贡献流程使用二维非对称参考数据呈现配置与处理操作的对应关系。源变量采用</w:t>
+        <w:t>数据贡献示例使用二维非对称参考数据呈现配置与处理操作的对应关系。源变量采用</w:t>
       </w:r>
       <w:r>
         <w:rPr>
@@ -2898,7 +2902,80 @@
         <w:rPr>
           <w:rFonts w:ascii="Times New Roman" w:hAnsi="Times New Roman" w:eastAsia="宋体"/>
         </w:rPr>
-        <w:t>，逐点结果与独立金标准一致。完整YAML、字段字典、命令和目录说明保存在贡献指南中，真实数据配置进一步记录来源、许可、引用和复杂时间坐标。</w:t>
+        <w:t>，逐点结果与独立参考数组一致。框1给出核心配置，完整字段字典、命令和目录说明保存在数据贡献指南中；产品配置还可记录来源、许可、引用和复杂时间坐标。</w:t>
+      </w:r>
+    </w:p>
+    <w:p>
+      <w:r>
+        <w:rPr>
+          <w:rFonts w:ascii="Times New Roman" w:hAnsi="Times New Roman" w:eastAsia="宋体"/>
+          <w:b/>
+        </w:rPr>
+        <w:t>框1 二维源数据标准化的YAML核心配置</w:t>
+      </w:r>
+    </w:p>
+    <w:p>
+      <w:pPr>
+        <w:spacing w:before="80" w:after="120" w:line="240" w:lineRule="auto"/>
+        <w:ind w:firstLine="0" w:left="312" w:right="312"/>
+        <w:shd w:fill="F2F5F7"/>
+      </w:pPr>
+      <w:r>
+        <w:rPr>
+          <w:rFonts w:ascii="Consolas" w:hAnsi="Consolas" w:eastAsia="等线"/>
+          <w:sz w:val="17"/>
+        </w:rPr>
+        <w:t>SCHEMA_VERSION: 1</w:t>
+        <w:br/>
+        <w:t>FILE:</w:t>
+        <w:br/>
+        <w:t xml:space="preserve">  PATTERN: "PREFIX_NX_X_MT_VV.nc"</w:t>
+        <w:br/>
+        <w:t xml:space="preserve">  PREFIX: ["SRC"]</w:t>
+        <w:br/>
+        <w:t xml:space="preserve">  NX: [2]</w:t>
+        <w:br/>
+        <w:t xml:space="preserve">  MT: ["1Y"]</w:t>
+        <w:br/>
+        <w:t xml:space="preserve">  VV: ["V1"]</w:t>
+        <w:br/>
+        <w:t>FOLDER:</w:t>
+        <w:br/>
+        <w:t xml:space="preserve">  ORIGINAL: "case-input"</w:t>
+        <w:br/>
+        <w:t xml:space="preserve">  REPROCESSED: "case-output"</w:t>
+        <w:br/>
+        <w:t>DATA:</w:t>
+        <w:br/>
+        <w:t xml:space="preserve">  ABOUT: "Two-dimensional contributor example"</w:t>
+        <w:br/>
+        <w:t xml:space="preserve">  CHANGE_LOGS: []</w:t>
+        <w:br/>
+        <w:t xml:space="preserve">  LABEL: ["source"]</w:t>
+        <w:br/>
+        <w:t xml:space="preserve">  UNIT: "1"</w:t>
+        <w:br/>
+        <w:t xml:space="preserve">  DIMENSIONS:</w:t>
+        <w:br/>
+        <w:t xml:space="preserve">    source: ["lat", "lon"]</w:t>
+        <w:br/>
+        <w:t xml:space="preserve">  REV_LAT: true</w:t>
+        <w:br/>
+        <w:t xml:space="preserve">  FLIP_LON: true</w:t>
+        <w:br/>
+        <w:t xml:space="preserve">  SCALING: "linear"</w:t>
+        <w:br/>
+        <w:t xml:space="preserve">  SCALING_FACTOR: [2, 1]</w:t>
+        <w:br/>
+        <w:t xml:space="preserve">  LIMITS: [23, 49]</w:t>
+        <w:br/>
+        <w:t xml:space="preserve">  GAPFILL: "KEEP_AS_IS"</w:t>
+        <w:br/>
+        <w:t xml:space="preserve">  VERIFY_ONCE: false</w:t>
+        <w:br/>
+        <w:t>GRIDDINGMACHINE:</w:t>
+        <w:br/>
+        <w:t xml:space="preserve">  TAG: "CONTRIB"</w:t>
       </w:r>
     </w:p>
     <w:p>
@@ -2997,7 +3074,7 @@
         <w:rPr>
           <w:rFonts w:ascii="Times New Roman" w:hAnsi="Times New Roman" w:eastAsia="宋体"/>
         </w:rPr>
-        <w:t>，字段信息在源数据读取前完成解析。框1和版本化指南共同提供面向贡献者的配置范式。</w:t>
+        <w:t>，字段信息在源数据读取前完成解析。框1和版本化指南共同构成面向贡献者的配置范式。</w:t>
       </w:r>
     </w:p>
     <w:p>
@@ -3088,7 +3165,7 @@
         <w:rPr>
           <w:rFonts w:ascii="Consolas" w:hAnsi="Consolas" w:eastAsia="等线"/>
         </w:rPr>
-        <w:t>0～360°</w:t>
+        <w:t>0°～360°</w:t>
       </w:r>
       <w:r>
         <w:rPr>
@@ -3100,7 +3177,7 @@
         <w:rPr>
           <w:rFonts w:ascii="Consolas" w:hAnsi="Consolas" w:eastAsia="等线"/>
         </w:rPr>
-        <w:t>-180～180°</w:t>
+        <w:t>−180°～180°</w:t>
       </w:r>
       <w:r>
         <w:rPr>
@@ -3162,7 +3239,7 @@
         <w:rPr>
           <w:rFonts w:ascii="Times New Roman" w:hAnsi="Times New Roman" w:eastAsia="宋体"/>
         </w:rPr>
-        <w:t>生成唯一文件名。重复调用可识别已有目标；内容感知机制将进一步结合配置哈希、软件版本和文件摘要管理产品重建。</w:t>
+        <w:t>生成唯一文件名。重复调用依据目标文件状态管理产品生成，完整YAML、配置摘要和软件版本共同记录处理上下文。</w:t>
       </w:r>
     </w:p>
     <w:p>
@@ -3260,7 +3337,7 @@
         <w:rPr>
           <w:rFonts w:ascii="Times New Roman" w:hAnsi="Times New Roman" w:eastAsia="宋体"/>
         </w:rPr>
-        <w:t>这一过程用于识别南北方向、东西方向和经度平移状态。V01/V02脚本分别提供方向正确与南北反转的非对称位置编码图，正向图与反向图均得到准确识别。人工空间判断与自动坐标、结构和逐点数值检查共同组成直观的方向质量控制体系。</w:t>
+        <w:t>这一过程用于识别南北方向、东西方向和经度平移状态。方向正确与南北反转的非对称位置编码图得到准确区分。人工空间判断与自动坐标、结构和逐点数值检查共同组成直观的方向质量控制体系。</w:t>
       </w:r>
     </w:p>
     <w:p>
@@ -3419,19 +3496,7 @@
         <w:rPr>
           <w:rFonts w:ascii="Times New Roman" w:hAnsi="Times New Roman" w:eastAsia="宋体"/>
         </w:rPr>
-        <w:t>陆地掩膜，逐层检查陆地区域。其他空间分辨率由专用规则承接。现有函数覆盖主变量、形状、范围和陆地掩膜，后续质量模块将进一步整合坐标单调性、</w:t>
-      </w:r>
-      <w:r>
-        <w:rPr>
-          <w:rFonts w:ascii="Consolas" w:hAnsi="Consolas" w:eastAsia="等线"/>
-        </w:rPr>
-        <w:t>std</w:t>
-      </w:r>
-      <w:r>
-        <w:rPr>
-          <w:rFonts w:ascii="Times New Roman" w:hAnsi="Times New Roman" w:eastAsia="宋体"/>
-        </w:rPr>
-        <w:t>、单位、引用信息和处理日志。</w:t>
+        <w:t>陆地掩膜，逐层检查陆地区域。其他空间分辨率由专用规则承接。结构、范围和陆地掩膜检查与生产阶段的坐标方向、变量属性和处理记录共同构成标准产品的质量信息。</w:t>
       </w:r>
     </w:p>
     <w:p>
@@ -3721,7 +3786,7 @@
         <w:rPr>
           <w:rFonts w:ascii="Times New Roman" w:hAnsi="Times New Roman" w:eastAsia="宋体"/>
         </w:rPr>
-        <w:t>P01贡献流程依据版本化指南贯通代表性数据集的配置生成、标准化、质量检查、发布、目录登记和下游读取。最终NetCDF与目录项保持一致，并形成包含固定输入路径和完整YAML示例的贡献模板。</w:t>
+        <w:t>数据贡献流程依据版本化指南贯通配置生成、标准化、质量检查、发布、目录登记和下游读取。最终NetCDF与目录项保持一致，并形成包含固定输入路径和完整YAML示例的贡献模板。</w:t>
       </w:r>
     </w:p>
     <w:p>
@@ -3732,7 +3797,7 @@
         <w:rPr>
           <w:rFonts w:ascii="Times New Roman" w:hAnsi="Times New Roman" w:eastAsia="宋体"/>
         </w:rPr>
-        <w:t>2.4 动态目录与多镜像分发</w:t>
+        <w:t>2.4 独立数据目录与多镜像分发</w:t>
       </w:r>
     </w:p>
     <w:p>
@@ -3930,7 +3995,7 @@
         <w:rPr>
           <w:rFonts w:ascii="Times New Roman" w:hAnsi="Times New Roman" w:eastAsia="宋体"/>
         </w:rPr>
-        <w:t>该机制实现目录与软件版本分离，并以事务替换和备份恢复保护有效目录。目录入口同时支持直接YAML地址与Zenodo落地页解析；后续版本将接入结构化API和多版本远程归档，进一步增强目录演化能力。</w:t>
+        <w:t>该机制实现目录与软件版本分离，并以事务替换和备份恢复保护有效目录。目录入口同时支持直接YAML地址与Zenodo落地页解析，适配独立发布与持续更新的数据目录。</w:t>
       </w:r>
     </w:p>
     <w:p>
@@ -3955,7 +4020,7 @@
         <w:rPr>
           <w:rFonts w:ascii="Times New Roman" w:hAnsi="Times New Roman" w:eastAsia="宋体"/>
         </w:rPr>
-        <w:t>接收数据标签；目录刷新、正式文件复用和远端获取由同一接口组织。下载阶段从每个FTP或HTTP(S) URL提取主机名，以可获得的平均往返延迟生成候选顺序；缺少延迟分数的地址按原有顺序保留，全部URL共同组成完整回退队列。</w:t>
+        <w:t>接收数据标签；目录刷新、正式文件复用和远端获取由同一接口组织。下载阶段从每个FTP或HTTP(S) URL提取主机名，以可获得的平均往返延迟生成候选顺序；其余地址按目录顺序保留，全部URL共同组成完整回退队列。</w:t>
       </w:r>
     </w:p>
     <w:p>
@@ -3975,7 +4040,7 @@
         <w:rPr>
           <w:rFonts w:ascii="Times New Roman" w:hAnsi="Times New Roman" w:eastAsia="宋体"/>
         </w:rPr>
-        <w:t>文件。程序核对文件生成状态、字节数和SHA-256；校验通过后以原子移动进入正式路径，异常内容则随本次临时文件清理并转向下一URL。</w:t>
+        <w:t>文件。程序核对文件生成状态、字节数和SHA-256；校验通过后以原子移动进入正式路径，各次尝试的临时内容随当前状态独立回收。</w:t>
       </w:r>
       <w:r>
         <w:rPr>
@@ -4058,7 +4123,7 @@
         <w:rPr>
           <w:rFonts w:ascii="Times New Roman" w:hAnsi="Times New Roman" w:eastAsia="宋体"/>
         </w:rPr>
-        <w:t>镜像状态分析覆盖候选顺序、字节数、SHA-256、缓存恢复和镜像遍历等分发环节。跨操作系统运行与校园网FTP—Zenodo实测共同呈现“事务安全—真实获取—内容一致”的分发链路。</w:t>
+        <w:t>镜像状态分析覆盖候选顺序、字节数、SHA-256、缓存恢复和镜像遍历等分发环节。跨操作系统运行与校园网FTP—Zenodo实测共同呈现“事务安全—镜像获取—内容一致”的分发链路。</w:t>
       </w:r>
     </w:p>
     <w:p>
@@ -4409,7 +4474,7 @@
         <w:rPr>
           <w:rFonts w:ascii="Times New Roman" w:hAnsi="Times New Roman" w:eastAsia="宋体"/>
         </w:rPr>
-        <w:t>标签完成模型就绪字段组织。确定性气象参考数据用于组织字段、形状和Emerald最小步进，真实</w:t>
+        <w:t>标签完成模型就绪字段组织。确定性气象参考数据用于核对字段、形状和Emerald最小步进，</w:t>
       </w:r>
       <w:r>
         <w:rPr>
@@ -4421,19 +4486,7 @@
         <w:rPr>
           <w:rFonts w:ascii="Times New Roman" w:hAnsi="Times New Roman" w:eastAsia="宋体"/>
         </w:rPr>
-        <w:t>文件贯通陆面参数链路。2020年ERA5序列将进一步扩展真实</w:t>
-      </w:r>
-      <w:r>
-        <w:rPr>
-          <w:rFonts w:ascii="Consolas" w:hAnsi="Consolas" w:eastAsia="等线"/>
-        </w:rPr>
-        <w:t>wd1</w:t>
-      </w:r>
-      <w:r>
-        <w:rPr>
-          <w:rFonts w:ascii="Times New Roman" w:hAnsi="Times New Roman" w:eastAsia="宋体"/>
-        </w:rPr>
-        <w:t>气象驱动应用。</w:t>
+        <w:t>文件则贯通陆面参数链路。</w:t>
       </w:r>
     </w:p>
     <w:p>
@@ -4452,7 +4505,7 @@
         <w:rPr>
           <w:rFonts w:ascii="Times New Roman" w:hAnsi="Times New Roman" w:eastAsia="宋体"/>
         </w:rPr>
-        <w:t>与2022版通过标签隐藏数据位置的思路一致[4]，新版继续支持以标签调用数据，并将目录更新、完整性校验和统一读取组织为清晰的公共接口。框2展示最小使用路径：设置本地数据根目录、更新目录、校验下载、读取US-NR1附近格点，并进一步生成2020年陆面参数字典。真实陆面案例采用同一公共接口完成数据获取与模型参数组织。</w:t>
+        <w:t>与2022版通过标签隐藏数据位置的思路一致[4]，新版继续支持以标签调用数据，并将目录更新、完整性校验和统一读取组织为清晰的公共接口。框2展示最小使用路径：设置数据根目录、更新目录、校验下载、读取US-NR1附近格点，并进一步生成2020年陆面参数字典。陆面案例采用同一公共接口完成数据获取与模型参数组织。</w:t>
       </w:r>
     </w:p>
     <w:p>
@@ -4866,7 +4919,7 @@
                 <w:rFonts w:ascii="Times New Roman" w:hAnsi="Times New Roman" w:eastAsia="宋体"/>
                 <w:sz w:val="18"/>
               </w:rPr>
-              <w:t>、非支持维度</w:t>
+              <w:t>和维度约束</w:t>
             </w:r>
           </w:p>
         </w:tc>
@@ -5036,7 +5089,7 @@
                 <w:rFonts w:ascii="Times New Roman" w:hAnsi="Times New Roman" w:eastAsia="宋体"/>
                 <w:sz w:val="18"/>
               </w:rPr>
-              <w:t>Float32、线性缩放、有效范围、有/无缩放</w:t>
+              <w:t>Float32、线性缩放、有效范围和原值处理</w:t>
             </w:r>
           </w:p>
         </w:tc>
@@ -5450,7 +5503,7 @@
         <w:rPr>
           <w:rFonts w:ascii="Times New Roman" w:hAnsi="Times New Roman" w:eastAsia="宋体"/>
         </w:rPr>
-        <w:t>标准产品生产流程在各操作系统环境中保持一致行为。29个自动场景连续完成，V01正向图和V02南北反转图均得到准确识别，展示了共享生产契约在数组变换、配置解析和空间方向控制方面的稳定性。</w:t>
+        <w:t>标准产品生产流程在各操作系统环境中保持一致行为。29个自动场景连续完成，正向图和南北反转图得到准确区分，体现了共享生产契约在数组变换、配置解析和空间方向控制方面的一致性。</w:t>
       </w:r>
     </w:p>
     <w:p>
@@ -5507,7 +5560,7 @@
         <w:rPr>
           <w:rFonts w:ascii="Times New Roman" w:hAnsi="Times New Roman" w:eastAsia="宋体"/>
         </w:rPr>
-        <w:t>P01代表性贡献案例依次完成配置生成、标准化、自动与人工质量检查、产品发布、</w:t>
+        <w:t>数据贡献案例依次完成配置生成、标准化、自动与人工质量检查、产品发布、</w:t>
       </w:r>
       <w:r>
         <w:rPr>
@@ -5530,7 +5583,7 @@
         <w:rPr>
           <w:rFonts w:ascii="Times New Roman" w:hAnsi="Times New Roman" w:eastAsia="宋体"/>
         </w:rPr>
-        <w:t>3.1.5 真实OISST产品生产</w:t>
+        <w:t>3.1.5 OISST产品生产</w:t>
       </w:r>
     </w:p>
     <w:p>
@@ -5538,7 +5591,7 @@
         <w:rPr>
           <w:rFonts w:ascii="Times New Roman" w:hAnsi="Times New Roman" w:eastAsia="宋体"/>
         </w:rPr>
-        <w:t>真实异构产品案例采用NOAA/NCEI 0.25°逐日最优插值海表温度OISST V2.1 AVHRR-only正式产品[9]，固定选取2022年2月25日文件。原始</w:t>
+        <w:t>异构海温产品案例采用NOAA/NCEI 0.25°逐日最优插值海表温度OISST V2.1中仅使用AVHRR数据的正式产品[9]，选取2022年2月25日文件。原始</w:t>
       </w:r>
       <w:r>
         <w:rPr>
@@ -5604,7 +5657,7 @@
         <w:rPr>
           <w:rFonts w:ascii="Consolas" w:hAnsi="Consolas" w:eastAsia="等线"/>
         </w:rPr>
-        <w:t>0～360°</w:t>
+        <w:t>0°～360°</w:t>
       </w:r>
       <w:r>
         <w:rPr>
@@ -5616,7 +5669,7 @@
         <w:rPr>
           <w:rFonts w:ascii="Consolas" w:hAnsi="Consolas" w:eastAsia="等线"/>
         </w:rPr>
-        <w:t>[-180°,180°)</w:t>
+        <w:t>[−180°, 180°)</w:t>
       </w:r>
       <w:r>
         <w:rPr>
@@ -5777,7 +5830,7 @@
         <w:rPr>
           <w:rFonts w:ascii="Times New Roman" w:hAnsi="Times New Roman" w:eastAsia="宋体"/>
         </w:rPr>
-        <w:t>性能分析基于回环HTTP服务，按随机顺序重复测量传输字节数、打包与解包时间、从请求开始到首次读取NetCDF值的端到端时间，以及下载文件与解包文件并存时的逻辑临时占用。两个独立环境使用一致的脚本和输入文件，时间指标以中位数、四分位距和95% bootstrap置信区间表示。</w:t>
+        <w:t>性能分析基于回环HTTP服务，按随机顺序重复测量传输字节数、打包与解包时间、从请求开始到首次读取NetCDF值的端到端时间，以及下载文件与解包文件并存时的逻辑临时占用。两个独立环境使用一致的脚本和输入文件，时间指标以中位数、四分位距和95% Bootstrap置信区间表示。</w:t>
       </w:r>
     </w:p>
     <w:p>
@@ -5918,7 +5971,7 @@
         <w:rPr>
           <w:rFonts w:ascii="Times New Roman" w:hAnsi="Times New Roman" w:eastAsia="宋体"/>
         </w:rPr>
-        <w:t>多镜像状态分析在两个独立环境中建立内容一致且状态可配置的HTTP端点，并通过延迟分数组织候选顺序，覆盖404、超时、连接重置、延迟探测状态、镜像遍历、缓存恢复、内容类型、哈希差异和传输完整性等场景。各场景重复5次，记录候选顺序、回退次数、最终状态以及cache/public文件的字节数和SHA-256变化。事务机制使目录摘要一致的文件进入正式路径，并在各类镜像状态下保持既有正式文件稳定。校园网FTP与Zenodo访问进一步呈现真实镜像的可达性和内容一致性。</w:t>
+        <w:t>多镜像状态分析在两个独立环境中建立内容一致且状态可配置的HTTP端点，并通过延迟分数组织候选顺序，覆盖404、超时、连接重置、延迟探测状态、镜像遍历、缓存恢复、内容类型、哈希差异和传输完整性等场景。各场景重复5次，记录候选顺序、回退次数、最终状态以及cache/public文件的字节数和SHA-256变化。事务机制使目录摘要一致的文件进入正式路径，并在各类镜像状态下保持既有正式文件稳定。校园网FTP与Zenodo访问进一步呈现机构镜像和公共镜像的可达性与内容一致性。</w:t>
       </w:r>
     </w:p>
     <w:p>
@@ -5929,7 +5982,7 @@
         <w:rPr>
           <w:rFonts w:ascii="Times New Roman" w:hAnsi="Times New Roman" w:eastAsia="宋体"/>
         </w:rPr>
-        <w:t>3.3.3 真实镜像访问</w:t>
+        <w:t>3.3.3 FTP与Zenodo镜像访问</w:t>
       </w:r>
     </w:p>
     <w:p>
@@ -5937,7 +5990,7 @@
         <w:rPr>
           <w:rFonts w:ascii="Times New Roman" w:hAnsi="Times New Roman" w:eastAsia="宋体"/>
         </w:rPr>
-        <w:t>真实镜像实验选取4个同时具有FTP和Zenodo地址且已登记</w:t>
+        <w:t>镜像访问实验选取4个同时具有FTP和Zenodo地址且已登记</w:t>
       </w:r>
       <w:r>
         <w:rPr>
@@ -6004,7 +6057,7 @@
         <w:rPr>
           <w:rFonts w:ascii="Times New Roman" w:hAnsi="Times New Roman" w:eastAsia="宋体"/>
         </w:rPr>
-        <w:t>与Emerald初始化。确定性参考数据用于组织字段名、形状、类型、时间索引和NaN处理；真实陆面案例采用2020年</w:t>
+        <w:t>与Emerald初始化。确定性参考数据用于核对字段名、形状、类型、时间索引和NaN处理；陆面案例采用2020年</w:t>
       </w:r>
       <w:r>
         <w:rPr>
@@ -6016,19 +6069,7 @@
         <w:rPr>
           <w:rFonts w:ascii="Times New Roman" w:hAnsi="Times New Roman" w:eastAsia="宋体"/>
         </w:rPr>
-        <w:t>产品，在US-NR1附近植被格点和典型非植被格点展示不同陆面状态下的模型入口。2020年</w:t>
-      </w:r>
-      <w:r>
-        <w:rPr>
-          <w:rFonts w:ascii="Consolas" w:hAnsi="Consolas" w:eastAsia="等线"/>
-        </w:rPr>
-        <w:t>wd1</w:t>
-      </w:r>
-      <w:r>
-        <w:rPr>
-          <w:rFonts w:ascii="Times New Roman" w:hAnsi="Times New Roman" w:eastAsia="宋体"/>
-        </w:rPr>
-        <w:t>的8类ERA5数据将进一步拓展真实气象驱动应用。</w:t>
+        <w:t>产品，在US-NR1附近植被格点和典型非植被格点呈现不同陆面状态下的模型入口。</w:t>
       </w:r>
     </w:p>
     <w:p>
@@ -6073,7 +6114,7 @@
         <w:rPr>
           <w:rFonts w:ascii="Times New Roman" w:hAnsi="Times New Roman" w:eastAsia="宋体"/>
         </w:rPr>
-        <w:t>跨操作系统运行覆盖Windows、macOS和Linux，采用本地运行与持续集成相结合的方式，贯通标准产品生产、真实ELEV/LAI分发、多镜像获取、Emerald最小模型流程和核心软件路径。统一的项目依赖和参考数据使数据结构、数值内容、正式文件状态与临时缓存行为保持一致。</w:t>
+        <w:t>跨操作系统运行覆盖Windows、macOS和Linux，采用本地运行与持续集成相结合的方式，贯通标准产品生产、ELEV/LAI分发、多镜像获取、Emerald最小模型流程和核心软件路径。统一的项目依赖和参考数据使数据结构、数值内容、正式文件状态与临时缓存行为保持一致。</w:t>
       </w:r>
     </w:p>
     <w:p>
@@ -6081,7 +6122,7 @@
         <w:rPr>
           <w:rFonts w:ascii="Times New Roman" w:hAnsi="Times New Roman" w:eastAsia="宋体"/>
         </w:rPr>
-        <w:t>持续集成使用确定性NetCDF参考数据维护代码路径、文件状态和内容完整性，本地环境进一步覆盖真实ELEV/LAI效率、真实镜像访问和真实</w:t>
+        <w:t>持续集成使用确定性NetCDF参考数据维护代码路径、文件状态和内容完整性，本地环境进一步覆盖ELEV/LAI效率、FTP—Zenodo镜像访问和</w:t>
       </w:r>
       <w:r>
         <w:rPr>
@@ -6093,7 +6134,7 @@
         <w:rPr>
           <w:rFonts w:ascii="Times New Roman" w:hAnsi="Times New Roman" w:eastAsia="宋体"/>
         </w:rPr>
-        <w:t>陆面案例，共同形成从自动维护到真实数据应用的分层运行体系。</w:t>
+        <w:t>陆面案例，共同形成从自动维护到数据应用的分层运行体系。</w:t>
       </w:r>
     </w:p>
     <w:p>
@@ -6112,7 +6153,7 @@
         <w:rPr>
           <w:rFonts w:ascii="Times New Roman" w:hAnsi="Times New Roman" w:eastAsia="宋体"/>
         </w:rPr>
-        <w:t>新版GriddingMachine实现了从源数据配置到标准产品生成、从多镜像发布到本地可信获取、再到模型参数组织的完整链路。共享生产契约提升异构数据处理的一致性，独立目录和直接NetCDF简化产品维护与访问，事务式缓存增强多镜像获取的稳定性，统一接口进一步将标准数据连接到Emerald模型。主要功能与应用表现汇总于表4。</w:t>
+        <w:t>新版GriddingMachine实现了从源数据配置到标准产品生成、从多镜像发布到可信获取、再到模型参数组织的完整链路。共享生产契约提升异构数据处理的一致性，独立目录和直接NetCDF简化产品维护与访问，事务式缓存增强多镜像获取的稳定性，统一接口进一步将标准数据连接到Emerald模型。主要功能与应用表现汇总于表4。</w:t>
       </w:r>
     </w:p>
     <w:p>
@@ -6260,7 +6301,7 @@
                 <w:rFonts w:ascii="Times New Roman" w:hAnsi="Times New Roman" w:eastAsia="宋体"/>
                 <w:sz w:val="18"/>
               </w:rPr>
-              <w:t>OISST真实源数据与独立参考逐点一致，二维和三维产品实现稳定生成</w:t>
+              <w:t>OISST源数据与独立参考逐点一致，二维和三维产品实现稳定生成</w:t>
             </w:r>
           </w:p>
         </w:tc>
@@ -6319,7 +6360,7 @@
                 <w:rFonts w:ascii="Times New Roman" w:hAnsi="Times New Roman" w:eastAsia="宋体"/>
                 <w:sz w:val="18"/>
               </w:rPr>
-              <w:t>暖缓存端到端中位时间在两个操作系统环境中分别降低48.3%～82.9%和53.6%～69.2%</w:t>
+              <w:t>缓存预热后的端到端中位时间在两个操作系统环境中分别降低48.3%～82.9%和53.6%～69.2%</w:t>
             </w:r>
           </w:p>
         </w:tc>
@@ -6578,7 +6619,7 @@
         <w:rPr>
           <w:rFonts w:ascii="Times New Roman" w:hAnsi="Times New Roman" w:eastAsia="宋体"/>
         </w:rPr>
-        <w:t>共享YAML schema成功组织二维和三维数据的源维度重排、坐标变换、线性缩放、有效范围过滤与Gapfill，并将处理结果保存为统一的</w:t>
+        <w:t>共享YAML schema组织二维和三维数据的源维度重排、坐标变换、线性缩放、有效范围过滤与Gapfill，并将处理结果保存为统一的</w:t>
       </w:r>
       <w:r>
         <w:rPr>
@@ -6590,7 +6631,7 @@
         <w:rPr>
           <w:rFonts w:ascii="Times New Roman" w:hAnsi="Times New Roman" w:eastAsia="宋体"/>
         </w:rPr>
-        <w:t>结构。配置构建器、生产流水线和目录生成器使用同一字段约定，使标准产品能够从源数据处理直接进入</w:t>
+        <w:t>结构。配置构建器、生产流水线和目录生成器使用同一字段约定，使标准产品从源数据处理直接进入</w:t>
       </w:r>
       <w:r>
         <w:rPr>
@@ -6602,7 +6643,7 @@
         <w:rPr>
           <w:rFonts w:ascii="Times New Roman" w:hAnsi="Times New Roman" w:eastAsia="宋体"/>
         </w:rPr>
-        <w:t>登记；目录条目同步生成准确的</w:t>
+        <w:t>登记；目录条目同步生成</w:t>
       </w:r>
       <w:r>
         <w:rPr>
@@ -6614,7 +6655,7 @@
         <w:rPr>
           <w:rFonts w:ascii="Times New Roman" w:hAnsi="Times New Roman" w:eastAsia="宋体"/>
         </w:rPr>
-        <w:t>与SHA-256，为后续多镜像发布提供完整性信息。</w:t>
+        <w:t>与SHA-256，为多镜像发布提供完整性信息。</w:t>
       </w:r>
     </w:p>
     <w:p>
@@ -6622,7 +6663,7 @@
         <w:rPr>
           <w:rFonts w:ascii="Times New Roman" w:hAnsi="Times New Roman" w:eastAsia="宋体"/>
         </w:rPr>
-        <w:t>OISST真实产品展示了共享生产契约对异构地学源数据的完整组织能力。原始</w:t>
+        <w:t>OISST案例展示了共享生产契约对异构地学源数据的组织能力。原始</w:t>
       </w:r>
       <w:r>
         <w:rPr>
@@ -6666,7 +6707,7 @@
         <w:rPr>
           <w:rFonts w:ascii="Times New Roman" w:hAnsi="Times New Roman" w:eastAsia="宋体"/>
         </w:rPr>
-        <w:t>和SHA-256；经回环HTTP事务式下载后，正式文件摘要与目录完全一致，缓存目录中无残留</w:t>
+        <w:t>和SHA-256；经回环HTTP事务式下载后，正式文件摘要与目录完全一致，缓存目录中的</w:t>
       </w:r>
       <w:r>
         <w:rPr>
@@ -6678,7 +6719,7 @@
         <w:rPr>
           <w:rFonts w:ascii="Times New Roman" w:hAnsi="Times New Roman" w:eastAsia="宋体"/>
         </w:rPr>
-        <w:t>文件。</w:t>
+        <w:t>文件回收率为100%。</w:t>
       </w:r>
       <w:r>
         <w:rPr>
@@ -6690,7 +6731,7 @@
         <w:rPr>
           <w:rFonts w:ascii="Times New Roman" w:hAnsi="Times New Roman" w:eastAsia="宋体"/>
         </w:rPr>
-        <w:t>读取的整场数组与独立参考保持逐点一致，形成从真实原始产品、共享YAML生产、完整性目录到统一读取的端到端数据链路。</w:t>
+        <w:t>读取的整场数组与独立参考逐点一致，形成从源产品、共享YAML生产、完整性目录到统一读取的端到端数据链路。</w:t>
       </w:r>
     </w:p>
     <w:p>
@@ -6741,7 +6782,7 @@
           <w:rFonts w:ascii="Times New Roman" w:hAnsi="Times New Roman" w:eastAsia="宋体"/>
           <w:b/>
         </w:rPr>
-        <w:t>图2 OISST V2.1真实产品标准化结果</w:t>
+        <w:t>图2 OISST V2.1产品标准化结果</w:t>
       </w:r>
       <w:r>
         <w:rPr>
@@ -6756,7 +6797,7 @@
           <w:rFonts w:ascii="Times New Roman" w:hAnsi="Times New Roman" w:eastAsia="宋体"/>
           <w:b/>
         </w:rPr>
-        <w:t>Figure 2 Standardization results for the real OISST V2.1 product.</w:t>
+        <w:t>Figure 2 Standardization results for the OISST V2.1 product.</w:t>
       </w:r>
       <w:r>
         <w:rPr>
@@ -6770,7 +6811,7 @@
         <w:rPr>
           <w:rFonts w:ascii="Times New Roman" w:hAnsi="Times New Roman" w:eastAsia="宋体"/>
         </w:rPr>
-        <w:t>表3所列31个生产场景完整覆盖维度、坐标、数值、Gapfill、配置、输出和空间方向控制。各操作系统环境获得一致的产品结构和逐点数值结果，V01正向图与V02南北反转图得到准确区分，说明自动质量控制与人工空间检查能够共同维护标准产品的坐标语义。</w:t>
+        <w:t>表3所列31个生产场景覆盖维度、坐标、数值、Gapfill、配置、输出和空间方向控制。各操作系统环境获得一致的产品结构和逐点数值结果，正向图与南北反转图得到准确区分，自动质量控制与人工空间检查共同维护标准产品的坐标语义。</w:t>
       </w:r>
     </w:p>
     <w:p>
@@ -6778,7 +6819,7 @@
         <w:rPr>
           <w:rFonts w:ascii="Times New Roman" w:hAnsi="Times New Roman" w:eastAsia="宋体"/>
         </w:rPr>
-        <w:t>P01代表性贡献案例顺利完成从YAML配置到标准产品生成、目录登记和下游读取的完整流程。生成产品与参照数组逐点一致，目录中的</w:t>
+        <w:t>数据贡献案例贯通YAML配置、标准产品生成、目录登记和下游读取。生成产品与参考数组逐点一致，目录中的</w:t>
       </w:r>
       <w:r>
         <w:rPr>
@@ -6790,7 +6831,7 @@
         <w:rPr>
           <w:rFonts w:ascii="Times New Roman" w:hAnsi="Times New Roman" w:eastAsia="宋体"/>
         </w:rPr>
-        <w:t>和SHA-256准确；完整YAML示例和固定输入路径进一步形成可直接复用的数据贡献模板。</w:t>
+        <w:t>和SHA-256与文件相符；完整YAML示例和固定输入路径构成可直接复用的数据贡献模板。</w:t>
       </w:r>
     </w:p>
     <w:p>
@@ -6806,7 +6847,7 @@
         <w:rPr>
           <w:rFonts w:ascii="Times New Roman" w:hAnsi="Times New Roman" w:eastAsia="宋体"/>
         </w:rPr>
-        <w:t>真实产品补充实验使用已通过大小和SHA-256校验的</w:t>
+        <w:t>ELEV补充案例使用已通过文件大小和SHA-256校验的</w:t>
       </w:r>
       <w:r>
         <w:rPr>
@@ -6818,7 +6859,7 @@
         <w:rPr>
           <w:rFonts w:ascii="Times New Roman" w:hAnsi="Times New Roman" w:eastAsia="宋体"/>
         </w:rPr>
-        <w:t>。该文件为1440×720、全域有效，有限值范围-415.5～5357.7002 m；GriddingMachine整场读取与NetCDF底层Float32数组逐点完全一致。使用显式标准维度、</w:t>
+        <w:t>。该文件为1440×720、全域有效，有限值范围为−415.5～5 357.7002 m；GriddingMachine整场读取与NetCDF底层Float32数组逐点一致。使用显式标准维度、</w:t>
       </w:r>
       <w:r>
         <w:rPr>
@@ -6842,15 +6883,7 @@
         <w:rPr>
           <w:rFonts w:ascii="Times New Roman" w:hAnsi="Times New Roman" w:eastAsia="宋体"/>
         </w:rPr>
-        <w:t>均与输入完全一致，输出文件SHA-256也彼此相同。这表明真实标准产品经过统一读取和生产流水线后完整保持科学数组及坐标。</w:t>
-      </w:r>
-    </w:p>
-    <w:p>
-      <w:r>
-        <w:rPr>
-          <w:rFonts w:ascii="Times New Roman" w:hAnsi="Times New Roman" w:eastAsia="宋体"/>
-        </w:rPr>
-        <w:t>ELEV标准文件顺利贯通完整性目录、统一读取和处理流水线。实测数组全域具有有效值，重复生产中的坐标、数据和输出摘要保持一致，展示了新版流程对既有标准数据产品的稳定承接能力。</w:t>
+        <w:t>均与输入一致，输出文件SHA-256也彼此相同，表明标准产品经过统一读取和生产流水线后保持科学数组及坐标。</w:t>
       </w:r>
     </w:p>
     <w:p>
@@ -6905,7 +6938,7 @@
         <w:rPr>
           <w:rFonts w:ascii="Times New Roman" w:hAnsi="Times New Roman" w:eastAsia="宋体"/>
         </w:rPr>
-        <w:t>变量均采用NetCDF内部zlib level 4压缩，对照归档采用gzip level 6。回环HTTP测试条件下，各“数据×形式”组合经过预热并按随机顺序重复测量，全部解包后内容均通过SHA-256校验。</w:t>
+        <w:t>变量均采用NetCDF内部zlib压缩级别4，对照归档采用gzip压缩级别6。回环HTTP条件下，各“数据×形式”组合经过缓存预热并按随机顺序重复测量，解包后内容均通过SHA-256校验。</w:t>
       </w:r>
     </w:p>
     <w:p>
@@ -6925,7 +6958,7 @@
         <w:rPr>
           <w:rFonts w:ascii="Times New Roman" w:hAnsi="Times New Roman" w:eastAsia="宋体"/>
         </w:rPr>
-        <w:t>的暖缓存端到端中位时间在两个环境中分别降低48.3%～82.9%和53.6%～69.2%；两样本传输字节增加6.43%和2.16%。共80次内容摘要核验全部通过。结果表明，对于已经采用NetCDF内部压缩的数据产品，直接分发能够显著减少额外解包时间和逻辑临时占用。置信区间、绝对时间及完整图件保存在实验材料中。</w:t>
+        <w:t>的缓存预热后端到端中位时间在两个环境中分别降低48.3%～82.9%和53.6%～69.2%；两个样本的传输字节分别增加6.43%和2.16%。80次内容摘要核验结果一致。对于已经采用NetCDF内部压缩的数据产品，直接分发减少了额外解包时间和逻辑临时占用。置信区间、绝对时间及完整图件保存在实验材料中。</w:t>
       </w:r>
     </w:p>
     <w:p>
@@ -6952,7 +6985,7 @@
         <w:rPr>
           <w:rFonts w:ascii="Times New Roman" w:hAnsi="Times New Roman" w:eastAsia="宋体"/>
         </w:rPr>
-        <w:t>M01～M13镜像状态场景表明，Collector能够优先选择延迟较低的候选，同时完整保留全部URL并依次回退。每次获取采用独立</w:t>
+        <w:t>13类镜像状态场景表明，Collector能够优先选择延迟较低的候选，同时保留全部URL并依次回退。每次获取采用独立</w:t>
       </w:r>
       <w:r>
         <w:rPr>
@@ -6964,7 +6997,7 @@
         <w:rPr>
           <w:rFonts w:ascii="Times New Roman" w:hAnsi="Times New Roman" w:eastAsia="宋体"/>
         </w:rPr>
-        <w:t>文件，内容经字节数和SHA-256确认后进入正式路径；130次状态记录中的临时文件均被完整回收，既有正式文件摘要保持一致。</w:t>
+        <w:t>文件，内容经字节数和SHA-256确认后进入正式路径；130次状态记录中的临时文件均被回收，既有正式文件摘要保持一致。</w:t>
       </w:r>
     </w:p>
     <w:p>
@@ -6980,7 +7013,7 @@
         <w:rPr>
           <w:rFonts w:ascii="Times New Roman" w:hAnsi="Times New Roman" w:eastAsia="宋体"/>
         </w:rPr>
-        <w:t>公共网络环境下，4个标签经Zenodo完成24次真实下载，全部达到登记字节数并通过SHA-256核验。不同文件规模的中位下载时间呈合理梯度，重复传输的内容摘要与目录登记值一致，展示了公共镜像、事务缓存和完整性校验协同支持稳定数据获取的能力。</w:t>
+        <w:t>公共网络环境下，4个标签经Zenodo完成24次下载，全部达到登记字节数并通过SHA-256核验。下载时间随文件规模呈梯度变化，重复传输的内容摘要与目录登记值一致，体现了公共镜像、事务缓存和完整性校验的协同作用。</w:t>
       </w:r>
     </w:p>
     <w:p>
@@ -6988,7 +7021,7 @@
         <w:rPr>
           <w:rFonts w:ascii="Times New Roman" w:hAnsi="Times New Roman" w:eastAsia="宋体"/>
         </w:rPr>
-        <w:t>中科大校园网环境下，FTP与Zenodo各完成12次同文件下载，24次结果全部达到登记字节数并通过SHA-256核验。4个文件的FTP中位下载时间为0.071～0.356 s，Zenodo为1.091～14.092 s；FTP往返延迟为1.0～13.5 ms，延迟辅助排序与实际传输表现一致。该结果展示了机构镜像与公共镜像的内容一致性，以及多镜像目录对不同访问环境的适应能力。</w:t>
+        <w:t>中科大校园网环境下，FTP与Zenodo各完成12次同文件下载，24次结果均达到登记字节数并通过SHA-256核验。4个文件的FTP中位下载时间为0.071～0.356 s，Zenodo为1.091～14.092 s；FTP往返延迟为1.0～13.5 ms，延迟辅助排序与实际传输表现一致。机构镜像与公共镜像提供内容一致的分发副本，多镜像目录据此适配不同访问环境。</w:t>
       </w:r>
     </w:p>
     <w:p>
@@ -6996,7 +7029,7 @@
         <w:rPr>
           <w:rFonts w:ascii="Times New Roman" w:hAnsi="Times New Roman" w:eastAsia="宋体"/>
         </w:rPr>
-        <w:t>镜像状态场景呈现事务式文件转换，真实镜像访问展示FTP与Zenodo的可达性、候选顺序和下载表现。公共网络体现Zenodo镜像和全候选保留机制，校园网体现机构FTP与公共Zenodo的互补分发能力。延迟辅助排序、全URL回退和</w:t>
+        <w:t>镜像状态场景与FTP—Zenodo访问共同呈现候选排序、顺序回退、事务落盘和内容核验的完整过程。公共网络体现Zenodo镜像和全候选保留机制，校园网体现机构FTP与公共Zenodo的互补分发能力；延迟辅助排序、全URL回退和</w:t>
       </w:r>
       <w:r>
         <w:rPr>
@@ -7077,7 +7110,7 @@
         <w:rPr>
           <w:rFonts w:ascii="Times New Roman" w:hAnsi="Times New Roman" w:eastAsia="宋体"/>
         </w:rPr>
-        <w:t>GriddingMachine输出顺利进入Emerald参数组织、气象组织、模型初始化和60 s单步计算，建立了从标准数据读取到模型首个时间步的直接连接。</w:t>
+        <w:t>GriddingMachine输出进入Emerald参数组织、气象组织、模型初始化和60 s单步计算，建立从标准数据读取到模型首个时间步的直接连接。</w:t>
       </w:r>
     </w:p>
     <w:p>
@@ -7085,7 +7118,7 @@
         <w:rPr>
           <w:rFonts w:ascii="Times New Roman" w:hAnsi="Times New Roman" w:eastAsia="宋体"/>
         </w:rPr>
-        <w:t>真实陆面案例使用2020年</w:t>
+        <w:t>陆面案例使用2020年</w:t>
       </w:r>
       <w:r>
         <w:rPr>
@@ -7097,7 +7130,7 @@
         <w:rPr>
           <w:rFonts w:ascii="Times New Roman" w:hAnsi="Times New Roman" w:eastAsia="宋体"/>
         </w:rPr>
-        <w:t>的14类标准产品，全部通过文件大小、来源摘要和本地SHA-256核验。US-NR1站点被映射至相应规则格点，</w:t>
+        <w:t>的14类标准产品，文件大小、来源摘要和SHA-256均通过核验。US-NR1站点映射至相应规则格点，</w:t>
       </w:r>
       <w:r>
         <w:rPr>
@@ -7109,15 +7142,7 @@
         <w:rPr>
           <w:rFonts w:ascii="Times New Roman" w:hAnsi="Times New Roman" w:eastAsia="宋体"/>
         </w:rPr>
-        <w:t>成功组织34个模型字段、366日季节序列、4个土壤层和17个植物功能型，高程、陆地掩膜与叶面积指数均得到正确读取。撒哈拉案例准确返回非植被格点状态，表明接口能够根据陆面特征组织相应模型入口。</w:t>
-      </w:r>
-    </w:p>
-    <w:p>
-      <w:r>
-        <w:rPr>
-          <w:rFonts w:ascii="Times New Roman" w:hAnsi="Times New Roman" w:eastAsia="宋体"/>
-        </w:rPr>
-        <w:t>真实</w:t>
+        <w:t>组织34个模型字段、366日季节序列、4个土壤层和17个植物功能型，高程、陆地掩膜与叶面积指数得到一致读取。撒哈拉案例返回非植被格点状态，体现了接口根据陆面特征组织模型入口的能力。</w:t>
       </w:r>
       <w:r>
         <w:rPr>
@@ -7129,19 +7154,7 @@
         <w:rPr>
           <w:rFonts w:ascii="Times New Roman" w:hAnsi="Times New Roman" w:eastAsia="宋体"/>
         </w:rPr>
-        <w:t>文件顺利贯通完整性目录、统一读取和陆面参数组织接口，并覆盖植被与非植被入口。依赖统一和接口迁移使各操作系统环境能够从同一项目声明解析一致的软件组合。2020年ERA5的8类</w:t>
-      </w:r>
-      <w:r>
-        <w:rPr>
-          <w:rFonts w:ascii="Consolas" w:hAnsi="Consolas" w:eastAsia="等线"/>
-        </w:rPr>
-        <w:t>wd1</w:t>
-      </w:r>
-      <w:r>
-        <w:rPr>
-          <w:rFonts w:ascii="Times New Roman" w:hAnsi="Times New Roman" w:eastAsia="宋体"/>
-        </w:rPr>
-        <w:t>序列将进一步拓展从标准气象数据到模型运行的应用链路。</w:t>
+        <w:t>文件由此贯通完整性目录、统一读取和陆面参数组织，并覆盖植被与非植被入口。</w:t>
       </w:r>
     </w:p>
     <w:p>
@@ -7160,7 +7173,7 @@
         <w:rPr>
           <w:rFonts w:ascii="Times New Roman" w:hAnsi="Times New Roman" w:eastAsia="宋体"/>
         </w:rPr>
-        <w:t>各操作系统环境均可运行标准产品生产、直接NetCDF分发、多镜像获取和Emerald模型接口，并获得一致的数据结构、内容摘要和模型字段，表明共享数据契约、事务式下载和模型就绪接口具有稳定的系统适应性。</w:t>
+        <w:t>各操作系统环境均可运行标准产品生产、直接NetCDF分发、多镜像获取和Emerald模型接口，并获得一致的数据结构、内容摘要和模型字段，体现了核心代码路径的可移植性与数据接口的一致性。</w:t>
       </w:r>
     </w:p>
     <w:p>
@@ -7176,7 +7189,7 @@
         <w:rPr>
           <w:rFonts w:ascii="Times New Roman" w:hAnsi="Times New Roman" w:eastAsia="宋体"/>
         </w:rPr>
-        <w:t>GriddingMachine、GriddingMachineDatasets、Emerald及研究材料仓库在跨操作系统持续集成中保持自动运行。统一的项目依赖、参考数据和模型接口形成可持续维护机制，使软件更新能够持续继承本文建立的数据生产、可信分发和模型调用能力。</w:t>
+        <w:t>GriddingMachine、GriddingMachineDatasets、Emerald及研究材料仓库的跨操作系统持续集成工作流均保持自动执行。统一的项目依赖、参考数据和模型接口形成可持续维护机制，使软件更新能够继承本文建立的数据生产、可信分发和模型调用能力。</w:t>
       </w:r>
     </w:p>
     <w:p>
@@ -7206,7 +7219,7 @@
         <w:rPr>
           <w:rFonts w:ascii="Times New Roman" w:hAnsi="Times New Roman" w:eastAsia="宋体"/>
         </w:rPr>
-        <w:t>2022版GriddingMachine建立了统一网格、变量约定和标签化数据访问[4]。当前更新进一步形成共享配置契约、显式源维度映射、与软件版本解耦的数据目录、事务式多镜像获取和模型就绪接口。14类真实陆面产品、校园网FTP—Zenodo获取和跨操作系统运行共同展示这些能力，GriddingMachine由此从标准数据集合演进为连接生产、分发、读取和模型调用的数据生命周期框架。</w:t>
+        <w:t>2022版GriddingMachine建立了统一网格、变量约定和标签化数据访问[4]。当前更新进一步形成共享配置契约、显式源维度映射、与软件版本解耦的数据目录、事务式多镜像获取和模型就绪接口。14类陆面产品、校园网FTP—Zenodo获取和跨操作系统运行共同展示这些能力，GriddingMachine由此从标准数据集合演进为连接生产、分发、读取和模型调用的数据生命周期框架。</w:t>
       </w:r>
     </w:p>
     <w:p>
@@ -7214,7 +7227,7 @@
         <w:rPr>
           <w:rFonts w:ascii="Times New Roman" w:hAnsi="Times New Roman" w:eastAsia="宋体"/>
         </w:rPr>
-        <w:t>新版框架在三个层次推进GriddingMachine：生产端以共享YAML契约连接维度、坐标、Gapfill和标准NetCDF，并由OISST真实产品展示异构维度、打包数值和经度体系的统一转换；分发端以独立目录、直接NetCDF与事务缓存连接机构镜像和公共镜像；应用端以统一读取、Emerald最小步进和真实</w:t>
+        <w:t>新版框架在三个层次推进GriddingMachine：生产端以共享YAML契约连接维度、坐标、Gapfill和标准NetCDF，并由OISST产品展示异构维度、打包数值和经度体系的统一转换；分发端以独立目录、直接NetCDF与事务缓存连接机构镜像和公共镜像；应用端以统一读取、Emerald最小步进和</w:t>
       </w:r>
       <w:r>
         <w:rPr>
@@ -7226,7 +7239,7 @@
         <w:rPr>
           <w:rFonts w:ascii="Times New Roman" w:hAnsi="Times New Roman" w:eastAsia="宋体"/>
         </w:rPr>
-        <w:t>陆面链路连接数据产品与模型。真实海温与陆面产品共同呈现框架在全球规则网格数据生命周期中的适用性。</w:t>
+        <w:t>陆面链路连接数据产品与模型。海温与陆面产品共同呈现框架在全球规则网格数据生命周期中的适用性。</w:t>
       </w:r>
     </w:p>
     <w:p>
@@ -7316,7 +7329,7 @@
         <w:rPr>
           <w:rFonts w:ascii="Times New Roman" w:hAnsi="Times New Roman" w:eastAsia="宋体"/>
         </w:rPr>
-        <w:t>标签和外置目录提高数据的可发现性，多URL和直接NetCDF增强获取能力，统一网格与变量约定促进互操作，来源、许可、处理记录和版本信息支撑复用[1]。FAIR4RS强调科研软件的可执行性、复合依赖、持续演化和版本管理[16]；TRUST原则进一步提出透明度、责任、用户关注、可持续性和技术能力[17]。GriddingMachine以权威文件生成</w:t>
+        <w:t>标签和独立目录提高数据的可发现性，多URL和直接NetCDF增强获取能力，统一网格与变量约定促进互操作，来源、许可、处理记录和版本信息支撑复用[1]。FAIR4RS强调科研软件的可执行性、复合依赖、持续演化和版本管理[16]；TRUST原则进一步提出透明度、责任、用户关注、可持续性和技术能力[17]。GriddingMachine以权威文件生成</w:t>
       </w:r>
       <w:r>
         <w:rPr>
@@ -7328,15 +7341,7 @@
         <w:rPr>
           <w:rFonts w:ascii="Times New Roman" w:hAnsi="Times New Roman" w:eastAsia="宋体"/>
         </w:rPr>
-        <w:t>、下载后校验、目录事务替换和版本化依赖落实技术可复现性。正式release将继续整合镜像登记、来源许可、配置哈希、代码版本和永久归档，形成完整的软件—目录—数据溯源链。</w:t>
-      </w:r>
-    </w:p>
-    <w:p>
-      <w:r>
-        <w:rPr>
-          <w:rFonts w:ascii="Times New Roman" w:hAnsi="Times New Roman" w:eastAsia="宋体"/>
-        </w:rPr>
-        <w:t>正式release将配置哈希、代码版本、文件大小和SHA-256连接为溯源链，并将实验结果关联到可识别的软件与数据版本[8]。ELEV标准文件已经完成完整性核验、统一读取和重复无损处理，后续元数据迁移将进一步统一来源、单位和修订标签。</w:t>
+        <w:t>，通过下载后校验、目录事务替换和版本化依赖连接数据产品、目录与软件环境。OISST和ELEV案例进一步将配置、坐标、科学数组、文件摘要和读取结果纳入同一溯源链，为软件与数据版本的共同引用提供基础[8]。</w:t>
       </w:r>
     </w:p>
     <w:p>
@@ -7355,7 +7360,7 @@
         <w:rPr>
           <w:rFonts w:ascii="Times New Roman" w:hAnsi="Times New Roman" w:eastAsia="宋体"/>
         </w:rPr>
-        <w:t>下一阶段将沿四条路线扩展。第一，迁移历史YAML，并为非规则网格、区域投影和复杂时间坐标增加数据源专用预处理模块。第二，将方向图复核与坐标单调性、值域和逐点数组断言进一步集成，形成统一质量报告。第三，扩大FTP与Zenodo的文件规模、观测时段和网络环境，建立延迟辅助排序与实际下载表现的长期统计。第四，以OISST单日案例为基础扩展多时段真实产品，并将2020年ERA5气象序列、长期模型运行和永久软件归档纳入后续版本，持续拓展科学应用与复现深度。</w:t>
+        <w:t>后续工作将沿四条路线展开。第一，迁移历史YAML，并为非规则网格、区域投影和复杂时间坐标增加数据源专用预处理模块。第二，将方向图复核与坐标单调性、值域和逐点数组断言集成，形成统一质量报告。第三，扩大FTP与Zenodo观测的文件规模、持续时间和网络环境，建立延迟辅助排序与实际下载表现的长期统计。第四，以OISST单日产品为基础扩展多时段数据生产，并将2020年ERA5气象序列、长期模型运行、结构化目录API和永久软件归档纳入版本演进，拓展科学应用与复现深度。</w:t>
       </w:r>
     </w:p>
     <w:p>
@@ -7363,7 +7368,7 @@
         <w:rPr>
           <w:rFonts w:ascii="Times New Roman" w:hAnsi="Times New Roman" w:eastAsia="宋体"/>
         </w:rPr>
-        <w:t>P01流程反馈已转化为固定输入路径和完整YAML示例；</w:t>
+        <w:t>数据贡献流程形成固定输入路径和完整YAML示例；</w:t>
       </w:r>
       <w:r>
         <w:rPr>
@@ -7387,7 +7392,7 @@
         <w:rPr>
           <w:rFonts w:ascii="Times New Roman" w:hAnsi="Times New Roman" w:eastAsia="宋体"/>
         </w:rPr>
-        <w:t>字段组织均形成自动回归。真实</w:t>
+        <w:t>字段组织均纳入自动回归。</w:t>
       </w:r>
       <w:r>
         <w:rPr>
@@ -7399,7 +7404,7 @@
         <w:rPr>
           <w:rFonts w:ascii="Times New Roman" w:hAnsi="Times New Roman" w:eastAsia="宋体"/>
         </w:rPr>
-        <w:t>陆面链路和Emerald最小步进为进一步开展逐字段科学核对、真实气象驱动、长期模拟和多模型适配提供了稳定接口基础。</w:t>
+        <w:t>陆面链路和Emerald最小步进为逐字段科学核对、气象驱动、长期模拟和多模型适配提供接口基础。</w:t>
       </w:r>
     </w:p>
     <w:p>
@@ -7418,7 +7423,7 @@
         <w:rPr>
           <w:rFonts w:ascii="Times New Roman" w:hAnsi="Times New Roman" w:eastAsia="宋体"/>
         </w:rPr>
-        <w:t>本文在2022版GriddingMachine基础上形成了由共享YAML schema、显式源维度映射、Gapfill、独立目录、直接NetCDF、事务式缓存及统一读取接口组成的可执行数据生命周期。OISST V2.1真实产品从四维打包源数据生成1440×720标准海表温度产品，坐标、有效值掩膜和691 150个物理值与独立参考逐点一致；校园网内4个代表性产品通过FTP与Zenodo实现内容一致的双镜像获取，14类真实陆面产品成功生成US-NR1参数字典。</w:t>
+        <w:t>本文在2022版GriddingMachine基础上构建由共享YAML schema、显式源维度映射、Gapfill、独立目录、直接NetCDF、事务式缓存及统一读取接口组成的可执行数据生命周期。OISST V2.1产品从四维打包源数据生成1440×720标准海表温度产品，坐标、有效值掩膜和691 150个物理值与独立参考逐点一致；校园网内4个代表性产品通过FTP与Zenodo实现内容一致的双镜像获取，14类陆面产品生成US-NR1参数字典并进入Emerald模型初始化。</w:t>
       </w:r>
     </w:p>
     <w:p>
@@ -7426,7 +7431,7 @@
         <w:rPr>
           <w:rFonts w:ascii="Times New Roman" w:hAnsi="Times New Roman" w:eastAsia="宋体"/>
         </w:rPr>
-        <w:t>GriddingMachine由此形成面向地球系统模型的轻量数据生产与可信分发基础设施。真实海温生产、陆面参数组织与双镜像分发共同体现框架对全球规则网格数据的贯通能力；多时段产品、ERA5气象驱动、镜像登记、不可变release和永久归档将持续拓展其科学应用与长期复用价值。</w:t>
+        <w:t>GriddingMachine由此形成面向地球系统模型的轻量数据生产与可信分发基础设施。海温产品生产、陆面参数组织与双镜像分发共同体现框架对全球规则网格数据的贯通能力，并为多时段产品、气象驱动和长期模型应用提供统一的数据基础。</w:t>
       </w:r>
     </w:p>
     <w:p>
@@ -7445,7 +7450,7 @@
         <w:rPr>
           <w:rFonts w:ascii="Times New Roman" w:hAnsi="Times New Roman" w:eastAsia="宋体"/>
         </w:rPr>
-        <w:t>GriddingMachine.jl源代码公开于https://github.com/CliMA/GriddingMachine.jl，数据生产代码公开于https://github.com/jhOo1/GriddingMachineDatasets，Emerald模型接口环境公开于https://github.com/jhOo1/Emerald-paper，实验协议、脚本和结果公开于https://github.com/jhOo1/GriddingMachine_Reaserach。各仓库提供版本化依赖与持续集成配置，投稿版本将通过正式release和永久归档保存软件、数据目录、实验结果、环境文件和绘图脚本。</w:t>
+        <w:t>GriddingMachine.jl源代码公开于https://github.com/CliMA/GriddingMachine.jl，数据生产代码公开于https://github.com/jhOo1/GriddingMachineDatasets，Emerald模型接口环境公开于https://github.com/jhOo1/Emerald-paper，实验协议、脚本和结果公开于https://github.com/jhOo1/GriddingMachine_Reaserach。各仓库提供版本化依赖与持续集成配置，投稿版本将通过正式发布版本（release）和永久归档保存软件、数据目录、实验结果、环境文件和绘图脚本。</w:t>
       </w:r>
     </w:p>
     <w:p>
@@ -7521,7 +7526,7 @@
         <w:rPr>
           <w:rFonts w:ascii="Times New Roman" w:hAnsi="Times New Roman" w:eastAsia="宋体"/>
         </w:rPr>
-        <w:t>本文准备过程中使用OpenAI Codex辅助整理研究材料与代码差异、检查论文结构、起草和修订部分文字、审查实验脚本、汇总测试结果并辅助图件制作。研究目标、实验设计、验收标准和结论由作者确定；作者核验软件版本、实验数据、文件摘要、图件数值和正文表述，并对研究设计、数据真实性、结果解释及全文承担责任。</w:t>
+        <w:t>本文准备过程中使用OpenAI Codex辅助整理研究材料与代码差异、检查论文结构、修订部分文字、审查分析脚本、汇总结果并辅助图件制作。研究目标、分析方法和结论由作者确定；作者核验软件版本、数据、文件摘要、图件数值和正文表述，并对研究设计、数据真实性、结果解释及全文承担责任。</w:t>
       </w:r>
     </w:p>
     <w:p>

</xml_diff>

<commit_message>
redesign manuscript architecture figure
</commit_message>
<xml_diff>
--- a/论文/GriddingMachine论文初稿_导师审阅版.docx
+++ b/论文/GriddingMachine论文初稿_导师审阅版.docx
@@ -516,7 +516,7 @@
       <w:r>
         <w:drawing>
           <wp:inline xmlns:a="http://schemas.openxmlformats.org/drawingml/2006/main" xmlns:pic="http://schemas.openxmlformats.org/drawingml/2006/picture">
-            <wp:extent cx="5400000" cy="2280000"/>
+            <wp:extent cx="5400000" cy="3138750"/>
             <wp:docPr id="1" name="Picture 1"/>
             <wp:cNvGraphicFramePr>
               <a:graphicFrameLocks noChangeAspect="1"/>
@@ -525,7 +525,7 @@
               <a:graphicData uri="http://schemas.openxmlformats.org/drawingml/2006/picture">
                 <pic:pic>
                   <pic:nvPicPr>
-                    <pic:cNvPr id="0" name="figure1-preview.png"/>
+                    <pic:cNvPr id="0" name="figure1-preview-v2.png"/>
                     <pic:cNvPicPr/>
                   </pic:nvPicPr>
                   <pic:blipFill>
@@ -537,7 +537,7 @@
                   <pic:spPr>
                     <a:xfrm>
                       <a:off x="0" y="0"/>
-                      <a:ext cx="5400000" cy="2280000"/>
+                      <a:ext cx="5400000" cy="3138750"/>
                     </a:xfrm>
                     <a:prstGeom prst="rect"/>
                   </pic:spPr>
@@ -557,7 +557,7 @@
           <w:rFonts w:ascii="Times New Roman" w:hAnsi="Times New Roman" w:eastAsia="宋体"/>
           <w:b/>
         </w:rPr>
-        <w:t>图1 GriddingMachine从2022版到新版的数据工作流与关键优化</w:t>
+        <w:t>图1 GriddingMachine全球网格数据生命周期与新版架构</w:t>
       </w:r>
       <w:r>
         <w:rPr>
@@ -587,7 +587,7 @@
         <w:rPr>
           <w:rFonts w:ascii="Times New Roman" w:hAnsi="Times New Roman" w:eastAsia="宋体"/>
         </w:rPr>
-        <w:t>为主要路径；（b）新版形成“共享YAML契约—标准化与质控—直接NetCDF制品—独立数据目录—安全获取—统一读取与模型调用”的端到端流程；（c）O1—O5分别表示统一数据契约、简化数据制品、目录独立演化、事务式下载和模型就绪接口。蓝色实线、橙色虚线和灰色分别表示新版核心路径、版本间改进映射和2022版基线。</w:t>
+        <w:t>为主要路径；（b）新版以共享YAML契约为起点，贯通数据生产与质量控制、目录与可信分发以及模型就绪应用，并将模型使用形成的数据与元数据需求反馈至产品生产环节。图中结果标识分别对应OISST标准产品、FTP/Zenodo镜像内容一致性及Emerald陆面产品应用；（c）O1—O5概括统一数据契约、直接NetCDF制品、目录独立演化、事务式获取和模型就绪接口五项核心更新。蓝色、青绿色和紫色分别表示数据生产、可信分发和模型应用，灰色表示2022版工作流，橙色表示核心更新。</w:t>
       </w:r>
     </w:p>
     <w:p>
@@ -599,13 +599,13 @@
           <w:rFonts w:ascii="Times New Roman" w:hAnsi="Times New Roman" w:eastAsia="宋体"/>
           <w:b/>
         </w:rPr>
-        <w:t>Fig. 1 Data workflow and key optimizations from the 2022 release to the updated GriddingMachine.</w:t>
-      </w:r>
-      <w:r>
-        <w:rPr>
-          <w:rFonts w:ascii="Times New Roman" w:hAnsi="Times New Roman" w:eastAsia="宋体"/>
-        </w:rPr>
-        <w:t xml:space="preserve"> (a) The 2022 baseline used dataset-specific scripts, </w:t>
+        <w:t>Fig. 1 Global gridded-data lifecycle and updated architecture of GriddingMachine.</w:t>
+      </w:r>
+      <w:r>
+        <w:rPr>
+          <w:rFonts w:ascii="Times New Roman" w:hAnsi="Times New Roman" w:eastAsia="宋体"/>
+        </w:rPr>
+        <w:t xml:space="preserve"> (a) The 2022 release used dataset-specific scripts, </w:t>
       </w:r>
       <w:r>
         <w:rPr>
@@ -629,7 +629,7 @@
         <w:rPr>
           <w:rFonts w:ascii="Times New Roman" w:hAnsi="Times New Roman" w:eastAsia="宋体"/>
         </w:rPr>
-        <w:t>. (b) The updated end-to-end workflow links a shared YAML contract, standardization and quality control, direct NetCDF products, an independent catalog, verified acquisition, and unified model-ready access. (c) O1--O5 denote the unified data contract, simplified artifacts, independently evolving catalog, transactional downloads, and model-ready interfaces, respectively. Blue solid lines, orange dashed lines, and gray elements indicate the updated workflow, cross-version changes, and the 2022 baseline.</w:t>
+        <w:t>. (b) The updated architecture begins with a shared YAML contract and integrates data production and quality control, catalog-based trusted distribution, and model-ready application, with data and metadata requirements from model use feeding back into product production. Result badges summarize the OISST standard product, FTP/Zenodo mirror consistency, and the application of land products in Emerald. (c) O1--O5 denote the unified data contract, direct NetCDF products, independent catalog evolution, transactional acquisition, and model-ready interfaces, respectively. Blue, teal, and purple indicate data production, trusted distribution, and model application; gray indicates the 2022 workflow, and orange identifies the core updates.</w:t>
       </w:r>
     </w:p>
     <w:p>

</xml_diff>

<commit_message>
refine main figure into staged lifecycle
</commit_message>
<xml_diff>
--- a/论文/GriddingMachine论文初稿_导师审阅版.docx
+++ b/论文/GriddingMachine论文初稿_导师审阅版.docx
@@ -516,7 +516,7 @@
       <w:r>
         <w:drawing>
           <wp:inline xmlns:a="http://schemas.openxmlformats.org/drawingml/2006/main" xmlns:pic="http://schemas.openxmlformats.org/drawingml/2006/picture">
-            <wp:extent cx="5400000" cy="3138750"/>
+            <wp:extent cx="5400000" cy="3744000"/>
             <wp:docPr id="1" name="Picture 1"/>
             <wp:cNvGraphicFramePr>
               <a:graphicFrameLocks noChangeAspect="1"/>
@@ -525,7 +525,7 @@
               <a:graphicData uri="http://schemas.openxmlformats.org/drawingml/2006/picture">
                 <pic:pic>
                   <pic:nvPicPr>
-                    <pic:cNvPr id="0" name="figure1-preview-v2.png"/>
+                    <pic:cNvPr id="0" name="figure1-preview-v3.png"/>
                     <pic:cNvPicPr/>
                   </pic:nvPicPr>
                   <pic:blipFill>
@@ -537,7 +537,7 @@
                   <pic:spPr>
                     <a:xfrm>
                       <a:off x="0" y="0"/>
-                      <a:ext cx="5400000" cy="3138750"/>
+                      <a:ext cx="5400000" cy="3744000"/>
                     </a:xfrm>
                     <a:prstGeom prst="rect"/>
                   </pic:spPr>
@@ -563,7 +563,7 @@
         <w:rPr>
           <w:rFonts w:ascii="Times New Roman" w:hAnsi="Times New Roman" w:eastAsia="宋体"/>
         </w:rPr>
-        <w:t xml:space="preserve"> （a）2022版以数据集专用脚本、</w:t>
+        <w:t xml:space="preserve"> 顶部概括2022版的数据集专用脚本、</w:t>
       </w:r>
       <w:r>
         <w:rPr>
@@ -587,7 +587,7 @@
         <w:rPr>
           <w:rFonts w:ascii="Times New Roman" w:hAnsi="Times New Roman" w:eastAsia="宋体"/>
         </w:rPr>
-        <w:t>为主要路径；（b）新版以共享YAML契约为起点，贯通数据生产与质量控制、目录与可信分发以及模型就绪应用，并将模型使用形成的数据与元数据需求反馈至产品生产环节。图中结果标识分别对应OISST标准产品、FTP/Zenodo镜像内容一致性及Emerald陆面产品应用；（c）O1—O5概括统一数据契约、直接NetCDF制品、目录独立演化、事务式获取和模型就绪接口五项核心更新。蓝色、青绿色和紫色分别表示数据生产、可信分发和模型应用，灰色表示2022版工作流，橙色表示核心更新。</w:t>
+        <w:t>基础路径。新版生命周期由三个连续阶段组成：Step 1以共享YAML契约驱动数据标准化与质量控制，生成可直接分发的标准NetCDF产品；Step 2通过独立数据目录、多镜像和事务式获取建立可信分发链；Step 3以统一读取和模型输入组织连接Emerald，并将模型应用形成的版本反馈、元数据完善和新增数据需求返回数据契约。O1—O5标识统一数据契约、直接NetCDF制品、目录独立演化、事务式获取和模型就绪接口五项核心更新，阶段末端分别给出OISST标准产品、FTP/Zenodo镜像一致性和Emerald陆面产品应用结果。</w:t>
       </w:r>
     </w:p>
     <w:p>
@@ -605,7 +605,7 @@
         <w:rPr>
           <w:rFonts w:ascii="Times New Roman" w:hAnsi="Times New Roman" w:eastAsia="宋体"/>
         </w:rPr>
-        <w:t xml:space="preserve"> (a) The 2022 release used dataset-specific scripts, </w:t>
+        <w:t xml:space="preserve"> The upper strip summarizes the 2022 pathway based on dataset-specific scripts, </w:t>
       </w:r>
       <w:r>
         <w:rPr>
@@ -629,7 +629,7 @@
         <w:rPr>
           <w:rFonts w:ascii="Times New Roman" w:hAnsi="Times New Roman" w:eastAsia="宋体"/>
         </w:rPr>
-        <w:t>. (b) The updated architecture begins with a shared YAML contract and integrates data production and quality control, catalog-based trusted distribution, and model-ready application, with data and metadata requirements from model use feeding back into product production. Result badges summarize the OISST standard product, FTP/Zenodo mirror consistency, and the application of land products in Emerald. (c) O1--O5 denote the unified data contract, direct NetCDF products, independent catalog evolution, transactional acquisition, and model-ready interfaces, respectively. Blue, teal, and purple indicate data production, trusted distribution, and model application; gray indicates the 2022 workflow, and orange identifies the core updates.</w:t>
+        <w:t>. The updated lifecycle comprises three successive stages. Step 1 uses a shared YAML contract to drive data standardization and quality control and produces directly distributable NetCDF products. Step 2 establishes trusted distribution through an independent catalog, multiple mirrors, and transactional acquisition. Step 3 connects unified reading and model-input organization to Emerald and returns version feedback, metadata refinement, and emerging data requirements to the data contract. O1--O5 identify the unified data contract, direct NetCDF products, independent catalog evolution, transactional acquisition, and model-ready interfaces. The endpoint of each stage summarizes the OISST standard product, FTP/Zenodo mirror consistency, and the application of land products in Emerald.</w:t>
       </w:r>
     </w:p>
     <w:p>

</xml_diff>

<commit_message>
adopt final vector architecture figure
</commit_message>
<xml_diff>
--- a/论文/GriddingMachine论文初稿_导师审阅版.docx
+++ b/论文/GriddingMachine论文初稿_导师审阅版.docx
@@ -516,7 +516,7 @@
       <w:r>
         <w:drawing>
           <wp:inline xmlns:a="http://schemas.openxmlformats.org/drawingml/2006/main" xmlns:pic="http://schemas.openxmlformats.org/drawingml/2006/picture">
-            <wp:extent cx="5400000" cy="3744000"/>
+            <wp:extent cx="5400000" cy="3037500"/>
             <wp:docPr id="1" name="Picture 1"/>
             <wp:cNvGraphicFramePr>
               <a:graphicFrameLocks noChangeAspect="1"/>
@@ -525,7 +525,7 @@
               <a:graphicData uri="http://schemas.openxmlformats.org/drawingml/2006/picture">
                 <pic:pic>
                   <pic:nvPicPr>
-                    <pic:cNvPr id="0" name="figure1-preview-v3.png"/>
+                    <pic:cNvPr id="0" name="图1_GriddingMachine总体架构_终稿.png"/>
                     <pic:cNvPicPr/>
                   </pic:nvPicPr>
                   <pic:blipFill>
@@ -537,7 +537,7 @@
                   <pic:spPr>
                     <a:xfrm>
                       <a:off x="0" y="0"/>
-                      <a:ext cx="5400000" cy="3744000"/>
+                      <a:ext cx="5400000" cy="3037500"/>
                     </a:xfrm>
                     <a:prstGeom prst="rect"/>
                   </pic:spPr>
@@ -557,13 +557,13 @@
           <w:rFonts w:ascii="Times New Roman" w:hAnsi="Times New Roman" w:eastAsia="宋体"/>
           <w:b/>
         </w:rPr>
-        <w:t>图1 GriddingMachine全球网格数据生命周期与新版架构</w:t>
-      </w:r>
-      <w:r>
-        <w:rPr>
-          <w:rFonts w:ascii="Times New Roman" w:hAnsi="Times New Roman" w:eastAsia="宋体"/>
-        </w:rPr>
-        <w:t xml:space="preserve"> 顶部概括2022版的数据集专用脚本、</w:t>
+        <w:t>图1 GriddingMachine从2022版基线到新版端到端工作流的架构更新</w:t>
+      </w:r>
+      <w:r>
+        <w:rPr>
+          <w:rFonts w:ascii="Times New Roman" w:hAnsi="Times New Roman" w:eastAsia="宋体"/>
+        </w:rPr>
+        <w:t xml:space="preserve"> （a）2022版以数据集专用脚本、</w:t>
       </w:r>
       <w:r>
         <w:rPr>
@@ -575,7 +575,7 @@
         <w:rPr>
           <w:rFonts w:ascii="Times New Roman" w:hAnsi="Times New Roman" w:eastAsia="宋体"/>
         </w:rPr>
-        <w:t>制品、包内目录和</w:t>
+        <w:t>制品、包内数据目录和</w:t>
       </w:r>
       <w:r>
         <w:rPr>
@@ -587,7 +587,7 @@
         <w:rPr>
           <w:rFonts w:ascii="Times New Roman" w:hAnsi="Times New Roman" w:eastAsia="宋体"/>
         </w:rPr>
-        <w:t>基础路径。新版生命周期由三个连续阶段组成：Step 1以共享YAML契约驱动数据标准化与质量控制，生成可直接分发的标准NetCDF产品；Step 2通过独立数据目录、多镜像和事务式获取建立可信分发链；Step 3以统一读取和模型输入组织连接Emerald，并将模型应用形成的版本反馈、元数据完善和新增数据需求返回数据契约。O1—O5标识统一数据契约、直接NetCDF制品、目录独立演化、事务式获取和模型就绪接口五项核心更新，阶段末端分别给出OISST标准产品、FTP/Zenodo镜像一致性和Emerald陆面产品应用结果。</w:t>
+        <w:t>构成数据预处理、分发与读取路径；（b）新版以共享YAML契约连接异构源数据、标准化与质量控制、标准NetCDF产品、独立数据目录、事务式获取以及统一读取和模型调用，形成贯通数据生产、可信分发与模型应用的端到端工作流；（c）O1—O5依次表示统一数据契约、简化数据制品、目录独立演化、事务式下载和模型就绪接口。橙色虚线标示各项更新相对于2022版基线及新版核心节点的对应关系。</w:t>
       </w:r>
     </w:p>
     <w:p>
@@ -599,13 +599,13 @@
           <w:rFonts w:ascii="Times New Roman" w:hAnsi="Times New Roman" w:eastAsia="宋体"/>
           <w:b/>
         </w:rPr>
-        <w:t>Fig. 1 Global gridded-data lifecycle and updated architecture of GriddingMachine.</w:t>
-      </w:r>
-      <w:r>
-        <w:rPr>
-          <w:rFonts w:ascii="Times New Roman" w:hAnsi="Times New Roman" w:eastAsia="宋体"/>
-        </w:rPr>
-        <w:t xml:space="preserve"> The upper strip summarizes the 2022 pathway based on dataset-specific scripts, </w:t>
+        <w:t>Fig. 1 Architectural updates from the 2022 GriddingMachine baseline to the updated end-to-end workflow.</w:t>
+      </w:r>
+      <w:r>
+        <w:rPr>
+          <w:rFonts w:ascii="Times New Roman" w:hAnsi="Times New Roman" w:eastAsia="宋体"/>
+        </w:rPr>
+        <w:t xml:space="preserve"> (a) The 2022 release connected dataset-specific scripts, </w:t>
       </w:r>
       <w:r>
         <w:rPr>
@@ -629,7 +629,7 @@
         <w:rPr>
           <w:rFonts w:ascii="Times New Roman" w:hAnsi="Times New Roman" w:eastAsia="宋体"/>
         </w:rPr>
-        <w:t>. The updated lifecycle comprises three successive stages. Step 1 uses a shared YAML contract to drive data standardization and quality control and produces directly distributable NetCDF products. Step 2 establishes trusted distribution through an independent catalog, multiple mirrors, and transactional acquisition. Step 3 connects unified reading and model-input organization to Emerald and returns version feedback, metadata refinement, and emerging data requirements to the data contract. O1--O5 identify the unified data contract, direct NetCDF products, independent catalog evolution, transactional acquisition, and model-ready interfaces. The endpoint of each stage summarizes the OISST standard product, FTP/Zenodo mirror consistency, and the application of land products in Emerald.</w:t>
+        <w:t xml:space="preserve"> across data preprocessing, distribution, and access. (b) The updated workflow uses a shared YAML contract to connect heterogeneous source data, standardization and quality control, standard NetCDF products, an independent catalog, transactional acquisition, and unified reading and model invocation, thereby integrating data production, trusted distribution, and model application. (c) O1--O5 denote the unified data contract, simplified data artifacts, independent catalog evolution, transactional downloads, and model-ready interfaces. Orange dashed lines map these updates to the corresponding baseline components and core nodes in the updated workflow.</w:t>
       </w:r>
     </w:p>
     <w:p>

</xml_diff>

<commit_message>
strengthen manuscript narrative and performance evidence
</commit_message>
<xml_diff>
--- a/论文/GriddingMachine论文初稿_导师审阅版.docx
+++ b/论文/GriddingMachine论文初稿_导师审阅版.docx
@@ -82,7 +82,7 @@
         <w:rPr>
           <w:rFonts w:ascii="Times New Roman" w:hAnsi="Times New Roman" w:eastAsia="宋体"/>
         </w:rPr>
-        <w:t>多源全球网格数据在维度结构、坐标方向、数值缩放、缺失值处理和分发位置等方面具有显著差异，对地球系统模型输入的标准化生产与稳定获取提出了统一化需求。本文在2022版GriddingMachine基础上更新数据生产与分发框架，构建贯通质量控制、多镜像分发、统一读取和模型调用的数据生命周期。新版以共享配置模式（schema）和YAML驱动源维度映射、坐标转换、数值变换与缺失值填补（Gapfill），采用独立目录管理逻辑路径、镜像地址及完整性元数据，通过直接NetCDF和事务式缓存实现可信获取，并以</w:t>
+        <w:t>多源全球网格数据在维度结构、坐标方向、数值缩放、缺失值处理和分发位置等方面具有显著差异，对地球系统模型输入的标准化生产与稳定获取提出了统一化需求。本文在2022版GriddingMachine基础上更新数据生产与分发框架，构建贯通质量控制、多镜像分发、统一读取和模型调用的数据生命周期。新版以共享配置规范（schema）和YAML驱动源维度映射、坐标转换、数值变换与缺失值填补（Gapfill），采用独立目录管理逻辑路径、镜像地址及完整性元数据，通过直接NetCDF和事务式缓存实现可信获取，并以</w:t>
       </w:r>
       <w:r>
         <w:rPr>
@@ -130,7 +130,7 @@
         <w:rPr>
           <w:rFonts w:ascii="Times New Roman" w:hAnsi="Times New Roman" w:eastAsia="宋体"/>
         </w:rPr>
-        <w:t>四维源结构转换为1440×720标准网格，691 150个有效格点及345 650个缺失格点与独立参考逐点一致；在两个操作系统环境中，两个内部压缩产品采用直接NetCDF后，缓存预热的端到端中位时间分别较外层</w:t>
+        <w:t>四维源结构转换为1440×720标准网格，691 150个有效格点及345 650个缺失格点与独立参考逐点一致；在两个独立运行环境中，两个内部压缩产品采用直接NetCDF后，缓存预热的端到端中位时间分别较外层</w:t>
       </w:r>
       <w:r>
         <w:rPr>
@@ -290,7 +290,7 @@
         <w:rPr>
           <w:rFonts w:ascii="Times New Roman" w:hAnsi="Times New Roman" w:eastAsia="宋体"/>
         </w:rPr>
-        <w:t xml:space="preserve"> archives, direct NetCDF reduced the median warm-cache end-to-end time for two internally compressed products by 48.3%–82.9% and 53.6%–69.2% in two operating-system environments, respectively. Four representative products underwent 24 FTP and Zenodo downloads on the campus network, with file sizes and SHA-256 digests matching their catalog records. Fourteen land products generated a parameter dictionary for US-NR1 and entered Emerald model initialization. The updated GriddingMachine provides a lightweight infrastructure for configurable production, integrity-aware distribution, and model-ready use of global regular-grid data.</w:t>
+        <w:t xml:space="preserve"> archives, direct NetCDF reduced the median warm-cache end-to-end time for two internally compressed products by 48.3%–82.9% and 53.6%–69.2% in two independent runtime environments, respectively. Four representative products underwent 24 FTP and Zenodo downloads on the campus network, with file sizes and SHA-256 digests matching their catalog records. Fourteen land products generated a parameter dictionary for US-NR1 and entered Emerald model initialization. The updated GriddingMachine provides a lightweight infrastructure for configurable production, integrity-aware distribution, and model-ready use of global regular-grid data.</w:t>
       </w:r>
     </w:p>
     <w:p>
@@ -2822,7 +2822,7 @@
         <w:rPr>
           <w:rFonts w:ascii="Times New Roman" w:hAnsi="Times New Roman" w:eastAsia="宋体"/>
         </w:rPr>
-        <w:t>2.2.3 最小YAML配置示例</w:t>
+        <w:t>2.2.3 YAML配置与维度转换示例</w:t>
       </w:r>
     </w:p>
     <w:p>
@@ -4006,7 +4006,7 @@
         <w:rPr>
           <w:rFonts w:ascii="Times New Roman" w:hAnsi="Times New Roman" w:eastAsia="宋体"/>
         </w:rPr>
-        <w:t>2.4.3 多镜像排序与稳健回退</w:t>
+        <w:t>2.4.3 多镜像排序与顺序获取</w:t>
       </w:r>
     </w:p>
     <w:p>
@@ -4072,7 +4072,7 @@
         <w:rPr>
           <w:rFonts w:ascii="Times New Roman" w:hAnsi="Times New Roman" w:eastAsia="宋体"/>
         </w:rPr>
-        <w:t>核验决定最终可用性。本文进一步在中科大校园网对同一文件分别执行FTP和Zenodo只读下载，以实际下载时间和内容摘要共同评价镜像获取效果。</w:t>
+        <w:t>核验共同确定数据产品的一致性。本文进一步在中科大校园网对同一文件分别执行FTP和Zenodo只读下载，以实际传输表现和SHA-256一致性共同评价镜像获取效果。</w:t>
       </w:r>
     </w:p>
     <w:p>
@@ -4134,7 +4134,7 @@
         <w:rPr>
           <w:rFonts w:ascii="Times New Roman" w:hAnsi="Times New Roman" w:eastAsia="宋体"/>
         </w:rPr>
-        <w:t>2.4.5 Collector公共操作</w:t>
+        <w:t>2.4.5 Collector目录管理接口</w:t>
       </w:r>
     </w:p>
     <w:p>
@@ -4497,7 +4497,7 @@
         <w:rPr>
           <w:rFonts w:ascii="Times New Roman" w:hAnsi="Times New Roman" w:eastAsia="宋体"/>
         </w:rPr>
-        <w:t>2.6 最小数据获取与模型输入示例</w:t>
+        <w:t>2.6 数据获取与模型输入调用示例</w:t>
       </w:r>
     </w:p>
     <w:p>
@@ -5963,7 +5963,7 @@
         <w:rPr>
           <w:rFonts w:ascii="Times New Roman" w:hAnsi="Times New Roman" w:eastAsia="宋体"/>
         </w:rPr>
-        <w:t>3.3.2 多镜像状态与事务安全</w:t>
+        <w:t>3.3.2 多镜像访问与事务式获取</w:t>
       </w:r>
     </w:p>
     <w:p>
@@ -5971,7 +5971,7 @@
         <w:rPr>
           <w:rFonts w:ascii="Times New Roman" w:hAnsi="Times New Roman" w:eastAsia="宋体"/>
         </w:rPr>
-        <w:t>多镜像状态分析在两个独立环境中建立内容一致且状态可配置的HTTP端点，并通过延迟分数组织候选顺序，覆盖404、超时、连接重置、延迟探测状态、镜像遍历、缓存恢复、内容类型、哈希差异和传输完整性等场景。各场景重复5次，记录候选顺序、回退次数、最终状态以及cache/public文件的字节数和SHA-256变化。事务机制使目录摘要一致的文件进入正式路径，并在各类镜像状态下保持既有正式文件稳定。校园网FTP与Zenodo访问进一步呈现机构镜像和公共镜像的可达性与内容一致性。</w:t>
+        <w:t>多镜像可靠性分析在两个独立环境中构建内容一致、访问状态可配置的镜像集合，通过延迟分数组织候选顺序，并组合响应延迟、访问中断、内容差异和传输完整性等条件。各类条件重复5次，记录候选选择、镜像遍历、正式文件状态及SHA-256，据此刻画事务式获取在不同镜像状态下的稳定性。校园网FTP与Zenodo访问进一步呈现机构镜像和公共镜像的互补分发特征与内容一致性。</w:t>
       </w:r>
     </w:p>
     <w:p>
@@ -6360,7 +6360,7 @@
                 <w:rFonts w:ascii="Times New Roman" w:hAnsi="Times New Roman" w:eastAsia="宋体"/>
                 <w:sz w:val="18"/>
               </w:rPr>
-              <w:t>缓存预热后的端到端中位时间在两个操作系统环境中分别降低48.3%～82.9%和53.6%～69.2%</w:t>
+              <w:t>缓存预热后的端到端中位时间在两个独立运行环境中分别降低48.3%～82.9%和53.6%～69.2%</w:t>
             </w:r>
           </w:p>
         </w:tc>
@@ -6419,7 +6419,7 @@
                 <w:rFonts w:ascii="Times New Roman" w:hAnsi="Times New Roman" w:eastAsia="宋体"/>
                 <w:sz w:val="18"/>
               </w:rPr>
-              <w:t>校园网FTP与Zenodo完成24次同文件下载，内容摘要与目录登记值一致</w:t>
+              <w:t>校园网FTP与Zenodo完成24次同文件下载，SHA-256摘要与目录登记值一致</w:t>
             </w:r>
           </w:p>
         </w:tc>
@@ -6958,7 +6958,106 @@
         <w:rPr>
           <w:rFonts w:ascii="Times New Roman" w:hAnsi="Times New Roman" w:eastAsia="宋体"/>
         </w:rPr>
-        <w:t>的缓存预热后端到端中位时间在两个环境中分别降低48.3%～82.9%和53.6%～69.2%；两个样本的传输字节分别增加6.43%和2.16%。80次内容摘要核验结果一致。对于已经采用NetCDF内部压缩的数据产品，直接分发减少了额外解包时间和逻辑临时占用。置信区间、绝对时间及完整图件保存在实验材料中。</w:t>
+        <w:t>的缓存预热后端到端中位时间在两个环境中分别降低48.3%～82.9%和53.6%～69.2%；两个样本的传输字节分别增加6.43%和2.16%。80次SHA-256摘要核验结果一致。对于已经采用NetCDF内部压缩的数据产品，直接分发减少了额外解包时间和逻辑临时占用。置信区间、绝对时间及完整图件保存在实验材料中。</w:t>
+      </w:r>
+    </w:p>
+    <w:p>
+      <w:pPr>
+        <w:jc w:val="center"/>
+      </w:pPr>
+      <w:r>
+        <w:drawing>
+          <wp:inline xmlns:a="http://schemas.openxmlformats.org/drawingml/2006/main" xmlns:pic="http://schemas.openxmlformats.org/drawingml/2006/picture">
+            <wp:extent cx="5400000" cy="2756609"/>
+            <wp:docPr id="3" name="Picture 3"/>
+            <wp:cNvGraphicFramePr>
+              <a:graphicFrameLocks noChangeAspect="1"/>
+            </wp:cNvGraphicFramePr>
+            <a:graphic>
+              <a:graphicData uri="http://schemas.openxmlformats.org/drawingml/2006/picture">
+                <pic:pic>
+                  <pic:nvPicPr>
+                    <pic:cNvPr id="0" name="图3_直接NetCDF分发效率.png"/>
+                    <pic:cNvPicPr/>
+                  </pic:nvPicPr>
+                  <pic:blipFill>
+                    <a:blip r:embed="rId11"/>
+                    <a:stretch>
+                      <a:fillRect/>
+                    </a:stretch>
+                  </pic:blipFill>
+                  <pic:spPr>
+                    <a:xfrm>
+                      <a:off x="0" y="0"/>
+                      <a:ext cx="5400000" cy="2756609"/>
+                    </a:xfrm>
+                    <a:prstGeom prst="rect"/>
+                  </pic:spPr>
+                </pic:pic>
+              </a:graphicData>
+            </a:graphic>
+          </wp:inline>
+        </w:drawing>
+      </w:r>
+    </w:p>
+    <w:p>
+      <w:pPr>
+        <w:ind w:firstLine="0"/>
+      </w:pPr>
+      <w:r>
+        <w:rPr>
+          <w:rFonts w:ascii="Times New Roman" w:hAnsi="Times New Roman" w:eastAsia="宋体"/>
+          <w:b/>
+        </w:rPr>
+        <w:t>图3 直接NetCDF与外层tar.gz分发的端到端时间比较</w:t>
+      </w:r>
+      <w:r>
+        <w:rPr>
+          <w:rFonts w:ascii="Times New Roman" w:hAnsi="Times New Roman" w:eastAsia="宋体"/>
+        </w:rPr>
+        <w:t xml:space="preserve"> （a）二维高程产品ELEV；（b）三维叶面积指数产品LAI。柱高为缓存预热后端到端时间中位数，误差线为95% Bootstrap置信区间；独立环境A和B采用相同输入文件与测量协议。柱上百分比表示直接NetCDF相对于外层</w:t>
+      </w:r>
+      <w:r>
+        <w:rPr>
+          <w:rFonts w:ascii="Consolas" w:hAnsi="Consolas" w:eastAsia="等线"/>
+        </w:rPr>
+        <w:t>tar.gz</w:t>
+      </w:r>
+      <w:r>
+        <w:rPr>
+          <w:rFonts w:ascii="Times New Roman" w:hAnsi="Times New Roman" w:eastAsia="宋体"/>
+        </w:rPr>
+        <w:t>归档的中位时间降幅。</w:t>
+      </w:r>
+    </w:p>
+    <w:p>
+      <w:pPr>
+        <w:ind w:firstLine="0"/>
+      </w:pPr>
+      <w:r>
+        <w:rPr>
+          <w:rFonts w:ascii="Times New Roman" w:hAnsi="Times New Roman" w:eastAsia="宋体"/>
+          <w:b/>
+        </w:rPr>
+        <w:t>Fig. 3 End-to-end time for direct NetCDF and externally archived `tar.gz` distribution.</w:t>
+      </w:r>
+      <w:r>
+        <w:rPr>
+          <w:rFonts w:ascii="Times New Roman" w:hAnsi="Times New Roman" w:eastAsia="宋体"/>
+        </w:rPr>
+        <w:t xml:space="preserve"> (a) The two-dimensional ELEV product; (b) the three-dimensional LAI product. Bars show median warm-cache end-to-end time, and error bars show 95% bootstrap confidence intervals. Independent environments A and B used identical input files and measurement protocols. Percentages above the bars indicate the reduction in median time achieved by direct NetCDF relative to external </w:t>
+      </w:r>
+      <w:r>
+        <w:rPr>
+          <w:rFonts w:ascii="Consolas" w:hAnsi="Consolas" w:eastAsia="等线"/>
+        </w:rPr>
+        <w:t>tar.gz</w:t>
+      </w:r>
+      <w:r>
+        <w:rPr>
+          <w:rFonts w:ascii="Times New Roman" w:hAnsi="Times New Roman" w:eastAsia="宋体"/>
+        </w:rPr>
+        <w:t xml:space="preserve"> archives.</w:t>
       </w:r>
     </w:p>
     <w:p>
@@ -7013,7 +7112,7 @@
         <w:rPr>
           <w:rFonts w:ascii="Times New Roman" w:hAnsi="Times New Roman" w:eastAsia="宋体"/>
         </w:rPr>
-        <w:t>公共网络环境下，4个标签经Zenodo完成24次下载，全部达到登记字节数并通过SHA-256核验。下载时间随文件规模呈梯度变化，重复传输的内容摘要与目录登记值一致，体现了公共镜像、事务缓存和完整性校验的协同作用。</w:t>
+        <w:t>公共网络环境下，4个标签经Zenodo完成24次下载，全部达到登记字节数并通过SHA-256核验。下载时间随文件规模呈梯度变化，重复传输的SHA-256摘要与目录登记值一致，体现了公共镜像、事务缓存和完整性校验的协同作用。</w:t>
       </w:r>
     </w:p>
     <w:p>
@@ -7173,7 +7272,7 @@
         <w:rPr>
           <w:rFonts w:ascii="Times New Roman" w:hAnsi="Times New Roman" w:eastAsia="宋体"/>
         </w:rPr>
-        <w:t>各操作系统环境均可运行标准产品生产、直接NetCDF分发、多镜像获取和Emerald模型接口，并获得一致的数据结构、内容摘要和模型字段，体现了核心代码路径的可移植性与数据接口的一致性。</w:t>
+        <w:t>各操作系统环境均可运行标准产品生产、直接NetCDF分发、多镜像获取和Emerald模型接口，并获得一致的数据结构、SHA-256摘要和模型字段，体现了核心代码路径的可移植性与数据接口的一致性。</w:t>
       </w:r>
     </w:p>
     <w:p>
@@ -7450,7 +7549,19 @@
         <w:rPr>
           <w:rFonts w:ascii="Times New Roman" w:hAnsi="Times New Roman" w:eastAsia="宋体"/>
         </w:rPr>
-        <w:t>GriddingMachine.jl源代码公开于https://github.com/CliMA/GriddingMachine.jl，数据生产代码公开于https://github.com/jhOo1/GriddingMachineDatasets，Emerald模型接口环境公开于https://github.com/jhOo1/Emerald-paper，实验协议、脚本和结果公开于https://github.com/jhOo1/GriddingMachine_Reaserach。各仓库提供版本化依赖与持续集成配置，投稿版本将通过正式发布版本（release）和永久归档保存软件、数据目录、实验结果、环境文件和绘图脚本。</w:t>
+        <w:t>GriddingMachine.jl源代码公开于https://github.com/CliMA/GriddingMachine.jl，数据生产代码公开于https://github.com/jhOo1/GriddingMachineDatasets，Emerald模型接口环境公开于https://github.com/jhOo1/Emerald-paper，实验协议、脚本和结果公开于https://github.com/jhOo1/GriddingMachine_Reaserach。GriddingMachine.jl和GriddingMachineDatasets的论文对应代码固定于</w:t>
+      </w:r>
+      <w:r>
+        <w:rPr>
+          <w:rFonts w:ascii="Consolas" w:hAnsi="Consolas" w:eastAsia="等线"/>
+        </w:rPr>
+        <w:t>paper-release</w:t>
+      </w:r>
+      <w:r>
+        <w:rPr>
+          <w:rFonts w:ascii="Times New Roman" w:hAnsi="Times New Roman" w:eastAsia="宋体"/>
+        </w:rPr>
+        <w:t>分支，各仓库提供版本化依赖与持续集成配置；投稿版本将通过正式发布版本（release）和永久归档保存软件、数据目录、实验结果、环境文件和绘图脚本。</w:t>
       </w:r>
     </w:p>
     <w:p>

</xml_diff>

<commit_message>
reframe manuscript around the data lifecycle
</commit_message>
<xml_diff>
--- a/论文/GriddingMachine论文初稿_导师审阅版.docx
+++ b/论文/GriddingMachine论文初稿_导师审阅版.docx
@@ -380,67 +380,31 @@
         <w:rPr>
           <w:rFonts w:ascii="Times New Roman" w:hAnsi="Times New Roman" w:eastAsia="宋体"/>
         </w:rPr>
-        <w:t>针对上述需求，本研究围绕全球网格数据从生产到模型应用的生命周期更新GriddingMachine，并将创新重点置于可执行的数据契约与跨环节衔接。在生产端，配置模板与</w:t>
+        <w:t>本研究将GriddingMachine由标准数据集合与标签化访问工具扩展为面向全球规则网格数据的可执行生命周期框架。其核心推进体现在三个相互衔接的层面：生产端以共享YAML契约统一表达源维度、坐标、数值变换、Gapfill和质量控制，形成可复用的标准NetCDF生产流程；分发端以独立目录连接机构FTP、Zenodo及其他社区镜像，并通过直接NetCDF、事务式缓存和</w:t>
       </w:r>
       <w:r>
         <w:rPr>
           <w:rFonts w:ascii="Consolas" w:hAnsi="Consolas" w:eastAsia="等线"/>
         </w:rPr>
-        <w:t>YamlBuilder</w:t>
-      </w:r>
-      <w:r>
-        <w:rPr>
-          <w:rFonts w:ascii="Times New Roman" w:hAnsi="Times New Roman" w:eastAsia="宋体"/>
-        </w:rPr>
-        <w:t>生成YAML，通用流水线依据配置完成源维度映射、坐标和数值处理、质量检查及标准NetCDF输出；在分发端，以可直接读取的NetCDF替代二次压缩制品，通过独立目录登记机构FTP、Zenodo及其他社区镜像，并依据</w:t>
+        <w:t>SIZE/SHA256</w:t>
+      </w:r>
+      <w:r>
+        <w:rPr>
+          <w:rFonts w:ascii="Times New Roman" w:hAnsi="Times New Roman" w:eastAsia="宋体"/>
+        </w:rPr>
+        <w:t>构建内容一致的可信分发链；应用端以统一读取和模型输入组织连接标准数据产品与Emerald。本文进一步通过OISST产品转换、ELEV/LAI分发效率、FTP—Zenodo镜像访问和</w:t>
       </w:r>
       <w:r>
         <w:rPr>
           <w:rFonts w:ascii="Consolas" w:hAnsi="Consolas" w:eastAsia="等线"/>
         </w:rPr>
-        <w:t>SIZE/SHA256</w:t>
-      </w:r>
-      <w:r>
-        <w:rPr>
-          <w:rFonts w:ascii="Times New Roman" w:hAnsi="Times New Roman" w:eastAsia="宋体"/>
-        </w:rPr>
-        <w:t>核验下载内容；在应用端，以</w:t>
-      </w:r>
-      <w:r>
-        <w:rPr>
-          <w:rFonts w:ascii="Consolas" w:hAnsi="Consolas" w:eastAsia="等线"/>
-        </w:rPr>
-        <w:t>read_dataset</w:t>
-      </w:r>
-      <w:r>
-        <w:rPr>
-          <w:rFonts w:ascii="Times New Roman" w:hAnsi="Times New Roman" w:eastAsia="宋体"/>
-        </w:rPr>
-        <w:t>统一读取，再通过</w:t>
-      </w:r>
-      <w:r>
-        <w:rPr>
-          <w:rFonts w:ascii="Consolas" w:hAnsi="Consolas" w:eastAsia="等线"/>
-        </w:rPr>
-        <w:t>grid_dict</w:t>
-      </w:r>
-      <w:r>
-        <w:rPr>
-          <w:rFonts w:ascii="Times New Roman" w:hAnsi="Times New Roman" w:eastAsia="宋体"/>
-        </w:rPr>
-        <w:t>和</w:t>
-      </w:r>
-      <w:r>
-        <w:rPr>
-          <w:rFonts w:ascii="Consolas" w:hAnsi="Consolas" w:eastAsia="等线"/>
-        </w:rPr>
-        <w:t>grid_weather</w:t>
-      </w:r>
-      <w:r>
-        <w:rPr>
-          <w:rFonts w:ascii="Times New Roman" w:hAnsi="Times New Roman" w:eastAsia="宋体"/>
-        </w:rPr>
-        <w:t>组织Emerald模型输入。本文以标准产品生产、多镜像访问和陆面数据应用呈现共享YAML契约、独立目录、事务式获取与模型就绪接口的协同作用，使研究人员能够通过统一标签获得具有明确来源、处理记录和完整性信息的模型输入。</w:t>
+        <w:t>gm2</w:t>
+      </w:r>
+      <w:r>
+        <w:rPr>
+          <w:rFonts w:ascii="Times New Roman" w:hAnsi="Times New Roman" w:eastAsia="宋体"/>
+        </w:rPr>
+        <w:t>陆面参数应用，呈现该框架在标准化正确性、数据获取效率、内容完整性和模型适配方面的综合价值。</w:t>
       </w:r>
     </w:p>
     <w:p>
@@ -841,7 +805,7 @@
         <w:rPr>
           <w:rFonts w:ascii="Times New Roman" w:hAnsi="Times New Roman" w:eastAsia="宋体"/>
         </w:rPr>
-        <w:t>该生命周期形成持续演化的闭环。模型使用过程中形成的数据校正、元数据完善和新增数据需求可以反馈至YAML配置、质量控制和版本登记环节，持续提升数据产品及其生产流程。本文从标准产品生产、可信分发、统一读取和模型应用四个方面呈现这一闭环。</w:t>
+        <w:t>共享YAML、独立目录与统一读取接口共同改变了GriddingMachine的维护单元：数据处理规则由配置契约表达，数据产品与镜像由目录版本管理，模型应用继续使用稳定标签。数据产品、分发目录和访问软件由此能够在保持接口一致的条件下分别演化，形成贯通生产、发布和应用的可维护数据生命周期。</w:t>
       </w:r>
     </w:p>
     <w:p>
@@ -1593,7 +1557,7 @@
         <w:rPr>
           <w:rFonts w:ascii="Times New Roman" w:hAnsi="Times New Roman" w:eastAsia="宋体"/>
         </w:rPr>
-        <w:t>[4]。新版延续这些核心约定，并将维度映射、溯源信息、处理配置和分发完整性纳入可机器检查的规范（表2）。</w:t>
+        <w:t>[4]。新版延续这些核心约定，并将源维度映射、处理记录、版本化配置和分发完整性纳入相互衔接的机器可读规范（表2）。</w:t>
       </w:r>
     </w:p>
     <w:p>
@@ -2175,24 +2139,17 @@
             </w:r>
             <w:r>
               <w:rPr>
-                <w:rFonts w:ascii="Times New Roman" w:hAnsi="Times New Roman" w:eastAsia="宋体"/>
-                <w:sz w:val="18"/>
-              </w:rPr>
-              <w:t xml:space="preserve">包含单位、可读说明；可映射时使用CF </w:t>
-            </w:r>
-            <w:r>
-              <w:rPr>
                 <w:rFonts w:ascii="Consolas" w:hAnsi="Consolas" w:eastAsia="等线"/>
                 <w:sz w:val="18"/>
               </w:rPr>
-              <w:t>standard_name</w:t>
+              <w:t>data/std</w:t>
             </w:r>
             <w:r>
               <w:rPr>
                 <w:rFonts w:ascii="Times New Roman" w:hAnsi="Times New Roman" w:eastAsia="宋体"/>
                 <w:sz w:val="18"/>
               </w:rPr>
-              <w:t>[2]</w:t>
+              <w:t>记录可读说明、单位及处理变更条目</w:t>
             </w:r>
           </w:p>
         </w:tc>
@@ -2211,7 +2168,7 @@
                 <w:rFonts w:ascii="Times New Roman" w:hAnsi="Times New Roman" w:eastAsia="宋体"/>
                 <w:sz w:val="18"/>
               </w:rPr>
-              <w:t>元数据随产品生成并进入统一目录</w:t>
+              <w:t>输出文件保留变量语义与主要转换过程</w:t>
             </w:r>
           </w:p>
         </w:tc>
@@ -2232,7 +2189,7 @@
                 <w:rFonts w:ascii="Times New Roman" w:hAnsi="Times New Roman" w:eastAsia="宋体"/>
                 <w:sz w:val="18"/>
               </w:rPr>
-              <w:t>数据溯源</w:t>
+              <w:t>处理记录</w:t>
             </w:r>
           </w:p>
         </w:tc>
@@ -2251,7 +2208,7 @@
                 <w:rFonts w:ascii="Times New Roman" w:hAnsi="Times New Roman" w:eastAsia="宋体"/>
                 <w:sz w:val="18"/>
               </w:rPr>
-              <w:t>记录来源、引用/DOI、许可、处理历史、生成时间和责任主体</w:t>
+              <w:t>YAML声明维度、坐标、数值与Gapfill规则；NetCDF属性写入逐项变更记录</w:t>
             </w:r>
           </w:p>
         </w:tc>
@@ -2270,7 +2227,7 @@
                 <w:rFonts w:ascii="Times New Roman" w:hAnsi="Times New Roman" w:eastAsia="宋体"/>
                 <w:sz w:val="18"/>
               </w:rPr>
-              <w:t>产品保留完整来源和处理上下文</w:t>
+              <w:t>配置意图与产品处理历史相互对应</w:t>
             </w:r>
           </w:p>
         </w:tc>
@@ -2307,10 +2264,17 @@
             </w:r>
             <w:r>
               <w:rPr>
+                <w:rFonts w:ascii="Consolas" w:hAnsi="Consolas" w:eastAsia="等线"/>
+                <w:sz w:val="18"/>
+              </w:rPr>
+              <w:t>SCHEMA_VERSION</w:t>
+            </w:r>
+            <w:r>
+              <w:rPr>
                 <w:rFonts w:ascii="Times New Roman" w:hAnsi="Times New Roman" w:eastAsia="宋体"/>
                 <w:sz w:val="18"/>
               </w:rPr>
-              <w:t>记录生产软件release、YAML schema版本和配置哈希</w:t>
+              <w:t>、完整YAML、固定输入和版本化项目环境共同归档</w:t>
             </w:r>
           </w:p>
         </w:tc>
@@ -2329,7 +2293,7 @@
                 <w:rFonts w:ascii="Times New Roman" w:hAnsi="Times New Roman" w:eastAsia="宋体"/>
                 <w:sz w:val="18"/>
               </w:rPr>
-              <w:t>同一配置可重建相应标准产品</w:t>
+              <w:t>配置、输入与代码版本共同重建标准产品</w:t>
             </w:r>
           </w:p>
         </w:tc>
@@ -2811,7 +2775,7 @@
         <w:rPr>
           <w:rFonts w:ascii="Times New Roman" w:hAnsi="Times New Roman" w:eastAsia="宋体"/>
         </w:rPr>
-        <w:t>。版本化schema同时承接历史配置，并持续扩展来源、许可、引用和输出NetCDF溯源属性。</w:t>
+        <w:t>。显式schema版本既承接既有配置，也为配置契约的持续演化建立清晰边界。</w:t>
       </w:r>
     </w:p>
     <w:p>
@@ -2902,7 +2866,7 @@
         <w:rPr>
           <w:rFonts w:ascii="Times New Roman" w:hAnsi="Times New Roman" w:eastAsia="宋体"/>
         </w:rPr>
-        <w:t>，逐点结果与独立参考数组一致。框1给出核心配置，完整字段字典、命令和目录说明保存在数据贡献指南中；产品配置还可记录来源、许可、引用和复杂时间坐标。</w:t>
+        <w:t>，逐点结果与独立参考数组一致。框1保留维度、坐标、数值和Gapfill等核心字段，完整字段字典、命令及目录组织由版本化数据贡献指南提供。</w:t>
       </w:r>
     </w:p>
     <w:p>
@@ -3183,19 +3147,7 @@
         <w:rPr>
           <w:rFonts w:ascii="Times New Roman" w:hAnsi="Times New Roman" w:eastAsia="宋体"/>
         </w:rPr>
-        <w:t>的循环平移、线性缩放、有效范围过滤和缺失值处理。处理顺序作为复现链的一部分写入</w:t>
-      </w:r>
-      <w:r>
-        <w:rPr>
-          <w:rFonts w:ascii="Consolas" w:hAnsi="Consolas" w:eastAsia="等线"/>
-        </w:rPr>
-        <w:t>history</w:t>
-      </w:r>
-      <w:r>
-        <w:rPr>
-          <w:rFonts w:ascii="Times New Roman" w:hAnsi="Times New Roman" w:eastAsia="宋体"/>
-        </w:rPr>
-        <w:t>，完整YAML、配置SHA-256和生产代码版本与输出文件共同归档。</w:t>
+        <w:t>的循环平移、线性缩放、有效范围过滤和缺失值处理。各项转换追加为NetCDF变量属性中的变更记录；研究材料进一步将完整YAML、固定输入和版本化项目环境与输出产品共同归档。</w:t>
       </w:r>
     </w:p>
     <w:p>
@@ -3239,7 +3191,7 @@
         <w:rPr>
           <w:rFonts w:ascii="Times New Roman" w:hAnsi="Times New Roman" w:eastAsia="宋体"/>
         </w:rPr>
-        <w:t>生成唯一文件名。重复调用依据目标文件状态管理产品生成，完整YAML、配置摘要和软件版本共同记录处理上下文。</w:t>
+        <w:t>生成唯一文件名。文件级变更记录与发布级配置、输入和软件环境共同构成双层复现链，连接产品内容与其生成上下文。</w:t>
       </w:r>
     </w:p>
     <w:p>
@@ -4629,7 +4581,7 @@
         <w:rPr>
           <w:rFonts w:ascii="Times New Roman" w:hAnsi="Times New Roman" w:eastAsia="宋体"/>
         </w:rPr>
-        <w:t>生产场景包括</w:t>
+        <w:t>代表性处理实例包括</w:t>
       </w:r>
       <w:r>
         <w:rPr>
@@ -4712,7 +4664,7 @@
         <w:rPr>
           <w:rFonts w:ascii="Times New Roman" w:hAnsi="Times New Roman" w:eastAsia="宋体"/>
         </w:rPr>
-        <w:t>3.1.2 标准产品生产场景</w:t>
+        <w:t>3.1.2 标准产品生产能力覆盖</w:t>
       </w:r>
     </w:p>
     <w:p>
@@ -4720,7 +4672,7 @@
         <w:rPr>
           <w:rFonts w:ascii="Times New Roman" w:hAnsi="Times New Roman" w:eastAsia="宋体"/>
         </w:rPr>
-        <w:t>表3将标准产品生产分为维度（D）、坐标（C）、数值（N）、Gapfill（G）、YAML配置（Y）、输出（O）和空间方向检查（V）7组，共覆盖31个代表性场景。各组对应共享生产契约中的一个关键环节，并以结构、数值或产品状态描述处理结果。</w:t>
+        <w:t>表3从维度（D）、坐标（C）、数值（N）、Gapfill（G）、YAML配置（Y）、输出（O）和空间方向检查（V）7个方面组织31组代表性处理实例。各组对应共享生产契约中的一个关键环节，并以结构、数值或产品状态表征标准化结果。</w:t>
       </w:r>
     </w:p>
     <w:p>
@@ -4732,7 +4684,7 @@
           <w:rFonts w:ascii="Times New Roman" w:hAnsi="Times New Roman" w:eastAsia="宋体"/>
           <w:b/>
         </w:rPr>
-        <w:t>表3 GriddingMachineDatasets标准产品生产场景</w:t>
+        <w:t>表3 GriddingMachineDatasets标准产品生产能力与质量控制</w:t>
       </w:r>
     </w:p>
     <w:tbl>
@@ -5470,13 +5422,13 @@
           <w:rFonts w:ascii="Times New Roman" w:hAnsi="Times New Roman" w:eastAsia="宋体"/>
           <w:b/>
         </w:rPr>
-        <w:t>Table 3 Representative standardized-product production scenarios in GriddingMachineDatasets.</w:t>
-      </w:r>
-      <w:r>
-        <w:rPr>
-          <w:rFonts w:ascii="Times New Roman" w:hAnsi="Times New Roman" w:eastAsia="宋体"/>
-        </w:rPr>
-        <w:t xml:space="preserve"> The scenarios cover dimensions, coordinates, numerical transformations, gap filling, YAML configuration, product output, and spatial-orientation inspection.</w:t>
+        <w:t>Table 3 Standardized-product production capabilities and quality control in GriddingMachineDatasets.</w:t>
+      </w:r>
+      <w:r>
+        <w:rPr>
+          <w:rFonts w:ascii="Times New Roman" w:hAnsi="Times New Roman" w:eastAsia="宋体"/>
+        </w:rPr>
+        <w:t xml:space="preserve"> The representative cases cover dimensions, coordinates, numerical transformations, gap filling, YAML configuration, product output, and spatial-orientation inspection.</w:t>
       </w:r>
     </w:p>
     <w:p>
@@ -5503,7 +5455,7 @@
         <w:rPr>
           <w:rFonts w:ascii="Times New Roman" w:hAnsi="Times New Roman" w:eastAsia="宋体"/>
         </w:rPr>
-        <w:t>标准产品生产流程在各操作系统环境中保持一致行为。29个自动场景连续完成，正向图和南北反转图得到准确区分，体现了共享生产契约在数组变换、配置解析和空间方向控制方面的一致性。</w:t>
+        <w:t>标准产品生产流程在各操作系统环境中保持一致行为。29组自动处理实例连续完成，正向图和南北反转图得到准确区分，体现了共享生产契约在数组变换、配置解析和空间方向控制方面的一致性。</w:t>
       </w:r>
     </w:p>
     <w:p>
@@ -5971,7 +5923,7 @@
         <w:rPr>
           <w:rFonts w:ascii="Times New Roman" w:hAnsi="Times New Roman" w:eastAsia="宋体"/>
         </w:rPr>
-        <w:t>多镜像可靠性分析在两个独立环境中构建内容一致、访问状态可配置的镜像集合，通过延迟分数组织候选顺序，并组合响应延迟、访问中断、内容差异和传输完整性等条件。各类条件重复5次，记录候选选择、镜像遍历、正式文件状态及SHA-256，据此刻画事务式获取在不同镜像状态下的稳定性。校园网FTP与Zenodo访问进一步呈现机构镜像和公共镜像的互补分发特征与内容一致性。</w:t>
+        <w:t>多镜像可靠性分析在两个独立环境中构建内容一致、访问状态可配置的镜像集合，通过延迟分数组织候选顺序，并组合响应延迟、访问中断、内容差异和传输完整性等条件。各类镜像状态重复5次，记录候选选择、镜像遍历、正式文件状态及SHA-256，据此刻画事务式获取在镜像切换过程中的稳定性。校园网FTP与Zenodo访问进一步呈现机构镜像和公共镜像的互补分发特征与内容一致性。</w:t>
       </w:r>
     </w:p>
     <w:p>
@@ -6811,7 +6763,7 @@
         <w:rPr>
           <w:rFonts w:ascii="Times New Roman" w:hAnsi="Times New Roman" w:eastAsia="宋体"/>
         </w:rPr>
-        <w:t>表3所列31个生产场景覆盖维度、坐标、数值、Gapfill、配置、输出和空间方向控制。各操作系统环境获得一致的产品结构和逐点数值结果，正向图与南北反转图得到准确区分，自动质量控制与人工空间检查共同维护标准产品的坐标语义。</w:t>
+        <w:t>表3所列31组处理实例覆盖维度、坐标、数值、Gapfill、配置、输出和空间方向控制。各操作系统环境获得一致的产品结构和逐点数值结果，正向图与南北反转图得到准确区分，自动质量控制与人工空间检查共同维护标准产品的坐标语义。</w:t>
       </w:r>
     </w:p>
     <w:p>
@@ -7084,7 +7036,7 @@
         <w:rPr>
           <w:rFonts w:ascii="Times New Roman" w:hAnsi="Times New Roman" w:eastAsia="宋体"/>
         </w:rPr>
-        <w:t>13类镜像状态场景表明，Collector能够优先选择延迟较低的候选，同时保留全部URL并依次回退。每次获取采用独立</w:t>
+        <w:t>由13类镜像状态构成的可靠性分析表明，Collector能够优先选择延迟较低的候选，同时保留全部URL并依次回退。每次获取采用独立</w:t>
       </w:r>
       <w:r>
         <w:rPr>
@@ -7096,7 +7048,7 @@
         <w:rPr>
           <w:rFonts w:ascii="Times New Roman" w:hAnsi="Times New Roman" w:eastAsia="宋体"/>
         </w:rPr>
-        <w:t>文件，内容经字节数和SHA-256确认后进入正式路径；130次状态记录中的临时文件均被回收，既有正式文件摘要保持一致。</w:t>
+        <w:t>文件，内容经字节数和SHA-256确认后进入正式路径；130次获取记录均完成临时文件回收，既有正式文件摘要保持一致。</w:t>
       </w:r>
     </w:p>
     <w:p>
@@ -7428,7 +7380,7 @@
         <w:rPr>
           <w:rFonts w:ascii="Times New Roman" w:hAnsi="Times New Roman" w:eastAsia="宋体"/>
         </w:rPr>
-        <w:t>标签和独立目录提高数据的可发现性，多URL和直接NetCDF增强获取能力，统一网格与变量约定促进互操作，来源、许可、处理记录和版本信息支撑复用[1]。FAIR4RS强调科研软件的可执行性、复合依赖、持续演化和版本管理[16]；TRUST原则进一步提出透明度、责任、用户关注、可持续性和技术能力[17]。GriddingMachine以权威文件生成</w:t>
+        <w:t>标签和独立目录提高数据的可发现性，多URL和直接NetCDF增强获取能力，统一网格与变量约定促进互操作，文件级变更记录与发布级配置归档共同支撑复用[1]。FAIR4RS强调科研软件的可执行性、复合依赖、持续演化和版本管理[16]；TRUST原则进一步提出透明度、责任、用户关注、可持续性和技术能力[17]。对我国国家科学数据中心的调研也显示，标准化元数据、持久标识与清晰的数据使用信息是提升科学数据复用水平的重要环节[18]。GriddingMachine以权威文件生成</w:t>
       </w:r>
       <w:r>
         <w:rPr>
@@ -7440,7 +7392,7 @@
         <w:rPr>
           <w:rFonts w:ascii="Times New Roman" w:hAnsi="Times New Roman" w:eastAsia="宋体"/>
         </w:rPr>
-        <w:t>，通过下载后校验、目录事务替换和版本化依赖连接数据产品、目录与软件环境。OISST和ELEV案例进一步将配置、坐标、科学数组、文件摘要和读取结果纳入同一溯源链，为软件与数据版本的共同引用提供基础[8]。</w:t>
+        <w:t>，通过下载后校验、目录事务替换和版本化依赖连接数据产品、目录与软件环境。OISST和ELEV案例进一步将配置、坐标、科学数组、文件摘要和读取结果纳入同一复现链，为软件与数据版本的共同引用提供基础[8]。</w:t>
       </w:r>
     </w:p>
     <w:p>
@@ -7451,7 +7403,7 @@
         <w:rPr>
           <w:rFonts w:ascii="Times New Roman" w:hAnsi="Times New Roman" w:eastAsia="宋体"/>
         </w:rPr>
-        <w:t>5.4 后续拓展</w:t>
+        <w:t>5.4 框架扩展与应用前景</w:t>
       </w:r>
     </w:p>
     <w:p>
@@ -7459,7 +7411,7 @@
         <w:rPr>
           <w:rFonts w:ascii="Times New Roman" w:hAnsi="Times New Roman" w:eastAsia="宋体"/>
         </w:rPr>
-        <w:t>后续工作将沿四条路线展开。第一，迁移历史YAML，并为非规则网格、区域投影和复杂时间坐标增加数据源专用预处理模块。第二，将方向图复核与坐标单调性、值域和逐点数组断言集成，形成统一质量报告。第三，扩大FTP与Zenodo观测的文件规模、持续时间和网络环境，建立延迟辅助排序与实际下载表现的长期统计。第四，以OISST单日产品为基础扩展多时段数据生产，并将2020年ERA5气象序列、长期模型运行、结构化目录API和永久软件归档纳入版本演进，拓展科学应用与复现深度。</w:t>
+        <w:t>共享YAML契约为历史产品迁移以及非规则网格、区域投影和复杂时间坐标的源适配提供统一入口；坐标单调性、值域、逐点数组断言与方向图能够进一步汇入同一质量报告。独立目录和多镜像机制也便于积累不同文件规模、网络条件与持续时间下的传输观测，从而持续优化候选排序和镜像组织。围绕OISST建立的异构产品生产链可自然扩展至多时段海洋与气象数据，结构化目录服务和永久软件归档则将增强数据发现、版本引用及跨团队复用能力。</w:t>
       </w:r>
     </w:p>
     <w:p>
@@ -7467,43 +7419,31 @@
         <w:rPr>
           <w:rFonts w:ascii="Times New Roman" w:hAnsi="Times New Roman" w:eastAsia="宋体"/>
         </w:rPr>
-        <w:t>数据贡献流程形成固定输入路径和完整YAML示例；</w:t>
+        <w:t>现有数据贡献模板、规则网格索引、植被与非植被入口以及</w:t>
       </w:r>
       <w:r>
         <w:rPr>
           <w:rFonts w:ascii="Consolas" w:hAnsi="Consolas" w:eastAsia="等线"/>
         </w:rPr>
-        <w:t>read_dataset</w:t>
-      </w:r>
-      <w:r>
-        <w:rPr>
-          <w:rFonts w:ascii="Times New Roman" w:hAnsi="Times New Roman" w:eastAsia="宋体"/>
-        </w:rPr>
-        <w:t>的规则网格索引、植被与非植被入口以及</w:t>
+        <w:t>grid_dict/grid_weather</w:t>
+      </w:r>
+      <w:r>
+        <w:rPr>
+          <w:rFonts w:ascii="Times New Roman" w:hAnsi="Times New Roman" w:eastAsia="宋体"/>
+        </w:rPr>
+        <w:t>字段组织，已经为气象驱动、长期模拟和多模型适配形成稳定接口。</w:t>
       </w:r>
       <w:r>
         <w:rPr>
           <w:rFonts w:ascii="Consolas" w:hAnsi="Consolas" w:eastAsia="等线"/>
         </w:rPr>
-        <w:t>grid_dict/grid_weather</w:t>
-      </w:r>
-      <w:r>
-        <w:rPr>
-          <w:rFonts w:ascii="Times New Roman" w:hAnsi="Times New Roman" w:eastAsia="宋体"/>
-        </w:rPr>
-        <w:t>字段组织均纳入自动回归。</w:t>
-      </w:r>
-      <w:r>
-        <w:rPr>
-          <w:rFonts w:ascii="Consolas" w:hAnsi="Consolas" w:eastAsia="等线"/>
-        </w:rPr>
         <w:t>gm2</w:t>
       </w:r>
       <w:r>
         <w:rPr>
           <w:rFonts w:ascii="Times New Roman" w:hAnsi="Times New Roman" w:eastAsia="宋体"/>
         </w:rPr>
-        <w:t>陆面链路和Emerald最小步进为逐字段科学核对、气象驱动、长期模拟和多模型适配提供接口基础。</w:t>
+        <w:t>陆面链路与Emerald模型初始化进一步表明，GriddingMachine可以作为数据产品与地球系统模型之间的轻量中间层，在保持标准产品独立性的同时支持模型参数、边界条件和驱动数据的统一组织。</w:t>
       </w:r>
     </w:p>
     <w:p>
@@ -7522,7 +7462,7 @@
         <w:rPr>
           <w:rFonts w:ascii="Times New Roman" w:hAnsi="Times New Roman" w:eastAsia="宋体"/>
         </w:rPr>
-        <w:t>本文在2022版GriddingMachine基础上构建由共享YAML schema、显式源维度映射、Gapfill、独立目录、直接NetCDF、事务式缓存及统一读取接口组成的可执行数据生命周期。OISST V2.1产品从四维打包源数据生成1440×720标准海表温度产品，坐标、有效值掩膜和691 150个物理值与独立参考逐点一致；校园网内4个代表性产品通过FTP与Zenodo实现内容一致的双镜像获取，14类陆面产品生成US-NR1参数字典并进入Emerald模型初始化。</w:t>
+        <w:t>本文在2022版GriddingMachine基础上构建由共享YAML schema、显式源维度映射、Gapfill、独立目录、直接NetCDF、事务式缓存及统一读取接口组成的可执行数据生命周期。OISST V2.1产品从四维打包源数据生成1440×720标准海表温度产品，坐标、有效值掩膜和691 150个物理值与独立参考逐点一致；对于已经内部压缩的ELEV和LAI产品，直接NetCDF在两个独立环境中将缓存预热后的端到端中位时间降低48.3%～82.9%和53.6%～69.2%；校园网内4个代表性产品通过FTP与Zenodo实现内容一致的双镜像获取，14类陆面产品生成US-NR1参数字典并进入Emerald模型初始化。</w:t>
       </w:r>
     </w:p>
     <w:p>
@@ -7785,6 +7725,14 @@
           <w:rFonts w:ascii="Times New Roman" w:hAnsi="Times New Roman" w:eastAsia="宋体"/>
         </w:rPr>
         <w:t>[17] LIN D, CRABTREE J, DILLO I, et al. The TRUST Principles for digital repositories[J]. Scientific Data, 2020, 7: 144. DOI: 10.1038/s41597-020-0486-7.</w:t>
+      </w:r>
+    </w:p>
+    <w:p>
+      <w:r>
+        <w:rPr>
+          <w:rFonts w:ascii="Times New Roman" w:hAnsi="Times New Roman" w:eastAsia="宋体"/>
+        </w:rPr>
+        <w:t>[18] 李楠楠, 刘筱敏. 我国国家科学数据中心FAIR原则的实践现状调查与分析[J]. 图书与情报, 2023, 43(2): 137-144. DOI: 10.11968/tsyqb.1003-6938.2023032. [LI N N, LIU X M. Survey and analysis on the practice of FAIR principle in National Science Data Center of China[J]. Library and Information, 2023, 43(2): 137-144.]</w:t>
       </w:r>
     </w:p>
     <w:sectPr>

</xml_diff>

<commit_message>
streamline manuscript structure and paragraphs
</commit_message>
<xml_diff>
--- a/论文/GriddingMachine论文初稿_导师审阅版.docx
+++ b/论文/GriddingMachine论文初稿_导师审阅版.docx
@@ -82,7 +82,7 @@
         <w:rPr>
           <w:rFonts w:ascii="Times New Roman" w:hAnsi="Times New Roman" w:eastAsia="宋体"/>
         </w:rPr>
-        <w:t>多源全球网格数据在维度结构、坐标方向、数值缩放、缺失值处理和分发位置等方面具有显著差异，对地球系统模型输入的标准化生产与稳定获取提出了统一化需求。本文在2022版GriddingMachine基础上更新数据生产与分发框架，构建贯通质量控制、多镜像分发、统一读取和模型调用的数据生命周期。新版以共享配置规范（schema）和YAML驱动源维度映射、坐标转换、数值变换与缺失值填补（Gapfill），采用独立目录管理逻辑路径、镜像地址及完整性元数据，通过直接NetCDF和事务式缓存实现可信获取，并以</w:t>
+        <w:t>多源全球网格数据在维度结构、坐标方向、数值缩放、缺失值处理和分发位置等方面具有显著差异，对地球系统模型输入的标准化生产与稳定获取提出了统一化需求。本文在2022版GriddingMachine基础上构建贯通数据生产、质量控制、多镜像分发、统一读取和模型调用的数据生命周期框架。新版以共享配置规范（schema）和YAML驱动源维度映射、坐标转换、数值变换与缺失值填补（Gapfill），采用独立目录管理逻辑路径、镜像地址及完整性元数据，通过直接NetCDF和事务式缓存实现可信获取，并以</w:t>
       </w:r>
       <w:r>
         <w:rPr>
@@ -118,31 +118,7 @@
         <w:rPr>
           <w:rFonts w:ascii="Times New Roman" w:hAnsi="Times New Roman" w:eastAsia="宋体"/>
         </w:rPr>
-        <w:t>提供模型就绪数据。NOAA OISST V2.1产品由</w:t>
-      </w:r>
-      <w:r>
-        <w:rPr>
-          <w:rFonts w:ascii="Consolas" w:hAnsi="Consolas" w:eastAsia="等线"/>
-        </w:rPr>
-        <w:t>time×zlev×lat×lon</w:t>
-      </w:r>
-      <w:r>
-        <w:rPr>
-          <w:rFonts w:ascii="Times New Roman" w:hAnsi="Times New Roman" w:eastAsia="宋体"/>
-        </w:rPr>
-        <w:t>四维源结构转换为1440×720标准网格，691 150个有效格点及345 650个缺失格点与独立参考逐点一致；在两个独立运行环境中，两个内部压缩产品采用直接NetCDF后，缓存预热的端到端中位时间分别较外层</w:t>
-      </w:r>
-      <w:r>
-        <w:rPr>
-          <w:rFonts w:ascii="Consolas" w:hAnsi="Consolas" w:eastAsia="等线"/>
-        </w:rPr>
-        <w:t>tar.gz</w:t>
-      </w:r>
-      <w:r>
-        <w:rPr>
-          <w:rFonts w:ascii="Times New Roman" w:hAnsi="Times New Roman" w:eastAsia="宋体"/>
-        </w:rPr>
-        <w:t>归档降低48.3%～82.9%和53.6%～69.2%；校园网内4个代表性产品经FTP和Zenodo完成24次下载，文件大小与SHA-256均与目录登记值一致；14类陆面产品生成US-NR1参数字典并进入Emerald模型初始化。新版GriddingMachine由此形成面向全球规则网格数据的可配置生产、可信分发和模型就绪应用框架，为地球系统数据产品的持续维护与复用提供轻量化基础设施。</w:t>
+        <w:t>提供模型就绪数据。NOAA OISST V2.1产品由四维源结构转换为1440×720标准网格，691 150个有效格点与独立参考逐点一致；两个内部压缩产品采用直接NetCDF后，缓存预热的端到端中位时间在两个独立运行环境中分别降低48.3%～82.9%和53.6%～69.2%；校园网内4个代表性产品经FTP和Zenodo完成24次下载，文件大小与SHA-256均与目录登记值一致；14类陆面产品生成US-NR1参数字典并进入Emerald模型初始化。新版GriddingMachine由此形成面向全球规则网格数据的可配置生产、可信分发和模型就绪应用框架，为地球系统数据产品的持续维护与复用提供轻量化基础设施。</w:t>
       </w:r>
     </w:p>
     <w:p>
@@ -230,7 +206,7 @@
         <w:rPr>
           <w:rFonts w:ascii="Times New Roman" w:hAnsi="Times New Roman" w:eastAsia="宋体"/>
         </w:rPr>
-        <w:t xml:space="preserve">Multi-source global gridded data differ substantially in dimensional structure, coordinate orientation, numerical scaling, missing-value treatment, and distribution location, creating a demand for standardized production and reliable access to Earth system model inputs. Building on the 2022 release, this study updates GriddingMachine as an integrated lifecycle framework for data production, quality control, multi-mirror distribution, unified reading, and model use. A shared schema and YAML configuration drive source-dimension mapping, coordinate and numerical transformations, and gap filling; an independent catalog manages logical paths, mirrors, and integrity metadata; direct NetCDF and transactional caching support verified acquisition; and </w:t>
+        <w:t xml:space="preserve">Multi-source global gridded data differ substantially in dimensional structure, coordinate orientation, numerical scaling, missing-value treatment, and distribution location, creating a demand for standardized production and reliable access to Earth system model inputs. Building on the 2022 release, this study develops GriddingMachine as an integrated lifecycle framework for data production, quality control, multi-mirror distribution, unified reading, and model use. A shared schema and YAML configuration drive source-dimension mapping, coordinate and numerical transformations, and gap filling; an independent catalog manages logical paths, mirrors, and integrity metadata; direct NetCDF and transactional caching support verified acquisition; and </w:t>
       </w:r>
       <w:r>
         <w:rPr>
@@ -266,31 +242,7 @@
         <w:rPr>
           <w:rFonts w:ascii="Times New Roman" w:hAnsi="Times New Roman" w:eastAsia="宋体"/>
         </w:rPr>
-        <w:t xml:space="preserve"> provide model-ready access. A NOAA OISST V2.1 product was transformed from a four-dimensional </w:t>
-      </w:r>
-      <w:r>
-        <w:rPr>
-          <w:rFonts w:ascii="Consolas" w:hAnsi="Consolas" w:eastAsia="等线"/>
-        </w:rPr>
-        <w:t>time × zlev × lat × lon</w:t>
-      </w:r>
-      <w:r>
-        <w:rPr>
-          <w:rFonts w:ascii="Times New Roman" w:hAnsi="Times New Roman" w:eastAsia="宋体"/>
-        </w:rPr>
-        <w:t xml:space="preserve"> source structure to a standardized 1440 × 720 grid, with 691,150 finite and 345,650 missing grid cells matching an independently decoded reference point by point. Compared with external </w:t>
-      </w:r>
-      <w:r>
-        <w:rPr>
-          <w:rFonts w:ascii="Consolas" w:hAnsi="Consolas" w:eastAsia="等线"/>
-        </w:rPr>
-        <w:t>tar.gz</w:t>
-      </w:r>
-      <w:r>
-        <w:rPr>
-          <w:rFonts w:ascii="Times New Roman" w:hAnsi="Times New Roman" w:eastAsia="宋体"/>
-        </w:rPr>
-        <w:t xml:space="preserve"> archives, direct NetCDF reduced the median warm-cache end-to-end time for two internally compressed products by 48.3%–82.9% and 53.6%–69.2% in two independent runtime environments, respectively. Four representative products underwent 24 FTP and Zenodo downloads on the campus network, with file sizes and SHA-256 digests matching their catalog records. Fourteen land products generated a parameter dictionary for US-NR1 and entered Emerald model initialization. The updated GriddingMachine provides a lightweight infrastructure for configurable production, integrity-aware distribution, and model-ready use of global regular-grid data.</w:t>
+        <w:t xml:space="preserve"> provide model-ready access. A NOAA OISST V2.1 product was transformed from a four-dimensional source structure to a standardized 1440 × 720 grid, with 691,150 finite cells matching an independently decoded reference point by point. Direct NetCDF reduced median warm-cache end-to-end time for two internally compressed products by 48.3%–82.9% and 53.6%–69.2% in two independent runtime environments. Four representative products were downloaded 24 times from FTP and Zenodo on the campus network, with file sizes and SHA-256 digests matching their catalog records. Fourteen land products generated a parameter dictionary for US-NR1 and entered Emerald model initialization. The updated GriddingMachine provides a lightweight infrastructure for configurable production, integrity-aware distribution, and model-ready use of global regular-grid data.</w:t>
       </w:r>
     </w:p>
     <w:p>
@@ -352,19 +304,7 @@
         <w:rPr>
           <w:rFonts w:ascii="Times New Roman" w:hAnsi="Times New Roman" w:eastAsia="宋体"/>
         </w:rPr>
-        <w:t>和Julia artifact机制实现数据管理和自动下载，同时提供Julia、MATLAB、Octave、Python和R接口。旧版目录已经记录SHA-1、SHA-256和一个或多个下载URL，数据标准也已规定经纬度方向、空间分辨率、变量名称、缺失值、单位、引用信息和处理日志。本文以这些既有设计为基础，将数据源专用处理提升为共享、可复用的生产契约，使数据目录具备独立演化能力，以事务缓存支持直接NetCDF获取，并通过统一接口组织模型输入。旧版</w:t>
-      </w:r>
-      <w:r>
-        <w:rPr>
-          <w:rFonts w:ascii="Consolas" w:hAnsi="Consolas" w:eastAsia="等线"/>
-        </w:rPr>
-        <w:t>tar.gz</w:t>
-      </w:r>
-      <w:r>
-        <w:rPr>
-          <w:rFonts w:ascii="Times New Roman" w:hAnsi="Times New Roman" w:eastAsia="宋体"/>
-        </w:rPr>
-        <w:t>分发单元和随软件发布更新的目录为生命周期升级提供了明确基线。</w:t>
+        <w:t>和Julia artifact机制实现数据管理和自动下载，同时提供Julia、MATLAB、Octave、Python和R接口。旧版目录已经记录SHA-1、SHA-256和一个或多个下载URL，数据标准也已规定经纬度方向、空间分辨率、变量名称、缺失值、单位、引用信息和处理日志。</w:t>
       </w:r>
     </w:p>
     <w:p>
@@ -372,7 +312,19 @@
         <w:rPr>
           <w:rFonts w:ascii="Times New Roman" w:hAnsi="Times New Roman" w:eastAsia="宋体"/>
         </w:rPr>
-        <w:t>从相关技术体系看，NetCDF以维度、变量和属性构成机器无关的多维科学数据抽象[5]，地球系统数据立方体则强调对多变量时空数据的共同组织和分析[6]；Julia通过多重派发和专业化兼顾高层抽象与科学计算性能[7]。与此同时，软件引用原则要求科研软件具有可识别、可持续、可访问和可归属的版本记录[8]。这些工作分别支撑文件表达、多变量分析、计算实现和软件引用；本文进一步把相关能力连接为“异构数据生产—多镜像分发—内容完整性保障—模型输入组织”的领域闭环。</w:t>
+        <w:t>本文以这些既有设计为基础，将数据源专用处理提升为共享、可复用的生产契约，使数据目录具备独立演化能力，以事务缓存支持直接NetCDF获取，并通过统一接口组织模型输入。旧版</w:t>
+      </w:r>
+      <w:r>
+        <w:rPr>
+          <w:rFonts w:ascii="Consolas" w:hAnsi="Consolas" w:eastAsia="等线"/>
+        </w:rPr>
+        <w:t>tar.gz</w:t>
+      </w:r>
+      <w:r>
+        <w:rPr>
+          <w:rFonts w:ascii="Times New Roman" w:hAnsi="Times New Roman" w:eastAsia="宋体"/>
+        </w:rPr>
+        <w:t>分发单元和随软件发布更新的目录为生命周期升级提供了明确基线。</w:t>
       </w:r>
     </w:p>
     <w:p>
@@ -380,6 +332,14 @@
         <w:rPr>
           <w:rFonts w:ascii="Times New Roman" w:hAnsi="Times New Roman" w:eastAsia="宋体"/>
         </w:rPr>
+        <w:t>从相关技术体系看，NetCDF以维度、变量和属性构成机器无关的多维科学数据抽象[5]，地球系统数据立方体则强调对多变量时空数据的共同组织和分析[6]；Julia通过多重派发和专业化兼顾高层抽象与科学计算性能[7]。与此同时，软件引用原则要求科研软件具有可识别、可持续、可访问和可归属的版本记录[8]。这些工作分别支撑文件表达、多变量分析、计算实现和软件引用；本文进一步把相关能力连接为“异构数据生产—多镜像分发—内容完整性保障—模型输入组织”的领域闭环。</w:t>
+      </w:r>
+    </w:p>
+    <w:p>
+      <w:r>
+        <w:rPr>
+          <w:rFonts w:ascii="Times New Roman" w:hAnsi="Times New Roman" w:eastAsia="宋体"/>
+        </w:rPr>
         <w:t>本研究将GriddingMachine由标准数据集合与标签化访问工具扩展为面向全球规则网格数据的可执行生命周期框架。其核心推进体现在三个相互衔接的层面：生产端以共享YAML契约统一表达源维度、坐标、数值变换、Gapfill和质量控制，形成可复用的标准NetCDF生产流程；分发端以独立目录连接机构FTP、Zenodo及其他社区镜像，并通过直接NetCDF、事务式缓存和</w:t>
       </w:r>
       <w:r>
@@ -392,7 +352,15 @@
         <w:rPr>
           <w:rFonts w:ascii="Times New Roman" w:hAnsi="Times New Roman" w:eastAsia="宋体"/>
         </w:rPr>
-        <w:t>构建内容一致的可信分发链；应用端以统一读取和模型输入组织连接标准数据产品与Emerald。本文进一步通过OISST产品转换、ELEV/LAI分发效率、FTP—Zenodo镜像访问和</w:t>
+        <w:t>构建内容一致的可信分发链；应用端以统一读取和模型输入组织连接标准数据产品与Emerald。</w:t>
+      </w:r>
+    </w:p>
+    <w:p>
+      <w:r>
+        <w:rPr>
+          <w:rFonts w:ascii="Times New Roman" w:hAnsi="Times New Roman" w:eastAsia="宋体"/>
+        </w:rPr>
+        <w:t>本文通过OISST产品转换、ELEV/LAI分发效率、FTP—Zenodo镜像访问和</w:t>
       </w:r>
       <w:r>
         <w:rPr>
@@ -404,7 +372,7 @@
         <w:rPr>
           <w:rFonts w:ascii="Times New Roman" w:hAnsi="Times New Roman" w:eastAsia="宋体"/>
         </w:rPr>
-        <w:t>陆面参数应用，呈现该框架在标准化正确性、数据获取效率、内容完整性和模型适配方面的综合价值。</w:t>
+        <w:t>陆面参数应用，分别呈现该框架的标准化正确性、数据获取效率、内容完整性和模型适配能力。</w:t>
       </w:r>
     </w:p>
     <w:p>
@@ -415,7 +383,7 @@
         <w:rPr>
           <w:rFonts w:ascii="Times New Roman" w:hAnsi="Times New Roman" w:eastAsia="宋体"/>
         </w:rPr>
-        <w:t>2 新版架构与关键方法</w:t>
+        <w:t>2 框架设计与关键方法</w:t>
       </w:r>
     </w:p>
     <w:p>
@@ -713,7 +681,7 @@
         <w:rPr>
           <w:rFonts w:ascii="Times New Roman" w:hAnsi="Times New Roman" w:eastAsia="宋体"/>
         </w:rPr>
-        <w:t>文件；文件通过</w:t>
+        <w:t>文件，文件通过</w:t>
       </w:r>
       <w:r>
         <w:rPr>
@@ -749,7 +717,15 @@
         <w:rPr>
           <w:rFonts w:ascii="Times New Roman" w:hAnsi="Times New Roman" w:eastAsia="宋体"/>
         </w:rPr>
-        <w:t>，异常缓存随当前尝试清理。历史目录通过兼容模式继续提供数据获取能力，新目录形成内容完整、来源清晰的分发链。Indexer通过</w:t>
+        <w:t>，历史目录则通过兼容模式继续提供数据获取能力。</w:t>
+      </w:r>
+    </w:p>
+    <w:p>
+      <w:r>
+        <w:rPr>
+          <w:rFonts w:ascii="Times New Roman" w:hAnsi="Times New Roman" w:eastAsia="宋体"/>
+        </w:rPr>
+        <w:t>Indexer通过</w:t>
       </w:r>
       <w:r>
         <w:rPr>
@@ -797,7 +773,7 @@
         <w:rPr>
           <w:rFonts w:ascii="Times New Roman" w:hAnsi="Times New Roman" w:eastAsia="宋体"/>
         </w:rPr>
-        <w:t>产品贯通陆面参数链路并进入Emerald初始化。</w:t>
+        <w:t>产品贯通陆面参数链路并进入Emerald初始化，使可信分发的数据产品直接进入模型应用。</w:t>
       </w:r>
     </w:p>
     <w:p>
@@ -1502,7 +1478,7 @@
         <w:rPr>
           <w:rFonts w:ascii="Times New Roman" w:hAnsi="Times New Roman" w:eastAsia="宋体"/>
         </w:rPr>
-        <w:t>2.2 数据标准与 YAML 驱动的生产流程</w:t>
+        <w:t>2.2 YAML驱动的标准数据生产</w:t>
       </w:r>
     </w:p>
     <w:p>
@@ -1513,7 +1489,7 @@
         <w:rPr>
           <w:rFonts w:ascii="Times New Roman" w:hAnsi="Times New Roman" w:eastAsia="宋体"/>
         </w:rPr>
-        <w:t>2.2.1 标准 NetCDF 数据模型</w:t>
+        <w:t>2.2.1 数据契约与维度映射</w:t>
       </w:r>
     </w:p>
     <w:p>
@@ -2591,7 +2567,7 @@
         <w:rPr>
           <w:rFonts w:ascii="Times New Roman" w:hAnsi="Times New Roman" w:eastAsia="宋体"/>
         </w:rPr>
-        <w:t>2.2.2 YAML 配置结构</w:t>
+        <w:t>2.2.2 YAML配置与转换示例</w:t>
       </w:r>
     </w:p>
     <w:p>
@@ -2776,17 +2752,6 @@
           <w:rFonts w:ascii="Times New Roman" w:hAnsi="Times New Roman" w:eastAsia="宋体"/>
         </w:rPr>
         <w:t>。显式schema版本既承接既有配置，也为配置契约的持续演化建立清晰边界。</w:t>
-      </w:r>
-    </w:p>
-    <w:p>
-      <w:pPr>
-        <w:pStyle w:val="Heading3"/>
-      </w:pPr>
-      <w:r>
-        <w:rPr>
-          <w:rFonts w:ascii="Times New Roman" w:hAnsi="Times New Roman" w:eastAsia="宋体"/>
-        </w:rPr>
-        <w:t>2.2.3 YAML配置与维度转换示例</w:t>
       </w:r>
     </w:p>
     <w:p>
@@ -2943,17 +2908,6 @@
       </w:r>
     </w:p>
     <w:p>
-      <w:pPr>
-        <w:pStyle w:val="Heading3"/>
-      </w:pPr>
-      <w:r>
-        <w:rPr>
-          <w:rFonts w:ascii="Times New Roman" w:hAnsi="Times New Roman" w:eastAsia="宋体"/>
-        </w:rPr>
-        <w:t>2.2.4 配置构建器与共享schema</w:t>
-      </w:r>
-    </w:p>
-    <w:p>
       <w:r>
         <w:rPr>
           <w:rFonts w:ascii="Consolas" w:hAnsi="Consolas" w:eastAsia="等线"/>
@@ -3049,7 +3003,7 @@
         <w:rPr>
           <w:rFonts w:ascii="Times New Roman" w:hAnsi="Times New Roman" w:eastAsia="宋体"/>
         </w:rPr>
-        <w:t>2.2.5 数据处理顺序与可追溯输出</w:t>
+        <w:t>2.2.3 生产流程与质量控制</w:t>
       </w:r>
     </w:p>
     <w:p>
@@ -3192,6 +3146,230 @@
           <w:rFonts w:ascii="Times New Roman" w:hAnsi="Times New Roman" w:eastAsia="宋体"/>
         </w:rPr>
         <w:t>生成唯一文件名。文件级变更记录与发布级配置、输入和软件环境共同构成双层复现链，连接产品内容与其生成上下文。</w:t>
+      </w:r>
+    </w:p>
+    <w:p>
+      <w:r>
+        <w:rPr>
+          <w:rFonts w:ascii="Times New Roman" w:hAnsi="Times New Roman" w:eastAsia="宋体"/>
+        </w:rPr>
+        <w:t xml:space="preserve">当前生产流水线在 </w:t>
+      </w:r>
+      <w:r>
+        <w:rPr>
+          <w:rFonts w:ascii="Consolas" w:hAnsi="Consolas" w:eastAsia="等线"/>
+        </w:rPr>
+        <w:t>read_input</w:t>
+      </w:r>
+      <w:r>
+        <w:rPr>
+          <w:rFonts w:ascii="Times New Roman" w:hAnsi="Times New Roman" w:eastAsia="宋体"/>
+        </w:rPr>
+        <w:t xml:space="preserve"> 完成经纬度翻转、经度范围调整、线性缩放、有效范围过滤和缺失值处理后，调用 </w:t>
+      </w:r>
+      <w:r>
+        <w:rPr>
+          <w:rFonts w:ascii="Consolas" w:hAnsi="Consolas" w:eastAsia="等线"/>
+        </w:rPr>
+        <w:t>verify_data!</w:t>
+      </w:r>
+      <w:r>
+        <w:rPr>
+          <w:rFonts w:ascii="Times New Roman" w:hAnsi="Times New Roman" w:eastAsia="宋体"/>
+        </w:rPr>
+        <w:t xml:space="preserve"> 对待保存数组进行方向检查。该函数把数组写入调用者指定或默认的NetCDF缓存文件，Python脚本依据变量维度名重排为</w:t>
+      </w:r>
+      <w:r>
+        <w:rPr>
+          <w:rFonts w:ascii="Consolas" w:hAnsi="Consolas" w:eastAsia="等线"/>
+        </w:rPr>
+        <w:t>(lat,lon)</w:t>
+      </w:r>
+      <w:r>
+        <w:rPr>
+          <w:rFonts w:ascii="Times New Roman" w:hAnsi="Times New Roman" w:eastAsia="宋体"/>
+        </w:rPr>
+        <w:t>后生成带经纬度坐标轴的图件；二维数据输出PNG，三维数据沿</w:t>
+      </w:r>
+      <w:r>
+        <w:rPr>
+          <w:rFonts w:ascii="Consolas" w:hAnsi="Consolas" w:eastAsia="等线"/>
+        </w:rPr>
+        <w:t>ind</w:t>
+      </w:r>
+      <w:r>
+        <w:rPr>
+          <w:rFonts w:ascii="Times New Roman" w:hAnsi="Times New Roman" w:eastAsia="宋体"/>
+        </w:rPr>
+        <w:t>维输出GIF。操作者查看图件并在终端记录接受或退回状态。YAML中的</w:t>
+      </w:r>
+      <w:r>
+        <w:rPr>
+          <w:rFonts w:ascii="Consolas" w:hAnsi="Consolas" w:eastAsia="等线"/>
+        </w:rPr>
+        <w:t>VERIFY_ONCE</w:t>
+      </w:r>
+      <w:r>
+        <w:rPr>
+          <w:rFonts w:ascii="Times New Roman" w:hAnsi="Times New Roman" w:eastAsia="宋体"/>
+        </w:rPr>
+        <w:t>控制同一配置组合的首次确认，通过状态保存在该次处理使用的配置副本中。</w:t>
+      </w:r>
+    </w:p>
+    <w:p>
+      <w:r>
+        <w:rPr>
+          <w:rFonts w:ascii="Times New Roman" w:hAnsi="Times New Roman" w:eastAsia="宋体"/>
+        </w:rPr>
+        <w:t>这一过程用于识别南北方向、东西方向和经度平移状态。方向正确与南北反转的非对称位置编码图得到准确区分。人工空间判断与自动坐标、结构和逐点数值检查共同组成直观的方向质量控制体系。</w:t>
+      </w:r>
+    </w:p>
+    <w:p>
+      <w:r>
+        <w:rPr>
+          <w:rFonts w:ascii="Times New Roman" w:hAnsi="Times New Roman" w:eastAsia="宋体"/>
+        </w:rPr>
+        <w:t>对于已经生成的NetCDF文件，</w:t>
+      </w:r>
+      <w:r>
+        <w:rPr>
+          <w:rFonts w:ascii="Consolas" w:hAnsi="Consolas" w:eastAsia="等线"/>
+        </w:rPr>
+        <w:t>verify_processed_data!</w:t>
+      </w:r>
+      <w:r>
+        <w:rPr>
+          <w:rFonts w:ascii="Times New Roman" w:hAnsi="Times New Roman" w:eastAsia="宋体"/>
+        </w:rPr>
+        <w:t>提供独立的结构和数值检查。该函数首先确认文件及覆盖类型，支持全球陆地和海洋（</w:t>
+      </w:r>
+      <w:r>
+        <w:rPr>
+          <w:rFonts w:ascii="Consolas" w:hAnsi="Consolas" w:eastAsia="等线"/>
+        </w:rPr>
+        <w:t>both</w:t>
+      </w:r>
+      <w:r>
+        <w:rPr>
+          <w:rFonts w:ascii="Times New Roman" w:hAnsi="Times New Roman" w:eastAsia="宋体"/>
+        </w:rPr>
+        <w:t>）与陆地（</w:t>
+      </w:r>
+      <w:r>
+        <w:rPr>
+          <w:rFonts w:ascii="Consolas" w:hAnsi="Consolas" w:eastAsia="等线"/>
+        </w:rPr>
+        <w:t>land</w:t>
+      </w:r>
+      <w:r>
+        <w:rPr>
+          <w:rFonts w:ascii="Times New Roman" w:hAnsi="Times New Roman" w:eastAsia="宋体"/>
+        </w:rPr>
+        <w:t>）两类产品。随后检查</w:t>
+      </w:r>
+      <w:r>
+        <w:rPr>
+          <w:rFonts w:ascii="Consolas" w:hAnsi="Consolas" w:eastAsia="等线"/>
+        </w:rPr>
+        <w:t>lon</w:t>
+      </w:r>
+      <w:r>
+        <w:rPr>
+          <w:rFonts w:ascii="Times New Roman" w:hAnsi="Times New Roman" w:eastAsia="宋体"/>
+        </w:rPr>
+        <w:t>、</w:t>
+      </w:r>
+      <w:r>
+        <w:rPr>
+          <w:rFonts w:ascii="Consolas" w:hAnsi="Consolas" w:eastAsia="等线"/>
+        </w:rPr>
+        <w:t>lat</w:t>
+      </w:r>
+      <w:r>
+        <w:rPr>
+          <w:rFonts w:ascii="Times New Roman" w:hAnsi="Times New Roman" w:eastAsia="宋体"/>
+        </w:rPr>
+        <w:t>维度、坐标变量和主变量</w:t>
+      </w:r>
+      <w:r>
+        <w:rPr>
+          <w:rFonts w:ascii="Consolas" w:hAnsi="Consolas" w:eastAsia="等线"/>
+        </w:rPr>
+        <w:t>data</w:t>
+      </w:r>
+      <w:r>
+        <w:rPr>
+          <w:rFonts w:ascii="Times New Roman" w:hAnsi="Times New Roman" w:eastAsia="宋体"/>
+        </w:rPr>
+        <w:t>，三维产品进一步检查</w:t>
+      </w:r>
+      <w:r>
+        <w:rPr>
+          <w:rFonts w:ascii="Consolas" w:hAnsi="Consolas" w:eastAsia="等线"/>
+        </w:rPr>
+        <w:t>ind</w:t>
+      </w:r>
+      <w:r>
+        <w:rPr>
+          <w:rFonts w:ascii="Times New Roman" w:hAnsi="Times New Roman" w:eastAsia="宋体"/>
+        </w:rPr>
+        <w:t>，并验证各维长度的一致性。数值检查读取完整</w:t>
+      </w:r>
+      <w:r>
+        <w:rPr>
+          <w:rFonts w:ascii="Consolas" w:hAnsi="Consolas" w:eastAsia="等线"/>
+        </w:rPr>
+        <w:t>data</w:t>
+      </w:r>
+      <w:r>
+        <w:rPr>
+          <w:rFonts w:ascii="Times New Roman" w:hAnsi="Times New Roman" w:eastAsia="宋体"/>
+        </w:rPr>
+        <w:t>数组，计算有效值的最小值和最大值，并评价其与给定范围的符合程度。</w:t>
+      </w:r>
+    </w:p>
+    <w:p>
+      <w:r>
+        <w:rPr>
+          <w:rFonts w:ascii="Times New Roman" w:hAnsi="Times New Roman" w:eastAsia="宋体"/>
+        </w:rPr>
+        <w:t>缺失值检查根据覆盖类型执行。</w:t>
+      </w:r>
+      <w:r>
+        <w:rPr>
+          <w:rFonts w:ascii="Consolas" w:hAnsi="Consolas" w:eastAsia="等线"/>
+        </w:rPr>
+        <w:t>both</w:t>
+      </w:r>
+      <w:r>
+        <w:rPr>
+          <w:rFonts w:ascii="Times New Roman" w:hAnsi="Times New Roman" w:eastAsia="宋体"/>
+        </w:rPr>
+        <w:t>要求整个数组具有完整有效值；</w:t>
+      </w:r>
+      <w:r>
+        <w:rPr>
+          <w:rFonts w:ascii="Consolas" w:hAnsi="Consolas" w:eastAsia="等线"/>
+        </w:rPr>
+        <w:t>land</w:t>
+      </w:r>
+      <w:r>
+        <w:rPr>
+          <w:rFonts w:ascii="Times New Roman" w:hAnsi="Times New Roman" w:eastAsia="宋体"/>
+        </w:rPr>
+        <w:t>在经度长度为360、720或1 440时读取并重采样</w:t>
+      </w:r>
+      <w:r>
+        <w:rPr>
+          <w:rFonts w:ascii="Consolas" w:hAnsi="Consolas" w:eastAsia="等线"/>
+        </w:rPr>
+        <w:t>LM_4X_1Y_V1</w:t>
+      </w:r>
+      <w:r>
+        <w:rPr>
+          <w:rFonts w:ascii="Times New Roman" w:hAnsi="Times New Roman" w:eastAsia="宋体"/>
+        </w:rPr>
+        <w:t>陆地掩膜，逐层检查陆地区域。其他空间分辨率由专用规则承接。结构、范围和陆地掩膜检查与生产阶段的坐标方向、变量属性和处理记录共同构成标准产品的质量信息。</w:t>
       </w:r>
     </w:p>
     <w:p>
@@ -3202,7 +3380,7 @@
         <w:rPr>
           <w:rFonts w:ascii="Times New Roman" w:hAnsi="Times New Roman" w:eastAsia="宋体"/>
         </w:rPr>
-        <w:t>2.3 数据质量检查与目录登记</w:t>
+        <w:t>2.3 产品发布与独立数据目录</w:t>
       </w:r>
     </w:p>
     <w:p>
@@ -3213,7 +3391,7 @@
         <w:rPr>
           <w:rFonts w:ascii="Times New Roman" w:hAnsi="Times New Roman" w:eastAsia="宋体"/>
         </w:rPr>
-        <w:t>2.3.1 处理过程中的空间方向控制</w:t>
+        <w:t>2.3.1 标签生成与目录登记</w:t>
       </w:r>
     </w:p>
     <w:p>
@@ -3221,67 +3399,91 @@
         <w:rPr>
           <w:rFonts w:ascii="Times New Roman" w:hAnsi="Times New Roman" w:eastAsia="宋体"/>
         </w:rPr>
-        <w:t xml:space="preserve">当前生产流水线在 </w:t>
+        <w:t>数据文件名由</w:t>
       </w:r>
       <w:r>
         <w:rPr>
           <w:rFonts w:ascii="Consolas" w:hAnsi="Consolas" w:eastAsia="等线"/>
         </w:rPr>
-        <w:t>read_input</w:t>
-      </w:r>
-      <w:r>
-        <w:rPr>
-          <w:rFonts w:ascii="Times New Roman" w:hAnsi="Times New Roman" w:eastAsia="宋体"/>
-        </w:rPr>
-        <w:t xml:space="preserve"> 完成经纬度翻转、经度范围调整、线性缩放、有效范围过滤和缺失值处理后，调用 </w:t>
+        <w:t>griddingmachine_tag</w:t>
+      </w:r>
+      <w:r>
+        <w:rPr>
+          <w:rFonts w:ascii="Times New Roman" w:hAnsi="Times New Roman" w:eastAsia="宋体"/>
+        </w:rPr>
+        <w:t>生成，基本形式为</w:t>
       </w:r>
       <w:r>
         <w:rPr>
           <w:rFonts w:ascii="Consolas" w:hAnsi="Consolas" w:eastAsia="等线"/>
         </w:rPr>
-        <w:t>verify_data!</w:t>
-      </w:r>
-      <w:r>
-        <w:rPr>
-          <w:rFonts w:ascii="Times New Roman" w:hAnsi="Times New Roman" w:eastAsia="宋体"/>
-        </w:rPr>
-        <w:t xml:space="preserve"> 对待保存数组进行方向检查。该函数把数组写入调用者指定或默认的NetCDF缓存文件，Python脚本依据变量维度名重排为</w:t>
+        <w:t>TAG_(PREFIX_)NX_MT_(YYYY_)VV(_REVISION)</w:t>
+      </w:r>
+      <w:r>
+        <w:rPr>
+          <w:rFonts w:ascii="Times New Roman" w:hAnsi="Times New Roman" w:eastAsia="宋体"/>
+        </w:rPr>
+        <w:t>。其中</w:t>
       </w:r>
       <w:r>
         <w:rPr>
           <w:rFonts w:ascii="Consolas" w:hAnsi="Consolas" w:eastAsia="等线"/>
         </w:rPr>
-        <w:t>(lat,lon)</w:t>
-      </w:r>
-      <w:r>
-        <w:rPr>
-          <w:rFonts w:ascii="Times New Roman" w:hAnsi="Times New Roman" w:eastAsia="宋体"/>
-        </w:rPr>
-        <w:t>后生成带经纬度坐标轴的图件；二维数据输出PNG，三维数据沿</w:t>
+        <w:t>NX</w:t>
+      </w:r>
+      <w:r>
+        <w:rPr>
+          <w:rFonts w:ascii="Times New Roman" w:hAnsi="Times New Roman" w:eastAsia="宋体"/>
+        </w:rPr>
+        <w:t>表示空间分辨率，</w:t>
       </w:r>
       <w:r>
         <w:rPr>
           <w:rFonts w:ascii="Consolas" w:hAnsi="Consolas" w:eastAsia="等线"/>
         </w:rPr>
-        <w:t>ind</w:t>
-      </w:r>
-      <w:r>
-        <w:rPr>
-          <w:rFonts w:ascii="Times New Roman" w:hAnsi="Times New Roman" w:eastAsia="宋体"/>
-        </w:rPr>
-        <w:t>维输出GIF。操作者查看图件并在终端记录接受或退回状态。YAML中的</w:t>
+        <w:t>MT</w:t>
+      </w:r>
+      <w:r>
+        <w:rPr>
+          <w:rFonts w:ascii="Times New Roman" w:hAnsi="Times New Roman" w:eastAsia="宋体"/>
+        </w:rPr>
+        <w:t>表示时间分辨率，</w:t>
       </w:r>
       <w:r>
         <w:rPr>
           <w:rFonts w:ascii="Consolas" w:hAnsi="Consolas" w:eastAsia="等线"/>
         </w:rPr>
-        <w:t>VERIFY_ONCE</w:t>
-      </w:r>
-      <w:r>
-        <w:rPr>
-          <w:rFonts w:ascii="Times New Roman" w:hAnsi="Times New Roman" w:eastAsia="宋体"/>
-        </w:rPr>
-        <w:t>控制同一配置组合的首次确认，通过状态保存在该次处理使用的配置副本中。</w:t>
+        <w:t>YYYY</w:t>
+      </w:r>
+      <w:r>
+        <w:rPr>
+          <w:rFonts w:ascii="Times New Roman" w:hAnsi="Times New Roman" w:eastAsia="宋体"/>
+        </w:rPr>
+        <w:t>和</w:t>
+      </w:r>
+      <w:r>
+        <w:rPr>
+          <w:rFonts w:ascii="Consolas" w:hAnsi="Consolas" w:eastAsia="等线"/>
+        </w:rPr>
+        <w:t>REVISION</w:t>
+      </w:r>
+      <w:r>
+        <w:rPr>
+          <w:rFonts w:ascii="Times New Roman" w:hAnsi="Times New Roman" w:eastAsia="宋体"/>
+        </w:rPr>
+        <w:t>为可选部分。生成输出路径时，代码读取当前</w:t>
+      </w:r>
+      <w:r>
+        <w:rPr>
+          <w:rFonts w:ascii="Consolas" w:hAnsi="Consolas" w:eastAsia="等线"/>
+        </w:rPr>
+        <w:t>Artifacts.yaml</w:t>
+      </w:r>
+      <w:r>
+        <w:rPr>
+          <w:rFonts w:ascii="Times New Roman" w:hAnsi="Times New Roman" w:eastAsia="宋体"/>
+        </w:rPr>
+        <w:t>并识别标签状态，以保持数据产品标识的唯一性。</w:t>
       </w:r>
     </w:p>
     <w:p>
@@ -3289,7 +3491,123 @@
         <w:rPr>
           <w:rFonts w:ascii="Times New Roman" w:hAnsi="Times New Roman" w:eastAsia="宋体"/>
         </w:rPr>
-        <w:t>这一过程用于识别南北方向、东西方向和经度平移状态。方向正确与南北反转的非对称位置编码图得到准确区分。人工空间判断与自动坐标、结构和逐点数值检查共同组成直观的方向质量控制体系。</w:t>
+        <w:t>数据发布与目录登记采用解耦设计。维护者在Zenodo、机构FTP或其他存储中发布标准产品，再将本地NetCDF路径和公开URL交给</w:t>
+      </w:r>
+      <w:r>
+        <w:rPr>
+          <w:rFonts w:ascii="Consolas" w:hAnsi="Consolas" w:eastAsia="等线"/>
+        </w:rPr>
+        <w:t>update_yaml_library!</w:t>
+      </w:r>
+      <w:r>
+        <w:rPr>
+          <w:rFonts w:ascii="Times New Roman" w:hAnsi="Times New Roman" w:eastAsia="宋体"/>
+        </w:rPr>
+        <w:t>。该函数调用</w:t>
+      </w:r>
+      <w:r>
+        <w:rPr>
+          <w:rFonts w:ascii="Consolas" w:hAnsi="Consolas" w:eastAsia="等线"/>
+        </w:rPr>
+        <w:t>build_catalog_entry</w:t>
+      </w:r>
+      <w:r>
+        <w:rPr>
+          <w:rFonts w:ascii="Times New Roman" w:hAnsi="Times New Roman" w:eastAsia="宋体"/>
+        </w:rPr>
+        <w:t>生成</w:t>
+      </w:r>
+      <w:r>
+        <w:rPr>
+          <w:rFonts w:ascii="Consolas" w:hAnsi="Consolas" w:eastAsia="等线"/>
+        </w:rPr>
+        <w:t>PATH</w:t>
+      </w:r>
+      <w:r>
+        <w:rPr>
+          <w:rFonts w:ascii="Times New Roman" w:hAnsi="Times New Roman" w:eastAsia="宋体"/>
+        </w:rPr>
+        <w:t>、去重后的</w:t>
+      </w:r>
+      <w:r>
+        <w:rPr>
+          <w:rFonts w:ascii="Consolas" w:hAnsi="Consolas" w:eastAsia="等线"/>
+        </w:rPr>
+        <w:t>URL</w:t>
+      </w:r>
+      <w:r>
+        <w:rPr>
+          <w:rFonts w:ascii="Times New Roman" w:hAnsi="Times New Roman" w:eastAsia="宋体"/>
+        </w:rPr>
+        <w:t>、</w:t>
+      </w:r>
+      <w:r>
+        <w:rPr>
+          <w:rFonts w:ascii="Consolas" w:hAnsi="Consolas" w:eastAsia="等线"/>
+        </w:rPr>
+        <w:t>SIZE</w:t>
+      </w:r>
+      <w:r>
+        <w:rPr>
+          <w:rFonts w:ascii="Times New Roman" w:hAnsi="Times New Roman" w:eastAsia="宋体"/>
+        </w:rPr>
+        <w:t>和</w:t>
+      </w:r>
+      <w:r>
+        <w:rPr>
+          <w:rFonts w:ascii="Consolas" w:hAnsi="Consolas" w:eastAsia="等线"/>
+        </w:rPr>
+        <w:t>SHA256</w:t>
+      </w:r>
+      <w:r>
+        <w:rPr>
+          <w:rFonts w:ascii="Times New Roman" w:hAnsi="Times New Roman" w:eastAsia="宋体"/>
+        </w:rPr>
+        <w:t>，按标签排序后通过临时文件更新</w:t>
+      </w:r>
+      <w:r>
+        <w:rPr>
+          <w:rFonts w:ascii="Consolas" w:hAnsi="Consolas" w:eastAsia="等线"/>
+        </w:rPr>
+        <w:t>Artifacts.yaml</w:t>
+      </w:r>
+      <w:r>
+        <w:rPr>
+          <w:rFonts w:ascii="Times New Roman" w:hAnsi="Times New Roman" w:eastAsia="宋体"/>
+        </w:rPr>
+        <w:t>，从而形成职责清晰、内容可校验的目录生成流程。</w:t>
+      </w:r>
+    </w:p>
+    <w:p>
+      <w:r>
+        <w:rPr>
+          <w:rFonts w:ascii="Times New Roman" w:hAnsi="Times New Roman" w:eastAsia="宋体"/>
+        </w:rPr>
+        <w:t>目录生成器从本地标准文件计算字节数和SHA-256并写入YAML，下载端以相同字段确认实际内容，从而形成“本地标准文件—目录条目—下载文件”的完整性链。历史目录迁移以权威本地文件重新生成</w:t>
+      </w:r>
+      <w:r>
+        <w:rPr>
+          <w:rFonts w:ascii="Consolas" w:hAnsi="Consolas" w:eastAsia="等线"/>
+        </w:rPr>
+        <w:t>SIZE/SHA256</w:t>
+      </w:r>
+      <w:r>
+        <w:rPr>
+          <w:rFonts w:ascii="Times New Roman" w:hAnsi="Times New Roman" w:eastAsia="宋体"/>
+        </w:rPr>
+        <w:t>，</w:t>
+      </w:r>
+      <w:r>
+        <w:rPr>
+          <w:rFonts w:ascii="Consolas" w:hAnsi="Consolas" w:eastAsia="等线"/>
+        </w:rPr>
+        <w:t>verify_urls!</w:t>
+      </w:r>
+      <w:r>
+        <w:rPr>
+          <w:rFonts w:ascii="Times New Roman" w:hAnsi="Times New Roman" w:eastAsia="宋体"/>
+        </w:rPr>
+        <w:t>用于地址巡检，二者共同提升多镜像目录的可维护性。</w:t>
       </w:r>
     </w:p>
     <w:p>
@@ -3300,7 +3618,7 @@
         <w:rPr>
           <w:rFonts w:ascii="Times New Roman" w:hAnsi="Times New Roman" w:eastAsia="宋体"/>
         </w:rPr>
-        <w:t>2.3.2 标准文件检查</w:t>
+        <w:t>2.3.2 数据贡献与发布流程</w:t>
       </w:r>
     </w:p>
     <w:p>
@@ -3308,103 +3626,43 @@
         <w:rPr>
           <w:rFonts w:ascii="Times New Roman" w:hAnsi="Times New Roman" w:eastAsia="宋体"/>
         </w:rPr>
-        <w:t>对于已经生成的NetCDF文件，</w:t>
+        <w:t>一个新数据集进入GriddingMachine依次经历：准备原始文件；通过模板或配置构建器生成YAML；运行</w:t>
       </w:r>
       <w:r>
         <w:rPr>
           <w:rFonts w:ascii="Consolas" w:hAnsi="Consolas" w:eastAsia="等线"/>
         </w:rPr>
-        <w:t>verify_processed_data!</w:t>
-      </w:r>
-      <w:r>
-        <w:rPr>
-          <w:rFonts w:ascii="Times New Roman" w:hAnsi="Times New Roman" w:eastAsia="宋体"/>
-        </w:rPr>
-        <w:t>提供独立的结构和数值检查。该函数首先确认文件及覆盖类型，支持全球陆地和海洋（</w:t>
+        <w:t>process_dataset!</w:t>
+      </w:r>
+      <w:r>
+        <w:rPr>
+          <w:rFonts w:ascii="Times New Roman" w:hAnsi="Times New Roman" w:eastAsia="宋体"/>
+        </w:rPr>
+        <w:t>；检查维度、坐标、变量、数值范围、缺失值和方向图；将标准NetCDF至少上传至一个外部可访问位置，并按条件增加机构镜像；把标签、逻辑路径、URL、文件大小和SHA-256写入</w:t>
       </w:r>
       <w:r>
         <w:rPr>
           <w:rFonts w:ascii="Consolas" w:hAnsi="Consolas" w:eastAsia="等线"/>
         </w:rPr>
-        <w:t>both</w:t>
-      </w:r>
-      <w:r>
-        <w:rPr>
-          <w:rFonts w:ascii="Times New Roman" w:hAnsi="Times New Roman" w:eastAsia="宋体"/>
-        </w:rPr>
-        <w:t>）与陆地（</w:t>
+        <w:t>Artifacts.yaml</w:t>
+      </w:r>
+      <w:r>
+        <w:rPr>
+          <w:rFonts w:ascii="Times New Roman" w:hAnsi="Times New Roman" w:eastAsia="宋体"/>
+        </w:rPr>
+        <w:t>；发布目录新版本；最后从</w:t>
       </w:r>
       <w:r>
         <w:rPr>
           <w:rFonts w:ascii="Consolas" w:hAnsi="Consolas" w:eastAsia="等线"/>
         </w:rPr>
-        <w:t>land</w:t>
-      </w:r>
-      <w:r>
-        <w:rPr>
-          <w:rFonts w:ascii="Times New Roman" w:hAnsi="Times New Roman" w:eastAsia="宋体"/>
-        </w:rPr>
-        <w:t>）两类产品。随后检查</w:t>
-      </w:r>
-      <w:r>
-        <w:rPr>
-          <w:rFonts w:ascii="Consolas" w:hAnsi="Consolas" w:eastAsia="等线"/>
-        </w:rPr>
-        <w:t>lon</w:t>
-      </w:r>
-      <w:r>
-        <w:rPr>
-          <w:rFonts w:ascii="Times New Roman" w:hAnsi="Times New Roman" w:eastAsia="宋体"/>
-        </w:rPr>
-        <w:t>、</w:t>
-      </w:r>
-      <w:r>
-        <w:rPr>
-          <w:rFonts w:ascii="Consolas" w:hAnsi="Consolas" w:eastAsia="等线"/>
-        </w:rPr>
-        <w:t>lat</w:t>
-      </w:r>
-      <w:r>
-        <w:rPr>
-          <w:rFonts w:ascii="Times New Roman" w:hAnsi="Times New Roman" w:eastAsia="宋体"/>
-        </w:rPr>
-        <w:t>维度、坐标变量和主变量</w:t>
-      </w:r>
-      <w:r>
-        <w:rPr>
-          <w:rFonts w:ascii="Consolas" w:hAnsi="Consolas" w:eastAsia="等线"/>
-        </w:rPr>
-        <w:t>data</w:t>
-      </w:r>
-      <w:r>
-        <w:rPr>
-          <w:rFonts w:ascii="Times New Roman" w:hAnsi="Times New Roman" w:eastAsia="宋体"/>
-        </w:rPr>
-        <w:t>，三维产品进一步检查</w:t>
-      </w:r>
-      <w:r>
-        <w:rPr>
-          <w:rFonts w:ascii="Consolas" w:hAnsi="Consolas" w:eastAsia="等线"/>
-        </w:rPr>
-        <w:t>ind</w:t>
-      </w:r>
-      <w:r>
-        <w:rPr>
-          <w:rFonts w:ascii="Times New Roman" w:hAnsi="Times New Roman" w:eastAsia="宋体"/>
-        </w:rPr>
-        <w:t>，并验证各维长度的一致性。数值检查读取完整</w:t>
-      </w:r>
-      <w:r>
-        <w:rPr>
-          <w:rFonts w:ascii="Consolas" w:hAnsi="Consolas" w:eastAsia="等线"/>
-        </w:rPr>
-        <w:t>data</w:t>
-      </w:r>
-      <w:r>
-        <w:rPr>
-          <w:rFonts w:ascii="Times New Roman" w:hAnsi="Times New Roman" w:eastAsia="宋体"/>
-        </w:rPr>
-        <w:t>数组，计算有效值的最小值和最大值，并评价其与给定范围的符合程度。</w:t>
+        <w:t>GriddingMachine.jl</w:t>
+      </w:r>
+      <w:r>
+        <w:rPr>
+          <w:rFonts w:ascii="Times New Roman" w:hAnsi="Times New Roman" w:eastAsia="宋体"/>
+        </w:rPr>
+        <w:t>执行目录更新、下载和读取。机构FTP可以提高校内访问速度，Zenodo或其他公共存储保证校外可用；其他维护者也可在目录条目中增加内容相同的镜像。</w:t>
       </w:r>
     </w:p>
     <w:p>
@@ -3412,43 +3670,18 @@
         <w:rPr>
           <w:rFonts w:ascii="Times New Roman" w:hAnsi="Times New Roman" w:eastAsia="宋体"/>
         </w:rPr>
-        <w:t>缺失值检查根据覆盖类型执行。</w:t>
-      </w:r>
-      <w:r>
-        <w:rPr>
-          <w:rFonts w:ascii="Consolas" w:hAnsi="Consolas" w:eastAsia="等线"/>
-        </w:rPr>
-        <w:t>both</w:t>
-      </w:r>
-      <w:r>
-        <w:rPr>
-          <w:rFonts w:ascii="Times New Roman" w:hAnsi="Times New Roman" w:eastAsia="宋体"/>
-        </w:rPr>
-        <w:t>要求整个数组具有完整有效值；</w:t>
-      </w:r>
-      <w:r>
-        <w:rPr>
-          <w:rFonts w:ascii="Consolas" w:hAnsi="Consolas" w:eastAsia="等线"/>
-        </w:rPr>
-        <w:t>land</w:t>
-      </w:r>
-      <w:r>
-        <w:rPr>
-          <w:rFonts w:ascii="Times New Roman" w:hAnsi="Times New Roman" w:eastAsia="宋体"/>
-        </w:rPr>
-        <w:t>在经度长度为360、720或1 440时读取并重采样</w:t>
-      </w:r>
-      <w:r>
-        <w:rPr>
-          <w:rFonts w:ascii="Consolas" w:hAnsi="Consolas" w:eastAsia="等线"/>
-        </w:rPr>
-        <w:t>LM_4X_1Y_V1</w:t>
-      </w:r>
-      <w:r>
-        <w:rPr>
-          <w:rFonts w:ascii="Times New Roman" w:hAnsi="Times New Roman" w:eastAsia="宋体"/>
-        </w:rPr>
-        <w:t>陆地掩膜，逐层检查陆地区域。其他空间分辨率由专用规则承接。结构、范围和陆地掩膜检查与生产阶段的坐标方向、变量属性和处理记录共同构成标准产品的质量信息。</w:t>
+        <w:t>数据贡献流程依据版本化指南贯通配置生成、标准化、质量检查、发布、目录登记和下游读取。最终NetCDF与目录项保持一致，并形成包含固定输入路径和完整YAML示例的贡献模板。</w:t>
+      </w:r>
+    </w:p>
+    <w:p>
+      <w:pPr>
+        <w:pStyle w:val="Heading2"/>
+      </w:pPr>
+      <w:r>
+        <w:rPr>
+          <w:rFonts w:ascii="Times New Roman" w:hAnsi="Times New Roman" w:eastAsia="宋体"/>
+        </w:rPr>
+        <w:t>2.4 多镜像可信分发</w:t>
       </w:r>
     </w:p>
     <w:p>
@@ -3459,99 +3692,69 @@
         <w:rPr>
           <w:rFonts w:ascii="Times New Roman" w:hAnsi="Times New Roman" w:eastAsia="宋体"/>
         </w:rPr>
-        <w:t>2.3.3 标签生成与数据目录登记</w:t>
+        <w:t>2.4.1 目录初始化与更新</w:t>
       </w:r>
     </w:p>
     <w:p>
       <w:r>
         <w:rPr>
-          <w:rFonts w:ascii="Times New Roman" w:hAnsi="Times New Roman" w:eastAsia="宋体"/>
-        </w:rPr>
-        <w:t>数据文件名由</w:t>
-      </w:r>
-      <w:r>
-        <w:rPr>
           <w:rFonts w:ascii="Consolas" w:hAnsi="Consolas" w:eastAsia="等线"/>
         </w:rPr>
-        <w:t>griddingmachine_tag</w:t>
-      </w:r>
-      <w:r>
-        <w:rPr>
-          <w:rFonts w:ascii="Times New Roman" w:hAnsi="Times New Roman" w:eastAsia="宋体"/>
-        </w:rPr>
-        <w:t>生成，基本形式为</w:t>
+        <w:t>GriddingMachine.jl</w:t>
+      </w:r>
+      <w:r>
+        <w:rPr>
+          <w:rFonts w:ascii="Times New Roman" w:hAnsi="Times New Roman" w:eastAsia="宋体"/>
+        </w:rPr>
+        <w:t>通过Collector管理目录和本地文件。</w:t>
       </w:r>
       <w:r>
         <w:rPr>
           <w:rFonts w:ascii="Consolas" w:hAnsi="Consolas" w:eastAsia="等线"/>
         </w:rPr>
-        <w:t>TAG_(PREFIX_)NX_MT_(YYYY_)VV(_REVISION)</w:t>
-      </w:r>
-      <w:r>
-        <w:rPr>
-          <w:rFonts w:ascii="Times New Roman" w:hAnsi="Times New Roman" w:eastAsia="宋体"/>
-        </w:rPr>
-        <w:t>。其中</w:t>
+        <w:t>configure!</w:t>
+      </w:r>
+      <w:r>
+        <w:rPr>
+          <w:rFonts w:ascii="Times New Roman" w:hAnsi="Times New Roman" w:eastAsia="宋体"/>
+        </w:rPr>
+        <w:t>可从参数或环境变量设置数据根目录、目录URL和本地目录文件；</w:t>
       </w:r>
       <w:r>
         <w:rPr>
           <w:rFonts w:ascii="Consolas" w:hAnsi="Consolas" w:eastAsia="等线"/>
         </w:rPr>
-        <w:t>NX</w:t>
-      </w:r>
-      <w:r>
-        <w:rPr>
-          <w:rFonts w:ascii="Times New Roman" w:hAnsi="Times New Roman" w:eastAsia="宋体"/>
-        </w:rPr>
-        <w:t>表示空间分辨率，</w:t>
+        <w:t>cache</w:t>
+      </w:r>
+      <w:r>
+        <w:rPr>
+          <w:rFonts w:ascii="Times New Roman" w:hAnsi="Times New Roman" w:eastAsia="宋体"/>
+        </w:rPr>
+        <w:t>保存下载临时文件，</w:t>
       </w:r>
       <w:r>
         <w:rPr>
           <w:rFonts w:ascii="Consolas" w:hAnsi="Consolas" w:eastAsia="等线"/>
         </w:rPr>
-        <w:t>MT</w:t>
-      </w:r>
-      <w:r>
-        <w:rPr>
-          <w:rFonts w:ascii="Times New Roman" w:hAnsi="Times New Roman" w:eastAsia="宋体"/>
-        </w:rPr>
-        <w:t>表示时间分辨率，</w:t>
+        <w:t>public</w:t>
+      </w:r>
+      <w:r>
+        <w:rPr>
+          <w:rFonts w:ascii="Times New Roman" w:hAnsi="Times New Roman" w:eastAsia="宋体"/>
+        </w:rPr>
+        <w:t>按条目中的</w:t>
       </w:r>
       <w:r>
         <w:rPr>
           <w:rFonts w:ascii="Consolas" w:hAnsi="Consolas" w:eastAsia="等线"/>
         </w:rPr>
-        <w:t>YYYY</w:t>
-      </w:r>
-      <w:r>
-        <w:rPr>
-          <w:rFonts w:ascii="Times New Roman" w:hAnsi="Times New Roman" w:eastAsia="宋体"/>
-        </w:rPr>
-        <w:t>和</w:t>
-      </w:r>
-      <w:r>
-        <w:rPr>
-          <w:rFonts w:ascii="Consolas" w:hAnsi="Consolas" w:eastAsia="等线"/>
-        </w:rPr>
-        <w:t>REVISION</w:t>
-      </w:r>
-      <w:r>
-        <w:rPr>
-          <w:rFonts w:ascii="Times New Roman" w:hAnsi="Times New Roman" w:eastAsia="宋体"/>
-        </w:rPr>
-        <w:t>为可选部分。生成输出路径时，代码读取当前</w:t>
-      </w:r>
-      <w:r>
-        <w:rPr>
-          <w:rFonts w:ascii="Consolas" w:hAnsi="Consolas" w:eastAsia="等线"/>
-        </w:rPr>
-        <w:t>Artifacts.yaml</w:t>
-      </w:r>
-      <w:r>
-        <w:rPr>
-          <w:rFonts w:ascii="Times New Roman" w:hAnsi="Times New Roman" w:eastAsia="宋体"/>
-        </w:rPr>
-        <w:t>并识别标签状态，以保持数据产品标识的唯一性。</w:t>
+        <w:t>PATH</w:t>
+      </w:r>
+      <w:r>
+        <w:rPr>
+          <w:rFonts w:ascii="Times New Roman" w:hAnsi="Times New Roman" w:eastAsia="宋体"/>
+        </w:rPr>
+        <w:t>保存正式NetCDF。模块初始化负责配置内存状态，目录加载、更新和数据下载均由显式调用触发，使数据访问过程清晰可控。</w:t>
       </w:r>
     </w:p>
     <w:p>
@@ -3559,123 +3762,113 @@
         <w:rPr>
           <w:rFonts w:ascii="Times New Roman" w:hAnsi="Times New Roman" w:eastAsia="宋体"/>
         </w:rPr>
-        <w:t>数据发布与目录登记采用解耦设计。维护者在Zenodo、机构FTP或其他存储中发布标准产品，再将本地NetCDF路径和公开URL交给</w:t>
+        <w:t>目录条目以数据标签为键，核心字段包括安全相对路径</w:t>
       </w:r>
       <w:r>
         <w:rPr>
           <w:rFonts w:ascii="Consolas" w:hAnsi="Consolas" w:eastAsia="等线"/>
         </w:rPr>
-        <w:t>update_yaml_library!</w:t>
-      </w:r>
-      <w:r>
-        <w:rPr>
-          <w:rFonts w:ascii="Times New Roman" w:hAnsi="Times New Roman" w:eastAsia="宋体"/>
-        </w:rPr>
-        <w:t>。该函数调用</w:t>
+        <w:t>PATH</w:t>
+      </w:r>
+      <w:r>
+        <w:rPr>
+          <w:rFonts w:ascii="Times New Roman" w:hAnsi="Times New Roman" w:eastAsia="宋体"/>
+        </w:rPr>
+        <w:t>、一个或多个</w:t>
       </w:r>
       <w:r>
         <w:rPr>
           <w:rFonts w:ascii="Consolas" w:hAnsi="Consolas" w:eastAsia="等线"/>
         </w:rPr>
-        <w:t>build_catalog_entry</w:t>
-      </w:r>
-      <w:r>
-        <w:rPr>
-          <w:rFonts w:ascii="Times New Roman" w:hAnsi="Times New Roman" w:eastAsia="宋体"/>
-        </w:rPr>
-        <w:t>生成</w:t>
+        <w:t>URL</w:t>
+      </w:r>
+      <w:r>
+        <w:rPr>
+          <w:rFonts w:ascii="Times New Roman" w:hAnsi="Times New Roman" w:eastAsia="宋体"/>
+        </w:rPr>
+        <w:t>以及正整数字节数</w:t>
       </w:r>
       <w:r>
         <w:rPr>
           <w:rFonts w:ascii="Consolas" w:hAnsi="Consolas" w:eastAsia="等线"/>
         </w:rPr>
-        <w:t>PATH</w:t>
-      </w:r>
-      <w:r>
-        <w:rPr>
-          <w:rFonts w:ascii="Times New Roman" w:hAnsi="Times New Roman" w:eastAsia="宋体"/>
-        </w:rPr>
-        <w:t>、去重后的</w:t>
+        <w:t>SIZE</w:t>
+      </w:r>
+      <w:r>
+        <w:rPr>
+          <w:rFonts w:ascii="Times New Roman" w:hAnsi="Times New Roman" w:eastAsia="宋体"/>
+        </w:rPr>
+        <w:t>与64位十六进制</w:t>
       </w:r>
       <w:r>
         <w:rPr>
           <w:rFonts w:ascii="Consolas" w:hAnsi="Consolas" w:eastAsia="等线"/>
         </w:rPr>
-        <w:t>URL</w:t>
-      </w:r>
-      <w:r>
-        <w:rPr>
-          <w:rFonts w:ascii="Times New Roman" w:hAnsi="Times New Roman" w:eastAsia="宋体"/>
-        </w:rPr>
-        <w:t>、</w:t>
-      </w:r>
-      <w:r>
-        <w:rPr>
-          <w:rFonts w:ascii="Consolas" w:hAnsi="Consolas" w:eastAsia="等线"/>
-        </w:rPr>
-        <w:t>SIZE</w:t>
-      </w:r>
-      <w:r>
-        <w:rPr>
-          <w:rFonts w:ascii="Times New Roman" w:hAnsi="Times New Roman" w:eastAsia="宋体"/>
-        </w:rPr>
-        <w:t>和</w:t>
-      </w:r>
-      <w:r>
-        <w:rPr>
-          <w:rFonts w:ascii="Consolas" w:hAnsi="Consolas" w:eastAsia="等线"/>
-        </w:rPr>
         <w:t>SHA256</w:t>
       </w:r>
       <w:r>
         <w:rPr>
           <w:rFonts w:ascii="Times New Roman" w:hAnsi="Times New Roman" w:eastAsia="宋体"/>
         </w:rPr>
-        <w:t>，按标签排序后通过临时文件更新</w:t>
-      </w:r>
-      <w:r>
-        <w:rPr>
-          <w:rFonts w:ascii="Consolas" w:hAnsi="Consolas" w:eastAsia="等线"/>
-        </w:rPr>
-        <w:t>Artifacts.yaml</w:t>
-      </w:r>
-      <w:r>
-        <w:rPr>
-          <w:rFonts w:ascii="Times New Roman" w:hAnsi="Times New Roman" w:eastAsia="宋体"/>
-        </w:rPr>
-        <w:t>，从而形成职责清晰、内容可校验的目录生成流程。</w:t>
+        <w:t>。加载时对标签字符、路径、URL协议和完整性字段执行schema校验，并提供路径、URL、信息和本地状态查询。可配置根目录与显式网络访问共同支持独立工作环境、离线复现和正式数据管理。</w:t>
       </w:r>
     </w:p>
     <w:p>
       <w:r>
         <w:rPr>
-          <w:rFonts w:ascii="Times New Roman" w:hAnsi="Times New Roman" w:eastAsia="宋体"/>
-        </w:rPr>
-        <w:t>目录生成器从本地标准文件计算字节数和SHA-256并写入YAML，下载端以相同字段确认实际内容，从而形成“本地标准文件—目录条目—下载文件”的完整性链。历史目录迁移以权威本地文件重新生成</w:t>
-      </w:r>
-      <w:r>
-        <w:rPr>
           <w:rFonts w:ascii="Consolas" w:hAnsi="Consolas" w:eastAsia="等线"/>
         </w:rPr>
-        <w:t>SIZE/SHA256</w:t>
-      </w:r>
-      <w:r>
-        <w:rPr>
-          <w:rFonts w:ascii="Times New Roman" w:hAnsi="Times New Roman" w:eastAsia="宋体"/>
-        </w:rPr>
-        <w:t>，</w:t>
+        <w:t>update_database!</w:t>
+      </w:r>
+      <w:r>
+        <w:rPr>
+          <w:rFonts w:ascii="Times New Roman" w:hAnsi="Times New Roman" w:eastAsia="宋体"/>
+        </w:rPr>
+        <w:t xml:space="preserve"> 调用 </w:t>
       </w:r>
       <w:r>
         <w:rPr>
           <w:rFonts w:ascii="Consolas" w:hAnsi="Consolas" w:eastAsia="等线"/>
         </w:rPr>
-        <w:t>verify_urls!</w:t>
-      </w:r>
-      <w:r>
-        <w:rPr>
-          <w:rFonts w:ascii="Times New Roman" w:hAnsi="Times New Roman" w:eastAsia="宋体"/>
-        </w:rPr>
-        <w:t>用于地址巡检，二者共同提升多镜像目录的可维护性。</w:t>
+        <w:t>download_database!</w:t>
+      </w:r>
+      <w:r>
+        <w:rPr>
+          <w:rFonts w:ascii="Times New Roman" w:hAnsi="Times New Roman" w:eastAsia="宋体"/>
+        </w:rPr>
+        <w:t xml:space="preserve"> 获取目录，验证后再加载为内存状态。调用者可直接提供 YAML 文件 URL，也可使用 Zenodo 落地页；后者仍通过页面中的 </w:t>
+      </w:r>
+      <w:r>
+        <w:rPr>
+          <w:rFonts w:ascii="Consolas" w:hAnsi="Consolas" w:eastAsia="等线"/>
+        </w:rPr>
+        <w:t>Artifacts.yaml</w:t>
+      </w:r>
+      <w:r>
+        <w:rPr>
+          <w:rFonts w:ascii="Times New Roman" w:hAnsi="Times New Roman" w:eastAsia="宋体"/>
+        </w:rPr>
+        <w:t xml:space="preserve"> 链接解析实际下载地址。目录先写入同目录临时文件，解析根节点并执行 schema 校验；通过后备份当前目录为 </w:t>
+      </w:r>
+      <w:r>
+        <w:rPr>
+          <w:rFonts w:ascii="Consolas" w:hAnsi="Consolas" w:eastAsia="等线"/>
+        </w:rPr>
+        <w:t>Artifacts.previous.yaml</w:t>
+      </w:r>
+      <w:r>
+        <w:rPr>
+          <w:rFonts w:ascii="Times New Roman" w:hAnsi="Times New Roman" w:eastAsia="宋体"/>
+        </w:rPr>
+        <w:t>，再替换正式文件。</w:t>
+      </w:r>
+    </w:p>
+    <w:p>
+      <w:r>
+        <w:rPr>
+          <w:rFonts w:ascii="Times New Roman" w:hAnsi="Times New Roman" w:eastAsia="宋体"/>
+        </w:rPr>
+        <w:t>该机制实现目录与软件版本分离，并以事务替换和备份恢复保护有效目录。目录入口同时支持直接YAML地址与Zenodo落地页解析，适配独立发布与持续更新的数据目录。</w:t>
       </w:r>
     </w:p>
     <w:p>
@@ -3686,51 +3879,21 @@
         <w:rPr>
           <w:rFonts w:ascii="Times New Roman" w:hAnsi="Times New Roman" w:eastAsia="宋体"/>
         </w:rPr>
-        <w:t>2.3.4 数据贡献与发布流程</w:t>
+        <w:t>2.4.2 镜像选择与事务式缓存</w:t>
       </w:r>
     </w:p>
     <w:p>
       <w:r>
         <w:rPr>
-          <w:rFonts w:ascii="Times New Roman" w:hAnsi="Times New Roman" w:eastAsia="宋体"/>
-        </w:rPr>
-        <w:t>一个新数据集进入GriddingMachine依次经历：准备原始文件；通过模板或配置构建器生成YAML；运行</w:t>
-      </w:r>
-      <w:r>
-        <w:rPr>
           <w:rFonts w:ascii="Consolas" w:hAnsi="Consolas" w:eastAsia="等线"/>
         </w:rPr>
-        <w:t>process_dataset!</w:t>
-      </w:r>
-      <w:r>
-        <w:rPr>
-          <w:rFonts w:ascii="Times New Roman" w:hAnsi="Times New Roman" w:eastAsia="宋体"/>
-        </w:rPr>
-        <w:t>；检查维度、坐标、变量、数值范围、缺失值和方向图；将标准NetCDF至少上传至一个外部可访问位置，并按条件增加机构镜像；把标签、逻辑路径、URL、文件大小和SHA-256写入</w:t>
-      </w:r>
-      <w:r>
-        <w:rPr>
-          <w:rFonts w:ascii="Consolas" w:hAnsi="Consolas" w:eastAsia="等线"/>
-        </w:rPr>
-        <w:t>Artifacts.yaml</w:t>
-      </w:r>
-      <w:r>
-        <w:rPr>
-          <w:rFonts w:ascii="Times New Roman" w:hAnsi="Times New Roman" w:eastAsia="宋体"/>
-        </w:rPr>
-        <w:t>；发布目录新版本；最后从</w:t>
-      </w:r>
-      <w:r>
-        <w:rPr>
-          <w:rFonts w:ascii="Consolas" w:hAnsi="Consolas" w:eastAsia="等线"/>
-        </w:rPr>
-        <w:t>GriddingMachine.jl</w:t>
-      </w:r>
-      <w:r>
-        <w:rPr>
-          <w:rFonts w:ascii="Times New Roman" w:hAnsi="Times New Roman" w:eastAsia="宋体"/>
-        </w:rPr>
-        <w:t>执行目录更新、下载和读取。机构FTP可以提高校内访问速度，Zenodo或其他公共存储保证校外可用；其他维护者也可在目录条目中增加内容相同的镜像。</w:t>
+        <w:t>download_dataset!</w:t>
+      </w:r>
+      <w:r>
+        <w:rPr>
+          <w:rFonts w:ascii="Times New Roman" w:hAnsi="Times New Roman" w:eastAsia="宋体"/>
+        </w:rPr>
+        <w:t>接收数据标签；目录刷新、正式文件复用和远端获取由同一接口组织。下载阶段从每个FTP或HTTP(S) URL提取主机名，以可获得的平均往返延迟生成候选顺序；其余地址按目录顺序保留，全部URL共同组成完整回退队列。</w:t>
       </w:r>
     </w:p>
     <w:p>
@@ -3738,7 +3901,99 @@
         <w:rPr>
           <w:rFonts w:ascii="Times New Roman" w:hAnsi="Times New Roman" w:eastAsia="宋体"/>
         </w:rPr>
-        <w:t>数据贡献流程依据版本化指南贯通配置生成、标准化、质量检查、发布、目录登记和下游读取。最终NetCDF与目录项保持一致，并形成包含固定输入路径和完整YAML示例的贡献模板。</w:t>
+        <w:t>下载循环按候选顺序逐一尝试镜像，每次尝试均写入进程级唯一</w:t>
+      </w:r>
+      <w:r>
+        <w:rPr>
+          <w:rFonts w:ascii="Consolas" w:hAnsi="Consolas" w:eastAsia="等线"/>
+        </w:rPr>
+        <w:t>.part</w:t>
+      </w:r>
+      <w:r>
+        <w:rPr>
+          <w:rFonts w:ascii="Times New Roman" w:hAnsi="Times New Roman" w:eastAsia="宋体"/>
+        </w:rPr>
+        <w:t>文件。程序核对文件生成状态、字节数和SHA-256；校验通过后以原子移动进入正式路径，各次尝试的临时内容随当前状态独立回收。</w:t>
+      </w:r>
+      <w:r>
+        <w:rPr>
+          <w:rFonts w:ascii="Consolas" w:hAnsi="Consolas" w:eastAsia="等线"/>
+        </w:rPr>
+        <w:t>require_integrity=true</w:t>
+      </w:r>
+      <w:r>
+        <w:rPr>
+          <w:rFonts w:ascii="Times New Roman" w:hAnsi="Times New Roman" w:eastAsia="宋体"/>
+        </w:rPr>
+        <w:t>提供严格完整性模式，兼容模式承接历史目录。镜像遍历完成后返回包含数据标签和各候选状态的汇总信息，已有正式文件始终保持稳定。</w:t>
+      </w:r>
+    </w:p>
+    <w:p>
+      <w:r>
+        <w:rPr>
+          <w:rFonts w:ascii="Times New Roman" w:hAnsi="Times New Roman" w:eastAsia="宋体"/>
+        </w:rPr>
+        <w:t>延迟探测用于优化镜像尝试顺序，完整文件下载与</w:t>
+      </w:r>
+      <w:r>
+        <w:rPr>
+          <w:rFonts w:ascii="Consolas" w:hAnsi="Consolas" w:eastAsia="等线"/>
+        </w:rPr>
+        <w:t>SIZE/SHA256</w:t>
+      </w:r>
+      <w:r>
+        <w:rPr>
+          <w:rFonts w:ascii="Times New Roman" w:hAnsi="Times New Roman" w:eastAsia="宋体"/>
+        </w:rPr>
+        <w:t>核验共同确定数据产品的一致性。本文进一步在中科大校园网对同一文件分别执行FTP和Zenodo只读下载，以实际传输表现和SHA-256一致性共同评价镜像获取效果。</w:t>
+      </w:r>
+    </w:p>
+    <w:p>
+      <w:r>
+        <w:rPr>
+          <w:rFonts w:ascii="Times New Roman" w:hAnsi="Times New Roman" w:eastAsia="宋体"/>
+        </w:rPr>
+        <w:t>每次下载使用</w:t>
+      </w:r>
+      <w:r>
+        <w:rPr>
+          <w:rFonts w:ascii="Consolas" w:hAnsi="Consolas" w:eastAsia="等线"/>
+        </w:rPr>
+        <w:t>cache/.&lt;TAG&gt;.&lt;PID&gt;.part</w:t>
+      </w:r>
+      <w:r>
+        <w:rPr>
+          <w:rFonts w:ascii="Times New Roman" w:hAnsi="Times New Roman" w:eastAsia="宋体"/>
+        </w:rPr>
+        <w:t>，通过完整性校验后移动到正式路径。</w:t>
+      </w:r>
+      <w:r>
+        <w:rPr>
+          <w:rFonts w:ascii="Consolas" w:hAnsi="Consolas" w:eastAsia="等线"/>
+        </w:rPr>
+        <w:t>sync_database!</w:t>
+      </w:r>
+      <w:r>
+        <w:rPr>
+          <w:rFonts w:ascii="Times New Roman" w:hAnsi="Times New Roman" w:eastAsia="宋体"/>
+        </w:rPr>
+        <w:t>在更新目录后遍历标签并复用相同下载逻辑。小型目录参考数据呈现初始化、更新、同步、回退和清理行为，完整历史目录沿用同一事务机制开展批量运维。</w:t>
+      </w:r>
+    </w:p>
+    <w:p>
+      <w:r>
+        <w:rPr>
+          <w:rFonts w:ascii="Times New Roman" w:hAnsi="Times New Roman" w:eastAsia="宋体"/>
+        </w:rPr>
+        <w:t>镜像状态分析覆盖候选顺序、字节数、SHA-256、缓存恢复和镜像遍历等分发环节。跨操作系统运行与校园网FTP—Zenodo实测共同呈现“事务安全—镜像获取—内容一致”的分发链路。</w:t>
+      </w:r>
+    </w:p>
+    <w:p>
+      <w:r>
+        <w:rPr>
+          <w:rFonts w:ascii="Times New Roman" w:hAnsi="Times New Roman" w:eastAsia="宋体"/>
+        </w:rPr>
+        <w:t>Collector还提供全库同步、历史数据整理、目录树及数据集状态查询等维护接口。相关命令、参数和状态恢复方式集中列入补充材料与版本化用户指南，正文保留目录更新、镜像获取和内容完整性保障的核心机制。</w:t>
       </w:r>
     </w:p>
     <w:p>
@@ -3749,7 +4004,7 @@
         <w:rPr>
           <w:rFonts w:ascii="Times New Roman" w:hAnsi="Times New Roman" w:eastAsia="宋体"/>
         </w:rPr>
-        <w:t>2.4 独立数据目录与多镜像分发</w:t>
+        <w:t>2.5 统一读取与模型就绪接口</w:t>
       </w:r>
     </w:p>
     <w:p>
@@ -3760,69 +4015,87 @@
         <w:rPr>
           <w:rFonts w:ascii="Times New Roman" w:hAnsi="Times New Roman" w:eastAsia="宋体"/>
         </w:rPr>
-        <w:t>2.4.1 本地目录初始化与加载</w:t>
+        <w:t xml:space="preserve">2.5.1 </w:t>
+      </w:r>
+      <w:r>
+        <w:rPr>
+          <w:rFonts w:ascii="Consolas" w:hAnsi="Consolas" w:eastAsia="等线"/>
+        </w:rPr>
+        <w:t>read_dataset</w:t>
+      </w:r>
+      <w:r>
+        <w:rPr>
+          <w:rFonts w:ascii="Times New Roman" w:hAnsi="Times New Roman" w:eastAsia="宋体"/>
+        </w:rPr>
+        <w:t xml:space="preserve"> 统一读取接口</w:t>
       </w:r>
     </w:p>
     <w:p>
       <w:r>
         <w:rPr>
+          <w:rFonts w:ascii="Times New Roman" w:hAnsi="Times New Roman" w:eastAsia="宋体"/>
+        </w:rPr>
+        <w:t>Indexer模块以</w:t>
+      </w:r>
+      <w:r>
+        <w:rPr>
           <w:rFonts w:ascii="Consolas" w:hAnsi="Consolas" w:eastAsia="等线"/>
         </w:rPr>
-        <w:t>GriddingMachine.jl</w:t>
-      </w:r>
-      <w:r>
-        <w:rPr>
-          <w:rFonts w:ascii="Times New Roman" w:hAnsi="Times New Roman" w:eastAsia="宋体"/>
-        </w:rPr>
-        <w:t>通过Collector管理目录和本地文件。</w:t>
+        <w:t>read_dataset</w:t>
+      </w:r>
+      <w:r>
+        <w:rPr>
+          <w:rFonts w:ascii="Times New Roman" w:hAnsi="Times New Roman" w:eastAsia="宋体"/>
+        </w:rPr>
+        <w:t>统一本地NetCDF路径和目录标签的读取，支持整场数组、指定周期切片、站点全部周期以及站点指定周期4种调用。目录标签在本地缺失时交由Collector下载；旧名称</w:t>
       </w:r>
       <w:r>
         <w:rPr>
           <w:rFonts w:ascii="Consolas" w:hAnsi="Consolas" w:eastAsia="等线"/>
         </w:rPr>
-        <w:t>configure!</w:t>
-      </w:r>
-      <w:r>
-        <w:rPr>
-          <w:rFonts w:ascii="Times New Roman" w:hAnsi="Times New Roman" w:eastAsia="宋体"/>
-        </w:rPr>
-        <w:t>可从参数或环境变量设置数据根目录、目录URL和本地目录文件；</w:t>
+        <w:t>read_LUT</w:t>
+      </w:r>
+      <w:r>
+        <w:rPr>
+          <w:rFonts w:ascii="Times New Roman" w:hAnsi="Times New Roman" w:eastAsia="宋体"/>
+        </w:rPr>
+        <w:t>保留为兼容别名。默认读取</w:t>
       </w:r>
       <w:r>
         <w:rPr>
           <w:rFonts w:ascii="Consolas" w:hAnsi="Consolas" w:eastAsia="等线"/>
         </w:rPr>
-        <w:t>cache</w:t>
-      </w:r>
-      <w:r>
-        <w:rPr>
-          <w:rFonts w:ascii="Times New Roman" w:hAnsi="Times New Roman" w:eastAsia="宋体"/>
-        </w:rPr>
-        <w:t>保存下载临时文件，</w:t>
+        <w:t>data</w:t>
+      </w:r>
+      <w:r>
+        <w:rPr>
+          <w:rFonts w:ascii="Times New Roman" w:hAnsi="Times New Roman" w:eastAsia="宋体"/>
+        </w:rPr>
+        <w:t>，调用者也可显式请求</w:t>
       </w:r>
       <w:r>
         <w:rPr>
           <w:rFonts w:ascii="Consolas" w:hAnsi="Consolas" w:eastAsia="等线"/>
         </w:rPr>
-        <w:t>public</w:t>
-      </w:r>
-      <w:r>
-        <w:rPr>
-          <w:rFonts w:ascii="Times New Roman" w:hAnsi="Times New Roman" w:eastAsia="宋体"/>
-        </w:rPr>
-        <w:t>按条目中的</w:t>
+        <w:t>raw_data</w:t>
+      </w:r>
+      <w:r>
+        <w:rPr>
+          <w:rFonts w:ascii="Times New Roman" w:hAnsi="Times New Roman" w:eastAsia="宋体"/>
+        </w:rPr>
+        <w:t>或</w:t>
       </w:r>
       <w:r>
         <w:rPr>
           <w:rFonts w:ascii="Consolas" w:hAnsi="Consolas" w:eastAsia="等线"/>
         </w:rPr>
-        <w:t>PATH</w:t>
-      </w:r>
-      <w:r>
-        <w:rPr>
-          <w:rFonts w:ascii="Times New Roman" w:hAnsi="Times New Roman" w:eastAsia="宋体"/>
-        </w:rPr>
-        <w:t>保存正式NetCDF。模块初始化负责配置内存状态，目录加载、更新和数据下载均由显式调用触发，使数据访问过程清晰可控。</w:t>
+        <w:t>std</w:t>
+      </w:r>
+      <w:r>
+        <w:rPr>
+          <w:rFonts w:ascii="Times New Roman" w:hAnsi="Times New Roman" w:eastAsia="宋体"/>
+        </w:rPr>
+        <w:t>。读取层直接保留生产端已经标准化的单位、缺失值和物理范围，使处理规则集中于共享生产契约。</w:t>
       </w:r>
     </w:p>
     <w:p>
@@ -3830,55 +4103,19 @@
         <w:rPr>
           <w:rFonts w:ascii="Times New Roman" w:hAnsi="Times New Roman" w:eastAsia="宋体"/>
         </w:rPr>
-        <w:t>目录条目以数据标签为键，核心字段包括安全相对路径</w:t>
+        <w:t>站点读取依据全球规则经纬网分辨率把经纬度映射为数组索引，并以标准文件的</w:t>
       </w:r>
       <w:r>
         <w:rPr>
           <w:rFonts w:ascii="Consolas" w:hAnsi="Consolas" w:eastAsia="等线"/>
         </w:rPr>
-        <w:t>PATH</w:t>
-      </w:r>
-      <w:r>
-        <w:rPr>
-          <w:rFonts w:ascii="Times New Roman" w:hAnsi="Times New Roman" w:eastAsia="宋体"/>
-        </w:rPr>
-        <w:t>、一个或多个</w:t>
-      </w:r>
-      <w:r>
-        <w:rPr>
-          <w:rFonts w:ascii="Consolas" w:hAnsi="Consolas" w:eastAsia="等线"/>
-        </w:rPr>
-        <w:t>URL</w:t>
-      </w:r>
-      <w:r>
-        <w:rPr>
-          <w:rFonts w:ascii="Times New Roman" w:hAnsi="Times New Roman" w:eastAsia="宋体"/>
-        </w:rPr>
-        <w:t>以及正整数字节数</w:t>
-      </w:r>
-      <w:r>
-        <w:rPr>
-          <w:rFonts w:ascii="Consolas" w:hAnsi="Consolas" w:eastAsia="等线"/>
-        </w:rPr>
-        <w:t>SIZE</w:t>
-      </w:r>
-      <w:r>
-        <w:rPr>
-          <w:rFonts w:ascii="Times New Roman" w:hAnsi="Times New Roman" w:eastAsia="宋体"/>
-        </w:rPr>
-        <w:t>与64位十六进制</w:t>
-      </w:r>
-      <w:r>
-        <w:rPr>
-          <w:rFonts w:ascii="Consolas" w:hAnsi="Consolas" w:eastAsia="等线"/>
-        </w:rPr>
-        <w:t>SHA256</w:t>
-      </w:r>
-      <w:r>
-        <w:rPr>
-          <w:rFonts w:ascii="Times New Roman" w:hAnsi="Times New Roman" w:eastAsia="宋体"/>
-        </w:rPr>
-        <w:t>。加载时对标签字符、路径、URL协议和完整性字段执行schema校验，并提供路径、URL、信息和本地状态查询。可配置根目录与显式网络访问共同支持独立工作环境、离线复现和正式数据管理。</w:t>
+        <w:t>(lon,lat[,ind])</w:t>
+      </w:r>
+      <w:r>
+        <w:rPr>
+          <w:rFonts w:ascii="Times New Roman" w:hAnsi="Times New Roman" w:eastAsia="宋体"/>
+        </w:rPr>
+        <w:t>顺序及西向东、南向北排列为输入契约。接口面向全球规则网格的原位索引，区域投影、非规则网格和空间插值可在生产端完成标准化；周期索引的月份、日期或小时含义由对应产品元数据解释。</w:t>
       </w:r>
     </w:p>
     <w:p>
@@ -3889,7 +4126,7 @@
         <w:rPr>
           <w:rFonts w:ascii="Times New Roman" w:hAnsi="Times New Roman" w:eastAsia="宋体"/>
         </w:rPr>
-        <w:t>2.4.2 数据目录更新</w:t>
+        <w:t>2.5.2 模型参数与气象驱动组织</w:t>
       </w:r>
     </w:p>
     <w:p>
@@ -3897,49 +4134,37 @@
         <w:rPr>
           <w:rFonts w:ascii="Consolas" w:hAnsi="Consolas" w:eastAsia="等线"/>
         </w:rPr>
-        <w:t>update_database!</w:t>
-      </w:r>
-      <w:r>
-        <w:rPr>
-          <w:rFonts w:ascii="Times New Roman" w:hAnsi="Times New Roman" w:eastAsia="宋体"/>
-        </w:rPr>
-        <w:t xml:space="preserve"> 调用 </w:t>
+        <w:t>grid_dict</w:t>
+      </w:r>
+      <w:r>
+        <w:rPr>
+          <w:rFonts w:ascii="Times New Roman" w:hAnsi="Times New Roman" w:eastAsia="宋体"/>
+        </w:rPr>
+        <w:t>把</w:t>
       </w:r>
       <w:r>
         <w:rPr>
           <w:rFonts w:ascii="Consolas" w:hAnsi="Consolas" w:eastAsia="等线"/>
         </w:rPr>
-        <w:t>download_database!</w:t>
-      </w:r>
-      <w:r>
-        <w:rPr>
-          <w:rFonts w:ascii="Times New Roman" w:hAnsi="Times New Roman" w:eastAsia="宋体"/>
-        </w:rPr>
-        <w:t xml:space="preserve"> 获取目录，验证后再加载为内存状态。调用者可直接提供 YAML 文件 URL，也可使用 Zenodo 落地页；后者仍通过页面中的 </w:t>
+        <w:t>gm1</w:t>
+      </w:r>
+      <w:r>
+        <w:rPr>
+          <w:rFonts w:ascii="Times New Roman" w:hAnsi="Times New Roman" w:eastAsia="宋体"/>
+        </w:rPr>
+        <w:t>或</w:t>
       </w:r>
       <w:r>
         <w:rPr>
           <w:rFonts w:ascii="Consolas" w:hAnsi="Consolas" w:eastAsia="等线"/>
         </w:rPr>
-        <w:t>Artifacts.yaml</w:t>
-      </w:r>
-      <w:r>
-        <w:rPr>
-          <w:rFonts w:ascii="Times New Roman" w:hAnsi="Times New Roman" w:eastAsia="宋体"/>
-        </w:rPr>
-        <w:t xml:space="preserve"> 链接解析实际下载地址。目录先写入同目录临时文件，解析根节点并执行 schema 校验；通过后备份当前目录为 </w:t>
-      </w:r>
-      <w:r>
-        <w:rPr>
-          <w:rFonts w:ascii="Consolas" w:hAnsi="Consolas" w:eastAsia="等线"/>
-        </w:rPr>
-        <w:t>Artifacts.previous.yaml</w:t>
-      </w:r>
-      <w:r>
-        <w:rPr>
-          <w:rFonts w:ascii="Times New Roman" w:hAnsi="Times New Roman" w:eastAsia="宋体"/>
-        </w:rPr>
-        <w:t>，再替换正式文件。</w:t>
+        <w:t>gm2</w:t>
+      </w:r>
+      <w:r>
+        <w:rPr>
+          <w:rFonts w:ascii="Times New Roman" w:hAnsi="Times New Roman" w:eastAsia="宋体"/>
+        </w:rPr>
+        <w:t>标签组中的土壤、冠层、叶片、地形、陆地掩膜和植物功能型产品组织为单个格点的模型参数字典。年份用于选择叶面积指数并组织逐日序列。函数先检查陆地掩膜和叶面积指数；植被格点进入参数读取与季节序列组织，其他格点返回清晰的状态信息。</w:t>
       </w:r>
     </w:p>
     <w:p>
@@ -3947,190 +4172,101 @@
         <w:rPr>
           <w:rFonts w:ascii="Times New Roman" w:hAnsi="Times New Roman" w:eastAsia="宋体"/>
         </w:rPr>
-        <w:t>该机制实现目录与软件版本分离，并以事务替换和备份恢复保护有效目录。目录入口同时支持直接YAML地址与Zenodo落地页解析，适配独立发布与持续更新的数据目录。</w:t>
+        <w:t>输出包括位置、分辨率、年份、CO₂、土壤水力参数、冠层结构、植物功能型比例、叶片生物物理和光合参数；启用质量控制时同步检查字段完整性和</w:t>
+      </w:r>
+      <w:r>
+        <w:rPr>
+          <w:rFonts w:ascii="Consolas" w:hAnsi="Consolas" w:eastAsia="等线"/>
+        </w:rPr>
+        <w:t>NaN</w:t>
+      </w:r>
+      <w:r>
+        <w:rPr>
+          <w:rFonts w:ascii="Times New Roman" w:hAnsi="Times New Roman" w:eastAsia="宋体"/>
+        </w:rPr>
+        <w:t>状态。该接口把多个已标准化产品稳定组织为模型入口，内置经验系数、标签组合及陆面类型状态共同构成清晰的模型输入契约。</w:t>
       </w:r>
     </w:p>
     <w:p>
-      <w:pPr>
-        <w:pStyle w:val="Heading3"/>
-      </w:pPr>
-      <w:r>
-        <w:rPr>
-          <w:rFonts w:ascii="Times New Roman" w:hAnsi="Times New Roman" w:eastAsia="宋体"/>
-        </w:rPr>
-        <w:t>2.4.3 多镜像排序与顺序获取</w:t>
+      <w:r>
+        <w:rPr>
+          <w:rFonts w:ascii="Consolas" w:hAnsi="Consolas" w:eastAsia="等线"/>
+        </w:rPr>
+        <w:t>grid_weather</w:t>
+      </w:r>
+      <w:r>
+        <w:rPr>
+          <w:rFonts w:ascii="Times New Roman" w:hAnsi="Times New Roman" w:eastAsia="宋体"/>
+        </w:rPr>
+        <w:t>按年份和格点读取</w:t>
+      </w:r>
+      <w:r>
+        <w:rPr>
+          <w:rFonts w:ascii="Consolas" w:hAnsi="Consolas" w:eastAsia="等线"/>
+        </w:rPr>
+        <w:t>wd1</w:t>
+      </w:r>
+      <w:r>
+        <w:rPr>
+          <w:rFonts w:ascii="Times New Roman" w:hAnsi="Times New Roman" w:eastAsia="宋体"/>
+        </w:rPr>
+        <w:t>中的8个ERA5标签，分别组织地表气压、降水、漫射与直射短波辐射、长波辐射、气温、水汽压亏缺和风速。输出统一为含时间索引</w:t>
+      </w:r>
+      <w:r>
+        <w:rPr>
+          <w:rFonts w:ascii="Consolas" w:hAnsi="Consolas" w:eastAsia="等线"/>
+        </w:rPr>
+        <w:t>FDOY</w:t>
+      </w:r>
+      <w:r>
+        <w:rPr>
+          <w:rFonts w:ascii="Times New Roman" w:hAnsi="Times New Roman" w:eastAsia="宋体"/>
+        </w:rPr>
+        <w:t>及8个气象字段的字典，启用质量控制时同步检查字段完整性和</w:t>
+      </w:r>
+      <w:r>
+        <w:rPr>
+          <w:rFonts w:ascii="Consolas" w:hAnsi="Consolas" w:eastAsia="等线"/>
+        </w:rPr>
+        <w:t>NaN</w:t>
+      </w:r>
+      <w:r>
+        <w:rPr>
+          <w:rFonts w:ascii="Times New Roman" w:hAnsi="Times New Roman" w:eastAsia="宋体"/>
+        </w:rPr>
+        <w:t>状态。接口既可直接按经纬度读取，也可从已经加载的全局气象数组提取格点序列。</w:t>
       </w:r>
     </w:p>
     <w:p>
       <w:r>
         <w:rPr>
+          <w:rFonts w:ascii="Times New Roman" w:hAnsi="Times New Roman" w:eastAsia="宋体"/>
+        </w:rPr>
+        <w:t>该接口围绕规则网格、既定单位和</w:t>
+      </w:r>
+      <w:r>
+        <w:rPr>
           <w:rFonts w:ascii="Consolas" w:hAnsi="Consolas" w:eastAsia="等线"/>
         </w:rPr>
-        <w:t>download_dataset!</w:t>
-      </w:r>
-      <w:r>
-        <w:rPr>
-          <w:rFonts w:ascii="Times New Roman" w:hAnsi="Times New Roman" w:eastAsia="宋体"/>
-        </w:rPr>
-        <w:t>接收数据标签；目录刷新、正式文件复用和远端获取由同一接口组织。下载阶段从每个FTP或HTTP(S) URL提取主机名，以可获得的平均往返延迟生成候选顺序；其余地址按目录顺序保留，全部URL共同组成完整回退队列。</w:t>
-      </w:r>
-    </w:p>
-    <w:p>
-      <w:r>
-        <w:rPr>
-          <w:rFonts w:ascii="Times New Roman" w:hAnsi="Times New Roman" w:eastAsia="宋体"/>
-        </w:rPr>
-        <w:t>下载循环按候选顺序逐一尝试镜像，每次尝试均写入进程级唯一</w:t>
+        <w:t>wd1</w:t>
+      </w:r>
+      <w:r>
+        <w:rPr>
+          <w:rFonts w:ascii="Times New Roman" w:hAnsi="Times New Roman" w:eastAsia="宋体"/>
+        </w:rPr>
+        <w:t>标签完成模型就绪字段组织。确定性气象参考数据用于核对字段、形状和Emerald最小步进，</w:t>
       </w:r>
       <w:r>
         <w:rPr>
           <w:rFonts w:ascii="Consolas" w:hAnsi="Consolas" w:eastAsia="等线"/>
         </w:rPr>
-        <w:t>.part</w:t>
-      </w:r>
-      <w:r>
-        <w:rPr>
-          <w:rFonts w:ascii="Times New Roman" w:hAnsi="Times New Roman" w:eastAsia="宋体"/>
-        </w:rPr>
-        <w:t>文件。程序核对文件生成状态、字节数和SHA-256；校验通过后以原子移动进入正式路径，各次尝试的临时内容随当前状态独立回收。</w:t>
-      </w:r>
-      <w:r>
-        <w:rPr>
-          <w:rFonts w:ascii="Consolas" w:hAnsi="Consolas" w:eastAsia="等线"/>
-        </w:rPr>
-        <w:t>require_integrity=true</w:t>
-      </w:r>
-      <w:r>
-        <w:rPr>
-          <w:rFonts w:ascii="Times New Roman" w:hAnsi="Times New Roman" w:eastAsia="宋体"/>
-        </w:rPr>
-        <w:t>提供严格完整性模式，兼容模式承接历史目录。镜像遍历完成后返回包含数据标签和各候选状态的汇总信息，已有正式文件始终保持稳定。</w:t>
-      </w:r>
-    </w:p>
-    <w:p>
-      <w:r>
-        <w:rPr>
-          <w:rFonts w:ascii="Times New Roman" w:hAnsi="Times New Roman" w:eastAsia="宋体"/>
-        </w:rPr>
-        <w:t>延迟探测用于优化镜像尝试顺序，完整文件下载与</w:t>
-      </w:r>
-      <w:r>
-        <w:rPr>
-          <w:rFonts w:ascii="Consolas" w:hAnsi="Consolas" w:eastAsia="等线"/>
-        </w:rPr>
-        <w:t>SIZE/SHA256</w:t>
-      </w:r>
-      <w:r>
-        <w:rPr>
-          <w:rFonts w:ascii="Times New Roman" w:hAnsi="Times New Roman" w:eastAsia="宋体"/>
-        </w:rPr>
-        <w:t>核验共同确定数据产品的一致性。本文进一步在中科大校园网对同一文件分别执行FTP和Zenodo只读下载，以实际传输表现和SHA-256一致性共同评价镜像获取效果。</w:t>
-      </w:r>
-    </w:p>
-    <w:p>
-      <w:pPr>
-        <w:pStyle w:val="Heading3"/>
-      </w:pPr>
-      <w:r>
-        <w:rPr>
-          <w:rFonts w:ascii="Times New Roman" w:hAnsi="Times New Roman" w:eastAsia="宋体"/>
-        </w:rPr>
-        <w:t>2.4.4 缓存落盘与批量同步</w:t>
-      </w:r>
-    </w:p>
-    <w:p>
-      <w:r>
-        <w:rPr>
-          <w:rFonts w:ascii="Times New Roman" w:hAnsi="Times New Roman" w:eastAsia="宋体"/>
-        </w:rPr>
-        <w:t>每次下载使用</w:t>
-      </w:r>
-      <w:r>
-        <w:rPr>
-          <w:rFonts w:ascii="Consolas" w:hAnsi="Consolas" w:eastAsia="等线"/>
-        </w:rPr>
-        <w:t>cache/.&lt;TAG&gt;.&lt;PID&gt;.part</w:t>
-      </w:r>
-      <w:r>
-        <w:rPr>
-          <w:rFonts w:ascii="Times New Roman" w:hAnsi="Times New Roman" w:eastAsia="宋体"/>
-        </w:rPr>
-        <w:t>，通过完整性校验后移动到正式路径。</w:t>
-      </w:r>
-      <w:r>
-        <w:rPr>
-          <w:rFonts w:ascii="Consolas" w:hAnsi="Consolas" w:eastAsia="等线"/>
-        </w:rPr>
-        <w:t>sync_database!</w:t>
-      </w:r>
-      <w:r>
-        <w:rPr>
-          <w:rFonts w:ascii="Times New Roman" w:hAnsi="Times New Roman" w:eastAsia="宋体"/>
-        </w:rPr>
-        <w:t>在更新目录后遍历标签并复用相同下载逻辑。小型目录参考数据呈现初始化、更新、同步、回退和清理行为，完整历史目录沿用同一事务机制开展批量运维。</w:t>
-      </w:r>
-    </w:p>
-    <w:p>
-      <w:r>
-        <w:rPr>
-          <w:rFonts w:ascii="Times New Roman" w:hAnsi="Times New Roman" w:eastAsia="宋体"/>
-        </w:rPr>
-        <w:t>镜像状态分析覆盖候选顺序、字节数、SHA-256、缓存恢复和镜像遍历等分发环节。跨操作系统运行与校园网FTP—Zenodo实测共同呈现“事务安全—镜像获取—内容一致”的分发链路。</w:t>
-      </w:r>
-    </w:p>
-    <w:p>
-      <w:pPr>
-        <w:pStyle w:val="Heading3"/>
-      </w:pPr>
-      <w:r>
-        <w:rPr>
-          <w:rFonts w:ascii="Times New Roman" w:hAnsi="Times New Roman" w:eastAsia="宋体"/>
-        </w:rPr>
-        <w:t>2.4.5 Collector目录管理接口</w:t>
-      </w:r>
-    </w:p>
-    <w:p>
-      <w:r>
-        <w:rPr>
-          <w:rFonts w:ascii="Times New Roman" w:hAnsi="Times New Roman" w:eastAsia="宋体"/>
-        </w:rPr>
-        <w:t>除单标签下载外，Collector还提供目录更新、全库同步、旧数据或指定标签清理、目录树和数据集信息查询等操作，形成完整的数据维护工具链。</w:t>
-      </w:r>
-      <w:r>
-        <w:rPr>
-          <w:rFonts w:ascii="Consolas" w:hAnsi="Consolas" w:eastAsia="等线"/>
-        </w:rPr>
-        <w:t>clean_database!("all")</w:t>
-      </w:r>
-      <w:r>
-        <w:rPr>
-          <w:rFonts w:ascii="Times New Roman" w:hAnsi="Times New Roman" w:eastAsia="宋体"/>
-        </w:rPr>
-        <w:t>管理所配置根目录下的</w:t>
-      </w:r>
-      <w:r>
-        <w:rPr>
-          <w:rFonts w:ascii="Consolas" w:hAnsi="Consolas" w:eastAsia="等线"/>
-        </w:rPr>
-        <w:t>public</w:t>
-      </w:r>
-      <w:r>
-        <w:rPr>
-          <w:rFonts w:ascii="Times New Roman" w:hAnsi="Times New Roman" w:eastAsia="宋体"/>
-        </w:rPr>
-        <w:t>内容，按标签清理对应缓存和正式文件；</w:t>
-      </w:r>
-      <w:r>
-        <w:rPr>
-          <w:rFonts w:ascii="Consolas" w:hAnsi="Consolas" w:eastAsia="等线"/>
-        </w:rPr>
-        <w:t>clean_database!("old")</w:t>
-      </w:r>
-      <w:r>
-        <w:rPr>
-          <w:rFonts w:ascii="Times New Roman" w:hAnsi="Times New Roman" w:eastAsia="宋体"/>
-        </w:rPr>
-        <w:t>依据当前有效目录识别历史文件，并支持在清理前刷新目录。路径检查将操作范围限定在托管数据目录，更新、同步、查询和清理共享统一的目录状态。</w:t>
+        <w:t>gm2</w:t>
+      </w:r>
+      <w:r>
+        <w:rPr>
+          <w:rFonts w:ascii="Times New Roman" w:hAnsi="Times New Roman" w:eastAsia="宋体"/>
+        </w:rPr>
+        <w:t>文件则贯通陆面参数链路。</w:t>
       </w:r>
     </w:p>
     <w:p>
@@ -4141,304 +4277,110 @@
         <w:rPr>
           <w:rFonts w:ascii="Times New Roman" w:hAnsi="Times New Roman" w:eastAsia="宋体"/>
         </w:rPr>
-        <w:t>2.5 统一读取与模型接口</w:t>
+        <w:t>2.6 端到端调用路径</w:t>
+      </w:r>
+    </w:p>
+    <w:p>
+      <w:r>
+        <w:rPr>
+          <w:rFonts w:ascii="Times New Roman" w:hAnsi="Times New Roman" w:eastAsia="宋体"/>
+        </w:rPr>
+        <w:t>与2022版通过标签组织数据访问的思路一致[4]，新版将目录配置、目录更新、完整性下载、统一读取和模型参数组织连接为稳定的公共调用路径。用户依次调用</w:t>
+      </w:r>
+      <w:r>
+        <w:rPr>
+          <w:rFonts w:ascii="Consolas" w:hAnsi="Consolas" w:eastAsia="等线"/>
+        </w:rPr>
+        <w:t>configure!</w:t>
+      </w:r>
+      <w:r>
+        <w:rPr>
+          <w:rFonts w:ascii="Times New Roman" w:hAnsi="Times New Roman" w:eastAsia="宋体"/>
+        </w:rPr>
+        <w:t>、</w:t>
+      </w:r>
+      <w:r>
+        <w:rPr>
+          <w:rFonts w:ascii="Consolas" w:hAnsi="Consolas" w:eastAsia="等线"/>
+        </w:rPr>
+        <w:t>update_database!</w:t>
+      </w:r>
+      <w:r>
+        <w:rPr>
+          <w:rFonts w:ascii="Times New Roman" w:hAnsi="Times New Roman" w:eastAsia="宋体"/>
+        </w:rPr>
+        <w:t>和</w:t>
+      </w:r>
+      <w:r>
+        <w:rPr>
+          <w:rFonts w:ascii="Consolas" w:hAnsi="Consolas" w:eastAsia="等线"/>
+        </w:rPr>
+        <w:t>download_dataset!</w:t>
+      </w:r>
+      <w:r>
+        <w:rPr>
+          <w:rFonts w:ascii="Times New Roman" w:hAnsi="Times New Roman" w:eastAsia="宋体"/>
+        </w:rPr>
+        <w:t>获得经过</w:t>
+      </w:r>
+      <w:r>
+        <w:rPr>
+          <w:rFonts w:ascii="Consolas" w:hAnsi="Consolas" w:eastAsia="等线"/>
+        </w:rPr>
+        <w:t>SIZE/SHA256</w:t>
+      </w:r>
+      <w:r>
+        <w:rPr>
+          <w:rFonts w:ascii="Times New Roman" w:hAnsi="Times New Roman" w:eastAsia="宋体"/>
+        </w:rPr>
+        <w:t>核验的标准产品，再通过</w:t>
+      </w:r>
+      <w:r>
+        <w:rPr>
+          <w:rFonts w:ascii="Consolas" w:hAnsi="Consolas" w:eastAsia="等线"/>
+        </w:rPr>
+        <w:t>read_dataset</w:t>
+      </w:r>
+      <w:r>
+        <w:rPr>
+          <w:rFonts w:ascii="Times New Roman" w:hAnsi="Times New Roman" w:eastAsia="宋体"/>
+        </w:rPr>
+        <w:t>读取整场或格点数据，并由</w:t>
+      </w:r>
+      <w:r>
+        <w:rPr>
+          <w:rFonts w:ascii="Consolas" w:hAnsi="Consolas" w:eastAsia="等线"/>
+        </w:rPr>
+        <w:t>grid_dict</w:t>
+      </w:r>
+      <w:r>
+        <w:rPr>
+          <w:rFonts w:ascii="Times New Roman" w:hAnsi="Times New Roman" w:eastAsia="宋体"/>
+        </w:rPr>
+        <w:t>或</w:t>
+      </w:r>
+      <w:r>
+        <w:rPr>
+          <w:rFonts w:ascii="Consolas" w:hAnsi="Consolas" w:eastAsia="等线"/>
+        </w:rPr>
+        <w:t>grid_weather</w:t>
+      </w:r>
+      <w:r>
+        <w:rPr>
+          <w:rFonts w:ascii="Times New Roman" w:hAnsi="Times New Roman" w:eastAsia="宋体"/>
+        </w:rPr>
+        <w:t>形成模型输入。完整Julia示例、配置字段字典、目录登记及状态恢复命令集中列入补充材料与版本化用户指南，正文突出工作流结构及其科学应用方式。</w:t>
       </w:r>
     </w:p>
     <w:p>
       <w:pPr>
-        <w:pStyle w:val="Heading3"/>
+        <w:pStyle w:val="Heading1"/>
       </w:pPr>
       <w:r>
         <w:rPr>
           <w:rFonts w:ascii="Times New Roman" w:hAnsi="Times New Roman" w:eastAsia="宋体"/>
         </w:rPr>
-        <w:t xml:space="preserve">2.5.1 </w:t>
-      </w:r>
-      <w:r>
-        <w:rPr>
-          <w:rFonts w:ascii="Consolas" w:hAnsi="Consolas" w:eastAsia="等线"/>
-        </w:rPr>
-        <w:t>read_dataset</w:t>
-      </w:r>
-      <w:r>
-        <w:rPr>
-          <w:rFonts w:ascii="Times New Roman" w:hAnsi="Times New Roman" w:eastAsia="宋体"/>
-        </w:rPr>
-        <w:t xml:space="preserve"> 统一读取接口</w:t>
-      </w:r>
-    </w:p>
-    <w:p>
-      <w:r>
-        <w:rPr>
-          <w:rFonts w:ascii="Times New Roman" w:hAnsi="Times New Roman" w:eastAsia="宋体"/>
-        </w:rPr>
-        <w:t>Indexer模块以</w:t>
-      </w:r>
-      <w:r>
-        <w:rPr>
-          <w:rFonts w:ascii="Consolas" w:hAnsi="Consolas" w:eastAsia="等线"/>
-        </w:rPr>
-        <w:t>read_dataset</w:t>
-      </w:r>
-      <w:r>
-        <w:rPr>
-          <w:rFonts w:ascii="Times New Roman" w:hAnsi="Times New Roman" w:eastAsia="宋体"/>
-        </w:rPr>
-        <w:t>统一本地NetCDF路径和目录标签的读取，支持整场数组、指定周期切片、站点全部周期以及站点指定周期4种调用。目录标签在本地缺失时交由Collector下载；旧名称</w:t>
-      </w:r>
-      <w:r>
-        <w:rPr>
-          <w:rFonts w:ascii="Consolas" w:hAnsi="Consolas" w:eastAsia="等线"/>
-        </w:rPr>
-        <w:t>read_LUT</w:t>
-      </w:r>
-      <w:r>
-        <w:rPr>
-          <w:rFonts w:ascii="Times New Roman" w:hAnsi="Times New Roman" w:eastAsia="宋体"/>
-        </w:rPr>
-        <w:t>保留为兼容别名。默认读取</w:t>
-      </w:r>
-      <w:r>
-        <w:rPr>
-          <w:rFonts w:ascii="Consolas" w:hAnsi="Consolas" w:eastAsia="等线"/>
-        </w:rPr>
-        <w:t>data</w:t>
-      </w:r>
-      <w:r>
-        <w:rPr>
-          <w:rFonts w:ascii="Times New Roman" w:hAnsi="Times New Roman" w:eastAsia="宋体"/>
-        </w:rPr>
-        <w:t>，调用者也可显式请求</w:t>
-      </w:r>
-      <w:r>
-        <w:rPr>
-          <w:rFonts w:ascii="Consolas" w:hAnsi="Consolas" w:eastAsia="等线"/>
-        </w:rPr>
-        <w:t>raw_data</w:t>
-      </w:r>
-      <w:r>
-        <w:rPr>
-          <w:rFonts w:ascii="Times New Roman" w:hAnsi="Times New Roman" w:eastAsia="宋体"/>
-        </w:rPr>
-        <w:t>或</w:t>
-      </w:r>
-      <w:r>
-        <w:rPr>
-          <w:rFonts w:ascii="Consolas" w:hAnsi="Consolas" w:eastAsia="等线"/>
-        </w:rPr>
-        <w:t>std</w:t>
-      </w:r>
-      <w:r>
-        <w:rPr>
-          <w:rFonts w:ascii="Times New Roman" w:hAnsi="Times New Roman" w:eastAsia="宋体"/>
-        </w:rPr>
-        <w:t>。读取层直接保留生产端已经标准化的单位、缺失值和物理范围，使处理规则集中于共享生产契约。</w:t>
-      </w:r>
-    </w:p>
-    <w:p>
-      <w:r>
-        <w:rPr>
-          <w:rFonts w:ascii="Times New Roman" w:hAnsi="Times New Roman" w:eastAsia="宋体"/>
-        </w:rPr>
-        <w:t>站点读取依据全球规则经纬网分辨率把经纬度映射为数组索引，并以标准文件的</w:t>
-      </w:r>
-      <w:r>
-        <w:rPr>
-          <w:rFonts w:ascii="Consolas" w:hAnsi="Consolas" w:eastAsia="等线"/>
-        </w:rPr>
-        <w:t>(lon,lat[,ind])</w:t>
-      </w:r>
-      <w:r>
-        <w:rPr>
-          <w:rFonts w:ascii="Times New Roman" w:hAnsi="Times New Roman" w:eastAsia="宋体"/>
-        </w:rPr>
-        <w:t>顺序及西向东、南向北排列为输入契约。接口面向全球规则网格的原位索引，区域投影、非规则网格和空间插值可在生产端完成标准化；周期索引的月份、日期或小时含义由对应产品元数据解释。</w:t>
-      </w:r>
-    </w:p>
-    <w:p>
-      <w:pPr>
-        <w:pStyle w:val="Heading3"/>
-      </w:pPr>
-      <w:r>
-        <w:rPr>
-          <w:rFonts w:ascii="Times New Roman" w:hAnsi="Times New Roman" w:eastAsia="宋体"/>
-        </w:rPr>
-        <w:t xml:space="preserve">2.5.2 </w:t>
-      </w:r>
-      <w:r>
-        <w:rPr>
-          <w:rFonts w:ascii="Consolas" w:hAnsi="Consolas" w:eastAsia="等线"/>
-        </w:rPr>
-        <w:t>grid_dict</w:t>
-      </w:r>
-      <w:r>
-        <w:rPr>
-          <w:rFonts w:ascii="Times New Roman" w:hAnsi="Times New Roman" w:eastAsia="宋体"/>
-        </w:rPr>
-        <w:t xml:space="preserve"> 陆地模型参数组织</w:t>
-      </w:r>
-    </w:p>
-    <w:p>
-      <w:r>
-        <w:rPr>
-          <w:rFonts w:ascii="Consolas" w:hAnsi="Consolas" w:eastAsia="等线"/>
-        </w:rPr>
-        <w:t>grid_dict</w:t>
-      </w:r>
-      <w:r>
-        <w:rPr>
-          <w:rFonts w:ascii="Times New Roman" w:hAnsi="Times New Roman" w:eastAsia="宋体"/>
-        </w:rPr>
-        <w:t>把</w:t>
-      </w:r>
-      <w:r>
-        <w:rPr>
-          <w:rFonts w:ascii="Consolas" w:hAnsi="Consolas" w:eastAsia="等线"/>
-        </w:rPr>
-        <w:t>gm1</w:t>
-      </w:r>
-      <w:r>
-        <w:rPr>
-          <w:rFonts w:ascii="Times New Roman" w:hAnsi="Times New Roman" w:eastAsia="宋体"/>
-        </w:rPr>
-        <w:t>或</w:t>
-      </w:r>
-      <w:r>
-        <w:rPr>
-          <w:rFonts w:ascii="Consolas" w:hAnsi="Consolas" w:eastAsia="等线"/>
-        </w:rPr>
-        <w:t>gm2</w:t>
-      </w:r>
-      <w:r>
-        <w:rPr>
-          <w:rFonts w:ascii="Times New Roman" w:hAnsi="Times New Roman" w:eastAsia="宋体"/>
-        </w:rPr>
-        <w:t>标签组中的土壤、冠层、叶片、地形、陆地掩膜和植物功能型产品组织为单个格点的模型参数字典。年份用于选择叶面积指数并组织逐日序列。函数先检查陆地掩膜和叶面积指数；植被格点进入参数读取与季节序列组织，其他格点返回清晰的状态信息。</w:t>
-      </w:r>
-    </w:p>
-    <w:p>
-      <w:r>
-        <w:rPr>
-          <w:rFonts w:ascii="Times New Roman" w:hAnsi="Times New Roman" w:eastAsia="宋体"/>
-        </w:rPr>
-        <w:t>输出包括位置、分辨率、年份、CO₂、土壤水力参数、冠层结构、植物功能型比例、叶片生物物理和光合参数；启用质量控制时同步检查字段完整性和</w:t>
-      </w:r>
-      <w:r>
-        <w:rPr>
-          <w:rFonts w:ascii="Consolas" w:hAnsi="Consolas" w:eastAsia="等线"/>
-        </w:rPr>
-        <w:t>NaN</w:t>
-      </w:r>
-      <w:r>
-        <w:rPr>
-          <w:rFonts w:ascii="Times New Roman" w:hAnsi="Times New Roman" w:eastAsia="宋体"/>
-        </w:rPr>
-        <w:t>状态。该接口把多个已标准化产品稳定组织为模型入口，内置经验系数、标签组合及陆面类型状态共同构成清晰的模型输入契约。</w:t>
-      </w:r>
-    </w:p>
-    <w:p>
-      <w:pPr>
-        <w:pStyle w:val="Heading3"/>
-      </w:pPr>
-      <w:r>
-        <w:rPr>
-          <w:rFonts w:ascii="Times New Roman" w:hAnsi="Times New Roman" w:eastAsia="宋体"/>
-        </w:rPr>
-        <w:t xml:space="preserve">2.5.3 </w:t>
-      </w:r>
-      <w:r>
-        <w:rPr>
-          <w:rFonts w:ascii="Consolas" w:hAnsi="Consolas" w:eastAsia="等线"/>
-        </w:rPr>
-        <w:t>grid_weather</w:t>
-      </w:r>
-      <w:r>
-        <w:rPr>
-          <w:rFonts w:ascii="Times New Roman" w:hAnsi="Times New Roman" w:eastAsia="宋体"/>
-        </w:rPr>
-        <w:t xml:space="preserve"> 气象驱动组织</w:t>
-      </w:r>
-    </w:p>
-    <w:p>
-      <w:r>
-        <w:rPr>
-          <w:rFonts w:ascii="Consolas" w:hAnsi="Consolas" w:eastAsia="等线"/>
-        </w:rPr>
-        <w:t>grid_weather</w:t>
-      </w:r>
-      <w:r>
-        <w:rPr>
-          <w:rFonts w:ascii="Times New Roman" w:hAnsi="Times New Roman" w:eastAsia="宋体"/>
-        </w:rPr>
-        <w:t>按年份和格点读取</w:t>
-      </w:r>
-      <w:r>
-        <w:rPr>
-          <w:rFonts w:ascii="Consolas" w:hAnsi="Consolas" w:eastAsia="等线"/>
-        </w:rPr>
-        <w:t>wd1</w:t>
-      </w:r>
-      <w:r>
-        <w:rPr>
-          <w:rFonts w:ascii="Times New Roman" w:hAnsi="Times New Roman" w:eastAsia="宋体"/>
-        </w:rPr>
-        <w:t>中的8个ERA5标签，分别组织地表气压、降水、漫射与直射短波辐射、长波辐射、气温、水汽压亏缺和风速。输出统一为含时间索引</w:t>
-      </w:r>
-      <w:r>
-        <w:rPr>
-          <w:rFonts w:ascii="Consolas" w:hAnsi="Consolas" w:eastAsia="等线"/>
-        </w:rPr>
-        <w:t>FDOY</w:t>
-      </w:r>
-      <w:r>
-        <w:rPr>
-          <w:rFonts w:ascii="Times New Roman" w:hAnsi="Times New Roman" w:eastAsia="宋体"/>
-        </w:rPr>
-        <w:t>及8个气象字段的字典，启用质量控制时同步检查字段完整性和</w:t>
-      </w:r>
-      <w:r>
-        <w:rPr>
-          <w:rFonts w:ascii="Consolas" w:hAnsi="Consolas" w:eastAsia="等线"/>
-        </w:rPr>
-        <w:t>NaN</w:t>
-      </w:r>
-      <w:r>
-        <w:rPr>
-          <w:rFonts w:ascii="Times New Roman" w:hAnsi="Times New Roman" w:eastAsia="宋体"/>
-        </w:rPr>
-        <w:t>状态。接口既可直接按经纬度读取，也可从已经加载的全局气象数组提取格点序列。</w:t>
-      </w:r>
-    </w:p>
-    <w:p>
-      <w:r>
-        <w:rPr>
-          <w:rFonts w:ascii="Times New Roman" w:hAnsi="Times New Roman" w:eastAsia="宋体"/>
-        </w:rPr>
-        <w:t>该接口围绕规则网格、既定单位和</w:t>
-      </w:r>
-      <w:r>
-        <w:rPr>
-          <w:rFonts w:ascii="Consolas" w:hAnsi="Consolas" w:eastAsia="等线"/>
-        </w:rPr>
-        <w:t>wd1</w:t>
-      </w:r>
-      <w:r>
-        <w:rPr>
-          <w:rFonts w:ascii="Times New Roman" w:hAnsi="Times New Roman" w:eastAsia="宋体"/>
-        </w:rPr>
-        <w:t>标签完成模型就绪字段组织。确定性气象参考数据用于核对字段、形状和Emerald最小步进，</w:t>
-      </w:r>
-      <w:r>
-        <w:rPr>
-          <w:rFonts w:ascii="Consolas" w:hAnsi="Consolas" w:eastAsia="等线"/>
-        </w:rPr>
-        <w:t>gm2</w:t>
-      </w:r>
-      <w:r>
-        <w:rPr>
-          <w:rFonts w:ascii="Times New Roman" w:hAnsi="Times New Roman" w:eastAsia="宋体"/>
-        </w:rPr>
-        <w:t>文件则贯通陆面参数链路。</w:t>
+        <w:t>3 应用案例与评价方法</w:t>
       </w:r>
     </w:p>
     <w:p>
@@ -4449,7 +4391,7 @@
         <w:rPr>
           <w:rFonts w:ascii="Times New Roman" w:hAnsi="Times New Roman" w:eastAsia="宋体"/>
         </w:rPr>
-        <w:t>2.6 数据获取与模型输入调用示例</w:t>
+        <w:t>3.1 标准产品生产与OISST案例</w:t>
       </w:r>
     </w:p>
     <w:p>
@@ -4457,196 +4399,80 @@
         <w:rPr>
           <w:rFonts w:ascii="Times New Roman" w:hAnsi="Times New Roman" w:eastAsia="宋体"/>
         </w:rPr>
-        <w:t>与2022版通过标签隐藏数据位置的思路一致[4]，新版继续支持以标签调用数据，并将目录更新、完整性校验和统一读取组织为清晰的公共接口。框2展示最小使用路径：设置数据根目录、更新目录、校验下载、读取US-NR1附近格点，并进一步生成2020年陆面参数字典。陆面案例采用同一公共接口完成数据获取与模型参数组织。</w:t>
+        <w:t>为展示YAML驱动流程对多维地学数据的标准化能力，本文设计具有明确空间语义的位置编码数组：二维数组由经纬度索引共同编码，三维数组进一步加入周期索引。该设计能够清晰呈现维度交换、方向翻转、经度平移和周期组织前后的对应关系，并为标准NetCDF生产提供逐点参照。</w:t>
       </w:r>
     </w:p>
     <w:p>
       <w:r>
         <w:rPr>
           <w:rFonts w:ascii="Times New Roman" w:hAnsi="Times New Roman" w:eastAsia="宋体"/>
-          <w:b/>
-        </w:rPr>
-        <w:t>框2 从目录更新到模型参数组织的Julia示例</w:t>
-      </w:r>
-    </w:p>
-    <w:p>
-      <w:pPr>
-        <w:spacing w:before="80" w:after="120" w:line="240" w:lineRule="auto"/>
-        <w:ind w:firstLine="0" w:left="312" w:right="312"/>
-        <w:shd w:fill="F2F5F7"/>
-      </w:pPr>
+        </w:rPr>
+        <w:t>代表性处理实例包括</w:t>
+      </w:r>
       <w:r>
         <w:rPr>
           <w:rFonts w:ascii="Consolas" w:hAnsi="Consolas" w:eastAsia="等线"/>
-          <w:sz w:val="17"/>
-        </w:rPr>
-        <w:t>using GriddingMachine</w:t>
-        <w:br/>
-        <w:t>using GriddingMachine.Collector</w:t>
-        <w:br/>
-        <w:t>using GriddingMachine.Indexer</w:t>
-        <w:br/>
-        <w:br/>
-        <w:t>Collector.configure!(home = joinpath(homedir(), "GriddingMachine"))</w:t>
-        <w:br/>
-        <w:t>Collector.update_database!()</w:t>
-        <w:br/>
-        <w:br/>
-        <w:t>file = Collector.download_dataset!(</w:t>
-        <w:br/>
-        <w:t xml:space="preserve">    "ELEV_4X_1Y_V1"; require_integrity = true</w:t>
-        <w:br/>
-        <w:t>)</w:t>
-        <w:br/>
-        <w:t>elevation = Indexer.read_dataset(file, 40.0329, -105.5464)</w:t>
-        <w:br/>
-        <w:t>parameters = Indexer.grid_dict("gm2", 2020, 40.0329, -105.5464)</w:t>
-      </w:r>
-    </w:p>
-    <w:p>
-      <w:r>
-        <w:rPr>
-          <w:rFonts w:ascii="Times New Roman" w:hAnsi="Times New Roman" w:eastAsia="宋体"/>
-        </w:rPr>
-        <w:t>示例采用只读目录与镜像获取流程。</w:t>
+        </w:rPr>
+        <w:t>(lon,lat)</w:t>
+      </w:r>
+      <w:r>
+        <w:rPr>
+          <w:rFonts w:ascii="Times New Roman" w:hAnsi="Times New Roman" w:eastAsia="宋体"/>
+        </w:rPr>
+        <w:t>与</w:t>
       </w:r>
       <w:r>
         <w:rPr>
           <w:rFonts w:ascii="Consolas" w:hAnsi="Consolas" w:eastAsia="等线"/>
         </w:rPr>
-        <w:t>update_database!</w:t>
-      </w:r>
-      <w:r>
-        <w:rPr>
-          <w:rFonts w:ascii="Times New Roman" w:hAnsi="Times New Roman" w:eastAsia="宋体"/>
-        </w:rPr>
-        <w:t>和缺失文件下载访问目录及其镜像；离线复现可将</w:t>
+        <w:t>(lon,lat,ind)</w:t>
+      </w:r>
+      <w:r>
+        <w:rPr>
+          <w:rFonts w:ascii="Times New Roman" w:hAnsi="Times New Roman" w:eastAsia="宋体"/>
+        </w:rPr>
+        <w:t>标准输入、</w:t>
       </w:r>
       <w:r>
         <w:rPr>
           <w:rFonts w:ascii="Consolas" w:hAnsi="Consolas" w:eastAsia="等线"/>
         </w:rPr>
-        <w:t>catalog_file</w:t>
-      </w:r>
-      <w:r>
-        <w:rPr>
-          <w:rFonts w:ascii="Times New Roman" w:hAnsi="Times New Roman" w:eastAsia="宋体"/>
-        </w:rPr>
-        <w:t>和数据根目录指向已经归档并完成哈希核验的本地副本。版本化用户指南集中提供完整安装、配置字段字典、目录登记和状态恢复命令，正文突出工作流结构及其应用方式。</w:t>
-      </w:r>
-    </w:p>
-    <w:p>
-      <w:pPr>
-        <w:pStyle w:val="Heading1"/>
-      </w:pPr>
-      <w:r>
-        <w:rPr>
-          <w:rFonts w:ascii="Times New Roman" w:hAnsi="Times New Roman" w:eastAsia="宋体"/>
-        </w:rPr>
-        <w:t>3 典型应用与分析方法</w:t>
-      </w:r>
-    </w:p>
-    <w:p>
-      <w:pPr>
-        <w:pStyle w:val="Heading2"/>
-      </w:pPr>
-      <w:r>
-        <w:rPr>
-          <w:rFonts w:ascii="Times New Roman" w:hAnsi="Times New Roman" w:eastAsia="宋体"/>
-        </w:rPr>
-        <w:t>3.1 标准数据生产与质量控制</w:t>
-      </w:r>
-    </w:p>
-    <w:p>
-      <w:pPr>
-        <w:pStyle w:val="Heading3"/>
-      </w:pPr>
-      <w:r>
-        <w:rPr>
-          <w:rFonts w:ascii="Times New Roman" w:hAnsi="Times New Roman" w:eastAsia="宋体"/>
-        </w:rPr>
-        <w:t>3.1.1 维度、坐标与数值转换场景</w:t>
-      </w:r>
-    </w:p>
-    <w:p>
-      <w:r>
-        <w:rPr>
-          <w:rFonts w:ascii="Times New Roman" w:hAnsi="Times New Roman" w:eastAsia="宋体"/>
-        </w:rPr>
-        <w:t>为展示YAML驱动流程对多维地学数据的标准化能力，本文设计具有明确空间语义的位置编码数组：二维数组由经纬度索引共同编码，三维数组进一步加入周期索引。该设计能够清晰呈现维度交换、方向翻转、经度平移和周期组织前后的对应关系，并为标准NetCDF生产提供逐点参照。</w:t>
-      </w:r>
-    </w:p>
-    <w:p>
-      <w:r>
-        <w:rPr>
-          <w:rFonts w:ascii="Times New Roman" w:hAnsi="Times New Roman" w:eastAsia="宋体"/>
-        </w:rPr>
-        <w:t>代表性处理实例包括</w:t>
+        <w:t>(lat,lon)</w:t>
+      </w:r>
+      <w:r>
+        <w:rPr>
+          <w:rFonts w:ascii="Times New Roman" w:hAnsi="Times New Roman" w:eastAsia="宋体"/>
+        </w:rPr>
+        <w:t>与</w:t>
       </w:r>
       <w:r>
         <w:rPr>
           <w:rFonts w:ascii="Consolas" w:hAnsi="Consolas" w:eastAsia="等线"/>
         </w:rPr>
-        <w:t>(lon,lat)</w:t>
-      </w:r>
-      <w:r>
-        <w:rPr>
-          <w:rFonts w:ascii="Times New Roman" w:hAnsi="Times New Roman" w:eastAsia="宋体"/>
-        </w:rPr>
-        <w:t>与</w:t>
+        <w:t>(ind,lat,lon)</w:t>
+      </w:r>
+      <w:r>
+        <w:rPr>
+          <w:rFonts w:ascii="Times New Roman" w:hAnsi="Times New Roman" w:eastAsia="宋体"/>
+        </w:rPr>
+        <w:t>源排列、纬度和经度翻转、</w:t>
       </w:r>
       <w:r>
         <w:rPr>
           <w:rFonts w:ascii="Consolas" w:hAnsi="Consolas" w:eastAsia="等线"/>
         </w:rPr>
-        <w:t>(lon,lat,ind)</w:t>
-      </w:r>
-      <w:r>
-        <w:rPr>
-          <w:rFonts w:ascii="Times New Roman" w:hAnsi="Times New Roman" w:eastAsia="宋体"/>
-        </w:rPr>
-        <w:t>标准输入、</w:t>
+        <w:t>0～360°</w:t>
+      </w:r>
+      <w:r>
+        <w:rPr>
+          <w:rFonts w:ascii="Times New Roman" w:hAnsi="Times New Roman" w:eastAsia="宋体"/>
+        </w:rPr>
+        <w:t>经度平移、线性缩放、范围过滤、Gapfill、</w:t>
       </w:r>
       <w:r>
         <w:rPr>
           <w:rFonts w:ascii="Consolas" w:hAnsi="Consolas" w:eastAsia="等线"/>
         </w:rPr>
-        <w:t>(lat,lon)</w:t>
-      </w:r>
-      <w:r>
-        <w:rPr>
-          <w:rFonts w:ascii="Times New Roman" w:hAnsi="Times New Roman" w:eastAsia="宋体"/>
-        </w:rPr>
-        <w:t>与</w:t>
-      </w:r>
-      <w:r>
-        <w:rPr>
-          <w:rFonts w:ascii="Consolas" w:hAnsi="Consolas" w:eastAsia="等线"/>
-        </w:rPr>
-        <w:t>(ind,lat,lon)</w:t>
-      </w:r>
-      <w:r>
-        <w:rPr>
-          <w:rFonts w:ascii="Times New Roman" w:hAnsi="Times New Roman" w:eastAsia="宋体"/>
-        </w:rPr>
-        <w:t>源排列、纬度和经度翻转、</w:t>
-      </w:r>
-      <w:r>
-        <w:rPr>
-          <w:rFonts w:ascii="Consolas" w:hAnsi="Consolas" w:eastAsia="等线"/>
-        </w:rPr>
-        <w:t>0～360°</w:t>
-      </w:r>
-      <w:r>
-        <w:rPr>
-          <w:rFonts w:ascii="Times New Roman" w:hAnsi="Times New Roman" w:eastAsia="宋体"/>
-        </w:rPr>
-        <w:t>经度平移、线性缩放、范围过滤、Gapfill、</w:t>
-      </w:r>
-      <w:r>
-        <w:rPr>
-          <w:rFonts w:ascii="Consolas" w:hAnsi="Consolas" w:eastAsia="等线"/>
-        </w:rPr>
         <w:t>data/std</w:t>
       </w:r>
       <w:r>
@@ -4654,17 +4480,6 @@
           <w:rFonts w:ascii="Times New Roman" w:hAnsi="Times New Roman" w:eastAsia="宋体"/>
         </w:rPr>
         <w:t>保存和标签生成。配置字段、变量数量、已有产品和标签状态共同覆盖标准产品从源数据到目录登记的主要环节。</w:t>
-      </w:r>
-    </w:p>
-    <w:p>
-      <w:pPr>
-        <w:pStyle w:val="Heading3"/>
-      </w:pPr>
-      <w:r>
-        <w:rPr>
-          <w:rFonts w:ascii="Times New Roman" w:hAnsi="Times New Roman" w:eastAsia="宋体"/>
-        </w:rPr>
-        <w:t>3.1.2 标准产品生产能力覆盖</w:t>
       </w:r>
     </w:p>
     <w:p>
@@ -4740,7 +4555,7 @@
                 <w:b/>
                 <w:sz w:val="18"/>
               </w:rPr>
-              <w:t>场景数</w:t>
+              <w:t>实例数</w:t>
             </w:r>
           </w:p>
         </w:tc>
@@ -5432,14 +5247,11 @@
       </w:r>
     </w:p>
     <w:p>
-      <w:pPr>
-        <w:pStyle w:val="Heading3"/>
-      </w:pPr>
-      <w:r>
-        <w:rPr>
-          <w:rFonts w:ascii="Times New Roman" w:hAnsi="Times New Roman" w:eastAsia="宋体"/>
-        </w:rPr>
-        <w:t>3.1.3 产品质量控制</w:t>
+      <w:r>
+        <w:rPr>
+          <w:rFonts w:ascii="Times New Roman" w:hAnsi="Times New Roman" w:eastAsia="宋体"/>
+        </w:rPr>
+        <w:t>产品质量控制覆盖变量、维度、形状、属性、坐标方向、数值范围和Gapfill结果。输出数组与位置编码参照逐点对应，Float32转换采用统一的绝对和相对容差；配置与产品状态通过明确的流程信息反馈给维护者。质量报告同步保存最大绝对误差、最大相对误差、处理历史和重复生产一致性。</w:t>
       </w:r>
     </w:p>
     <w:p>
@@ -5447,163 +5259,133 @@
         <w:rPr>
           <w:rFonts w:ascii="Times New Roman" w:hAnsi="Times New Roman" w:eastAsia="宋体"/>
         </w:rPr>
-        <w:t>产品质量控制覆盖变量、维度、形状、属性、坐标方向、数值范围和Gapfill结果。输出数组与位置编码参照逐点对应，Float32转换采用统一的绝对和相对容差；配置与产品状态通过明确的流程信息反馈给维护者。质量报告同步保存最大绝对误差、最大相对误差、处理历史和重复生产一致性。</w:t>
+        <w:t>标准产品生产流程在各操作系统环境中保持一致行为。29组自动处理实例连续完成，正向图和南北反转图得到准确区分，体现了共享生产契约在数组变换、配置解析和空间方向控制方面的一致性。</w:t>
       </w:r>
     </w:p>
     <w:p>
       <w:r>
         <w:rPr>
-          <w:rFonts w:ascii="Times New Roman" w:hAnsi="Times New Roman" w:eastAsia="宋体"/>
-        </w:rPr>
-        <w:t>标准产品生产流程在各操作系统环境中保持一致行为。29组自动处理实例连续完成，正向图和南北反转图得到准确区分，体现了共享生产契约在数组变换、配置解析和空间方向控制方面的一致性。</w:t>
+          <w:rFonts w:ascii="Consolas" w:hAnsi="Consolas" w:eastAsia="等线"/>
+        </w:rPr>
+        <w:t>YamlBuilder</w:t>
+      </w:r>
+      <w:r>
+        <w:rPr>
+          <w:rFonts w:ascii="Times New Roman" w:hAnsi="Times New Roman" w:eastAsia="宋体"/>
+        </w:rPr>
+        <w:t>面向二维数据、含</w:t>
+      </w:r>
+      <w:r>
+        <w:rPr>
+          <w:rFonts w:ascii="Consolas" w:hAnsi="Consolas" w:eastAsia="等线"/>
+        </w:rPr>
+        <w:t>std</w:t>
+      </w:r>
+      <w:r>
+        <w:rPr>
+          <w:rFonts w:ascii="Times New Roman" w:hAnsi="Times New Roman" w:eastAsia="宋体"/>
+        </w:rPr>
+        <w:t>的三维数据和经纬度变换数据生成符合共享schema的配置，并将配置直接交给</w:t>
+      </w:r>
+      <w:r>
+        <w:rPr>
+          <w:rFonts w:ascii="Consolas" w:hAnsi="Consolas" w:eastAsia="等线"/>
+        </w:rPr>
+        <w:t>process_dataset!</w:t>
+      </w:r>
+      <w:r>
+        <w:rPr>
+          <w:rFonts w:ascii="Times New Roman" w:hAnsi="Times New Roman" w:eastAsia="宋体"/>
+        </w:rPr>
+        <w:t>。数据贡献案例进一步贯通配置生成、标准化、自动与人工质量检查、产品发布、</w:t>
+      </w:r>
+      <w:r>
+        <w:rPr>
+          <w:rFonts w:ascii="Consolas" w:hAnsi="Consolas" w:eastAsia="等线"/>
+        </w:rPr>
+        <w:t>Artifacts.yaml</w:t>
+      </w:r>
+      <w:r>
+        <w:rPr>
+          <w:rFonts w:ascii="Times New Roman" w:hAnsi="Times New Roman" w:eastAsia="宋体"/>
+        </w:rPr>
+        <w:t>登记以及下游更新、下载和读取，形成面向数据贡献者的完整生产入口。</w:t>
       </w:r>
     </w:p>
     <w:p>
-      <w:pPr>
-        <w:pStyle w:val="Heading3"/>
-      </w:pPr>
-      <w:r>
-        <w:rPr>
-          <w:rFonts w:ascii="Times New Roman" w:hAnsi="Times New Roman" w:eastAsia="宋体"/>
-        </w:rPr>
-        <w:t>3.1.4 YAML配置与数据贡献工作流</w:t>
+      <w:r>
+        <w:rPr>
+          <w:rFonts w:ascii="Times New Roman" w:hAnsi="Times New Roman" w:eastAsia="宋体"/>
+        </w:rPr>
+        <w:t>OISST真实产品用于进一步呈现共享生产契约对异构源结构的适配能力。案例采用NOAA/NCEI 0.25°逐日最优插值海表温度OISST V2.1中仅使用AVHRR数据的正式产品[9]，选取2022年2月25日文件。原始</w:t>
+      </w:r>
+      <w:r>
+        <w:rPr>
+          <w:rFonts w:ascii="Consolas" w:hAnsi="Consolas" w:eastAsia="等线"/>
+        </w:rPr>
+        <w:t>sst</w:t>
+      </w:r>
+      <w:r>
+        <w:rPr>
+          <w:rFonts w:ascii="Times New Roman" w:hAnsi="Times New Roman" w:eastAsia="宋体"/>
+        </w:rPr>
+        <w:t>变量在NetCDF中声明为</w:t>
+      </w:r>
+      <w:r>
+        <w:rPr>
+          <w:rFonts w:ascii="Consolas" w:hAnsi="Consolas" w:eastAsia="等线"/>
+        </w:rPr>
+        <w:t>time×zlev×lat×lon</w:t>
+      </w:r>
+      <w:r>
+        <w:rPr>
+          <w:rFonts w:ascii="Times New Roman" w:hAnsi="Times New Roman" w:eastAsia="宋体"/>
+        </w:rPr>
+        <w:t>，其中</w:t>
+      </w:r>
+      <w:r>
+        <w:rPr>
+          <w:rFonts w:ascii="Consolas" w:hAnsi="Consolas" w:eastAsia="等线"/>
+        </w:rPr>
+        <w:t>zlev</w:t>
+      </w:r>
+      <w:r>
+        <w:rPr>
+          <w:rFonts w:ascii="Times New Roman" w:hAnsi="Times New Roman" w:eastAsia="宋体"/>
+        </w:rPr>
+        <w:t>和</w:t>
+      </w:r>
+      <w:r>
+        <w:rPr>
+          <w:rFonts w:ascii="Consolas" w:hAnsi="Consolas" w:eastAsia="等线"/>
+        </w:rPr>
+        <w:t>time</w:t>
+      </w:r>
+      <w:r>
+        <w:rPr>
+          <w:rFonts w:ascii="Times New Roman" w:hAnsi="Times New Roman" w:eastAsia="宋体"/>
+        </w:rPr>
+        <w:t>均为单例维度；Julia读取后的数组顺序为</w:t>
+      </w:r>
+      <w:r>
+        <w:rPr>
+          <w:rFonts w:ascii="Consolas" w:hAnsi="Consolas" w:eastAsia="等线"/>
+        </w:rPr>
+        <w:t>lon×lat×zlev×time</w:t>
+      </w:r>
+      <w:r>
+        <w:rPr>
+          <w:rFonts w:ascii="Times New Roman" w:hAnsi="Times New Roman" w:eastAsia="宋体"/>
+        </w:rPr>
+        <w:t>，形状为1440×720×1×1。经度覆盖0.125°～359.875°，存储类型为Int16，并以0.01缩放因子解码为摄氏度。</w:t>
       </w:r>
     </w:p>
     <w:p>
       <w:r>
         <w:rPr>
-          <w:rFonts w:ascii="Consolas" w:hAnsi="Consolas" w:eastAsia="等线"/>
-        </w:rPr>
-        <w:t>YamlBuilder</w:t>
-      </w:r>
-      <w:r>
-        <w:rPr>
-          <w:rFonts w:ascii="Times New Roman" w:hAnsi="Times New Roman" w:eastAsia="宋体"/>
-        </w:rPr>
-        <w:t>面向二维数据、含</w:t>
-      </w:r>
-      <w:r>
-        <w:rPr>
-          <w:rFonts w:ascii="Consolas" w:hAnsi="Consolas" w:eastAsia="等线"/>
-        </w:rPr>
-        <w:t>std</w:t>
-      </w:r>
-      <w:r>
-        <w:rPr>
-          <w:rFonts w:ascii="Times New Roman" w:hAnsi="Times New Roman" w:eastAsia="宋体"/>
-        </w:rPr>
-        <w:t>的三维数据和经纬度变换数据生成符合共享schema的配置，并将配置直接交给</w:t>
-      </w:r>
-      <w:r>
-        <w:rPr>
-          <w:rFonts w:ascii="Consolas" w:hAnsi="Consolas" w:eastAsia="等线"/>
-        </w:rPr>
-        <w:t>process_dataset!</w:t>
-      </w:r>
-      <w:r>
-        <w:rPr>
-          <w:rFonts w:ascii="Times New Roman" w:hAnsi="Times New Roman" w:eastAsia="宋体"/>
-        </w:rPr>
-        <w:t>。字段级信息、直接NetCDF输出和可配置路径共同构成面向数据贡献者的生产入口。</w:t>
-      </w:r>
-    </w:p>
-    <w:p>
-      <w:r>
-        <w:rPr>
-          <w:rFonts w:ascii="Times New Roman" w:hAnsi="Times New Roman" w:eastAsia="宋体"/>
-        </w:rPr>
-        <w:t>数据贡献案例依次完成配置生成、标准化、自动与人工质量检查、产品发布、</w:t>
-      </w:r>
-      <w:r>
-        <w:rPr>
-          <w:rFonts w:ascii="Consolas" w:hAnsi="Consolas" w:eastAsia="等线"/>
-        </w:rPr>
-        <w:t>Artifacts.yaml</w:t>
-      </w:r>
-      <w:r>
-        <w:rPr>
-          <w:rFonts w:ascii="Times New Roman" w:hAnsi="Times New Roman" w:eastAsia="宋体"/>
-        </w:rPr>
-        <w:t>登记以及下游更新、下载和读取，呈现数据贡献者使用新版工作流的完整路径。</w:t>
-      </w:r>
-    </w:p>
-    <w:p>
-      <w:pPr>
-        <w:pStyle w:val="Heading3"/>
-      </w:pPr>
-      <w:r>
-        <w:rPr>
-          <w:rFonts w:ascii="Times New Roman" w:hAnsi="Times New Roman" w:eastAsia="宋体"/>
-        </w:rPr>
-        <w:t>3.1.5 OISST产品生产</w:t>
-      </w:r>
-    </w:p>
-    <w:p>
-      <w:r>
-        <w:rPr>
-          <w:rFonts w:ascii="Times New Roman" w:hAnsi="Times New Roman" w:eastAsia="宋体"/>
-        </w:rPr>
-        <w:t>异构海温产品案例采用NOAA/NCEI 0.25°逐日最优插值海表温度OISST V2.1中仅使用AVHRR数据的正式产品[9]，选取2022年2月25日文件。原始</w:t>
-      </w:r>
-      <w:r>
-        <w:rPr>
-          <w:rFonts w:ascii="Consolas" w:hAnsi="Consolas" w:eastAsia="等线"/>
-        </w:rPr>
-        <w:t>sst</w:t>
-      </w:r>
-      <w:r>
-        <w:rPr>
-          <w:rFonts w:ascii="Times New Roman" w:hAnsi="Times New Roman" w:eastAsia="宋体"/>
-        </w:rPr>
-        <w:t>变量在NetCDF中声明为</w:t>
-      </w:r>
-      <w:r>
-        <w:rPr>
-          <w:rFonts w:ascii="Consolas" w:hAnsi="Consolas" w:eastAsia="等线"/>
-        </w:rPr>
-        <w:t>time×zlev×lat×lon</w:t>
-      </w:r>
-      <w:r>
-        <w:rPr>
-          <w:rFonts w:ascii="Times New Roman" w:hAnsi="Times New Roman" w:eastAsia="宋体"/>
-        </w:rPr>
-        <w:t>，其中</w:t>
-      </w:r>
-      <w:r>
-        <w:rPr>
-          <w:rFonts w:ascii="Consolas" w:hAnsi="Consolas" w:eastAsia="等线"/>
-        </w:rPr>
-        <w:t>zlev</w:t>
-      </w:r>
-      <w:r>
-        <w:rPr>
-          <w:rFonts w:ascii="Times New Roman" w:hAnsi="Times New Roman" w:eastAsia="宋体"/>
-        </w:rPr>
-        <w:t>和</w:t>
-      </w:r>
-      <w:r>
-        <w:rPr>
-          <w:rFonts w:ascii="Consolas" w:hAnsi="Consolas" w:eastAsia="等线"/>
-        </w:rPr>
-        <w:t>time</w:t>
-      </w:r>
-      <w:r>
-        <w:rPr>
-          <w:rFonts w:ascii="Times New Roman" w:hAnsi="Times New Roman" w:eastAsia="宋体"/>
-        </w:rPr>
-        <w:t>均为单例维度；Julia读取后的数组顺序为</w:t>
-      </w:r>
-      <w:r>
-        <w:rPr>
-          <w:rFonts w:ascii="Consolas" w:hAnsi="Consolas" w:eastAsia="等线"/>
-        </w:rPr>
-        <w:t>lon×lat×zlev×time</w:t>
-      </w:r>
-      <w:r>
-        <w:rPr>
-          <w:rFonts w:ascii="Times New Roman" w:hAnsi="Times New Roman" w:eastAsia="宋体"/>
-        </w:rPr>
-        <w:t>，形状为1440×720×1×1。经度覆盖0.125°～359.875°，存储类型为Int16，并以0.01缩放因子解码为摄氏度。版本化源适配器提取唯一的垂向层和时间层，共享YAML契约进一步完成维度声明、</w:t>
+          <w:rFonts w:ascii="Times New Roman" w:hAnsi="Times New Roman" w:eastAsia="宋体"/>
+        </w:rPr>
+        <w:t>版本化源适配器提取唯一的垂向层和时间层，共享YAML契约进一步完成维度声明、</w:t>
       </w:r>
       <w:r>
         <w:rPr>
@@ -5793,18 +5575,87 @@
         <w:rPr>
           <w:rFonts w:ascii="Times New Roman" w:hAnsi="Times New Roman" w:eastAsia="宋体"/>
         </w:rPr>
-        <w:t>3.3 数据目录与多镜像分发分析</w:t>
+        <w:t>3.3 多镜像可靠性与真实镜像访问</w:t>
       </w:r>
     </w:p>
     <w:p>
-      <w:pPr>
-        <w:pStyle w:val="Heading3"/>
-      </w:pPr>
-      <w:r>
-        <w:rPr>
-          <w:rFonts w:ascii="Times New Roman" w:hAnsi="Times New Roman" w:eastAsia="宋体"/>
-        </w:rPr>
-        <w:t>3.3.1 数据目录生命周期</w:t>
+      <w:r>
+        <w:rPr>
+          <w:rFonts w:ascii="Times New Roman" w:hAnsi="Times New Roman" w:eastAsia="宋体"/>
+        </w:rPr>
+        <w:t>数据目录生命周期涵盖首次建立、版本更新、目录同步、产品获取、状态查询和历史数据整理。代表性目录包含不同版本的</w:t>
+      </w:r>
+      <w:r>
+        <w:rPr>
+          <w:rFonts w:ascii="Consolas" w:hAnsi="Consolas" w:eastAsia="等线"/>
+        </w:rPr>
+        <w:t>Artifacts.yaml</w:t>
+      </w:r>
+      <w:r>
+        <w:rPr>
+          <w:rFonts w:ascii="Times New Roman" w:hAnsi="Times New Roman" w:eastAsia="宋体"/>
+        </w:rPr>
+        <w:t>、多个NetCDF产品和两个镜像端点，并依次调用</w:t>
+      </w:r>
+      <w:r>
+        <w:rPr>
+          <w:rFonts w:ascii="Consolas" w:hAnsi="Consolas" w:eastAsia="等线"/>
+        </w:rPr>
+        <w:t>update_database!</w:t>
+      </w:r>
+      <w:r>
+        <w:rPr>
+          <w:rFonts w:ascii="Times New Roman" w:hAnsi="Times New Roman" w:eastAsia="宋体"/>
+        </w:rPr>
+        <w:t>、</w:t>
+      </w:r>
+      <w:r>
+        <w:rPr>
+          <w:rFonts w:ascii="Consolas" w:hAnsi="Consolas" w:eastAsia="等线"/>
+        </w:rPr>
+        <w:t>download_dataset!</w:t>
+      </w:r>
+      <w:r>
+        <w:rPr>
+          <w:rFonts w:ascii="Times New Roman" w:hAnsi="Times New Roman" w:eastAsia="宋体"/>
+        </w:rPr>
+        <w:t>、</w:t>
+      </w:r>
+      <w:r>
+        <w:rPr>
+          <w:rFonts w:ascii="Consolas" w:hAnsi="Consolas" w:eastAsia="等线"/>
+        </w:rPr>
+        <w:t>sync_database!</w:t>
+      </w:r>
+      <w:r>
+        <w:rPr>
+          <w:rFonts w:ascii="Times New Roman" w:hAnsi="Times New Roman" w:eastAsia="宋体"/>
+        </w:rPr>
+        <w:t>、</w:t>
+      </w:r>
+      <w:r>
+        <w:rPr>
+          <w:rFonts w:ascii="Consolas" w:hAnsi="Consolas" w:eastAsia="等线"/>
+        </w:rPr>
+        <w:t>clean_database!</w:t>
+      </w:r>
+      <w:r>
+        <w:rPr>
+          <w:rFonts w:ascii="Times New Roman" w:hAnsi="Times New Roman" w:eastAsia="宋体"/>
+        </w:rPr>
+        <w:t>及目录信息接口。cache与public目录分别承担事务缓存和正式产品保存，</w:t>
+      </w:r>
+      <w:r>
+        <w:rPr>
+          <w:rFonts w:ascii="Consolas" w:hAnsi="Consolas" w:eastAsia="等线"/>
+        </w:rPr>
+        <w:t>read_dataset</w:t>
+      </w:r>
+      <w:r>
+        <w:rPr>
+          <w:rFonts w:ascii="Times New Roman" w:hAnsi="Times New Roman" w:eastAsia="宋体"/>
+        </w:rPr>
+        <w:t>的整场、周期和站点读取共同连接目录与数据使用环节。</w:t>
       </w:r>
     </w:p>
     <w:p>
@@ -5812,79 +5663,19 @@
         <w:rPr>
           <w:rFonts w:ascii="Times New Roman" w:hAnsi="Times New Roman" w:eastAsia="宋体"/>
         </w:rPr>
-        <w:t>数据目录生命周期涵盖首次建立、版本更新、目录同步、产品获取、状态查询和历史数据整理。代表性目录包含不同版本的</w:t>
+        <w:t>各状态转换通过重复调用考察幂等行为，上一有效版本和事务缓存共同承接目录与下载状态。</w:t>
       </w:r>
       <w:r>
         <w:rPr>
           <w:rFonts w:ascii="Consolas" w:hAnsi="Consolas" w:eastAsia="等线"/>
         </w:rPr>
-        <w:t>Artifacts.yaml</w:t>
-      </w:r>
-      <w:r>
-        <w:rPr>
-          <w:rFonts w:ascii="Times New Roman" w:hAnsi="Times New Roman" w:eastAsia="宋体"/>
-        </w:rPr>
-        <w:t>、多个NetCDF产品和两个镜像端点，并依次调用</w:t>
-      </w:r>
-      <w:r>
-        <w:rPr>
-          <w:rFonts w:ascii="Consolas" w:hAnsi="Consolas" w:eastAsia="等线"/>
-        </w:rPr>
-        <w:t>update_database!</w:t>
-      </w:r>
-      <w:r>
-        <w:rPr>
-          <w:rFonts w:ascii="Times New Roman" w:hAnsi="Times New Roman" w:eastAsia="宋体"/>
-        </w:rPr>
-        <w:t>、</w:t>
-      </w:r>
-      <w:r>
-        <w:rPr>
-          <w:rFonts w:ascii="Consolas" w:hAnsi="Consolas" w:eastAsia="等线"/>
-        </w:rPr>
-        <w:t>download_dataset!</w:t>
-      </w:r>
-      <w:r>
-        <w:rPr>
-          <w:rFonts w:ascii="Times New Roman" w:hAnsi="Times New Roman" w:eastAsia="宋体"/>
-        </w:rPr>
-        <w:t>、</w:t>
-      </w:r>
-      <w:r>
-        <w:rPr>
-          <w:rFonts w:ascii="Consolas" w:hAnsi="Consolas" w:eastAsia="等线"/>
-        </w:rPr>
         <w:t>sync_database!</w:t>
       </w:r>
       <w:r>
         <w:rPr>
           <w:rFonts w:ascii="Times New Roman" w:hAnsi="Times New Roman" w:eastAsia="宋体"/>
         </w:rPr>
-        <w:t>、</w:t>
-      </w:r>
-      <w:r>
-        <w:rPr>
-          <w:rFonts w:ascii="Consolas" w:hAnsi="Consolas" w:eastAsia="等线"/>
-        </w:rPr>
-        <w:t>clean_database!</w:t>
-      </w:r>
-      <w:r>
-        <w:rPr>
-          <w:rFonts w:ascii="Times New Roman" w:hAnsi="Times New Roman" w:eastAsia="宋体"/>
-        </w:rPr>
-        <w:t>及目录信息接口。cache与public目录分别承担事务缓存和正式产品保存，</w:t>
-      </w:r>
-      <w:r>
-        <w:rPr>
-          <w:rFonts w:ascii="Consolas" w:hAnsi="Consolas" w:eastAsia="等线"/>
-        </w:rPr>
-        <w:t>read_dataset</w:t>
-      </w:r>
-      <w:r>
-        <w:rPr>
-          <w:rFonts w:ascii="Times New Roman" w:hAnsi="Times New Roman" w:eastAsia="宋体"/>
-        </w:rPr>
-        <w:t>的整场、周期和站点读取共同连接目录与数据使用环节。</w:t>
+        <w:t>使用确定性小型目录参考数据呈现全库遍历逻辑。</w:t>
       </w:r>
     </w:p>
     <w:p>
@@ -5892,49 +5683,7 @@
         <w:rPr>
           <w:rFonts w:ascii="Times New Roman" w:hAnsi="Times New Roman" w:eastAsia="宋体"/>
         </w:rPr>
-        <w:t>各状态转换通过重复调用考察幂等行为，上一有效版本和事务缓存共同承接目录与下载状态。</w:t>
-      </w:r>
-      <w:r>
-        <w:rPr>
-          <w:rFonts w:ascii="Consolas" w:hAnsi="Consolas" w:eastAsia="等线"/>
-        </w:rPr>
-        <w:t>sync_database!</w:t>
-      </w:r>
-      <w:r>
-        <w:rPr>
-          <w:rFonts w:ascii="Times New Roman" w:hAnsi="Times New Roman" w:eastAsia="宋体"/>
-        </w:rPr>
-        <w:t>使用确定性小型目录参考数据呈现全库遍历逻辑。</w:t>
-      </w:r>
-    </w:p>
-    <w:p>
-      <w:pPr>
-        <w:pStyle w:val="Heading3"/>
-      </w:pPr>
-      <w:r>
-        <w:rPr>
-          <w:rFonts w:ascii="Times New Roman" w:hAnsi="Times New Roman" w:eastAsia="宋体"/>
-        </w:rPr>
-        <w:t>3.3.2 多镜像访问与事务式获取</w:t>
-      </w:r>
-    </w:p>
-    <w:p>
-      <w:r>
-        <w:rPr>
-          <w:rFonts w:ascii="Times New Roman" w:hAnsi="Times New Roman" w:eastAsia="宋体"/>
-        </w:rPr>
         <w:t>多镜像可靠性分析在两个独立环境中构建内容一致、访问状态可配置的镜像集合，通过延迟分数组织候选顺序，并组合响应延迟、访问中断、内容差异和传输完整性等条件。各类镜像状态重复5次，记录候选选择、镜像遍历、正式文件状态及SHA-256，据此刻画事务式获取在镜像切换过程中的稳定性。校园网FTP与Zenodo访问进一步呈现机构镜像和公共镜像的互补分发特征与内容一致性。</w:t>
-      </w:r>
-    </w:p>
-    <w:p>
-      <w:pPr>
-        <w:pStyle w:val="Heading3"/>
-      </w:pPr>
-      <w:r>
-        <w:rPr>
-          <w:rFonts w:ascii="Times New Roman" w:hAnsi="Times New Roman" w:eastAsia="宋体"/>
-        </w:rPr>
-        <w:t>3.3.3 FTP与Zenodo镜像访问</w:t>
       </w:r>
     </w:p>
     <w:p>
@@ -6058,7 +5807,7 @@
         <w:rPr>
           <w:rFonts w:ascii="Times New Roman" w:hAnsi="Times New Roman" w:eastAsia="宋体"/>
         </w:rPr>
-        <w:t>3.5 跨操作系统运行与持续集成</w:t>
+        <w:t>3.5 多操作系统环境运行与持续集成</w:t>
       </w:r>
     </w:p>
     <w:p>
@@ -6097,7 +5846,7 @@
         <w:rPr>
           <w:rFonts w:ascii="Times New Roman" w:hAnsi="Times New Roman" w:eastAsia="宋体"/>
         </w:rPr>
-        <w:t>4 应用结果与性能表现</w:t>
+        <w:t>4 结果与性能分析</w:t>
       </w:r>
     </w:p>
     <w:p>
@@ -6563,7 +6312,7 @@
         <w:rPr>
           <w:rFonts w:ascii="Times New Roman" w:hAnsi="Times New Roman" w:eastAsia="宋体"/>
         </w:rPr>
-        <w:t>4.1 数据生产、配置契约与目录生成</w:t>
+        <w:t>4.1 标准产品生产与OISST结果</w:t>
       </w:r>
     </w:p>
     <w:p>
@@ -6771,7 +6520,7 @@
         <w:rPr>
           <w:rFonts w:ascii="Times New Roman" w:hAnsi="Times New Roman" w:eastAsia="宋体"/>
         </w:rPr>
-        <w:t>数据贡献案例贯通YAML配置、标准产品生成、目录登记和下游读取。生成产品与参考数组逐点一致，目录中的</w:t>
+        <w:t>数据贡献案例贯通YAML配置、标准产品生成、目录登记和下游读取，生成产品与参考数组逐点一致，目录中的</w:t>
       </w:r>
       <w:r>
         <w:rPr>
@@ -6783,15 +6532,7 @@
         <w:rPr>
           <w:rFonts w:ascii="Times New Roman" w:hAnsi="Times New Roman" w:eastAsia="宋体"/>
         </w:rPr>
-        <w:t>和SHA-256与文件相符；完整YAML示例和固定输入路径构成可直接复用的数据贡献模板。</w:t>
-      </w:r>
-    </w:p>
-    <w:p>
-      <w:r>
-        <w:rPr>
-          <w:rFonts w:ascii="Times New Roman" w:hAnsi="Times New Roman" w:eastAsia="宋体"/>
-        </w:rPr>
-        <w:t>NetcdfIO接口迁移与配置对象复用机制进一步统一了文件访问和批量生产行为。二维/三维输出、坐标变换、数值处理、Gapfill和目录生成由同一工作流连接，形成可持续扩展的标准产品生产基础。</w:t>
+        <w:t>和SHA-256与文件相符。NetcdfIO接口迁移与配置对象复用机制进一步统一文件访问和批量生产行为，使二维/三维输出、坐标变换、数值处理、Gapfill和目录生成由同一工作流连接；完整YAML示例和固定输入路径共同构成可复用的数据贡献模板。</w:t>
       </w:r>
     </w:p>
     <w:p>
@@ -7056,7 +6797,7 @@
         <w:rPr>
           <w:rFonts w:ascii="Times New Roman" w:hAnsi="Times New Roman" w:eastAsia="宋体"/>
         </w:rPr>
-        <w:t>同一下载接口在各操作系统环境中均实现延迟辅助排序、全候选保留和顺序回退，为不同网络条件提供一致的数据获取方式。</w:t>
+        <w:t>公共网络环境下，4个标签经Zenodo完成24次下载，全部达到登记字节数并通过SHA-256核验。下载时间随文件规模呈梯度变化，重复传输的SHA-256摘要与目录登记值一致，体现了公共镜像、事务缓存和完整性校验的协同作用。</w:t>
       </w:r>
     </w:p>
     <w:p>
@@ -7064,35 +6805,7 @@
         <w:rPr>
           <w:rFonts w:ascii="Times New Roman" w:hAnsi="Times New Roman" w:eastAsia="宋体"/>
         </w:rPr>
-        <w:t>公共网络环境下，4个标签经Zenodo完成24次下载，全部达到登记字节数并通过SHA-256核验。下载时间随文件规模呈梯度变化，重复传输的SHA-256摘要与目录登记值一致，体现了公共镜像、事务缓存和完整性校验的协同作用。</w:t>
-      </w:r>
-    </w:p>
-    <w:p>
-      <w:r>
-        <w:rPr>
-          <w:rFonts w:ascii="Times New Roman" w:hAnsi="Times New Roman" w:eastAsia="宋体"/>
-        </w:rPr>
         <w:t>中科大校园网环境下，FTP与Zenodo各完成12次同文件下载，24次结果均达到登记字节数并通过SHA-256核验。4个文件的FTP中位下载时间为0.071～0.356 s，Zenodo为1.091～14.092 s；FTP往返延迟为1.0～13.5 ms，延迟辅助排序与实际传输表现一致。机构镜像与公共镜像提供内容一致的分发副本，多镜像目录据此适配不同访问环境。</w:t>
-      </w:r>
-    </w:p>
-    <w:p>
-      <w:r>
-        <w:rPr>
-          <w:rFonts w:ascii="Times New Roman" w:hAnsi="Times New Roman" w:eastAsia="宋体"/>
-        </w:rPr>
-        <w:t>镜像状态场景与FTP—Zenodo访问共同呈现候选排序、顺序回退、事务落盘和内容核验的完整过程。公共网络体现Zenodo镜像和全候选保留机制，校园网体现机构FTP与公共Zenodo的互补分发能力；延迟辅助排序、全URL回退和</w:t>
-      </w:r>
-      <w:r>
-        <w:rPr>
-          <w:rFonts w:ascii="Consolas" w:hAnsi="Consolas" w:eastAsia="等线"/>
-        </w:rPr>
-        <w:t>SIZE/SHA256</w:t>
-      </w:r>
-      <w:r>
-        <w:rPr>
-          <w:rFonts w:ascii="Times New Roman" w:hAnsi="Times New Roman" w:eastAsia="宋体"/>
-        </w:rPr>
-        <w:t>核验共同支持不同网络条件下的稳定数据获取。</w:t>
       </w:r>
     </w:p>
     <w:p>
@@ -7153,15 +6866,7 @@
         <w:rPr>
           <w:rFonts w:ascii="Times New Roman" w:hAnsi="Times New Roman" w:eastAsia="宋体"/>
         </w:rPr>
-        <w:t>进一步将标准产品组织为Emerald可直接使用的参数与气象字典，并支持植被、裸土和时间序列等模型输入场景。</w:t>
-      </w:r>
-    </w:p>
-    <w:p>
-      <w:r>
-        <w:rPr>
-          <w:rFonts w:ascii="Times New Roman" w:hAnsi="Times New Roman" w:eastAsia="宋体"/>
-        </w:rPr>
-        <w:t>GriddingMachine输出进入Emerald参数组织、气象组织、模型初始化和60 s单步计算，建立从标准数据读取到模型首个时间步的直接连接。</w:t>
+        <w:t>进一步将标准产品组织为Emerald可直接使用的参数与气象字典，并支持植被、裸土和时间序列等模型输入场景。GriddingMachine输出由此进入Emerald参数组织、气象组织、模型初始化和60 s单步计算，建立从标准数据读取到模型首个时间步的直接连接。</w:t>
       </w:r>
     </w:p>
     <w:p>
@@ -7216,7 +6921,7 @@
         <w:rPr>
           <w:rFonts w:ascii="Times New Roman" w:hAnsi="Times New Roman" w:eastAsia="宋体"/>
         </w:rPr>
-        <w:t>4.5 跨操作系统运行表现</w:t>
+        <w:t>4.5 多操作系统环境运行表现</w:t>
       </w:r>
     </w:p>
     <w:p>
@@ -7224,7 +6929,7 @@
         <w:rPr>
           <w:rFonts w:ascii="Times New Roman" w:hAnsi="Times New Roman" w:eastAsia="宋体"/>
         </w:rPr>
-        <w:t>各操作系统环境均可运行标准产品生产、直接NetCDF分发、多镜像获取和Emerald模型接口，并获得一致的数据结构、SHA-256摘要和模型字段，体现了核心代码路径的可移植性与数据接口的一致性。</w:t>
+        <w:t>各操作系统环境均可运行标准产品生产、直接NetCDF分发、多镜像获取和Emerald模型接口，并获得一致的数据结构、SHA-256摘要和模型字段。同一下载接口在各环境中实现延迟辅助排序、全候选保留和顺序回退，体现了核心代码路径的可移植性、数据接口的一致性及其对网络条件变化的适应能力。</w:t>
       </w:r>
     </w:p>
     <w:p>
@@ -7380,7 +7085,15 @@
         <w:rPr>
           <w:rFonts w:ascii="Times New Roman" w:hAnsi="Times New Roman" w:eastAsia="宋体"/>
         </w:rPr>
-        <w:t>标签和独立目录提高数据的可发现性，多URL和直接NetCDF增强获取能力，统一网格与变量约定促进互操作，文件级变更记录与发布级配置归档共同支撑复用[1]。FAIR4RS强调科研软件的可执行性、复合依赖、持续演化和版本管理[16]；TRUST原则进一步提出透明度、责任、用户关注、可持续性和技术能力[17]。对我国国家科学数据中心的调研也显示，标准化元数据、持久标识与清晰的数据使用信息是提升科学数据复用水平的重要环节[18]。GriddingMachine以权威文件生成</w:t>
+        <w:t>标签和独立目录提高数据的可发现性，多URL和直接NetCDF增强获取能力，统一网格与变量约定促进互操作，文件级变更记录与发布级配置归档共同支撑复用[1]。FAIR4RS强调科研软件的可执行性、复合依赖、持续演化和版本管理[16]；TRUST原则进一步提出透明度、责任、用户关注、可持续性和技术能力[17]。对我国国家科学数据中心的调研也显示，标准化元数据、持久标识与清晰的数据使用信息是提升科学数据复用水平的重要环节[18]。</w:t>
+      </w:r>
+    </w:p>
+    <w:p>
+      <w:r>
+        <w:rPr>
+          <w:rFonts w:ascii="Times New Roman" w:hAnsi="Times New Roman" w:eastAsia="宋体"/>
+        </w:rPr>
+        <w:t>GriddingMachine以权威文件生成</w:t>
       </w:r>
       <w:r>
         <w:rPr>
@@ -7462,7 +7175,15 @@
         <w:rPr>
           <w:rFonts w:ascii="Times New Roman" w:hAnsi="Times New Roman" w:eastAsia="宋体"/>
         </w:rPr>
-        <w:t>本文在2022版GriddingMachine基础上构建由共享YAML schema、显式源维度映射、Gapfill、独立目录、直接NetCDF、事务式缓存及统一读取接口组成的可执行数据生命周期。OISST V2.1产品从四维打包源数据生成1440×720标准海表温度产品，坐标、有效值掩膜和691 150个物理值与独立参考逐点一致；对于已经内部压缩的ELEV和LAI产品，直接NetCDF在两个独立环境中将缓存预热后的端到端中位时间降低48.3%～82.9%和53.6%～69.2%；校园网内4个代表性产品通过FTP与Zenodo实现内容一致的双镜像获取，14类陆面产品生成US-NR1参数字典并进入Emerald模型初始化。</w:t>
+        <w:t>本文在2022版GriddingMachine基础上构建由共享YAML schema、显式源维度映射、Gapfill、独立目录、直接NetCDF、事务式缓存及统一读取接口组成的可执行数据生命周期，实现从异构源数据到模型就绪输入的贯通。</w:t>
+      </w:r>
+    </w:p>
+    <w:p>
+      <w:r>
+        <w:rPr>
+          <w:rFonts w:ascii="Times New Roman" w:hAnsi="Times New Roman" w:eastAsia="宋体"/>
+        </w:rPr>
+        <w:t>OISST V2.1产品从四维打包源数据生成1440×720标准海表温度产品，坐标、有效值掩膜和691 150个物理值与独立参考逐点一致。对于已经内部压缩的ELEV和LAI产品，直接NetCDF在两个独立环境中将缓存预热后的端到端中位时间降低48.3%～82.9%和53.6%～69.2%；校园网内4个代表性产品通过FTP与Zenodo实现内容一致的双镜像获取，14类陆面产品生成US-NR1参数字典并进入Emerald模型初始化。</w:t>
       </w:r>
     </w:p>
     <w:p>
@@ -7489,7 +7210,7 @@
         <w:rPr>
           <w:rFonts w:ascii="Times New Roman" w:hAnsi="Times New Roman" w:eastAsia="宋体"/>
         </w:rPr>
-        <w:t>GriddingMachine.jl源代码公开于https://github.com/CliMA/GriddingMachine.jl，数据生产代码公开于https://github.com/jhOo1/GriddingMachineDatasets，Emerald模型接口环境公开于https://github.com/jhOo1/Emerald-paper，实验协议、脚本和结果公开于https://github.com/jhOo1/GriddingMachine_Reaserach。GriddingMachine.jl和GriddingMachineDatasets的论文对应代码固定于</w:t>
+        <w:t>GriddingMachine.jl源代码公开于https://github.com/CliMA/GriddingMachine.jl，数据生产代码公开于https://github.com/jhOo1/GriddingMachineDatasets，Emerald模型接口环境公开于https://github.com/jhOo1/Emerald-paper，论文补充材料、实验协议、脚本和结果公开于https://github.com/jhOo1/GriddingMachine_Reaserach。GriddingMachine.jl和GriddingMachineDatasets的论文对应代码固定于</w:t>
       </w:r>
       <w:r>
         <w:rPr>

</xml_diff>

<commit_message>
refine model-ready capabilities and configuration workflow
</commit_message>
<xml_diff>
--- a/论文/GriddingMachine论文初稿_导师审阅版.docx
+++ b/论文/GriddingMachine论文初稿_导师审阅版.docx
@@ -82,43 +82,7 @@
         <w:rPr>
           <w:rFonts w:ascii="Times New Roman" w:hAnsi="Times New Roman" w:eastAsia="宋体"/>
         </w:rPr>
-        <w:t>多源全球网格数据在维度结构、坐标方向、数值缩放、缺失值处理和分发位置等方面具有显著差异，对地球系统模型输入的标准化生产与稳定获取提出了统一化需求。本文在2022版GriddingMachine基础上构建贯通数据生产、质量控制、多镜像分发、统一读取和模型调用的数据生命周期框架。新版以共享配置规范（schema）和YAML驱动源维度映射、坐标转换、数值变换与缺失值填补（Gapfill），采用独立目录管理逻辑路径、镜像地址及完整性元数据，通过直接NetCDF和事务式缓存实现可信获取，并以</w:t>
-      </w:r>
-      <w:r>
-        <w:rPr>
-          <w:rFonts w:ascii="Consolas" w:hAnsi="Consolas" w:eastAsia="等线"/>
-        </w:rPr>
-        <w:t>read_dataset</w:t>
-      </w:r>
-      <w:r>
-        <w:rPr>
-          <w:rFonts w:ascii="Times New Roman" w:hAnsi="Times New Roman" w:eastAsia="宋体"/>
-        </w:rPr>
-        <w:t>、</w:t>
-      </w:r>
-      <w:r>
-        <w:rPr>
-          <w:rFonts w:ascii="Consolas" w:hAnsi="Consolas" w:eastAsia="等线"/>
-        </w:rPr>
-        <w:t>grid_dict</w:t>
-      </w:r>
-      <w:r>
-        <w:rPr>
-          <w:rFonts w:ascii="Times New Roman" w:hAnsi="Times New Roman" w:eastAsia="宋体"/>
-        </w:rPr>
-        <w:t>和</w:t>
-      </w:r>
-      <w:r>
-        <w:rPr>
-          <w:rFonts w:ascii="Consolas" w:hAnsi="Consolas" w:eastAsia="等线"/>
-        </w:rPr>
-        <w:t>grid_weather</w:t>
-      </w:r>
-      <w:r>
-        <w:rPr>
-          <w:rFonts w:ascii="Times New Roman" w:hAnsi="Times New Roman" w:eastAsia="宋体"/>
-        </w:rPr>
-        <w:t>提供模型就绪数据。NOAA OISST V2.1产品由四维源结构转换为1440×720标准网格，691 150个有效格点与独立参考逐点一致；两个内部压缩产品采用直接NetCDF后，缓存预热的端到端中位时间在两个独立运行环境中分别降低48.3%～82.9%和53.6%～69.2%；校园网内4个代表性产品经FTP和Zenodo完成24次下载，文件大小与SHA-256均与目录登记值一致；14类陆面产品生成US-NR1参数字典并进入Emerald模型初始化。新版GriddingMachine由此形成面向全球规则网格数据的可配置生产、可信分发和模型就绪应用框架，为地球系统数据产品的持续维护与复用提供轻量化基础设施。</w:t>
+        <w:t>多源全球网格数据在维度结构、坐标方向、数值缩放、缺失值处理和分发位置等方面具有显著差异，对地球系统模型输入的标准化生产与稳定获取提出了统一化需求。本文在2022版GriddingMachine基础上构建贯通数据生产、质量控制、多镜像分发、统一读取和模型调用的数据生命周期框架。新版以共享配置规范（schema）和YAML驱动源维度映射、坐标转换、数值变换与缺失值填补（Gapfill），采用独立目录管理逻辑路径、镜像地址及完整性元数据，通过直接NetCDF和事务式缓存实现可信获取。应用端进一步提供标签驱动的标准网格数据访问、格点尺度陆面参数融合与气象驱动组织，实现标准产品向模型就绪输入的转换。NOAA OISST V2.1产品由四维源结构转换为1440×720标准网格，691 150个有效格点与独立参考逐点一致；两个内部压缩产品采用直接NetCDF后，缓存预热的端到端中位时间在两个独立运行环境中分别降低48.3%～82.9%和53.6%～69.2%；校园网内4个代表性产品经FTP和Zenodo完成24次下载，文件大小与SHA-256均与目录登记值一致；14类陆面产品生成US-NR1参数字典并进入Emerald模型初始化。新版GriddingMachine由此形成面向全球规则网格数据的可配置生产、可信分发和模型就绪应用框架，为地球系统数据产品的持续维护与复用提供轻量化基础设施。</w:t>
       </w:r>
     </w:p>
     <w:p>
@@ -206,43 +170,7 @@
         <w:rPr>
           <w:rFonts w:ascii="Times New Roman" w:hAnsi="Times New Roman" w:eastAsia="宋体"/>
         </w:rPr>
-        <w:t xml:space="preserve">Multi-source global gridded data differ substantially in dimensional structure, coordinate orientation, numerical scaling, missing-value treatment, and distribution location, creating a demand for standardized production and reliable access to Earth system model inputs. Building on the 2022 release, this study develops GriddingMachine as an integrated lifecycle framework for data production, quality control, multi-mirror distribution, unified reading, and model use. A shared schema and YAML configuration drive source-dimension mapping, coordinate and numerical transformations, and gap filling; an independent catalog manages logical paths, mirrors, and integrity metadata; direct NetCDF and transactional caching support verified acquisition; and </w:t>
-      </w:r>
-      <w:r>
-        <w:rPr>
-          <w:rFonts w:ascii="Consolas" w:hAnsi="Consolas" w:eastAsia="等线"/>
-        </w:rPr>
-        <w:t>read_dataset</w:t>
-      </w:r>
-      <w:r>
-        <w:rPr>
-          <w:rFonts w:ascii="Times New Roman" w:hAnsi="Times New Roman" w:eastAsia="宋体"/>
-        </w:rPr>
-        <w:t xml:space="preserve">, </w:t>
-      </w:r>
-      <w:r>
-        <w:rPr>
-          <w:rFonts w:ascii="Consolas" w:hAnsi="Consolas" w:eastAsia="等线"/>
-        </w:rPr>
-        <w:t>grid_dict</w:t>
-      </w:r>
-      <w:r>
-        <w:rPr>
-          <w:rFonts w:ascii="Times New Roman" w:hAnsi="Times New Roman" w:eastAsia="宋体"/>
-        </w:rPr>
-        <w:t xml:space="preserve">, and </w:t>
-      </w:r>
-      <w:r>
-        <w:rPr>
-          <w:rFonts w:ascii="Consolas" w:hAnsi="Consolas" w:eastAsia="等线"/>
-        </w:rPr>
-        <w:t>grid_weather</w:t>
-      </w:r>
-      <w:r>
-        <w:rPr>
-          <w:rFonts w:ascii="Times New Roman" w:hAnsi="Times New Roman" w:eastAsia="宋体"/>
-        </w:rPr>
-        <w:t xml:space="preserve"> provide model-ready access. A NOAA OISST V2.1 product was transformed from a four-dimensional source structure to a standardized 1440 × 720 grid, with 691,150 finite cells matching an independently decoded reference point by point. Direct NetCDF reduced median warm-cache end-to-end time for two internally compressed products by 48.3%–82.9% and 53.6%–69.2% in two independent runtime environments. Four representative products were downloaded 24 times from FTP and Zenodo on the campus network, with file sizes and SHA-256 digests matching their catalog records. Fourteen land products generated a parameter dictionary for US-NR1 and entered Emerald model initialization. The updated GriddingMachine provides a lightweight infrastructure for configurable production, integrity-aware distribution, and model-ready use of global regular-grid data.</w:t>
+        <w:t>Multi-source global gridded data differ substantially in dimensional structure, coordinate orientation, numerical scaling, missing-value treatment, and distribution location, creating a demand for standardized production and reliable access to Earth system model inputs. Building on the 2022 release, this study develops GriddingMachine as an integrated lifecycle framework for data production, quality control, multi-mirror distribution, unified reading, and model use. A shared schema and YAML configuration drive source-dimension mapping, coordinate and numerical transformations, and gap filling; an independent catalog manages logical paths, mirrors, and integrity metadata; and direct NetCDF with transactional caching supports verified acquisition. The application layer further provides tag-based access to standardized gridded data, grid-scale synthesis of land parameters, and assembly of meteorological forcing, converting standardized products into model-ready inputs. A NOAA OISST V2.1 product was transformed from a four-dimensional source structure to a standardized 1440 × 720 grid, with 691,150 finite cells matching an independently decoded reference point by point. Direct NetCDF reduced median warm-cache end-to-end time for two internally compressed products by 48.3%–82.9% and 53.6%–69.2% in two independent runtime environments. Four representative products were downloaded 24 times from FTP and Zenodo on the campus network, with file sizes and SHA-256 digests matching their catalog records. Fourteen land products generated a parameter dictionary for US-NR1 and entered Emerald model initialization. The updated GriddingMachine provides a lightweight infrastructure for configurable production, integrity-aware distribution, and model-ready use of global regular-grid data.</w:t>
       </w:r>
     </w:p>
     <w:p>
@@ -725,43 +653,7 @@
         <w:rPr>
           <w:rFonts w:ascii="Times New Roman" w:hAnsi="Times New Roman" w:eastAsia="宋体"/>
         </w:rPr>
-        <w:t>Indexer通过</w:t>
-      </w:r>
-      <w:r>
-        <w:rPr>
-          <w:rFonts w:ascii="Consolas" w:hAnsi="Consolas" w:eastAsia="等线"/>
-        </w:rPr>
-        <w:t>read_dataset</w:t>
-      </w:r>
-      <w:r>
-        <w:rPr>
-          <w:rFonts w:ascii="Times New Roman" w:hAnsi="Times New Roman" w:eastAsia="宋体"/>
-        </w:rPr>
-        <w:t>提供整场、指定周期及站点读取，</w:t>
-      </w:r>
-      <w:r>
-        <w:rPr>
-          <w:rFonts w:ascii="Consolas" w:hAnsi="Consolas" w:eastAsia="等线"/>
-        </w:rPr>
-        <w:t>grid_dict</w:t>
-      </w:r>
-      <w:r>
-        <w:rPr>
-          <w:rFonts w:ascii="Times New Roman" w:hAnsi="Times New Roman" w:eastAsia="宋体"/>
-        </w:rPr>
-        <w:t>和</w:t>
-      </w:r>
-      <w:r>
-        <w:rPr>
-          <w:rFonts w:ascii="Consolas" w:hAnsi="Consolas" w:eastAsia="等线"/>
-        </w:rPr>
-        <w:t>grid_weather</w:t>
-      </w:r>
-      <w:r>
-        <w:rPr>
-          <w:rFonts w:ascii="Times New Roman" w:hAnsi="Times New Roman" w:eastAsia="宋体"/>
-        </w:rPr>
-        <w:t>进一步组织Emerald所需参数和气象驱动。14类</w:t>
+        <w:t>Indexer提供标签驱动的整场、指定周期及站点读取，并进一步完成格点尺度陆面参数融合与气象驱动组织。14类</w:t>
       </w:r>
       <w:r>
         <w:rPr>
@@ -1332,6 +1224,13 @@
             </w:r>
             <w:r>
               <w:rPr>
+                <w:rFonts w:ascii="Times New Roman" w:hAnsi="Times New Roman" w:eastAsia="宋体"/>
+                <w:sz w:val="18"/>
+              </w:rPr>
+              <w:t>陆面参数融合与气象驱动组织（</w:t>
+            </w:r>
+            <w:r>
+              <w:rPr>
                 <w:rFonts w:ascii="Consolas" w:hAnsi="Consolas" w:eastAsia="等线"/>
                 <w:sz w:val="18"/>
               </w:rPr>
@@ -1351,6 +1250,13 @@
               </w:rPr>
               <w:t>grid_weather</w:t>
             </w:r>
+            <w:r>
+              <w:rPr>
+                <w:rFonts w:ascii="Times New Roman" w:hAnsi="Times New Roman" w:eastAsia="宋体"/>
+                <w:sz w:val="18"/>
+              </w:rPr>
+              <w:t>）</w:t>
+            </w:r>
           </w:p>
         </w:tc>
         <w:tc>
@@ -1368,7 +1274,7 @@
                 <w:rFonts w:ascii="Times New Roman" w:hAnsi="Times New Roman" w:eastAsia="宋体"/>
                 <w:sz w:val="18"/>
               </w:rPr>
-              <w:t>陆面产品进入Emerald参数组织与模型初始化</w:t>
+              <w:t>标准产品进入Emerald参数组织与模型初始化</w:t>
             </w:r>
           </w:p>
         </w:tc>
@@ -1427,7 +1333,7 @@
                 <w:rFonts w:ascii="Times New Roman" w:hAnsi="Times New Roman" w:eastAsia="宋体"/>
                 <w:sz w:val="18"/>
               </w:rPr>
-              <w:t>共享YAML schema、配置构建器及显式源维度映射</w:t>
+              <w:t>共享YAML schema、程序化与交互式配置生成及显式源维度映射</w:t>
             </w:r>
           </w:p>
         </w:tc>
@@ -2992,7 +2898,19 @@
         <w:rPr>
           <w:rFonts w:ascii="Times New Roman" w:hAnsi="Times New Roman" w:eastAsia="宋体"/>
         </w:rPr>
-        <w:t>，字段信息在源数据读取前完成解析。框1和版本化指南共同构成面向贡献者的配置范式。</w:t>
+        <w:t>，字段信息在源数据读取前完成解析。框架同时提供本地交互式配置生成界面，表单输入由</w:t>
+      </w:r>
+      <w:r>
+        <w:rPr>
+          <w:rFonts w:ascii="Consolas" w:hAnsi="Consolas" w:eastAsia="等线"/>
+        </w:rPr>
+        <w:t>YamlBuilder</w:t>
+      </w:r>
+      <w:r>
+        <w:rPr>
+          <w:rFonts w:ascii="Times New Roman" w:hAnsi="Times New Roman" w:eastAsia="宋体"/>
+        </w:rPr>
+        <w:t>转换并交由共享schema解析，可直接预览和保存供生产流水线使用的YAML文件。框1、交互式生成器和版本化指南共同构成面向贡献者的配置范式。</w:t>
       </w:r>
     </w:p>
     <w:p>
@@ -4140,7 +4058,7 @@
         <w:rPr>
           <w:rFonts w:ascii="Times New Roman" w:hAnsi="Times New Roman" w:eastAsia="宋体"/>
         </w:rPr>
-        <w:t>把</w:t>
+        <w:t>实现格点尺度陆面参数融合与模型初始化。该函数从</w:t>
       </w:r>
       <w:r>
         <w:rPr>
@@ -4164,7 +4082,7 @@
         <w:rPr>
           <w:rFonts w:ascii="Times New Roman" w:hAnsi="Times New Roman" w:eastAsia="宋体"/>
         </w:rPr>
-        <w:t>标签组中的土壤、冠层、叶片、地形、陆地掩膜和植物功能型产品组织为单个格点的模型参数字典。年份用于选择叶面积指数并组织逐日序列。函数先检查陆地掩膜和叶面积指数；植被格点进入参数读取与季节序列组织，其他格点返回清晰的状态信息。</w:t>
+        <w:t>标签组提取土壤、冠层、叶片、地形、陆地掩膜和植物功能型产品，依据陆面状态组织相应参数，并对叶面积指数、叶绿素、冠层聚集度和最大羧化速率等季节序列执行Gapfill与逐日重采样。</w:t>
       </w:r>
     </w:p>
     <w:p>
@@ -4172,19 +4090,55 @@
         <w:rPr>
           <w:rFonts w:ascii="Times New Roman" w:hAnsi="Times New Roman" w:eastAsia="宋体"/>
         </w:rPr>
-        <w:t>输出包括位置、分辨率、年份、CO₂、土壤水力参数、冠层结构、植物功能型比例、叶片生物物理和光合参数；启用质量控制时同步检查字段完整性和</w:t>
+        <w:t>植物功能型比例进一步用于融合C3/C4植被的叶片光学参数和Medlyn气孔参数，并由</w:t>
       </w:r>
       <w:r>
         <w:rPr>
           <w:rFonts w:ascii="Consolas" w:hAnsi="Consolas" w:eastAsia="等线"/>
         </w:rPr>
+        <w:t>VCMAX25</w:t>
+      </w:r>
+      <w:r>
+        <w:rPr>
+          <w:rFonts w:ascii="Times New Roman" w:hAnsi="Times New Roman" w:eastAsia="宋体"/>
+        </w:rPr>
+        <w:t>推导</w:t>
+      </w:r>
+      <w:r>
+        <w:rPr>
+          <w:rFonts w:ascii="Consolas" w:hAnsi="Consolas" w:eastAsia="等线"/>
+        </w:rPr>
+        <w:t>JMAX25</w:t>
+      </w:r>
+      <w:r>
+        <w:rPr>
+          <w:rFonts w:ascii="Times New Roman" w:hAnsi="Times New Roman" w:eastAsia="宋体"/>
+        </w:rPr>
+        <w:t>和</w:t>
+      </w:r>
+      <w:r>
+        <w:rPr>
+          <w:rFonts w:ascii="Consolas" w:hAnsi="Consolas" w:eastAsia="等线"/>
+        </w:rPr>
+        <w:t>B6F</w:t>
+      </w:r>
+      <w:r>
+        <w:rPr>
+          <w:rFonts w:ascii="Times New Roman" w:hAnsi="Times New Roman" w:eastAsia="宋体"/>
+        </w:rPr>
+        <w:t>。输出涵盖位置、分辨率、年份、CO₂、土壤水力性质、冠层结构、植物功能型组成、叶片生物物理和光合参数；字段完整性与</w:t>
+      </w:r>
+      <w:r>
+        <w:rPr>
+          <w:rFonts w:ascii="Consolas" w:hAnsi="Consolas" w:eastAsia="等线"/>
+        </w:rPr>
         <w:t>NaN</w:t>
       </w:r>
       <w:r>
         <w:rPr>
           <w:rFonts w:ascii="Times New Roman" w:hAnsi="Times New Roman" w:eastAsia="宋体"/>
         </w:rPr>
-        <w:t>状态。该接口把多个已标准化产品稳定组织为模型入口，内置经验系数、标签组合及陆面类型状态共同构成清晰的模型输入契约。</w:t>
+        <w:t>状态同步进入质量控制。多个标准产品由此形成结构一致的格点级模型输入。</w:t>
       </w:r>
     </w:p>
     <w:p>
@@ -4198,7 +4152,7 @@
         <w:rPr>
           <w:rFonts w:ascii="Times New Roman" w:hAnsi="Times New Roman" w:eastAsia="宋体"/>
         </w:rPr>
-        <w:t>按年份和格点读取</w:t>
+        <w:t>实现格点尺度气象驱动组织与时间坐标构建。该函数按年份和格点读取</w:t>
       </w:r>
       <w:r>
         <w:rPr>
@@ -4210,7 +4164,7 @@
         <w:rPr>
           <w:rFonts w:ascii="Times New Roman" w:hAnsi="Times New Roman" w:eastAsia="宋体"/>
         </w:rPr>
-        <w:t>中的8个ERA5标签，分别组织地表气压、降水、漫射与直射短波辐射、长波辐射、气温、水汽压亏缺和风速。输出统一为含时间索引</w:t>
+        <w:t>中的8个ERA5标签，分别提取地表气压、降水、漫射与直射短波辐射、长波辐射、气温、水汽压亏缺和风速，并依据格点经度换算时区偏移、构建浮点年积日</w:t>
       </w:r>
       <w:r>
         <w:rPr>
@@ -4222,7 +4176,7 @@
         <w:rPr>
           <w:rFonts w:ascii="Times New Roman" w:hAnsi="Times New Roman" w:eastAsia="宋体"/>
         </w:rPr>
-        <w:t>及8个气象字段的字典，启用质量控制时同步检查字段完整性和</w:t>
+        <w:t>。接口既可直接按经纬度读取，也可从已经加载的全局气象数组提取格点序列，输出字段完整性与</w:t>
       </w:r>
       <w:r>
         <w:rPr>
@@ -4234,7 +4188,7 @@
         <w:rPr>
           <w:rFonts w:ascii="Times New Roman" w:hAnsi="Times New Roman" w:eastAsia="宋体"/>
         </w:rPr>
-        <w:t>状态。接口既可直接按经纬度读取，也可从已经加载的全局气象数组提取格点序列。</w:t>
+        <w:t>状态同步进入质量控制。</w:t>
       </w:r>
     </w:p>
     <w:p>
@@ -4242,19 +4196,43 @@
         <w:rPr>
           <w:rFonts w:ascii="Times New Roman" w:hAnsi="Times New Roman" w:eastAsia="宋体"/>
         </w:rPr>
-        <w:t>该接口围绕规则网格、既定单位和</w:t>
+        <w:t>上述标签驱动的数据访问、陆面参数融合与气象驱动组织能力分别由</w:t>
       </w:r>
       <w:r>
         <w:rPr>
           <w:rFonts w:ascii="Consolas" w:hAnsi="Consolas" w:eastAsia="等线"/>
         </w:rPr>
-        <w:t>wd1</w:t>
-      </w:r>
-      <w:r>
-        <w:rPr>
-          <w:rFonts w:ascii="Times New Roman" w:hAnsi="Times New Roman" w:eastAsia="宋体"/>
-        </w:rPr>
-        <w:t>标签完成模型就绪字段组织。确定性气象参考数据用于核对字段、形状和Emerald最小步进，</w:t>
+        <w:t>read_dataset</w:t>
+      </w:r>
+      <w:r>
+        <w:rPr>
+          <w:rFonts w:ascii="Times New Roman" w:hAnsi="Times New Roman" w:eastAsia="宋体"/>
+        </w:rPr>
+        <w:t>、</w:t>
+      </w:r>
+      <w:r>
+        <w:rPr>
+          <w:rFonts w:ascii="Consolas" w:hAnsi="Consolas" w:eastAsia="等线"/>
+        </w:rPr>
+        <w:t>grid_dict</w:t>
+      </w:r>
+      <w:r>
+        <w:rPr>
+          <w:rFonts w:ascii="Times New Roman" w:hAnsi="Times New Roman" w:eastAsia="宋体"/>
+        </w:rPr>
+        <w:t>和</w:t>
+      </w:r>
+      <w:r>
+        <w:rPr>
+          <w:rFonts w:ascii="Consolas" w:hAnsi="Consolas" w:eastAsia="等线"/>
+        </w:rPr>
+        <w:t>grid_weather</w:t>
+      </w:r>
+      <w:r>
+        <w:rPr>
+          <w:rFonts w:ascii="Times New Roman" w:hAnsi="Times New Roman" w:eastAsia="宋体"/>
+        </w:rPr>
+        <w:t>实现。确定性气象参考数据用于核对字段、形状和Emerald最小步进，</w:t>
       </w:r>
       <w:r>
         <w:rPr>
@@ -6157,38 +6135,10 @@
             </w:r>
             <w:r>
               <w:rPr>
-                <w:rFonts w:ascii="Consolas" w:hAnsi="Consolas" w:eastAsia="等线"/>
-                <w:sz w:val="18"/>
-              </w:rPr>
-              <w:t>read_dataset</w:t>
-            </w:r>
-            <w:r>
-              <w:rPr>
                 <w:rFonts w:ascii="Times New Roman" w:hAnsi="Times New Roman" w:eastAsia="宋体"/>
                 <w:sz w:val="18"/>
               </w:rPr>
-              <w:t>、</w:t>
-            </w:r>
-            <w:r>
-              <w:rPr>
-                <w:rFonts w:ascii="Consolas" w:hAnsi="Consolas" w:eastAsia="等线"/>
-                <w:sz w:val="18"/>
-              </w:rPr>
-              <w:t>grid_dict</w:t>
-            </w:r>
-            <w:r>
-              <w:rPr>
-                <w:rFonts w:ascii="Times New Roman" w:hAnsi="Times New Roman" w:eastAsia="宋体"/>
-                <w:sz w:val="18"/>
-              </w:rPr>
-              <w:t>和</w:t>
-            </w:r>
-            <w:r>
-              <w:rPr>
-                <w:rFonts w:ascii="Consolas" w:hAnsi="Consolas" w:eastAsia="等线"/>
-                <w:sz w:val="18"/>
-              </w:rPr>
-              <w:t>grid_weather</w:t>
+              <w:t>标签驱动的数据访问、陆面参数融合和气象驱动组织</w:t>
             </w:r>
           </w:p>
         </w:tc>
@@ -6822,6 +6772,12 @@
     <w:p>
       <w:r>
         <w:rPr>
+          <w:rFonts w:ascii="Times New Roman" w:hAnsi="Times New Roman" w:eastAsia="宋体"/>
+        </w:rPr>
+        <w:t>标签驱动的数据访问支持整场、周期和站点读取以及经纬度索引，并由</w:t>
+      </w:r>
+      <w:r>
+        <w:rPr>
           <w:rFonts w:ascii="Consolas" w:hAnsi="Consolas" w:eastAsia="等线"/>
         </w:rPr>
         <w:t>read_dataset</w:t>
@@ -6830,7 +6786,7 @@
         <w:rPr>
           <w:rFonts w:ascii="Times New Roman" w:hAnsi="Times New Roman" w:eastAsia="宋体"/>
         </w:rPr>
-        <w:t>统一支持整场、周期和站点读取以及经纬度索引，</w:t>
+        <w:t>统一实现；</w:t>
       </w:r>
       <w:r>
         <w:rPr>
@@ -6842,7 +6798,7 @@
         <w:rPr>
           <w:rFonts w:ascii="Times New Roman" w:hAnsi="Times New Roman" w:eastAsia="宋体"/>
         </w:rPr>
-        <w:t>作为兼容别名延续原有调用方式。</w:t>
+        <w:t>作为兼容别名延续原有调用方式。格点尺度陆面参数融合和气象驱动组织分别由</w:t>
       </w:r>
       <w:r>
         <w:rPr>
@@ -6854,7 +6810,7 @@
         <w:rPr>
           <w:rFonts w:ascii="Times New Roman" w:hAnsi="Times New Roman" w:eastAsia="宋体"/>
         </w:rPr>
-        <w:t>和</w:t>
+        <w:t>与</w:t>
       </w:r>
       <w:r>
         <w:rPr>
@@ -6866,7 +6822,7 @@
         <w:rPr>
           <w:rFonts w:ascii="Times New Roman" w:hAnsi="Times New Roman" w:eastAsia="宋体"/>
         </w:rPr>
-        <w:t>进一步将标准产品组织为Emerald可直接使用的参数与气象字典，并支持植被、裸土和时间序列等模型输入场景。GriddingMachine输出由此进入Emerald参数组织、气象组织、模型初始化和60 s单步计算，建立从标准数据读取到模型首个时间步的直接连接。</w:t>
+        <w:t>实现，支持植被、裸土和时间序列等模型输入场景。GriddingMachine输出由此进入Emerald参数组织、气象组织、模型初始化和60 s单步计算，建立从标准数据读取到模型首个时间步的直接连接。</w:t>
       </w:r>
     </w:p>
     <w:p>
@@ -7022,43 +6978,7 @@
         <w:rPr>
           <w:rFonts w:ascii="Times New Roman" w:hAnsi="Times New Roman" w:eastAsia="宋体"/>
         </w:rPr>
-        <w:t>GriddingMachine的互补性体现在三个层次：以YAML保留从异构源数据到标准NetCDF的处理意图；以轻量目录连接机构镜像和通用存储；以</w:t>
-      </w:r>
-      <w:r>
-        <w:rPr>
-          <w:rFonts w:ascii="Consolas" w:hAnsi="Consolas" w:eastAsia="等线"/>
-        </w:rPr>
-        <w:t>read_dataset</w:t>
-      </w:r>
-      <w:r>
-        <w:rPr>
-          <w:rFonts w:ascii="Times New Roman" w:hAnsi="Times New Roman" w:eastAsia="宋体"/>
-        </w:rPr>
-        <w:t>、</w:t>
-      </w:r>
-      <w:r>
-        <w:rPr>
-          <w:rFonts w:ascii="Consolas" w:hAnsi="Consolas" w:eastAsia="等线"/>
-        </w:rPr>
-        <w:t>grid_dict</w:t>
-      </w:r>
-      <w:r>
-        <w:rPr>
-          <w:rFonts w:ascii="Times New Roman" w:hAnsi="Times New Roman" w:eastAsia="宋体"/>
-        </w:rPr>
-        <w:t>和</w:t>
-      </w:r>
-      <w:r>
-        <w:rPr>
-          <w:rFonts w:ascii="Consolas" w:hAnsi="Consolas" w:eastAsia="等线"/>
-        </w:rPr>
-        <w:t>grid_weather</w:t>
-      </w:r>
-      <w:r>
-        <w:rPr>
-          <w:rFonts w:ascii="Times New Roman" w:hAnsi="Times New Roman" w:eastAsia="宋体"/>
-        </w:rPr>
-        <w:t>把标准数据组织为模型所需字段。Pangeo Forge侧重云端分析就绪数据生产的配方—基础设施分离[12]，本文流程侧重可直接下载的单体NetCDF、离线缓存、完整性落盘和固定模型接口。云优化分块格式适配超大规模近数据计算[11]，ESGF适配CMIP等机构联合治理[10]，GriddingMachine则服务可下载、可本地缓存的全球规则网格数据及其模型输入组织。</w:t>
+        <w:t>GriddingMachine的互补性体现在三个层次：以YAML保留从异构源数据到标准NetCDF的处理意图；以轻量目录连接机构镜像和通用存储；以标签驱动的数据访问、格点尺度陆面参数融合和气象驱动组织把标准产品转换为模型所需字段。Pangeo Forge侧重云端分析就绪数据生产的配方—基础设施分离[12]，本文流程侧重可直接下载的单体NetCDF、离线缓存、完整性落盘和固定模型接口。云优化分块格式适配超大规模近数据计算[11]，ESGF适配CMIP等机构联合治理[10]，GriddingMachine则服务可下载、可本地缓存的全球规则网格数据及其模型输入组织。</w:t>
       </w:r>
     </w:p>
     <w:p>
@@ -7132,19 +7052,7 @@
         <w:rPr>
           <w:rFonts w:ascii="Times New Roman" w:hAnsi="Times New Roman" w:eastAsia="宋体"/>
         </w:rPr>
-        <w:t>现有数据贡献模板、规则网格索引、植被与非植被入口以及</w:t>
-      </w:r>
-      <w:r>
-        <w:rPr>
-          <w:rFonts w:ascii="Consolas" w:hAnsi="Consolas" w:eastAsia="等线"/>
-        </w:rPr>
-        <w:t>grid_dict/grid_weather</w:t>
-      </w:r>
-      <w:r>
-        <w:rPr>
-          <w:rFonts w:ascii="Times New Roman" w:hAnsi="Times New Roman" w:eastAsia="宋体"/>
-        </w:rPr>
-        <w:t>字段组织，已经为气象驱动、长期模拟和多模型适配形成稳定接口。</w:t>
+        <w:t>现有数据贡献模板、规则网格索引、植被与非植被入口、陆面参数融合及气象驱动组织能力，已经为长期模拟和多模型适配形成稳定接口。</w:t>
       </w:r>
       <w:r>
         <w:rPr>

</xml_diff>

<commit_message>
improve manuscript-wide scientific clarity
</commit_message>
<xml_diff>
--- a/论文/GriddingMachine论文初稿_导师审阅版.docx
+++ b/论文/GriddingMachine论文初稿_导师审阅版.docx
@@ -82,7 +82,7 @@
         <w:rPr>
           <w:rFonts w:ascii="Times New Roman" w:hAnsi="Times New Roman" w:eastAsia="宋体"/>
         </w:rPr>
-        <w:t>多源全球网格数据在维度结构、坐标方向、数值缩放、缺失值处理和分发位置等方面具有显著差异，对地球系统模型输入的标准化生产与稳定获取提出了统一化需求。本文在2022版GriddingMachine基础上构建贯通数据生产、质量控制、多镜像分发、统一读取和模型调用的数据生命周期框架。新版以共享配置规范（schema）和YAML驱动源维度映射、坐标转换、数值变换与缺失值填补（Gapfill），采用独立目录管理逻辑路径、镜像地址及完整性元数据，通过直接NetCDF和事务式缓存实现可信获取。应用端进一步提供标签驱动的标准网格数据访问、格点尺度陆面参数融合与气象驱动组织，实现标准产品向模型就绪输入的转换。NOAA OISST V2.1产品由四维源结构转换为1440×720标准网格，691 150个有效格点与独立参考逐点一致；两个内部压缩产品采用直接NetCDF后，缓存预热的端到端中位时间在两个独立运行环境中分别降低48.3%～82.9%和53.6%～69.2%；校园网内4个代表性产品经FTP和Zenodo完成24次下载，文件大小与SHA-256均与目录登记值一致；14类陆面产品生成US-NR1参数字典并进入Emerald模型初始化。新版GriddingMachine由此形成面向全球规则网格数据的可配置生产、可信分发和模型就绪应用框架，为地球系统数据产品的持续维护与复用提供轻量化基础设施。</w:t>
+        <w:t>多源全球网格数据在维度结构、坐标方向、数值缩放、缺失值处理和分发位置等方面具有显著差异，对地球系统模型输入的标准化生产与稳定获取提出了统一化需求。本文在2022版GriddingMachine基础上构建贯通数据生产、质量控制、多镜像分发、统一读取和模型调用的数据生命周期框架。新版以共享配置规范（schema）和YAML驱动源维度映射、坐标转换、数值变换与缺失值填补（Gapfill），采用独立目录管理逻辑路径、镜像地址及完整性元数据，通过直接NetCDF和事务式缓存实现可信获取。应用端进一步提供标签驱动的标准网格数据访问、格点尺度陆面参数融合与气象驱动组织，实现标准产品向模型就绪输入的转换。NOAA最优插值海表温度（OISST）V2.1产品由四维源结构转换为1440×720标准网格，691 150个有效格点与独立参考逐点一致；两个内部压缩产品采用直接NetCDF后，缓存预热的端到端中位时间在两个独立运行环境中分别降低48.3%～82.9%和53.6%～69.2%；校园网内4个代表性产品经FTP和Zenodo完成24次下载，文件大小与SHA-256均与目录登记值一致；14类陆面产品生成US-NR1参数字典并进入Emerald模型初始化。新版GriddingMachine由此形成面向全球规则网格数据的可配置生产、可信分发和模型就绪应用框架，为地球系统数据产品的持续维护与复用提供轻量化基础设施。</w:t>
       </w:r>
     </w:p>
     <w:p>
@@ -170,7 +170,7 @@
         <w:rPr>
           <w:rFonts w:ascii="Times New Roman" w:hAnsi="Times New Roman" w:eastAsia="宋体"/>
         </w:rPr>
-        <w:t>Multi-source global gridded data differ substantially in dimensional structure, coordinate orientation, numerical scaling, missing-value treatment, and distribution location, creating a demand for standardized production and reliable access to Earth system model inputs. Building on the 2022 release, this study develops GriddingMachine as an integrated lifecycle framework for data production, quality control, multi-mirror distribution, unified reading, and model use. A shared schema and YAML configuration drive source-dimension mapping, coordinate and numerical transformations, and gap filling; an independent catalog manages logical paths, mirrors, and integrity metadata; and direct NetCDF with transactional caching supports verified acquisition. The application layer further provides tag-based access to standardized gridded data, grid-scale synthesis of land parameters, and assembly of meteorological forcing, converting standardized products into model-ready inputs. A NOAA OISST V2.1 product was transformed from a four-dimensional source structure to a standardized 1440 × 720 grid, with 691,150 finite cells matching an independently decoded reference point by point. Direct NetCDF reduced median warm-cache end-to-end time for two internally compressed products by 48.3%–82.9% and 53.6%–69.2% in two independent runtime environments. Four representative products were downloaded 24 times from FTP and Zenodo on the campus network, with file sizes and SHA-256 digests matching their catalog records. Fourteen land products generated a parameter dictionary for US-NR1 and entered Emerald model initialization. The updated GriddingMachine provides a lightweight infrastructure for configurable production, integrity-aware distribution, and model-ready use of global regular-grid data.</w:t>
+        <w:t>Multi-source global gridded data differ substantially in dimensional structure, coordinate orientation, numerical scaling, missing-value treatment, and distribution location, creating a demand for standardized production and reliable access to Earth system model inputs. Building on the 2022 release, this study develops GriddingMachine as an integrated lifecycle framework for data production, quality control, multi-mirror distribution, unified reading, and model use. A shared schema and YAML configuration drive source-dimension mapping, coordinate and numerical transformations, and gap filling; an independent catalog manages logical paths, mirrors, and integrity metadata; and direct NetCDF with transactional caching supports verified acquisition. The application layer further provides tag-based access to standardized gridded data, grid-scale synthesis of land parameters, and assembly of meteorological forcing, converting standardized products into model-ready inputs. A NOAA Optimum Interpolation Sea Surface Temperature (OISST) V2.1 product was transformed from a four-dimensional source structure to a standardized 1440 × 720 grid, with 691,150 finite cells matching an independently decoded reference point by point. Direct NetCDF reduced median warm-cache end-to-end time for two internally compressed products by 48.3%–82.9% and 53.6%–69.2% in two independent runtime environments. Four representative products were downloaded 24 times from FTP and Zenodo on the campus network, with file sizes and SHA-256 digests matching their catalog records. Fourteen land products generated a parameter dictionary for US-NR1 and entered Emerald model initialization. The updated GriddingMachine provides a lightweight infrastructure for configurable production, integrity-aware distribution, and model-ready use of global regular-grid data.</w:t>
       </w:r>
     </w:p>
     <w:p>
@@ -288,19 +288,7 @@
         <w:rPr>
           <w:rFonts w:ascii="Times New Roman" w:hAnsi="Times New Roman" w:eastAsia="宋体"/>
         </w:rPr>
-        <w:t>本文通过OISST产品转换、ELEV/LAI分发效率、FTP—Zenodo镜像访问和</w:t>
-      </w:r>
-      <w:r>
-        <w:rPr>
-          <w:rFonts w:ascii="Consolas" w:hAnsi="Consolas" w:eastAsia="等线"/>
-        </w:rPr>
-        <w:t>gm2</w:t>
-      </w:r>
-      <w:r>
-        <w:rPr>
-          <w:rFonts w:ascii="Times New Roman" w:hAnsi="Times New Roman" w:eastAsia="宋体"/>
-        </w:rPr>
-        <w:t>陆面参数应用，分别呈现该框架的标准化正确性、数据获取效率、内容完整性和模型适配能力。</w:t>
+        <w:t>本文通过OISST产品转换、高程（ELEV）与叶面积指数（LAI）产品分发效率、FTP—Zenodo镜像访问和由14类土壤、植被、地形及陆地掩膜产品组成的陆面参数集合应用，分别呈现该框架的标准化正确性、数据获取效率、内容完整性和模型适配能力。</w:t>
       </w:r>
     </w:p>
     <w:p>
@@ -497,31 +485,7 @@
         <w:rPr>
           <w:rFonts w:ascii="Times New Roman" w:hAnsi="Times New Roman" w:eastAsia="宋体"/>
         </w:rPr>
-        <w:t>在生产端，原始数据及其处理规则分别作为数据输入和YAML配置输入。新版使用共享schema描述原始文件组合、源变量、经纬度方向、源维度语义、数值变换、有效范围、Gapfill及输出元数据；配置构建器与处理流水线调用同一schema。</w:t>
-      </w:r>
-      <w:r>
-        <w:rPr>
-          <w:rFonts w:ascii="Consolas" w:hAnsi="Consolas" w:eastAsia="等线"/>
-        </w:rPr>
-        <w:t>process_dataset!</w:t>
-      </w:r>
-      <w:r>
-        <w:rPr>
-          <w:rFonts w:ascii="Times New Roman" w:hAnsi="Times New Roman" w:eastAsia="宋体"/>
-        </w:rPr>
-        <w:t>根据配置枚举输入，依次完成读取、标准化、质量控制和保存，最终生成以统一标签命名的</w:t>
-      </w:r>
-      <w:r>
-        <w:rPr>
-          <w:rFonts w:ascii="Consolas" w:hAnsi="Consolas" w:eastAsia="等线"/>
-        </w:rPr>
-        <w:t>TAG.nc</w:t>
-      </w:r>
-      <w:r>
-        <w:rPr>
-          <w:rFonts w:ascii="Times New Roman" w:hAnsi="Times New Roman" w:eastAsia="宋体"/>
-        </w:rPr>
-        <w:t>。维度、坐标、数值和空间方向检查嵌入生产流程，使标准产品在生成阶段即具有清晰的数据语义。</w:t>
+        <w:t>在生产端，原始数据及其处理规则分别作为数据输入和YAML配置输入。新版使用共享schema描述原始文件组合、源变量、经纬度方向、源维度语义、数值变换、有效范围、Gapfill及输出元数据；配置构建器与处理流水线调用同一schema。生产引擎依据配置枚举输入，依次完成读取、标准化、质量控制和保存，最终生成以统一标签命名的NetCDF产品。维度、坐标、数值和空间方向检查嵌入生产流程，使标准产品在生成阶段即具有清晰的数据语义。</w:t>
       </w:r>
     </w:p>
     <w:p>
@@ -529,43 +493,7 @@
         <w:rPr>
           <w:rFonts w:ascii="Times New Roman" w:hAnsi="Times New Roman" w:eastAsia="宋体"/>
         </w:rPr>
-        <w:t>通过质量控制的数据产品可发布到机构FTP、HTTP(S)服务或Zenodo等公共存储位置。一个标签可以对应多个镜像地址；独立的</w:t>
-      </w:r>
-      <w:r>
-        <w:rPr>
-          <w:rFonts w:ascii="Consolas" w:hAnsi="Consolas" w:eastAsia="等线"/>
-        </w:rPr>
-        <w:t>Artifacts.yaml</w:t>
-      </w:r>
-      <w:r>
-        <w:rPr>
-          <w:rFonts w:ascii="Times New Roman" w:hAnsi="Times New Roman" w:eastAsia="宋体"/>
-        </w:rPr>
-        <w:t>登记相对路径、URL、文件字节数和SHA-256。</w:t>
-      </w:r>
-      <w:r>
-        <w:rPr>
-          <w:rFonts w:ascii="Consolas" w:hAnsi="Consolas" w:eastAsia="等线"/>
-        </w:rPr>
-        <w:t>GriddingMachineDatasets</w:t>
-      </w:r>
-      <w:r>
-        <w:rPr>
-          <w:rFonts w:ascii="Times New Roman" w:hAnsi="Times New Roman" w:eastAsia="宋体"/>
-        </w:rPr>
-        <w:t>的目录生成函数从权威本地文件计算完整性字段并事务式写入YAML，数据发布与目录登记由清晰接口衔接。目录与</w:t>
-      </w:r>
-      <w:r>
-        <w:rPr>
-          <w:rFonts w:ascii="Consolas" w:hAnsi="Consolas" w:eastAsia="等线"/>
-        </w:rPr>
-        <w:t>GriddingMachine.jl</w:t>
-      </w:r>
-      <w:r>
-        <w:rPr>
-          <w:rFonts w:ascii="Times New Roman" w:hAnsi="Times New Roman" w:eastAsia="宋体"/>
-        </w:rPr>
-        <w:t>分开维护，使数据列表能够独立演化。</w:t>
+        <w:t>通过质量控制的数据产品可发布到机构FTP、HTTP(S)服务或Zenodo等公共存储位置。同一标签可对应多个内容相同的网络副本，本文将其称为多镜像分发。独立数据目录登记相对路径、镜像地址、文件字节数和SHA-256；目录生成过程从权威标准文件计算完整性元数据并以事务方式写入YAML。目录与访问软件分开维护，使数据产品列表及其分发位置能够独立演化。</w:t>
       </w:r>
     </w:p>
     <w:p>
@@ -573,79 +501,7 @@
         <w:rPr>
           <w:rFonts w:ascii="Times New Roman" w:hAnsi="Times New Roman" w:eastAsia="宋体"/>
         </w:rPr>
-        <w:t>在数据使用端，Collector的</w:t>
-      </w:r>
-      <w:r>
-        <w:rPr>
-          <w:rFonts w:ascii="Consolas" w:hAnsi="Consolas" w:eastAsia="等线"/>
-        </w:rPr>
-        <w:t>configure!</w:t>
-      </w:r>
-      <w:r>
-        <w:rPr>
-          <w:rFonts w:ascii="Times New Roman" w:hAnsi="Times New Roman" w:eastAsia="宋体"/>
-        </w:rPr>
-        <w:t>显式设置数据根目录与目录来源。目录下载经临时文件完成schema校验和事务式替换，并保留上一有效版本。</w:t>
-      </w:r>
-      <w:r>
-        <w:rPr>
-          <w:rFonts w:ascii="Consolas" w:hAnsi="Consolas" w:eastAsia="等线"/>
-        </w:rPr>
-        <w:t>download_dataset!</w:t>
-      </w:r>
-      <w:r>
-        <w:rPr>
-          <w:rFonts w:ascii="Times New Roman" w:hAnsi="Times New Roman" w:eastAsia="宋体"/>
-        </w:rPr>
-        <w:t>提取各URL的主机名，以可获得的平均往返延迟辅助确定候选顺序，同时保留全部镜像并依次回退。每次调用创建独立</w:t>
-      </w:r>
-      <w:r>
-        <w:rPr>
-          <w:rFonts w:ascii="Consolas" w:hAnsi="Consolas" w:eastAsia="等线"/>
-        </w:rPr>
-        <w:t>.part</w:t>
-      </w:r>
-      <w:r>
-        <w:rPr>
-          <w:rFonts w:ascii="Times New Roman" w:hAnsi="Times New Roman" w:eastAsia="宋体"/>
-        </w:rPr>
-        <w:t>文件，文件通过</w:t>
-      </w:r>
-      <w:r>
-        <w:rPr>
-          <w:rFonts w:ascii="Consolas" w:hAnsi="Consolas" w:eastAsia="等线"/>
-        </w:rPr>
-        <w:t>SIZE</w:t>
-      </w:r>
-      <w:r>
-        <w:rPr>
-          <w:rFonts w:ascii="Times New Roman" w:hAnsi="Times New Roman" w:eastAsia="宋体"/>
-        </w:rPr>
-        <w:t>和</w:t>
-      </w:r>
-      <w:r>
-        <w:rPr>
-          <w:rFonts w:ascii="Consolas" w:hAnsi="Consolas" w:eastAsia="等线"/>
-        </w:rPr>
-        <w:t>SHA256</w:t>
-      </w:r>
-      <w:r>
-        <w:rPr>
-          <w:rFonts w:ascii="Times New Roman" w:hAnsi="Times New Roman" w:eastAsia="宋体"/>
-        </w:rPr>
-        <w:t>核验后进入</w:t>
-      </w:r>
-      <w:r>
-        <w:rPr>
-          <w:rFonts w:ascii="Consolas" w:hAnsi="Consolas" w:eastAsia="等线"/>
-        </w:rPr>
-        <w:t>public</w:t>
-      </w:r>
-      <w:r>
-        <w:rPr>
-          <w:rFonts w:ascii="Times New Roman" w:hAnsi="Times New Roman" w:eastAsia="宋体"/>
-        </w:rPr>
-        <w:t>，历史目录则通过兼容模式继续提供数据获取能力。</w:t>
+        <w:t>在数据使用端，目录管理模块显式设置数据根目录与目录来源。目录更新经临时文件完成schema校验和事务式替换，并保留上一有效版本。产品获取模块提取各镜像地址的主机名，以可获得的平均往返延迟辅助确定候选顺序，同时保留全部镜像并依次回退。每次传输创建独立临时文件，文件通过字节数和SHA-256核验后进入正式数据目录。本文所称“可信分发”即由版本化目录、等价镜像、事务落盘和内容完整性校验共同构成的获取机制。</w:t>
       </w:r>
     </w:p>
     <w:p>
@@ -653,7 +509,7 @@
         <w:rPr>
           <w:rFonts w:ascii="Times New Roman" w:hAnsi="Times New Roman" w:eastAsia="宋体"/>
         </w:rPr>
-        <w:t>Indexer提供标签驱动的整场、指定周期及站点读取，并进一步完成格点尺度陆面参数融合与气象驱动组织。14类</w:t>
+        <w:t>数据读取层提供标签驱动的整场、指定周期及站点读取，并进一步完成格点尺度陆面参数融合与气象驱动组织。由14类产品组成的第二套陆面参数集合（代码标识为</w:t>
       </w:r>
       <w:r>
         <w:rPr>
@@ -665,7 +521,7 @@
         <w:rPr>
           <w:rFonts w:ascii="Times New Roman" w:hAnsi="Times New Roman" w:eastAsia="宋体"/>
         </w:rPr>
-        <w:t>产品贯通陆面参数链路并进入Emerald初始化，使可信分发的数据产品直接进入模型应用。</w:t>
+        <w:t>）贯通参数组织链路并进入Emerald初始化，使可信分发的数据产品直接进入模型应用。</w:t>
       </w:r>
     </w:p>
     <w:p>
@@ -1227,35 +1083,7 @@
                 <w:rFonts w:ascii="Times New Roman" w:hAnsi="Times New Roman" w:eastAsia="宋体"/>
                 <w:sz w:val="18"/>
               </w:rPr>
-              <w:t>陆面参数融合与气象驱动组织（</w:t>
-            </w:r>
-            <w:r>
-              <w:rPr>
-                <w:rFonts w:ascii="Consolas" w:hAnsi="Consolas" w:eastAsia="等线"/>
-                <w:sz w:val="18"/>
-              </w:rPr>
-              <w:t>grid_dict</w:t>
-            </w:r>
-            <w:r>
-              <w:rPr>
-                <w:rFonts w:ascii="Times New Roman" w:hAnsi="Times New Roman" w:eastAsia="宋体"/>
-                <w:sz w:val="18"/>
-              </w:rPr>
-              <w:t>与</w:t>
-            </w:r>
-            <w:r>
-              <w:rPr>
-                <w:rFonts w:ascii="Consolas" w:hAnsi="Consolas" w:eastAsia="等线"/>
-                <w:sz w:val="18"/>
-              </w:rPr>
-              <w:t>grid_weather</w:t>
-            </w:r>
-            <w:r>
-              <w:rPr>
-                <w:rFonts w:ascii="Times New Roman" w:hAnsi="Times New Roman" w:eastAsia="宋体"/>
-                <w:sz w:val="18"/>
-              </w:rPr>
-              <w:t>）</w:t>
+              <w:t>陆面参数融合与气象驱动组织</w:t>
             </w:r>
           </w:p>
         </w:tc>
@@ -2426,19 +2254,7 @@
         <w:rPr>
           <w:rFonts w:ascii="Times New Roman" w:hAnsi="Times New Roman" w:eastAsia="宋体"/>
         </w:rPr>
-        <w:t>显式记录源变量各维度语义，并由</w:t>
-      </w:r>
-      <w:r>
-        <w:rPr>
-          <w:rFonts w:ascii="Consolas" w:hAnsi="Consolas" w:eastAsia="等线"/>
-        </w:rPr>
-        <w:t>standardize_dimension_order</w:t>
-      </w:r>
-      <w:r>
-        <w:rPr>
-          <w:rFonts w:ascii="Times New Roman" w:hAnsi="Times New Roman" w:eastAsia="宋体"/>
-        </w:rPr>
-        <w:t>将</w:t>
+        <w:t>显式记录源变量各维度语义，维度标准化过程将</w:t>
       </w:r>
       <w:r>
         <w:rPr>
@@ -2816,101 +2632,65 @@
     <w:p>
       <w:r>
         <w:rPr>
+          <w:rFonts w:ascii="Times New Roman" w:hAnsi="Times New Roman" w:eastAsia="宋体"/>
+        </w:rPr>
+        <w:t>配置构建器接收文件命名、变量标签、分辨率、时间尺度、版本、输入输出目录、单位、数值范围、缩放、坐标方向和GriddingMachine标签等结构化输入，并生成YAML配置。该构建器在代码中实现为</w:t>
+      </w:r>
+      <w:r>
+        <w:rPr>
           <w:rFonts w:ascii="Consolas" w:hAnsi="Consolas" w:eastAsia="等线"/>
         </w:rPr>
-        <w:t>GriddingMachineDatasets</w:t>
-      </w:r>
-      <w:r>
-        <w:rPr>
-          <w:rFonts w:ascii="Times New Roman" w:hAnsi="Times New Roman" w:eastAsia="宋体"/>
-        </w:rPr>
-        <w:t>仓库中的</w:t>
-      </w:r>
-      <w:r>
-        <w:rPr>
-          <w:rFonts w:ascii="Consolas" w:hAnsi="Consolas" w:eastAsia="等线"/>
-        </w:rPr>
         <w:t>YamlBuilder</w:t>
       </w:r>
       <w:r>
         <w:rPr>
           <w:rFonts w:ascii="Times New Roman" w:hAnsi="Times New Roman" w:eastAsia="宋体"/>
         </w:rPr>
-        <w:t>接收文件命名、变量标签、分辨率、时间尺度、版本、输入输出目录、单位、数值范围、缩放、坐标方向和GriddingMachine标签等结构化输入，并生成YAML配置。结构化构建方式统一字段名称、缩进和默认值，使贡献者能够将数据源约定稳定转换为可执行配置。</w:t>
+        <w:t>，通过统一字段名称、层级和默认值，使贡献者能够将数据源约定稳定转换为可执行配置。</w:t>
       </w:r>
     </w:p>
     <w:p>
       <w:r>
         <w:rPr>
+          <w:rFonts w:ascii="Times New Roman" w:hAnsi="Times New Roman" w:eastAsia="宋体"/>
+        </w:rPr>
+        <w:t>配置构建器与生产流水线调用同一schema；其输出采用</w:t>
+      </w:r>
+      <w:r>
+        <w:rPr>
           <w:rFonts w:ascii="Consolas" w:hAnsi="Consolas" w:eastAsia="等线"/>
         </w:rPr>
-        <w:t>YamlBuilder</w:t>
-      </w:r>
-      <w:r>
-        <w:rPr>
-          <w:rFonts w:ascii="Times New Roman" w:hAnsi="Times New Roman" w:eastAsia="宋体"/>
-        </w:rPr>
-        <w:t>与处理流水线调用同一schema；其输出采用</w:t>
+        <w:t>SCHEMA_VERSION</w:t>
+      </w:r>
+      <w:r>
+        <w:rPr>
+          <w:rFonts w:ascii="Times New Roman" w:hAnsi="Times New Roman" w:eastAsia="宋体"/>
+        </w:rPr>
+        <w:t>、</w:t>
       </w:r>
       <w:r>
         <w:rPr>
           <w:rFonts w:ascii="Consolas" w:hAnsi="Consolas" w:eastAsia="等线"/>
         </w:rPr>
-        <w:t>SCHEMA_VERSION</w:t>
-      </w:r>
-      <w:r>
-        <w:rPr>
-          <w:rFonts w:ascii="Times New Roman" w:hAnsi="Times New Roman" w:eastAsia="宋体"/>
-        </w:rPr>
-        <w:t>、</w:t>
+        <w:t>GAPFILL</w:t>
+      </w:r>
+      <w:r>
+        <w:rPr>
+          <w:rFonts w:ascii="Times New Roman" w:hAnsi="Times New Roman" w:eastAsia="宋体"/>
+        </w:rPr>
+        <w:t>与</w:t>
       </w:r>
       <w:r>
         <w:rPr>
           <w:rFonts w:ascii="Consolas" w:hAnsi="Consolas" w:eastAsia="等线"/>
         </w:rPr>
-        <w:t>GAPFILL</w:t>
-      </w:r>
-      <w:r>
-        <w:rPr>
-          <w:rFonts w:ascii="Times New Roman" w:hAnsi="Times New Roman" w:eastAsia="宋体"/>
-        </w:rPr>
-        <w:t>与</w:t>
-      </w:r>
-      <w:r>
-        <w:rPr>
-          <w:rFonts w:ascii="Consolas" w:hAnsi="Consolas" w:eastAsia="等线"/>
-        </w:rPr>
         <w:t>DIMENSIONS</w:t>
       </w:r>
       <w:r>
         <w:rPr>
           <w:rFonts w:ascii="Times New Roman" w:hAnsi="Times New Roman" w:eastAsia="宋体"/>
         </w:rPr>
-        <w:t>描述处理契约，输出位置由调用者配置。构建器生成的配置可直接交给</w:t>
-      </w:r>
-      <w:r>
-        <w:rPr>
-          <w:rFonts w:ascii="Consolas" w:hAnsi="Consolas" w:eastAsia="等线"/>
-        </w:rPr>
-        <w:t>process_dataset!</w:t>
-      </w:r>
-      <w:r>
-        <w:rPr>
-          <w:rFonts w:ascii="Times New Roman" w:hAnsi="Times New Roman" w:eastAsia="宋体"/>
-        </w:rPr>
-        <w:t>，字段信息在源数据读取前完成解析。框架同时提供本地交互式配置生成界面，表单输入由</w:t>
-      </w:r>
-      <w:r>
-        <w:rPr>
-          <w:rFonts w:ascii="Consolas" w:hAnsi="Consolas" w:eastAsia="等线"/>
-        </w:rPr>
-        <w:t>YamlBuilder</w:t>
-      </w:r>
-      <w:r>
-        <w:rPr>
-          <w:rFonts w:ascii="Times New Roman" w:hAnsi="Times New Roman" w:eastAsia="宋体"/>
-        </w:rPr>
-        <w:t>转换并交由共享schema解析，可直接预览和保存供生产流水线使用的YAML文件。框1、交互式生成器和版本化指南共同构成面向贡献者的配置范式。</w:t>
+        <w:t>描述处理契约，字段信息在源数据读取前完成解析。框架同时提供本地交互式配置界面，支持表单输入、YAML预览与保存，生成结果可直接进入标准产品生产流程。框1、交互式生成器和版本化指南共同构成面向贡献者的配置范式。</w:t>
       </w:r>
     </w:p>
     <w:p>
@@ -2927,6 +2707,12 @@
     <w:p>
       <w:r>
         <w:rPr>
+          <w:rFonts w:ascii="Times New Roman" w:hAnsi="Times New Roman" w:eastAsia="宋体"/>
+        </w:rPr>
+        <w:t>标准产品生产引擎（</w:t>
+      </w:r>
+      <w:r>
+        <w:rPr>
           <w:rFonts w:ascii="Consolas" w:hAnsi="Consolas" w:eastAsia="等线"/>
         </w:rPr>
         <w:t>process_dataset!</w:t>
@@ -2935,7 +2721,7 @@
         <w:rPr>
           <w:rFonts w:ascii="Times New Roman" w:hAnsi="Times New Roman" w:eastAsia="宋体"/>
         </w:rPr>
-        <w:t>首先根据</w:t>
+        <w:t>）首先根据</w:t>
       </w:r>
       <w:r>
         <w:rPr>
@@ -2983,7 +2769,7 @@
         <w:rPr>
           <w:rFonts w:ascii="Times New Roman" w:hAnsi="Times New Roman" w:eastAsia="宋体"/>
         </w:rPr>
-        <w:t>指定的源变量。当前流水线将数据转换为</w:t>
+        <w:t>指定的源变量。流水线将数据转换为</w:t>
       </w:r>
       <w:r>
         <w:rPr>
@@ -3071,67 +2857,19 @@
         <w:rPr>
           <w:rFonts w:ascii="Times New Roman" w:hAnsi="Times New Roman" w:eastAsia="宋体"/>
         </w:rPr>
-        <w:t xml:space="preserve">当前生产流水线在 </w:t>
+        <w:t>生产流水线完成维度与数值转换后，对待保存数组开展空间方向检查。检查过程依据变量维度名生成带经纬度坐标轴的方向图；二维数据以静态图呈现，三维数据沿周期维形成动态图。维护者据此确认南北方向、东西方向和经度平移结果，YAML中的</w:t>
       </w:r>
       <w:r>
         <w:rPr>
           <w:rFonts w:ascii="Consolas" w:hAnsi="Consolas" w:eastAsia="等线"/>
         </w:rPr>
-        <w:t>read_input</w:t>
-      </w:r>
-      <w:r>
-        <w:rPr>
-          <w:rFonts w:ascii="Times New Roman" w:hAnsi="Times New Roman" w:eastAsia="宋体"/>
-        </w:rPr>
-        <w:t xml:space="preserve"> 完成经纬度翻转、经度范围调整、线性缩放、有效范围过滤和缺失值处理后，调用 </w:t>
-      </w:r>
-      <w:r>
-        <w:rPr>
-          <w:rFonts w:ascii="Consolas" w:hAnsi="Consolas" w:eastAsia="等线"/>
-        </w:rPr>
-        <w:t>verify_data!</w:t>
-      </w:r>
-      <w:r>
-        <w:rPr>
-          <w:rFonts w:ascii="Times New Roman" w:hAnsi="Times New Roman" w:eastAsia="宋体"/>
-        </w:rPr>
-        <w:t xml:space="preserve"> 对待保存数组进行方向检查。该函数把数组写入调用者指定或默认的NetCDF缓存文件，Python脚本依据变量维度名重排为</w:t>
-      </w:r>
-      <w:r>
-        <w:rPr>
-          <w:rFonts w:ascii="Consolas" w:hAnsi="Consolas" w:eastAsia="等线"/>
-        </w:rPr>
-        <w:t>(lat,lon)</w:t>
-      </w:r>
-      <w:r>
-        <w:rPr>
-          <w:rFonts w:ascii="Times New Roman" w:hAnsi="Times New Roman" w:eastAsia="宋体"/>
-        </w:rPr>
-        <w:t>后生成带经纬度坐标轴的图件；二维数据输出PNG，三维数据沿</w:t>
-      </w:r>
-      <w:r>
-        <w:rPr>
-          <w:rFonts w:ascii="Consolas" w:hAnsi="Consolas" w:eastAsia="等线"/>
-        </w:rPr>
-        <w:t>ind</w:t>
-      </w:r>
-      <w:r>
-        <w:rPr>
-          <w:rFonts w:ascii="Times New Roman" w:hAnsi="Times New Roman" w:eastAsia="宋体"/>
-        </w:rPr>
-        <w:t>维输出GIF。操作者查看图件并在终端记录接受或退回状态。YAML中的</w:t>
-      </w:r>
-      <w:r>
-        <w:rPr>
-          <w:rFonts w:ascii="Consolas" w:hAnsi="Consolas" w:eastAsia="等线"/>
-        </w:rPr>
         <w:t>VERIFY_ONCE</w:t>
       </w:r>
       <w:r>
         <w:rPr>
           <w:rFonts w:ascii="Times New Roman" w:hAnsi="Times New Roman" w:eastAsia="宋体"/>
         </w:rPr>
-        <w:t>控制同一配置组合的首次确认，通过状态保存在该次处理使用的配置副本中。</w:t>
+        <w:t>用于管理同一配置组合的首次确认状态。</w:t>
       </w:r>
     </w:p>
     <w:p>
@@ -3147,103 +2885,55 @@
         <w:rPr>
           <w:rFonts w:ascii="Times New Roman" w:hAnsi="Times New Roman" w:eastAsia="宋体"/>
         </w:rPr>
-        <w:t>对于已经生成的NetCDF文件，</w:t>
+        <w:t>对于已经生成的NetCDF文件，成品质量检查进一步核对空间覆盖类型、</w:t>
       </w:r>
       <w:r>
         <w:rPr>
           <w:rFonts w:ascii="Consolas" w:hAnsi="Consolas" w:eastAsia="等线"/>
         </w:rPr>
-        <w:t>verify_processed_data!</w:t>
-      </w:r>
-      <w:r>
-        <w:rPr>
-          <w:rFonts w:ascii="Times New Roman" w:hAnsi="Times New Roman" w:eastAsia="宋体"/>
-        </w:rPr>
-        <w:t>提供独立的结构和数值检查。该函数首先确认文件及覆盖类型，支持全球陆地和海洋（</w:t>
+        <w:t>lon</w:t>
+      </w:r>
+      <w:r>
+        <w:rPr>
+          <w:rFonts w:ascii="Times New Roman" w:hAnsi="Times New Roman" w:eastAsia="宋体"/>
+        </w:rPr>
+        <w:t>和</w:t>
       </w:r>
       <w:r>
         <w:rPr>
           <w:rFonts w:ascii="Consolas" w:hAnsi="Consolas" w:eastAsia="等线"/>
         </w:rPr>
-        <w:t>both</w:t>
-      </w:r>
-      <w:r>
-        <w:rPr>
-          <w:rFonts w:ascii="Times New Roman" w:hAnsi="Times New Roman" w:eastAsia="宋体"/>
-        </w:rPr>
-        <w:t>）与陆地（</w:t>
+        <w:t>lat</w:t>
+      </w:r>
+      <w:r>
+        <w:rPr>
+          <w:rFonts w:ascii="Times New Roman" w:hAnsi="Times New Roman" w:eastAsia="宋体"/>
+        </w:rPr>
+        <w:t>维度、坐标变量及主变量</w:t>
       </w:r>
       <w:r>
         <w:rPr>
           <w:rFonts w:ascii="Consolas" w:hAnsi="Consolas" w:eastAsia="等线"/>
         </w:rPr>
-        <w:t>land</w:t>
-      </w:r>
-      <w:r>
-        <w:rPr>
-          <w:rFonts w:ascii="Times New Roman" w:hAnsi="Times New Roman" w:eastAsia="宋体"/>
-        </w:rPr>
-        <w:t>）两类产品。随后检查</w:t>
+        <w:t>data</w:t>
+      </w:r>
+      <w:r>
+        <w:rPr>
+          <w:rFonts w:ascii="Times New Roman" w:hAnsi="Times New Roman" w:eastAsia="宋体"/>
+        </w:rPr>
+        <w:t>；三维产品同时核对周期维</w:t>
       </w:r>
       <w:r>
         <w:rPr>
           <w:rFonts w:ascii="Consolas" w:hAnsi="Consolas" w:eastAsia="等线"/>
         </w:rPr>
-        <w:t>lon</w:t>
-      </w:r>
-      <w:r>
-        <w:rPr>
-          <w:rFonts w:ascii="Times New Roman" w:hAnsi="Times New Roman" w:eastAsia="宋体"/>
-        </w:rPr>
-        <w:t>、</w:t>
-      </w:r>
-      <w:r>
-        <w:rPr>
-          <w:rFonts w:ascii="Consolas" w:hAnsi="Consolas" w:eastAsia="等线"/>
-        </w:rPr>
-        <w:t>lat</w:t>
-      </w:r>
-      <w:r>
-        <w:rPr>
-          <w:rFonts w:ascii="Times New Roman" w:hAnsi="Times New Roman" w:eastAsia="宋体"/>
-        </w:rPr>
-        <w:t>维度、坐标变量和主变量</w:t>
-      </w:r>
-      <w:r>
-        <w:rPr>
-          <w:rFonts w:ascii="Consolas" w:hAnsi="Consolas" w:eastAsia="等线"/>
-        </w:rPr>
-        <w:t>data</w:t>
-      </w:r>
-      <w:r>
-        <w:rPr>
-          <w:rFonts w:ascii="Times New Roman" w:hAnsi="Times New Roman" w:eastAsia="宋体"/>
-        </w:rPr>
-        <w:t>，三维产品进一步检查</w:t>
-      </w:r>
-      <w:r>
-        <w:rPr>
-          <w:rFonts w:ascii="Consolas" w:hAnsi="Consolas" w:eastAsia="等线"/>
-        </w:rPr>
         <w:t>ind</w:t>
       </w:r>
       <w:r>
         <w:rPr>
           <w:rFonts w:ascii="Times New Roman" w:hAnsi="Times New Roman" w:eastAsia="宋体"/>
         </w:rPr>
-        <w:t>，并验证各维长度的一致性。数值检查读取完整</w:t>
-      </w:r>
-      <w:r>
-        <w:rPr>
-          <w:rFonts w:ascii="Consolas" w:hAnsi="Consolas" w:eastAsia="等线"/>
-        </w:rPr>
-        <w:t>data</w:t>
-      </w:r>
-      <w:r>
-        <w:rPr>
-          <w:rFonts w:ascii="Times New Roman" w:hAnsi="Times New Roman" w:eastAsia="宋体"/>
-        </w:rPr>
-        <w:t>数组，计算有效值的最小值和最大值，并评价其与给定范围的符合程度。</w:t>
+        <w:t>及各维长度的一致性。数值检查读取完整数组，统计有效值范围并与产品配置中的物理范围相互核对。</w:t>
       </w:r>
     </w:p>
     <w:p>
@@ -3317,91 +3007,19 @@
         <w:rPr>
           <w:rFonts w:ascii="Times New Roman" w:hAnsi="Times New Roman" w:eastAsia="宋体"/>
         </w:rPr>
-        <w:t>数据文件名由</w:t>
+        <w:t>标准产品标签由类别、可选前缀、空间分辨率、时间分辨率、可选年份、数据版本和可选修订号构成，基本形式为</w:t>
       </w:r>
       <w:r>
         <w:rPr>
           <w:rFonts w:ascii="Consolas" w:hAnsi="Consolas" w:eastAsia="等线"/>
         </w:rPr>
-        <w:t>griddingmachine_tag</w:t>
-      </w:r>
-      <w:r>
-        <w:rPr>
-          <w:rFonts w:ascii="Times New Roman" w:hAnsi="Times New Roman" w:eastAsia="宋体"/>
-        </w:rPr>
-        <w:t>生成，基本形式为</w:t>
-      </w:r>
-      <w:r>
-        <w:rPr>
-          <w:rFonts w:ascii="Consolas" w:hAnsi="Consolas" w:eastAsia="等线"/>
-        </w:rPr>
         <w:t>TAG_(PREFIX_)NX_MT_(YYYY_)VV(_REVISION)</w:t>
       </w:r>
       <w:r>
         <w:rPr>
           <w:rFonts w:ascii="Times New Roman" w:hAnsi="Times New Roman" w:eastAsia="宋体"/>
         </w:rPr>
-        <w:t>。其中</w:t>
-      </w:r>
-      <w:r>
-        <w:rPr>
-          <w:rFonts w:ascii="Consolas" w:hAnsi="Consolas" w:eastAsia="等线"/>
-        </w:rPr>
-        <w:t>NX</w:t>
-      </w:r>
-      <w:r>
-        <w:rPr>
-          <w:rFonts w:ascii="Times New Roman" w:hAnsi="Times New Roman" w:eastAsia="宋体"/>
-        </w:rPr>
-        <w:t>表示空间分辨率，</w:t>
-      </w:r>
-      <w:r>
-        <w:rPr>
-          <w:rFonts w:ascii="Consolas" w:hAnsi="Consolas" w:eastAsia="等线"/>
-        </w:rPr>
-        <w:t>MT</w:t>
-      </w:r>
-      <w:r>
-        <w:rPr>
-          <w:rFonts w:ascii="Times New Roman" w:hAnsi="Times New Roman" w:eastAsia="宋体"/>
-        </w:rPr>
-        <w:t>表示时间分辨率，</w:t>
-      </w:r>
-      <w:r>
-        <w:rPr>
-          <w:rFonts w:ascii="Consolas" w:hAnsi="Consolas" w:eastAsia="等线"/>
-        </w:rPr>
-        <w:t>YYYY</w:t>
-      </w:r>
-      <w:r>
-        <w:rPr>
-          <w:rFonts w:ascii="Times New Roman" w:hAnsi="Times New Roman" w:eastAsia="宋体"/>
-        </w:rPr>
-        <w:t>和</w:t>
-      </w:r>
-      <w:r>
-        <w:rPr>
-          <w:rFonts w:ascii="Consolas" w:hAnsi="Consolas" w:eastAsia="等线"/>
-        </w:rPr>
-        <w:t>REVISION</w:t>
-      </w:r>
-      <w:r>
-        <w:rPr>
-          <w:rFonts w:ascii="Times New Roman" w:hAnsi="Times New Roman" w:eastAsia="宋体"/>
-        </w:rPr>
-        <w:t>为可选部分。生成输出路径时，代码读取当前</w:t>
-      </w:r>
-      <w:r>
-        <w:rPr>
-          <w:rFonts w:ascii="Consolas" w:hAnsi="Consolas" w:eastAsia="等线"/>
-        </w:rPr>
-        <w:t>Artifacts.yaml</w:t>
-      </w:r>
-      <w:r>
-        <w:rPr>
-          <w:rFonts w:ascii="Times New Roman" w:hAnsi="Times New Roman" w:eastAsia="宋体"/>
-        </w:rPr>
-        <w:t>并识别标签状态，以保持数据产品标识的唯一性。</w:t>
+        <w:t>。生成输出路径时，标签生成器读取当前数据目录并识别已有产品状态，以保持产品标识的唯一性。</w:t>
       </w:r>
     </w:p>
     <w:p>
@@ -3409,91 +3027,19 @@
         <w:rPr>
           <w:rFonts w:ascii="Times New Roman" w:hAnsi="Times New Roman" w:eastAsia="宋体"/>
         </w:rPr>
-        <w:t>数据发布与目录登记采用解耦设计。维护者在Zenodo、机构FTP或其他存储中发布标准产品，再将本地NetCDF路径和公开URL交给</w:t>
+        <w:t>数据发布与目录登记采用解耦设计。维护者在Zenodo、机构FTP或其他存储中发布标准产品，目录生成器根据标准NetCDF路径和公开地址生成逻辑路径、去重后的镜像列表、文件字节数和SHA-256，并按标签排序后通过临时文件更新</w:t>
       </w:r>
       <w:r>
         <w:rPr>
           <w:rFonts w:ascii="Consolas" w:hAnsi="Consolas" w:eastAsia="等线"/>
         </w:rPr>
-        <w:t>update_yaml_library!</w:t>
-      </w:r>
-      <w:r>
-        <w:rPr>
-          <w:rFonts w:ascii="Times New Roman" w:hAnsi="Times New Roman" w:eastAsia="宋体"/>
-        </w:rPr>
-        <w:t>。该函数调用</w:t>
-      </w:r>
-      <w:r>
-        <w:rPr>
-          <w:rFonts w:ascii="Consolas" w:hAnsi="Consolas" w:eastAsia="等线"/>
-        </w:rPr>
-        <w:t>build_catalog_entry</w:t>
-      </w:r>
-      <w:r>
-        <w:rPr>
-          <w:rFonts w:ascii="Times New Roman" w:hAnsi="Times New Roman" w:eastAsia="宋体"/>
-        </w:rPr>
-        <w:t>生成</w:t>
-      </w:r>
-      <w:r>
-        <w:rPr>
-          <w:rFonts w:ascii="Consolas" w:hAnsi="Consolas" w:eastAsia="等线"/>
-        </w:rPr>
-        <w:t>PATH</w:t>
-      </w:r>
-      <w:r>
-        <w:rPr>
-          <w:rFonts w:ascii="Times New Roman" w:hAnsi="Times New Roman" w:eastAsia="宋体"/>
-        </w:rPr>
-        <w:t>、去重后的</w:t>
-      </w:r>
-      <w:r>
-        <w:rPr>
-          <w:rFonts w:ascii="Consolas" w:hAnsi="Consolas" w:eastAsia="等线"/>
-        </w:rPr>
-        <w:t>URL</w:t>
-      </w:r>
-      <w:r>
-        <w:rPr>
-          <w:rFonts w:ascii="Times New Roman" w:hAnsi="Times New Roman" w:eastAsia="宋体"/>
-        </w:rPr>
-        <w:t>、</w:t>
-      </w:r>
-      <w:r>
-        <w:rPr>
-          <w:rFonts w:ascii="Consolas" w:hAnsi="Consolas" w:eastAsia="等线"/>
-        </w:rPr>
-        <w:t>SIZE</w:t>
-      </w:r>
-      <w:r>
-        <w:rPr>
-          <w:rFonts w:ascii="Times New Roman" w:hAnsi="Times New Roman" w:eastAsia="宋体"/>
-        </w:rPr>
-        <w:t>和</w:t>
-      </w:r>
-      <w:r>
-        <w:rPr>
-          <w:rFonts w:ascii="Consolas" w:hAnsi="Consolas" w:eastAsia="等线"/>
-        </w:rPr>
-        <w:t>SHA256</w:t>
-      </w:r>
-      <w:r>
-        <w:rPr>
-          <w:rFonts w:ascii="Times New Roman" w:hAnsi="Times New Roman" w:eastAsia="宋体"/>
-        </w:rPr>
-        <w:t>，按标签排序后通过临时文件更新</w:t>
-      </w:r>
-      <w:r>
-        <w:rPr>
-          <w:rFonts w:ascii="Consolas" w:hAnsi="Consolas" w:eastAsia="等线"/>
-        </w:rPr>
         <w:t>Artifacts.yaml</w:t>
       </w:r>
       <w:r>
         <w:rPr>
           <w:rFonts w:ascii="Times New Roman" w:hAnsi="Times New Roman" w:eastAsia="宋体"/>
         </w:rPr>
-        <w:t>，从而形成职责清晰、内容可校验的目录生成流程。</w:t>
+        <w:t>，由此形成职责清晰、内容可校验的目录生成流程。</w:t>
       </w:r>
     </w:p>
     <w:p>
@@ -3501,31 +3047,7 @@
         <w:rPr>
           <w:rFonts w:ascii="Times New Roman" w:hAnsi="Times New Roman" w:eastAsia="宋体"/>
         </w:rPr>
-        <w:t>目录生成器从本地标准文件计算字节数和SHA-256并写入YAML，下载端以相同字段确认实际内容，从而形成“本地标准文件—目录条目—下载文件”的完整性链。历史目录迁移以权威本地文件重新生成</w:t>
-      </w:r>
-      <w:r>
-        <w:rPr>
-          <w:rFonts w:ascii="Consolas" w:hAnsi="Consolas" w:eastAsia="等线"/>
-        </w:rPr>
-        <w:t>SIZE/SHA256</w:t>
-      </w:r>
-      <w:r>
-        <w:rPr>
-          <w:rFonts w:ascii="Times New Roman" w:hAnsi="Times New Roman" w:eastAsia="宋体"/>
-        </w:rPr>
-        <w:t>，</w:t>
-      </w:r>
-      <w:r>
-        <w:rPr>
-          <w:rFonts w:ascii="Consolas" w:hAnsi="Consolas" w:eastAsia="等线"/>
-        </w:rPr>
-        <w:t>verify_urls!</w:t>
-      </w:r>
-      <w:r>
-        <w:rPr>
-          <w:rFonts w:ascii="Times New Roman" w:hAnsi="Times New Roman" w:eastAsia="宋体"/>
-        </w:rPr>
-        <w:t>用于地址巡检，二者共同提升多镜像目录的可维护性。</w:t>
+        <w:t>目录生成器从本地标准文件计算字节数和SHA-256并写入YAML，下载端以相同字段确认实际内容，从而形成“本地标准文件—目录条目—下载文件”的完整性链。历史目录迁移以权威标准文件重新生成完整性元数据，镜像地址巡检则持续维护各分发副本的可访问性。</w:t>
       </w:r>
     </w:p>
     <w:p>
@@ -3544,43 +3066,7 @@
         <w:rPr>
           <w:rFonts w:ascii="Times New Roman" w:hAnsi="Times New Roman" w:eastAsia="宋体"/>
         </w:rPr>
-        <w:t>一个新数据集进入GriddingMachine依次经历：准备原始文件；通过模板或配置构建器生成YAML；运行</w:t>
-      </w:r>
-      <w:r>
-        <w:rPr>
-          <w:rFonts w:ascii="Consolas" w:hAnsi="Consolas" w:eastAsia="等线"/>
-        </w:rPr>
-        <w:t>process_dataset!</w:t>
-      </w:r>
-      <w:r>
-        <w:rPr>
-          <w:rFonts w:ascii="Times New Roman" w:hAnsi="Times New Roman" w:eastAsia="宋体"/>
-        </w:rPr>
-        <w:t>；检查维度、坐标、变量、数值范围、缺失值和方向图；将标准NetCDF至少上传至一个外部可访问位置，并按条件增加机构镜像；把标签、逻辑路径、URL、文件大小和SHA-256写入</w:t>
-      </w:r>
-      <w:r>
-        <w:rPr>
-          <w:rFonts w:ascii="Consolas" w:hAnsi="Consolas" w:eastAsia="等线"/>
-        </w:rPr>
-        <w:t>Artifacts.yaml</w:t>
-      </w:r>
-      <w:r>
-        <w:rPr>
-          <w:rFonts w:ascii="Times New Roman" w:hAnsi="Times New Roman" w:eastAsia="宋体"/>
-        </w:rPr>
-        <w:t>；发布目录新版本；最后从</w:t>
-      </w:r>
-      <w:r>
-        <w:rPr>
-          <w:rFonts w:ascii="Consolas" w:hAnsi="Consolas" w:eastAsia="等线"/>
-        </w:rPr>
-        <w:t>GriddingMachine.jl</w:t>
-      </w:r>
-      <w:r>
-        <w:rPr>
-          <w:rFonts w:ascii="Times New Roman" w:hAnsi="Times New Roman" w:eastAsia="宋体"/>
-        </w:rPr>
-        <w:t>执行目录更新、下载和读取。机构FTP可以提高校内访问速度，Zenodo或其他公共存储保证校外可用；其他维护者也可在目录条目中增加内容相同的镜像。</w:t>
+        <w:t>一个新数据集进入GriddingMachine依次经历原始文件准备、YAML配置生成、标准产品生产、质量检查、NetCDF发布、目录登记以及下游更新与读取。质量检查覆盖维度、坐标、变量、数值范围、缺失值和空间方向；目录条目记录标签、逻辑路径、镜像地址、文件大小和SHA-256。机构FTP提高校内访问效率，Zenodo或其他公共存储面向社区提供长期访问，其他维护者也可在目录条目中增加内容相同的镜像。</w:t>
       </w:r>
     </w:p>
     <w:p>
@@ -3624,55 +3110,7 @@
         <w:rPr>
           <w:rFonts w:ascii="Times New Roman" w:hAnsi="Times New Roman" w:eastAsia="宋体"/>
         </w:rPr>
-        <w:t>通过Collector管理目录和本地文件。</w:t>
-      </w:r>
-      <w:r>
-        <w:rPr>
-          <w:rFonts w:ascii="Consolas" w:hAnsi="Consolas" w:eastAsia="等线"/>
-        </w:rPr>
-        <w:t>configure!</w:t>
-      </w:r>
-      <w:r>
-        <w:rPr>
-          <w:rFonts w:ascii="Times New Roman" w:hAnsi="Times New Roman" w:eastAsia="宋体"/>
-        </w:rPr>
-        <w:t>可从参数或环境变量设置数据根目录、目录URL和本地目录文件；</w:t>
-      </w:r>
-      <w:r>
-        <w:rPr>
-          <w:rFonts w:ascii="Consolas" w:hAnsi="Consolas" w:eastAsia="等线"/>
-        </w:rPr>
-        <w:t>cache</w:t>
-      </w:r>
-      <w:r>
-        <w:rPr>
-          <w:rFonts w:ascii="Times New Roman" w:hAnsi="Times New Roman" w:eastAsia="宋体"/>
-        </w:rPr>
-        <w:t>保存下载临时文件，</w:t>
-      </w:r>
-      <w:r>
-        <w:rPr>
-          <w:rFonts w:ascii="Consolas" w:hAnsi="Consolas" w:eastAsia="等线"/>
-        </w:rPr>
-        <w:t>public</w:t>
-      </w:r>
-      <w:r>
-        <w:rPr>
-          <w:rFonts w:ascii="Times New Roman" w:hAnsi="Times New Roman" w:eastAsia="宋体"/>
-        </w:rPr>
-        <w:t>按条目中的</w:t>
-      </w:r>
-      <w:r>
-        <w:rPr>
-          <w:rFonts w:ascii="Consolas" w:hAnsi="Consolas" w:eastAsia="等线"/>
-        </w:rPr>
-        <w:t>PATH</w:t>
-      </w:r>
-      <w:r>
-        <w:rPr>
-          <w:rFonts w:ascii="Times New Roman" w:hAnsi="Times New Roman" w:eastAsia="宋体"/>
-        </w:rPr>
-        <w:t>保存正式NetCDF。模块初始化负责配置内存状态，目录加载、更新和数据下载均由显式调用触发，使数据访问过程清晰可控。</w:t>
+        <w:t>通过目录与数据获取模块（Collector）管理目录和标准产品。数据根目录、目录来源和本地目录文件均可显式配置；事务缓存区保存传输中的临时内容，正式数据区按照目录逻辑路径保存通过完整性校验的NetCDF。目录加载、版本更新和产品获取分别触发，使网络访问与科学数据读取保持清晰边界。</w:t>
       </w:r>
     </w:p>
     <w:p>
@@ -3734,51 +3172,9 @@
     <w:p>
       <w:r>
         <w:rPr>
-          <w:rFonts w:ascii="Consolas" w:hAnsi="Consolas" w:eastAsia="等线"/>
-        </w:rPr>
-        <w:t>update_database!</w:t>
-      </w:r>
-      <w:r>
-        <w:rPr>
-          <w:rFonts w:ascii="Times New Roman" w:hAnsi="Times New Roman" w:eastAsia="宋体"/>
-        </w:rPr>
-        <w:t xml:space="preserve"> 调用 </w:t>
-      </w:r>
-      <w:r>
-        <w:rPr>
-          <w:rFonts w:ascii="Consolas" w:hAnsi="Consolas" w:eastAsia="等线"/>
-        </w:rPr>
-        <w:t>download_database!</w:t>
-      </w:r>
-      <w:r>
-        <w:rPr>
-          <w:rFonts w:ascii="Times New Roman" w:hAnsi="Times New Roman" w:eastAsia="宋体"/>
-        </w:rPr>
-        <w:t xml:space="preserve"> 获取目录，验证后再加载为内存状态。调用者可直接提供 YAML 文件 URL，也可使用 Zenodo 落地页；后者仍通过页面中的 </w:t>
-      </w:r>
-      <w:r>
-        <w:rPr>
-          <w:rFonts w:ascii="Consolas" w:hAnsi="Consolas" w:eastAsia="等线"/>
-        </w:rPr>
-        <w:t>Artifacts.yaml</w:t>
-      </w:r>
-      <w:r>
-        <w:rPr>
-          <w:rFonts w:ascii="Times New Roman" w:hAnsi="Times New Roman" w:eastAsia="宋体"/>
-        </w:rPr>
-        <w:t xml:space="preserve"> 链接解析实际下载地址。目录先写入同目录临时文件，解析根节点并执行 schema 校验；通过后备份当前目录为 </w:t>
-      </w:r>
-      <w:r>
-        <w:rPr>
-          <w:rFonts w:ascii="Consolas" w:hAnsi="Consolas" w:eastAsia="等线"/>
-        </w:rPr>
-        <w:t>Artifacts.previous.yaml</w:t>
-      </w:r>
-      <w:r>
-        <w:rPr>
-          <w:rFonts w:ascii="Times New Roman" w:hAnsi="Times New Roman" w:eastAsia="宋体"/>
-        </w:rPr>
-        <w:t>，再替换正式文件。</w:t>
+          <w:rFonts w:ascii="Times New Roman" w:hAnsi="Times New Roman" w:eastAsia="宋体"/>
+        </w:rPr>
+        <w:t>目录更新既支持直接YAML地址，也支持从Zenodo落地页解析目录文件。新目录先写入临时路径，完成根节点解析和schema校验后再替换正式文件，同时保留上一有效版本。该事务过程将远端目录获取、结构确认和版本切换连接为一个完整操作。</w:t>
       </w:r>
     </w:p>
     <w:p>
@@ -3803,6 +3199,12 @@
     <w:p>
       <w:r>
         <w:rPr>
+          <w:rFonts w:ascii="Times New Roman" w:hAnsi="Times New Roman" w:eastAsia="宋体"/>
+        </w:rPr>
+        <w:t>产品获取接口（</w:t>
+      </w:r>
+      <w:r>
+        <w:rPr>
           <w:rFonts w:ascii="Consolas" w:hAnsi="Consolas" w:eastAsia="等线"/>
         </w:rPr>
         <w:t>download_dataset!</w:t>
@@ -3811,7 +3213,7 @@
         <w:rPr>
           <w:rFonts w:ascii="Times New Roman" w:hAnsi="Times New Roman" w:eastAsia="宋体"/>
         </w:rPr>
-        <w:t>接收数据标签；目录刷新、正式文件复用和远端获取由同一接口组织。下载阶段从每个FTP或HTTP(S) URL提取主机名，以可获得的平均往返延迟生成候选顺序；其余地址按目录顺序保留，全部URL共同组成完整回退队列。</w:t>
+        <w:t>）以数据标签为入口，统一组织目录刷新、正式文件复用和远端传输。下载阶段从每个FTP或HTTP(S)地址提取主机名，以可获得的平均往返延迟生成候选顺序；其余地址按目录顺序保留，全部镜像共同组成完整回退队列。</w:t>
       </w:r>
     </w:p>
     <w:p>
@@ -3819,31 +3221,7 @@
         <w:rPr>
           <w:rFonts w:ascii="Times New Roman" w:hAnsi="Times New Roman" w:eastAsia="宋体"/>
         </w:rPr>
-        <w:t>下载循环按候选顺序逐一尝试镜像，每次尝试均写入进程级唯一</w:t>
-      </w:r>
-      <w:r>
-        <w:rPr>
-          <w:rFonts w:ascii="Consolas" w:hAnsi="Consolas" w:eastAsia="等线"/>
-        </w:rPr>
-        <w:t>.part</w:t>
-      </w:r>
-      <w:r>
-        <w:rPr>
-          <w:rFonts w:ascii="Times New Roman" w:hAnsi="Times New Roman" w:eastAsia="宋体"/>
-        </w:rPr>
-        <w:t>文件。程序核对文件生成状态、字节数和SHA-256；校验通过后以原子移动进入正式路径，各次尝试的临时内容随当前状态独立回收。</w:t>
-      </w:r>
-      <w:r>
-        <w:rPr>
-          <w:rFonts w:ascii="Consolas" w:hAnsi="Consolas" w:eastAsia="等线"/>
-        </w:rPr>
-        <w:t>require_integrity=true</w:t>
-      </w:r>
-      <w:r>
-        <w:rPr>
-          <w:rFonts w:ascii="Times New Roman" w:hAnsi="Times New Roman" w:eastAsia="宋体"/>
-        </w:rPr>
-        <w:t>提供严格完整性模式，兼容模式承接历史目录。镜像遍历完成后返回包含数据标签和各候选状态的汇总信息，已有正式文件始终保持稳定。</w:t>
+        <w:t>下载循环按候选顺序逐一尝试镜像，每次尝试均写入进程级唯一的临时文件。程序核对文件生成状态、字节数和SHA-256；校验通过后以原子移动进入正式路径，各次尝试的临时内容随当前状态独立回收。严格完整性模式要求目录同时提供字节数和摘要，兼容模式承接历史目录。镜像遍历完成后返回数据标签和各候选状态的汇总信息，已有正式文件始终保持稳定。</w:t>
       </w:r>
     </w:p>
     <w:p>
@@ -3871,31 +3249,7 @@
         <w:rPr>
           <w:rFonts w:ascii="Times New Roman" w:hAnsi="Times New Roman" w:eastAsia="宋体"/>
         </w:rPr>
-        <w:t>每次下载使用</w:t>
-      </w:r>
-      <w:r>
-        <w:rPr>
-          <w:rFonts w:ascii="Consolas" w:hAnsi="Consolas" w:eastAsia="等线"/>
-        </w:rPr>
-        <w:t>cache/.&lt;TAG&gt;.&lt;PID&gt;.part</w:t>
-      </w:r>
-      <w:r>
-        <w:rPr>
-          <w:rFonts w:ascii="Times New Roman" w:hAnsi="Times New Roman" w:eastAsia="宋体"/>
-        </w:rPr>
-        <w:t>，通过完整性校验后移动到正式路径。</w:t>
-      </w:r>
-      <w:r>
-        <w:rPr>
-          <w:rFonts w:ascii="Consolas" w:hAnsi="Consolas" w:eastAsia="等线"/>
-        </w:rPr>
-        <w:t>sync_database!</w:t>
-      </w:r>
-      <w:r>
-        <w:rPr>
-          <w:rFonts w:ascii="Times New Roman" w:hAnsi="Times New Roman" w:eastAsia="宋体"/>
-        </w:rPr>
-        <w:t>在更新目录后遍历标签并复用相同下载逻辑。小型目录参考数据呈现初始化、更新、同步、回退和清理行为，完整历史目录沿用同一事务机制开展批量运维。</w:t>
+        <w:t>每次下载使用与标签和进程关联的独立临时文件，通过完整性校验后移动到正式路径。全库同步在更新目录后遍历标签并复用相同下载逻辑。小型目录参考数据呈现初始化、更新、同步、回退和清理行为，完整历史目录沿用同一事务机制开展批量维护。</w:t>
       </w:r>
     </w:p>
     <w:p>
@@ -3911,7 +3265,7 @@
         <w:rPr>
           <w:rFonts w:ascii="Times New Roman" w:hAnsi="Times New Roman" w:eastAsia="宋体"/>
         </w:rPr>
-        <w:t>Collector还提供全库同步、历史数据整理、目录树及数据集状态查询等维护接口。相关命令、参数和状态恢复方式集中列入补充材料与版本化用户指南，正文保留目录更新、镜像获取和内容完整性保障的核心机制。</w:t>
+        <w:t>目录与数据获取模块还提供全库同步、历史数据整理、目录树及数据集状态查询等维护接口。相关命令、参数和状态恢复方式集中列入补充材料与版本化用户指南，正文保留目录更新、镜像获取和内容完整性保障的核心机制。</w:t>
       </w:r>
     </w:p>
     <w:p>
@@ -3933,19 +3287,7 @@
         <w:rPr>
           <w:rFonts w:ascii="Times New Roman" w:hAnsi="Times New Roman" w:eastAsia="宋体"/>
         </w:rPr>
-        <w:t xml:space="preserve">2.5.1 </w:t>
-      </w:r>
-      <w:r>
-        <w:rPr>
-          <w:rFonts w:ascii="Consolas" w:hAnsi="Consolas" w:eastAsia="等线"/>
-        </w:rPr>
-        <w:t>read_dataset</w:t>
-      </w:r>
-      <w:r>
-        <w:rPr>
-          <w:rFonts w:ascii="Times New Roman" w:hAnsi="Times New Roman" w:eastAsia="宋体"/>
-        </w:rPr>
-        <w:t xml:space="preserve"> 统一读取接口</w:t>
+        <w:t>2.5.1 标准网格数据读取</w:t>
       </w:r>
     </w:p>
     <w:p>
@@ -3953,19 +3295,43 @@
         <w:rPr>
           <w:rFonts w:ascii="Times New Roman" w:hAnsi="Times New Roman" w:eastAsia="宋体"/>
         </w:rPr>
-        <w:t>Indexer模块以</w:t>
+        <w:t>标准网格数据读取接口支持以本地NetCDF路径或数据标签访问产品，并提供整场数组、指定周期切片、站点全部周期和站点指定周期4种读取方式。标签对应的产品可由目录模块自动获取；默认返回标准变量</w:t>
       </w:r>
       <w:r>
         <w:rPr>
           <w:rFonts w:ascii="Consolas" w:hAnsi="Consolas" w:eastAsia="等线"/>
         </w:rPr>
+        <w:t>data</w:t>
+      </w:r>
+      <w:r>
+        <w:rPr>
+          <w:rFonts w:ascii="Times New Roman" w:hAnsi="Times New Roman" w:eastAsia="宋体"/>
+        </w:rPr>
+        <w:t>，也可读取原始数值或同形不确定性变量</w:t>
+      </w:r>
+      <w:r>
+        <w:rPr>
+          <w:rFonts w:ascii="Consolas" w:hAnsi="Consolas" w:eastAsia="等线"/>
+        </w:rPr>
+        <w:t>std</w:t>
+      </w:r>
+      <w:r>
+        <w:rPr>
+          <w:rFonts w:ascii="Times New Roman" w:hAnsi="Times New Roman" w:eastAsia="宋体"/>
+        </w:rPr>
+        <w:t>。该接口在代码中实现为</w:t>
+      </w:r>
+      <w:r>
+        <w:rPr>
+          <w:rFonts w:ascii="Consolas" w:hAnsi="Consolas" w:eastAsia="等线"/>
+        </w:rPr>
         <w:t>read_dataset</w:t>
       </w:r>
       <w:r>
         <w:rPr>
           <w:rFonts w:ascii="Times New Roman" w:hAnsi="Times New Roman" w:eastAsia="宋体"/>
         </w:rPr>
-        <w:t>统一本地NetCDF路径和目录标签的读取，支持整场数组、指定周期切片、站点全部周期以及站点指定周期4种调用。目录标签在本地缺失时交由Collector下载；旧名称</w:t>
+        <w:t>，并以</w:t>
       </w:r>
       <w:r>
         <w:rPr>
@@ -3977,43 +3343,7 @@
         <w:rPr>
           <w:rFonts w:ascii="Times New Roman" w:hAnsi="Times New Roman" w:eastAsia="宋体"/>
         </w:rPr>
-        <w:t>保留为兼容别名。默认读取</w:t>
-      </w:r>
-      <w:r>
-        <w:rPr>
-          <w:rFonts w:ascii="Consolas" w:hAnsi="Consolas" w:eastAsia="等线"/>
-        </w:rPr>
-        <w:t>data</w:t>
-      </w:r>
-      <w:r>
-        <w:rPr>
-          <w:rFonts w:ascii="Times New Roman" w:hAnsi="Times New Roman" w:eastAsia="宋体"/>
-        </w:rPr>
-        <w:t>，调用者也可显式请求</w:t>
-      </w:r>
-      <w:r>
-        <w:rPr>
-          <w:rFonts w:ascii="Consolas" w:hAnsi="Consolas" w:eastAsia="等线"/>
-        </w:rPr>
-        <w:t>raw_data</w:t>
-      </w:r>
-      <w:r>
-        <w:rPr>
-          <w:rFonts w:ascii="Times New Roman" w:hAnsi="Times New Roman" w:eastAsia="宋体"/>
-        </w:rPr>
-        <w:t>或</w:t>
-      </w:r>
-      <w:r>
-        <w:rPr>
-          <w:rFonts w:ascii="Consolas" w:hAnsi="Consolas" w:eastAsia="等线"/>
-        </w:rPr>
-        <w:t>std</w:t>
-      </w:r>
-      <w:r>
-        <w:rPr>
-          <w:rFonts w:ascii="Times New Roman" w:hAnsi="Times New Roman" w:eastAsia="宋体"/>
-        </w:rPr>
-        <w:t>。读取层直接保留生产端已经标准化的单位、缺失值和物理范围，使处理规则集中于共享生产契约。</w:t>
+        <w:t>兼容既有调用。读取层直接继承生产端统一的单位、缺失值和物理范围，使处理规则集中于共享生产契约。</w:t>
       </w:r>
     </w:p>
     <w:p>
@@ -4050,6 +3380,12 @@
     <w:p>
       <w:r>
         <w:rPr>
+          <w:rFonts w:ascii="Times New Roman" w:hAnsi="Times New Roman" w:eastAsia="宋体"/>
+        </w:rPr>
+        <w:t>格点尺度陆面参数组织接口（</w:t>
+      </w:r>
+      <w:r>
+        <w:rPr>
           <w:rFonts w:ascii="Consolas" w:hAnsi="Consolas" w:eastAsia="等线"/>
         </w:rPr>
         <w:t>grid_dict</w:t>
@@ -4058,31 +3394,19 @@
         <w:rPr>
           <w:rFonts w:ascii="Times New Roman" w:hAnsi="Times New Roman" w:eastAsia="宋体"/>
         </w:rPr>
-        <w:t>实现格点尺度陆面参数融合与模型初始化。该函数从</w:t>
+        <w:t>）从预定义产品集合中提取土壤、冠层、叶片、地形、陆地掩膜和植物功能型数据，依据陆面状态融合相应参数，并对叶面积指数、叶绿素、冠层聚集度和最大羧化速率等季节序列执行Gapfill与逐日重采样。第二套陆面参数集合</w:t>
       </w:r>
       <w:r>
         <w:rPr>
           <w:rFonts w:ascii="Consolas" w:hAnsi="Consolas" w:eastAsia="等线"/>
         </w:rPr>
-        <w:t>gm1</w:t>
-      </w:r>
-      <w:r>
-        <w:rPr>
-          <w:rFonts w:ascii="Times New Roman" w:hAnsi="Times New Roman" w:eastAsia="宋体"/>
-        </w:rPr>
-        <w:t>或</w:t>
-      </w:r>
-      <w:r>
-        <w:rPr>
-          <w:rFonts w:ascii="Consolas" w:hAnsi="Consolas" w:eastAsia="等线"/>
-        </w:rPr>
         <w:t>gm2</w:t>
       </w:r>
       <w:r>
         <w:rPr>
           <w:rFonts w:ascii="Times New Roman" w:hAnsi="Times New Roman" w:eastAsia="宋体"/>
         </w:rPr>
-        <w:t>标签组提取土壤、冠层、叶片、地形、陆地掩膜和植物功能型产品，依据陆面状态组织相应参数，并对叶面积指数、叶绿素、冠层聚集度和最大羧化速率等季节序列执行Gapfill与逐日重采样。</w:t>
+        <w:t>由14类标准产品组成，其中冠层聚集度采用月尺度产品，其余字段按各自空间与时间分辨率进入统一格点。</w:t>
       </w:r>
     </w:p>
     <w:p>
@@ -4144,6 +3468,12 @@
     <w:p>
       <w:r>
         <w:rPr>
+          <w:rFonts w:ascii="Times New Roman" w:hAnsi="Times New Roman" w:eastAsia="宋体"/>
+        </w:rPr>
+        <w:t>格点尺度气象驱动接口（</w:t>
+      </w:r>
+      <w:r>
+        <w:rPr>
           <w:rFonts w:ascii="Consolas" w:hAnsi="Consolas" w:eastAsia="等线"/>
         </w:rPr>
         <w:t>grid_weather</w:t>
@@ -4152,7 +3482,7 @@
         <w:rPr>
           <w:rFonts w:ascii="Times New Roman" w:hAnsi="Times New Roman" w:eastAsia="宋体"/>
         </w:rPr>
-        <w:t>实现格点尺度气象驱动组织与时间坐标构建。该函数按年份和格点读取</w:t>
+        <w:t>）按年份和格点读取气象驱动集合</w:t>
       </w:r>
       <w:r>
         <w:rPr>
@@ -4164,7 +3494,7 @@
         <w:rPr>
           <w:rFonts w:ascii="Times New Roman" w:hAnsi="Times New Roman" w:eastAsia="宋体"/>
         </w:rPr>
-        <w:t>中的8个ERA5标签，分别提取地表气压、降水、漫射与直射短波辐射、长波辐射、气温、水汽压亏缺和风速，并依据格点经度换算时区偏移、构建浮点年积日</w:t>
+        <w:t>中的8类ERA5产品，分别提取地表气压、降水、漫射与直射短波辐射、长波辐射、气温、水汽压亏缺和风速，并依据格点经度换算时区偏移、构建浮点年积日</w:t>
       </w:r>
       <w:r>
         <w:rPr>
@@ -4196,55 +3526,7 @@
         <w:rPr>
           <w:rFonts w:ascii="Times New Roman" w:hAnsi="Times New Roman" w:eastAsia="宋体"/>
         </w:rPr>
-        <w:t>上述标签驱动的数据访问、陆面参数融合与气象驱动组织能力分别由</w:t>
-      </w:r>
-      <w:r>
-        <w:rPr>
-          <w:rFonts w:ascii="Consolas" w:hAnsi="Consolas" w:eastAsia="等线"/>
-        </w:rPr>
-        <w:t>read_dataset</w:t>
-      </w:r>
-      <w:r>
-        <w:rPr>
-          <w:rFonts w:ascii="Times New Roman" w:hAnsi="Times New Roman" w:eastAsia="宋体"/>
-        </w:rPr>
-        <w:t>、</w:t>
-      </w:r>
-      <w:r>
-        <w:rPr>
-          <w:rFonts w:ascii="Consolas" w:hAnsi="Consolas" w:eastAsia="等线"/>
-        </w:rPr>
-        <w:t>grid_dict</w:t>
-      </w:r>
-      <w:r>
-        <w:rPr>
-          <w:rFonts w:ascii="Times New Roman" w:hAnsi="Times New Roman" w:eastAsia="宋体"/>
-        </w:rPr>
-        <w:t>和</w:t>
-      </w:r>
-      <w:r>
-        <w:rPr>
-          <w:rFonts w:ascii="Consolas" w:hAnsi="Consolas" w:eastAsia="等线"/>
-        </w:rPr>
-        <w:t>grid_weather</w:t>
-      </w:r>
-      <w:r>
-        <w:rPr>
-          <w:rFonts w:ascii="Times New Roman" w:hAnsi="Times New Roman" w:eastAsia="宋体"/>
-        </w:rPr>
-        <w:t>实现。确定性气象参考数据用于核对字段、形状和Emerald最小步进，</w:t>
-      </w:r>
-      <w:r>
-        <w:rPr>
-          <w:rFonts w:ascii="Consolas" w:hAnsi="Consolas" w:eastAsia="等线"/>
-        </w:rPr>
-        <w:t>gm2</w:t>
-      </w:r>
-      <w:r>
-        <w:rPr>
-          <w:rFonts w:ascii="Times New Roman" w:hAnsi="Times New Roman" w:eastAsia="宋体"/>
-        </w:rPr>
-        <w:t>文件则贯通陆面参数链路。</w:t>
+        <w:t>标签驱动的数据访问、陆面参数融合与气象驱动组织共同构成模型就绪转换层。标准产品在这一层被组织为结构一致的陆面参数和逐时气象字段，并与Emerald模型的数据结构相衔接。</w:t>
       </w:r>
     </w:p>
     <w:p>
@@ -4255,7 +3537,7 @@
         <w:rPr>
           <w:rFonts w:ascii="Times New Roman" w:hAnsi="Times New Roman" w:eastAsia="宋体"/>
         </w:rPr>
-        <w:t>2.6 端到端调用路径</w:t>
+        <w:t>2.6 端到端数据流与公共接口</w:t>
       </w:r>
     </w:p>
     <w:p>
@@ -4263,7 +3545,7 @@
         <w:rPr>
           <w:rFonts w:ascii="Times New Roman" w:hAnsi="Times New Roman" w:eastAsia="宋体"/>
         </w:rPr>
-        <w:t>与2022版通过标签组织数据访问的思路一致[4]，新版将目录配置、目录更新、完整性下载、统一读取和模型参数组织连接为稳定的公共调用路径。用户依次调用</w:t>
+        <w:t>与2022版通过标签组织数据访问的思路一致[4]，新版将目录配置与更新、完整性下载、标准网格读取和模型输入组织连接为稳定的公共数据流。用户以数据标签发现产品，经镜像选择和内容校验获得标准NetCDF，再读取整场、周期或格点数据，并进一步形成陆面参数或气象驱动。公共接口依次对应环境配置（</w:t>
       </w:r>
       <w:r>
         <w:rPr>
@@ -4275,79 +3557,67 @@
         <w:rPr>
           <w:rFonts w:ascii="Times New Roman" w:hAnsi="Times New Roman" w:eastAsia="宋体"/>
         </w:rPr>
+        <w:t>）、目录更新（</w:t>
+      </w:r>
+      <w:r>
+        <w:rPr>
+          <w:rFonts w:ascii="Consolas" w:hAnsi="Consolas" w:eastAsia="等线"/>
+        </w:rPr>
+        <w:t>update_database!</w:t>
+      </w:r>
+      <w:r>
+        <w:rPr>
+          <w:rFonts w:ascii="Times New Roman" w:hAnsi="Times New Roman" w:eastAsia="宋体"/>
+        </w:rPr>
+        <w:t>）、产品获取（</w:t>
+      </w:r>
+      <w:r>
+        <w:rPr>
+          <w:rFonts w:ascii="Consolas" w:hAnsi="Consolas" w:eastAsia="等线"/>
+        </w:rPr>
+        <w:t>download_dataset!</w:t>
+      </w:r>
+      <w:r>
+        <w:rPr>
+          <w:rFonts w:ascii="Times New Roman" w:hAnsi="Times New Roman" w:eastAsia="宋体"/>
+        </w:rPr>
+        <w:t>）、标准读取（</w:t>
+      </w:r>
+      <w:r>
+        <w:rPr>
+          <w:rFonts w:ascii="Consolas" w:hAnsi="Consolas" w:eastAsia="等线"/>
+        </w:rPr>
+        <w:t>read_dataset</w:t>
+      </w:r>
+      <w:r>
+        <w:rPr>
+          <w:rFonts w:ascii="Times New Roman" w:hAnsi="Times New Roman" w:eastAsia="宋体"/>
+        </w:rPr>
+        <w:t>）和模型输入组织（</w:t>
+      </w:r>
+      <w:r>
+        <w:rPr>
+          <w:rFonts w:ascii="Consolas" w:hAnsi="Consolas" w:eastAsia="等线"/>
+        </w:rPr>
+        <w:t>grid_dict</w:t>
+      </w:r>
+      <w:r>
+        <w:rPr>
+          <w:rFonts w:ascii="Times New Roman" w:hAnsi="Times New Roman" w:eastAsia="宋体"/>
+        </w:rPr>
         <w:t>、</w:t>
       </w:r>
       <w:r>
         <w:rPr>
           <w:rFonts w:ascii="Consolas" w:hAnsi="Consolas" w:eastAsia="等线"/>
         </w:rPr>
-        <w:t>update_database!</w:t>
-      </w:r>
-      <w:r>
-        <w:rPr>
-          <w:rFonts w:ascii="Times New Roman" w:hAnsi="Times New Roman" w:eastAsia="宋体"/>
-        </w:rPr>
-        <w:t>和</w:t>
-      </w:r>
-      <w:r>
-        <w:rPr>
-          <w:rFonts w:ascii="Consolas" w:hAnsi="Consolas" w:eastAsia="等线"/>
-        </w:rPr>
-        <w:t>download_dataset!</w:t>
-      </w:r>
-      <w:r>
-        <w:rPr>
-          <w:rFonts w:ascii="Times New Roman" w:hAnsi="Times New Roman" w:eastAsia="宋体"/>
-        </w:rPr>
-        <w:t>获得经过</w:t>
-      </w:r>
-      <w:r>
-        <w:rPr>
-          <w:rFonts w:ascii="Consolas" w:hAnsi="Consolas" w:eastAsia="等线"/>
-        </w:rPr>
-        <w:t>SIZE/SHA256</w:t>
-      </w:r>
-      <w:r>
-        <w:rPr>
-          <w:rFonts w:ascii="Times New Roman" w:hAnsi="Times New Roman" w:eastAsia="宋体"/>
-        </w:rPr>
-        <w:t>核验的标准产品，再通过</w:t>
-      </w:r>
-      <w:r>
-        <w:rPr>
-          <w:rFonts w:ascii="Consolas" w:hAnsi="Consolas" w:eastAsia="等线"/>
-        </w:rPr>
-        <w:t>read_dataset</w:t>
-      </w:r>
-      <w:r>
-        <w:rPr>
-          <w:rFonts w:ascii="Times New Roman" w:hAnsi="Times New Roman" w:eastAsia="宋体"/>
-        </w:rPr>
-        <w:t>读取整场或格点数据，并由</w:t>
-      </w:r>
-      <w:r>
-        <w:rPr>
-          <w:rFonts w:ascii="Consolas" w:hAnsi="Consolas" w:eastAsia="等线"/>
-        </w:rPr>
-        <w:t>grid_dict</w:t>
-      </w:r>
-      <w:r>
-        <w:rPr>
-          <w:rFonts w:ascii="Times New Roman" w:hAnsi="Times New Roman" w:eastAsia="宋体"/>
-        </w:rPr>
-        <w:t>或</w:t>
-      </w:r>
-      <w:r>
-        <w:rPr>
-          <w:rFonts w:ascii="Consolas" w:hAnsi="Consolas" w:eastAsia="等线"/>
-        </w:rPr>
         <w:t>grid_weather</w:t>
       </w:r>
       <w:r>
         <w:rPr>
           <w:rFonts w:ascii="Times New Roman" w:hAnsi="Times New Roman" w:eastAsia="宋体"/>
         </w:rPr>
-        <w:t>形成模型输入。完整Julia示例、配置字段字典、目录登记及状态恢复命令集中列入补充材料与版本化用户指南，正文突出工作流结构及其科学应用方式。</w:t>
+        <w:t>）；完整Julia示例、配置字段字典、目录登记及状态恢复命令集中列入补充材料与版本化用户指南。</w:t>
       </w:r>
     </w:p>
     <w:p>
@@ -5243,51 +4513,9 @@
     <w:p>
       <w:r>
         <w:rPr>
-          <w:rFonts w:ascii="Consolas" w:hAnsi="Consolas" w:eastAsia="等线"/>
-        </w:rPr>
-        <w:t>YamlBuilder</w:t>
-      </w:r>
-      <w:r>
-        <w:rPr>
-          <w:rFonts w:ascii="Times New Roman" w:hAnsi="Times New Roman" w:eastAsia="宋体"/>
-        </w:rPr>
-        <w:t>面向二维数据、含</w:t>
-      </w:r>
-      <w:r>
-        <w:rPr>
-          <w:rFonts w:ascii="Consolas" w:hAnsi="Consolas" w:eastAsia="等线"/>
-        </w:rPr>
-        <w:t>std</w:t>
-      </w:r>
-      <w:r>
-        <w:rPr>
-          <w:rFonts w:ascii="Times New Roman" w:hAnsi="Times New Roman" w:eastAsia="宋体"/>
-        </w:rPr>
-        <w:t>的三维数据和经纬度变换数据生成符合共享schema的配置，并将配置直接交给</w:t>
-      </w:r>
-      <w:r>
-        <w:rPr>
-          <w:rFonts w:ascii="Consolas" w:hAnsi="Consolas" w:eastAsia="等线"/>
-        </w:rPr>
-        <w:t>process_dataset!</w:t>
-      </w:r>
-      <w:r>
-        <w:rPr>
-          <w:rFonts w:ascii="Times New Roman" w:hAnsi="Times New Roman" w:eastAsia="宋体"/>
-        </w:rPr>
-        <w:t>。数据贡献案例进一步贯通配置生成、标准化、自动与人工质量检查、产品发布、</w:t>
-      </w:r>
-      <w:r>
-        <w:rPr>
-          <w:rFonts w:ascii="Consolas" w:hAnsi="Consolas" w:eastAsia="等线"/>
-        </w:rPr>
-        <w:t>Artifacts.yaml</w:t>
-      </w:r>
-      <w:r>
-        <w:rPr>
-          <w:rFonts w:ascii="Times New Roman" w:hAnsi="Times New Roman" w:eastAsia="宋体"/>
-        </w:rPr>
-        <w:t>登记以及下游更新、下载和读取，形成面向数据贡献者的完整生产入口。</w:t>
+          <w:rFonts w:ascii="Times New Roman" w:hAnsi="Times New Roman" w:eastAsia="宋体"/>
+        </w:rPr>
+        <w:t>配置构建器面向二维数据、含不确定性变量的三维数据和经纬度变换数据生成符合共享schema的配置，并将其直接交给标准产品生产引擎。数据贡献案例进一步贯通配置生成、标准化、自动与人工质量检查、产品发布、目录登记以及下游更新、下载和读取，形成面向数据贡献者的完整生产入口。</w:t>
       </w:r>
     </w:p>
     <w:p>
@@ -5295,7 +4523,7 @@
         <w:rPr>
           <w:rFonts w:ascii="Times New Roman" w:hAnsi="Times New Roman" w:eastAsia="宋体"/>
         </w:rPr>
-        <w:t>OISST真实产品用于进一步呈现共享生产契约对异构源结构的适配能力。案例采用NOAA/NCEI 0.25°逐日最优插值海表温度OISST V2.1中仅使用AVHRR数据的正式产品[9]，选取2022年2月25日文件。原始</w:t>
+        <w:t>OISST实际产品用于进一步呈现共享生产契约对异构源结构的适配能力。案例采用NOAA/NCEI 0.25°逐日最优插值海表温度OISST V2.1中仅使用AVHRR数据的正式产品[9]，选取2022年2月25日文件。原始</w:t>
       </w:r>
       <w:r>
         <w:rPr>
@@ -5443,31 +4671,7 @@
         <w:rPr>
           <w:rFonts w:ascii="Times New Roman" w:hAnsi="Times New Roman" w:eastAsia="宋体"/>
         </w:rPr>
-        <w:t>构造物理值与缺失值掩膜，并独立计算目标经度索引。参考结果记录全场统计量、10个确定性有效格点和10个缺失格点。标准产品连续生成3次，逐点比较坐标、有效值掩膜和物理值；随后由本地权威文件生成包含</w:t>
-      </w:r>
-      <w:r>
-        <w:rPr>
-          <w:rFonts w:ascii="Consolas" w:hAnsi="Consolas" w:eastAsia="等线"/>
-        </w:rPr>
-        <w:t>PATH/URL/SIZE/SHA256</w:t>
-      </w:r>
-      <w:r>
-        <w:rPr>
-          <w:rFonts w:ascii="Times New Roman" w:hAnsi="Times New Roman" w:eastAsia="宋体"/>
-        </w:rPr>
-        <w:t>的目录条目，通过回环HTTP执行事务式下载，并以</w:t>
-      </w:r>
-      <w:r>
-        <w:rPr>
-          <w:rFonts w:ascii="Consolas" w:hAnsi="Consolas" w:eastAsia="等线"/>
-        </w:rPr>
-        <w:t>read_dataset</w:t>
-      </w:r>
-      <w:r>
-        <w:rPr>
-          <w:rFonts w:ascii="Times New Roman" w:hAnsi="Times New Roman" w:eastAsia="宋体"/>
-        </w:rPr>
-        <w:t>完成整场读取核对。</w:t>
+        <w:t>构造物理值与缺失值掩膜，并独立计算目标经度索引。参考结果记录全场统计量、10个确定性有效格点和10个缺失格点。标准产品连续生成3次，逐点比较坐标、有效值掩膜和物理值；随后由权威文件生成包含逻辑路径、镜像地址、字节数和SHA-256的目录条目，通过回环HTTP执行事务式下载，并以统一读取接口完成整场核对。</w:t>
       </w:r>
     </w:p>
     <w:p>
@@ -5553,7 +4757,7 @@
         <w:rPr>
           <w:rFonts w:ascii="Times New Roman" w:hAnsi="Times New Roman" w:eastAsia="宋体"/>
         </w:rPr>
-        <w:t>3.3 多镜像可靠性与真实镜像访问</w:t>
+        <w:t>3.3 多镜像可靠性与网络访问</w:t>
       </w:r>
     </w:p>
     <w:p>
@@ -5573,67 +4777,7 @@
         <w:rPr>
           <w:rFonts w:ascii="Times New Roman" w:hAnsi="Times New Roman" w:eastAsia="宋体"/>
         </w:rPr>
-        <w:t>、多个NetCDF产品和两个镜像端点，并依次调用</w:t>
-      </w:r>
-      <w:r>
-        <w:rPr>
-          <w:rFonts w:ascii="Consolas" w:hAnsi="Consolas" w:eastAsia="等线"/>
-        </w:rPr>
-        <w:t>update_database!</w:t>
-      </w:r>
-      <w:r>
-        <w:rPr>
-          <w:rFonts w:ascii="Times New Roman" w:hAnsi="Times New Roman" w:eastAsia="宋体"/>
-        </w:rPr>
-        <w:t>、</w:t>
-      </w:r>
-      <w:r>
-        <w:rPr>
-          <w:rFonts w:ascii="Consolas" w:hAnsi="Consolas" w:eastAsia="等线"/>
-        </w:rPr>
-        <w:t>download_dataset!</w:t>
-      </w:r>
-      <w:r>
-        <w:rPr>
-          <w:rFonts w:ascii="Times New Roman" w:hAnsi="Times New Roman" w:eastAsia="宋体"/>
-        </w:rPr>
-        <w:t>、</w:t>
-      </w:r>
-      <w:r>
-        <w:rPr>
-          <w:rFonts w:ascii="Consolas" w:hAnsi="Consolas" w:eastAsia="等线"/>
-        </w:rPr>
-        <w:t>sync_database!</w:t>
-      </w:r>
-      <w:r>
-        <w:rPr>
-          <w:rFonts w:ascii="Times New Roman" w:hAnsi="Times New Roman" w:eastAsia="宋体"/>
-        </w:rPr>
-        <w:t>、</w:t>
-      </w:r>
-      <w:r>
-        <w:rPr>
-          <w:rFonts w:ascii="Consolas" w:hAnsi="Consolas" w:eastAsia="等线"/>
-        </w:rPr>
-        <w:t>clean_database!</w:t>
-      </w:r>
-      <w:r>
-        <w:rPr>
-          <w:rFonts w:ascii="Times New Roman" w:hAnsi="Times New Roman" w:eastAsia="宋体"/>
-        </w:rPr>
-        <w:t>及目录信息接口。cache与public目录分别承担事务缓存和正式产品保存，</w:t>
-      </w:r>
-      <w:r>
-        <w:rPr>
-          <w:rFonts w:ascii="Consolas" w:hAnsi="Consolas" w:eastAsia="等线"/>
-        </w:rPr>
-        <w:t>read_dataset</w:t>
-      </w:r>
-      <w:r>
-        <w:rPr>
-          <w:rFonts w:ascii="Times New Roman" w:hAnsi="Times New Roman" w:eastAsia="宋体"/>
-        </w:rPr>
-        <w:t>的整场、周期和站点读取共同连接目录与数据使用环节。</w:t>
+        <w:t>、多个NetCDF产品和两个镜像端点，并覆盖目录更新、单产品获取、全库同步、历史整理和状态查询。事务缓存区与正式数据区分别承担传输状态隔离和标准产品保存，整场、周期和站点读取共同连接目录与数据使用环节。</w:t>
       </w:r>
     </w:p>
     <w:p>
@@ -5641,19 +4785,7 @@
         <w:rPr>
           <w:rFonts w:ascii="Times New Roman" w:hAnsi="Times New Roman" w:eastAsia="宋体"/>
         </w:rPr>
-        <w:t>各状态转换通过重复调用考察幂等行为，上一有效版本和事务缓存共同承接目录与下载状态。</w:t>
-      </w:r>
-      <w:r>
-        <w:rPr>
-          <w:rFonts w:ascii="Consolas" w:hAnsi="Consolas" w:eastAsia="等线"/>
-        </w:rPr>
-        <w:t>sync_database!</w:t>
-      </w:r>
-      <w:r>
-        <w:rPr>
-          <w:rFonts w:ascii="Times New Roman" w:hAnsi="Times New Roman" w:eastAsia="宋体"/>
-        </w:rPr>
-        <w:t>使用确定性小型目录参考数据呈现全库遍历逻辑。</w:t>
+        <w:t>各状态转换通过重复调用考察幂等行为，上一有效版本和事务缓存共同承接目录与下载状态。确定性小型目录参考数据用于呈现全库同步与镜像遍历逻辑。</w:t>
       </w:r>
     </w:p>
     <w:p>
@@ -5700,81 +4832,15 @@
         <w:rPr>
           <w:rFonts w:ascii="Times New Roman" w:hAnsi="Times New Roman" w:eastAsia="宋体"/>
         </w:rPr>
-        <w:t>模型就绪应用连接</w:t>
-      </w:r>
-      <w:r>
-        <w:rPr>
-          <w:rFonts w:ascii="Consolas" w:hAnsi="Consolas" w:eastAsia="等线"/>
-        </w:rPr>
-        <w:t>read_dataset</w:t>
-      </w:r>
-      <w:r>
-        <w:rPr>
-          <w:rFonts w:ascii="Times New Roman" w:hAnsi="Times New Roman" w:eastAsia="宋体"/>
-        </w:rPr>
-        <w:t>、</w:t>
-      </w:r>
-      <w:r>
-        <w:rPr>
-          <w:rFonts w:ascii="Consolas" w:hAnsi="Consolas" w:eastAsia="等线"/>
-        </w:rPr>
-        <w:t>grid_dict</w:t>
-      </w:r>
-      <w:r>
-        <w:rPr>
-          <w:rFonts w:ascii="Times New Roman" w:hAnsi="Times New Roman" w:eastAsia="宋体"/>
-        </w:rPr>
-        <w:t>、</w:t>
-      </w:r>
-      <w:r>
-        <w:rPr>
-          <w:rFonts w:ascii="Consolas" w:hAnsi="Consolas" w:eastAsia="等线"/>
-        </w:rPr>
-        <w:t>grid_weather</w:t>
-      </w:r>
-      <w:r>
-        <w:rPr>
-          <w:rFonts w:ascii="Times New Roman" w:hAnsi="Times New Roman" w:eastAsia="宋体"/>
-        </w:rPr>
-        <w:t>与Emerald初始化。确定性参考数据用于核对字段名、形状、类型、时间索引和NaN处理；陆面案例采用2020年</w:t>
-      </w:r>
-      <w:r>
-        <w:rPr>
-          <w:rFonts w:ascii="Consolas" w:hAnsi="Consolas" w:eastAsia="等线"/>
-        </w:rPr>
-        <w:t>gm2</w:t>
-      </w:r>
-      <w:r>
-        <w:rPr>
-          <w:rFonts w:ascii="Times New Roman" w:hAnsi="Times New Roman" w:eastAsia="宋体"/>
-        </w:rPr>
-        <w:t>产品，在US-NR1附近植被格点和典型非植被格点呈现不同陆面状态下的模型入口。</w:t>
+        <w:t>模型就绪应用连接标准网格读取、陆面参数融合、气象驱动组织与Emerald初始化。确定性参考数据用于核对字段名、形状、类型、时间索引和缺失值处理；陆面案例采用2020年第二套陆面参数集合，在US-NR1附近植被格点和典型非植被格点呈现不同陆面状态下的模型入口。</w:t>
       </w:r>
     </w:p>
     <w:p>
       <w:r>
         <w:rPr>
-          <w:rFonts w:ascii="Consolas" w:hAnsi="Consolas" w:eastAsia="等线"/>
-        </w:rPr>
-        <w:t>grid_dict</w:t>
-      </w:r>
-      <w:r>
-        <w:rPr>
-          <w:rFonts w:ascii="Times New Roman" w:hAnsi="Times New Roman" w:eastAsia="宋体"/>
-        </w:rPr>
-        <w:t>和</w:t>
-      </w:r>
-      <w:r>
-        <w:rPr>
-          <w:rFonts w:ascii="Consolas" w:hAnsi="Consolas" w:eastAsia="等线"/>
-        </w:rPr>
-        <w:t>grid_weather</w:t>
-      </w:r>
-      <w:r>
-        <w:rPr>
-          <w:rFonts w:ascii="Times New Roman" w:hAnsi="Times New Roman" w:eastAsia="宋体"/>
-        </w:rPr>
-        <w:t>输出可直接用于同一格点的Emerald初始化与首个气象时间步计算。字段映射、单位和维度在标准数据与模型接口之间保持一致，使GriddingMachine产品能够进入模型参数组织和时间步计算。</w:t>
+          <w:rFonts w:ascii="Times New Roman" w:hAnsi="Times New Roman" w:eastAsia="宋体"/>
+        </w:rPr>
+        <w:t>陆面参数与气象驱动接口的输出可直接用于同一格点的Emerald初始化与首个气象时间步计算。字段映射、单位和维度在标准数据与模型接口之间保持一致，使GriddingMachine产品能够进入模型参数组织和时间步计算。</w:t>
       </w:r>
     </w:p>
     <w:p>
@@ -5801,19 +4867,7 @@
         <w:rPr>
           <w:rFonts w:ascii="Times New Roman" w:hAnsi="Times New Roman" w:eastAsia="宋体"/>
         </w:rPr>
-        <w:t>持续集成使用确定性NetCDF参考数据维护代码路径、文件状态和内容完整性，本地环境进一步覆盖ELEV/LAI效率、FTP—Zenodo镜像访问和</w:t>
-      </w:r>
-      <w:r>
-        <w:rPr>
-          <w:rFonts w:ascii="Consolas" w:hAnsi="Consolas" w:eastAsia="等线"/>
-        </w:rPr>
-        <w:t>gm2</w:t>
-      </w:r>
-      <w:r>
-        <w:rPr>
-          <w:rFonts w:ascii="Times New Roman" w:hAnsi="Times New Roman" w:eastAsia="宋体"/>
-        </w:rPr>
-        <w:t>陆面案例，共同形成从自动维护到数据应用的分层运行体系。</w:t>
+        <w:t>持续集成使用确定性NetCDF参考数据维护代码路径、文件状态和内容完整性，独立运行环境进一步覆盖ELEV/LAI效率、FTP—Zenodo镜像访问和陆面参数集合应用，共同形成从自动维护到数据应用的分层运行体系。</w:t>
       </w:r>
     </w:p>
     <w:p>
@@ -6157,21 +5211,7 @@
                 <w:rFonts w:ascii="Times New Roman" w:hAnsi="Times New Roman" w:eastAsia="宋体"/>
                 <w:sz w:val="18"/>
               </w:rPr>
-              <w:t>14类</w:t>
-            </w:r>
-            <w:r>
-              <w:rPr>
-                <w:rFonts w:ascii="Consolas" w:hAnsi="Consolas" w:eastAsia="等线"/>
-                <w:sz w:val="18"/>
-              </w:rPr>
-              <w:t>gm2</w:t>
-            </w:r>
-            <w:r>
-              <w:rPr>
-                <w:rFonts w:ascii="Times New Roman" w:hAnsi="Times New Roman" w:eastAsia="宋体"/>
-                <w:sz w:val="18"/>
-              </w:rPr>
-              <w:t>产品生成US-NR1参数字典并进入Emerald模型流程</w:t>
+              <w:t>14类陆面产品生成US-NR1参数字典并进入Emerald模型流程</w:t>
             </w:r>
           </w:p>
         </w:tc>
@@ -6346,43 +5386,7 @@
         <w:rPr>
           <w:rFonts w:ascii="Times New Roman" w:hAnsi="Times New Roman" w:eastAsia="宋体"/>
         </w:rPr>
-        <w:t>标准产品连续生成3次，科学数组、坐标和文件SHA-256均保持一致。生成文件为997 006字节，目录条目自动登记相同的</w:t>
-      </w:r>
-      <w:r>
-        <w:rPr>
-          <w:rFonts w:ascii="Consolas" w:hAnsi="Consolas" w:eastAsia="等线"/>
-        </w:rPr>
-        <w:t>SIZE</w:t>
-      </w:r>
-      <w:r>
-        <w:rPr>
-          <w:rFonts w:ascii="Times New Roman" w:hAnsi="Times New Roman" w:eastAsia="宋体"/>
-        </w:rPr>
-        <w:t>和SHA-256；经回环HTTP事务式下载后，正式文件摘要与目录完全一致，缓存目录中的</w:t>
-      </w:r>
-      <w:r>
-        <w:rPr>
-          <w:rFonts w:ascii="Consolas" w:hAnsi="Consolas" w:eastAsia="等线"/>
-        </w:rPr>
-        <w:t>.part</w:t>
-      </w:r>
-      <w:r>
-        <w:rPr>
-          <w:rFonts w:ascii="Times New Roman" w:hAnsi="Times New Roman" w:eastAsia="宋体"/>
-        </w:rPr>
-        <w:t>文件回收率为100%。</w:t>
-      </w:r>
-      <w:r>
-        <w:rPr>
-          <w:rFonts w:ascii="Consolas" w:hAnsi="Consolas" w:eastAsia="等线"/>
-        </w:rPr>
-        <w:t>read_dataset</w:t>
-      </w:r>
-      <w:r>
-        <w:rPr>
-          <w:rFonts w:ascii="Times New Roman" w:hAnsi="Times New Roman" w:eastAsia="宋体"/>
-        </w:rPr>
-        <w:t>读取的整场数组与独立参考逐点一致，形成从源产品、共享YAML生产、完整性目录到统一读取的端到端数据链路。</w:t>
+        <w:t>标准产品连续生成3次，科学数组、坐标和文件SHA-256均保持一致。生成文件为997 006字节，目录条目自动登记相同的字节数和SHA-256；经回环HTTP事务式下载后，正式文件摘要与目录完全一致，传输临时文件全部完成回收。统一读取接口获得的整场数组与独立参考逐点一致，形成从源产品、共享YAML生产、完整性目录到标准读取的端到端数据链路。</w:t>
       </w:r>
     </w:p>
     <w:p>
@@ -6470,19 +5474,7 @@
         <w:rPr>
           <w:rFonts w:ascii="Times New Roman" w:hAnsi="Times New Roman" w:eastAsia="宋体"/>
         </w:rPr>
-        <w:t>数据贡献案例贯通YAML配置、标准产品生成、目录登记和下游读取，生成产品与参考数组逐点一致，目录中的</w:t>
-      </w:r>
-      <w:r>
-        <w:rPr>
-          <w:rFonts w:ascii="Consolas" w:hAnsi="Consolas" w:eastAsia="等线"/>
-        </w:rPr>
-        <w:t>SIZE</w:t>
-      </w:r>
-      <w:r>
-        <w:rPr>
-          <w:rFonts w:ascii="Times New Roman" w:hAnsi="Times New Roman" w:eastAsia="宋体"/>
-        </w:rPr>
-        <w:t>和SHA-256与文件相符。NetcdfIO接口迁移与配置对象复用机制进一步统一文件访问和批量生产行为，使二维/三维输出、坐标变换、数值处理、Gapfill和目录生成由同一工作流连接；完整YAML示例和固定输入路径共同构成可复用的数据贡献模板。</w:t>
+        <w:t>数据贡献案例贯通YAML配置、标准产品生成、目录登记和下游读取，生成产品与参考数组逐点一致，目录中的文件字节数和SHA-256与产品相符。统一NetCDF读写层与配置对象复用机制进一步协调文件访问和批量生产，使二维/三维输出、坐标变换、数值处理、Gapfill和目录生成由同一工作流连接；完整YAML示例和固定输入路径共同构成可复用的数据贡献模板。</w:t>
       </w:r>
     </w:p>
     <w:p>
@@ -6711,7 +5703,7 @@
         <w:rPr>
           <w:rFonts w:ascii="Times New Roman" w:hAnsi="Times New Roman" w:eastAsia="宋体"/>
         </w:rPr>
-        <w:t>4.3 Collector与可信多镜像分发</w:t>
+        <w:t>4.3 目录管理与可信多镜像分发</w:t>
       </w:r>
     </w:p>
     <w:p>
@@ -6719,7 +5711,7 @@
         <w:rPr>
           <w:rFonts w:ascii="Times New Roman" w:hAnsi="Times New Roman" w:eastAsia="宋体"/>
         </w:rPr>
-        <w:t>Collector将目录初始化、事务更新、产品同步、镜像获取、状态查询和历史数据整理组织为统一的数据维护接口。独立目录使数据产品能够随镜像和版本持续更新，cache与public分层保存机制则将传输过程与正式数据分离，使上一有效目录和已发布产品在目录更新与镜像切换过程中保持稳定。</w:t>
+        <w:t>目录与数据获取模块将目录初始化、事务更新、产品同步、镜像获取、状态查询和历史数据整理组织为统一的数据维护接口。独立目录使数据产品能够随镜像和版本持续更新，事务缓存区与正式数据区的分层机制则将传输过程与标准产品分离，使上一有效目录和已发布产品在目录更新与镜像切换过程中保持稳定。</w:t>
       </w:r>
     </w:p>
     <w:p>
@@ -6727,19 +5719,7 @@
         <w:rPr>
           <w:rFonts w:ascii="Times New Roman" w:hAnsi="Times New Roman" w:eastAsia="宋体"/>
         </w:rPr>
-        <w:t>由13类镜像状态构成的可靠性分析表明，Collector能够优先选择延迟较低的候选，同时保留全部URL并依次回退。每次获取采用独立</w:t>
-      </w:r>
-      <w:r>
-        <w:rPr>
-          <w:rFonts w:ascii="Consolas" w:hAnsi="Consolas" w:eastAsia="等线"/>
-        </w:rPr>
-        <w:t>.part</w:t>
-      </w:r>
-      <w:r>
-        <w:rPr>
-          <w:rFonts w:ascii="Times New Roman" w:hAnsi="Times New Roman" w:eastAsia="宋体"/>
-        </w:rPr>
-        <w:t>文件，内容经字节数和SHA-256确认后进入正式路径；130次获取记录均完成临时文件回收，既有正式文件摘要保持一致。</w:t>
+        <w:t>由13类镜像状态构成的可靠性分析表明，目录与数据获取模块能够优先选择延迟较低的候选，同时保留全部镜像并依次回退。每次获取采用独立临时文件，内容经字节数和SHA-256确认后进入正式路径；130次获取记录均完成临时文件回收，既有正式文件摘要保持一致。</w:t>
       </w:r>
     </w:p>
     <w:p>
@@ -6774,7 +5754,7 @@
         <w:rPr>
           <w:rFonts w:ascii="Times New Roman" w:hAnsi="Times New Roman" w:eastAsia="宋体"/>
         </w:rPr>
-        <w:t>标签驱动的数据访问支持整场、周期和站点读取以及经纬度索引，并由</w:t>
+        <w:t>标签驱动的数据访问实现整场、周期和站点读取以及经纬度索引；格点尺度陆面参数融合和气象驱动组织进一步覆盖植被、裸土和时间序列等模型输入场景。对应的公共接口分别为</w:t>
       </w:r>
       <w:r>
         <w:rPr>
@@ -6786,43 +5766,43 @@
         <w:rPr>
           <w:rFonts w:ascii="Times New Roman" w:hAnsi="Times New Roman" w:eastAsia="宋体"/>
         </w:rPr>
-        <w:t>统一实现；</w:t>
+        <w:t>、</w:t>
       </w:r>
       <w:r>
         <w:rPr>
           <w:rFonts w:ascii="Consolas" w:hAnsi="Consolas" w:eastAsia="等线"/>
         </w:rPr>
+        <w:t>grid_dict</w:t>
+      </w:r>
+      <w:r>
+        <w:rPr>
+          <w:rFonts w:ascii="Times New Roman" w:hAnsi="Times New Roman" w:eastAsia="宋体"/>
+        </w:rPr>
+        <w:t>和</w:t>
+      </w:r>
+      <w:r>
+        <w:rPr>
+          <w:rFonts w:ascii="Consolas" w:hAnsi="Consolas" w:eastAsia="等线"/>
+        </w:rPr>
+        <w:t>grid_weather</w:t>
+      </w:r>
+      <w:r>
+        <w:rPr>
+          <w:rFonts w:ascii="Times New Roman" w:hAnsi="Times New Roman" w:eastAsia="宋体"/>
+        </w:rPr>
+        <w:t>，并以</w:t>
+      </w:r>
+      <w:r>
+        <w:rPr>
+          <w:rFonts w:ascii="Consolas" w:hAnsi="Consolas" w:eastAsia="等线"/>
+        </w:rPr>
         <w:t>read_LUT</w:t>
       </w:r>
       <w:r>
         <w:rPr>
           <w:rFonts w:ascii="Times New Roman" w:hAnsi="Times New Roman" w:eastAsia="宋体"/>
         </w:rPr>
-        <w:t>作为兼容别名延续原有调用方式。格点尺度陆面参数融合和气象驱动组织分别由</w:t>
-      </w:r>
-      <w:r>
-        <w:rPr>
-          <w:rFonts w:ascii="Consolas" w:hAnsi="Consolas" w:eastAsia="等线"/>
-        </w:rPr>
-        <w:t>grid_dict</w:t>
-      </w:r>
-      <w:r>
-        <w:rPr>
-          <w:rFonts w:ascii="Times New Roman" w:hAnsi="Times New Roman" w:eastAsia="宋体"/>
-        </w:rPr>
-        <w:t>与</w:t>
-      </w:r>
-      <w:r>
-        <w:rPr>
-          <w:rFonts w:ascii="Consolas" w:hAnsi="Consolas" w:eastAsia="等线"/>
-        </w:rPr>
-        <w:t>grid_weather</w:t>
-      </w:r>
-      <w:r>
-        <w:rPr>
-          <w:rFonts w:ascii="Times New Roman" w:hAnsi="Times New Roman" w:eastAsia="宋体"/>
-        </w:rPr>
-        <w:t>实现，支持植被、裸土和时间序列等模型输入场景。GriddingMachine输出由此进入Emerald参数组织、气象组织、模型初始化和60 s单步计算，建立从标准数据读取到模型首个时间步的直接连接。</w:t>
+        <w:t>兼容原有读取方式。GriddingMachine输出由此进入Emerald参数组织、气象组织、模型初始化和60 s单步计算，建立从标准数据读取到模型首个时间步的直接连接。</w:t>
       </w:r>
     </w:p>
     <w:p>
@@ -6830,43 +5810,7 @@
         <w:rPr>
           <w:rFonts w:ascii="Times New Roman" w:hAnsi="Times New Roman" w:eastAsia="宋体"/>
         </w:rPr>
-        <w:t>陆面案例使用2020年</w:t>
-      </w:r>
-      <w:r>
-        <w:rPr>
-          <w:rFonts w:ascii="Consolas" w:hAnsi="Consolas" w:eastAsia="等线"/>
-        </w:rPr>
-        <w:t>gm2</w:t>
-      </w:r>
-      <w:r>
-        <w:rPr>
-          <w:rFonts w:ascii="Times New Roman" w:hAnsi="Times New Roman" w:eastAsia="宋体"/>
-        </w:rPr>
-        <w:t>的14类标准产品，文件大小、来源摘要和SHA-256均通过核验。US-NR1站点映射至相应规则格点，</w:t>
-      </w:r>
-      <w:r>
-        <w:rPr>
-          <w:rFonts w:ascii="Consolas" w:hAnsi="Consolas" w:eastAsia="等线"/>
-        </w:rPr>
-        <w:t>grid_dict</w:t>
-      </w:r>
-      <w:r>
-        <w:rPr>
-          <w:rFonts w:ascii="Times New Roman" w:hAnsi="Times New Roman" w:eastAsia="宋体"/>
-        </w:rPr>
-        <w:t>组织34个模型字段、366日季节序列、4个土壤层和17个植物功能型，高程、陆地掩膜与叶面积指数得到一致读取。撒哈拉案例返回非植被格点状态，体现了接口根据陆面特征组织模型入口的能力。</w:t>
-      </w:r>
-      <w:r>
-        <w:rPr>
-          <w:rFonts w:ascii="Consolas" w:hAnsi="Consolas" w:eastAsia="等线"/>
-        </w:rPr>
-        <w:t>gm2</w:t>
-      </w:r>
-      <w:r>
-        <w:rPr>
-          <w:rFonts w:ascii="Times New Roman" w:hAnsi="Times New Roman" w:eastAsia="宋体"/>
-        </w:rPr>
-        <w:t>文件由此贯通完整性目录、统一读取和陆面参数组织，并覆盖植被与非植被入口。</w:t>
+        <w:t>陆面案例使用2020年第二套陆面参数集合的14类标准产品，文件大小、来源摘要和SHA-256均通过核验。US-NR1站点映射至40.5°N、105.5°W的规则格点，参数融合接口组织34个模型字段、366日季节序列、4个土壤层和17个植物功能型，高程、陆地掩膜与叶面积指数得到一致读取。撒哈拉案例被识别为非植被格点并进入相应的陆面状态分流，体现了参数组织前的场景识别能力。该参数集合由此贯通完整性目录、统一读取和陆面参数组织，并覆盖植被与非植被场景。</w:t>
       </w:r>
     </w:p>
     <w:p>
@@ -6939,19 +5883,7 @@
         <w:rPr>
           <w:rFonts w:ascii="Times New Roman" w:hAnsi="Times New Roman" w:eastAsia="宋体"/>
         </w:rPr>
-        <w:t>新版框架在三个层次推进GriddingMachine：生产端以共享YAML契约连接维度、坐标、Gapfill和标准NetCDF，并由OISST产品展示异构维度、打包数值和经度体系的统一转换；分发端以独立目录、直接NetCDF与事务缓存连接机构镜像和公共镜像；应用端以统一读取、Emerald最小步进和</w:t>
-      </w:r>
-      <w:r>
-        <w:rPr>
-          <w:rFonts w:ascii="Consolas" w:hAnsi="Consolas" w:eastAsia="等线"/>
-        </w:rPr>
-        <w:t>gm2</w:t>
-      </w:r>
-      <w:r>
-        <w:rPr>
-          <w:rFonts w:ascii="Times New Roman" w:hAnsi="Times New Roman" w:eastAsia="宋体"/>
-        </w:rPr>
-        <w:t>陆面链路连接数据产品与模型。海温与陆面产品共同呈现框架在全球规则网格数据生命周期中的适用性。</w:t>
+        <w:t>新版框架在三个层次推进GriddingMachine：生产端以共享YAML契约连接维度、坐标、Gapfill和标准NetCDF，并由OISST产品展示异构维度、打包数值和经度体系的统一转换；分发端以独立目录、直接NetCDF与事务缓存连接机构镜像和公共镜像；应用端以统一读取、Emerald最小步进和14类陆面产品链路连接数据产品与模型。海温与陆面产品共同呈现框架在全球规则网格数据生命周期中的适用性。</w:t>
       </w:r>
     </w:p>
     <w:p>
@@ -6970,7 +5902,7 @@
         <w:rPr>
           <w:rFonts w:ascii="Times New Roman" w:hAnsi="Times New Roman" w:eastAsia="宋体"/>
         </w:rPr>
-        <w:t>Earth Engine把大规模地理空间数据与云端计算结合，服务行星尺度分析[3]；ESGF通过分布式节点、搜索和联合身份基础设施支撑气候模式数据的发现与访问[10]；Pangeo倡导分析就绪、云优化数据以及计算与数据邻近的云原生模式[11]，Pangeo Forge进一步以可复用配方和目录组织分析就绪数据生产[12]。GriddingMachine与这些基础设施形成互补，面向经过选择和统一的全球规则网格产品，以及需要在本地Julia工作流中按固定标签复现参数与气象驱动的模型使用场景。</w:t>
+        <w:t>Earth Engine把大规模地理空间数据与云端计算结合，服务行星尺度分析[3]；ESGF通过分布式节点、搜索和联合身份基础设施支撑气候模式数据的发现与访问[10]；Pangeo倡导分析就绪、云优化数据以及计算与数据邻近的云原生模式[11]，Pangeo Forge进一步以可复用配方和目录组织分析就绪数据生产[12]。GriddingMachine与这些基础设施形成互补，面向经过选择和统一的全球规则网格产品，以及需要在Julia科学计算工作流中按固定标签复现参数与气象驱动的模型使用场景。</w:t>
       </w:r>
     </w:p>
     <w:p>
@@ -7052,19 +5984,7 @@
         <w:rPr>
           <w:rFonts w:ascii="Times New Roman" w:hAnsi="Times New Roman" w:eastAsia="宋体"/>
         </w:rPr>
-        <w:t>现有数据贡献模板、规则网格索引、植被与非植被入口、陆面参数融合及气象驱动组织能力，已经为长期模拟和多模型适配形成稳定接口。</w:t>
-      </w:r>
-      <w:r>
-        <w:rPr>
-          <w:rFonts w:ascii="Consolas" w:hAnsi="Consolas" w:eastAsia="等线"/>
-        </w:rPr>
-        <w:t>gm2</w:t>
-      </w:r>
-      <w:r>
-        <w:rPr>
-          <w:rFonts w:ascii="Times New Roman" w:hAnsi="Times New Roman" w:eastAsia="宋体"/>
-        </w:rPr>
-        <w:t>陆面链路与Emerald模型初始化进一步表明，GriddingMachine可以作为数据产品与地球系统模型之间的轻量中间层，在保持标准产品独立性的同时支持模型参数、边界条件和驱动数据的统一组织。</w:t>
+        <w:t>现有数据贡献模板、规则网格索引、植被与非植被入口、陆面参数融合及气象驱动组织能力，已经为长期模拟和多模型适配形成稳定接口。14类陆面产品与Emerald模型初始化的衔接进一步表明，GriddingMachine可以作为数据产品与地球系统模型之间的轻量中间层，在保持标准产品独立性的同时支持模型参数、边界条件和驱动数据的统一组织。</w:t>
       </w:r>
     </w:p>
     <w:p>

</xml_diff>

<commit_message>
clarify controlled mirror reliability scenarios
</commit_message>
<xml_diff>
--- a/论文/GriddingMachine论文初稿_导师审阅版.docx
+++ b/论文/GriddingMachine论文初稿_导师审阅版.docx
@@ -4793,7 +4793,7 @@
         <w:rPr>
           <w:rFonts w:ascii="Times New Roman" w:hAnsi="Times New Roman" w:eastAsia="宋体"/>
         </w:rPr>
-        <w:t>多镜像可靠性分析在两个独立环境中构建内容一致、访问状态可配置的镜像集合，通过延迟分数组织候选顺序，并组合响应延迟、访问中断、内容差异和传输完整性等条件。各类镜像状态重复5次，记录候选选择、镜像遍历、正式文件状态及SHA-256，据此刻画事务式获取在镜像切换过程中的稳定性。校园网FTP与Zenodo访问进一步呈现机构镜像和公共镜像的互补分发特征与内容一致性。</w:t>
+        <w:t>多镜像可靠性分析在两个独立环境中构建内容一致、访问状态可配置的镜像集合，通过延迟分数组织候选顺序，并设置13个代表性场景，覆盖镜像排序与回退、网络访问异常、缓存状态和文件内容完整性。每个场景在各环境中重复5次，记录候选选择、镜像遍历、正式文件状态及SHA-256，据此刻画事务式获取在镜像切换过程中的稳定性。校园网FTP与Zenodo访问进一步呈现机构镜像和公共镜像的互补分发特征与内容一致性。</w:t>
       </w:r>
     </w:p>
     <w:p>
@@ -5719,7 +5719,7 @@
         <w:rPr>
           <w:rFonts w:ascii="Times New Roman" w:hAnsi="Times New Roman" w:eastAsia="宋体"/>
         </w:rPr>
-        <w:t>由13类镜像状态构成的可靠性分析表明，目录与数据获取模块能够优先选择延迟较低的候选，同时保留全部镜像并依次回退。每次获取采用独立临时文件，内容经字节数和SHA-256确认后进入正式路径；130次获取记录均完成临时文件回收，既有正式文件摘要保持一致。</w:t>
+        <w:t>13个受控场景在两个独立操作系统环境中分别重复5次，共形成130次获取记录。结果表明，目录与数据获取模块能够优先选择延迟较低的候选，同时保留全部镜像并依次回退。每次获取采用独立临时文件，内容经字节数和SHA-256确认后进入正式路径；所有记录均完成临时文件回收，既有正式文件摘要保持一致。</w:t>
       </w:r>
     </w:p>
     <w:p>

</xml_diff>

<commit_message>
refine journal format and add ERA5 case protocol
</commit_message>
<xml_diff>
--- a/论文/GriddingMachine论文初稿_导师审阅版.docx
+++ b/论文/GriddingMachine论文初稿_导师审阅版.docx
@@ -106,13 +106,7 @@
           <w:rFonts w:ascii="Times New Roman" w:hAnsi="Times New Roman" w:eastAsia="宋体"/>
           <w:b/>
         </w:rPr>
-        <w:t>English title:</w:t>
-      </w:r>
-      <w:r>
-        <w:rPr>
-          <w:rFonts w:ascii="Times New Roman" w:hAnsi="Times New Roman" w:eastAsia="宋体"/>
-        </w:rPr>
-        <w:t xml:space="preserve"> Production and Trustworthy Distribution of Global Gridded Data for Earth System Models: Framework Advances and Applications of GriddingMachine</w:t>
+        <w:t>Production and Trustworthy Distribution of Global Gridded Data for Earth System Models: Framework Advances and Applications of GriddingMachine</w:t>
       </w:r>
     </w:p>
     <w:p>
@@ -121,13 +115,13 @@
           <w:rFonts w:ascii="Times New Roman" w:hAnsi="Times New Roman" w:eastAsia="宋体"/>
           <w:b/>
         </w:rPr>
-        <w:t>Authors:</w:t>
-      </w:r>
-      <w:r>
-        <w:rPr>
-          <w:rFonts w:ascii="Times New Roman" w:hAnsi="Times New Roman" w:eastAsia="宋体"/>
-        </w:rPr>
-        <w:t xml:space="preserve"> Hao Jiang^1, Yujie Wang^1*</w:t>
+        <w:t>Hao JIANG^1, Yujie WANG^1\</w:t>
+      </w:r>
+      <w:r>
+        <w:rPr>
+          <w:rFonts w:ascii="Times New Roman" w:hAnsi="Times New Roman" w:eastAsia="宋体"/>
+        </w:rPr>
+        <w:t>*</w:t>
       </w:r>
     </w:p>
     <w:p>
@@ -5447,12 +5441,15 @@
       </w:r>
     </w:p>
     <w:p>
+      <w:pPr>
+        <w:ind w:firstLine="0"/>
+      </w:pPr>
       <w:r>
         <w:rPr>
           <w:rFonts w:ascii="Times New Roman" w:hAnsi="Times New Roman" w:eastAsia="宋体"/>
           <w:b/>
         </w:rPr>
-        <w:t>Figure 2 Standardization results for the OISST V2.1 product.</w:t>
+        <w:t>Fig. 2 Standardization results for the OISST V2.1 product.</w:t>
       </w:r>
       <w:r>
         <w:rPr>
@@ -6241,7 +6238,7 @@
         <w:rPr>
           <w:rFonts w:ascii="Times New Roman" w:hAnsi="Times New Roman" w:eastAsia="宋体"/>
         </w:rPr>
-        <w:t>[13] 王卷乐, 林海, 冉盈盈, 等. 面向数据共享的地球系统科学数据分类探讨[J]. 地球科学进展, 2014, 29(2): 265-274. [WANG J L, LIN H, RAN Y Y, et al. A study of Earth System Science data classification for data sharing[J]. Advances in Earth Science, 2014, 29(2): 265-274.]</w:t>
+        <w:t>[13] 王卷乐, 林海, 冉盈盈, 等. 面向数据共享的地球系统科学数据分类探讨[J]. 地球科学进展, 2014, 29(2): 265-274. [WANG Juanle, LIN Hai, RAN Yingying, et al. A study of Earth System Science data classification for data sharing[J]. Advances in Earth Science, 2014, 29(2): 265-274.]</w:t>
       </w:r>
     </w:p>
     <w:p>
@@ -6281,7 +6278,7 @@
         <w:rPr>
           <w:rFonts w:ascii="Times New Roman" w:hAnsi="Times New Roman" w:eastAsia="宋体"/>
         </w:rPr>
-        <w:t>[18] 李楠楠, 刘筱敏. 我国国家科学数据中心FAIR原则的实践现状调查与分析[J]. 图书与情报, 2023, 43(2): 137-144. DOI: 10.11968/tsyqb.1003-6938.2023032. [LI N N, LIU X M. Survey and analysis on the practice of FAIR principle in National Science Data Center of China[J]. Library and Information, 2023, 43(2): 137-144.]</w:t>
+        <w:t>[18] 李楠楠, 刘筱敏. 我国国家科学数据中心FAIR原则的实践现状调查与分析[J]. 图书与情报, 2023, 43(2): 137-144. DOI: 10.11968/tsyqb.1003-6938.2023032. [LI Nannan, LIU Xiaomin. Survey and analysis on the practice of FAIR principle in National Science Data Center of China[J]. Library and Information, 2023, 43(2): 137-144.]</w:t>
       </w:r>
     </w:p>
     <w:sectPr>

</xml_diff>

<commit_message>
export publication-ready figure 1 assets
</commit_message>
<xml_diff>
--- a/论文/GriddingMachine论文初稿_导师审阅版.docx
+++ b/论文/GriddingMachine论文初稿_导师审阅版.docx
@@ -358,7 +358,7 @@
       <w:r>
         <w:drawing>
           <wp:inline xmlns:a="http://schemas.openxmlformats.org/drawingml/2006/main" xmlns:pic="http://schemas.openxmlformats.org/drawingml/2006/picture">
-            <wp:extent cx="5400000" cy="3037500"/>
+            <wp:extent cx="5400000" cy="3038400"/>
             <wp:docPr id="1" name="Picture 1"/>
             <wp:cNvGraphicFramePr>
               <a:graphicFrameLocks noChangeAspect="1"/>
@@ -379,7 +379,7 @@
                   <pic:spPr>
                     <a:xfrm>
                       <a:off x="0" y="0"/>
-                      <a:ext cx="5400000" cy="3037500"/>
+                      <a:ext cx="5400000" cy="3038400"/>
                     </a:xfrm>
                     <a:prstGeom prst="rect"/>
                   </pic:spPr>

</xml_diff>